<commit_message>
<fix> single effect background changing solved
</commit_message>
<xml_diff>
--- a/Manual de desarrollo en Atlax Renpy.docx
+++ b/Manual de desarrollo en Atlax Renpy.docx
@@ -114,8 +114,42 @@
           <w:sz w:val="52"/>
           <w:szCs w:val="52"/>
         </w:rPr>
-        <w:t>Manual de desarrollo en Atlax Renpy</w:t>
-      </w:r>
+        <w:t xml:space="preserve">Manual de desarrollo en </w:t>
+      </w:r>
+      <w:proofErr w:type="spellStart"/>
+      <w:r>
+        <w:rPr>
+          <w:rFonts w:cs="Times New Roman"/>
+          <w:b/>
+          <w:bCs/>
+          <w:sz w:val="52"/>
+          <w:szCs w:val="52"/>
+        </w:rPr>
+        <w:t>Atlax</w:t>
+      </w:r>
+      <w:proofErr w:type="spellEnd"/>
+      <w:r>
+        <w:rPr>
+          <w:rFonts w:cs="Times New Roman"/>
+          <w:b/>
+          <w:bCs/>
+          <w:sz w:val="52"/>
+          <w:szCs w:val="52"/>
+        </w:rPr>
+        <w:t xml:space="preserve"> </w:t>
+      </w:r>
+      <w:proofErr w:type="spellStart"/>
+      <w:r>
+        <w:rPr>
+          <w:rFonts w:cs="Times New Roman"/>
+          <w:b/>
+          <w:bCs/>
+          <w:sz w:val="52"/>
+          <w:szCs w:val="52"/>
+        </w:rPr>
+        <w:t>Renpy</w:t>
+      </w:r>
+      <w:proofErr w:type="spellEnd"/>
     </w:p>
     <w:p>
       <w:pPr>
@@ -239,8 +273,16 @@
         <w:rPr>
           <w:rFonts w:cs="Times New Roman"/>
         </w:rPr>
-        <w:t>Desarrollador de Campanella Studios</w:t>
-      </w:r>
+        <w:t xml:space="preserve">Desarrollador de Campanella </w:t>
+      </w:r>
+      <w:proofErr w:type="spellStart"/>
+      <w:r>
+        <w:rPr>
+          <w:rFonts w:cs="Times New Roman"/>
+        </w:rPr>
+        <w:t>Studios</w:t>
+      </w:r>
+      <w:proofErr w:type="spellEnd"/>
     </w:p>
     <w:p>
       <w:pPr>
@@ -2426,7 +2468,22 @@
     <w:p>
       <w:r>
         <w:tab/>
-        <w:t xml:space="preserve">Atlax Renpy es un motor </w:t>
+      </w:r>
+      <w:proofErr w:type="spellStart"/>
+      <w:r>
+        <w:t>Atlax</w:t>
+      </w:r>
+      <w:proofErr w:type="spellEnd"/>
+      <w:r>
+        <w:t xml:space="preserve"> </w:t>
+      </w:r>
+      <w:proofErr w:type="spellStart"/>
+      <w:r>
+        <w:t>Renpy</w:t>
+      </w:r>
+      <w:proofErr w:type="spellEnd"/>
+      <w:r>
+        <w:t xml:space="preserve"> es un motor </w:t>
       </w:r>
       <w:r>
         <w:t>de</w:t>
@@ -2435,11 +2492,32 @@
         <w:t xml:space="preserve"> videojuegos del género novela visual clásica</w:t>
       </w:r>
       <w:r>
-        <w:t xml:space="preserve"> que utiliza como base el motor Renpy en su versión 8.1.3</w:t>
-      </w:r>
-      <w:r>
-        <w:t>. Atlax Renpy</w:t>
-      </w:r>
+        <w:t xml:space="preserve"> que utiliza como base el motor </w:t>
+      </w:r>
+      <w:proofErr w:type="spellStart"/>
+      <w:r>
+        <w:t>Renpy</w:t>
+      </w:r>
+      <w:proofErr w:type="spellEnd"/>
+      <w:r>
+        <w:t xml:space="preserve"> en su versión 8.1.3</w:t>
+      </w:r>
+      <w:r>
+        <w:t xml:space="preserve">. </w:t>
+      </w:r>
+      <w:proofErr w:type="spellStart"/>
+      <w:r>
+        <w:t>Atlax</w:t>
+      </w:r>
+      <w:proofErr w:type="spellEnd"/>
+      <w:r>
+        <w:t xml:space="preserve"> </w:t>
+      </w:r>
+      <w:proofErr w:type="spellStart"/>
+      <w:r>
+        <w:t>Renpy</w:t>
+      </w:r>
+      <w:proofErr w:type="spellEnd"/>
       <w:r>
         <w:t xml:space="preserve"> permite el desarrollo de juegos con mínimos conocimientos informáticos y de programación. El motor está hecho para ser una fábrica de novelas visuales alimentada </w:t>
       </w:r>
@@ -2465,8 +2543,21 @@
         <w:t xml:space="preserve"> de</w:t>
       </w:r>
       <w:r>
-        <w:t xml:space="preserve"> Atlax Renpy</w:t>
-      </w:r>
+        <w:t xml:space="preserve"> </w:t>
+      </w:r>
+      <w:proofErr w:type="spellStart"/>
+      <w:r>
+        <w:t>Atlax</w:t>
+      </w:r>
+      <w:proofErr w:type="spellEnd"/>
+      <w:r>
+        <w:t xml:space="preserve"> </w:t>
+      </w:r>
+      <w:proofErr w:type="spellStart"/>
+      <w:r>
+        <w:t>Renpy</w:t>
+      </w:r>
+      <w:proofErr w:type="spellEnd"/>
       <w:r>
         <w:t>, este</w:t>
       </w:r>
@@ -2536,7 +2627,23 @@
         <w:t>cción de</w:t>
       </w:r>
       <w:r>
-        <w:t xml:space="preserve"> la novela visual dominen ciertos conocimientos y comprendan algunos conceptos fundamentales para desarrollar exitosamente un videojuego usando Atlax Renpy.</w:t>
+        <w:t xml:space="preserve"> la novela visual dominen ciertos conocimientos y comprendan algunos conceptos fundamentales para desarrollar exitosamente un videojuego usando </w:t>
+      </w:r>
+      <w:proofErr w:type="spellStart"/>
+      <w:r>
+        <w:t>Atlax</w:t>
+      </w:r>
+      <w:proofErr w:type="spellEnd"/>
+      <w:r>
+        <w:t xml:space="preserve"> </w:t>
+      </w:r>
+      <w:proofErr w:type="spellStart"/>
+      <w:r>
+        <w:t>Renpy</w:t>
+      </w:r>
+      <w:proofErr w:type="spellEnd"/>
+      <w:r>
+        <w:t>.</w:t>
       </w:r>
     </w:p>
     <w:p/>
@@ -2590,7 +2697,15 @@
         <w:t>ditor de texto:</w:t>
       </w:r>
       <w:r>
-        <w:t xml:space="preserve"> Bloc de notas, Visual Studio Code (recomendado), Sublime Text, Notepad.</w:t>
+        <w:t xml:space="preserve"> Bloc de notas, Visual Studio </w:t>
+      </w:r>
+      <w:proofErr w:type="spellStart"/>
+      <w:r>
+        <w:t>Code</w:t>
+      </w:r>
+      <w:proofErr w:type="spellEnd"/>
+      <w:r>
+        <w:t xml:space="preserve"> (recomendado), Sublime Text, Notepad.</w:t>
       </w:r>
     </w:p>
     <w:p>
@@ -2609,7 +2724,15 @@
         <w:t>Herramienta para abrir y editar archivos CSV:</w:t>
       </w:r>
       <w:r>
-        <w:t xml:space="preserve"> Excel (recomendado), LibreOffice, Visual Studio Code.</w:t>
+        <w:t xml:space="preserve"> Excel (recomendado), LibreOffice, Visual Studio </w:t>
+      </w:r>
+      <w:proofErr w:type="spellStart"/>
+      <w:r>
+        <w:t>Code</w:t>
+      </w:r>
+      <w:proofErr w:type="spellEnd"/>
+      <w:r>
+        <w:t>.</w:t>
       </w:r>
     </w:p>
     <w:p>
@@ -2620,12 +2743,21 @@
           <w:numId w:val="2"/>
         </w:numPr>
       </w:pPr>
+      <w:proofErr w:type="spellStart"/>
       <w:r>
         <w:rPr>
           <w:b/>
           <w:bCs/>
         </w:rPr>
-        <w:t>Renpy:</w:t>
+        <w:t>Renpy</w:t>
+      </w:r>
+      <w:proofErr w:type="spellEnd"/>
+      <w:r>
+        <w:rPr>
+          <w:b/>
+          <w:bCs/>
+        </w:rPr>
+        <w:t>:</w:t>
       </w:r>
       <w:r>
         <w:t xml:space="preserve"> En su versión 8.1.3.</w:t>
@@ -2649,7 +2781,23 @@
     <w:p>
       <w:r>
         <w:tab/>
-        <w:t>Si estás leyendo esto seguramente tengas algunos conocimientos sobre las novelas visuales, ya sean conocimientos técnicos o de usuario final, en esta sección se va a desglosar la estructura y funcionamiento que sigue Atlax Renpy para mantener el control de todo lo que sucede internamente. Iremos de lo macro a lo micro.</w:t>
+        <w:t xml:space="preserve">Si estás leyendo esto seguramente tengas algunos conocimientos sobre las novelas visuales, ya sean conocimientos técnicos o de usuario final, en esta sección se va a desglosar la estructura y funcionamiento que sigue </w:t>
+      </w:r>
+      <w:proofErr w:type="spellStart"/>
+      <w:r>
+        <w:t>Atlax</w:t>
+      </w:r>
+      <w:proofErr w:type="spellEnd"/>
+      <w:r>
+        <w:t xml:space="preserve"> </w:t>
+      </w:r>
+      <w:proofErr w:type="spellStart"/>
+      <w:r>
+        <w:t>Renpy</w:t>
+      </w:r>
+      <w:proofErr w:type="spellEnd"/>
+      <w:r>
+        <w:t xml:space="preserve"> para mantener el control de todo lo que sucede internamente. Iremos de lo macro a lo micro.</w:t>
       </w:r>
     </w:p>
     <w:p/>
@@ -2937,7 +3085,23 @@
         <w:t xml:space="preserve"> </w:t>
       </w:r>
       <w:r>
-        <w:t>no, te restará o no ganarás ninguno. Atlax Renpy es capaz de soportar todos los puntos que necesites, puntos de amist</w:t>
+        <w:t xml:space="preserve">no, te restará o no ganarás ninguno. </w:t>
+      </w:r>
+      <w:proofErr w:type="spellStart"/>
+      <w:r>
+        <w:t>Atlax</w:t>
+      </w:r>
+      <w:proofErr w:type="spellEnd"/>
+      <w:r>
+        <w:t xml:space="preserve"> </w:t>
+      </w:r>
+      <w:proofErr w:type="spellStart"/>
+      <w:r>
+        <w:t>Renpy</w:t>
+      </w:r>
+      <w:proofErr w:type="spellEnd"/>
+      <w:r>
+        <w:t xml:space="preserve"> es capaz de soportar todos los puntos que necesites, puntos de amist</w:t>
       </w:r>
       <w:r>
         <w:t>a</w:t>
@@ -2962,7 +3126,23 @@
         <w:t>,</w:t>
       </w:r>
       <w:r>
-        <w:t xml:space="preserve"> nos vamos a enfocar en lo que se necesita saber para utilizar Atlax Renpy.</w:t>
+        <w:t xml:space="preserve"> nos vamos a enfocar en lo que se necesita saber para utilizar </w:t>
+      </w:r>
+      <w:proofErr w:type="spellStart"/>
+      <w:r>
+        <w:t>Atlax</w:t>
+      </w:r>
+      <w:proofErr w:type="spellEnd"/>
+      <w:r>
+        <w:t xml:space="preserve"> </w:t>
+      </w:r>
+      <w:proofErr w:type="spellStart"/>
+      <w:r>
+        <w:t>Renpy</w:t>
+      </w:r>
+      <w:proofErr w:type="spellEnd"/>
+      <w:r>
+        <w:t>.</w:t>
       </w:r>
     </w:p>
     <w:p>
@@ -2985,7 +3165,23 @@
         <w:pStyle w:val="Ttulo2"/>
       </w:pPr>
       <w:r>
-        <w:t>¿Cómo funciona Atlax Renpy?</w:t>
+        <w:t xml:space="preserve">¿Cómo funciona </w:t>
+      </w:r>
+      <w:proofErr w:type="spellStart"/>
+      <w:r>
+        <w:t>Atlax</w:t>
+      </w:r>
+      <w:proofErr w:type="spellEnd"/>
+      <w:r>
+        <w:t xml:space="preserve"> </w:t>
+      </w:r>
+      <w:proofErr w:type="spellStart"/>
+      <w:r>
+        <w:t>Renpy</w:t>
+      </w:r>
+      <w:proofErr w:type="spellEnd"/>
+      <w:r>
+        <w:t>?</w:t>
       </w:r>
     </w:p>
     <w:p>
@@ -2997,14 +3193,19 @@
         <w:t>Deberías dar prioridad a organizar estos archivos de control de la mejor manera posible, el orden recomendado es crear</w:t>
       </w:r>
       <w:r>
-        <w:t xml:space="preserve"> una </w:t>
-      </w:r>
-      <w:r>
         <w:t xml:space="preserve"> </w:t>
       </w:r>
+      <w:proofErr w:type="gramStart"/>
+      <w:r>
+        <w:t xml:space="preserve">una </w:t>
+      </w:r>
+      <w:r>
+        <w:t xml:space="preserve"> </w:t>
+      </w:r>
       <w:r>
         <w:t>carpeta</w:t>
       </w:r>
+      <w:proofErr w:type="gramEnd"/>
       <w:r>
         <w:t xml:space="preserve"> para cada</w:t>
       </w:r>
@@ -3033,7 +3234,15 @@
         <w:t>de</w:t>
       </w:r>
       <w:r>
-        <w:t xml:space="preserve"> la carpeta “scenes”.</w:t>
+        <w:t xml:space="preserve"> la carpeta “</w:t>
+      </w:r>
+      <w:proofErr w:type="spellStart"/>
+      <w:r>
+        <w:t>scenes</w:t>
+      </w:r>
+      <w:proofErr w:type="spellEnd"/>
+      <w:r>
+        <w:t>”.</w:t>
       </w:r>
     </w:p>
     <w:p>
@@ -3051,10 +3260,26 @@
         <w:t xml:space="preserve"> como si fuese una ruta,</w:t>
       </w:r>
       <w:r>
-        <w:t xml:space="preserve"> quizás una llamada “intro” o “comienzo”, ponle el nombre que desees.</w:t>
-      </w:r>
-      <w:r>
-        <w:t xml:space="preserve"> Lo que sí, debes indicarle al motor cuál es la escena de entrada, de momento no vamos a explicar como hacerlo ya que será más adelante, solo ten presente que debes indicarle al motor por dónde empezar</w:t>
+        <w:t xml:space="preserve"> quizás una llamada “</w:t>
+      </w:r>
+      <w:proofErr w:type="spellStart"/>
+      <w:r>
+        <w:t>intro</w:t>
+      </w:r>
+      <w:proofErr w:type="spellEnd"/>
+      <w:r>
+        <w:t>” o “comienzo”, ponle el nombre que desees.</w:t>
+      </w:r>
+      <w:r>
+        <w:t xml:space="preserve"> Lo que sí, debes indicarle al motor cuál es la escena de entrada, de momento no vamos a explicar </w:t>
+      </w:r>
+      <w:proofErr w:type="spellStart"/>
+      <w:r>
+        <w:t>como</w:t>
+      </w:r>
+      <w:proofErr w:type="spellEnd"/>
+      <w:r>
+        <w:t xml:space="preserve"> hacerlo ya que será más adelante, solo ten presente que debes indicarle al motor por dónde empezar</w:t>
       </w:r>
       <w:r>
         <w:t>.</w:t>
@@ -3063,13 +3288,44 @@
     <w:p>
       <w:r>
         <w:tab/>
-        <w:t xml:space="preserve">Atlax Renpy va a leer ese primer archivo de control y </w:t>
+      </w:r>
+      <w:proofErr w:type="spellStart"/>
+      <w:r>
+        <w:t>Atlax</w:t>
+      </w:r>
+      <w:proofErr w:type="spellEnd"/>
+      <w:r>
+        <w:t xml:space="preserve"> </w:t>
+      </w:r>
+      <w:proofErr w:type="spellStart"/>
+      <w:r>
+        <w:t>Renpy</w:t>
+      </w:r>
+      <w:proofErr w:type="spellEnd"/>
+      <w:r>
+        <w:t xml:space="preserve"> va a leer ese primer archivo de control y </w:t>
       </w:r>
       <w:r>
         <w:t>comenzará</w:t>
       </w:r>
       <w:r>
-        <w:t xml:space="preserve"> a mostrar los diálogos como de costumbre, uno a uno, click a click. Una vez llegado el final de la escena, esta puede tener distintas formas de terminar, puede terminar de una forma lineal, es decir, que conduzca a una única escena o que presente una decisión.</w:t>
+        <w:t xml:space="preserve"> a mostrar los diálogos como de costumbre, uno a uno, </w:t>
+      </w:r>
+      <w:proofErr w:type="spellStart"/>
+      <w:r>
+        <w:t>click</w:t>
+      </w:r>
+      <w:proofErr w:type="spellEnd"/>
+      <w:r>
+        <w:t xml:space="preserve"> a </w:t>
+      </w:r>
+      <w:proofErr w:type="spellStart"/>
+      <w:r>
+        <w:t>click</w:t>
+      </w:r>
+      <w:proofErr w:type="spellEnd"/>
+      <w:r>
+        <w:t>. Una vez llegado el final de la escena, esta puede tener distintas formas de terminar, puede terminar de una forma lineal, es decir, que conduzca a una única escena o que presente una decisión.</w:t>
       </w:r>
     </w:p>
     <w:p>
@@ -3166,7 +3422,23 @@
     <w:p>
       <w:r>
         <w:tab/>
-        <w:t>En resumen, Atlax Renpy es un lector de escenas</w:t>
+        <w:t xml:space="preserve">En resumen, </w:t>
+      </w:r>
+      <w:proofErr w:type="spellStart"/>
+      <w:r>
+        <w:t>Atlax</w:t>
+      </w:r>
+      <w:proofErr w:type="spellEnd"/>
+      <w:r>
+        <w:t xml:space="preserve"> </w:t>
+      </w:r>
+      <w:proofErr w:type="spellStart"/>
+      <w:r>
+        <w:t>Renpy</w:t>
+      </w:r>
+      <w:proofErr w:type="spellEnd"/>
+      <w:r>
+        <w:t xml:space="preserve"> es un lector de escenas</w:t>
       </w:r>
       <w:r>
         <w:t xml:space="preserve"> que nos da todas las herramientas para ilustrar una historia utilizando únicamente estos archivos de control y escribiendo una cantidad mínima de código de programación.</w:t>
@@ -3197,7 +3469,23 @@
     <w:p>
       <w:r>
         <w:tab/>
-        <w:t>El archivo de entrada es el archivo de control que el motor toma para iniciar el juego, este por defecto toma un archivo llamado “testing” y la manera de cambiarlo es viajando al archivo script.rpy, abriéndolo y cerca de la línea 23 veremos algo como lo siguiente.</w:t>
+        <w:t>El archivo de entrada es el archivo de control que el motor toma para iniciar el juego, este por defecto toma un archivo llamado “</w:t>
+      </w:r>
+      <w:proofErr w:type="spellStart"/>
+      <w:r>
+        <w:t>testing</w:t>
+      </w:r>
+      <w:proofErr w:type="spellEnd"/>
+      <w:r>
+        <w:t xml:space="preserve">” y la manera de cambiarlo es viajando al archivo </w:t>
+      </w:r>
+      <w:proofErr w:type="spellStart"/>
+      <w:r>
+        <w:t>script.rpy</w:t>
+      </w:r>
+      <w:proofErr w:type="spellEnd"/>
+      <w:r>
+        <w:t>, abriéndolo y cerca de la línea 23 veremos algo como lo siguiente.</w:t>
       </w:r>
     </w:p>
     <w:p>
@@ -3245,7 +3533,23 @@
     <w:p>
       <w:r>
         <w:tab/>
-        <w:t>Basta con cambiar testing por el archivo de control del que quieres empezar o en su defecto, trabajar en el archivo testing y cuando ya esté terminado guardar su contenido en un archivo diferente.</w:t>
+        <w:t xml:space="preserve">Basta con cambiar </w:t>
+      </w:r>
+      <w:proofErr w:type="spellStart"/>
+      <w:r>
+        <w:t>testing</w:t>
+      </w:r>
+      <w:proofErr w:type="spellEnd"/>
+      <w:r>
+        <w:t xml:space="preserve"> por el archivo de control del que quieres empezar o en su defecto, trabajar en el archivo </w:t>
+      </w:r>
+      <w:proofErr w:type="spellStart"/>
+      <w:r>
+        <w:t>testing</w:t>
+      </w:r>
+      <w:proofErr w:type="spellEnd"/>
+      <w:r>
+        <w:t xml:space="preserve"> y cuando ya esté terminado guardar su contenido en un archivo diferente.</w:t>
       </w:r>
     </w:p>
     <w:p>
@@ -3261,15 +3565,27 @@
         <w:tab/>
         <w:t xml:space="preserve">Para definir a tus personajes, debes dirigirte al archivo </w:t>
       </w:r>
+      <w:proofErr w:type="spellStart"/>
       <w:r>
         <w:t>charactersDefine.rpy</w:t>
       </w:r>
-      <w:r>
-        <w:t xml:space="preserve"> ubicado en la carpeta game</w:t>
-      </w:r>
-      <w:r>
-        <w:t>/definitions</w:t>
-      </w:r>
+      <w:proofErr w:type="spellEnd"/>
+      <w:r>
+        <w:t xml:space="preserve"> ubicado en la carpeta </w:t>
+      </w:r>
+      <w:proofErr w:type="spellStart"/>
+      <w:r>
+        <w:t>game</w:t>
+      </w:r>
+      <w:proofErr w:type="spellEnd"/>
+      <w:r>
+        <w:t>/</w:t>
+      </w:r>
+      <w:proofErr w:type="spellStart"/>
+      <w:r>
+        <w:t>definitions</w:t>
+      </w:r>
+      <w:proofErr w:type="spellEnd"/>
       <w:r>
         <w:t>, si lo abres con Visual Studio, en su interior encontrarás algo así.</w:t>
       </w:r>
@@ -3319,7 +3635,15 @@
     <w:p>
       <w:r>
         <w:tab/>
-        <w:t xml:space="preserve">Allí debes definir a los personajes de tu historia siguiendo con ese mismo patrón, es importante mencionar que en cuanto a nombres de personajes, se requiere usar siempre </w:t>
+        <w:t xml:space="preserve">Allí debes definir a los personajes de tu historia siguiendo con ese mismo patrón, es importante mencionar </w:t>
+      </w:r>
+      <w:proofErr w:type="gramStart"/>
+      <w:r>
+        <w:t>que</w:t>
+      </w:r>
+      <w:proofErr w:type="gramEnd"/>
+      <w:r>
+        <w:t xml:space="preserve"> en cuanto a nombres de personajes, se requiere usar siempre </w:t>
       </w:r>
       <w:r>
         <w:lastRenderedPageBreak/>
@@ -3409,15 +3733,27 @@
       <w:r>
         <w:t xml:space="preserve">Los fondos son los escenarios que se muestran detrás de los personajes como por ejemplo un salón, un parque o un cielo estrellado, esta vez acudiremos al archivo </w:t>
       </w:r>
+      <w:proofErr w:type="spellStart"/>
       <w:r>
         <w:t>backgroundsDefine.rpy</w:t>
       </w:r>
+      <w:proofErr w:type="spellEnd"/>
       <w:r>
         <w:t xml:space="preserve"> ubicado en la carpeta </w:t>
       </w:r>
-      <w:r>
-        <w:t>game/definitions</w:t>
-      </w:r>
+      <w:proofErr w:type="spellStart"/>
+      <w:r>
+        <w:t>game</w:t>
+      </w:r>
+      <w:proofErr w:type="spellEnd"/>
+      <w:r>
+        <w:t>/</w:t>
+      </w:r>
+      <w:proofErr w:type="spellStart"/>
+      <w:r>
+        <w:t>definitions</w:t>
+      </w:r>
+      <w:proofErr w:type="spellEnd"/>
       <w:r>
         <w:t>, al abrirlo encontraremos algo así.</w:t>
       </w:r>
@@ -3472,7 +3808,31 @@
         <w:ind w:firstLine="708"/>
       </w:pPr>
       <w:r>
-        <w:t>Los fondos se encuentran en la carpeta game/images/backgrounds, deben ser en formato .png y preferiblemente tener la misma resolución, el tamaño recomendado es 1920x1080</w:t>
+        <w:t xml:space="preserve">Los fondos se encuentran en la carpeta </w:t>
+      </w:r>
+      <w:proofErr w:type="spellStart"/>
+      <w:r>
+        <w:t>game</w:t>
+      </w:r>
+      <w:proofErr w:type="spellEnd"/>
+      <w:r>
+        <w:t>/</w:t>
+      </w:r>
+      <w:proofErr w:type="spellStart"/>
+      <w:r>
+        <w:t>images</w:t>
+      </w:r>
+      <w:proofErr w:type="spellEnd"/>
+      <w:r>
+        <w:t>/</w:t>
+      </w:r>
+      <w:proofErr w:type="spellStart"/>
+      <w:r>
+        <w:t>backgrounds</w:t>
+      </w:r>
+      <w:proofErr w:type="spellEnd"/>
+      <w:r>
+        <w:t>, deben ser en formato .png y preferiblemente tener la misma resolución, el tamaño recomendado es 1920x1080</w:t>
       </w:r>
       <w:r>
         <w:t>.</w:t>
@@ -3500,7 +3860,15 @@
         <w:ind w:firstLine="708"/>
       </w:pPr>
       <w:r>
-        <w:t>Se recomienda no quitar los fondos flash y blackout ya que el motor los necesita para hacer algunas transiciones.</w:t>
+        <w:t xml:space="preserve">Se recomienda no quitar los fondos flash y </w:t>
+      </w:r>
+      <w:proofErr w:type="spellStart"/>
+      <w:r>
+        <w:t>blackout</w:t>
+      </w:r>
+      <w:proofErr w:type="spellEnd"/>
+      <w:r>
+        <w:t xml:space="preserve"> ya que el motor los necesita para hacer algunas transiciones.</w:t>
       </w:r>
     </w:p>
     <w:p>
@@ -3514,7 +3882,22 @@
     <w:p>
       <w:r>
         <w:tab/>
-        <w:t>Atlax Renpy soporta diversos idiomas, sin embargo</w:t>
+      </w:r>
+      <w:proofErr w:type="spellStart"/>
+      <w:r>
+        <w:t>Atlax</w:t>
+      </w:r>
+      <w:proofErr w:type="spellEnd"/>
+      <w:r>
+        <w:t xml:space="preserve"> </w:t>
+      </w:r>
+      <w:proofErr w:type="spellStart"/>
+      <w:r>
+        <w:t>Renpy</w:t>
+      </w:r>
+      <w:proofErr w:type="spellEnd"/>
+      <w:r>
+        <w:t xml:space="preserve"> soporta diversos idiomas, sin embargo</w:t>
       </w:r>
       <w:r>
         <w:t>,</w:t>
@@ -3525,11 +3908,32 @@
       <w:r>
         <w:t xml:space="preserve">archivo </w:t>
       </w:r>
+      <w:proofErr w:type="spellStart"/>
       <w:r>
         <w:t>languageDefine</w:t>
       </w:r>
       <w:r>
-        <w:t>.rpy ubicado en la carpeta game/definitions. Allí encontraremos algo así.</w:t>
+        <w:t>.rpy</w:t>
+      </w:r>
+      <w:proofErr w:type="spellEnd"/>
+      <w:r>
+        <w:t xml:space="preserve"> ubicado en la carpeta </w:t>
+      </w:r>
+      <w:proofErr w:type="spellStart"/>
+      <w:r>
+        <w:t>game</w:t>
+      </w:r>
+      <w:proofErr w:type="spellEnd"/>
+      <w:r>
+        <w:t>/</w:t>
+      </w:r>
+      <w:proofErr w:type="spellStart"/>
+      <w:r>
+        <w:t>definitions</w:t>
+      </w:r>
+      <w:proofErr w:type="spellEnd"/>
+      <w:r>
+        <w:t>. Allí encontraremos algo así.</w:t>
       </w:r>
     </w:p>
     <w:p>
@@ -3581,7 +3985,22 @@
       <w:r>
         <w:lastRenderedPageBreak/>
         <w:tab/>
-        <w:t>currentLanguage es el idioma por defecto que usará el motor al abrir el juego, este puede ser cambiado en la configuración del juego mismo. La otra variable llamada allLanguages, lista todos los lenguajes que soporte tu historia</w:t>
+      </w:r>
+      <w:proofErr w:type="spellStart"/>
+      <w:r>
+        <w:t>currentLanguage</w:t>
+      </w:r>
+      <w:proofErr w:type="spellEnd"/>
+      <w:r>
+        <w:t xml:space="preserve"> es el idioma por defecto que usará el motor al abrir el juego, este puede ser cambiado en la configuración del juego mismo. La otra variable llamada </w:t>
+      </w:r>
+      <w:proofErr w:type="spellStart"/>
+      <w:r>
+        <w:t>allLanguages</w:t>
+      </w:r>
+      <w:proofErr w:type="spellEnd"/>
+      <w:r>
+        <w:t>, lista todos los lenguajes que soporte tu historia</w:t>
       </w:r>
       <w:r>
         <w:t>, se recuerda que es de fundamental importancia respetar el orden de estos lenguajes. En caso de que queramos agregar más lenguajes lo haríamos de la siguiente forma.</w:t>
@@ -3652,13 +4071,39 @@
         <w:t>l</w:t>
       </w:r>
       <w:r>
-        <w:t xml:space="preserve">os valores predeterminados de Renpy puedes hacerlo en el archivo </w:t>
-      </w:r>
+        <w:t xml:space="preserve">os valores predeterminados de </w:t>
+      </w:r>
+      <w:proofErr w:type="spellStart"/>
+      <w:r>
+        <w:t>Renpy</w:t>
+      </w:r>
+      <w:proofErr w:type="spellEnd"/>
+      <w:r>
+        <w:t xml:space="preserve"> puedes hacerlo en el archivo </w:t>
+      </w:r>
+      <w:proofErr w:type="spellStart"/>
       <w:r>
         <w:t>configDefine.rpy</w:t>
       </w:r>
-      <w:r>
-        <w:t xml:space="preserve"> ubicado en la carpeta game/definitions. Allí encontrarás algo así.</w:t>
+      <w:proofErr w:type="spellEnd"/>
+      <w:r>
+        <w:t xml:space="preserve"> ubicado en la carpeta </w:t>
+      </w:r>
+      <w:proofErr w:type="spellStart"/>
+      <w:r>
+        <w:t>game</w:t>
+      </w:r>
+      <w:proofErr w:type="spellEnd"/>
+      <w:r>
+        <w:t>/</w:t>
+      </w:r>
+      <w:proofErr w:type="spellStart"/>
+      <w:r>
+        <w:t>definitions</w:t>
+      </w:r>
+      <w:proofErr w:type="spellEnd"/>
+      <w:r>
+        <w:t>. Allí encontrarás algo así.</w:t>
       </w:r>
     </w:p>
     <w:p>
@@ -3706,7 +4151,47 @@
     <w:p>
       <w:r>
         <w:tab/>
-        <w:t>Por defecto Atlax Renpy utiliza esas configuraciones allí mostradas, establece el tiempo de fadeout de las canciones a 3 segundos y define los layers. Si tienes conocimientos sobre Renpy y necesitas establecer alguna configuración específica debes hacerlo ahí.</w:t>
+        <w:t xml:space="preserve">Por defecto </w:t>
+      </w:r>
+      <w:proofErr w:type="spellStart"/>
+      <w:r>
+        <w:t>Atlax</w:t>
+      </w:r>
+      <w:proofErr w:type="spellEnd"/>
+      <w:r>
+        <w:t xml:space="preserve"> </w:t>
+      </w:r>
+      <w:proofErr w:type="spellStart"/>
+      <w:r>
+        <w:t>Renpy</w:t>
+      </w:r>
+      <w:proofErr w:type="spellEnd"/>
+      <w:r>
+        <w:t xml:space="preserve"> utiliza esas configuraciones allí mostradas, establece el tiempo de </w:t>
+      </w:r>
+      <w:proofErr w:type="spellStart"/>
+      <w:r>
+        <w:t>fadeout</w:t>
+      </w:r>
+      <w:proofErr w:type="spellEnd"/>
+      <w:r>
+        <w:t xml:space="preserve"> de las canciones a 3 segundos y define los </w:t>
+      </w:r>
+      <w:proofErr w:type="spellStart"/>
+      <w:r>
+        <w:t>layers</w:t>
+      </w:r>
+      <w:proofErr w:type="spellEnd"/>
+      <w:r>
+        <w:t xml:space="preserve">. Si tienes conocimientos sobre </w:t>
+      </w:r>
+      <w:proofErr w:type="spellStart"/>
+      <w:r>
+        <w:t>Renpy</w:t>
+      </w:r>
+      <w:proofErr w:type="spellEnd"/>
+      <w:r>
+        <w:t xml:space="preserve"> y necesitas establecer alguna configuración específica debes hacerlo ahí.</w:t>
       </w:r>
     </w:p>
     <w:p>
@@ -3743,7 +4228,31 @@
     <w:p>
       <w:r>
         <w:tab/>
-        <w:t>Crear un archivo de control es muy sencillo, tenemos dos formas de hacerlo, la forma “complicada” es creando un archivo de texto en nuestro computador y colocarle al final .csv, llamémoslo “ejemplo.csv”. Es posible que al abrirlo se ejecute el bloc de notas, para ello tenemos que ir a la configuración de nuestro sistema operativo para que nos permita ver las extensiones o formatos de los archivos, una vez cambiado debemos cambiar “.txt” por “.csv”.</w:t>
+        <w:t>Crear un archivo de control es muy sencillo, tenemos dos formas de hacerlo, la forma “complicada” es creando un archivo de texto en nuestro computador y colocarle al final .</w:t>
+      </w:r>
+      <w:proofErr w:type="spellStart"/>
+      <w:r>
+        <w:t>csv</w:t>
+      </w:r>
+      <w:proofErr w:type="spellEnd"/>
+      <w:r>
+        <w:t>, llamémoslo “ejemplo.csv”. Es posible que al abrirlo se ejecute el bloc de notas, para ello tenemos que ir a la configuración de nuestro sistema operativo para que nos permita ver las extensiones o formatos de los archivos, una vez cambiado debemos cambiar “.</w:t>
+      </w:r>
+      <w:proofErr w:type="spellStart"/>
+      <w:r>
+        <w:t>txt</w:t>
+      </w:r>
+      <w:proofErr w:type="spellEnd"/>
+      <w:r>
+        <w:t>” por “.</w:t>
+      </w:r>
+      <w:proofErr w:type="spellStart"/>
+      <w:r>
+        <w:t>csv</w:t>
+      </w:r>
+      <w:proofErr w:type="spellEnd"/>
+      <w:r>
+        <w:t>”.</w:t>
       </w:r>
     </w:p>
     <w:p>
@@ -3825,7 +4334,23 @@
     <w:p>
       <w:r>
         <w:tab/>
-        <w:t>Si tienes dudas puedes optar por simplemente copiar y pegar alguno de los archivos de control de ejemplo que proporciona Atlax Renpy, borrar su contenido y empezar desde allí.</w:t>
+        <w:t xml:space="preserve">Si tienes dudas puedes optar por simplemente copiar y pegar alguno de los archivos de control de ejemplo que proporciona </w:t>
+      </w:r>
+      <w:proofErr w:type="spellStart"/>
+      <w:r>
+        <w:t>Atlax</w:t>
+      </w:r>
+      <w:proofErr w:type="spellEnd"/>
+      <w:r>
+        <w:t xml:space="preserve"> </w:t>
+      </w:r>
+      <w:proofErr w:type="spellStart"/>
+      <w:r>
+        <w:t>Renpy</w:t>
+      </w:r>
+      <w:proofErr w:type="spellEnd"/>
+      <w:r>
+        <w:t>, borrar su contenido y empezar desde allí.</w:t>
       </w:r>
     </w:p>
     <w:p/>
@@ -4020,13 +4545,91 @@
           <w:szCs w:val="20"/>
         </w:rPr>
       </w:pPr>
+      <w:proofErr w:type="spellStart"/>
+      <w:proofErr w:type="gramStart"/>
       <w:r>
         <w:rPr>
           <w:sz w:val="20"/>
           <w:szCs w:val="20"/>
         </w:rPr>
-        <w:t>Key;Background;Music;Sound;Single effect;Continuous effect;Events;Delay;Emisor</w:t>
-      </w:r>
+        <w:t>Key;Background</w:t>
+      </w:r>
+      <w:proofErr w:type="gramEnd"/>
+      <w:r>
+        <w:rPr>
+          <w:sz w:val="20"/>
+          <w:szCs w:val="20"/>
+        </w:rPr>
+        <w:t>;</w:t>
+      </w:r>
+      <w:proofErr w:type="gramStart"/>
+      <w:r>
+        <w:rPr>
+          <w:sz w:val="20"/>
+          <w:szCs w:val="20"/>
+        </w:rPr>
+        <w:t>Music;Sound</w:t>
+      </w:r>
+      <w:proofErr w:type="gramEnd"/>
+      <w:r>
+        <w:rPr>
+          <w:sz w:val="20"/>
+          <w:szCs w:val="20"/>
+        </w:rPr>
+        <w:t>;Single</w:t>
+      </w:r>
+      <w:proofErr w:type="spellEnd"/>
+      <w:r>
+        <w:rPr>
+          <w:sz w:val="20"/>
+          <w:szCs w:val="20"/>
+        </w:rPr>
+        <w:t xml:space="preserve"> </w:t>
+      </w:r>
+      <w:proofErr w:type="spellStart"/>
+      <w:proofErr w:type="gramStart"/>
+      <w:r>
+        <w:rPr>
+          <w:sz w:val="20"/>
+          <w:szCs w:val="20"/>
+        </w:rPr>
+        <w:t>effect;Continuous</w:t>
+      </w:r>
+      <w:proofErr w:type="spellEnd"/>
+      <w:proofErr w:type="gramEnd"/>
+      <w:r>
+        <w:rPr>
+          <w:sz w:val="20"/>
+          <w:szCs w:val="20"/>
+        </w:rPr>
+        <w:t xml:space="preserve"> </w:t>
+      </w:r>
+      <w:proofErr w:type="spellStart"/>
+      <w:proofErr w:type="gramStart"/>
+      <w:r>
+        <w:rPr>
+          <w:sz w:val="20"/>
+          <w:szCs w:val="20"/>
+        </w:rPr>
+        <w:t>effect;Events</w:t>
+      </w:r>
+      <w:proofErr w:type="gramEnd"/>
+      <w:r>
+        <w:rPr>
+          <w:sz w:val="20"/>
+          <w:szCs w:val="20"/>
+        </w:rPr>
+        <w:t>;</w:t>
+      </w:r>
+      <w:proofErr w:type="gramStart"/>
+      <w:r>
+        <w:rPr>
+          <w:sz w:val="20"/>
+          <w:szCs w:val="20"/>
+        </w:rPr>
+        <w:t>Delay;Emisor</w:t>
+      </w:r>
+      <w:proofErr w:type="gramEnd"/>
       <w:r>
         <w:rPr>
           <w:b/>
@@ -4036,6 +4639,7 @@
         </w:rPr>
         <w:t>;</w:t>
       </w:r>
+      <w:proofErr w:type="gramStart"/>
       <w:r>
         <w:rPr>
           <w:sz w:val="20"/>
@@ -4043,6 +4647,8 @@
         </w:rPr>
         <w:t>Spanish;English</w:t>
       </w:r>
+      <w:proofErr w:type="spellEnd"/>
+      <w:proofErr w:type="gramEnd"/>
     </w:p>
     <w:p>
       <w:pPr>
@@ -4134,7 +4740,23 @@
         <w:t xml:space="preserve"> las columnas de</w:t>
       </w:r>
       <w:r>
-        <w:t xml:space="preserve"> los archivos de control, se debe dejar claro lo siguiente: Atlax Renpy, requiere de un archivo de inicio, por defecto ese archivo se llama testing.csv, más adelante en la sección de personalización se explicará como cambiar el nombre de ese archivo de entrada</w:t>
+        <w:t xml:space="preserve"> los archivos de control, se debe dejar claro lo siguiente: </w:t>
+      </w:r>
+      <w:proofErr w:type="spellStart"/>
+      <w:r>
+        <w:t>Atlax</w:t>
+      </w:r>
+      <w:proofErr w:type="spellEnd"/>
+      <w:r>
+        <w:t xml:space="preserve"> </w:t>
+      </w:r>
+      <w:proofErr w:type="spellStart"/>
+      <w:r>
+        <w:t>Renpy</w:t>
+      </w:r>
+      <w:proofErr w:type="spellEnd"/>
+      <w:r>
+        <w:t>, requiere de un archivo de inicio, por defecto ese archivo se llama testing.csv, más adelante en la sección de personalización se explicará como cambiar el nombre de ese archivo de entrada</w:t>
       </w:r>
       <w:r>
         <w:t>.</w:t>
@@ -4154,8 +4776,13 @@
         <w:t>a</w:t>
       </w:r>
       <w:r>
-        <w:t xml:space="preserve"> es simplemente escribir dentro de ese testing.csv para visualizar lo que vayas haciendo en el archivo utilizando Renpy</w:t>
-      </w:r>
+        <w:t xml:space="preserve"> es simplemente escribir dentro de ese testing.csv para visualizar lo que vayas haciendo en el archivo utilizando </w:t>
+      </w:r>
+      <w:proofErr w:type="spellStart"/>
+      <w:r>
+        <w:t>Renpy</w:t>
+      </w:r>
+      <w:proofErr w:type="spellEnd"/>
       <w:r>
         <w:t xml:space="preserve"> y posteriormente pasar su contenido a otro archivo para ir almacenando las escenas completadas.</w:t>
       </w:r>
@@ -4185,7 +4812,39 @@
     <w:p>
       <w:r>
         <w:tab/>
-        <w:t>El valor recomendado para colocar en esta columna key es el siguiente: [ruta]_[capitulo]_[escena]_[dialogo], por ejemplo si queremos describir el diálogo número 89 de la escena noche de paseo del capítulo 3 de la ruta Stefannie, haríamos algo así: stefannie_3_night_out_89, el siguiente diálogo sería igual pero con un 90 en vez de 89 y siempre empezando en 1.</w:t>
+        <w:t xml:space="preserve">El valor recomendado para colocar en esta columna </w:t>
+      </w:r>
+      <w:proofErr w:type="spellStart"/>
+      <w:r>
+        <w:t>key</w:t>
+      </w:r>
+      <w:proofErr w:type="spellEnd"/>
+      <w:r>
+        <w:t xml:space="preserve"> es el siguiente: [ruta]_[capitulo]_[escena]_[dialogo], por </w:t>
+      </w:r>
+      <w:proofErr w:type="gramStart"/>
+      <w:r>
+        <w:t>ejemplo</w:t>
+      </w:r>
+      <w:proofErr w:type="gramEnd"/>
+      <w:r>
+        <w:t xml:space="preserve"> si queremos describir el diálogo número 89 de la escena noche de paseo del capítulo 3 de la ruta </w:t>
+      </w:r>
+      <w:proofErr w:type="spellStart"/>
+      <w:r>
+        <w:t>Stefannie</w:t>
+      </w:r>
+      <w:proofErr w:type="spellEnd"/>
+      <w:r>
+        <w:t xml:space="preserve">, haríamos algo así: stefannie_3_night_out_89, el siguiente diálogo sería </w:t>
+      </w:r>
+      <w:proofErr w:type="gramStart"/>
+      <w:r>
+        <w:t>igual</w:t>
+      </w:r>
+      <w:proofErr w:type="gramEnd"/>
+      <w:r>
+        <w:t xml:space="preserve"> pero con un 90 en vez de 89 y siempre empezando en 1.</w:t>
       </w:r>
     </w:p>
     <w:p>
@@ -4197,7 +4856,15 @@
       </w:r>
       <w:r>
         <w:lastRenderedPageBreak/>
-        <w:t>seguido dirigimos el cursor a la esquina inferior derecha de la celda seleccionada y manteniendo el click, lo arrastramos hacia abajo hasta donde veamos necesario.</w:t>
+        <w:t xml:space="preserve">seguido dirigimos el cursor a la esquina inferior derecha de la celda seleccionada y manteniendo el </w:t>
+      </w:r>
+      <w:proofErr w:type="spellStart"/>
+      <w:r>
+        <w:t>click</w:t>
+      </w:r>
+      <w:proofErr w:type="spellEnd"/>
+      <w:r>
+        <w:t>, lo arrastramos hacia abajo hasta donde veamos necesario.</w:t>
       </w:r>
     </w:p>
     <w:p>
@@ -4370,9 +5037,14 @@
       </w:pPr>
       <w:bookmarkStart w:id="8" w:name="_Toc199261561"/>
       <w:r>
-        <w:t>Columna Background</w:t>
+        <w:t xml:space="preserve">Columna </w:t>
+      </w:r>
+      <w:proofErr w:type="spellStart"/>
+      <w:r>
+        <w:t>Background</w:t>
       </w:r>
       <w:bookmarkEnd w:id="8"/>
+      <w:proofErr w:type="spellEnd"/>
     </w:p>
     <w:p>
       <w:r>
@@ -4385,7 +5057,23 @@
         <w:ind w:firstLine="708"/>
       </w:pPr>
       <w:r>
-        <w:t>Nombre del fondo : tipo de transición : parámetros de la transición</w:t>
+        <w:t xml:space="preserve">Nombre del </w:t>
+      </w:r>
+      <w:proofErr w:type="gramStart"/>
+      <w:r>
+        <w:t>fondo :</w:t>
+      </w:r>
+      <w:proofErr w:type="gramEnd"/>
+      <w:r>
+        <w:t xml:space="preserve"> tipo de </w:t>
+      </w:r>
+      <w:proofErr w:type="gramStart"/>
+      <w:r>
+        <w:t>transición :</w:t>
+      </w:r>
+      <w:proofErr w:type="gramEnd"/>
+      <w:r>
+        <w:t xml:space="preserve"> parámetros de la transición</w:t>
       </w:r>
     </w:p>
     <w:p>
@@ -4419,7 +5107,15 @@
         </w:numPr>
       </w:pPr>
       <w:r>
-        <w:t>school_hall_3:dissolve:4</w:t>
+        <w:t>school_hall_</w:t>
+      </w:r>
+      <w:proofErr w:type="gramStart"/>
+      <w:r>
+        <w:t>3:dissolve</w:t>
+      </w:r>
+      <w:proofErr w:type="gramEnd"/>
+      <w:r>
+        <w:t>:4</w:t>
       </w:r>
     </w:p>
     <w:p>
@@ -4430,8 +5126,13 @@
           <w:numId w:val="5"/>
         </w:numPr>
       </w:pPr>
-      <w:r>
-        <w:t>campus:fade:1:3:1</w:t>
+      <w:proofErr w:type="gramStart"/>
+      <w:r>
+        <w:t>campus:fade</w:t>
+      </w:r>
+      <w:proofErr w:type="gramEnd"/>
+      <w:r>
+        <w:t>:1:3:1</w:t>
       </w:r>
     </w:p>
     <w:p>
@@ -4442,8 +5143,13 @@
           <w:numId w:val="5"/>
         </w:numPr>
       </w:pPr>
-      <w:r>
-        <w:t>music_room (Aparece con la transición por defecto)</w:t>
+      <w:proofErr w:type="spellStart"/>
+      <w:r>
+        <w:t>music_room</w:t>
+      </w:r>
+      <w:proofErr w:type="spellEnd"/>
+      <w:r>
+        <w:t xml:space="preserve"> (Aparece con la transición por defecto)</w:t>
       </w:r>
     </w:p>
     <w:p>
@@ -4580,9 +5286,11 @@
             <w:pPr>
               <w:jc w:val="center"/>
             </w:pPr>
+            <w:proofErr w:type="spellStart"/>
             <w:r>
               <w:t>dissolve</w:t>
             </w:r>
+            <w:proofErr w:type="spellEnd"/>
           </w:p>
         </w:tc>
         <w:tc>
@@ -4631,9 +5339,11 @@
             <w:pPr>
               <w:jc w:val="center"/>
             </w:pPr>
+            <w:proofErr w:type="spellStart"/>
             <w:r>
               <w:t>fade</w:t>
             </w:r>
+            <w:proofErr w:type="spellEnd"/>
           </w:p>
         </w:tc>
         <w:tc>
@@ -4799,7 +5509,15 @@
               <w:jc w:val="center"/>
             </w:pPr>
             <w:r>
-              <w:t>El fondo actual se pixela hasta el color de mayor presencia, luego cambia de color y muestra el siguiente fondo haciendo el proceso inverso. (Se recomienda dejarlo por defecto)</w:t>
+              <w:t xml:space="preserve">El fondo actual se </w:t>
+            </w:r>
+            <w:proofErr w:type="spellStart"/>
+            <w:r>
+              <w:t>pixela</w:t>
+            </w:r>
+            <w:proofErr w:type="spellEnd"/>
+            <w:r>
+              <w:t xml:space="preserve"> hasta el color de mayor presencia, luego cambia de color y muestra el siguiente fondo haciendo el proceso inverso. (Se recomienda dejarlo por defecto)</w:t>
             </w:r>
           </w:p>
         </w:tc>
@@ -4874,6 +5592,7 @@
             <w:pPr>
               <w:jc w:val="center"/>
             </w:pPr>
+            <w:proofErr w:type="spellStart"/>
             <w:r>
               <w:t>p</w:t>
             </w:r>
@@ -4881,8 +5600,33 @@
               <w:t>ush</w:t>
             </w:r>
             <w:r>
-              <w:t>up / pushright / pushdown / pushleft</w:t>
-            </w:r>
+              <w:t>up</w:t>
+            </w:r>
+            <w:proofErr w:type="spellEnd"/>
+            <w:r>
+              <w:t xml:space="preserve"> / </w:t>
+            </w:r>
+            <w:proofErr w:type="spellStart"/>
+            <w:r>
+              <w:t>pushright</w:t>
+            </w:r>
+            <w:proofErr w:type="spellEnd"/>
+            <w:r>
+              <w:t xml:space="preserve"> / </w:t>
+            </w:r>
+            <w:proofErr w:type="spellStart"/>
+            <w:r>
+              <w:t>pushdown</w:t>
+            </w:r>
+            <w:proofErr w:type="spellEnd"/>
+            <w:r>
+              <w:t xml:space="preserve"> / </w:t>
+            </w:r>
+            <w:proofErr w:type="spellStart"/>
+            <w:r>
+              <w:t>pushleft</w:t>
+            </w:r>
+            <w:proofErr w:type="spellEnd"/>
           </w:p>
           <w:p/>
         </w:tc>
@@ -4931,9 +5675,35 @@
             <w:pPr>
               <w:jc w:val="center"/>
             </w:pPr>
-            <w:r>
-              <w:t>rup / rright / rdown / rleft</w:t>
-            </w:r>
+            <w:proofErr w:type="spellStart"/>
+            <w:r>
+              <w:t>rup</w:t>
+            </w:r>
+            <w:proofErr w:type="spellEnd"/>
+            <w:r>
+              <w:t xml:space="preserve"> / </w:t>
+            </w:r>
+            <w:proofErr w:type="spellStart"/>
+            <w:r>
+              <w:t>rright</w:t>
+            </w:r>
+            <w:proofErr w:type="spellEnd"/>
+            <w:r>
+              <w:t xml:space="preserve"> / </w:t>
+            </w:r>
+            <w:proofErr w:type="spellStart"/>
+            <w:r>
+              <w:t>rdown</w:t>
+            </w:r>
+            <w:proofErr w:type="spellEnd"/>
+            <w:r>
+              <w:t xml:space="preserve"> / </w:t>
+            </w:r>
+            <w:proofErr w:type="spellStart"/>
+            <w:r>
+              <w:t>rleft</w:t>
+            </w:r>
+            <w:proofErr w:type="spellEnd"/>
           </w:p>
         </w:tc>
         <w:tc>
@@ -4992,7 +5762,23 @@
         <w:ind w:firstLine="708"/>
       </w:pPr>
       <w:r>
-        <w:t>La columna encargada de realizar los cambios de música en el juego, estos deben estar en la carpeta game/audio/music y además de poseer formato .wav. Hay que dejar claro 2 conceptos.</w:t>
+        <w:t xml:space="preserve">La columna encargada de realizar los cambios de música en el juego, estos deben estar en la carpeta </w:t>
+      </w:r>
+      <w:proofErr w:type="spellStart"/>
+      <w:r>
+        <w:t>game</w:t>
+      </w:r>
+      <w:proofErr w:type="spellEnd"/>
+      <w:r>
+        <w:t>/audio/music y además de poseer formato .</w:t>
+      </w:r>
+      <w:proofErr w:type="spellStart"/>
+      <w:r>
+        <w:t>wav</w:t>
+      </w:r>
+      <w:proofErr w:type="spellEnd"/>
+      <w:r>
+        <w:t>. Hay que dejar claro 2 conceptos.</w:t>
       </w:r>
     </w:p>
     <w:p>
@@ -5003,8 +5789,13 @@
           <w:numId w:val="6"/>
         </w:numPr>
       </w:pPr>
-      <w:r>
-        <w:t>Fade-in: Tiempo en el que una canción pasa del silencio al 100%</w:t>
+      <w:proofErr w:type="spellStart"/>
+      <w:r>
+        <w:t>Fade</w:t>
+      </w:r>
+      <w:proofErr w:type="spellEnd"/>
+      <w:r>
+        <w:t>-in: Tiempo en el que una canción pasa del silencio al 100%</w:t>
       </w:r>
     </w:p>
     <w:p>
@@ -5015,8 +5806,13 @@
           <w:numId w:val="6"/>
         </w:numPr>
       </w:pPr>
-      <w:r>
-        <w:t>Fade-out:</w:t>
+      <w:proofErr w:type="spellStart"/>
+      <w:r>
+        <w:t>Fade-out</w:t>
+      </w:r>
+      <w:proofErr w:type="spellEnd"/>
+      <w:r>
+        <w:t>:</w:t>
       </w:r>
       <w:r>
         <w:t xml:space="preserve"> </w:t>
@@ -5042,7 +5838,31 @@
         <w:t>canción</w:t>
       </w:r>
       <w:r>
-        <w:t xml:space="preserve"> que se está reproduciendo hará un fade-out de 3 segundos (definido en configDefine.rpy), será igual para las músicas entrantes si no se les coloca un tiempo de fade-in</w:t>
+        <w:t xml:space="preserve"> que se está reproduciendo hará un </w:t>
+      </w:r>
+      <w:proofErr w:type="spellStart"/>
+      <w:r>
+        <w:t>fade-out</w:t>
+      </w:r>
+      <w:proofErr w:type="spellEnd"/>
+      <w:r>
+        <w:t xml:space="preserve"> de 3 segundos (definido en </w:t>
+      </w:r>
+      <w:proofErr w:type="spellStart"/>
+      <w:r>
+        <w:t>configDefine.rpy</w:t>
+      </w:r>
+      <w:proofErr w:type="spellEnd"/>
+      <w:r>
+        <w:t xml:space="preserve">), será igual para las músicas entrantes si no se les coloca un tiempo de </w:t>
+      </w:r>
+      <w:proofErr w:type="spellStart"/>
+      <w:r>
+        <w:t>fade</w:t>
+      </w:r>
+      <w:proofErr w:type="spellEnd"/>
+      <w:r>
+        <w:t>-in</w:t>
       </w:r>
       <w:r>
         <w:t xml:space="preserve">. </w:t>
@@ -5055,8 +5875,29 @@
       <w:pPr>
         <w:ind w:left="708" w:firstLine="708"/>
       </w:pPr>
-      <w:r>
-        <w:t>nombre_de_la_musica : fade-in en segundos</w:t>
+      <w:proofErr w:type="spellStart"/>
+      <w:r>
+        <w:t>nombre_de_la_</w:t>
+      </w:r>
+      <w:proofErr w:type="gramStart"/>
+      <w:r>
+        <w:t>musica</w:t>
+      </w:r>
+      <w:proofErr w:type="spellEnd"/>
+      <w:r>
+        <w:t xml:space="preserve"> :</w:t>
+      </w:r>
+      <w:proofErr w:type="gramEnd"/>
+      <w:r>
+        <w:t xml:space="preserve"> </w:t>
+      </w:r>
+      <w:proofErr w:type="spellStart"/>
+      <w:r>
+        <w:t>fade</w:t>
+      </w:r>
+      <w:proofErr w:type="spellEnd"/>
+      <w:r>
+        <w:t>-in en segundos</w:t>
       </w:r>
     </w:p>
     <w:p>
@@ -5079,22 +5920,32 @@
       </w:pPr>
       <w:r>
         <w:lastRenderedPageBreak/>
-        <w:t>Para quitar la música y crear un silencio, simplemente debemos colocar un *, por supuesto, también podemos acompañarlo del parámetro de fade-in</w:t>
-      </w:r>
-      <w:r>
-        <w:t xml:space="preserve"> que en este caso tomará el rol de fade-out.</w:t>
+        <w:t xml:space="preserve">Para quitar la música y crear un silencio, simplemente debemos colocar un *, por supuesto, también podemos acompañarlo del parámetro de </w:t>
+      </w:r>
+      <w:proofErr w:type="spellStart"/>
+      <w:r>
+        <w:t>fade</w:t>
+      </w:r>
+      <w:proofErr w:type="spellEnd"/>
+      <w:r>
+        <w:t>-in</w:t>
+      </w:r>
+      <w:r>
+        <w:t xml:space="preserve"> que en este caso tomará el rol de </w:t>
+      </w:r>
+      <w:proofErr w:type="spellStart"/>
+      <w:r>
+        <w:t>fade-out</w:t>
+      </w:r>
+      <w:proofErr w:type="spellEnd"/>
+      <w:r>
+        <w:t>.</w:t>
       </w:r>
     </w:p>
     <w:p>
       <w:r>
         <w:tab/>
-        <w:t>Ejemplo</w:t>
-      </w:r>
-      <w:r>
-        <w:t>s</w:t>
-      </w:r>
-      <w:r>
-        <w:t>:</w:t>
+        <w:t>Ejemplos:</w:t>
       </w:r>
     </w:p>
     <w:p>
@@ -5105,8 +5956,37 @@
           <w:numId w:val="7"/>
         </w:numPr>
       </w:pPr>
-      <w:r>
-        <w:t>while we speak:4 (La música actual hace el fade-out por defecto y la nueva fade-in de 4 segundos)</w:t>
+      <w:proofErr w:type="spellStart"/>
+      <w:r>
+        <w:t>while</w:t>
+      </w:r>
+      <w:proofErr w:type="spellEnd"/>
+      <w:r>
+        <w:t xml:space="preserve"> </w:t>
+      </w:r>
+      <w:proofErr w:type="spellStart"/>
+      <w:r>
+        <w:t>we</w:t>
+      </w:r>
+      <w:proofErr w:type="spellEnd"/>
+      <w:r>
+        <w:t xml:space="preserve"> speak:4 (La música actual hace el </w:t>
+      </w:r>
+      <w:proofErr w:type="spellStart"/>
+      <w:r>
+        <w:t>fade-out</w:t>
+      </w:r>
+      <w:proofErr w:type="spellEnd"/>
+      <w:r>
+        <w:t xml:space="preserve"> por defecto y la nueva </w:t>
+      </w:r>
+      <w:proofErr w:type="spellStart"/>
+      <w:r>
+        <w:t>fade</w:t>
+      </w:r>
+      <w:proofErr w:type="spellEnd"/>
+      <w:r>
+        <w:t>-in de 4 segundos)</w:t>
       </w:r>
     </w:p>
     <w:p>
@@ -5117,8 +5997,21 @@
           <w:numId w:val="7"/>
         </w:numPr>
       </w:pPr>
-      <w:r>
-        <w:t>stride (Tanto la música actual y la entrante harán un fade-out y fide-in por defecto)</w:t>
+      <w:proofErr w:type="spellStart"/>
+      <w:r>
+        <w:t>stride</w:t>
+      </w:r>
+      <w:proofErr w:type="spellEnd"/>
+      <w:r>
+        <w:t xml:space="preserve"> (Tanto la música actual y la entrante harán un </w:t>
+      </w:r>
+      <w:proofErr w:type="spellStart"/>
+      <w:r>
+        <w:t>fade-out</w:t>
+      </w:r>
+      <w:proofErr w:type="spellEnd"/>
+      <w:r>
+        <w:t xml:space="preserve"> y fide-in por defecto)</w:t>
       </w:r>
     </w:p>
     <w:p>
@@ -5130,7 +6023,15 @@
         </w:numPr>
       </w:pPr>
       <w:r>
-        <w:t>*:5 (La canción actual hace un fade-out de 5 segundos al silencio)</w:t>
+        <w:t xml:space="preserve">*:5 (La canción actual hace un </w:t>
+      </w:r>
+      <w:proofErr w:type="spellStart"/>
+      <w:r>
+        <w:t>fade-out</w:t>
+      </w:r>
+      <w:proofErr w:type="spellEnd"/>
+      <w:r>
+        <w:t xml:space="preserve"> de 5 segundos al silencio)</w:t>
       </w:r>
     </w:p>
     <w:p>
@@ -5156,14 +6057,43 @@
       </w:pPr>
       <w:bookmarkStart w:id="10" w:name="_Toc199261563"/>
       <w:r>
-        <w:t>Columna Sound</w:t>
+        <w:t xml:space="preserve">Columna </w:t>
+      </w:r>
+      <w:proofErr w:type="spellStart"/>
+      <w:r>
+        <w:t>Sound</w:t>
       </w:r>
       <w:bookmarkEnd w:id="10"/>
+      <w:proofErr w:type="spellEnd"/>
     </w:p>
     <w:p>
       <w:r>
         <w:tab/>
-        <w:t>Los sonidos que se reproducen en el diálogo, pueden ser varios a la vez. Deben estar en formato .wav y estar ubicados en la carpeta games/audio/sounds. Generalmente se reproducirán una vez, sin embargo</w:t>
+        <w:t>Los sonidos que se reproducen en el diálogo, pueden ser varios a la vez. Deben estar en formato .</w:t>
+      </w:r>
+      <w:proofErr w:type="spellStart"/>
+      <w:r>
+        <w:t>wav</w:t>
+      </w:r>
+      <w:proofErr w:type="spellEnd"/>
+      <w:r>
+        <w:t xml:space="preserve"> y estar ubicados en la carpeta </w:t>
+      </w:r>
+      <w:proofErr w:type="spellStart"/>
+      <w:r>
+        <w:t>games</w:t>
+      </w:r>
+      <w:proofErr w:type="spellEnd"/>
+      <w:r>
+        <w:t>/audio/</w:t>
+      </w:r>
+      <w:proofErr w:type="spellStart"/>
+      <w:r>
+        <w:t>sounds</w:t>
+      </w:r>
+      <w:proofErr w:type="spellEnd"/>
+      <w:r>
+        <w:t>. Generalmente se reproducirán una vez, sin embargo</w:t>
       </w:r>
       <w:r>
         <w:t>,</w:t>
@@ -5175,8 +6105,12 @@
     <w:p>
       <w:r>
         <w:tab/>
+      </w:r>
+      <w:proofErr w:type="spellStart"/>
+      <w:r>
         <w:t>Nombre_del_sonido</w:t>
       </w:r>
+      <w:proofErr w:type="spellEnd"/>
     </w:p>
     <w:p>
       <w:r>
@@ -5187,8 +6121,21 @@
     <w:p>
       <w:r>
         <w:tab/>
-        <w:t>Nombre del sonido : loop</w:t>
-      </w:r>
+        <w:t xml:space="preserve">Nombre del </w:t>
+      </w:r>
+      <w:proofErr w:type="gramStart"/>
+      <w:r>
+        <w:t>sonido :</w:t>
+      </w:r>
+      <w:proofErr w:type="gramEnd"/>
+      <w:r>
+        <w:t xml:space="preserve"> </w:t>
+      </w:r>
+      <w:proofErr w:type="spellStart"/>
+      <w:r>
+        <w:t>loop</w:t>
+      </w:r>
+      <w:proofErr w:type="spellEnd"/>
     </w:p>
     <w:p>
       <w:r>
@@ -5199,7 +6146,20 @@
     <w:p>
       <w:r>
         <w:tab/>
-        <w:t xml:space="preserve">Si colocamos el nombre del sonido sin más, este se reproducirá una sola vez. Para reproducir varios sonidos simultáneamente, debemos separarlos por comas. Si deseamos que el sonido se reproduzca constantemente debemos añadir :loop, es importante mencionar que hacer eso hará que el sonido se reproduzca indefinidamente hasta que volvamos a escribir la misma instrucción más adelante. </w:t>
+        <w:t xml:space="preserve">Si colocamos el nombre del sonido sin más, este se reproducirá una sola vez. Para reproducir varios sonidos simultáneamente, debemos separarlos por comas. Si deseamos que el sonido se reproduzca constantemente debemos </w:t>
+      </w:r>
+      <w:proofErr w:type="gramStart"/>
+      <w:r>
+        <w:t>añadir :</w:t>
+      </w:r>
+      <w:proofErr w:type="spellStart"/>
+      <w:r>
+        <w:t>loop</w:t>
+      </w:r>
+      <w:proofErr w:type="spellEnd"/>
+      <w:proofErr w:type="gramEnd"/>
+      <w:r>
+        <w:t xml:space="preserve">, es importante mencionar que hacer eso hará que el sonido se reproduzca indefinidamente hasta que volvamos a escribir la misma instrucción más adelante. </w:t>
       </w:r>
     </w:p>
     <w:p>
@@ -5241,7 +6201,27 @@
         </w:numPr>
       </w:pPr>
       <w:r>
-        <w:t>Espadas chocando:loop (Reproduce espadas chocando indefinidamente hasta que se vuelva a escribir Espadas chocando:loop en un diálogo posterior).</w:t>
+        <w:t xml:space="preserve">Espadas </w:t>
+      </w:r>
+      <w:proofErr w:type="spellStart"/>
+      <w:proofErr w:type="gramStart"/>
+      <w:r>
+        <w:t>chocando:loop</w:t>
+      </w:r>
+      <w:proofErr w:type="spellEnd"/>
+      <w:proofErr w:type="gramEnd"/>
+      <w:r>
+        <w:t xml:space="preserve"> (Reproduce espadas chocando indefinidamente hasta que se vuelva a escribir Espadas </w:t>
+      </w:r>
+      <w:proofErr w:type="spellStart"/>
+      <w:proofErr w:type="gramStart"/>
+      <w:r>
+        <w:t>chocando:loop</w:t>
+      </w:r>
+      <w:proofErr w:type="spellEnd"/>
+      <w:proofErr w:type="gramEnd"/>
+      <w:r>
+        <w:t xml:space="preserve"> en un diálogo posterior).</w:t>
       </w:r>
     </w:p>
     <w:p>
@@ -5249,13 +6229,37 @@
         <w:ind w:left="360" w:firstLine="348"/>
       </w:pPr>
       <w:r>
-        <w:t xml:space="preserve">Se debe tener en cuenta que si un sonido está en loop y se reproduce </w:t>
+        <w:t xml:space="preserve">Se debe tener en cuenta </w:t>
+      </w:r>
+      <w:proofErr w:type="gramStart"/>
+      <w:r>
+        <w:t>que</w:t>
+      </w:r>
+      <w:proofErr w:type="gramEnd"/>
+      <w:r>
+        <w:t xml:space="preserve"> si un sonido está en </w:t>
+      </w:r>
+      <w:proofErr w:type="spellStart"/>
+      <w:r>
+        <w:t>loop</w:t>
+      </w:r>
+      <w:proofErr w:type="spellEnd"/>
+      <w:r>
+        <w:t xml:space="preserve"> y se reproduce </w:t>
       </w:r>
       <w:r>
         <w:t>otro</w:t>
       </w:r>
       <w:r>
-        <w:t xml:space="preserve"> sonido, el loop se detendrá</w:t>
+        <w:t xml:space="preserve"> sonido, el </w:t>
+      </w:r>
+      <w:proofErr w:type="spellStart"/>
+      <w:r>
+        <w:t>loop</w:t>
+      </w:r>
+      <w:proofErr w:type="spellEnd"/>
+      <w:r>
+        <w:t xml:space="preserve"> se detendrá</w:t>
       </w:r>
       <w:r>
         <w:t xml:space="preserve"> y sonará el sonido escrito</w:t>
@@ -5269,7 +6273,15 @@
         <w:ind w:left="360" w:firstLine="348"/>
       </w:pPr>
       <w:r>
-        <w:t>No se pueden colocar 2 sonidos en loop al mismo tiempo, en caso de que lo necesite se recomienda editar y solapar ambos audios en uno solo.</w:t>
+        <w:t xml:space="preserve">No se pueden colocar 2 sonidos en </w:t>
+      </w:r>
+      <w:proofErr w:type="spellStart"/>
+      <w:r>
+        <w:t>loop</w:t>
+      </w:r>
+      <w:proofErr w:type="spellEnd"/>
+      <w:r>
+        <w:t xml:space="preserve"> al mismo tiempo, en caso de que lo necesite se recomienda editar y solapar ambos audios en uno solo.</w:t>
       </w:r>
     </w:p>
     <w:p>
@@ -5287,9 +6299,413 @@
         <w:pStyle w:val="Ttulo2"/>
       </w:pPr>
       <w:r>
-        <w:t>Columna Single effect</w:t>
+        <w:t xml:space="preserve">Columna Single </w:t>
+      </w:r>
+      <w:proofErr w:type="spellStart"/>
+      <w:r>
+        <w:t>effect</w:t>
       </w:r>
       <w:bookmarkEnd w:id="11"/>
+      <w:proofErr w:type="spellEnd"/>
+    </w:p>
+    <w:p>
+      <w:r>
+        <w:tab/>
+        <w:t>Son efectos visuales que suceden una única vez, como una sacudida de pantalla o flash repentino. Sintaxis:</w:t>
+      </w:r>
+    </w:p>
+    <w:p>
+      <w:r>
+        <w:tab/>
+      </w:r>
+      <w:proofErr w:type="spellStart"/>
+      <w:r>
+        <w:t>Nombre_del_</w:t>
+      </w:r>
+      <w:proofErr w:type="gramStart"/>
+      <w:r>
+        <w:t>efecto</w:t>
+      </w:r>
+      <w:proofErr w:type="spellEnd"/>
+      <w:r>
+        <w:t xml:space="preserve"> :</w:t>
+      </w:r>
+      <w:proofErr w:type="gramEnd"/>
+      <w:r>
+        <w:t xml:space="preserve"> parámetros</w:t>
+      </w:r>
+    </w:p>
+    <w:p>
+      <w:r>
+        <w:tab/>
+        <w:t>Nombre_del_efecto_</w:t>
+      </w:r>
+      <w:proofErr w:type="gramStart"/>
+      <w:r>
+        <w:t>1:parámetros</w:t>
+      </w:r>
+      <w:proofErr w:type="gramEnd"/>
+      <w:r>
+        <w:t>, Nombre_del_efecto_</w:t>
+      </w:r>
+      <w:proofErr w:type="gramStart"/>
+      <w:r>
+        <w:t>2:parámetros</w:t>
+      </w:r>
+      <w:proofErr w:type="gramEnd"/>
+    </w:p>
+    <w:p>
+      <w:r>
+        <w:tab/>
+        <w:t>Podemos colocar varios efectos en un mismo diálogo, estos se efectuarán uno a uno en el orden escritos.</w:t>
+      </w:r>
+    </w:p>
+    <w:p>
+      <w:pPr>
+        <w:pStyle w:val="Ttulo3"/>
+      </w:pPr>
+      <w:r>
+        <w:t>Efectos simples</w:t>
+      </w:r>
+    </w:p>
+    <w:tbl>
+      <w:tblPr>
+        <w:tblStyle w:val="Tablaconcuadrcula"/>
+        <w:tblW w:w="0" w:type="auto"/>
+        <w:tblLook w:val="04A0" w:firstRow="1" w:lastRow="0" w:firstColumn="1" w:lastColumn="0" w:noHBand="0" w:noVBand="1"/>
+      </w:tblPr>
+      <w:tblGrid>
+        <w:gridCol w:w="1555"/>
+        <w:gridCol w:w="3402"/>
+        <w:gridCol w:w="3537"/>
+      </w:tblGrid>
+      <w:tr>
+        <w:trPr>
+          <w:trHeight w:val="531"/>
+        </w:trPr>
+        <w:tc>
+          <w:tcPr>
+            <w:tcW w:w="1555" w:type="dxa"/>
+            <w:vAlign w:val="center"/>
+          </w:tcPr>
+          <w:p>
+            <w:pPr>
+              <w:jc w:val="center"/>
+              <w:rPr>
+                <w:b/>
+                <w:bCs/>
+                <w:sz w:val="28"/>
+                <w:szCs w:val="28"/>
+              </w:rPr>
+            </w:pPr>
+            <w:r>
+              <w:rPr>
+                <w:b/>
+                <w:bCs/>
+                <w:sz w:val="28"/>
+                <w:szCs w:val="28"/>
+              </w:rPr>
+              <w:t>Nombre</w:t>
+            </w:r>
+          </w:p>
+        </w:tc>
+        <w:tc>
+          <w:tcPr>
+            <w:tcW w:w="3402" w:type="dxa"/>
+            <w:vAlign w:val="center"/>
+          </w:tcPr>
+          <w:p>
+            <w:pPr>
+              <w:jc w:val="center"/>
+              <w:rPr>
+                <w:b/>
+                <w:bCs/>
+                <w:sz w:val="28"/>
+                <w:szCs w:val="28"/>
+              </w:rPr>
+            </w:pPr>
+            <w:r>
+              <w:rPr>
+                <w:b/>
+                <w:bCs/>
+                <w:sz w:val="28"/>
+                <w:szCs w:val="28"/>
+              </w:rPr>
+              <w:t>Descripción</w:t>
+            </w:r>
+          </w:p>
+        </w:tc>
+        <w:tc>
+          <w:tcPr>
+            <w:tcW w:w="3537" w:type="dxa"/>
+            <w:vAlign w:val="center"/>
+          </w:tcPr>
+          <w:p>
+            <w:pPr>
+              <w:jc w:val="center"/>
+              <w:rPr>
+                <w:b/>
+                <w:bCs/>
+                <w:sz w:val="28"/>
+                <w:szCs w:val="28"/>
+              </w:rPr>
+            </w:pPr>
+            <w:r>
+              <w:rPr>
+                <w:b/>
+                <w:bCs/>
+                <w:sz w:val="28"/>
+                <w:szCs w:val="28"/>
+              </w:rPr>
+              <w:t>Parámetros</w:t>
+            </w:r>
+          </w:p>
+        </w:tc>
+      </w:tr>
+      <w:tr>
+        <w:trPr>
+          <w:trHeight w:val="1298"/>
+        </w:trPr>
+        <w:tc>
+          <w:tcPr>
+            <w:tcW w:w="1555" w:type="dxa"/>
+            <w:vAlign w:val="center"/>
+          </w:tcPr>
+          <w:p>
+            <w:pPr>
+              <w:jc w:val="center"/>
+            </w:pPr>
+            <w:proofErr w:type="spellStart"/>
+            <w:r>
+              <w:t>vpunch</w:t>
+            </w:r>
+            <w:proofErr w:type="spellEnd"/>
+            <w:r>
+              <w:t xml:space="preserve"> / </w:t>
+            </w:r>
+            <w:proofErr w:type="spellStart"/>
+            <w:r>
+              <w:t>hpunch</w:t>
+            </w:r>
+            <w:proofErr w:type="spellEnd"/>
+          </w:p>
+        </w:tc>
+        <w:tc>
+          <w:tcPr>
+            <w:tcW w:w="3402" w:type="dxa"/>
+            <w:vAlign w:val="center"/>
+          </w:tcPr>
+          <w:p>
+            <w:pPr>
+              <w:jc w:val="center"/>
+            </w:pPr>
+            <w:r>
+              <w:t>El fondo de pantalla se mueve en horizontal (</w:t>
+            </w:r>
+            <w:proofErr w:type="spellStart"/>
+            <w:r>
+              <w:t>hpunch</w:t>
+            </w:r>
+            <w:proofErr w:type="spellEnd"/>
+            <w:r>
+              <w:t>) o vertical (</w:t>
+            </w:r>
+            <w:proofErr w:type="spellStart"/>
+            <w:r>
+              <w:t>vpunch</w:t>
+            </w:r>
+            <w:proofErr w:type="spellEnd"/>
+            <w:r>
+              <w:t>) simulando con golpe de una intensidad dada</w:t>
+            </w:r>
+          </w:p>
+        </w:tc>
+        <w:tc>
+          <w:tcPr>
+            <w:tcW w:w="3537" w:type="dxa"/>
+            <w:vAlign w:val="center"/>
+          </w:tcPr>
+          <w:p>
+            <w:pPr>
+              <w:jc w:val="center"/>
+            </w:pPr>
+            <w:r>
+              <w:t xml:space="preserve">1. </w:t>
+            </w:r>
+            <w:r>
+              <w:t>La intensidad del golpe. Ejemplo 10 un golpe sutil, 60 un golpe fuerte y 100 un golpe exagerado</w:t>
+            </w:r>
+            <w:r>
+              <w:t>. (20)</w:t>
+            </w:r>
+          </w:p>
+        </w:tc>
+      </w:tr>
+      <w:tr>
+        <w:trPr>
+          <w:trHeight w:val="732"/>
+        </w:trPr>
+        <w:tc>
+          <w:tcPr>
+            <w:tcW w:w="1555" w:type="dxa"/>
+            <w:vMerge w:val="restart"/>
+            <w:vAlign w:val="center"/>
+          </w:tcPr>
+          <w:p>
+            <w:pPr>
+              <w:jc w:val="center"/>
+            </w:pPr>
+            <w:r>
+              <w:t>Nombre de un fondo</w:t>
+            </w:r>
+          </w:p>
+        </w:tc>
+        <w:tc>
+          <w:tcPr>
+            <w:tcW w:w="3402" w:type="dxa"/>
+            <w:vMerge w:val="restart"/>
+            <w:vAlign w:val="center"/>
+          </w:tcPr>
+          <w:p>
+            <w:pPr>
+              <w:jc w:val="center"/>
+            </w:pPr>
+            <w:r>
+              <w:t>El juego muestra unos parpadeos mostrando un fondo de pantalla una cantidad de veces a lo largo de una cantidad de segundos.</w:t>
+            </w:r>
+          </w:p>
+        </w:tc>
+        <w:tc>
+          <w:tcPr>
+            <w:tcW w:w="3537" w:type="dxa"/>
+            <w:vAlign w:val="center"/>
+          </w:tcPr>
+          <w:p>
+            <w:pPr>
+              <w:jc w:val="center"/>
+            </w:pPr>
+            <w:r>
+              <w:t>1.</w:t>
+            </w:r>
+            <w:r>
+              <w:t xml:space="preserve"> Los segundos que tarda el fondo en mostrarse y quitarte cada ciclo</w:t>
+            </w:r>
+            <w:r>
+              <w:t xml:space="preserve"> (0.1)</w:t>
+            </w:r>
+          </w:p>
+        </w:tc>
+      </w:tr>
+      <w:tr>
+        <w:trPr>
+          <w:trHeight w:val="861"/>
+        </w:trPr>
+        <w:tc>
+          <w:tcPr>
+            <w:tcW w:w="1555" w:type="dxa"/>
+            <w:vMerge/>
+            <w:vAlign w:val="center"/>
+          </w:tcPr>
+          <w:p>
+            <w:pPr>
+              <w:jc w:val="center"/>
+            </w:pPr>
+          </w:p>
+        </w:tc>
+        <w:tc>
+          <w:tcPr>
+            <w:tcW w:w="3402" w:type="dxa"/>
+            <w:vMerge/>
+            <w:vAlign w:val="center"/>
+          </w:tcPr>
+          <w:p>
+            <w:pPr>
+              <w:jc w:val="center"/>
+            </w:pPr>
+          </w:p>
+        </w:tc>
+        <w:tc>
+          <w:tcPr>
+            <w:tcW w:w="3537" w:type="dxa"/>
+            <w:vAlign w:val="center"/>
+          </w:tcPr>
+          <w:p>
+            <w:pPr>
+              <w:jc w:val="center"/>
+            </w:pPr>
+            <w:r>
+              <w:t xml:space="preserve">2. </w:t>
+            </w:r>
+            <w:r>
+              <w:t>La cantidad de ciclos (veces) que el fondo se va a mostrar</w:t>
+            </w:r>
+            <w:r>
+              <w:t xml:space="preserve"> (4)</w:t>
+            </w:r>
+          </w:p>
+        </w:tc>
+      </w:tr>
+    </w:tbl>
+    <w:p/>
+    <w:p>
+      <w:r>
+        <w:tab/>
+        <w:t>Ejemplos</w:t>
+      </w:r>
+    </w:p>
+    <w:p>
+      <w:pPr>
+        <w:pStyle w:val="Prrafodelista"/>
+        <w:numPr>
+          <w:ilvl w:val="0"/>
+          <w:numId w:val="9"/>
+        </w:numPr>
+      </w:pPr>
+      <w:r>
+        <w:t>vpunch:50 (Ocurre un golpe vertical con una intensidad fuerte)</w:t>
+      </w:r>
+    </w:p>
+    <w:p>
+      <w:pPr>
+        <w:pStyle w:val="Prrafodelista"/>
+        <w:numPr>
+          <w:ilvl w:val="0"/>
+          <w:numId w:val="9"/>
+        </w:numPr>
+      </w:pPr>
+      <w:r>
+        <w:t>hospital:0.1:3 (Muestra el fondo hospital 3 veces</w:t>
+      </w:r>
+      <w:r>
+        <w:t xml:space="preserve"> mostrando el fondo 0.1 segundos cada vez</w:t>
+      </w:r>
+      <w:r>
+        <w:t>)</w:t>
+      </w:r>
+    </w:p>
+    <w:p>
+      <w:pPr>
+        <w:pStyle w:val="Prrafodelista"/>
+        <w:numPr>
+          <w:ilvl w:val="0"/>
+          <w:numId w:val="9"/>
+        </w:numPr>
+      </w:pPr>
+      <w:r>
+        <w:t>flash:0.25:1 (Muestra un fondo blanco una única vez durante 0.25 segundos simulando un destello repentino)</w:t>
+      </w:r>
+    </w:p>
+    <w:p>
+      <w:pPr>
+        <w:pStyle w:val="Prrafodelista"/>
+        <w:numPr>
+          <w:ilvl w:val="0"/>
+          <w:numId w:val="9"/>
+        </w:numPr>
+      </w:pPr>
+      <w:r>
+        <w:t>blackout:0.25:1 (Muestra un fondo negro una única vez durante 0.25 segundos simulando un pequeño corte de luz o parpadeo)</w:t>
+      </w:r>
     </w:p>
     <w:p>
       <w:pPr>
@@ -5297,9 +6713,652 @@
       </w:pPr>
       <w:bookmarkStart w:id="12" w:name="_Toc199261565"/>
       <w:r>
-        <w:t>Columna Continuous effect</w:t>
+        <w:t xml:space="preserve">Columna </w:t>
+      </w:r>
+      <w:proofErr w:type="spellStart"/>
+      <w:r>
+        <w:t>Continuous</w:t>
+      </w:r>
+      <w:proofErr w:type="spellEnd"/>
+      <w:r>
+        <w:t xml:space="preserve"> </w:t>
+      </w:r>
+      <w:proofErr w:type="spellStart"/>
+      <w:r>
+        <w:t>effect</w:t>
       </w:r>
       <w:bookmarkEnd w:id="12"/>
+      <w:proofErr w:type="spellEnd"/>
+    </w:p>
+    <w:p>
+      <w:r>
+        <w:tab/>
+        <w:t xml:space="preserve">Es similar a los Single </w:t>
+      </w:r>
+      <w:proofErr w:type="spellStart"/>
+      <w:r>
+        <w:t>Effects</w:t>
+      </w:r>
+      <w:proofErr w:type="spellEnd"/>
+      <w:r>
+        <w:t>, solo que esta vez es un efecto que sucede constantemente en pantalla y persiste indefinidamente hasta que se vuelva a llamar</w:t>
+      </w:r>
+      <w:r>
+        <w:t xml:space="preserve">. Se pueden dividir en dos, aquellos efectos continuos que interactúan con </w:t>
+      </w:r>
+      <w:proofErr w:type="spellStart"/>
+      <w:r>
+        <w:t>el</w:t>
+      </w:r>
+      <w:proofErr w:type="spellEnd"/>
+      <w:r>
+        <w:t xml:space="preserve"> fondo actual, y aquellos que colocan una imagen por encima.</w:t>
+      </w:r>
+      <w:r>
+        <w:t xml:space="preserve"> </w:t>
+      </w:r>
+      <w:r>
+        <w:t>L</w:t>
+      </w:r>
+      <w:r>
+        <w:t>a sintaxis es la misma que la de</w:t>
+      </w:r>
+      <w:r>
+        <w:t xml:space="preserve"> los Single </w:t>
+      </w:r>
+      <w:proofErr w:type="spellStart"/>
+      <w:r>
+        <w:t>Effects</w:t>
+      </w:r>
+      <w:proofErr w:type="spellEnd"/>
+      <w:r>
+        <w:t>.</w:t>
+      </w:r>
+    </w:p>
+    <w:p>
+      <w:r>
+        <w:tab/>
+      </w:r>
+      <w:proofErr w:type="spellStart"/>
+      <w:r>
+        <w:t>Nombre_del_</w:t>
+      </w:r>
+      <w:proofErr w:type="gramStart"/>
+      <w:r>
+        <w:t>efecto</w:t>
+      </w:r>
+      <w:proofErr w:type="spellEnd"/>
+      <w:r>
+        <w:t xml:space="preserve"> :</w:t>
+      </w:r>
+      <w:proofErr w:type="gramEnd"/>
+      <w:r>
+        <w:t xml:space="preserve"> parámetros</w:t>
+      </w:r>
+    </w:p>
+    <w:p>
+      <w:r>
+        <w:lastRenderedPageBreak/>
+        <w:tab/>
+        <w:t>Nombre_del_efecto_</w:t>
+      </w:r>
+      <w:proofErr w:type="gramStart"/>
+      <w:r>
+        <w:t>1 :</w:t>
+      </w:r>
+      <w:proofErr w:type="gramEnd"/>
+      <w:r>
+        <w:t xml:space="preserve"> parámetros, Nombre_del_efecto_</w:t>
+      </w:r>
+      <w:proofErr w:type="gramStart"/>
+      <w:r>
+        <w:t>2 :</w:t>
+      </w:r>
+      <w:proofErr w:type="gramEnd"/>
+      <w:r>
+        <w:t xml:space="preserve"> parámetros</w:t>
+      </w:r>
+    </w:p>
+    <w:p>
+      <w:pPr>
+        <w:pStyle w:val="Ttulo3"/>
+      </w:pPr>
+      <w:r>
+        <w:t>Efectos que interactúan con el fondo</w:t>
+      </w:r>
+    </w:p>
+    <w:tbl>
+      <w:tblPr>
+        <w:tblStyle w:val="Tablaconcuadrcula"/>
+        <w:tblW w:w="0" w:type="auto"/>
+        <w:tblLook w:val="04A0" w:firstRow="1" w:lastRow="0" w:firstColumn="1" w:lastColumn="0" w:noHBand="0" w:noVBand="1"/>
+      </w:tblPr>
+      <w:tblGrid>
+        <w:gridCol w:w="1555"/>
+        <w:gridCol w:w="3543"/>
+        <w:gridCol w:w="3396"/>
+      </w:tblGrid>
+      <w:tr>
+        <w:trPr>
+          <w:trHeight w:val="531"/>
+        </w:trPr>
+        <w:tc>
+          <w:tcPr>
+            <w:tcW w:w="1555" w:type="dxa"/>
+            <w:vAlign w:val="center"/>
+          </w:tcPr>
+          <w:p>
+            <w:pPr>
+              <w:jc w:val="center"/>
+              <w:rPr>
+                <w:b/>
+                <w:bCs/>
+                <w:sz w:val="28"/>
+                <w:szCs w:val="28"/>
+              </w:rPr>
+            </w:pPr>
+            <w:r>
+              <w:rPr>
+                <w:b/>
+                <w:bCs/>
+                <w:sz w:val="28"/>
+                <w:szCs w:val="28"/>
+              </w:rPr>
+              <w:t>Nombre</w:t>
+            </w:r>
+          </w:p>
+        </w:tc>
+        <w:tc>
+          <w:tcPr>
+            <w:tcW w:w="3543" w:type="dxa"/>
+            <w:vAlign w:val="center"/>
+          </w:tcPr>
+          <w:p>
+            <w:pPr>
+              <w:jc w:val="center"/>
+              <w:rPr>
+                <w:b/>
+                <w:bCs/>
+                <w:sz w:val="28"/>
+                <w:szCs w:val="28"/>
+              </w:rPr>
+            </w:pPr>
+            <w:r>
+              <w:rPr>
+                <w:b/>
+                <w:bCs/>
+                <w:sz w:val="28"/>
+                <w:szCs w:val="28"/>
+              </w:rPr>
+              <w:t>Descripción</w:t>
+            </w:r>
+          </w:p>
+        </w:tc>
+        <w:tc>
+          <w:tcPr>
+            <w:tcW w:w="3396" w:type="dxa"/>
+            <w:vAlign w:val="center"/>
+          </w:tcPr>
+          <w:p>
+            <w:pPr>
+              <w:jc w:val="center"/>
+              <w:rPr>
+                <w:b/>
+                <w:bCs/>
+                <w:sz w:val="28"/>
+                <w:szCs w:val="28"/>
+              </w:rPr>
+            </w:pPr>
+            <w:r>
+              <w:rPr>
+                <w:b/>
+                <w:bCs/>
+                <w:sz w:val="28"/>
+                <w:szCs w:val="28"/>
+              </w:rPr>
+              <w:t>Parámetros</w:t>
+            </w:r>
+          </w:p>
+        </w:tc>
+      </w:tr>
+      <w:tr>
+        <w:trPr>
+          <w:trHeight w:val="927"/>
+        </w:trPr>
+        <w:tc>
+          <w:tcPr>
+            <w:tcW w:w="1555" w:type="dxa"/>
+            <w:vAlign w:val="center"/>
+          </w:tcPr>
+          <w:p>
+            <w:pPr>
+              <w:jc w:val="center"/>
+            </w:pPr>
+            <w:proofErr w:type="spellStart"/>
+            <w:r>
+              <w:t>blur</w:t>
+            </w:r>
+            <w:proofErr w:type="spellEnd"/>
+          </w:p>
+        </w:tc>
+        <w:tc>
+          <w:tcPr>
+            <w:tcW w:w="3543" w:type="dxa"/>
+            <w:vAlign w:val="center"/>
+          </w:tcPr>
+          <w:p>
+            <w:pPr>
+              <w:jc w:val="center"/>
+            </w:pPr>
+            <w:r>
+              <w:t xml:space="preserve">El fondo actual se </w:t>
+            </w:r>
+            <w:r>
+              <w:t>vuelve borroso</w:t>
+            </w:r>
+          </w:p>
+        </w:tc>
+        <w:tc>
+          <w:tcPr>
+            <w:tcW w:w="3396" w:type="dxa"/>
+            <w:vAlign w:val="center"/>
+          </w:tcPr>
+          <w:p>
+            <w:pPr>
+              <w:jc w:val="center"/>
+            </w:pPr>
+            <w:r>
+              <w:t xml:space="preserve">1. </w:t>
+            </w:r>
+            <w:r>
+              <w:t>La intensidad de la borrosidad. Siendo 100 una gran borrosidad. (20)</w:t>
+            </w:r>
+          </w:p>
+        </w:tc>
+      </w:tr>
+      <w:tr>
+        <w:trPr>
+          <w:trHeight w:val="732"/>
+        </w:trPr>
+        <w:tc>
+          <w:tcPr>
+            <w:tcW w:w="1555" w:type="dxa"/>
+            <w:vAlign w:val="center"/>
+          </w:tcPr>
+          <w:p>
+            <w:pPr>
+              <w:jc w:val="center"/>
+            </w:pPr>
+            <w:proofErr w:type="spellStart"/>
+            <w:r>
+              <w:t>hwarp</w:t>
+            </w:r>
+            <w:proofErr w:type="spellEnd"/>
+            <w:r>
+              <w:t xml:space="preserve"> / </w:t>
+            </w:r>
+            <w:proofErr w:type="spellStart"/>
+            <w:r>
+              <w:t>v</w:t>
+            </w:r>
+            <w:r>
+              <w:t>w</w:t>
+            </w:r>
+            <w:r>
+              <w:t>arp</w:t>
+            </w:r>
+            <w:proofErr w:type="spellEnd"/>
+          </w:p>
+        </w:tc>
+        <w:tc>
+          <w:tcPr>
+            <w:tcW w:w="3543" w:type="dxa"/>
+            <w:vAlign w:val="center"/>
+          </w:tcPr>
+          <w:p>
+            <w:pPr>
+              <w:jc w:val="center"/>
+            </w:pPr>
+            <w:r>
+              <w:t>El fondo actual se estira vertical (</w:t>
+            </w:r>
+            <w:proofErr w:type="spellStart"/>
+            <w:r>
+              <w:t>vwarp</w:t>
+            </w:r>
+            <w:proofErr w:type="spellEnd"/>
+            <w:r>
+              <w:t>) u horizontalmente (</w:t>
+            </w:r>
+            <w:proofErr w:type="spellStart"/>
+            <w:r>
+              <w:t>hwarp</w:t>
+            </w:r>
+            <w:proofErr w:type="spellEnd"/>
+            <w:r>
+              <w:t>)</w:t>
+            </w:r>
+          </w:p>
+        </w:tc>
+        <w:tc>
+          <w:tcPr>
+            <w:tcW w:w="3396" w:type="dxa"/>
+            <w:vAlign w:val="center"/>
+          </w:tcPr>
+          <w:p>
+            <w:pPr>
+              <w:jc w:val="center"/>
+            </w:pPr>
+            <w:r>
+              <w:t>1.</w:t>
+            </w:r>
+            <w:r>
+              <w:t>El factor de estiramiento. En 1 no se estira nada, en 2 el fondo duplica su tamaño horizontal o verticalmente. (1.1)</w:t>
+            </w:r>
+          </w:p>
+        </w:tc>
+      </w:tr>
+      <w:tr>
+        <w:trPr>
+          <w:trHeight w:val="1282"/>
+        </w:trPr>
+        <w:tc>
+          <w:tcPr>
+            <w:tcW w:w="1555" w:type="dxa"/>
+            <w:vAlign w:val="center"/>
+          </w:tcPr>
+          <w:p>
+            <w:pPr>
+              <w:jc w:val="center"/>
+            </w:pPr>
+            <w:proofErr w:type="spellStart"/>
+            <w:r>
+              <w:t>rotate</w:t>
+            </w:r>
+            <w:proofErr w:type="spellEnd"/>
+          </w:p>
+          <w:p>
+            <w:pPr>
+              <w:jc w:val="center"/>
+            </w:pPr>
+          </w:p>
+        </w:tc>
+        <w:tc>
+          <w:tcPr>
+            <w:tcW w:w="3543" w:type="dxa"/>
+            <w:vAlign w:val="center"/>
+          </w:tcPr>
+          <w:p>
+            <w:pPr>
+              <w:jc w:val="center"/>
+            </w:pPr>
+            <w:r>
+              <w:t>El fondo actual rota una cantidad de grados dada. No se recomienda usar mucho ya que deja ver el fondo trasparente por detrás</w:t>
+            </w:r>
+          </w:p>
+        </w:tc>
+        <w:tc>
+          <w:tcPr>
+            <w:tcW w:w="3396" w:type="dxa"/>
+            <w:vAlign w:val="center"/>
+          </w:tcPr>
+          <w:p>
+            <w:pPr>
+              <w:jc w:val="center"/>
+            </w:pPr>
+            <w:r>
+              <w:t>1. L</w:t>
+            </w:r>
+            <w:r>
+              <w:t>os grados que el fondo es girado (45)</w:t>
+            </w:r>
+          </w:p>
+        </w:tc>
+      </w:tr>
+    </w:tbl>
+    <w:p/>
+    <w:p>
+      <w:r>
+        <w:tab/>
+        <w:t>Ejemplo</w:t>
+      </w:r>
+      <w:r>
+        <w:t>s</w:t>
+      </w:r>
+      <w:r>
+        <w:t>:</w:t>
+      </w:r>
+    </w:p>
+    <w:p>
+      <w:pPr>
+        <w:pStyle w:val="Prrafodelista"/>
+        <w:numPr>
+          <w:ilvl w:val="0"/>
+          <w:numId w:val="10"/>
+        </w:numPr>
+      </w:pPr>
+      <w:r>
+        <w:t>blur:30 (Una borrosidad considerable)</w:t>
+      </w:r>
+    </w:p>
+    <w:p>
+      <w:pPr>
+        <w:pStyle w:val="Prrafodelista"/>
+        <w:numPr>
+          <w:ilvl w:val="0"/>
+          <w:numId w:val="10"/>
+        </w:numPr>
+      </w:pPr>
+      <w:r>
+        <w:t>vwarp:1.5 (El fondo se estira verticalmente 1.5 veces su alto)</w:t>
+      </w:r>
+    </w:p>
+    <w:p>
+      <w:pPr>
+        <w:pStyle w:val="Prrafodelista"/>
+        <w:numPr>
+          <w:ilvl w:val="0"/>
+          <w:numId w:val="10"/>
+        </w:numPr>
+      </w:pPr>
+      <w:r>
+        <w:t>rotate:30 (El fondo rota 30 grados hacia la derecha</w:t>
+      </w:r>
+      <w:r>
+        <w:t xml:space="preserve"> en sentido de las manecillas del reloj</w:t>
+      </w:r>
+      <w:r>
+        <w:t>)</w:t>
+      </w:r>
+    </w:p>
+    <w:p>
+      <w:pPr>
+        <w:pStyle w:val="Prrafodelista"/>
+        <w:numPr>
+          <w:ilvl w:val="0"/>
+          <w:numId w:val="10"/>
+        </w:numPr>
+      </w:pPr>
+    </w:p>
+    <w:p>
+      <w:pPr>
+        <w:pStyle w:val="Ttulo3"/>
+      </w:pPr>
+      <w:r>
+        <w:t xml:space="preserve">Efectos que </w:t>
+      </w:r>
+      <w:r>
+        <w:t>colocan una imagen encima del fondo</w:t>
+      </w:r>
+    </w:p>
+    <w:tbl>
+      <w:tblPr>
+        <w:tblStyle w:val="Tablaconcuadrcula"/>
+        <w:tblW w:w="0" w:type="auto"/>
+        <w:tblLook w:val="04A0" w:firstRow="1" w:lastRow="0" w:firstColumn="1" w:lastColumn="0" w:noHBand="0" w:noVBand="1"/>
+      </w:tblPr>
+      <w:tblGrid>
+        <w:gridCol w:w="1555"/>
+        <w:gridCol w:w="3543"/>
+        <w:gridCol w:w="3396"/>
+      </w:tblGrid>
+      <w:tr>
+        <w:trPr>
+          <w:trHeight w:val="531"/>
+        </w:trPr>
+        <w:tc>
+          <w:tcPr>
+            <w:tcW w:w="1555" w:type="dxa"/>
+            <w:vAlign w:val="center"/>
+          </w:tcPr>
+          <w:p>
+            <w:pPr>
+              <w:jc w:val="center"/>
+              <w:rPr>
+                <w:b/>
+                <w:bCs/>
+                <w:sz w:val="28"/>
+                <w:szCs w:val="28"/>
+              </w:rPr>
+            </w:pPr>
+            <w:r>
+              <w:rPr>
+                <w:b/>
+                <w:bCs/>
+                <w:sz w:val="28"/>
+                <w:szCs w:val="28"/>
+              </w:rPr>
+              <w:t>Nombre</w:t>
+            </w:r>
+          </w:p>
+        </w:tc>
+        <w:tc>
+          <w:tcPr>
+            <w:tcW w:w="3543" w:type="dxa"/>
+            <w:vAlign w:val="center"/>
+          </w:tcPr>
+          <w:p>
+            <w:pPr>
+              <w:jc w:val="center"/>
+              <w:rPr>
+                <w:b/>
+                <w:bCs/>
+                <w:sz w:val="28"/>
+                <w:szCs w:val="28"/>
+              </w:rPr>
+            </w:pPr>
+            <w:r>
+              <w:rPr>
+                <w:b/>
+                <w:bCs/>
+                <w:sz w:val="28"/>
+                <w:szCs w:val="28"/>
+              </w:rPr>
+              <w:t>Descripción</w:t>
+            </w:r>
+          </w:p>
+        </w:tc>
+        <w:tc>
+          <w:tcPr>
+            <w:tcW w:w="3396" w:type="dxa"/>
+            <w:vAlign w:val="center"/>
+          </w:tcPr>
+          <w:p>
+            <w:pPr>
+              <w:jc w:val="center"/>
+              <w:rPr>
+                <w:b/>
+                <w:bCs/>
+                <w:sz w:val="28"/>
+                <w:szCs w:val="28"/>
+              </w:rPr>
+            </w:pPr>
+            <w:r>
+              <w:rPr>
+                <w:b/>
+                <w:bCs/>
+                <w:sz w:val="28"/>
+                <w:szCs w:val="28"/>
+              </w:rPr>
+              <w:t>Parámetros</w:t>
+            </w:r>
+          </w:p>
+        </w:tc>
+      </w:tr>
+      <w:tr>
+        <w:trPr>
+          <w:trHeight w:val="927"/>
+        </w:trPr>
+        <w:tc>
+          <w:tcPr>
+            <w:tcW w:w="1555" w:type="dxa"/>
+            <w:vAlign w:val="center"/>
+          </w:tcPr>
+          <w:p>
+            <w:pPr>
+              <w:jc w:val="center"/>
+            </w:pPr>
+            <w:r>
+              <w:t>Nombre del fondo</w:t>
+            </w:r>
+          </w:p>
+        </w:tc>
+        <w:tc>
+          <w:tcPr>
+            <w:tcW w:w="3543" w:type="dxa"/>
+            <w:vAlign w:val="center"/>
+          </w:tcPr>
+          <w:p>
+            <w:pPr>
+              <w:jc w:val="center"/>
+            </w:pPr>
+            <w:r>
+              <w:t>Muestra una imagen por encima del fondo y los personajes en pantalla, se puede controlar su nivel de opacidad</w:t>
+            </w:r>
+          </w:p>
+        </w:tc>
+        <w:tc>
+          <w:tcPr>
+            <w:tcW w:w="3396" w:type="dxa"/>
+            <w:vAlign w:val="center"/>
+          </w:tcPr>
+          <w:p>
+            <w:pPr>
+              <w:jc w:val="center"/>
+            </w:pPr>
+            <w:r>
+              <w:t xml:space="preserve">1. La </w:t>
+            </w:r>
+            <w:r>
+              <w:t>intensidad de la opacidad, donde 1 es la imagen normal y 0 es la imagen totalmente invisible. (0.4)</w:t>
+            </w:r>
+          </w:p>
+        </w:tc>
+      </w:tr>
+    </w:tbl>
+    <w:p/>
+    <w:p>
+      <w:r>
+        <w:tab/>
+        <w:t>Ejemplos:</w:t>
+      </w:r>
+    </w:p>
+    <w:p>
+      <w:pPr>
+        <w:pStyle w:val="Prrafodelista"/>
+        <w:numPr>
+          <w:ilvl w:val="0"/>
+          <w:numId w:val="10"/>
+        </w:numPr>
+      </w:pPr>
+      <w:proofErr w:type="spellStart"/>
+      <w:r>
+        <w:t>Suffocation</w:t>
+      </w:r>
+      <w:proofErr w:type="spellEnd"/>
+      <w:r>
+        <w:t>:</w:t>
+      </w:r>
     </w:p>
     <w:p>
       <w:pPr>
@@ -5307,9 +7366,15 @@
       </w:pPr>
       <w:bookmarkStart w:id="13" w:name="_Toc199261566"/>
       <w:r>
-        <w:t>Columna Events</w:t>
+        <w:lastRenderedPageBreak/>
+        <w:t xml:space="preserve">Columna </w:t>
+      </w:r>
+      <w:proofErr w:type="spellStart"/>
+      <w:r>
+        <w:t>Events</w:t>
       </w:r>
       <w:bookmarkEnd w:id="13"/>
+      <w:proofErr w:type="spellEnd"/>
     </w:p>
     <w:p>
       <w:pPr>
@@ -5317,9 +7382,14 @@
       </w:pPr>
       <w:bookmarkStart w:id="14" w:name="_Toc199261567"/>
       <w:r>
-        <w:t>Columna Delay</w:t>
+        <w:t xml:space="preserve">Columna </w:t>
+      </w:r>
+      <w:proofErr w:type="spellStart"/>
+      <w:r>
+        <w:t>Delay</w:t>
       </w:r>
       <w:bookmarkEnd w:id="14"/>
+      <w:proofErr w:type="spellEnd"/>
     </w:p>
     <w:p>
       <w:pPr>
@@ -5366,10 +7436,12 @@
         <w:pStyle w:val="Ttulo1"/>
       </w:pPr>
       <w:bookmarkStart w:id="19" w:name="_Toc199261572"/>
+      <w:proofErr w:type="spellStart"/>
       <w:r>
         <w:t>Testing</w:t>
       </w:r>
       <w:bookmarkEnd w:id="19"/>
+      <w:proofErr w:type="spellEnd"/>
     </w:p>
     <w:p/>
     <w:p>
@@ -5874,102 +7946,16 @@
     </w:lvl>
   </w:abstractNum>
   <w:abstractNum w:abstractNumId="3" w15:restartNumberingAfterBreak="0">
-    <w:nsid w:val="391A4D18"/>
+    <w:nsid w:val="35BB7E8F"/>
     <w:multiLevelType w:val="hybridMultilevel"/>
-    <w:tmpl w:val="BFCC90D6"/>
-    <w:lvl w:ilvl="0" w:tplc="0C0A000F">
-      <w:start w:val="1"/>
-      <w:numFmt w:val="decimal"/>
-      <w:lvlText w:val="%1."/>
-      <w:lvlJc w:val="left"/>
-      <w:pPr>
-        <w:ind w:left="720" w:hanging="360"/>
-      </w:pPr>
-    </w:lvl>
-    <w:lvl w:ilvl="1" w:tplc="0C0A0019" w:tentative="1">
-      <w:start w:val="1"/>
-      <w:numFmt w:val="lowerLetter"/>
-      <w:lvlText w:val="%2."/>
-      <w:lvlJc w:val="left"/>
-      <w:pPr>
-        <w:ind w:left="1440" w:hanging="360"/>
-      </w:pPr>
-    </w:lvl>
-    <w:lvl w:ilvl="2" w:tplc="0C0A001B" w:tentative="1">
-      <w:start w:val="1"/>
-      <w:numFmt w:val="lowerRoman"/>
-      <w:lvlText w:val="%3."/>
-      <w:lvlJc w:val="right"/>
-      <w:pPr>
-        <w:ind w:left="2160" w:hanging="180"/>
-      </w:pPr>
-    </w:lvl>
-    <w:lvl w:ilvl="3" w:tplc="0C0A000F" w:tentative="1">
-      <w:start w:val="1"/>
-      <w:numFmt w:val="decimal"/>
-      <w:lvlText w:val="%4."/>
-      <w:lvlJc w:val="left"/>
-      <w:pPr>
-        <w:ind w:left="2880" w:hanging="360"/>
-      </w:pPr>
-    </w:lvl>
-    <w:lvl w:ilvl="4" w:tplc="0C0A0019" w:tentative="1">
-      <w:start w:val="1"/>
-      <w:numFmt w:val="lowerLetter"/>
-      <w:lvlText w:val="%5."/>
-      <w:lvlJc w:val="left"/>
-      <w:pPr>
-        <w:ind w:left="3600" w:hanging="360"/>
-      </w:pPr>
-    </w:lvl>
-    <w:lvl w:ilvl="5" w:tplc="0C0A001B" w:tentative="1">
-      <w:start w:val="1"/>
-      <w:numFmt w:val="lowerRoman"/>
-      <w:lvlText w:val="%6."/>
-      <w:lvlJc w:val="right"/>
-      <w:pPr>
-        <w:ind w:left="4320" w:hanging="180"/>
-      </w:pPr>
-    </w:lvl>
-    <w:lvl w:ilvl="6" w:tplc="0C0A000F" w:tentative="1">
-      <w:start w:val="1"/>
-      <w:numFmt w:val="decimal"/>
-      <w:lvlText w:val="%7."/>
-      <w:lvlJc w:val="left"/>
-      <w:pPr>
-        <w:ind w:left="5040" w:hanging="360"/>
-      </w:pPr>
-    </w:lvl>
-    <w:lvl w:ilvl="7" w:tplc="0C0A0019" w:tentative="1">
-      <w:start w:val="1"/>
-      <w:numFmt w:val="lowerLetter"/>
-      <w:lvlText w:val="%8."/>
-      <w:lvlJc w:val="left"/>
-      <w:pPr>
-        <w:ind w:left="5760" w:hanging="360"/>
-      </w:pPr>
-    </w:lvl>
-    <w:lvl w:ilvl="8" w:tplc="0C0A001B" w:tentative="1">
-      <w:start w:val="1"/>
-      <w:numFmt w:val="lowerRoman"/>
-      <w:lvlText w:val="%9."/>
-      <w:lvlJc w:val="right"/>
-      <w:pPr>
-        <w:ind w:left="6480" w:hanging="180"/>
-      </w:pPr>
-    </w:lvl>
-  </w:abstractNum>
-  <w:abstractNum w:abstractNumId="4" w15:restartNumberingAfterBreak="0">
-    <w:nsid w:val="3A74320C"/>
-    <w:multiLevelType w:val="hybridMultilevel"/>
-    <w:tmpl w:val="6E88E228"/>
+    <w:tmpl w:val="2DF213C2"/>
     <w:lvl w:ilvl="0" w:tplc="0C0A0001">
       <w:start w:val="1"/>
       <w:numFmt w:val="bullet"/>
       <w:lvlText w:val=""/>
       <w:lvlJc w:val="left"/>
       <w:pPr>
-        <w:ind w:left="1428" w:hanging="360"/>
+        <w:ind w:left="1425" w:hanging="360"/>
       </w:pPr>
       <w:rPr>
         <w:rFonts w:ascii="Symbol" w:hAnsi="Symbol" w:hint="default"/>
@@ -5981,7 +7967,7 @@
       <w:lvlText w:val="o"/>
       <w:lvlJc w:val="left"/>
       <w:pPr>
-        <w:ind w:left="2148" w:hanging="360"/>
+        <w:ind w:left="2145" w:hanging="360"/>
       </w:pPr>
       <w:rPr>
         <w:rFonts w:ascii="Courier New" w:hAnsi="Courier New" w:cs="Courier New" w:hint="default"/>
@@ -5993,7 +7979,7 @@
       <w:lvlText w:val=""/>
       <w:lvlJc w:val="left"/>
       <w:pPr>
-        <w:ind w:left="2868" w:hanging="360"/>
+        <w:ind w:left="2865" w:hanging="360"/>
       </w:pPr>
       <w:rPr>
         <w:rFonts w:ascii="Wingdings" w:hAnsi="Wingdings" w:hint="default"/>
@@ -6005,7 +7991,7 @@
       <w:lvlText w:val=""/>
       <w:lvlJc w:val="left"/>
       <w:pPr>
-        <w:ind w:left="3588" w:hanging="360"/>
+        <w:ind w:left="3585" w:hanging="360"/>
       </w:pPr>
       <w:rPr>
         <w:rFonts w:ascii="Symbol" w:hAnsi="Symbol" w:hint="default"/>
@@ -6017,7 +8003,7 @@
       <w:lvlText w:val="o"/>
       <w:lvlJc w:val="left"/>
       <w:pPr>
-        <w:ind w:left="4308" w:hanging="360"/>
+        <w:ind w:left="4305" w:hanging="360"/>
       </w:pPr>
       <w:rPr>
         <w:rFonts w:ascii="Courier New" w:hAnsi="Courier New" w:cs="Courier New" w:hint="default"/>
@@ -6029,7 +8015,7 @@
       <w:lvlText w:val=""/>
       <w:lvlJc w:val="left"/>
       <w:pPr>
-        <w:ind w:left="5028" w:hanging="360"/>
+        <w:ind w:left="5025" w:hanging="360"/>
       </w:pPr>
       <w:rPr>
         <w:rFonts w:ascii="Wingdings" w:hAnsi="Wingdings" w:hint="default"/>
@@ -6041,7 +8027,7 @@
       <w:lvlText w:val=""/>
       <w:lvlJc w:val="left"/>
       <w:pPr>
-        <w:ind w:left="5748" w:hanging="360"/>
+        <w:ind w:left="5745" w:hanging="360"/>
       </w:pPr>
       <w:rPr>
         <w:rFonts w:ascii="Symbol" w:hAnsi="Symbol" w:hint="default"/>
@@ -6053,7 +8039,7 @@
       <w:lvlText w:val="o"/>
       <w:lvlJc w:val="left"/>
       <w:pPr>
-        <w:ind w:left="6468" w:hanging="360"/>
+        <w:ind w:left="6465" w:hanging="360"/>
       </w:pPr>
       <w:rPr>
         <w:rFonts w:ascii="Courier New" w:hAnsi="Courier New" w:cs="Courier New" w:hint="default"/>
@@ -6065,14 +8051,326 @@
       <w:lvlText w:val=""/>
       <w:lvlJc w:val="left"/>
       <w:pPr>
-        <w:ind w:left="7188" w:hanging="360"/>
+        <w:ind w:left="7185" w:hanging="360"/>
       </w:pPr>
       <w:rPr>
         <w:rFonts w:ascii="Wingdings" w:hAnsi="Wingdings" w:hint="default"/>
       </w:rPr>
     </w:lvl>
   </w:abstractNum>
+  <w:abstractNum w:abstractNumId="4" w15:restartNumberingAfterBreak="0">
+    <w:nsid w:val="391A4D18"/>
+    <w:multiLevelType w:val="hybridMultilevel"/>
+    <w:tmpl w:val="BFCC90D6"/>
+    <w:lvl w:ilvl="0" w:tplc="0C0A000F">
+      <w:start w:val="1"/>
+      <w:numFmt w:val="decimal"/>
+      <w:lvlText w:val="%1."/>
+      <w:lvlJc w:val="left"/>
+      <w:pPr>
+        <w:ind w:left="720" w:hanging="360"/>
+      </w:pPr>
+    </w:lvl>
+    <w:lvl w:ilvl="1" w:tplc="0C0A0019" w:tentative="1">
+      <w:start w:val="1"/>
+      <w:numFmt w:val="lowerLetter"/>
+      <w:lvlText w:val="%2."/>
+      <w:lvlJc w:val="left"/>
+      <w:pPr>
+        <w:ind w:left="1440" w:hanging="360"/>
+      </w:pPr>
+    </w:lvl>
+    <w:lvl w:ilvl="2" w:tplc="0C0A001B" w:tentative="1">
+      <w:start w:val="1"/>
+      <w:numFmt w:val="lowerRoman"/>
+      <w:lvlText w:val="%3."/>
+      <w:lvlJc w:val="right"/>
+      <w:pPr>
+        <w:ind w:left="2160" w:hanging="180"/>
+      </w:pPr>
+    </w:lvl>
+    <w:lvl w:ilvl="3" w:tplc="0C0A000F" w:tentative="1">
+      <w:start w:val="1"/>
+      <w:numFmt w:val="decimal"/>
+      <w:lvlText w:val="%4."/>
+      <w:lvlJc w:val="left"/>
+      <w:pPr>
+        <w:ind w:left="2880" w:hanging="360"/>
+      </w:pPr>
+    </w:lvl>
+    <w:lvl w:ilvl="4" w:tplc="0C0A0019" w:tentative="1">
+      <w:start w:val="1"/>
+      <w:numFmt w:val="lowerLetter"/>
+      <w:lvlText w:val="%5."/>
+      <w:lvlJc w:val="left"/>
+      <w:pPr>
+        <w:ind w:left="3600" w:hanging="360"/>
+      </w:pPr>
+    </w:lvl>
+    <w:lvl w:ilvl="5" w:tplc="0C0A001B" w:tentative="1">
+      <w:start w:val="1"/>
+      <w:numFmt w:val="lowerRoman"/>
+      <w:lvlText w:val="%6."/>
+      <w:lvlJc w:val="right"/>
+      <w:pPr>
+        <w:ind w:left="4320" w:hanging="180"/>
+      </w:pPr>
+    </w:lvl>
+    <w:lvl w:ilvl="6" w:tplc="0C0A000F" w:tentative="1">
+      <w:start w:val="1"/>
+      <w:numFmt w:val="decimal"/>
+      <w:lvlText w:val="%7."/>
+      <w:lvlJc w:val="left"/>
+      <w:pPr>
+        <w:ind w:left="5040" w:hanging="360"/>
+      </w:pPr>
+    </w:lvl>
+    <w:lvl w:ilvl="7" w:tplc="0C0A0019" w:tentative="1">
+      <w:start w:val="1"/>
+      <w:numFmt w:val="lowerLetter"/>
+      <w:lvlText w:val="%8."/>
+      <w:lvlJc w:val="left"/>
+      <w:pPr>
+        <w:ind w:left="5760" w:hanging="360"/>
+      </w:pPr>
+    </w:lvl>
+    <w:lvl w:ilvl="8" w:tplc="0C0A001B" w:tentative="1">
+      <w:start w:val="1"/>
+      <w:numFmt w:val="lowerRoman"/>
+      <w:lvlText w:val="%9."/>
+      <w:lvlJc w:val="right"/>
+      <w:pPr>
+        <w:ind w:left="6480" w:hanging="180"/>
+      </w:pPr>
+    </w:lvl>
+  </w:abstractNum>
   <w:abstractNum w:abstractNumId="5" w15:restartNumberingAfterBreak="0">
+    <w:nsid w:val="3A74320C"/>
+    <w:multiLevelType w:val="hybridMultilevel"/>
+    <w:tmpl w:val="6E88E228"/>
+    <w:lvl w:ilvl="0" w:tplc="0C0A0001">
+      <w:start w:val="1"/>
+      <w:numFmt w:val="bullet"/>
+      <w:lvlText w:val=""/>
+      <w:lvlJc w:val="left"/>
+      <w:pPr>
+        <w:ind w:left="1428" w:hanging="360"/>
+      </w:pPr>
+      <w:rPr>
+        <w:rFonts w:ascii="Symbol" w:hAnsi="Symbol" w:hint="default"/>
+      </w:rPr>
+    </w:lvl>
+    <w:lvl w:ilvl="1" w:tplc="0C0A0003" w:tentative="1">
+      <w:start w:val="1"/>
+      <w:numFmt w:val="bullet"/>
+      <w:lvlText w:val="o"/>
+      <w:lvlJc w:val="left"/>
+      <w:pPr>
+        <w:ind w:left="2148" w:hanging="360"/>
+      </w:pPr>
+      <w:rPr>
+        <w:rFonts w:ascii="Courier New" w:hAnsi="Courier New" w:cs="Courier New" w:hint="default"/>
+      </w:rPr>
+    </w:lvl>
+    <w:lvl w:ilvl="2" w:tplc="0C0A0005" w:tentative="1">
+      <w:start w:val="1"/>
+      <w:numFmt w:val="bullet"/>
+      <w:lvlText w:val=""/>
+      <w:lvlJc w:val="left"/>
+      <w:pPr>
+        <w:ind w:left="2868" w:hanging="360"/>
+      </w:pPr>
+      <w:rPr>
+        <w:rFonts w:ascii="Wingdings" w:hAnsi="Wingdings" w:hint="default"/>
+      </w:rPr>
+    </w:lvl>
+    <w:lvl w:ilvl="3" w:tplc="0C0A0001" w:tentative="1">
+      <w:start w:val="1"/>
+      <w:numFmt w:val="bullet"/>
+      <w:lvlText w:val=""/>
+      <w:lvlJc w:val="left"/>
+      <w:pPr>
+        <w:ind w:left="3588" w:hanging="360"/>
+      </w:pPr>
+      <w:rPr>
+        <w:rFonts w:ascii="Symbol" w:hAnsi="Symbol" w:hint="default"/>
+      </w:rPr>
+    </w:lvl>
+    <w:lvl w:ilvl="4" w:tplc="0C0A0003" w:tentative="1">
+      <w:start w:val="1"/>
+      <w:numFmt w:val="bullet"/>
+      <w:lvlText w:val="o"/>
+      <w:lvlJc w:val="left"/>
+      <w:pPr>
+        <w:ind w:left="4308" w:hanging="360"/>
+      </w:pPr>
+      <w:rPr>
+        <w:rFonts w:ascii="Courier New" w:hAnsi="Courier New" w:cs="Courier New" w:hint="default"/>
+      </w:rPr>
+    </w:lvl>
+    <w:lvl w:ilvl="5" w:tplc="0C0A0005" w:tentative="1">
+      <w:start w:val="1"/>
+      <w:numFmt w:val="bullet"/>
+      <w:lvlText w:val=""/>
+      <w:lvlJc w:val="left"/>
+      <w:pPr>
+        <w:ind w:left="5028" w:hanging="360"/>
+      </w:pPr>
+      <w:rPr>
+        <w:rFonts w:ascii="Wingdings" w:hAnsi="Wingdings" w:hint="default"/>
+      </w:rPr>
+    </w:lvl>
+    <w:lvl w:ilvl="6" w:tplc="0C0A0001" w:tentative="1">
+      <w:start w:val="1"/>
+      <w:numFmt w:val="bullet"/>
+      <w:lvlText w:val=""/>
+      <w:lvlJc w:val="left"/>
+      <w:pPr>
+        <w:ind w:left="5748" w:hanging="360"/>
+      </w:pPr>
+      <w:rPr>
+        <w:rFonts w:ascii="Symbol" w:hAnsi="Symbol" w:hint="default"/>
+      </w:rPr>
+    </w:lvl>
+    <w:lvl w:ilvl="7" w:tplc="0C0A0003" w:tentative="1">
+      <w:start w:val="1"/>
+      <w:numFmt w:val="bullet"/>
+      <w:lvlText w:val="o"/>
+      <w:lvlJc w:val="left"/>
+      <w:pPr>
+        <w:ind w:left="6468" w:hanging="360"/>
+      </w:pPr>
+      <w:rPr>
+        <w:rFonts w:ascii="Courier New" w:hAnsi="Courier New" w:cs="Courier New" w:hint="default"/>
+      </w:rPr>
+    </w:lvl>
+    <w:lvl w:ilvl="8" w:tplc="0C0A0005" w:tentative="1">
+      <w:start w:val="1"/>
+      <w:numFmt w:val="bullet"/>
+      <w:lvlText w:val=""/>
+      <w:lvlJc w:val="left"/>
+      <w:pPr>
+        <w:ind w:left="7188" w:hanging="360"/>
+      </w:pPr>
+      <w:rPr>
+        <w:rFonts w:ascii="Wingdings" w:hAnsi="Wingdings" w:hint="default"/>
+      </w:rPr>
+    </w:lvl>
+  </w:abstractNum>
+  <w:abstractNum w:abstractNumId="6" w15:restartNumberingAfterBreak="0">
+    <w:nsid w:val="3D616461"/>
+    <w:multiLevelType w:val="hybridMultilevel"/>
+    <w:tmpl w:val="5E869988"/>
+    <w:lvl w:ilvl="0" w:tplc="0C0A0001">
+      <w:start w:val="1"/>
+      <w:numFmt w:val="bullet"/>
+      <w:lvlText w:val=""/>
+      <w:lvlJc w:val="left"/>
+      <w:pPr>
+        <w:ind w:left="1425" w:hanging="360"/>
+      </w:pPr>
+      <w:rPr>
+        <w:rFonts w:ascii="Symbol" w:hAnsi="Symbol" w:hint="default"/>
+      </w:rPr>
+    </w:lvl>
+    <w:lvl w:ilvl="1" w:tplc="0C0A0003" w:tentative="1">
+      <w:start w:val="1"/>
+      <w:numFmt w:val="bullet"/>
+      <w:lvlText w:val="o"/>
+      <w:lvlJc w:val="left"/>
+      <w:pPr>
+        <w:ind w:left="2145" w:hanging="360"/>
+      </w:pPr>
+      <w:rPr>
+        <w:rFonts w:ascii="Courier New" w:hAnsi="Courier New" w:cs="Courier New" w:hint="default"/>
+      </w:rPr>
+    </w:lvl>
+    <w:lvl w:ilvl="2" w:tplc="0C0A0005" w:tentative="1">
+      <w:start w:val="1"/>
+      <w:numFmt w:val="bullet"/>
+      <w:lvlText w:val=""/>
+      <w:lvlJc w:val="left"/>
+      <w:pPr>
+        <w:ind w:left="2865" w:hanging="360"/>
+      </w:pPr>
+      <w:rPr>
+        <w:rFonts w:ascii="Wingdings" w:hAnsi="Wingdings" w:hint="default"/>
+      </w:rPr>
+    </w:lvl>
+    <w:lvl w:ilvl="3" w:tplc="0C0A0001" w:tentative="1">
+      <w:start w:val="1"/>
+      <w:numFmt w:val="bullet"/>
+      <w:lvlText w:val=""/>
+      <w:lvlJc w:val="left"/>
+      <w:pPr>
+        <w:ind w:left="3585" w:hanging="360"/>
+      </w:pPr>
+      <w:rPr>
+        <w:rFonts w:ascii="Symbol" w:hAnsi="Symbol" w:hint="default"/>
+      </w:rPr>
+    </w:lvl>
+    <w:lvl w:ilvl="4" w:tplc="0C0A0003" w:tentative="1">
+      <w:start w:val="1"/>
+      <w:numFmt w:val="bullet"/>
+      <w:lvlText w:val="o"/>
+      <w:lvlJc w:val="left"/>
+      <w:pPr>
+        <w:ind w:left="4305" w:hanging="360"/>
+      </w:pPr>
+      <w:rPr>
+        <w:rFonts w:ascii="Courier New" w:hAnsi="Courier New" w:cs="Courier New" w:hint="default"/>
+      </w:rPr>
+    </w:lvl>
+    <w:lvl w:ilvl="5" w:tplc="0C0A0005" w:tentative="1">
+      <w:start w:val="1"/>
+      <w:numFmt w:val="bullet"/>
+      <w:lvlText w:val=""/>
+      <w:lvlJc w:val="left"/>
+      <w:pPr>
+        <w:ind w:left="5025" w:hanging="360"/>
+      </w:pPr>
+      <w:rPr>
+        <w:rFonts w:ascii="Wingdings" w:hAnsi="Wingdings" w:hint="default"/>
+      </w:rPr>
+    </w:lvl>
+    <w:lvl w:ilvl="6" w:tplc="0C0A0001" w:tentative="1">
+      <w:start w:val="1"/>
+      <w:numFmt w:val="bullet"/>
+      <w:lvlText w:val=""/>
+      <w:lvlJc w:val="left"/>
+      <w:pPr>
+        <w:ind w:left="5745" w:hanging="360"/>
+      </w:pPr>
+      <w:rPr>
+        <w:rFonts w:ascii="Symbol" w:hAnsi="Symbol" w:hint="default"/>
+      </w:rPr>
+    </w:lvl>
+    <w:lvl w:ilvl="7" w:tplc="0C0A0003" w:tentative="1">
+      <w:start w:val="1"/>
+      <w:numFmt w:val="bullet"/>
+      <w:lvlText w:val="o"/>
+      <w:lvlJc w:val="left"/>
+      <w:pPr>
+        <w:ind w:left="6465" w:hanging="360"/>
+      </w:pPr>
+      <w:rPr>
+        <w:rFonts w:ascii="Courier New" w:hAnsi="Courier New" w:cs="Courier New" w:hint="default"/>
+      </w:rPr>
+    </w:lvl>
+    <w:lvl w:ilvl="8" w:tplc="0C0A0005" w:tentative="1">
+      <w:start w:val="1"/>
+      <w:numFmt w:val="bullet"/>
+      <w:lvlText w:val=""/>
+      <w:lvlJc w:val="left"/>
+      <w:pPr>
+        <w:ind w:left="7185" w:hanging="360"/>
+      </w:pPr>
+      <w:rPr>
+        <w:rFonts w:ascii="Wingdings" w:hAnsi="Wingdings" w:hint="default"/>
+      </w:rPr>
+    </w:lvl>
+  </w:abstractNum>
+  <w:abstractNum w:abstractNumId="7" w15:restartNumberingAfterBreak="0">
     <w:nsid w:val="3E672CCD"/>
     <w:multiLevelType w:val="hybridMultilevel"/>
     <w:tmpl w:val="0BAE5ED6"/>
@@ -6161,7 +8459,7 @@
       </w:pPr>
     </w:lvl>
   </w:abstractNum>
-  <w:abstractNum w:abstractNumId="6" w15:restartNumberingAfterBreak="0">
+  <w:abstractNum w:abstractNumId="8" w15:restartNumberingAfterBreak="0">
     <w:nsid w:val="4D794F7B"/>
     <w:multiLevelType w:val="hybridMultilevel"/>
     <w:tmpl w:val="ADB0E002"/>
@@ -6274,7 +8572,7 @@
       </w:rPr>
     </w:lvl>
   </w:abstractNum>
-  <w:abstractNum w:abstractNumId="7" w15:restartNumberingAfterBreak="0">
+  <w:abstractNum w:abstractNumId="9" w15:restartNumberingAfterBreak="0">
     <w:nsid w:val="63556DA1"/>
     <w:multiLevelType w:val="hybridMultilevel"/>
     <w:tmpl w:val="FE8C0458"/>
@@ -6388,28 +8686,34 @@
     </w:lvl>
   </w:abstractNum>
   <w:num w:numId="1" w16cid:durableId="1293169672">
-    <w:abstractNumId w:val="6"/>
+    <w:abstractNumId w:val="8"/>
   </w:num>
   <w:num w:numId="2" w16cid:durableId="132523105">
-    <w:abstractNumId w:val="7"/>
+    <w:abstractNumId w:val="9"/>
   </w:num>
   <w:num w:numId="3" w16cid:durableId="550045339">
     <w:abstractNumId w:val="1"/>
   </w:num>
   <w:num w:numId="4" w16cid:durableId="913316204">
+    <w:abstractNumId w:val="7"/>
+  </w:num>
+  <w:num w:numId="5" w16cid:durableId="1328904247">
     <w:abstractNumId w:val="5"/>
   </w:num>
-  <w:num w:numId="5" w16cid:durableId="1328904247">
+  <w:num w:numId="6" w16cid:durableId="675959527">
     <w:abstractNumId w:val="4"/>
-  </w:num>
-  <w:num w:numId="6" w16cid:durableId="675959527">
-    <w:abstractNumId w:val="3"/>
   </w:num>
   <w:num w:numId="7" w16cid:durableId="1954557278">
     <w:abstractNumId w:val="2"/>
   </w:num>
   <w:num w:numId="8" w16cid:durableId="1356231617">
     <w:abstractNumId w:val="0"/>
+  </w:num>
+  <w:num w:numId="9" w16cid:durableId="1882328899">
+    <w:abstractNumId w:val="3"/>
+  </w:num>
+  <w:num w:numId="10" w16cid:durableId="870528595">
+    <w:abstractNumId w:val="6"/>
   </w:num>
 </w:numbering>
 </file>

</xml_diff>

<commit_message>
<fix> displaying elements images over background
</commit_message>
<xml_diff>
--- a/Manual de desarrollo en Atlax Renpy.docx
+++ b/Manual de desarrollo en Atlax Renpy.docx
@@ -136,20 +136,8 @@
           <w:sz w:val="52"/>
           <w:szCs w:val="52"/>
         </w:rPr>
-        <w:t xml:space="preserve"> </w:t>
-      </w:r>
-      <w:proofErr w:type="spellStart"/>
-      <w:r>
-        <w:rPr>
-          <w:rFonts w:cs="Times New Roman"/>
-          <w:b/>
-          <w:bCs/>
-          <w:sz w:val="52"/>
-          <w:szCs w:val="52"/>
-        </w:rPr>
-        <w:t>Renpy</w:t>
-      </w:r>
-      <w:proofErr w:type="spellEnd"/>
+        <w:t xml:space="preserve"> Renpy</w:t>
+      </w:r>
     </w:p>
     <w:p>
       <w:pPr>
@@ -4378,6 +4366,21 @@
       <w:pPr>
         <w:ind w:firstLine="708"/>
       </w:pPr>
+    </w:p>
+    <w:p>
+      <w:pPr>
+        <w:ind w:firstLine="708"/>
+      </w:pPr>
+    </w:p>
+    <w:p>
+      <w:pPr>
+        <w:ind w:firstLine="708"/>
+      </w:pPr>
+    </w:p>
+    <w:p>
+      <w:pPr>
+        <w:ind w:firstLine="708"/>
+      </w:pPr>
       <w:r>
         <w:rPr>
           <w:noProof/>
@@ -4491,24 +4494,13 @@
     </w:p>
     <w:p/>
     <w:p>
+      <w:bookmarkStart w:id="6" w:name="_Toc199261559"/>
+    </w:p>
+    <w:p>
       <w:pPr>
         <w:pStyle w:val="Ttulo2"/>
       </w:pPr>
-      <w:bookmarkStart w:id="6" w:name="_Toc199261559"/>
-    </w:p>
-    <w:p>
-      <w:pPr>
-        <w:pStyle w:val="Ttulo2"/>
-        <w:jc w:val="both"/>
-      </w:pPr>
-    </w:p>
-    <w:p/>
-    <w:p>
-      <w:pPr>
-        <w:pStyle w:val="Ttulo2"/>
-      </w:pPr>
-      <w:r>
-        <w:lastRenderedPageBreak/>
+      <w:r>
         <w:t>Estructura</w:t>
       </w:r>
       <w:bookmarkEnd w:id="6"/>
@@ -4659,13 +4651,13 @@
           <w:noProof/>
         </w:rPr>
         <w:drawing>
-          <wp:anchor distT="0" distB="0" distL="114300" distR="114300" simplePos="0" relativeHeight="251661312" behindDoc="0" locked="0" layoutInCell="1" allowOverlap="1" wp14:anchorId="0E2A93C7" wp14:editId="2EBDE23F">
+          <wp:anchor distT="0" distB="0" distL="114300" distR="114300" simplePos="0" relativeHeight="251661312" behindDoc="0" locked="0" layoutInCell="1" allowOverlap="1" wp14:anchorId="0E2A93C7" wp14:editId="038BC823">
             <wp:simplePos x="0" y="0"/>
             <wp:positionH relativeFrom="margin">
               <wp:posOffset>-671830</wp:posOffset>
             </wp:positionH>
             <wp:positionV relativeFrom="margin">
-              <wp:posOffset>2052320</wp:posOffset>
+              <wp:posOffset>2652395</wp:posOffset>
             </wp:positionV>
             <wp:extent cx="6641465" cy="390525"/>
             <wp:effectExtent l="0" t="0" r="6985" b="9525"/>
@@ -4792,6 +4784,27 @@
         <w:tab/>
         <w:t>Al momento de utilizar números decimales utilizar puntos en vez de comas y escribir todo en minúsculas.</w:t>
       </w:r>
+      <w:r>
+        <w:t xml:space="preserve"> Verás que </w:t>
+      </w:r>
+      <w:r>
+        <w:t>al momento de</w:t>
+      </w:r>
+      <w:r>
+        <w:t xml:space="preserve"> expli</w:t>
+      </w:r>
+      <w:r>
+        <w:t>car</w:t>
+      </w:r>
+      <w:r>
+        <w:t xml:space="preserve"> los parámetros de ciertos elementos estos tendrán unos paréntesis</w:t>
+      </w:r>
+      <w:r>
+        <w:t xml:space="preserve"> al final</w:t>
+      </w:r>
+      <w:r>
+        <w:t>, esto significa el valor que tienen por defecto.</w:t>
+      </w:r>
     </w:p>
     <w:p>
       <w:pPr>
@@ -4836,7 +4849,11 @@
       </w:r>
       <w:proofErr w:type="spellEnd"/>
       <w:r>
-        <w:t xml:space="preserve">, haríamos algo así: stefannie_3_night_out_89, el siguiente diálogo sería </w:t>
+        <w:t xml:space="preserve">, haríamos algo </w:t>
+      </w:r>
+      <w:r>
+        <w:lastRenderedPageBreak/>
+        <w:t xml:space="preserve">así: stefannie_3_night_out_89, el siguiente diálogo sería </w:t>
       </w:r>
       <w:proofErr w:type="gramStart"/>
       <w:r>
@@ -4852,11 +4869,7 @@
         <w:ind w:firstLine="708"/>
       </w:pPr>
       <w:r>
-        <w:t xml:space="preserve">Debido a que puede llegar a ser demasiado tedioso escribir a mano todos los números, Excel nos brinda una ayuda, primero abrimos el archivo usando Excel, escribimos en la primera fila (después de la cabecera) stefannie_3_night_out_1, acto </w:t>
-      </w:r>
-      <w:r>
-        <w:lastRenderedPageBreak/>
-        <w:t xml:space="preserve">seguido dirigimos el cursor a la esquina inferior derecha de la celda seleccionada y manteniendo el </w:t>
+        <w:t xml:space="preserve">Debido a que puede llegar a ser demasiado tedioso escribir a mano todos los números, Excel nos brinda una ayuda, primero abrimos el archivo usando Excel, escribimos en la primera fila (después de la cabecera) stefannie_3_night_out_1, acto seguido dirigimos el cursor a la esquina inferior derecha de la celda seleccionada y manteniendo el </w:t>
       </w:r>
       <w:proofErr w:type="spellStart"/>
       <w:r>
@@ -4987,6 +5000,9 @@
       <w:pPr>
         <w:ind w:firstLine="708"/>
       </w:pPr>
+      <w:r>
+        <w:t>De esa manera Excel autocompletará las celdas y nos ahorrará escribir todos los números de cada diálogo.</w:t>
+      </w:r>
     </w:p>
     <w:p>
       <w:pPr>
@@ -4995,44 +5011,6 @@
     </w:p>
     <w:p>
       <w:pPr>
-        <w:ind w:firstLine="708"/>
-      </w:pPr>
-    </w:p>
-    <w:p>
-      <w:pPr>
-        <w:ind w:firstLine="708"/>
-      </w:pPr>
-    </w:p>
-    <w:p>
-      <w:pPr>
-        <w:ind w:firstLine="708"/>
-      </w:pPr>
-    </w:p>
-    <w:p>
-      <w:pPr>
-        <w:ind w:firstLine="708"/>
-      </w:pPr>
-    </w:p>
-    <w:p>
-      <w:pPr>
-        <w:ind w:firstLine="708"/>
-      </w:pPr>
-    </w:p>
-    <w:p>
-      <w:pPr>
-        <w:ind w:firstLine="708"/>
-      </w:pPr>
-      <w:r>
-        <w:t>De esa manera Excel autocompletará las celdas y nos ahorrará escribir todos los números de cada diálogo.</w:t>
-      </w:r>
-    </w:p>
-    <w:p>
-      <w:pPr>
-        <w:ind w:firstLine="708"/>
-      </w:pPr>
-    </w:p>
-    <w:p>
-      <w:pPr>
         <w:pStyle w:val="Ttulo2"/>
       </w:pPr>
       <w:bookmarkStart w:id="8" w:name="_Toc199261561"/>
@@ -5049,7 +5027,16 @@
     <w:p>
       <w:r>
         <w:tab/>
-        <w:t>En esta columna vamos a escribir los fondos que queremos que muestre el juego, así como la forma en que aparecen, la sintaxis es la siguiente:</w:t>
+        <w:t>En esta columna vamos a escribir los fondos que queremos que muestre el juego, así como la forma en que aparecen,</w:t>
+      </w:r>
+      <w:r>
+        <w:t xml:space="preserve"> deben estar en formato .png y tener una resolución de 1920x1080.</w:t>
+      </w:r>
+      <w:r>
+        <w:t xml:space="preserve"> </w:t>
+      </w:r>
+      <w:r>
+        <w:t>Sintaxis:</w:t>
       </w:r>
     </w:p>
     <w:p>
@@ -5154,19 +5141,17 @@
     </w:p>
     <w:p>
       <w:pPr>
-        <w:ind w:firstLine="708"/>
-      </w:pPr>
-    </w:p>
-    <w:p>
-      <w:pPr>
-        <w:ind w:firstLine="708"/>
-      </w:pPr>
-    </w:p>
-    <w:p>
-      <w:pPr>
-        <w:ind w:firstLine="708"/>
-      </w:pPr>
-    </w:p>
+        <w:pStyle w:val="Prrafodelista"/>
+        <w:ind w:left="1428"/>
+      </w:pPr>
+    </w:p>
+    <w:p>
+      <w:pPr>
+        <w:pStyle w:val="Prrafodelista"/>
+        <w:ind w:left="1428"/>
+      </w:pPr>
+    </w:p>
+    <w:p/>
     <w:p>
       <w:pPr>
         <w:pStyle w:val="Ttulo3"/>
@@ -5741,17 +5726,14 @@
     </w:tbl>
     <w:p>
       <w:pPr>
-        <w:pStyle w:val="Ttulo3"/>
-      </w:pPr>
-      <w:r>
-        <w:t xml:space="preserve"> </w:t>
-      </w:r>
-    </w:p>
-    <w:p>
-      <w:pPr>
         <w:pStyle w:val="Ttulo2"/>
       </w:pPr>
       <w:bookmarkStart w:id="9" w:name="_Toc199261562"/>
+    </w:p>
+    <w:p>
+      <w:pPr>
+        <w:pStyle w:val="Ttulo2"/>
+      </w:pPr>
       <w:r>
         <w:t>Columna Music</w:t>
       </w:r>
@@ -6291,14 +6273,6 @@
       <w:bookmarkStart w:id="11" w:name="_Toc199261564"/>
       <w:r>
         <w:lastRenderedPageBreak/>
-        <w:tab/>
-      </w:r>
-    </w:p>
-    <w:p>
-      <w:pPr>
-        <w:pStyle w:val="Ttulo2"/>
-      </w:pPr>
-      <w:r>
         <w:t xml:space="preserve">Columna Single </w:t>
       </w:r>
       <w:proofErr w:type="spellStart"/>
@@ -6712,6 +6686,11 @@
         <w:pStyle w:val="Ttulo2"/>
       </w:pPr>
       <w:bookmarkStart w:id="12" w:name="_Toc199261565"/>
+    </w:p>
+    <w:p>
+      <w:pPr>
+        <w:pStyle w:val="Ttulo2"/>
+      </w:pPr>
       <w:r>
         <w:t xml:space="preserve">Columna </w:t>
       </w:r>
@@ -6744,15 +6723,7 @@
         <w:t>, solo que esta vez es un efecto que sucede constantemente en pantalla y persiste indefinidamente hasta que se vuelva a llamar</w:t>
       </w:r>
       <w:r>
-        <w:t xml:space="preserve">. Se pueden dividir en dos, aquellos efectos continuos que interactúan con </w:t>
-      </w:r>
-      <w:proofErr w:type="spellStart"/>
-      <w:r>
-        <w:t>el</w:t>
-      </w:r>
-      <w:proofErr w:type="spellEnd"/>
-      <w:r>
-        <w:t xml:space="preserve"> fondo actual, y aquellos que colocan una imagen por encima.</w:t>
+        <w:t>. Se pueden dividir en dos, aquellos efectos continuos que interactúan con el fondo actual, y aquellos que colocan una imagen por encima.</w:t>
       </w:r>
       <w:r>
         <w:t xml:space="preserve"> </w:t>
@@ -7174,21 +7145,55 @@
     <w:p>
       <w:pPr>
         <w:pStyle w:val="Prrafodelista"/>
-        <w:numPr>
-          <w:ilvl w:val="0"/>
-          <w:numId w:val="10"/>
-        </w:numPr>
-      </w:pPr>
+        <w:ind w:left="1425"/>
+      </w:pPr>
+    </w:p>
+    <w:p>
+      <w:pPr>
+        <w:ind w:firstLine="708"/>
+      </w:pPr>
+      <w:r>
+        <w:t xml:space="preserve">Estos efectos que interactúan con el fondo no se pueden acumular, es decir, solo puede haber uno activo a la vez, por ejemplo, si se intenta colocar un </w:t>
+      </w:r>
+      <w:proofErr w:type="spellStart"/>
+      <w:r>
+        <w:t>rotate</w:t>
+      </w:r>
+      <w:proofErr w:type="spellEnd"/>
+      <w:r>
+        <w:t xml:space="preserve"> luego de un </w:t>
+      </w:r>
+      <w:proofErr w:type="spellStart"/>
+      <w:r>
+        <w:t>blur</w:t>
+      </w:r>
+      <w:proofErr w:type="spellEnd"/>
+      <w:r>
+        <w:t xml:space="preserve">, el </w:t>
+      </w:r>
+      <w:proofErr w:type="spellStart"/>
+      <w:r>
+        <w:t>blur</w:t>
+      </w:r>
+      <w:proofErr w:type="spellEnd"/>
+      <w:r>
+        <w:t xml:space="preserve"> desaparecerá y el </w:t>
+      </w:r>
+      <w:proofErr w:type="spellStart"/>
+      <w:r>
+        <w:t>rotate</w:t>
+      </w:r>
+      <w:proofErr w:type="spellEnd"/>
+      <w:r>
+        <w:t xml:space="preserve"> se ejecutará.</w:t>
+      </w:r>
     </w:p>
     <w:p>
       <w:pPr>
         <w:pStyle w:val="Ttulo3"/>
       </w:pPr>
       <w:r>
-        <w:t xml:space="preserve">Efectos que </w:t>
-      </w:r>
-      <w:r>
-        <w:t>colocan una imagen encima del fondo</w:t>
+        <w:t>Efectos que colocan una imagen encima del fondo</w:t>
       </w:r>
     </w:p>
     <w:tbl>
@@ -7327,10 +7332,13 @@
               <w:jc w:val="center"/>
             </w:pPr>
             <w:r>
-              <w:t xml:space="preserve">1. La </w:t>
-            </w:r>
-            <w:r>
-              <w:t>intensidad de la opacidad, donde 1 es la imagen normal y 0 es la imagen totalmente invisible. (0.4)</w:t>
+              <w:t>1. La opacidad, donde 1 es la imagen normal y 0 es la imagen totalmente invisible. (</w:t>
+            </w:r>
+            <w:r>
+              <w:t>1</w:t>
+            </w:r>
+            <w:r>
+              <w:t>)</w:t>
             </w:r>
           </w:p>
         </w:tc>
@@ -7340,6 +7348,19 @@
     <w:p>
       <w:r>
         <w:tab/>
+        <w:t>Estos también sirven para mostrar imágenes</w:t>
+      </w:r>
+      <w:r>
+        <w:t xml:space="preserve"> pequeñas para describir algún objeto o escena que estén observando, en cuyo caso habrá que escribir el nombre de la imagen. Cabe destacar que el nombre de la imagen debe ser único y no coincidir con el de algún fondo de pantalla.</w:t>
+      </w:r>
+    </w:p>
+    <w:p/>
+    <w:p/>
+    <w:p/>
+    <w:p>
+      <w:r>
+        <w:lastRenderedPageBreak/>
+        <w:tab/>
         <w:t>Ejemplos:</w:t>
       </w:r>
     </w:p>
@@ -7351,13 +7372,44 @@
           <w:numId w:val="10"/>
         </w:numPr>
       </w:pPr>
-      <w:proofErr w:type="spellStart"/>
-      <w:r>
-        <w:t>Suffocation</w:t>
-      </w:r>
-      <w:proofErr w:type="spellEnd"/>
-      <w:r>
-        <w:t>:</w:t>
+      <w:r>
+        <w:t>Suffocation:</w:t>
+      </w:r>
+      <w:r>
+        <w:t xml:space="preserve">0.4 (Muestra un fondo llamado </w:t>
+      </w:r>
+      <w:proofErr w:type="spellStart"/>
+      <w:r>
+        <w:t>suffocation</w:t>
+      </w:r>
+      <w:proofErr w:type="spellEnd"/>
+      <w:r>
+        <w:t xml:space="preserve"> el cual es rojizo y tiene venas en el borde con una opacidad del 0.4 dando la impresión de que el protagonista se está asfixiando o sufriendo)</w:t>
+      </w:r>
+    </w:p>
+    <w:p>
+      <w:pPr>
+        <w:pStyle w:val="Prrafodelista"/>
+        <w:numPr>
+          <w:ilvl w:val="0"/>
+          <w:numId w:val="10"/>
+        </w:numPr>
+      </w:pPr>
+      <w:proofErr w:type="spellStart"/>
+      <w:r>
+        <w:t>Family_picture</w:t>
+      </w:r>
+      <w:proofErr w:type="spellEnd"/>
+      <w:r>
+        <w:t xml:space="preserve"> (Muestra una foto de una familia en pantalla)</w:t>
+      </w:r>
+    </w:p>
+    <w:p>
+      <w:pPr>
+        <w:ind w:firstLine="708"/>
+      </w:pPr>
+      <w:r>
+        <w:t>Las imágenes deben estar en formato .png y se debe tener en cuenta la resolución que estas tienen ya que de ese tamaño se mostraran las imágenes, es decir, si intentas mostrar en pantalla una imagen de resolución 1920x1080, esta taparía toda la pantalla.</w:t>
       </w:r>
     </w:p>
     <w:p>
@@ -7366,7 +7418,6 @@
       </w:pPr>
       <w:bookmarkStart w:id="13" w:name="_Toc199261566"/>
       <w:r>
-        <w:lastRenderedPageBreak/>
         <w:t xml:space="preserve">Columna </w:t>
       </w:r>
       <w:proofErr w:type="spellStart"/>

</xml_diff>

<commit_message>
<fix> better var names
</commit_message>
<xml_diff>
--- a/Manual de desarrollo en Atlax Renpy.docx
+++ b/Manual de desarrollo en Atlax Renpy.docx
@@ -6552,10 +6552,7 @@
               <w:jc w:val="left"/>
             </w:pPr>
             <w:r>
-              <w:t>El personaje completamente visible en la parte más a la izquierda de la pantalla</w:t>
-            </w:r>
-            <w:r>
-              <w:t>.</w:t>
+              <w:t>El personaje completamente visible en la parte más a la izquierda de la pantalla.</w:t>
             </w:r>
           </w:p>
         </w:tc>
@@ -6621,10 +6618,7 @@
               <w:jc w:val="left"/>
             </w:pPr>
             <w:r>
-              <w:t>El personaje ubicado en todo el centro</w:t>
-            </w:r>
-            <w:r>
-              <w:t>.</w:t>
+              <w:t>El personaje ubicado en todo el centro.</w:t>
             </w:r>
           </w:p>
         </w:tc>
@@ -6657,19 +6651,7 @@
               <w:jc w:val="left"/>
             </w:pPr>
             <w:r>
-              <w:t xml:space="preserve">El personaje aparece ubicado a </w:t>
-            </w:r>
-            <w:r>
-              <w:t>dos</w:t>
-            </w:r>
-            <w:r>
-              <w:t xml:space="preserve"> tercio</w:t>
-            </w:r>
-            <w:r>
-              <w:t>s</w:t>
-            </w:r>
-            <w:r>
-              <w:t xml:space="preserve"> del ancho de la pantalla.</w:t>
+              <w:t>El personaje aparece ubicado a dos tercios del ancho de la pantalla.</w:t>
             </w:r>
           </w:p>
         </w:tc>
@@ -6702,10 +6684,7 @@
               <w:jc w:val="left"/>
             </w:pPr>
             <w:r>
-              <w:t>El personaje completamente visible en la parte más a la derecha de la pantalla</w:t>
-            </w:r>
-            <w:r>
-              <w:t>.</w:t>
+              <w:t>El personaje completamente visible en la parte más a la derecha de la pantalla.</w:t>
             </w:r>
           </w:p>
         </w:tc>
@@ -6744,10 +6723,7 @@
               <w:t>Sprite</w:t>
             </w:r>
             <w:r>
-              <w:t xml:space="preserve"> es visible</w:t>
-            </w:r>
-            <w:r>
-              <w:t>.</w:t>
+              <w:t xml:space="preserve"> es visible.</w:t>
             </w:r>
           </w:p>
         </w:tc>
@@ -6780,13 +6756,7 @@
               <w:jc w:val="left"/>
             </w:pPr>
             <w:r>
-              <w:t xml:space="preserve">El personaje aparece completamente oculto fuera de la pantalla por la </w:t>
-            </w:r>
-            <w:r>
-              <w:t>derecha</w:t>
-            </w:r>
-            <w:r>
-              <w:t>.</w:t>
+              <w:t>El personaje aparece completamente oculto fuera de la pantalla por la derecha.</w:t>
             </w:r>
           </w:p>
         </w:tc>
@@ -7212,10 +7182,7 @@
               <w:jc w:val="center"/>
             </w:pPr>
             <w:r>
-              <w:t xml:space="preserve">1. </w:t>
-            </w:r>
-            <w:r>
-              <w:t>Los segundos que el personaje cambia al nuevo Sprite (0)</w:t>
+              <w:t>1. Los segundos que el personaje cambia al nuevo Sprite (0)</w:t>
             </w:r>
           </w:p>
         </w:tc>
@@ -7264,10 +7231,7 @@
               <w:jc w:val="center"/>
             </w:pPr>
             <w:r>
-              <w:t xml:space="preserve">1. </w:t>
-            </w:r>
-            <w:r>
-              <w:t>La nueva posición.</w:t>
+              <w:t>1. La nueva posición.</w:t>
             </w:r>
           </w:p>
         </w:tc>
@@ -7310,10 +7274,7 @@
               <w:jc w:val="center"/>
             </w:pPr>
             <w:r>
-              <w:t>2.  L</w:t>
-            </w:r>
-            <w:r>
-              <w:t>os segundos que tardará en moverse</w:t>
+              <w:t>2.  Los segundos que tardará en moverse</w:t>
             </w:r>
             <w:r>
               <w:t>. (2)</w:t>
@@ -7425,10 +7386,7 @@
               <w:jc w:val="center"/>
             </w:pPr>
             <w:r>
-              <w:t>1. La</w:t>
-            </w:r>
-            <w:r>
-              <w:t>s veces que el personaje tiembla (10)</w:t>
+              <w:t>1. Las veces que el personaje tiembla (10)</w:t>
             </w:r>
           </w:p>
         </w:tc>
@@ -7573,10 +7531,7 @@
               <w:jc w:val="center"/>
             </w:pPr>
             <w:r>
-              <w:t xml:space="preserve">1. </w:t>
-            </w:r>
-            <w:r>
-              <w:t>La duración del derribo en segundos (0.5)</w:t>
+              <w:t>1. La duración del derribo en segundos (0.5)</w:t>
             </w:r>
           </w:p>
         </w:tc>
@@ -7721,25 +7676,11 @@
               <w:jc w:val="center"/>
             </w:pPr>
             <w:r>
-              <w:t xml:space="preserve">1. </w:t>
-            </w:r>
-            <w:r>
-              <w:t xml:space="preserve">Número decimal que indica hacia donde se moverá el personaje. </w:t>
+              <w:t xml:space="preserve">1. Número decimal que indica hacia donde se moverá el personaje. </w:t>
             </w:r>
             <w:r>
               <w:br/>
-            </w:r>
-            <w:r>
-              <w:t xml:space="preserve">0 </w:t>
-            </w:r>
-            <w:r>
-              <w:t>=</w:t>
-            </w:r>
-            <w:r>
-              <w:t xml:space="preserve"> personaje en el centro</w:t>
-            </w:r>
-            <w:r>
-              <w:t>.</w:t>
+              <w:t>0 = personaje en el centro.</w:t>
             </w:r>
           </w:p>
           <w:p>
@@ -7747,22 +7688,7 @@
               <w:jc w:val="center"/>
             </w:pPr>
             <w:r>
-              <w:t>1</w:t>
-            </w:r>
-            <w:r>
-              <w:t xml:space="preserve"> =</w:t>
-            </w:r>
-            <w:r>
-              <w:t xml:space="preserve"> </w:t>
-            </w:r>
-            <w:r>
-              <w:t xml:space="preserve">Saldrá </w:t>
-            </w:r>
-            <w:r>
-              <w:t>de pantalla por abajo</w:t>
-            </w:r>
-            <w:r>
-              <w:t>.</w:t>
+              <w:t>1 = Saldrá de pantalla por abajo.</w:t>
             </w:r>
           </w:p>
           <w:p>
@@ -7770,10 +7696,7 @@
               <w:jc w:val="center"/>
             </w:pPr>
             <w:r>
-              <w:t xml:space="preserve">-1 </w:t>
-            </w:r>
-            <w:r>
-              <w:t>= Saldrá de pantalla por arriba.</w:t>
+              <w:t>-1 = Saldrá de pantalla por arriba.</w:t>
             </w:r>
           </w:p>
         </w:tc>
@@ -8672,7 +8595,7 @@
     <w:p>
       <w:r>
         <w:tab/>
-        <w:t>A partir de esta columna se escribirán el texto de los diálogos que será mostrado en pantalla en los distintos idiomas declarados en la cabecera del archivo de control respetando el orden. En caso de necesitar añadir más idiomas es tan sencillo como escribir un ; en el último idioma y empezar a traducir todos los diálogos.</w:t>
+        <w:t>A partir de esta columna se escribirá el texto de los diálogos que será mostrado en pantalla en los distintos idiomas declarados en la cabecera del archivo de control respetando el orden. En caso de necesitar añadir más idiomas es tan sencillo como escribir un ; en el último idioma y empezar a traducir todos los diálogos.</w:t>
       </w:r>
     </w:p>
     <w:p>
@@ -8720,7 +8643,7 @@
       <w:r>
         <w:t xml:space="preserve">Renpy posee diversos modificadores de texto, estos se escriben en medio del diálogo y son perfectamente utilizables en la columnas de idioma. Existen muchos modificadores de texto así que te recomiendo leer la documentación de Renpy para intentar implementarlos. </w:t>
       </w:r>
-      <w:hyperlink r:id="rId26" w:history="1">
+      <w:hyperlink r:id="rId26" w:anchor="text-tag-alpha" w:history="1">
         <w:r>
           <w:rPr>
             <w:rStyle w:val="Hipervnculo"/>
@@ -8877,7 +8800,13 @@
     <w:p>
       <w:r>
         <w:tab/>
-        <w:t>Una terminación de escena describe la manera en que la escena va a terminar, define qué va a suceder cuando el archivo de control llegue a su fin. Para definir el final de una escena debemos empezar la columna key con un # y acto seguido describir el tipo de final que tendrá nuestra escena</w:t>
+        <w:t xml:space="preserve">Una terminación de escena describe la manera en que la escena va a terminar, define qué va a suceder cuando el archivo de control llegue a su fin. Para definir el final de una escena debemos empezar la </w:t>
+      </w:r>
+      <w:r>
+        <w:t>línea de texto</w:t>
+      </w:r>
+      <w:r>
+        <w:t xml:space="preserve"> con un # y acto seguido describir el tipo de final que tendrá nuestra escena</w:t>
       </w:r>
       <w:r>
         <w:t xml:space="preserve"> con sus respectivos parámetros</w:t>
@@ -8892,7 +8821,13 @@
       </w:pPr>
       <w:r>
         <w:tab/>
-        <w:t># tipo de terminación de escena</w:t>
+        <w:t xml:space="preserve"># </w:t>
+      </w:r>
+      <w:r>
+        <w:t>T</w:t>
+      </w:r>
+      <w:r>
+        <w:t>ipo de terminación de escena</w:t>
       </w:r>
       <w:r>
         <w:t xml:space="preserve"> ; transición : parámetros de transición</w:t>
@@ -8904,7 +8839,15 @@
       </w:pPr>
       <w:r>
         <w:tab/>
-        <w:t xml:space="preserve">Parámetro 1 </w:t>
+      </w:r>
+      <w:r>
+        <w:t>Key</w:t>
+      </w:r>
+      <w:r>
+        <w:t>_</w:t>
+      </w:r>
+      <w:r>
+        <w:t xml:space="preserve">1 </w:t>
       </w:r>
       <w:r>
         <w:t>;</w:t>
@@ -8931,13 +8874,15 @@
       </w:pPr>
       <w:r>
         <w:tab/>
-        <w:t xml:space="preserve">Parámetro </w:t>
-      </w:r>
-      <w:r>
-        <w:t>2</w:t>
-      </w:r>
-      <w:r>
-        <w:t xml:space="preserve"> </w:t>
+      </w:r>
+      <w:r>
+        <w:t>Key</w:t>
+      </w:r>
+      <w:r>
+        <w:t>_</w:t>
+      </w:r>
+      <w:r>
+        <w:t xml:space="preserve"> 2 </w:t>
       </w:r>
       <w:r>
         <w:t>;</w:t>
@@ -8960,6 +8905,32 @@
     </w:p>
     <w:p>
       <w:pPr>
+        <w:spacing w:after="0"/>
+      </w:pPr>
+    </w:p>
+    <w:p>
+      <w:pPr>
+        <w:spacing w:after="0"/>
+      </w:pPr>
+      <w:r>
+        <w:tab/>
+        <w:t>La filas siguientes después de definir el tipo de terminación, son cada uno de los elementos que acompañan al tipo de terminación, en este caso nombrados “</w:t>
+      </w:r>
+      <w:r>
+        <w:t>Key</w:t>
+      </w:r>
+      <w:r>
+        <w:t>_1” y “</w:t>
+      </w:r>
+      <w:r>
+        <w:t>Key</w:t>
+      </w:r>
+      <w:r>
+        <w:t>_2”, estos campos funcionan de forma similar a la columna Key, se requiere que tengan un identificador único completamente distinto a todos los demás, esto se hace para que posteriormente podamos crear consecuencias basadas en acontecimientos anteriores.</w:t>
+      </w:r>
+    </w:p>
+    <w:p>
+      <w:pPr>
         <w:pStyle w:val="Ttulo3"/>
       </w:pPr>
       <w:r>
@@ -8969,12 +8940,1587 @@
     <w:p>
       <w:r>
         <w:tab/>
-        <w:t>Una escena que termina de forma lineal es que siempre lleva a la misma escena. Útil cuando queremos que varios caminos desemboquen en uno solo o simplemente para mantener más ordenados los archivos de control.</w:t>
+        <w:t>Una escena que termina de forma lineal es</w:t>
+      </w:r>
+      <w:r>
+        <w:t xml:space="preserve"> la</w:t>
+      </w:r>
+      <w:r>
+        <w:t xml:space="preserve"> que siempre lleva a la misma escena. Útil cuando queremos que varios caminos desemboquen en uno solo o simplemente para mantener más ordenados los archivos de control.</w:t>
+      </w:r>
+    </w:p>
+    <w:p>
+      <w:r>
+        <w:rPr>
+          <w:noProof/>
+        </w:rPr>
+        <w:drawing>
+          <wp:inline distT="0" distB="0" distL="0" distR="0" wp14:anchorId="5B7426F9" wp14:editId="63DB19C4">
+            <wp:extent cx="5400040" cy="1024255"/>
+            <wp:effectExtent l="0" t="0" r="0" b="4445"/>
+            <wp:docPr id="1381373383" name="Imagen 1"/>
+            <wp:cNvGraphicFramePr>
+              <a:graphicFrameLocks xmlns:a="http://schemas.openxmlformats.org/drawingml/2006/main" noChangeAspect="1"/>
+            </wp:cNvGraphicFramePr>
+            <a:graphic xmlns:a="http://schemas.openxmlformats.org/drawingml/2006/main">
+              <a:graphicData uri="http://schemas.openxmlformats.org/drawingml/2006/picture">
+                <pic:pic xmlns:pic="http://schemas.openxmlformats.org/drawingml/2006/picture">
+                  <pic:nvPicPr>
+                    <pic:cNvPr id="1381373383" name=""/>
+                    <pic:cNvPicPr/>
+                  </pic:nvPicPr>
+                  <pic:blipFill>
+                    <a:blip r:embed="rId27"/>
+                    <a:stretch>
+                      <a:fillRect/>
+                    </a:stretch>
+                  </pic:blipFill>
+                  <pic:spPr>
+                    <a:xfrm>
+                      <a:off x="0" y="0"/>
+                      <a:ext cx="5400040" cy="1024255"/>
+                    </a:xfrm>
+                    <a:prstGeom prst="rect">
+                      <a:avLst/>
+                    </a:prstGeom>
+                  </pic:spPr>
+                </pic:pic>
+              </a:graphicData>
+            </a:graphic>
+          </wp:inline>
+        </w:drawing>
+      </w:r>
+    </w:p>
+    <w:p>
+      <w:r>
+        <w:tab/>
+        <w:t>En este ejemplo podemos ver como la Escena A siempre conlleva a la Escena B. Si bien es cierto que podríamos escribir todo un capítulo dentro de una misma escena, lo recomendable es utilizar varias escenas y que cada una englobe un arco o situación dentro de la historia.</w:t>
+      </w:r>
+    </w:p>
+    <w:p>
+      <w:r>
+        <w:lastRenderedPageBreak/>
+        <w:t xml:space="preserve">             </w:t>
+      </w:r>
+      <w:r>
+        <w:rPr>
+          <w:noProof/>
+        </w:rPr>
+        <w:drawing>
+          <wp:inline distT="0" distB="0" distL="0" distR="0" wp14:anchorId="66B3A939" wp14:editId="251F2D69">
+            <wp:extent cx="4600575" cy="2345190"/>
+            <wp:effectExtent l="0" t="0" r="0" b="0"/>
+            <wp:docPr id="1504239939" name="Imagen 1"/>
+            <wp:cNvGraphicFramePr>
+              <a:graphicFrameLocks xmlns:a="http://schemas.openxmlformats.org/drawingml/2006/main" noChangeAspect="1"/>
+            </wp:cNvGraphicFramePr>
+            <a:graphic xmlns:a="http://schemas.openxmlformats.org/drawingml/2006/main">
+              <a:graphicData uri="http://schemas.openxmlformats.org/drawingml/2006/picture">
+                <pic:pic xmlns:pic="http://schemas.openxmlformats.org/drawingml/2006/picture">
+                  <pic:nvPicPr>
+                    <pic:cNvPr id="1504239939" name=""/>
+                    <pic:cNvPicPr/>
+                  </pic:nvPicPr>
+                  <pic:blipFill>
+                    <a:blip r:embed="rId28"/>
+                    <a:stretch>
+                      <a:fillRect/>
+                    </a:stretch>
+                  </pic:blipFill>
+                  <pic:spPr>
+                    <a:xfrm>
+                      <a:off x="0" y="0"/>
+                      <a:ext cx="4606794" cy="2348360"/>
+                    </a:xfrm>
+                    <a:prstGeom prst="rect">
+                      <a:avLst/>
+                    </a:prstGeom>
+                  </pic:spPr>
+                </pic:pic>
+              </a:graphicData>
+            </a:graphic>
+          </wp:inline>
+        </w:drawing>
+      </w:r>
+    </w:p>
+    <w:p>
+      <w:r>
+        <w:tab/>
+        <w:t>En este caso podemos apreciar otro caso de terminación lineal, Las escenas A, B y C siempre terminan en la escena D. Es decir, el autor desea que la escena D siempre suceda sin importar el camino que hay tomado el jugador.</w:t>
+      </w:r>
+      <w:r>
+        <w:t xml:space="preserve"> La sintaxis de una escena que termina linealmente es la siguiente.</w:t>
+      </w:r>
+    </w:p>
+    <w:p>
+      <w:pPr>
+        <w:spacing w:after="0"/>
+      </w:pPr>
+      <w:r>
+        <w:tab/>
+        <w:t>#linear</w:t>
+      </w:r>
+    </w:p>
+    <w:p>
+      <w:r>
+        <w:tab/>
+        <w:t>Key_de_fin_de_escena_A ; Nombre_de_la_siguiente_escena</w:t>
+      </w:r>
+    </w:p>
+    <w:p>
+      <w:r>
+        <w:tab/>
+        <w:t xml:space="preserve">Por ejemplo, si estamos en una escena llamada </w:t>
+      </w:r>
+      <w:r>
+        <w:t xml:space="preserve">“studying_for_final_exam” y </w:t>
+      </w:r>
+      <w:r>
+        <w:t xml:space="preserve">tenemos </w:t>
+      </w:r>
+      <w:r>
+        <w:t>otra</w:t>
+      </w:r>
+      <w:r>
+        <w:t xml:space="preserve"> escena</w:t>
+      </w:r>
+      <w:r>
+        <w:t xml:space="preserve"> que le sigue llamada “the_final_exam”, el archivo de control studying_for_</w:t>
+      </w:r>
+      <w:r>
+        <w:t>final_</w:t>
+      </w:r>
+      <w:r>
+        <w:t>exam.csv debería de terminar de la siguiente forma.</w:t>
+      </w:r>
+    </w:p>
+    <w:p>
+      <w:pPr>
+        <w:spacing w:after="0"/>
+        <w:rPr>
+          <w:highlight w:val="yellow"/>
+        </w:rPr>
+      </w:pPr>
+      <w:r>
+        <w:tab/>
+      </w:r>
+      <w:r>
+        <w:rPr>
+          <w:highlight w:val="yellow"/>
+        </w:rPr>
+        <w:t>#linear</w:t>
+      </w:r>
+    </w:p>
+    <w:p>
+      <w:pPr>
+        <w:ind w:firstLine="708"/>
+      </w:pPr>
+      <w:r>
+        <w:rPr>
+          <w:highlight w:val="yellow"/>
+        </w:rPr>
+        <w:t>studying_for_final_exam</w:t>
+      </w:r>
+      <w:r>
+        <w:rPr>
+          <w:highlight w:val="yellow"/>
+        </w:rPr>
+        <w:t xml:space="preserve">_end ; </w:t>
+      </w:r>
+      <w:r>
+        <w:rPr>
+          <w:highlight w:val="yellow"/>
+        </w:rPr>
+        <w:t>the_final_exam</w:t>
+      </w:r>
+    </w:p>
+    <w:p>
+      <w:r>
+        <w:tab/>
+        <w:t>Continuando con el ejemplo de la segunda imagen, imaginemos que en nuestra historia hay un examen obligatorio que sin importar la ruta en que se encuentre el jugador, este examen siempre va a suceder. La escena del examen la llamaremos “the_x_exam”.</w:t>
+      </w:r>
+    </w:p>
+    <w:p>
+      <w:pPr>
+        <w:sectPr>
+          <w:type w:val="continuous"/>
+          <w:pgSz w:w="11906" w:h="16838"/>
+          <w:pgMar w:top="1417" w:right="1701" w:bottom="1417" w:left="1701" w:header="708" w:footer="708" w:gutter="0"/>
+          <w:cols w:space="708"/>
+          <w:docGrid w:linePitch="360"/>
+        </w:sectPr>
+      </w:pPr>
+    </w:p>
+    <w:p>
+      <w:pPr>
+        <w:sectPr>
+          <w:type w:val="continuous"/>
+          <w:pgSz w:w="11906" w:h="16838"/>
+          <w:pgMar w:top="1417" w:right="1701" w:bottom="1417" w:left="1701" w:header="708" w:footer="708" w:gutter="0"/>
+          <w:cols w:num="2" w:space="708"/>
+          <w:docGrid w:linePitch="360"/>
+        </w:sectPr>
+      </w:pPr>
+      <w:r>
+        <w:tab/>
+      </w:r>
+    </w:p>
+    <w:p>
+      <w:r>
+        <w:t>(En la ruta de Katherine)</w:t>
+      </w:r>
+    </w:p>
+    <w:p>
+      <w:pPr>
+        <w:spacing w:after="0"/>
+        <w:rPr>
+          <w:highlight w:val="yellow"/>
+        </w:rPr>
+      </w:pPr>
+      <w:r>
+        <w:rPr>
+          <w:highlight w:val="yellow"/>
+        </w:rPr>
+        <w:t>#linear</w:t>
+      </w:r>
+    </w:p>
+    <w:p>
+      <w:pPr>
+        <w:spacing w:after="0"/>
+      </w:pPr>
+      <w:r>
+        <w:rPr>
+          <w:highlight w:val="yellow"/>
+        </w:rPr>
+        <w:t>katherine_scene_end ; the_x_exam</w:t>
       </w:r>
     </w:p>
     <w:p/>
     <w:p/>
     <w:p>
+      <w:r>
+        <w:t xml:space="preserve">(En la ruta de </w:t>
+      </w:r>
+      <w:r>
+        <w:t>Amber</w:t>
+      </w:r>
+      <w:r>
+        <w:t>)</w:t>
+      </w:r>
+    </w:p>
+    <w:p>
+      <w:pPr>
+        <w:spacing w:after="0"/>
+        <w:rPr>
+          <w:highlight w:val="yellow"/>
+        </w:rPr>
+      </w:pPr>
+      <w:r>
+        <w:rPr>
+          <w:highlight w:val="yellow"/>
+        </w:rPr>
+        <w:t>#linear</w:t>
+      </w:r>
+    </w:p>
+    <w:p>
+      <w:pPr>
+        <w:spacing w:after="0"/>
+      </w:pPr>
+      <w:r>
+        <w:rPr>
+          <w:highlight w:val="yellow"/>
+        </w:rPr>
+        <w:t>amber_scene_end</w:t>
+      </w:r>
+      <w:r>
+        <w:rPr>
+          <w:highlight w:val="yellow"/>
+        </w:rPr>
+        <w:t xml:space="preserve"> ; the_x_exam</w:t>
+      </w:r>
+    </w:p>
+    <w:p>
+      <w:r>
+        <w:t>(En la ruta de Mariangeles)</w:t>
+      </w:r>
+    </w:p>
+    <w:p>
+      <w:pPr>
+        <w:spacing w:after="0"/>
+        <w:rPr>
+          <w:highlight w:val="yellow"/>
+        </w:rPr>
+      </w:pPr>
+      <w:r>
+        <w:rPr>
+          <w:highlight w:val="yellow"/>
+        </w:rPr>
+        <w:t>#linear</w:t>
+      </w:r>
+    </w:p>
+    <w:p>
+      <w:pPr>
+        <w:spacing w:after="0"/>
+      </w:pPr>
+      <w:r>
+        <w:rPr>
+          <w:highlight w:val="yellow"/>
+        </w:rPr>
+        <w:t>mariangeles_scene_end ; the_x_exam</w:t>
+      </w:r>
+    </w:p>
+    <w:p/>
+    <w:p/>
+    <w:p>
+      <w:r>
+        <w:t>(En la ruta de Stefannie)</w:t>
+      </w:r>
+    </w:p>
+    <w:p>
+      <w:pPr>
+        <w:spacing w:after="0"/>
+        <w:rPr>
+          <w:highlight w:val="yellow"/>
+        </w:rPr>
+      </w:pPr>
+      <w:r>
+        <w:rPr>
+          <w:highlight w:val="yellow"/>
+        </w:rPr>
+        <w:t>#linear</w:t>
+      </w:r>
+    </w:p>
+    <w:p>
+      <w:pPr>
+        <w:spacing w:after="0"/>
+        <w:sectPr>
+          <w:type w:val="continuous"/>
+          <w:pgSz w:w="11906" w:h="16838"/>
+          <w:pgMar w:top="1417" w:right="1701" w:bottom="1417" w:left="1701" w:header="708" w:footer="708" w:gutter="0"/>
+          <w:cols w:num="2" w:space="708"/>
+          <w:docGrid w:linePitch="360"/>
+        </w:sectPr>
+      </w:pPr>
+      <w:r>
+        <w:rPr>
+          <w:highlight w:val="yellow"/>
+        </w:rPr>
+        <w:t>stefannie_scene_end ; the_x_exam</w:t>
+      </w:r>
+    </w:p>
+    <w:p>
+      <w:pPr>
+        <w:sectPr>
+          <w:type w:val="continuous"/>
+          <w:pgSz w:w="11906" w:h="16838"/>
+          <w:pgMar w:top="1417" w:right="1701" w:bottom="1417" w:left="1701" w:header="708" w:footer="708" w:gutter="0"/>
+          <w:cols w:num="2" w:space="708"/>
+          <w:docGrid w:linePitch="360"/>
+        </w:sectPr>
+      </w:pPr>
+    </w:p>
+    <w:p/>
+    <w:p/>
+    <w:p>
+      <w:pPr>
+        <w:sectPr>
+          <w:type w:val="continuous"/>
+          <w:pgSz w:w="11906" w:h="16838"/>
+          <w:pgMar w:top="1417" w:right="1701" w:bottom="1417" w:left="1701" w:header="708" w:footer="708" w:gutter="0"/>
+          <w:cols w:num="2" w:space="708"/>
+          <w:docGrid w:linePitch="360"/>
+        </w:sectPr>
+      </w:pPr>
+    </w:p>
+    <w:p>
+      <w:pPr>
+        <w:pStyle w:val="Ttulo3"/>
+      </w:pPr>
+      <w:r>
+        <w:lastRenderedPageBreak/>
+        <w:t>Decisión</w:t>
+      </w:r>
+    </w:p>
+    <w:p>
+      <w:r>
+        <w:tab/>
+        <w:t>La decisión es la mecánica principal de la mayoría de novelas visuales, este consiste en plasmar ante el jugador una situación en la que deba tomar una decisión. Con las decisiones podemos dividir la historia en caminos distintos y además Atlax Renpy nos permitirá agregar un sistema de puntos. Sintaxis.</w:t>
+      </w:r>
+    </w:p>
+    <w:p>
+      <w:pPr>
+        <w:spacing w:after="0"/>
+      </w:pPr>
+      <w:r>
+        <w:tab/>
+        <w:t>#decision</w:t>
+      </w:r>
+    </w:p>
+    <w:p>
+      <w:pPr>
+        <w:spacing w:after="0"/>
+        <w:ind w:firstLine="708"/>
+      </w:pPr>
+      <w:r>
+        <w:t>key_opcion_1 ; punto_1 : valor_punto_1 ; siguiente escena</w:t>
+      </w:r>
+    </w:p>
+    <w:p>
+      <w:pPr>
+        <w:spacing w:after="0"/>
+        <w:ind w:firstLine="708"/>
+      </w:pPr>
+      <w:r>
+        <w:t>k</w:t>
+      </w:r>
+      <w:r>
+        <w:t>ey_opcion_</w:t>
+      </w:r>
+      <w:r>
+        <w:t>2</w:t>
+      </w:r>
+      <w:r>
+        <w:t xml:space="preserve"> ;; siguiente escena</w:t>
+      </w:r>
+    </w:p>
+    <w:p>
+      <w:pPr>
+        <w:spacing w:after="0"/>
+        <w:ind w:firstLine="708"/>
+      </w:pPr>
+      <w:r>
+        <w:t>k</w:t>
+      </w:r>
+      <w:r>
+        <w:t>ey_opcion_</w:t>
+      </w:r>
+      <w:r>
+        <w:t>3</w:t>
+      </w:r>
+      <w:r>
+        <w:t xml:space="preserve"> ; punto1:valor_punto1</w:t>
+      </w:r>
+      <w:r>
+        <w:t>, punto2:valor_punto2</w:t>
+      </w:r>
+      <w:r>
+        <w:t xml:space="preserve"> ; siguiente escena</w:t>
+      </w:r>
+      <w:r>
+        <w:t xml:space="preserve"> </w:t>
+      </w:r>
+    </w:p>
+    <w:p>
+      <w:pPr>
+        <w:spacing w:after="0"/>
+        <w:ind w:firstLine="708"/>
+      </w:pPr>
+    </w:p>
+    <w:p>
+      <w:pPr>
+        <w:spacing w:after="0"/>
+        <w:ind w:firstLine="708"/>
+      </w:pPr>
+      <w:r>
+        <w:t>Podemos hacer que cada opción de la decisión lleve a una escena distinta o que algunas de ellas lleven a la misma.</w:t>
+      </w:r>
+    </w:p>
+    <w:p>
+      <w:pPr>
+        <w:spacing w:after="0"/>
+        <w:ind w:firstLine="708"/>
+      </w:pPr>
+    </w:p>
+    <w:p>
+      <w:pPr>
+        <w:spacing w:after="0"/>
+      </w:pPr>
+      <w:r>
+        <w:t xml:space="preserve">       </w:t>
+      </w:r>
+      <w:r>
+        <w:rPr>
+          <w:noProof/>
+        </w:rPr>
+        <w:drawing>
+          <wp:inline distT="0" distB="0" distL="0" distR="0" wp14:anchorId="5F881253" wp14:editId="048554C7">
+            <wp:extent cx="4961890" cy="2613978"/>
+            <wp:effectExtent l="0" t="0" r="0" b="0"/>
+            <wp:docPr id="1529824056" name="Imagen 1"/>
+            <wp:cNvGraphicFramePr>
+              <a:graphicFrameLocks xmlns:a="http://schemas.openxmlformats.org/drawingml/2006/main" noChangeAspect="1"/>
+            </wp:cNvGraphicFramePr>
+            <a:graphic xmlns:a="http://schemas.openxmlformats.org/drawingml/2006/main">
+              <a:graphicData uri="http://schemas.openxmlformats.org/drawingml/2006/picture">
+                <pic:pic xmlns:pic="http://schemas.openxmlformats.org/drawingml/2006/picture">
+                  <pic:nvPicPr>
+                    <pic:cNvPr id="1529824056" name=""/>
+                    <pic:cNvPicPr/>
+                  </pic:nvPicPr>
+                  <pic:blipFill>
+                    <a:blip r:embed="rId29"/>
+                    <a:stretch>
+                      <a:fillRect/>
+                    </a:stretch>
+                  </pic:blipFill>
+                  <pic:spPr>
+                    <a:xfrm>
+                      <a:off x="0" y="0"/>
+                      <a:ext cx="4971029" cy="2618793"/>
+                    </a:xfrm>
+                    <a:prstGeom prst="rect">
+                      <a:avLst/>
+                    </a:prstGeom>
+                  </pic:spPr>
+                </pic:pic>
+              </a:graphicData>
+            </a:graphic>
+          </wp:inline>
+        </w:drawing>
+      </w:r>
+    </w:p>
+    <w:p>
+      <w:r>
+        <w:t xml:space="preserve">       </w:t>
+      </w:r>
+      <w:r>
+        <w:rPr>
+          <w:noProof/>
+        </w:rPr>
+        <w:drawing>
+          <wp:inline distT="0" distB="0" distL="0" distR="0" wp14:anchorId="0C9D4566" wp14:editId="4CC4BAE9">
+            <wp:extent cx="4931845" cy="2381250"/>
+            <wp:effectExtent l="0" t="0" r="2540" b="0"/>
+            <wp:docPr id="776506038" name="Imagen 1"/>
+            <wp:cNvGraphicFramePr>
+              <a:graphicFrameLocks xmlns:a="http://schemas.openxmlformats.org/drawingml/2006/main" noChangeAspect="1"/>
+            </wp:cNvGraphicFramePr>
+            <a:graphic xmlns:a="http://schemas.openxmlformats.org/drawingml/2006/main">
+              <a:graphicData uri="http://schemas.openxmlformats.org/drawingml/2006/picture">
+                <pic:pic xmlns:pic="http://schemas.openxmlformats.org/drawingml/2006/picture">
+                  <pic:nvPicPr>
+                    <pic:cNvPr id="776506038" name=""/>
+                    <pic:cNvPicPr/>
+                  </pic:nvPicPr>
+                  <pic:blipFill>
+                    <a:blip r:embed="rId30"/>
+                    <a:stretch>
+                      <a:fillRect/>
+                    </a:stretch>
+                  </pic:blipFill>
+                  <pic:spPr>
+                    <a:xfrm>
+                      <a:off x="0" y="0"/>
+                      <a:ext cx="4939020" cy="2384714"/>
+                    </a:xfrm>
+                    <a:prstGeom prst="rect">
+                      <a:avLst/>
+                    </a:prstGeom>
+                  </pic:spPr>
+                </pic:pic>
+              </a:graphicData>
+            </a:graphic>
+          </wp:inline>
+        </w:drawing>
+      </w:r>
+    </w:p>
+    <w:p>
+      <w:r>
+        <w:tab/>
+        <w:t>Como se dijo anteriormente, también se pueden modificar los puntos, estos puntos pueden llevar el nombre que se desee, el único detalle es que debes asegurarte de escribirlo bien ya que si lo escribes mal, el motor lo interpretará como un punto distinto.</w:t>
+      </w:r>
+    </w:p>
+    <w:p>
+      <w:r>
+        <w:lastRenderedPageBreak/>
+        <w:t xml:space="preserve">            </w:t>
+      </w:r>
+      <w:r>
+        <w:rPr>
+          <w:noProof/>
+        </w:rPr>
+        <w:drawing>
+          <wp:inline distT="0" distB="0" distL="0" distR="0" wp14:anchorId="632249F4" wp14:editId="20B338BB">
+            <wp:extent cx="4791075" cy="2616387"/>
+            <wp:effectExtent l="0" t="0" r="0" b="0"/>
+            <wp:docPr id="1612724208" name="Imagen 1"/>
+            <wp:cNvGraphicFramePr>
+              <a:graphicFrameLocks xmlns:a="http://schemas.openxmlformats.org/drawingml/2006/main" noChangeAspect="1"/>
+            </wp:cNvGraphicFramePr>
+            <a:graphic xmlns:a="http://schemas.openxmlformats.org/drawingml/2006/main">
+              <a:graphicData uri="http://schemas.openxmlformats.org/drawingml/2006/picture">
+                <pic:pic xmlns:pic="http://schemas.openxmlformats.org/drawingml/2006/picture">
+                  <pic:nvPicPr>
+                    <pic:cNvPr id="1612724208" name=""/>
+                    <pic:cNvPicPr/>
+                  </pic:nvPicPr>
+                  <pic:blipFill>
+                    <a:blip r:embed="rId31"/>
+                    <a:stretch>
+                      <a:fillRect/>
+                    </a:stretch>
+                  </pic:blipFill>
+                  <pic:spPr>
+                    <a:xfrm>
+                      <a:off x="0" y="0"/>
+                      <a:ext cx="4797245" cy="2619756"/>
+                    </a:xfrm>
+                    <a:prstGeom prst="rect">
+                      <a:avLst/>
+                    </a:prstGeom>
+                  </pic:spPr>
+                </pic:pic>
+              </a:graphicData>
+            </a:graphic>
+          </wp:inline>
+        </w:drawing>
+      </w:r>
+    </w:p>
+    <w:p>
+      <w:r>
+        <w:tab/>
+        <w:t>Por supuesto que los puntos no son obligatorios, puedes dejarlo en blanco. El ejemplo anterior se escribiría así.</w:t>
+      </w:r>
+    </w:p>
+    <w:p>
+      <w:pPr>
+        <w:spacing w:after="0"/>
+      </w:pPr>
+      <w:r>
+        <w:tab/>
+      </w:r>
+      <w:r>
+        <w:rPr>
+          <w:highlight w:val="yellow"/>
+        </w:rPr>
+        <w:t>#linear</w:t>
+      </w:r>
+    </w:p>
+    <w:p>
+      <w:pPr>
+        <w:spacing w:after="0"/>
+      </w:pPr>
+      <w:r>
+        <w:tab/>
+      </w:r>
+      <w:r>
+        <w:rPr>
+          <w:highlight w:val="yellow"/>
+        </w:rPr>
+        <w:t>give_sushi ; ; scene_B</w:t>
+      </w:r>
+    </w:p>
+    <w:p>
+      <w:pPr>
+        <w:spacing w:after="0"/>
+      </w:pPr>
+      <w:r>
+        <w:tab/>
+      </w:r>
+      <w:r>
+        <w:rPr>
+          <w:highlight w:val="yellow"/>
+        </w:rPr>
+        <w:t>give_salad ; amistad : -1 ; scene_C</w:t>
+      </w:r>
+    </w:p>
+    <w:p>
+      <w:pPr>
+        <w:spacing w:after="0"/>
+      </w:pPr>
+      <w:r>
+        <w:tab/>
+      </w:r>
+      <w:r>
+        <w:rPr>
+          <w:highlight w:val="yellow"/>
+        </w:rPr>
+        <w:t>give_beef ; amistad : 1 ; scene_D</w:t>
+      </w:r>
+    </w:p>
+    <w:p>
+      <w:pPr>
+        <w:spacing w:after="0"/>
+      </w:pPr>
+    </w:p>
+    <w:p>
+      <w:pPr>
+        <w:spacing w:after="0"/>
+      </w:pPr>
+      <w:r>
+        <w:tab/>
+        <w:t>Nuevamente hago énfasis en que cada opción debe tener su identificador único ya que nos servirá para manejar las consecuencias</w:t>
+      </w:r>
+      <w:r>
+        <w:t>, este caso son “give_sushi”, “give_salad” y “give_beef”, estos identificadores jamás deben repetirse, o al menos, en la ruta actual</w:t>
+      </w:r>
+      <w:r>
+        <w:t>.</w:t>
+      </w:r>
+    </w:p>
+    <w:p>
+      <w:pPr>
+        <w:pStyle w:val="Ttulo3"/>
+      </w:pPr>
+      <w:r>
+        <w:t>Condición</w:t>
+      </w:r>
+    </w:p>
+    <w:p>
+      <w:r>
+        <w:tab/>
+        <w:t>Cuando la escena llega al final, dependiendo de una serie de condiciones, el motor automáticamente toma un camino sin que el jugador lo note. Esto nos permite hacer que una escena conlleve a múltiples escenas sin necesidad de colocar una decisión, en vez de eso, nos basaremos en eventos pasados como si se tratara de una consecuencia.</w:t>
+      </w:r>
+    </w:p>
+    <w:p>
+      <w:r>
+        <w:tab/>
+        <w:t>Existen 3 tipos de condiciones, condición por puntos, por escena</w:t>
+      </w:r>
+      <w:r>
+        <w:t xml:space="preserve"> </w:t>
+      </w:r>
+      <w:r>
+        <w:t>y por decisión.</w:t>
+      </w:r>
+      <w:r>
+        <w:t xml:space="preserve"> Para estas condiciones se debe tener especial control sobre los valores posibles de los puntos así como los posibles diálogos y escenas pasadas, esto para saber si de verdad las condiciones que estás escribiendo se pueden cumplir. </w:t>
+      </w:r>
+    </w:p>
+    <w:p>
+      <w:pPr>
+        <w:ind w:firstLine="708"/>
+      </w:pPr>
+      <w:r>
+        <w:t xml:space="preserve">Un ejemplo es colocar la condición de que el jugador deba tener 50 puntos de amistad cuando a ese punto es imposible que él haya alcanzado esa puntuación. </w:t>
+      </w:r>
+      <w:r>
+        <w:t>Si ninguna condición se cumple el juego tomará la última por defecto.</w:t>
+      </w:r>
+    </w:p>
+    <w:p>
+      <w:pPr>
+        <w:pStyle w:val="Ttulo4"/>
+      </w:pPr>
+      <w:r>
+        <w:lastRenderedPageBreak/>
+        <w:t>Condición por puntos</w:t>
+      </w:r>
+    </w:p>
+    <w:p>
+      <w:r>
+        <w:rPr>
+          <w:noProof/>
+        </w:rPr>
+        <w:drawing>
+          <wp:inline distT="0" distB="0" distL="0" distR="0" wp14:anchorId="7CC5750D" wp14:editId="15E05ED1">
+            <wp:extent cx="5400040" cy="2329815"/>
+            <wp:effectExtent l="0" t="0" r="0" b="0"/>
+            <wp:docPr id="675072319" name="Imagen 1"/>
+            <wp:cNvGraphicFramePr>
+              <a:graphicFrameLocks xmlns:a="http://schemas.openxmlformats.org/drawingml/2006/main" noChangeAspect="1"/>
+            </wp:cNvGraphicFramePr>
+            <a:graphic xmlns:a="http://schemas.openxmlformats.org/drawingml/2006/main">
+              <a:graphicData uri="http://schemas.openxmlformats.org/drawingml/2006/picture">
+                <pic:pic xmlns:pic="http://schemas.openxmlformats.org/drawingml/2006/picture">
+                  <pic:nvPicPr>
+                    <pic:cNvPr id="675072319" name=""/>
+                    <pic:cNvPicPr/>
+                  </pic:nvPicPr>
+                  <pic:blipFill>
+                    <a:blip r:embed="rId32"/>
+                    <a:stretch>
+                      <a:fillRect/>
+                    </a:stretch>
+                  </pic:blipFill>
+                  <pic:spPr>
+                    <a:xfrm>
+                      <a:off x="0" y="0"/>
+                      <a:ext cx="5400040" cy="2329815"/>
+                    </a:xfrm>
+                    <a:prstGeom prst="rect">
+                      <a:avLst/>
+                    </a:prstGeom>
+                  </pic:spPr>
+                </pic:pic>
+              </a:graphicData>
+            </a:graphic>
+          </wp:inline>
+        </w:drawing>
+      </w:r>
+    </w:p>
+    <w:p>
+      <w:pPr>
+        <w:spacing w:after="0"/>
+      </w:pPr>
+      <w:r>
+        <w:tab/>
+      </w:r>
+      <w:r>
+        <w:rPr>
+          <w:highlight w:val="yellow"/>
+        </w:rPr>
+        <w:t>#condition points</w:t>
+      </w:r>
+    </w:p>
+    <w:p>
+      <w:pPr>
+        <w:spacing w:after="0"/>
+      </w:pPr>
+      <w:r>
+        <w:tab/>
+      </w:r>
+      <w:r>
+        <w:rPr>
+          <w:highlight w:val="yellow"/>
+        </w:rPr>
+        <w:t>exam_positive_grade ; calificación &gt; 10 ; aprobado</w:t>
+      </w:r>
+    </w:p>
+    <w:p>
+      <w:pPr>
+        <w:spacing w:after="0"/>
+      </w:pPr>
+      <w:r>
+        <w:tab/>
+      </w:r>
+      <w:r>
+        <w:rPr>
+          <w:highlight w:val="yellow"/>
+        </w:rPr>
+        <w:t>exam_negative_grade ; ; reprobado</w:t>
+      </w:r>
+    </w:p>
+    <w:p>
+      <w:pPr>
+        <w:spacing w:after="0"/>
+      </w:pPr>
+      <w:r>
+        <w:tab/>
+      </w:r>
+    </w:p>
+    <w:p>
+      <w:pPr>
+        <w:spacing w:after="0"/>
+      </w:pPr>
+      <w:r>
+        <w:tab/>
+        <w:t>Los distintos operadores de comparación son:</w:t>
+      </w:r>
+    </w:p>
+    <w:p>
+      <w:pPr>
+        <w:pStyle w:val="Prrafodelista"/>
+        <w:numPr>
+          <w:ilvl w:val="0"/>
+          <w:numId w:val="19"/>
+        </w:numPr>
+        <w:spacing w:after="0"/>
+      </w:pPr>
+      <w:r>
+        <w:t>&lt; (menor)</w:t>
+      </w:r>
+    </w:p>
+    <w:p>
+      <w:pPr>
+        <w:pStyle w:val="Prrafodelista"/>
+        <w:numPr>
+          <w:ilvl w:val="0"/>
+          <w:numId w:val="19"/>
+        </w:numPr>
+        <w:spacing w:after="0"/>
+      </w:pPr>
+      <w:r>
+        <w:t>&gt; (mayor)</w:t>
+      </w:r>
+    </w:p>
+    <w:p>
+      <w:pPr>
+        <w:pStyle w:val="Prrafodelista"/>
+        <w:numPr>
+          <w:ilvl w:val="0"/>
+          <w:numId w:val="19"/>
+        </w:numPr>
+        <w:spacing w:after="0"/>
+      </w:pPr>
+      <w:r>
+        <w:t>&lt;= (menor o igual)</w:t>
+      </w:r>
+    </w:p>
+    <w:p>
+      <w:pPr>
+        <w:pStyle w:val="Prrafodelista"/>
+        <w:numPr>
+          <w:ilvl w:val="0"/>
+          <w:numId w:val="19"/>
+        </w:numPr>
+        <w:spacing w:after="0"/>
+      </w:pPr>
+      <w:r>
+        <w:t>&gt;= (mayor o igual)</w:t>
+      </w:r>
+    </w:p>
+    <w:p>
+      <w:pPr>
+        <w:spacing w:after="0"/>
+      </w:pPr>
+    </w:p>
+    <w:p>
+      <w:pPr>
+        <w:ind w:firstLine="708"/>
+      </w:pPr>
+      <w:r>
+        <w:t>Como Atlax Renpy verifica todas las condiciones y si ninguna se cumple toma la última por defecto, no hace falta colocar condición en la última opción, ya que si no se cumple una, irá a la otra.</w:t>
+      </w:r>
+    </w:p>
+    <w:p>
+      <w:pPr>
+        <w:ind w:firstLine="708"/>
+      </w:pPr>
+      <w:r>
+        <w:t>También se pueden colocar condiciones múltiples, en ese caso lo separaremos por comas.</w:t>
+      </w:r>
+    </w:p>
+    <w:p>
+      <w:pPr>
+        <w:spacing w:after="0"/>
+        <w:ind w:firstLine="708"/>
+      </w:pPr>
+      <w:r>
+        <w:t>#condition points</w:t>
+      </w:r>
+    </w:p>
+    <w:p>
+      <w:pPr>
+        <w:spacing w:after="0"/>
+        <w:ind w:firstLine="708"/>
+        <w:rPr>
+          <w:highlight w:val="yellow"/>
+        </w:rPr>
+      </w:pPr>
+      <w:r>
+        <w:rPr>
+          <w:highlight w:val="yellow"/>
+        </w:rPr>
+        <w:t>Katherine_route_good_end ; amistad &gt; 18, calificación &gt; 10 ; final_bueno</w:t>
+      </w:r>
+    </w:p>
+    <w:p>
+      <w:pPr>
+        <w:spacing w:after="0"/>
+        <w:ind w:firstLine="708"/>
+        <w:rPr>
+          <w:highlight w:val="yellow"/>
+        </w:rPr>
+      </w:pPr>
+      <w:r>
+        <w:rPr>
+          <w:highlight w:val="yellow"/>
+        </w:rPr>
+        <w:t>Katherine_route_</w:t>
+      </w:r>
+      <w:r>
+        <w:rPr>
+          <w:highlight w:val="yellow"/>
+        </w:rPr>
+        <w:t>neutral</w:t>
+      </w:r>
+      <w:r>
+        <w:rPr>
+          <w:highlight w:val="yellow"/>
+        </w:rPr>
+        <w:t xml:space="preserve">_end ; amistad &gt; </w:t>
+      </w:r>
+      <w:r>
+        <w:rPr>
+          <w:highlight w:val="yellow"/>
+        </w:rPr>
+        <w:t>12</w:t>
+      </w:r>
+      <w:r>
+        <w:rPr>
+          <w:highlight w:val="yellow"/>
+        </w:rPr>
+        <w:t xml:space="preserve">, </w:t>
+      </w:r>
+      <w:r>
+        <w:rPr>
+          <w:highlight w:val="yellow"/>
+        </w:rPr>
+        <w:t>calificación &gt; 5</w:t>
+      </w:r>
+      <w:r>
+        <w:rPr>
+          <w:highlight w:val="yellow"/>
+        </w:rPr>
+        <w:t xml:space="preserve"> ; final_</w:t>
+      </w:r>
+      <w:r>
+        <w:rPr>
+          <w:highlight w:val="yellow"/>
+        </w:rPr>
+        <w:t>neutral</w:t>
+      </w:r>
+    </w:p>
+    <w:p>
+      <w:pPr>
+        <w:spacing w:after="0"/>
+        <w:ind w:firstLine="708"/>
+      </w:pPr>
+      <w:r>
+        <w:rPr>
+          <w:highlight w:val="yellow"/>
+        </w:rPr>
+        <w:t>Katherine_route_</w:t>
+      </w:r>
+      <w:r>
+        <w:rPr>
+          <w:highlight w:val="yellow"/>
+        </w:rPr>
+        <w:t>bad_</w:t>
+      </w:r>
+      <w:r>
+        <w:rPr>
+          <w:highlight w:val="yellow"/>
+        </w:rPr>
+        <w:t>end ; ; final_</w:t>
+      </w:r>
+      <w:r>
+        <w:rPr>
+          <w:highlight w:val="yellow"/>
+        </w:rPr>
+        <w:t>malo</w:t>
+      </w:r>
+    </w:p>
+    <w:p>
+      <w:pPr>
+        <w:spacing w:after="0"/>
+        <w:ind w:firstLine="708"/>
+      </w:pPr>
+    </w:p>
+    <w:p>
+      <w:pPr>
+        <w:spacing w:after="0"/>
+        <w:ind w:firstLine="708"/>
+      </w:pPr>
+    </w:p>
+    <w:p>
+      <w:pPr>
+        <w:spacing w:after="0"/>
+        <w:ind w:firstLine="708"/>
+      </w:pPr>
+    </w:p>
+    <w:p>
+      <w:pPr>
+        <w:spacing w:after="0"/>
+        <w:ind w:firstLine="708"/>
+      </w:pPr>
+    </w:p>
+    <w:p>
+      <w:pPr>
+        <w:spacing w:after="0"/>
+        <w:ind w:firstLine="708"/>
+      </w:pPr>
+    </w:p>
+    <w:p>
+      <w:pPr>
+        <w:spacing w:after="0"/>
+        <w:ind w:firstLine="708"/>
+      </w:pPr>
+    </w:p>
+    <w:p>
+      <w:pPr>
+        <w:spacing w:after="0"/>
+        <w:ind w:firstLine="708"/>
+      </w:pPr>
+    </w:p>
+    <w:p>
+      <w:pPr>
+        <w:spacing w:after="0"/>
+        <w:ind w:firstLine="708"/>
+      </w:pPr>
+    </w:p>
+    <w:p/>
+    <w:p>
+      <w:pPr>
+        <w:pStyle w:val="Ttulo4"/>
+      </w:pPr>
+      <w:r>
+        <w:lastRenderedPageBreak/>
+        <w:t>Condición por decisión</w:t>
+      </w:r>
+    </w:p>
+    <w:p>
+      <w:r>
+        <w:tab/>
+        <w:t>Podemos bifurcar la historia dependiendo de si el jugador tomó una decisión específica o no, aquí retomaremos el ejemplo de la decisión de “¿Qué comida le pido?”</w:t>
+      </w:r>
+    </w:p>
+    <w:p>
+      <w:r>
+        <w:t xml:space="preserve">      </w:t>
+      </w:r>
+      <w:r>
+        <w:rPr>
+          <w:noProof/>
+        </w:rPr>
+        <w:drawing>
+          <wp:inline distT="0" distB="0" distL="0" distR="0" wp14:anchorId="6459394A" wp14:editId="573BF31D">
+            <wp:extent cx="5019675" cy="2250118"/>
+            <wp:effectExtent l="0" t="0" r="0" b="0"/>
+            <wp:docPr id="329083489" name="Imagen 1"/>
+            <wp:cNvGraphicFramePr>
+              <a:graphicFrameLocks xmlns:a="http://schemas.openxmlformats.org/drawingml/2006/main" noChangeAspect="1"/>
+            </wp:cNvGraphicFramePr>
+            <a:graphic xmlns:a="http://schemas.openxmlformats.org/drawingml/2006/main">
+              <a:graphicData uri="http://schemas.openxmlformats.org/drawingml/2006/picture">
+                <pic:pic xmlns:pic="http://schemas.openxmlformats.org/drawingml/2006/picture">
+                  <pic:nvPicPr>
+                    <pic:cNvPr id="329083489" name=""/>
+                    <pic:cNvPicPr/>
+                  </pic:nvPicPr>
+                  <pic:blipFill>
+                    <a:blip r:embed="rId33"/>
+                    <a:stretch>
+                      <a:fillRect/>
+                    </a:stretch>
+                  </pic:blipFill>
+                  <pic:spPr>
+                    <a:xfrm>
+                      <a:off x="0" y="0"/>
+                      <a:ext cx="5026902" cy="2253357"/>
+                    </a:xfrm>
+                    <a:prstGeom prst="rect">
+                      <a:avLst/>
+                    </a:prstGeom>
+                  </pic:spPr>
+                </pic:pic>
+              </a:graphicData>
+            </a:graphic>
+          </wp:inline>
+        </w:drawing>
+      </w:r>
+    </w:p>
+    <w:p>
+      <w:pPr>
+        <w:spacing w:after="0"/>
+      </w:pPr>
+      <w:r>
+        <w:tab/>
+      </w:r>
+      <w:r>
+        <w:rPr>
+          <w:highlight w:val="yellow"/>
+        </w:rPr>
+        <w:t>#condition decisión</w:t>
+      </w:r>
+    </w:p>
+    <w:p>
+      <w:pPr>
+        <w:spacing w:after="0"/>
+      </w:pPr>
+      <w:r>
+        <w:tab/>
+      </w:r>
+      <w:r>
+        <w:rPr>
+          <w:highlight w:val="yellow"/>
+        </w:rPr>
+        <w:t>sushi_gived ; give_sushi ; escena_B</w:t>
+      </w:r>
+    </w:p>
+    <w:p>
+      <w:pPr>
+        <w:spacing w:after="0"/>
+      </w:pPr>
+      <w:r>
+        <w:tab/>
+      </w:r>
+      <w:r>
+        <w:rPr>
+          <w:highlight w:val="yellow"/>
+        </w:rPr>
+        <w:t>salad</w:t>
+      </w:r>
+      <w:r>
+        <w:rPr>
+          <w:highlight w:val="yellow"/>
+        </w:rPr>
+        <w:t>_gived ; give_</w:t>
+      </w:r>
+      <w:r>
+        <w:rPr>
+          <w:highlight w:val="yellow"/>
+        </w:rPr>
+        <w:t>salad</w:t>
+      </w:r>
+      <w:r>
+        <w:rPr>
+          <w:highlight w:val="yellow"/>
+        </w:rPr>
+        <w:t xml:space="preserve"> ; escena_</w:t>
+      </w:r>
+      <w:r>
+        <w:rPr>
+          <w:highlight w:val="yellow"/>
+        </w:rPr>
+        <w:t>C</w:t>
+      </w:r>
+    </w:p>
+    <w:p>
+      <w:pPr>
+        <w:spacing w:after="0"/>
+        <w:ind w:firstLine="708"/>
+      </w:pPr>
+      <w:r>
+        <w:rPr>
+          <w:highlight w:val="yellow"/>
+        </w:rPr>
+        <w:t>beef</w:t>
+      </w:r>
+      <w:r>
+        <w:rPr>
+          <w:highlight w:val="yellow"/>
+        </w:rPr>
+        <w:t>_gived ; give_</w:t>
+      </w:r>
+      <w:r>
+        <w:rPr>
+          <w:highlight w:val="yellow"/>
+        </w:rPr>
+        <w:t>beef</w:t>
+      </w:r>
+      <w:r>
+        <w:rPr>
+          <w:highlight w:val="yellow"/>
+        </w:rPr>
+        <w:t xml:space="preserve"> ; escena_</w:t>
+      </w:r>
+      <w:r>
+        <w:rPr>
+          <w:highlight w:val="yellow"/>
+        </w:rPr>
+        <w:t>D</w:t>
+      </w:r>
+    </w:p>
+    <w:p>
+      <w:pPr>
+        <w:spacing w:after="0"/>
+        <w:ind w:firstLine="708"/>
+      </w:pPr>
+    </w:p>
+    <w:p>
+      <w:pPr>
+        <w:ind w:firstLine="708"/>
+      </w:pPr>
+      <w:r>
+        <w:t>¿Recuerdan los identificadores que con tanta insistencia se dijo que los hicieran únicos? Para esto era, para poder crear caminos a partir de esas decisiones pasadas, en este caso en la segunda columna se coloca el identificador único de la opción que el jugador debe tomar para ser encaminado a la escena dada.</w:t>
+      </w:r>
+    </w:p>
+    <w:p>
+      <w:pPr>
+        <w:ind w:firstLine="708"/>
+      </w:pPr>
+      <w:r>
+        <w:t xml:space="preserve">Se debe tener en cuenta que Atlax Renpy va a verificar tanto las opciones de decisiones tomadas </w:t>
+      </w:r>
+      <w:r>
+        <w:t xml:space="preserve">por el jugador, </w:t>
+      </w:r>
+      <w:r>
+        <w:t>como la de los fines de diálogo</w:t>
+      </w:r>
+      <w:r>
+        <w:t xml:space="preserve"> que él haya visto</w:t>
+      </w:r>
+      <w:r>
+        <w:t xml:space="preserve">, porque recordemos que </w:t>
+      </w:r>
+      <w:r>
+        <w:t xml:space="preserve">al </w:t>
+      </w:r>
+      <w:r>
+        <w:t>de</w:t>
+      </w:r>
+      <w:r>
+        <w:t>finir</w:t>
+      </w:r>
+      <w:r>
+        <w:t xml:space="preserve"> l</w:t>
+      </w:r>
+      <w:r>
+        <w:t>as</w:t>
+      </w:r>
+      <w:r>
+        <w:t xml:space="preserve"> </w:t>
+      </w:r>
+      <w:r>
+        <w:t>terminaciones</w:t>
+      </w:r>
+      <w:r>
+        <w:t xml:space="preserve"> de diálogo también les ponemos identificadores únicos, esos también se tendrán en cuenta para esta condición.</w:t>
+      </w:r>
+    </w:p>
+    <w:p>
+      <w:pPr>
+        <w:ind w:firstLine="708"/>
+      </w:pPr>
+      <w:r>
+        <w:t xml:space="preserve">De </w:t>
+      </w:r>
+      <w:r>
+        <w:t>forma similar a los puntos, también podemos colocar varios identificadores separados por comas</w:t>
+      </w:r>
+      <w:r>
+        <w:t>.</w:t>
+      </w:r>
+    </w:p>
+    <w:p>
+      <w:pPr>
+        <w:ind w:firstLine="708"/>
+      </w:pPr>
+    </w:p>
+    <w:p>
+      <w:pPr>
+        <w:pStyle w:val="Ttulo4"/>
+      </w:pPr>
+      <w:r>
+        <w:t>Condición por escena</w:t>
+      </w:r>
+    </w:p>
+    <w:p>
+      <w:r>
+        <w:tab/>
+        <w:t>Por ultimo, también podremos bifurcar el juego dependiendo de las escenas que el jugador haya visto</w:t>
+      </w:r>
+      <w:r>
+        <w:t>, es similar a las condiciones por decisión solo que en este caso se va a utilizar los nombres de los archivos de control.</w:t>
+      </w:r>
+    </w:p>
+    <w:p>
+      <w:r>
+        <w:rPr>
+          <w:noProof/>
+        </w:rPr>
+        <w:lastRenderedPageBreak/>
+        <w:drawing>
+          <wp:inline distT="0" distB="0" distL="0" distR="0" wp14:anchorId="37687B73" wp14:editId="05682B4E">
+            <wp:extent cx="5400040" cy="2165350"/>
+            <wp:effectExtent l="0" t="0" r="0" b="6350"/>
+            <wp:docPr id="87152528" name="Imagen 1"/>
+            <wp:cNvGraphicFramePr>
+              <a:graphicFrameLocks xmlns:a="http://schemas.openxmlformats.org/drawingml/2006/main" noChangeAspect="1"/>
+            </wp:cNvGraphicFramePr>
+            <a:graphic xmlns:a="http://schemas.openxmlformats.org/drawingml/2006/main">
+              <a:graphicData uri="http://schemas.openxmlformats.org/drawingml/2006/picture">
+                <pic:pic xmlns:pic="http://schemas.openxmlformats.org/drawingml/2006/picture">
+                  <pic:nvPicPr>
+                    <pic:cNvPr id="87152528" name=""/>
+                    <pic:cNvPicPr/>
+                  </pic:nvPicPr>
+                  <pic:blipFill>
+                    <a:blip r:embed="rId34"/>
+                    <a:stretch>
+                      <a:fillRect/>
+                    </a:stretch>
+                  </pic:blipFill>
+                  <pic:spPr>
+                    <a:xfrm>
+                      <a:off x="0" y="0"/>
+                      <a:ext cx="5400040" cy="2165350"/>
+                    </a:xfrm>
+                    <a:prstGeom prst="rect">
+                      <a:avLst/>
+                    </a:prstGeom>
+                  </pic:spPr>
+                </pic:pic>
+              </a:graphicData>
+            </a:graphic>
+          </wp:inline>
+        </w:drawing>
+      </w:r>
+    </w:p>
+    <w:p>
+      <w:r>
+        <w:tab/>
+        <w:t>Imaginemos que en nuestra historia hay un terremoto que siempre ocurre, solo que</w:t>
+      </w:r>
+      <w:r>
+        <w:t>,</w:t>
+      </w:r>
+      <w:r>
+        <w:t xml:space="preserve"> dependiendo de las decisiones del jugador, este puede que esté en varios lugares cuando el terremoto suceda, viviendo así experiencias distintas.</w:t>
+      </w:r>
+    </w:p>
+    <w:p>
+      <w:pPr>
+        <w:ind w:firstLine="708"/>
+      </w:pPr>
+      <w:r>
+        <w:t>En un diálogo posterior el protagonista cuenta lo que vivió en el terremoto</w:t>
+      </w:r>
+      <w:r>
+        <w:t xml:space="preserve"> y dependiendo del lugar en el que estuvo, lo cuenta de una manera u otra.</w:t>
+      </w:r>
+    </w:p>
+    <w:p>
+      <w:pPr>
+        <w:spacing w:after="0"/>
+        <w:ind w:firstLine="708"/>
+        <w:rPr>
+          <w:highlight w:val="yellow"/>
+        </w:rPr>
+      </w:pPr>
+      <w:r>
+        <w:rPr>
+          <w:highlight w:val="yellow"/>
+        </w:rPr>
+        <w:t>#condition scene</w:t>
+      </w:r>
+    </w:p>
+    <w:p>
+      <w:pPr>
+        <w:spacing w:after="0"/>
+        <w:ind w:firstLine="708"/>
+        <w:rPr>
+          <w:highlight w:val="yellow"/>
+        </w:rPr>
+      </w:pPr>
+      <w:r>
+        <w:rPr>
+          <w:highlight w:val="yellow"/>
+        </w:rPr>
+        <w:t>earthquake_lived_in_home ; earthquake_in_home ; tell_home_earthquake</w:t>
+      </w:r>
+    </w:p>
+    <w:p>
+      <w:pPr>
+        <w:spacing w:after="0"/>
+        <w:ind w:firstLine="708"/>
+        <w:rPr>
+          <w:highlight w:val="yellow"/>
+        </w:rPr>
+      </w:pPr>
+      <w:r>
+        <w:rPr>
+          <w:highlight w:val="yellow"/>
+        </w:rPr>
+        <w:t>e</w:t>
+      </w:r>
+      <w:r>
+        <w:rPr>
+          <w:highlight w:val="yellow"/>
+        </w:rPr>
+        <w:t>arthquake_lived_in_</w:t>
+      </w:r>
+      <w:r>
+        <w:rPr>
+          <w:highlight w:val="yellow"/>
+        </w:rPr>
+        <w:t>shop</w:t>
+      </w:r>
+      <w:r>
+        <w:rPr>
+          <w:highlight w:val="yellow"/>
+        </w:rPr>
+        <w:t xml:space="preserve"> ; earthquake_in_</w:t>
+      </w:r>
+      <w:r>
+        <w:rPr>
+          <w:highlight w:val="yellow"/>
+        </w:rPr>
+        <w:t>shop</w:t>
+      </w:r>
+      <w:r>
+        <w:rPr>
+          <w:highlight w:val="yellow"/>
+        </w:rPr>
+        <w:t xml:space="preserve"> ; tell_</w:t>
+      </w:r>
+      <w:r>
+        <w:rPr>
+          <w:highlight w:val="yellow"/>
+        </w:rPr>
+        <w:t>shop</w:t>
+      </w:r>
+      <w:r>
+        <w:rPr>
+          <w:highlight w:val="yellow"/>
+        </w:rPr>
+        <w:t>_earthquake</w:t>
+      </w:r>
+    </w:p>
+    <w:p>
+      <w:pPr>
+        <w:ind w:firstLine="708"/>
+      </w:pPr>
+      <w:r>
+        <w:rPr>
+          <w:highlight w:val="yellow"/>
+        </w:rPr>
+        <w:t>e</w:t>
+      </w:r>
+      <w:r>
+        <w:rPr>
+          <w:highlight w:val="yellow"/>
+        </w:rPr>
+        <w:t>arthquake_lived_in_</w:t>
+      </w:r>
+      <w:r>
+        <w:rPr>
+          <w:highlight w:val="yellow"/>
+        </w:rPr>
+        <w:t>gym</w:t>
+      </w:r>
+      <w:r>
+        <w:rPr>
+          <w:highlight w:val="yellow"/>
+        </w:rPr>
+        <w:t xml:space="preserve"> ; earthquake_in</w:t>
+      </w:r>
+      <w:r>
+        <w:rPr>
+          <w:highlight w:val="yellow"/>
+        </w:rPr>
+        <w:t>_gym</w:t>
+      </w:r>
+      <w:r>
+        <w:rPr>
+          <w:highlight w:val="yellow"/>
+        </w:rPr>
+        <w:t xml:space="preserve"> ; tell_</w:t>
+      </w:r>
+      <w:r>
+        <w:rPr>
+          <w:highlight w:val="yellow"/>
+        </w:rPr>
+        <w:t>gym</w:t>
+      </w:r>
+      <w:r>
+        <w:rPr>
+          <w:highlight w:val="yellow"/>
+        </w:rPr>
+        <w:t>_earthquake</w:t>
+      </w:r>
+    </w:p>
+    <w:p>
+      <w:pPr>
+        <w:ind w:firstLine="708"/>
+      </w:pPr>
+      <w:r>
+        <w:t>Quizás sea algo confuso de entender, solo ten en cuenta que la primera columna es el identificador único de la opción que estamos escribiendo, la segunda es el nombre del archivo de control que muestra como el protagonista vivió el terremoto y la tercera columna es el nombre del archivo de control del jugador contando cómo vivió el terremoto.</w:t>
+      </w:r>
+    </w:p>
+    <w:p>
+      <w:pPr>
+        <w:ind w:firstLine="708"/>
+      </w:pPr>
+      <w:r>
+        <w:t>De esa forma, el juego verifica ¿El jugador pasó por la escena “earthquake_in_home.csv”? Entonces lo mandamos a la escena tell_home_earthquake. Y así sucesivamente con las demás opciones. Si ninguna se cumple se tomará la última.</w:t>
+      </w:r>
+    </w:p>
+    <w:p/>
+    <w:p>
       <w:pPr>
         <w:pStyle w:val="Ttulo2"/>
       </w:pPr>
@@ -9012,6 +10558,7 @@
       </w:pPr>
       <w:bookmarkStart w:id="21" w:name="_Toc199261574"/>
       <w:r>
+        <w:lastRenderedPageBreak/>
         <w:t>Balanceo de novela visual</w:t>
       </w:r>
       <w:bookmarkEnd w:id="21"/>
@@ -9023,7 +10570,6 @@
       </w:pPr>
       <w:bookmarkStart w:id="22" w:name="_Toc199261575"/>
       <w:r>
-        <w:lastRenderedPageBreak/>
         <w:t>Derechos</w:t>
       </w:r>
       <w:bookmarkEnd w:id="22"/>
@@ -9041,7 +10587,7 @@
     <w:p/>
     <w:p/>
     <w:p>
-      <w:hyperlink r:id="rId27" w:history="1">
+      <w:hyperlink r:id="rId35" w:history="1">
         <w:r>
           <w:rPr>
             <w:rStyle w:val="Hipervnculo"/>
@@ -9054,7 +10600,7 @@
       </w:r>
     </w:p>
     <w:p>
-      <w:hyperlink r:id="rId28" w:history="1">
+      <w:hyperlink r:id="rId36" w:history="1">
         <w:r>
           <w:rPr>
             <w:rStyle w:val="Hipervnculo"/>
@@ -9064,7 +10610,7 @@
       </w:hyperlink>
     </w:p>
     <w:p>
-      <w:hyperlink r:id="rId29" w:history="1">
+      <w:hyperlink r:id="rId37" w:anchor="text-tag-alpha" w:history="1">
         <w:r>
           <w:rPr>
             <w:rStyle w:val="Hipervnculo"/>
@@ -10636,6 +12182,92 @@
     </w:lvl>
   </w:abstractNum>
   <w:abstractNum w:abstractNumId="14" w15:restartNumberingAfterBreak="0">
+    <w:nsid w:val="615B20F0"/>
+    <w:multiLevelType w:val="hybridMultilevel"/>
+    <w:tmpl w:val="7AC4399A"/>
+    <w:lvl w:ilvl="0" w:tplc="0C0A000F">
+      <w:start w:val="1"/>
+      <w:numFmt w:val="decimal"/>
+      <w:lvlText w:val="%1."/>
+      <w:lvlJc w:val="left"/>
+      <w:pPr>
+        <w:ind w:left="1068" w:hanging="360"/>
+      </w:pPr>
+    </w:lvl>
+    <w:lvl w:ilvl="1" w:tplc="0C0A0019" w:tentative="1">
+      <w:start w:val="1"/>
+      <w:numFmt w:val="lowerLetter"/>
+      <w:lvlText w:val="%2."/>
+      <w:lvlJc w:val="left"/>
+      <w:pPr>
+        <w:ind w:left="1788" w:hanging="360"/>
+      </w:pPr>
+    </w:lvl>
+    <w:lvl w:ilvl="2" w:tplc="0C0A001B" w:tentative="1">
+      <w:start w:val="1"/>
+      <w:numFmt w:val="lowerRoman"/>
+      <w:lvlText w:val="%3."/>
+      <w:lvlJc w:val="right"/>
+      <w:pPr>
+        <w:ind w:left="2508" w:hanging="180"/>
+      </w:pPr>
+    </w:lvl>
+    <w:lvl w:ilvl="3" w:tplc="0C0A000F" w:tentative="1">
+      <w:start w:val="1"/>
+      <w:numFmt w:val="decimal"/>
+      <w:lvlText w:val="%4."/>
+      <w:lvlJc w:val="left"/>
+      <w:pPr>
+        <w:ind w:left="3228" w:hanging="360"/>
+      </w:pPr>
+    </w:lvl>
+    <w:lvl w:ilvl="4" w:tplc="0C0A0019" w:tentative="1">
+      <w:start w:val="1"/>
+      <w:numFmt w:val="lowerLetter"/>
+      <w:lvlText w:val="%5."/>
+      <w:lvlJc w:val="left"/>
+      <w:pPr>
+        <w:ind w:left="3948" w:hanging="360"/>
+      </w:pPr>
+    </w:lvl>
+    <w:lvl w:ilvl="5" w:tplc="0C0A001B" w:tentative="1">
+      <w:start w:val="1"/>
+      <w:numFmt w:val="lowerRoman"/>
+      <w:lvlText w:val="%6."/>
+      <w:lvlJc w:val="right"/>
+      <w:pPr>
+        <w:ind w:left="4668" w:hanging="180"/>
+      </w:pPr>
+    </w:lvl>
+    <w:lvl w:ilvl="6" w:tplc="0C0A000F" w:tentative="1">
+      <w:start w:val="1"/>
+      <w:numFmt w:val="decimal"/>
+      <w:lvlText w:val="%7."/>
+      <w:lvlJc w:val="left"/>
+      <w:pPr>
+        <w:ind w:left="5388" w:hanging="360"/>
+      </w:pPr>
+    </w:lvl>
+    <w:lvl w:ilvl="7" w:tplc="0C0A0019" w:tentative="1">
+      <w:start w:val="1"/>
+      <w:numFmt w:val="lowerLetter"/>
+      <w:lvlText w:val="%8."/>
+      <w:lvlJc w:val="left"/>
+      <w:pPr>
+        <w:ind w:left="6108" w:hanging="360"/>
+      </w:pPr>
+    </w:lvl>
+    <w:lvl w:ilvl="8" w:tplc="0C0A001B" w:tentative="1">
+      <w:start w:val="1"/>
+      <w:numFmt w:val="lowerRoman"/>
+      <w:lvlText w:val="%9."/>
+      <w:lvlJc w:val="right"/>
+      <w:pPr>
+        <w:ind w:left="6828" w:hanging="180"/>
+      </w:pPr>
+    </w:lvl>
+  </w:abstractNum>
+  <w:abstractNum w:abstractNumId="15" w15:restartNumberingAfterBreak="0">
     <w:nsid w:val="63556DA1"/>
     <w:multiLevelType w:val="hybridMultilevel"/>
     <w:tmpl w:val="FE8C0458"/>
@@ -10748,7 +12380,7 @@
       </w:rPr>
     </w:lvl>
   </w:abstractNum>
-  <w:abstractNum w:abstractNumId="15" w15:restartNumberingAfterBreak="0">
+  <w:abstractNum w:abstractNumId="16" w15:restartNumberingAfterBreak="0">
     <w:nsid w:val="6AD52AD2"/>
     <w:multiLevelType w:val="hybridMultilevel"/>
     <w:tmpl w:val="9FCE4DB8"/>
@@ -10837,7 +12469,7 @@
       </w:pPr>
     </w:lvl>
   </w:abstractNum>
-  <w:abstractNum w:abstractNumId="16" w15:restartNumberingAfterBreak="0">
+  <w:abstractNum w:abstractNumId="17" w15:restartNumberingAfterBreak="0">
     <w:nsid w:val="77037EA0"/>
     <w:multiLevelType w:val="hybridMultilevel"/>
     <w:tmpl w:val="1D7C8B04"/>
@@ -10950,7 +12582,7 @@
       </w:rPr>
     </w:lvl>
   </w:abstractNum>
-  <w:abstractNum w:abstractNumId="17" w15:restartNumberingAfterBreak="0">
+  <w:abstractNum w:abstractNumId="18" w15:restartNumberingAfterBreak="0">
     <w:nsid w:val="7B12378A"/>
     <w:multiLevelType w:val="hybridMultilevel"/>
     <w:tmpl w:val="E6EC6DD6"/>
@@ -11040,7 +12672,7 @@
     <w:abstractNumId w:val="13"/>
   </w:num>
   <w:num w:numId="2" w16cid:durableId="132523105">
-    <w:abstractNumId w:val="14"/>
+    <w:abstractNumId w:val="15"/>
   </w:num>
   <w:num w:numId="3" w16cid:durableId="550045339">
     <w:abstractNumId w:val="2"/>
@@ -11067,13 +12699,13 @@
     <w:abstractNumId w:val="9"/>
   </w:num>
   <w:num w:numId="11" w16cid:durableId="1776826764">
-    <w:abstractNumId w:val="16"/>
+    <w:abstractNumId w:val="17"/>
   </w:num>
   <w:num w:numId="12" w16cid:durableId="1998149375">
     <w:abstractNumId w:val="0"/>
   </w:num>
   <w:num w:numId="13" w16cid:durableId="2030794282">
-    <w:abstractNumId w:val="17"/>
+    <w:abstractNumId w:val="18"/>
   </w:num>
   <w:num w:numId="14" w16cid:durableId="389350923">
     <w:abstractNumId w:val="5"/>
@@ -11085,10 +12717,13 @@
     <w:abstractNumId w:val="12"/>
   </w:num>
   <w:num w:numId="17" w16cid:durableId="534732538">
-    <w:abstractNumId w:val="15"/>
+    <w:abstractNumId w:val="16"/>
   </w:num>
   <w:num w:numId="18" w16cid:durableId="1870793516">
     <w:abstractNumId w:val="10"/>
+  </w:num>
+  <w:num w:numId="19" w16cid:durableId="1198272480">
+    <w:abstractNumId w:val="14"/>
   </w:num>
 </w:numbering>
 </file>
@@ -11578,10 +13213,9 @@
     <w:next w:val="Normal"/>
     <w:link w:val="Ttulo4Car"/>
     <w:uiPriority w:val="9"/>
-    <w:semiHidden/>
     <w:unhideWhenUsed/>
     <w:qFormat/>
-    <w:rsid w:val="00386F61"/>
+    <w:rsid w:val="00DF39FF"/>
     <w:pPr>
       <w:keepNext/>
       <w:keepLines/>
@@ -11592,7 +13226,7 @@
       <w:rFonts w:eastAsiaTheme="majorEastAsia" w:cstheme="majorBidi"/>
       <w:i/>
       <w:iCs/>
-      <w:color w:val="2F5496" w:themeColor="accent1" w:themeShade="BF"/>
+      <w:color w:val="000000" w:themeColor="text1"/>
     </w:rPr>
   </w:style>
   <w:style w:type="paragraph" w:styleId="Ttulo5">
@@ -11707,6 +13341,7 @@
   <w:style w:type="character" w:default="1" w:styleId="Fuentedeprrafopredeter">
     <w:name w:val="Default Paragraph Font"/>
     <w:uiPriority w:val="1"/>
+    <w:semiHidden/>
     <w:unhideWhenUsed/>
   </w:style>
   <w:style w:type="table" w:default="1" w:styleId="Tablanormal">
@@ -11778,13 +13413,12 @@
     <w:basedOn w:val="Fuentedeprrafopredeter"/>
     <w:link w:val="Ttulo4"/>
     <w:uiPriority w:val="9"/>
-    <w:semiHidden/>
-    <w:rsid w:val="00386F61"/>
+    <w:rsid w:val="00DF39FF"/>
     <w:rPr>
-      <w:rFonts w:eastAsiaTheme="majorEastAsia" w:cstheme="majorBidi"/>
+      <w:rFonts w:ascii="Times New Roman" w:eastAsiaTheme="majorEastAsia" w:hAnsi="Times New Roman" w:cstheme="majorBidi"/>
       <w:i/>
       <w:iCs/>
-      <w:color w:val="2F5496" w:themeColor="accent1" w:themeShade="BF"/>
+      <w:color w:val="000000" w:themeColor="text1"/>
     </w:rPr>
   </w:style>
   <w:style w:type="character" w:customStyle="1" w:styleId="Ttulo5Car">

</xml_diff>

<commit_message>
<fix> termination methods, transition and clear ready
</commit_message>
<xml_diff>
--- a/Manual de desarrollo en Atlax Renpy.docx
+++ b/Manual de desarrollo en Atlax Renpy.docx
@@ -9199,13 +9199,7 @@
     <w:p/>
     <w:p>
       <w:r>
-        <w:t xml:space="preserve">(En la ruta de </w:t>
-      </w:r>
-      <w:r>
-        <w:t>Amber</w:t>
-      </w:r>
-      <w:r>
-        <w:t>)</w:t>
+        <w:t>(En la ruta de Amber)</w:t>
       </w:r>
     </w:p>
     <w:p>
@@ -9230,13 +9224,7 @@
         <w:rPr>
           <w:highlight w:val="yellow"/>
         </w:rPr>
-        <w:t>amber_scene_end</w:t>
-      </w:r>
-      <w:r>
-        <w:rPr>
-          <w:highlight w:val="yellow"/>
-        </w:rPr>
-        <w:t xml:space="preserve"> ; the_x_exam</w:t>
+        <w:t>amber_scene_end ; the_x_exam</w:t>
       </w:r>
     </w:p>
     <w:p>
@@ -9371,16 +9359,7 @@
         <w:ind w:firstLine="708"/>
       </w:pPr>
       <w:r>
-        <w:t>k</w:t>
-      </w:r>
-      <w:r>
-        <w:t>ey_opcion_</w:t>
-      </w:r>
-      <w:r>
-        <w:t>2</w:t>
-      </w:r>
-      <w:r>
-        <w:t xml:space="preserve"> ;; siguiente escena</w:t>
+        <w:t>key_opcion_2 ;; siguiente escena</w:t>
       </w:r>
     </w:p>
     <w:p>
@@ -9389,25 +9368,7 @@
         <w:ind w:firstLine="708"/>
       </w:pPr>
       <w:r>
-        <w:t>k</w:t>
-      </w:r>
-      <w:r>
-        <w:t>ey_opcion_</w:t>
-      </w:r>
-      <w:r>
-        <w:t>3</w:t>
-      </w:r>
-      <w:r>
-        <w:t xml:space="preserve"> ; punto1:valor_punto1</w:t>
-      </w:r>
-      <w:r>
-        <w:t>, punto2:valor_punto2</w:t>
-      </w:r>
-      <w:r>
-        <w:t xml:space="preserve"> ; siguiente escena</w:t>
-      </w:r>
-      <w:r>
-        <w:t xml:space="preserve"> </w:t>
+        <w:t xml:space="preserve">key_opcion_3 ; punto1:valor_punto1, punto2:valor_punto2 ; siguiente escena </w:t>
       </w:r>
     </w:p>
     <w:p>
@@ -9971,25 +9932,7 @@
         <w:rPr>
           <w:highlight w:val="yellow"/>
         </w:rPr>
-        <w:t>Katherine_route_</w:t>
-      </w:r>
-      <w:r>
-        <w:rPr>
-          <w:highlight w:val="yellow"/>
-        </w:rPr>
-        <w:t>bad_</w:t>
-      </w:r>
-      <w:r>
-        <w:rPr>
-          <w:highlight w:val="yellow"/>
-        </w:rPr>
-        <w:t>end ; ; final_</w:t>
-      </w:r>
-      <w:r>
-        <w:rPr>
-          <w:highlight w:val="yellow"/>
-        </w:rPr>
-        <w:t>malo</w:t>
+        <w:t>Katherine_route_bad_end ; ; final_malo</w:t>
       </w:r>
     </w:p>
     <w:p>
@@ -10140,31 +10083,7 @@
         <w:rPr>
           <w:highlight w:val="yellow"/>
         </w:rPr>
-        <w:t>salad</w:t>
-      </w:r>
-      <w:r>
-        <w:rPr>
-          <w:highlight w:val="yellow"/>
-        </w:rPr>
-        <w:t>_gived ; give_</w:t>
-      </w:r>
-      <w:r>
-        <w:rPr>
-          <w:highlight w:val="yellow"/>
-        </w:rPr>
-        <w:t>salad</w:t>
-      </w:r>
-      <w:r>
-        <w:rPr>
-          <w:highlight w:val="yellow"/>
-        </w:rPr>
-        <w:t xml:space="preserve"> ; escena_</w:t>
-      </w:r>
-      <w:r>
-        <w:rPr>
-          <w:highlight w:val="yellow"/>
-        </w:rPr>
-        <w:t>C</w:t>
+        <w:t>salad_gived ; give_salad ; escena_C</w:t>
       </w:r>
     </w:p>
     <w:p>
@@ -10176,31 +10095,7 @@
         <w:rPr>
           <w:highlight w:val="yellow"/>
         </w:rPr>
-        <w:t>beef</w:t>
-      </w:r>
-      <w:r>
-        <w:rPr>
-          <w:highlight w:val="yellow"/>
-        </w:rPr>
-        <w:t>_gived ; give_</w:t>
-      </w:r>
-      <w:r>
-        <w:rPr>
-          <w:highlight w:val="yellow"/>
-        </w:rPr>
-        <w:t>beef</w:t>
-      </w:r>
-      <w:r>
-        <w:rPr>
-          <w:highlight w:val="yellow"/>
-        </w:rPr>
-        <w:t xml:space="preserve"> ; escena_</w:t>
-      </w:r>
-      <w:r>
-        <w:rPr>
-          <w:highlight w:val="yellow"/>
-        </w:rPr>
-        <w:t>D</w:t>
+        <w:t>beef_gived ; give_beef ; escena_D</w:t>
       </w:r>
     </w:p>
     <w:p>
@@ -10405,118 +10300,208 @@
         <w:rPr>
           <w:highlight w:val="yellow"/>
         </w:rPr>
-        <w:t>e</w:t>
+        <w:t>earthquake_lived_in_shop ; earthquake_in_</w:t>
       </w:r>
       <w:r>
         <w:rPr>
           <w:highlight w:val="yellow"/>
         </w:rPr>
-        <w:t>arthquake_lived_in_</w:t>
+        <w:t>shop</w:t>
       </w:r>
       <w:r>
         <w:rPr>
           <w:highlight w:val="yellow"/>
         </w:rPr>
-        <w:t>shop</w:t>
-      </w:r>
+        <w:t xml:space="preserve"> ; tell_shop_earthquake</w:t>
+      </w:r>
+    </w:p>
+    <w:p>
+      <w:pPr>
+        <w:ind w:firstLine="708"/>
+      </w:pPr>
       <w:r>
         <w:rPr>
           <w:highlight w:val="yellow"/>
         </w:rPr>
-        <w:t xml:space="preserve"> ; earthquake_in_</w:t>
+        <w:t>earthquake_lived_in_gym ; earthquake_in</w:t>
       </w:r>
       <w:r>
         <w:rPr>
           <w:highlight w:val="yellow"/>
         </w:rPr>
-        <w:t>shop</w:t>
+        <w:t>_gym</w:t>
       </w:r>
       <w:r>
         <w:rPr>
           <w:highlight w:val="yellow"/>
         </w:rPr>
-        <w:t xml:space="preserve"> ; tell_</w:t>
+        <w:t xml:space="preserve"> ; tell_gym_earthquake</w:t>
+      </w:r>
+    </w:p>
+    <w:p>
+      <w:pPr>
+        <w:ind w:firstLine="708"/>
+      </w:pPr>
+      <w:r>
+        <w:t>Quizás sea algo confuso de entender, solo ten en cuenta que la primera columna es el identificador único de la opción que estamos escribiendo, la segunda es el nombre del archivo de control</w:t>
+      </w:r>
+      <w:r>
+        <w:t xml:space="preserve"> que el jugador debió haber jugado para escoger la opción</w:t>
+      </w:r>
+      <w:r>
+        <w:t xml:space="preserve"> y la tercera columna es el nombre del archivo de control del jugador contando cómo vivió el terremoto.</w:t>
+      </w:r>
+    </w:p>
+    <w:p>
+      <w:pPr>
+        <w:ind w:firstLine="708"/>
+      </w:pPr>
+      <w:r>
+        <w:t>De esa forma, el juego verifica ¿El jugador pasó por la escena “earthquake_in_home.csv”? Entonces lo mandamos a la escena tell_home_earthquake. Y así sucesivamente con las demás opciones. Si ninguna se cumple se tomará la última.</w:t>
+      </w:r>
+    </w:p>
+    <w:p>
+      <w:pPr>
+        <w:pStyle w:val="Ttulo3"/>
+      </w:pPr>
+      <w:r>
+        <w:t>Transiciones tras terminar una escena</w:t>
+      </w:r>
+    </w:p>
+    <w:p>
+      <w:r>
+        <w:tab/>
+        <w:t>Es posible que al pasar de una escena queramos ejecutar una transición, ya sea porque cambia el día o simplemente la escena tiene lugar tiempo después. Esto lo podemos definir en la misma línea donde definimos el tipo de fin de diálogo. Cabe destacar que esta transición siempre ocurrirá sin importar el camino o la opción que se tome.</w:t>
+      </w:r>
+    </w:p>
+    <w:p>
+      <w:r>
+        <w:tab/>
+        <w:t>Estas transiciones irán separadas por un ; y sus parámetros por :</w:t>
+      </w:r>
+    </w:p>
+    <w:p>
+      <w:pPr>
+        <w:spacing w:after="0"/>
+      </w:pPr>
+      <w:r>
+        <w:tab/>
       </w:r>
       <w:r>
         <w:rPr>
           <w:highlight w:val="yellow"/>
         </w:rPr>
-        <w:t>shop</w:t>
+        <w:t>#decision ; fade : 1 : 3 : 1</w:t>
+      </w:r>
+      <w:r>
+        <w:t xml:space="preserve"> (Hace un fade entre escenas)</w:t>
+      </w:r>
+    </w:p>
+    <w:p>
+      <w:r>
+        <w:tab/>
       </w:r>
       <w:r>
         <w:rPr>
           <w:highlight w:val="yellow"/>
         </w:rPr>
-        <w:t>_earthquake</w:t>
-      </w:r>
-    </w:p>
-    <w:p>
-      <w:pPr>
-        <w:ind w:firstLine="708"/>
-      </w:pPr>
+        <w:t>#linear ; video : nombre_del_video</w:t>
+      </w:r>
+      <w:r>
+        <w:t xml:space="preserve"> (Muestra un video antes de pasar a la siguiente secena)</w:t>
+      </w:r>
+    </w:p>
+    <w:p>
+      <w:r>
+        <w:tab/>
+        <w:t>Si se desea mostrar un video este debe estar en formato .webp.</w:t>
+      </w:r>
+    </w:p>
+    <w:p/>
+    <w:p>
+      <w:pPr>
+        <w:pStyle w:val="Ttulo3"/>
+      </w:pPr>
+      <w:r>
+        <w:t>Limpieza del juego</w:t>
+      </w:r>
+    </w:p>
+    <w:p>
+      <w:r>
+        <w:tab/>
+        <w:t>Por razones de ahorro de recursos es conveniente que de vez en cuando limpiemos nuestra escena, esto lo hacemos añadiendo la opción “clear” al final de un fin de diálogo, este debe ir separado por un ;</w:t>
+      </w:r>
+    </w:p>
+    <w:p>
+      <w:pPr>
+        <w:spacing w:after="0"/>
+      </w:pPr>
+      <w:r>
+        <w:tab/>
+      </w:r>
       <w:r>
         <w:rPr>
           <w:highlight w:val="yellow"/>
         </w:rPr>
-        <w:t>e</w:t>
+        <w:t xml:space="preserve">#decision ; video ; </w:t>
       </w:r>
       <w:r>
         <w:rPr>
           <w:highlight w:val="yellow"/>
         </w:rPr>
-        <w:t>arthquake_lived_in_</w:t>
+        <w:t>sun_rising ; clear</w:t>
+      </w:r>
+      <w:r>
+        <w:t xml:space="preserve"> (Repro</w:t>
+      </w:r>
+      <w:r>
+        <w:t>d</w:t>
+      </w:r>
+      <w:r>
+        <w:t>uce el video sun_rising y luego limpia el juego)</w:t>
+      </w:r>
+    </w:p>
+    <w:p>
+      <w:pPr>
+        <w:spacing w:after="0"/>
+      </w:pPr>
+      <w:r>
+        <w:tab/>
       </w:r>
       <w:r>
         <w:rPr>
           <w:highlight w:val="yellow"/>
         </w:rPr>
-        <w:t>gym</w:t>
+        <w:t>#condition scene ; fade : 1 : 2 : 1 ; clear</w:t>
+      </w:r>
+      <w:r>
+        <w:t xml:space="preserve"> (Hace un fa</w:t>
+      </w:r>
+      <w:r>
+        <w:t>d</w:t>
+      </w:r>
+      <w:r>
+        <w:t>e y luego limpia el juego)</w:t>
+      </w:r>
+    </w:p>
+    <w:p>
+      <w:r>
+        <w:tab/>
       </w:r>
       <w:r>
         <w:rPr>
           <w:highlight w:val="yellow"/>
         </w:rPr>
-        <w:t xml:space="preserve"> ; earthquake_in</w:t>
-      </w:r>
-      <w:r>
-        <w:rPr>
-          <w:highlight w:val="yellow"/>
-        </w:rPr>
-        <w:t>_gym</w:t>
-      </w:r>
-      <w:r>
-        <w:rPr>
-          <w:highlight w:val="yellow"/>
-        </w:rPr>
-        <w:t xml:space="preserve"> ; tell_</w:t>
-      </w:r>
-      <w:r>
-        <w:rPr>
-          <w:highlight w:val="yellow"/>
-        </w:rPr>
-        <w:t>gym</w:t>
-      </w:r>
-      <w:r>
-        <w:rPr>
-          <w:highlight w:val="yellow"/>
-        </w:rPr>
-        <w:t>_earthquake</w:t>
-      </w:r>
-    </w:p>
-    <w:p>
-      <w:pPr>
-        <w:ind w:firstLine="708"/>
-      </w:pPr>
-      <w:r>
-        <w:t>Quizás sea algo confuso de entender, solo ten en cuenta que la primera columna es el identificador único de la opción que estamos escribiendo, la segunda es el nombre del archivo de control que muestra como el protagonista vivió el terremoto y la tercera columna es el nombre del archivo de control del jugador contando cómo vivió el terremoto.</w:t>
-      </w:r>
-    </w:p>
-    <w:p>
-      <w:pPr>
-        <w:ind w:firstLine="708"/>
-      </w:pPr>
-      <w:r>
-        <w:t>De esa forma, el juego verifica ¿El jugador pasó por la escena “earthquake_in_home.csv”? Entonces lo mandamos a la escena tell_home_earthquake. Y así sucesivamente con las demás opciones. Si ninguna se cumple se tomará la última.</w:t>
+        <w:t>#condition decisión ; ; clear</w:t>
+      </w:r>
+      <w:r>
+        <w:t xml:space="preserve"> (Limpiando sin hacer una transición)</w:t>
+      </w:r>
+    </w:p>
+    <w:p>
+      <w:r>
+        <w:tab/>
+        <w:t>Siempre que se vaya a pasar de una escena a otra de forma limpia, es decir, sin personajes en pantalla y sin cambio de fondo, es conveniente siempre agregar el parámetro clear para ahorrar recursos al dispositivo.</w:t>
       </w:r>
     </w:p>
     <w:p/>
@@ -10531,6 +10516,30 @@
       <w:bookmarkEnd w:id="18"/>
     </w:p>
     <w:p>
+      <w:r>
+        <w:tab/>
+        <w:t>Junto con este archivo se encuentran dos carpetas llamadas “ejemplo1” y “ejemplo2”, estas contienen unos archivos de control que explican dos escenas distintas utilizando las funciones que anteriormente se han descrito a lo largo del documento.</w:t>
+      </w:r>
+    </w:p>
+    <w:p>
+      <w:r>
+        <w:tab/>
+        <w:t xml:space="preserve">El “ejemplo1” describe al protagonista </w:t>
+      </w:r>
+      <w:r>
+        <w:t>caminando por la calle acompañado de otro personaje, pasan por varias tiendas y hay una decisión de por medio.</w:t>
+      </w:r>
+    </w:p>
+    <w:p>
+      <w:r>
+        <w:tab/>
+        <w:t>El “ejemplo2” muestra un enfrentamiento entre el protagonista y otro personaje en un combate de prueba usando espadas de madera.</w:t>
+      </w:r>
+      <w:r>
+        <w:t xml:space="preserve"> En medio del combate hay una decisión la cual tiene repercusiones al final del combate.</w:t>
+      </w:r>
+    </w:p>
+    <w:p>
       <w:pPr>
         <w:pStyle w:val="Ttulo1"/>
       </w:pPr>
@@ -10558,18 +10567,18 @@
       </w:pPr>
       <w:bookmarkStart w:id="21" w:name="_Toc199261574"/>
       <w:r>
+        <w:t>Balanceo de novela visual</w:t>
+      </w:r>
+      <w:bookmarkEnd w:id="21"/>
+    </w:p>
+    <w:p/>
+    <w:p>
+      <w:pPr>
+        <w:pStyle w:val="Ttulo1"/>
+      </w:pPr>
+      <w:bookmarkStart w:id="22" w:name="_Toc199261575"/>
+      <w:r>
         <w:lastRenderedPageBreak/>
-        <w:t>Balanceo de novela visual</w:t>
-      </w:r>
-      <w:bookmarkEnd w:id="21"/>
-    </w:p>
-    <w:p/>
-    <w:p>
-      <w:pPr>
-        <w:pStyle w:val="Ttulo1"/>
-      </w:pPr>
-      <w:bookmarkStart w:id="22" w:name="_Toc199261575"/>
-      <w:r>
         <w:t>Derechos</w:t>
       </w:r>
       <w:bookmarkEnd w:id="22"/>

</xml_diff>

<commit_message>
<fix> adding language to decisions text in docs
</commit_message>
<xml_diff>
--- a/Manual de desarrollo en Atlax Renpy.docx
+++ b/Manual de desarrollo en Atlax Renpy.docx
@@ -9348,27 +9348,72 @@
       <w:pPr>
         <w:spacing w:after="0"/>
         <w:ind w:firstLine="708"/>
-      </w:pPr>
-      <w:r>
+        <w:rPr>
+          <w:sz w:val="22"/>
+          <w:szCs w:val="22"/>
+        </w:rPr>
+      </w:pPr>
+      <w:r>
+        <w:rPr>
+          <w:sz w:val="22"/>
+          <w:szCs w:val="22"/>
+        </w:rPr>
         <w:t>key_opcion_1 ; punto_1 : valor_punto_1 ; siguiente escena</w:t>
+      </w:r>
+      <w:r>
+        <w:rPr>
+          <w:sz w:val="22"/>
+          <w:szCs w:val="22"/>
+        </w:rPr>
+        <w:t xml:space="preserve"> ; de decision</w:t>
       </w:r>
     </w:p>
     <w:p>
       <w:pPr>
         <w:spacing w:after="0"/>
         <w:ind w:firstLine="708"/>
-      </w:pPr>
-      <w:r>
+        <w:rPr>
+          <w:sz w:val="22"/>
+          <w:szCs w:val="22"/>
+        </w:rPr>
+      </w:pPr>
+      <w:r>
+        <w:rPr>
+          <w:sz w:val="22"/>
+          <w:szCs w:val="22"/>
+        </w:rPr>
         <w:t>key_opcion_2 ;; siguiente escena</w:t>
+      </w:r>
+      <w:r>
+        <w:rPr>
+          <w:sz w:val="22"/>
+          <w:szCs w:val="22"/>
+        </w:rPr>
+        <w:t xml:space="preserve"> ; texto</w:t>
       </w:r>
     </w:p>
     <w:p>
       <w:pPr>
         <w:spacing w:after="0"/>
         <w:ind w:firstLine="708"/>
-      </w:pPr>
-      <w:r>
+        <w:rPr>
+          <w:sz w:val="22"/>
+          <w:szCs w:val="22"/>
+        </w:rPr>
+      </w:pPr>
+      <w:r>
+        <w:rPr>
+          <w:sz w:val="22"/>
+          <w:szCs w:val="22"/>
+        </w:rPr>
         <w:t xml:space="preserve">key_opcion_3 ; punto1:valor_punto1, punto2:valor_punto2 ; siguiente escena </w:t>
+      </w:r>
+      <w:r>
+        <w:rPr>
+          <w:sz w:val="22"/>
+          <w:szCs w:val="22"/>
+        </w:rPr>
+        <w:t>; texto</w:t>
       </w:r>
     </w:p>
     <w:p>
@@ -9546,6 +9591,9 @@
     <w:p>
       <w:pPr>
         <w:spacing w:after="0"/>
+        <w:rPr>
+          <w:highlight w:val="yellow"/>
+        </w:rPr>
       </w:pPr>
       <w:r>
         <w:tab/>
@@ -9554,12 +9602,21 @@
         <w:rPr>
           <w:highlight w:val="yellow"/>
         </w:rPr>
-        <w:t>#linear</w:t>
+        <w:t>#</w:t>
+      </w:r>
+      <w:r>
+        <w:rPr>
+          <w:highlight w:val="yellow"/>
+        </w:rPr>
+        <w:t>decision</w:t>
       </w:r>
     </w:p>
     <w:p>
       <w:pPr>
         <w:spacing w:after="0"/>
+        <w:rPr>
+          <w:highlight w:val="yellow"/>
+        </w:rPr>
       </w:pPr>
       <w:r>
         <w:tab/>
@@ -9570,10 +9627,19 @@
         </w:rPr>
         <w:t>give_sushi ; ; scene_B</w:t>
       </w:r>
+      <w:r>
+        <w:rPr>
+          <w:highlight w:val="yellow"/>
+        </w:rPr>
+        <w:t>;Sushi</w:t>
+      </w:r>
     </w:p>
     <w:p>
       <w:pPr>
         <w:spacing w:after="0"/>
+        <w:rPr>
+          <w:highlight w:val="yellow"/>
+        </w:rPr>
       </w:pPr>
       <w:r>
         <w:tab/>
@@ -9584,6 +9650,12 @@
         </w:rPr>
         <w:t>give_salad ; amistad : -1 ; scene_C</w:t>
       </w:r>
+      <w:r>
+        <w:rPr>
+          <w:highlight w:val="yellow"/>
+        </w:rPr>
+        <w:t>;Ensalada</w:t>
+      </w:r>
     </w:p>
     <w:p>
       <w:pPr>
@@ -9597,6 +9669,12 @@
           <w:highlight w:val="yellow"/>
         </w:rPr>
         <w:t>give_beef ; amistad : 1 ; scene_D</w:t>
+      </w:r>
+      <w:r>
+        <w:rPr>
+          <w:highlight w:val="yellow"/>
+        </w:rPr>
+        <w:t>;Bistec</w:t>
       </w:r>
     </w:p>
     <w:p>
@@ -9617,6 +9695,15 @@
       </w:r>
       <w:r>
         <w:t>.</w:t>
+      </w:r>
+    </w:p>
+    <w:p>
+      <w:pPr>
+        <w:spacing w:after="0"/>
+      </w:pPr>
+      <w:r>
+        <w:tab/>
+        <w:t>Al igual que con los diálogos, para agregar nuevos textos dependiendo del idioma, debemos seguir agregando ; y añadiendo los textos correspondientes al idioma.</w:t>
       </w:r>
     </w:p>
     <w:p>

</xml_diff>

<commit_message>
<fix> adding example1 and fixing some things
</commit_message>
<xml_diff>
--- a/Manual de desarrollo en Atlax Renpy.docx
+++ b/Manual de desarrollo en Atlax Renpy.docx
@@ -3429,10 +3429,10 @@
           <w:noProof/>
         </w:rPr>
         <w:drawing>
-          <wp:inline distT="0" distB="0" distL="0" distR="0" wp14:anchorId="3A9E6ED2" wp14:editId="6B0E4E1F">
-            <wp:extent cx="4514850" cy="809625"/>
-            <wp:effectExtent l="0" t="0" r="0" b="9525"/>
-            <wp:docPr id="1251497537" name="Imagen 1"/>
+          <wp:inline distT="0" distB="0" distL="0" distR="0" wp14:anchorId="006DEA25" wp14:editId="13BC2BB7">
+            <wp:extent cx="4200525" cy="1581150"/>
+            <wp:effectExtent l="0" t="0" r="9525" b="0"/>
+            <wp:docPr id="2007377502" name="Imagen 1"/>
             <wp:cNvGraphicFramePr>
               <a:graphicFrameLocks xmlns:a="http://schemas.openxmlformats.org/drawingml/2006/main" noChangeAspect="1"/>
             </wp:cNvGraphicFramePr>
@@ -3440,7 +3440,7 @@
               <a:graphicData uri="http://schemas.openxmlformats.org/drawingml/2006/picture">
                 <pic:pic xmlns:pic="http://schemas.openxmlformats.org/drawingml/2006/picture">
                   <pic:nvPicPr>
-                    <pic:cNvPr id="1251497537" name=""/>
+                    <pic:cNvPr id="2007377502" name=""/>
                     <pic:cNvPicPr/>
                   </pic:nvPicPr>
                   <pic:blipFill>
@@ -3452,7 +3452,7 @@
                   <pic:spPr>
                     <a:xfrm>
                       <a:off x="0" y="0"/>
-                      <a:ext cx="4514850" cy="809625"/>
+                      <a:ext cx="4200525" cy="1581150"/>
                     </a:xfrm>
                     <a:prstGeom prst="rect">
                       <a:avLst/>
@@ -3532,6 +3532,7 @@
     </w:p>
     <w:p>
       <w:r>
+        <w:lastRenderedPageBreak/>
         <w:tab/>
       </w:r>
       <w:r>
@@ -3577,7 +3578,6 @@
     </w:p>
     <w:p>
       <w:r>
-        <w:lastRenderedPageBreak/>
         <w:tab/>
         <w:t>currentLanguage es el idioma por defecto que usará el motor al abrir el juego, este puede ser cambiado en la configuración del juego mismo. La otra variable llamada allLanguages, lista todos los lenguajes que soporte tu historia</w:t>
       </w:r>
@@ -3741,7 +3741,11 @@
     <w:p>
       <w:r>
         <w:tab/>
-        <w:t>Crear un archivo de control es muy sencillo, tenemos dos formas de hacerlo, la forma “complicada” es creando un archivo de texto en nuestro computador y colocarle al final .csv, llamémoslo “ejemplo.csv”. Es posible que al abrirlo se ejecute el bloc de notas, para ello tenemos que ir a la configuración de nuestro sistema operativo para que nos permita ver las extensiones o formatos de los archivos, una vez cambiado debemos cambiar “.txt” por “.csv”.</w:t>
+        <w:t xml:space="preserve">Crear un archivo de control es muy sencillo, tenemos dos formas de hacerlo, la forma “complicada” es creando un archivo de texto en nuestro computador y colocarle al final .csv, llamémoslo “ejemplo.csv”. Es posible que al abrirlo se ejecute el bloc de notas, para ello tenemos que ir a la configuración de nuestro sistema operativo para que nos </w:t>
+      </w:r>
+      <w:r>
+        <w:lastRenderedPageBreak/>
+        <w:t>permita ver las extensiones o formatos de los archivos, una vez cambiado debemos cambiar “.txt” por “.csv”.</w:t>
       </w:r>
     </w:p>
     <w:p>
@@ -3749,7 +3753,6 @@
         <w:rPr>
           <w:noProof/>
         </w:rPr>
-        <w:lastRenderedPageBreak/>
         <w:drawing>
           <wp:anchor distT="0" distB="0" distL="114300" distR="114300" simplePos="0" relativeHeight="251658240" behindDoc="0" locked="0" layoutInCell="1" allowOverlap="1" wp14:anchorId="698E50CD" wp14:editId="448B7B75">
             <wp:simplePos x="0" y="0"/>
@@ -3926,6 +3929,7 @@
         <w:rPr>
           <w:noProof/>
         </w:rPr>
+        <w:lastRenderedPageBreak/>
         <w:drawing>
           <wp:anchor distT="0" distB="0" distL="114300" distR="114300" simplePos="0" relativeHeight="251659264" behindDoc="0" locked="0" layoutInCell="1" allowOverlap="1" wp14:anchorId="77406FC3" wp14:editId="0C381A7A">
             <wp:simplePos x="0" y="0"/>
@@ -4219,12 +4223,9 @@
     </w:p>
     <w:p>
       <w:r>
+        <w:lastRenderedPageBreak/>
         <w:tab/>
-        <w:t xml:space="preserve">El valor recomendado para colocar en esta columna key es el siguiente: [ruta]_[capitulo]_[escena]_[dialogo], por ejemplo si queremos describir el diálogo </w:t>
-      </w:r>
-      <w:r>
-        <w:lastRenderedPageBreak/>
-        <w:t>número 89 de la escena noche de paseo del capítulo 3 de la ruta Stefannie, haríamos algo así: stefannie_3_night_out_89, el siguiente diálogo sería igual pero con un 90 en vez de 89 y siempre empezando en 1.</w:t>
+        <w:t>El valor recomendado para colocar en esta columna key es el siguiente: [ruta]_[capitulo]_[escena]_[dialogo], por ejemplo si queremos describir el diálogo número 89 de la escena noche de paseo del capítulo 3 de la ruta Stefannie, haríamos algo así: stefannie_3_night_out_89, el siguiente diálogo sería igual pero con un 90 en vez de 89 y siempre empezando en 1.</w:t>
       </w:r>
     </w:p>
     <w:p>
@@ -4462,7 +4463,6 @@
         <w:pStyle w:val="Ttulo3"/>
       </w:pPr>
       <w:r>
-        <w:lastRenderedPageBreak/>
         <w:t xml:space="preserve">Tipos de </w:t>
       </w:r>
       <w:r>
@@ -5165,7 +5165,16 @@
     <w:p>
       <w:r>
         <w:tab/>
-        <w:t>El nombre del sonido que se va a escribir debe ser el mismo que el archivo de audio, puedes utilizar espacios en los nombres o reemplazarlos por _, sin embargo, en los nombres de los archivos de audio siempre deben estar por _.</w:t>
+        <w:t xml:space="preserve">El nombre del sonido que se va a escribir debe ser el mismo que el archivo de audio, puedes utilizar espacios en los nombres o reemplazarlos por _, sin embargo, en los nombres de los archivos de audio siempre deben estar por </w:t>
+      </w:r>
+      <w:r>
+        <w:t>espacios</w:t>
+      </w:r>
+      <w:r>
+        <w:t>.</w:t>
+      </w:r>
+      <w:r>
+        <w:t xml:space="preserve"> Las mayúsculas no se respetan, de todas formas se recomienda escribirlo todo en minúscula.</w:t>
       </w:r>
     </w:p>
     <w:p>

</xml_diff>

<commit_message>
<fix> attack and dodge animations ready
</commit_message>
<xml_diff>
--- a/Manual de desarrollo en Atlax Renpy.docx
+++ b/Manual de desarrollo en Atlax Renpy.docx
@@ -11753,8 +11753,62 @@
     </w:p>
     <w:p>
       <w:r>
+        <w:tab/>
+        <w:t xml:space="preserve">Aunque la animación no tenga parámetros, puedes colocarla en </w:t>
+      </w:r>
+      <w:r>
+        <w:rPr>
+          <w:i/>
+          <w:iCs/>
+        </w:rPr>
+        <w:t>oneParameterEvents</w:t>
+      </w:r>
+      <w:r>
+        <w:rPr>
+          <w:i/>
+          <w:iCs/>
+        </w:rPr>
         <w:t xml:space="preserve"> </w:t>
       </w:r>
+      <w:r>
+        <w:t>o</w:t>
+      </w:r>
+      <w:r>
+        <w:rPr>
+          <w:i/>
+          <w:iCs/>
+        </w:rPr>
+        <w:t xml:space="preserve"> </w:t>
+      </w:r>
+      <w:r>
+        <w:rPr>
+          <w:i/>
+          <w:iCs/>
+        </w:rPr>
+        <w:t>twoParameterEvents</w:t>
+      </w:r>
+      <w:r>
+        <w:t xml:space="preserve">. IMPORTANTE: Si la animación utiliza la propiedad zoom, estrictamente debe estar en </w:t>
+      </w:r>
+      <w:r>
+        <w:rPr>
+          <w:i/>
+          <w:iCs/>
+        </w:rPr>
+        <w:t>twoParameterEvents</w:t>
+      </w:r>
+      <w:r>
+        <w:rPr>
+          <w:i/>
+          <w:iCs/>
+        </w:rPr>
+        <w:t>.</w:t>
+      </w:r>
+    </w:p>
+    <w:p>
+      <w:r>
+        <w:t xml:space="preserve"> </w:t>
+      </w:r>
     </w:p>
     <w:p/>
     <w:p>
@@ -11763,6 +11817,7 @@
       </w:pPr>
       <w:bookmarkStart w:id="21" w:name="_Toc199261574"/>
       <w:r>
+        <w:lastRenderedPageBreak/>
         <w:t>Balanceo de novela visual</w:t>
       </w:r>
       <w:bookmarkEnd w:id="21"/>
@@ -11774,7 +11829,6 @@
       </w:pPr>
       <w:bookmarkStart w:id="22" w:name="_Toc199261575"/>
       <w:r>
-        <w:lastRenderedPageBreak/>
         <w:t>Derechos</w:t>
       </w:r>
       <w:bookmarkEnd w:id="22"/>

</xml_diff>

<commit_message>
<fix> deleting router manager and info added to continuos events
</commit_message>
<xml_diff>
--- a/Manual de desarrollo en Atlax Renpy.docx
+++ b/Manual de desarrollo en Atlax Renpy.docx
@@ -6595,7 +6595,25 @@
         <w:rPr>
           <w:highlight w:val="yellow"/>
         </w:rPr>
-        <w:t>Family_picture</w:t>
+        <w:t>f</w:t>
+      </w:r>
+      <w:r>
+        <w:rPr>
+          <w:highlight w:val="yellow"/>
+        </w:rPr>
+        <w:t>amily</w:t>
+      </w:r>
+      <w:r>
+        <w:rPr>
+          <w:highlight w:val="yellow"/>
+        </w:rPr>
+        <w:t xml:space="preserve"> </w:t>
+      </w:r>
+      <w:r>
+        <w:rPr>
+          <w:highlight w:val="yellow"/>
+        </w:rPr>
+        <w:t>picture</w:t>
       </w:r>
       <w:r>
         <w:t xml:space="preserve"> (Muestra una foto de una familia en pantalla)</w:t>
@@ -6611,11 +6629,19 @@
     </w:p>
     <w:p>
       <w:pPr>
+        <w:ind w:firstLine="708"/>
+      </w:pPr>
+      <w:r>
+        <w:lastRenderedPageBreak/>
+        <w:t>Los nombres de los archivos a mostrar deben estar en minúscula.</w:t>
+      </w:r>
+    </w:p>
+    <w:p>
+      <w:pPr>
         <w:pStyle w:val="Ttulo2"/>
       </w:pPr>
       <w:bookmarkStart w:id="13" w:name="_Toc199261566"/>
       <w:r>
-        <w:lastRenderedPageBreak/>
         <w:t>Columna Events</w:t>
       </w:r>
       <w:bookmarkEnd w:id="13"/>

</xml_diff>

<commit_message>
<fix> destroy characters interrupt the game fixed
</commit_message>
<xml_diff>
--- a/Manual de desarrollo en Atlax Renpy.docx
+++ b/Manual de desarrollo en Atlax Renpy.docx
@@ -9169,6 +9169,223 @@
       <w:pPr>
         <w:ind w:firstLine="708"/>
       </w:pPr>
+      <w:r>
+        <w:lastRenderedPageBreak/>
+        <w:t>Dependiendo de la fuente que utilices en tu proyecto, es posible que ciertos caracteres no se muestren, por ejemplo el carácter “</w:t>
+      </w:r>
+      <w:r>
+        <w:t>♪</w:t>
+      </w:r>
+      <w:r>
+        <w:t>” no existe en la fuente “playtime” y en su lugar se mostrará un carácter extraño. En esos casos tendrás que usar obligatoriamente un modificador de texto especificando una fuente la cual sí que cuente con el carácter necesitado.</w:t>
+      </w:r>
+    </w:p>
+    <w:p>
+      <w:pPr>
+        <w:ind w:firstLine="708"/>
+      </w:pPr>
+    </w:p>
+    <w:p>
+      <w:pPr>
+        <w:ind w:firstLine="708"/>
+        <w:rPr>
+          <w:i/>
+          <w:iCs/>
+        </w:rPr>
+      </w:pPr>
+      <w:r>
+        <w:rPr>
+          <w:i/>
+          <w:iCs/>
+        </w:rPr>
+        <w:t xml:space="preserve">Mostrando el diálogo “Ahora a bailar wuuuu </w:t>
+      </w:r>
+      <w:r>
+        <w:t>♪♪♪♪</w:t>
+      </w:r>
+      <w:r>
+        <w:rPr>
+          <w:i/>
+          <w:iCs/>
+        </w:rPr>
+        <w:t>”</w:t>
+      </w:r>
+    </w:p>
+    <w:p>
+      <w:pPr>
+        <w:ind w:firstLine="708"/>
+      </w:pPr>
+      <w:r>
+        <w:rPr>
+          <w:noProof/>
+        </w:rPr>
+        <w:drawing>
+          <wp:inline distT="0" distB="0" distL="0" distR="0" wp14:anchorId="51FFCB40" wp14:editId="5D252EBD">
+            <wp:extent cx="4267200" cy="771525"/>
+            <wp:effectExtent l="0" t="0" r="0" b="9525"/>
+            <wp:docPr id="1468955270" name="Imagen 1"/>
+            <wp:cNvGraphicFramePr>
+              <a:graphicFrameLocks xmlns:a="http://schemas.openxmlformats.org/drawingml/2006/main" noChangeAspect="1"/>
+            </wp:cNvGraphicFramePr>
+            <a:graphic xmlns:a="http://schemas.openxmlformats.org/drawingml/2006/main">
+              <a:graphicData uri="http://schemas.openxmlformats.org/drawingml/2006/picture">
+                <pic:pic xmlns:pic="http://schemas.openxmlformats.org/drawingml/2006/picture">
+                  <pic:nvPicPr>
+                    <pic:cNvPr id="1468955270" name=""/>
+                    <pic:cNvPicPr/>
+                  </pic:nvPicPr>
+                  <pic:blipFill>
+                    <a:blip r:embed="rId27"/>
+                    <a:stretch>
+                      <a:fillRect/>
+                    </a:stretch>
+                  </pic:blipFill>
+                  <pic:spPr>
+                    <a:xfrm>
+                      <a:off x="0" y="0"/>
+                      <a:ext cx="4267200" cy="771525"/>
+                    </a:xfrm>
+                    <a:prstGeom prst="rect">
+                      <a:avLst/>
+                    </a:prstGeom>
+                  </pic:spPr>
+                </pic:pic>
+              </a:graphicData>
+            </a:graphic>
+          </wp:inline>
+        </w:drawing>
+      </w:r>
+    </w:p>
+    <w:p>
+      <w:pPr>
+        <w:ind w:firstLine="708"/>
+      </w:pPr>
+    </w:p>
+    <w:p>
+      <w:pPr>
+        <w:ind w:firstLine="708"/>
+      </w:pPr>
+      <w:r>
+        <w:t>E</w:t>
+      </w:r>
+      <w:r>
+        <w:t>l modificador de texto es el siguiente.</w:t>
+      </w:r>
+    </w:p>
+    <w:p>
+      <w:pPr>
+        <w:ind w:firstLine="708"/>
+      </w:pPr>
+      <w:r>
+        <w:t>{font=DejaVuSans.ttf}♪♪♪{/font}</w:t>
+      </w:r>
+    </w:p>
+    <w:p>
+      <w:pPr>
+        <w:ind w:firstLine="708"/>
+      </w:pPr>
+      <w:r>
+        <w:t>De esa forma las notas musicales se muestran en la fuente “DejaVuSans.ttf”</w:t>
+      </w:r>
+    </w:p>
+    <w:p>
+      <w:pPr>
+        <w:ind w:firstLine="708"/>
+      </w:pPr>
+    </w:p>
+    <w:p>
+      <w:pPr>
+        <w:ind w:firstLine="708"/>
+        <w:rPr>
+          <w:i/>
+          <w:iCs/>
+        </w:rPr>
+      </w:pPr>
+      <w:r>
+        <w:rPr>
+          <w:i/>
+          <w:iCs/>
+        </w:rPr>
+        <w:t>Mostrando el diálogo “</w:t>
+      </w:r>
+      <w:r>
+        <w:rPr>
+          <w:i/>
+          <w:iCs/>
+        </w:rPr>
+        <w:t>Ahora a bailar wuuuu</w:t>
+      </w:r>
+      <w:r>
+        <w:rPr>
+          <w:i/>
+          <w:iCs/>
+        </w:rPr>
+        <w:t xml:space="preserve"> </w:t>
+      </w:r>
+      <w:r>
+        <w:rPr>
+          <w:i/>
+          <w:iCs/>
+        </w:rPr>
+        <w:t>{font=DejaVuSans.ttf}♪♪♪{/font}</w:t>
+      </w:r>
+      <w:r>
+        <w:rPr>
+          <w:i/>
+          <w:iCs/>
+        </w:rPr>
+        <w:t>”</w:t>
+      </w:r>
+    </w:p>
+    <w:p>
+      <w:pPr>
+        <w:ind w:firstLine="708"/>
+      </w:pPr>
+      <w:r>
+        <w:rPr>
+          <w:noProof/>
+        </w:rPr>
+        <w:drawing>
+          <wp:inline distT="0" distB="0" distL="0" distR="0" wp14:anchorId="39374C6B" wp14:editId="3997D87C">
+            <wp:extent cx="4400550" cy="733425"/>
+            <wp:effectExtent l="0" t="0" r="0" b="9525"/>
+            <wp:docPr id="1855658548" name="Imagen 1"/>
+            <wp:cNvGraphicFramePr>
+              <a:graphicFrameLocks xmlns:a="http://schemas.openxmlformats.org/drawingml/2006/main" noChangeAspect="1"/>
+            </wp:cNvGraphicFramePr>
+            <a:graphic xmlns:a="http://schemas.openxmlformats.org/drawingml/2006/main">
+              <a:graphicData uri="http://schemas.openxmlformats.org/drawingml/2006/picture">
+                <pic:pic xmlns:pic="http://schemas.openxmlformats.org/drawingml/2006/picture">
+                  <pic:nvPicPr>
+                    <pic:cNvPr id="1855658548" name=""/>
+                    <pic:cNvPicPr/>
+                  </pic:nvPicPr>
+                  <pic:blipFill>
+                    <a:blip r:embed="rId28"/>
+                    <a:stretch>
+                      <a:fillRect/>
+                    </a:stretch>
+                  </pic:blipFill>
+                  <pic:spPr>
+                    <a:xfrm>
+                      <a:off x="0" y="0"/>
+                      <a:ext cx="4422468" cy="737078"/>
+                    </a:xfrm>
+                    <a:prstGeom prst="rect">
+                      <a:avLst/>
+                    </a:prstGeom>
+                  </pic:spPr>
+                </pic:pic>
+              </a:graphicData>
+            </a:graphic>
+          </wp:inline>
+        </w:drawing>
+      </w:r>
+    </w:p>
+    <w:p>
+      <w:pPr>
+        <w:ind w:firstLine="708"/>
+      </w:pPr>
     </w:p>
     <w:p>
       <w:pPr>
@@ -9299,6 +9516,7 @@
         <w:pStyle w:val="Ttulo2"/>
       </w:pPr>
       <w:r>
+        <w:lastRenderedPageBreak/>
         <w:t xml:space="preserve">Terminación de </w:t>
       </w:r>
       <w:bookmarkEnd w:id="17"/>
@@ -9487,7 +9705,6 @@
         <w:pStyle w:val="Ttulo3"/>
       </w:pPr>
       <w:r>
-        <w:lastRenderedPageBreak/>
         <w:t>Lineal</w:t>
       </w:r>
     </w:p>
@@ -9524,7 +9741,7 @@
                     <pic:cNvPicPr/>
                   </pic:nvPicPr>
                   <pic:blipFill>
-                    <a:blip r:embed="rId27"/>
+                    <a:blip r:embed="rId29"/>
                     <a:stretch>
                       <a:fillRect/>
                     </a:stretch>
@@ -9553,6 +9770,7 @@
     </w:p>
     <w:p>
       <w:r>
+        <w:lastRenderedPageBreak/>
         <w:t xml:space="preserve">             </w:t>
       </w:r>
       <w:r>
@@ -9575,7 +9793,7 @@
                     <pic:cNvPicPr/>
                   </pic:nvPicPr>
                   <pic:blipFill>
-                    <a:blip r:embed="rId28"/>
+                    <a:blip r:embed="rId30"/>
                     <a:stretch>
                       <a:fillRect/>
                     </a:stretch>
@@ -9715,7 +9933,6 @@
         </w:sectPr>
       </w:pPr>
       <w:r>
-        <w:lastRenderedPageBreak/>
         <w:tab/>
       </w:r>
     </w:p>
@@ -9879,6 +10096,7 @@
         <w:pStyle w:val="Ttulo3"/>
       </w:pPr>
       <w:r>
+        <w:lastRenderedPageBreak/>
         <w:t>Decisión</w:t>
       </w:r>
     </w:p>
@@ -10024,7 +10242,7 @@
                     <pic:cNvPicPr/>
                   </pic:nvPicPr>
                   <pic:blipFill>
-                    <a:blip r:embed="rId29"/>
+                    <a:blip r:embed="rId31"/>
                     <a:stretch>
                       <a:fillRect/>
                     </a:stretch>
@@ -10047,7 +10265,6 @@
     </w:p>
     <w:p>
       <w:r>
-        <w:lastRenderedPageBreak/>
         <w:t xml:space="preserve">       </w:t>
       </w:r>
       <w:r>
@@ -10070,7 +10287,7 @@
                     <pic:cNvPicPr/>
                   </pic:nvPicPr>
                   <pic:blipFill>
-                    <a:blip r:embed="rId30"/>
+                    <a:blip r:embed="rId32"/>
                     <a:stretch>
                       <a:fillRect/>
                     </a:stretch>
@@ -10099,6 +10316,7 @@
     </w:p>
     <w:p>
       <w:r>
+        <w:lastRenderedPageBreak/>
         <w:t xml:space="preserve">            </w:t>
       </w:r>
       <w:r>
@@ -10121,7 +10339,7 @@
                     <pic:cNvPicPr/>
                   </pic:nvPicPr>
                   <pic:blipFill>
-                    <a:blip r:embed="rId31"/>
+                    <a:blip r:embed="rId33"/>
                     <a:stretch>
                       <a:fillRect/>
                     </a:stretch>
@@ -10355,7 +10573,6 @@
         <w:pStyle w:val="Ttulo3"/>
       </w:pPr>
       <w:r>
-        <w:lastRenderedPageBreak/>
         <w:t>Condición</w:t>
       </w:r>
     </w:p>
@@ -10396,6 +10613,7 @@
         <w:pStyle w:val="Ttulo4"/>
       </w:pPr>
       <w:r>
+        <w:lastRenderedPageBreak/>
         <w:t>Condición por puntos</w:t>
       </w:r>
     </w:p>
@@ -10420,7 +10638,7 @@
                     <pic:cNvPicPr/>
                   </pic:nvPicPr>
                   <pic:blipFill>
-                    <a:blip r:embed="rId32"/>
+                    <a:blip r:embed="rId34"/>
                     <a:stretch>
                       <a:fillRect/>
                     </a:stretch>
@@ -10582,7 +10800,6 @@
         <w:rPr>
           <w:highlight w:val="yellow"/>
         </w:rPr>
-        <w:lastRenderedPageBreak/>
         <w:t>#condition points</w:t>
       </w:r>
     </w:p>
@@ -10693,6 +10910,7 @@
     </w:p>
     <w:p>
       <w:r>
+        <w:lastRenderedPageBreak/>
         <w:t xml:space="preserve">      </w:t>
       </w:r>
       <w:r>
@@ -10715,7 +10933,7 @@
                     <pic:cNvPicPr/>
                   </pic:nvPicPr>
                   <pic:blipFill>
-                    <a:blip r:embed="rId33"/>
+                    <a:blip r:embed="rId35"/>
                     <a:stretch>
                       <a:fillRect/>
                     </a:stretch>
@@ -10872,7 +11090,6 @@
         <w:pStyle w:val="Ttulo4"/>
       </w:pPr>
       <w:r>
-        <w:lastRenderedPageBreak/>
         <w:t>Condición por escena</w:t>
       </w:r>
     </w:p>
@@ -10890,6 +11107,7 @@
         <w:rPr>
           <w:noProof/>
         </w:rPr>
+        <w:lastRenderedPageBreak/>
         <w:drawing>
           <wp:inline distT="0" distB="0" distL="0" distR="0" wp14:anchorId="37687B73" wp14:editId="05682B4E">
             <wp:extent cx="5400040" cy="2165350"/>
@@ -10906,7 +11124,7 @@
                     <pic:cNvPicPr/>
                   </pic:nvPicPr>
                   <pic:blipFill>
-                    <a:blip r:embed="rId34"/>
+                    <a:blip r:embed="rId36"/>
                     <a:stretch>
                       <a:fillRect/>
                     </a:stretch>
@@ -11083,7 +11301,6 @@
         <w:spacing w:after="0"/>
       </w:pPr>
       <w:r>
-        <w:lastRenderedPageBreak/>
         <w:tab/>
       </w:r>
       <w:r>
@@ -11292,7 +11509,6 @@
     </w:p>
     <w:p>
       <w:r>
-        <w:lastRenderedPageBreak/>
         <w:tab/>
       </w:r>
       <w:r>
@@ -11315,7 +11531,7 @@
                     <pic:cNvPicPr/>
                   </pic:nvPicPr>
                   <pic:blipFill>
-                    <a:blip r:embed="rId35"/>
+                    <a:blip r:embed="rId37"/>
                     <a:stretch>
                       <a:fillRect/>
                     </a:stretch>
@@ -11341,6 +11557,7 @@
         <w:ind w:firstLine="708"/>
       </w:pPr>
       <w:r>
+        <w:lastRenderedPageBreak/>
         <w:t xml:space="preserve">Si requireSceneEncryption </w:t>
       </w:r>
       <w:r>
@@ -11405,7 +11622,7 @@
                     <pic:cNvPicPr/>
                   </pic:nvPicPr>
                   <pic:blipFill>
-                    <a:blip r:embed="rId36"/>
+                    <a:blip r:embed="rId38"/>
                     <a:stretch>
                       <a:fillRect/>
                     </a:stretch>
@@ -11549,16 +11766,16 @@
     <w:p/>
     <w:p>
       <w:r>
+        <w:tab/>
+      </w:r>
+    </w:p>
+    <w:p>
+      <w:pPr>
+        <w:pStyle w:val="Ttulo1"/>
+      </w:pPr>
+      <w:bookmarkStart w:id="19" w:name="_Toc199261572"/>
+      <w:r>
         <w:lastRenderedPageBreak/>
-        <w:tab/>
-      </w:r>
-    </w:p>
-    <w:p>
-      <w:pPr>
-        <w:pStyle w:val="Ttulo1"/>
-      </w:pPr>
-      <w:bookmarkStart w:id="19" w:name="_Toc199261572"/>
-      <w:r>
         <w:t>Testing</w:t>
       </w:r>
       <w:bookmarkEnd w:id="19"/>
@@ -11696,7 +11913,7 @@
                     <pic:cNvPicPr/>
                   </pic:nvPicPr>
                   <pic:blipFill>
-                    <a:blip r:embed="rId37"/>
+                    <a:blip r:embed="rId39"/>
                     <a:stretch>
                       <a:fillRect/>
                     </a:stretch>
@@ -11832,7 +12049,6 @@
     </w:p>
     <w:p>
       <w:r>
-        <w:lastRenderedPageBreak/>
         <w:tab/>
         <w:t xml:space="preserve">Aunque la animación no tenga parámetros, puedes colocarla en </w:t>
       </w:r>
@@ -11925,7 +12141,7 @@
     <w:p/>
     <w:p/>
     <w:p>
-      <w:hyperlink r:id="rId38" w:history="1">
+      <w:hyperlink r:id="rId40" w:history="1">
         <w:r>
           <w:rPr>
             <w:rStyle w:val="Hipervnculo"/>
@@ -11938,7 +12154,7 @@
       </w:r>
     </w:p>
     <w:p>
-      <w:hyperlink r:id="rId39" w:history="1">
+      <w:hyperlink r:id="rId41" w:history="1">
         <w:r>
           <w:rPr>
             <w:rStyle w:val="Hipervnculo"/>
@@ -11948,7 +12164,7 @@
       </w:hyperlink>
     </w:p>
     <w:p>
-      <w:hyperlink r:id="rId40" w:anchor="text-tag-alpha" w:history="1">
+      <w:hyperlink r:id="rId42" w:anchor="text-tag-alpha" w:history="1">
         <w:r>
           <w:rPr>
             <w:rStyle w:val="Hipervnculo"/>

</xml_diff>

<commit_message>
<dev> re writting documentation
</commit_message>
<xml_diff>
--- a/Manual de desarrollo en Atlax Renpy.docx
+++ b/Manual de desarrollo en Atlax Renpy.docx
@@ -3644,10 +3644,10 @@
         </w:rPr>
         <w:lastRenderedPageBreak/>
         <w:drawing>
-          <wp:inline distT="0" distB="0" distL="0" distR="0" wp14:anchorId="0830AFF9" wp14:editId="067AB110">
-            <wp:extent cx="5400040" cy="3622675"/>
-            <wp:effectExtent l="0" t="0" r="0" b="0"/>
-            <wp:docPr id="937259897" name="Imagen 1"/>
+          <wp:inline distT="0" distB="0" distL="0" distR="0" wp14:anchorId="3493B6DB" wp14:editId="2AF38733">
+            <wp:extent cx="5400040" cy="5745480"/>
+            <wp:effectExtent l="0" t="0" r="0" b="7620"/>
+            <wp:docPr id="1682740595" name="Imagen 1"/>
             <wp:cNvGraphicFramePr>
               <a:graphicFrameLocks xmlns:a="http://schemas.openxmlformats.org/drawingml/2006/main" noChangeAspect="1"/>
             </wp:cNvGraphicFramePr>
@@ -3655,7 +3655,7 @@
               <a:graphicData uri="http://schemas.openxmlformats.org/drawingml/2006/picture">
                 <pic:pic xmlns:pic="http://schemas.openxmlformats.org/drawingml/2006/picture">
                   <pic:nvPicPr>
-                    <pic:cNvPr id="937259897" name=""/>
+                    <pic:cNvPr id="1682740595" name=""/>
                     <pic:cNvPicPr/>
                   </pic:nvPicPr>
                   <pic:blipFill>
@@ -3667,7 +3667,7 @@
                   <pic:spPr>
                     <a:xfrm>
                       <a:off x="0" y="0"/>
-                      <a:ext cx="5400040" cy="3622675"/>
+                      <a:ext cx="5400040" cy="5745480"/>
                     </a:xfrm>
                     <a:prstGeom prst="rect">
                       <a:avLst/>
@@ -3697,6 +3697,23 @@
       </w:r>
     </w:p>
     <w:p>
+      <w:r>
+        <w:tab/>
+      </w:r>
+      <w:r>
+        <w:t xml:space="preserve">Al momento de definir los idiomas es importante que recuerdes escribirlos todos de la misma forma, </w:t>
+      </w:r>
+      <w:r>
+        <w:t>ya que en otros sitios del motor haremos referencias a estos idiomas. En</w:t>
+      </w:r>
+      <w:r>
+        <w:t xml:space="preserve"> este caso </w:t>
+      </w:r>
+      <w:r>
+        <w:t>todos están escritos en minúscula.</w:t>
+      </w:r>
+    </w:p>
+    <w:p>
       <w:pPr>
         <w:rPr>
           <w:i/>
@@ -3705,24 +3722,7 @@
       </w:pPr>
       <w:r>
         <w:tab/>
-      </w:r>
-      <w:r>
-        <w:t xml:space="preserve">Al momento de definir los idiomas es importante que recuerdes escribirlos todos de la misma forma, </w:t>
-      </w:r>
-      <w:r>
-        <w:t>ya que en otros sitios</w:t>
-      </w:r>
-      <w:r>
-        <w:t xml:space="preserve"> del motor</w:t>
-      </w:r>
-      <w:r>
-        <w:t xml:space="preserve"> haremos referencias a estos </w:t>
-      </w:r>
-      <w:r>
-        <w:t>idiomas. En</w:t>
-      </w:r>
-      <w:r>
-        <w:t xml:space="preserve"> este caso todos empiezan con la inicial en mayúscula, </w:t>
+        <w:t>Es importante mencionar que el primer idioma que coloques será considerado el idioma por defecto.</w:t>
       </w:r>
     </w:p>
     <w:p>
@@ -3771,49 +3771,46 @@
         <w:t xml:space="preserve"> </w:t>
       </w:r>
       <w:r>
-        <w:t>escribiremos el nombre de la escena</w:t>
-      </w:r>
-    </w:p>
-    <w:p/>
-    <w:p>
-      <w:pPr>
-        <w:pStyle w:val="Ttulo2"/>
-      </w:pPr>
-      <w:r>
-        <w:t>Definición de personajes</w:t>
-      </w:r>
-    </w:p>
-    <w:p>
-      <w:r>
-        <w:tab/>
-        <w:t xml:space="preserve">Para definir a tus personajes, debes dirigirte al archivo </w:t>
+        <w:t xml:space="preserve">escribiremos </w:t>
+      </w:r>
+      <w:r>
+        <w:t>la ubicación y nombre d</w:t>
+      </w:r>
+      <w:r>
+        <w:t>el nombre de</w:t>
+      </w:r>
+      <w:r>
+        <w:t xml:space="preserve">l archivo de control o script personalizado desde la cual comenzará la novela. Por ejemplo si nuestra escena de inicio está ubicada en la carpeta </w:t>
       </w:r>
       <w:r>
         <w:rPr>
           <w:i/>
           <w:iCs/>
         </w:rPr>
-        <w:t>charactersDefine.rpy</w:t>
-      </w:r>
-      <w:r>
-        <w:t xml:space="preserve"> ubicado en la carpeta </w:t>
+        <w:t>intro</w:t>
+      </w:r>
+      <w:r>
+        <w:t xml:space="preserve"> y se llama </w:t>
       </w:r>
       <w:r>
         <w:rPr>
           <w:i/>
           <w:iCs/>
         </w:rPr>
-        <w:t>game</w:t>
+        <w:t>game_introduction.csv</w:t>
+      </w:r>
+      <w:r>
+        <w:t xml:space="preserve">, nuestro </w:t>
       </w:r>
       <w:r>
         <w:rPr>
           <w:i/>
           <w:iCs/>
         </w:rPr>
-        <w:t>/definitions</w:t>
-      </w:r>
-      <w:r>
-        <w:t>, si lo abres con Visual Studio, en su interior encontrarás algo así.</w:t>
+        <w:t>config.csv</w:t>
+      </w:r>
+      <w:r>
+        <w:t xml:space="preserve"> se vería así.</w:t>
       </w:r>
     </w:p>
     <w:p>
@@ -3821,12 +3818,11 @@
         <w:rPr>
           <w:noProof/>
         </w:rPr>
-        <w:lastRenderedPageBreak/>
         <w:drawing>
-          <wp:inline distT="0" distB="0" distL="0" distR="0" wp14:anchorId="10199E30" wp14:editId="41D662F7">
-            <wp:extent cx="4162425" cy="800100"/>
-            <wp:effectExtent l="0" t="0" r="9525" b="0"/>
-            <wp:docPr id="1684196513" name="Imagen 1"/>
+          <wp:inline distT="0" distB="0" distL="0" distR="0" wp14:anchorId="59BA811D" wp14:editId="20C183C6">
+            <wp:extent cx="5400040" cy="536575"/>
+            <wp:effectExtent l="0" t="0" r="0" b="0"/>
+            <wp:docPr id="814949175" name="Imagen 1"/>
             <wp:cNvGraphicFramePr>
               <a:graphicFrameLocks xmlns:a="http://schemas.openxmlformats.org/drawingml/2006/main" noChangeAspect="1"/>
             </wp:cNvGraphicFramePr>
@@ -3834,7 +3830,7 @@
               <a:graphicData uri="http://schemas.openxmlformats.org/drawingml/2006/picture">
                 <pic:pic xmlns:pic="http://schemas.openxmlformats.org/drawingml/2006/picture">
                   <pic:nvPicPr>
-                    <pic:cNvPr id="1684196513" name=""/>
+                    <pic:cNvPr id="814949175" name=""/>
                     <pic:cNvPicPr/>
                   </pic:nvPicPr>
                   <pic:blipFill>
@@ -3846,7 +3842,7 @@
                   <pic:spPr>
                     <a:xfrm>
                       <a:off x="0" y="0"/>
-                      <a:ext cx="4162425" cy="800100"/>
+                      <a:ext cx="5400040" cy="536575"/>
                     </a:xfrm>
                     <a:prstGeom prst="rect">
                       <a:avLst/>
@@ -3862,33 +3858,31 @@
     <w:p>
       <w:r>
         <w:tab/>
-        <w:t>Allí debes definir a los personajes de tu historia siguiendo con ese mismo patrón, es importante mencionar que en cuanto a nombres de personajes, se requiere usar siempre minúsculas</w:t>
-      </w:r>
-      <w:r>
-        <w:t xml:space="preserve"> y utilizar _ en vez de espacios. En cuanto al color que aparece allí, es el color del nombre del personaje que se mostrará en la caja de diálogo cuando este hable, ese color está en hexadecimal, si lo desconoces, es simplemente la representación de un color mediante un # y 6 dígitos, puedes usar herramientas como Paint o el sitio web </w:t>
-      </w:r>
-      <w:hyperlink r:id="rId12" w:history="1">
-        <w:r>
-          <w:rPr>
-            <w:rStyle w:val="Hipervnculo"/>
-          </w:rPr>
-          <w:t>https://htmlcolorcodes.com/es/</w:t>
-        </w:r>
-      </w:hyperlink>
-      <w:r>
-        <w:t xml:space="preserve"> para descubrir los códigos hexadecimales para el color que necesites.</w:t>
+        <w:t>Por otro lado</w:t>
+      </w:r>
+      <w:r>
+        <w:t>,</w:t>
+      </w:r>
+      <w:r>
+        <w:t xml:space="preserve"> si el inicio de nuestra novela es un script personalizado, colocaremos el nombre del label de nuestro script. Sin embargo, este asunto de los scripts personalizados será tratado más adelante con precisión.</w:t>
+      </w:r>
+    </w:p>
+    <w:p/>
+    <w:p>
+      <w:pPr>
+        <w:pStyle w:val="Ttulo2"/>
+      </w:pPr>
+      <w:r>
+        <w:t>Definición de personajes</w:t>
       </w:r>
     </w:p>
     <w:p>
       <w:r>
         <w:tab/>
-        <w:t xml:space="preserve">Si por ejemplo tu personaje se llama Katherine y quieres que su nombre aparezca en </w:t>
-      </w:r>
-      <w:r>
-        <w:t>color</w:t>
-      </w:r>
-      <w:r>
-        <w:t xml:space="preserve"> rosado, para definirlo tendrías que escribir la siguiente línea:</w:t>
+        <w:t>Para definir personajes utilizaremos el key “character” colocando en la columna Value1 el nombre clave del personaje y en Value2 el color que tendrá al momento de mostrar su nombre en el namebox en hexadecimal</w:t>
+      </w:r>
+      <w:r>
+        <w:t>.</w:t>
       </w:r>
     </w:p>
     <w:p>
@@ -3897,10 +3891,10 @@
           <w:noProof/>
         </w:rPr>
         <w:drawing>
-          <wp:inline distT="0" distB="0" distL="0" distR="0" wp14:anchorId="50F8D074" wp14:editId="7461D4F8">
-            <wp:extent cx="4619625" cy="371475"/>
-            <wp:effectExtent l="0" t="0" r="9525" b="9525"/>
-            <wp:docPr id="1697034935" name="Imagen 1"/>
+          <wp:inline distT="0" distB="0" distL="0" distR="0" wp14:anchorId="6E6D79DC" wp14:editId="78E8E375">
+            <wp:extent cx="5010150" cy="2600325"/>
+            <wp:effectExtent l="0" t="0" r="0" b="9525"/>
+            <wp:docPr id="427014048" name="Imagen 1"/>
             <wp:cNvGraphicFramePr>
               <a:graphicFrameLocks xmlns:a="http://schemas.openxmlformats.org/drawingml/2006/main" noChangeAspect="1"/>
             </wp:cNvGraphicFramePr>
@@ -3908,11 +3902,11 @@
               <a:graphicData uri="http://schemas.openxmlformats.org/drawingml/2006/picture">
                 <pic:pic xmlns:pic="http://schemas.openxmlformats.org/drawingml/2006/picture">
                   <pic:nvPicPr>
-                    <pic:cNvPr id="1697034935" name=""/>
+                    <pic:cNvPr id="427014048" name=""/>
                     <pic:cNvPicPr/>
                   </pic:nvPicPr>
                   <pic:blipFill>
-                    <a:blip r:embed="rId13"/>
+                    <a:blip r:embed="rId12"/>
                     <a:stretch>
                       <a:fillRect/>
                     </a:stretch>
@@ -3920,7 +3914,7 @@
                   <pic:spPr>
                     <a:xfrm>
                       <a:off x="0" y="0"/>
-                      <a:ext cx="4619625" cy="371475"/>
+                      <a:ext cx="5010150" cy="2600325"/>
                     </a:xfrm>
                     <a:prstGeom prst="rect">
                       <a:avLst/>
@@ -3933,55 +3927,58 @@
         </w:drawing>
       </w:r>
     </w:p>
-    <w:p>
-      <w:pPr>
-        <w:pStyle w:val="Ttulo2"/>
-      </w:pPr>
-      <w:r>
-        <w:t>Definición de fondos</w:t>
-      </w:r>
-    </w:p>
+    <w:p/>
     <w:p>
       <w:pPr>
         <w:ind w:firstLine="708"/>
       </w:pPr>
       <w:r>
-        <w:t xml:space="preserve">Los fondos son los escenarios que se muestran detrás de los personajes como por ejemplo un salón, un parque o un cielo estrellado, esta vez acudiremos al archivo </w:t>
-      </w:r>
-      <w:r>
-        <w:rPr>
-          <w:i/>
-          <w:iCs/>
-        </w:rPr>
-        <w:t>backgroundsDefine.rpy</w:t>
-      </w:r>
-      <w:r>
-        <w:t xml:space="preserve"> ubicado en la carpeta </w:t>
-      </w:r>
-      <w:r>
-        <w:rPr>
-          <w:i/>
-          <w:iCs/>
-        </w:rPr>
-        <w:t>game/definitions</w:t>
-      </w:r>
-      <w:r>
-        <w:t>, al abrirlo encontraremos algo así.</w:t>
-      </w:r>
-    </w:p>
-    <w:p>
-      <w:pPr>
-        <w:ind w:firstLine="708"/>
-      </w:pPr>
+        <w:t xml:space="preserve">Si desconoces completamente el término “hexadecimal” para referirse a colores, </w:t>
+      </w:r>
+      <w:r>
+        <w:t xml:space="preserve">es simplemente la representación de un color mediante un # y 6 dígitos, puedes usar herramientas como Paint o el sitio web </w:t>
+      </w:r>
+      <w:hyperlink r:id="rId13" w:history="1">
+        <w:r>
+          <w:rPr>
+            <w:rStyle w:val="Hipervnculo"/>
+          </w:rPr>
+          <w:t>https://htmlcolorcodes.com/es/</w:t>
+        </w:r>
+      </w:hyperlink>
+      <w:r>
+        <w:t xml:space="preserve"> para descubrir los códigos hexadecimales para el color que necesites.</w:t>
+      </w:r>
+    </w:p>
+    <w:p>
+      <w:r>
+        <w:lastRenderedPageBreak/>
+        <w:tab/>
+        <w:t xml:space="preserve">Si por ejemplo </w:t>
+      </w:r>
+      <w:r>
+        <w:t>un</w:t>
+      </w:r>
+      <w:r>
+        <w:t xml:space="preserve"> personaje se llama Katherine y quieres que su nombre aparezca en </w:t>
+      </w:r>
+      <w:r>
+        <w:t>color</w:t>
+      </w:r>
+      <w:r>
+        <w:t xml:space="preserve"> rosado, para definirlo tendrías que escribir la siguiente línea:</w:t>
+      </w:r>
+    </w:p>
+    <w:p>
       <w:r>
         <w:rPr>
           <w:noProof/>
         </w:rPr>
         <w:drawing>
-          <wp:inline distT="0" distB="0" distL="0" distR="0" wp14:anchorId="006DEA25" wp14:editId="13BC2BB7">
-            <wp:extent cx="4200525" cy="1581150"/>
-            <wp:effectExtent l="0" t="0" r="9525" b="0"/>
-            <wp:docPr id="2007377502" name="Imagen 1"/>
+          <wp:inline distT="0" distB="0" distL="0" distR="0" wp14:anchorId="04FC4D77" wp14:editId="5E3481EE">
+            <wp:extent cx="5219700" cy="476250"/>
+            <wp:effectExtent l="0" t="0" r="0" b="0"/>
+            <wp:docPr id="1035006697" name="Imagen 1"/>
             <wp:cNvGraphicFramePr>
               <a:graphicFrameLocks xmlns:a="http://schemas.openxmlformats.org/drawingml/2006/main" noChangeAspect="1"/>
             </wp:cNvGraphicFramePr>
@@ -3989,7 +3986,7 @@
               <a:graphicData uri="http://schemas.openxmlformats.org/drawingml/2006/picture">
                 <pic:pic xmlns:pic="http://schemas.openxmlformats.org/drawingml/2006/picture">
                   <pic:nvPicPr>
-                    <pic:cNvPr id="2007377502" name=""/>
+                    <pic:cNvPr id="1035006697" name=""/>
                     <pic:cNvPicPr/>
                   </pic:nvPicPr>
                   <pic:blipFill>
@@ -4001,7 +3998,7 @@
                   <pic:spPr>
                     <a:xfrm>
                       <a:off x="0" y="0"/>
-                      <a:ext cx="4200525" cy="1581150"/>
+                      <a:ext cx="5219700" cy="476250"/>
                     </a:xfrm>
                     <a:prstGeom prst="rect">
                       <a:avLst/>
@@ -4016,107 +4013,42 @@
     </w:p>
     <w:p>
       <w:pPr>
-        <w:ind w:firstLine="708"/>
-      </w:pPr>
-      <w:r>
-        <w:t>Los fondos se encuentran en la carpeta</w:t>
+        <w:rPr>
+          <w:noProof/>
+        </w:rPr>
+      </w:pPr>
+      <w:r>
+        <w:rPr>
+          <w:noProof/>
+        </w:rPr>
+        <w:tab/>
+        <w:t xml:space="preserve">¿Recuerdas que el archivo </w:t>
       </w:r>
       <w:r>
         <w:rPr>
           <w:i/>
           <w:iCs/>
-        </w:rPr>
-        <w:t xml:space="preserve"> game/images/backgrounds</w:t>
-      </w:r>
-      <w:r>
-        <w:t>, deben ser en formato .png y preferiblemente tener la misma resolución, el tamaño recomendado es 1920x1080</w:t>
-      </w:r>
-      <w:r>
-        <w:t>.</w:t>
-      </w:r>
-    </w:p>
-    <w:p>
-      <w:pPr>
-        <w:ind w:firstLine="708"/>
-      </w:pPr>
-      <w:r>
-        <w:t xml:space="preserve">Para agregar los fondos de nuestra novela, siguiendo el mismo formato debemos añadir otra línea y colocar </w:t>
-      </w:r>
-      <w:r>
-        <w:t xml:space="preserve">la imagen </w:t>
-      </w:r>
-      <w:r>
-        <w:t>en la respectiva carpeta, siempre sustituyendo los espacios vacíos por _</w:t>
-      </w:r>
-      <w:r>
-        <w:t>.</w:t>
-      </w:r>
-    </w:p>
-    <w:p>
-      <w:pPr>
-        <w:ind w:firstLine="708"/>
-      </w:pPr>
-      <w:r>
-        <w:t>Se recomienda no quitar los fondos flash y blackout ya que el motor los necesita para hacer algunas transiciones.</w:t>
-      </w:r>
-    </w:p>
-    <w:p>
-      <w:pPr>
-        <w:pStyle w:val="Ttulo2"/>
-      </w:pPr>
-      <w:r>
-        <w:lastRenderedPageBreak/>
-        <w:t>Definición de idiomas</w:t>
-      </w:r>
-    </w:p>
-    <w:p>
-      <w:r>
-        <w:tab/>
-        <w:t>Atlax Renpy soporta diversos idiomas, sin embargo</w:t>
-      </w:r>
-      <w:r>
-        <w:t>,</w:t>
-      </w:r>
-      <w:r>
-        <w:t xml:space="preserve"> debemos definir cuáles lenguajes soporta y mantener siempre el orden en el que están escritos ya que será importante para los archivos de control. Estas definiciones podemos encontrarlas en el </w:t>
-      </w:r>
-      <w:r>
-        <w:t xml:space="preserve">archivo </w:t>
-      </w:r>
-      <w:r>
-        <w:rPr>
-          <w:i/>
-          <w:iCs/>
-        </w:rPr>
-        <w:t>languageDefine.rpy</w:t>
-      </w:r>
-      <w:r>
-        <w:t xml:space="preserve"> ubicado en la carpeta </w:t>
-      </w:r>
-      <w:r>
-        <w:rPr>
-          <w:i/>
-          <w:iCs/>
-        </w:rPr>
-        <w:t>game/definitions</w:t>
-      </w:r>
-      <w:r>
-        <w:t>. Allí encontraremos algo así.</w:t>
-      </w:r>
-    </w:p>
-    <w:p>
-      <w:r>
-        <w:tab/>
-      </w:r>
-      <w:r>
-        <w:rPr>
           <w:noProof/>
         </w:rPr>
+        <w:t>config.csv</w:t>
+      </w:r>
+      <w:r>
+        <w:rPr>
+          <w:noProof/>
+        </w:rPr>
+        <w:t xml:space="preserve"> tiene varias columnas detallando los posibles idiomas de la novela? Cuando defines a un personaje debes definir cómo se escribirá su nombre en pantalla dependiendo del idioma.</w:t>
+      </w:r>
+    </w:p>
+    <w:p>
+      <w:r>
+        <w:rPr>
+          <w:noProof/>
+        </w:rPr>
         <w:drawing>
-          <wp:inline distT="0" distB="0" distL="0" distR="0" wp14:anchorId="044C0805" wp14:editId="73DC4C3B">
-            <wp:extent cx="2905125" cy="561975"/>
-            <wp:effectExtent l="0" t="0" r="9525" b="9525"/>
-            <wp:docPr id="361237427" name="Imagen 1"/>
+          <wp:inline distT="0" distB="0" distL="0" distR="0" wp14:anchorId="376B1191" wp14:editId="33F2174D">
+            <wp:extent cx="5400040" cy="239395"/>
+            <wp:effectExtent l="0" t="0" r="0" b="8255"/>
+            <wp:docPr id="1295631050" name="Imagen 1"/>
             <wp:cNvGraphicFramePr>
               <a:graphicFrameLocks xmlns:a="http://schemas.openxmlformats.org/drawingml/2006/main" noChangeAspect="1"/>
             </wp:cNvGraphicFramePr>
@@ -4124,7 +4056,7 @@
               <a:graphicData uri="http://schemas.openxmlformats.org/drawingml/2006/picture">
                 <pic:pic xmlns:pic="http://schemas.openxmlformats.org/drawingml/2006/picture">
                   <pic:nvPicPr>
-                    <pic:cNvPr id="361237427" name=""/>
+                    <pic:cNvPr id="1295631050" name=""/>
                     <pic:cNvPicPr/>
                   </pic:nvPicPr>
                   <pic:blipFill>
@@ -4136,7 +4068,7 @@
                   <pic:spPr>
                     <a:xfrm>
                       <a:off x="0" y="0"/>
-                      <a:ext cx="2905125" cy="561975"/>
+                      <a:ext cx="5400040" cy="239395"/>
                     </a:xfrm>
                     <a:prstGeom prst="rect">
                       <a:avLst/>
@@ -4152,10 +4084,27 @@
     <w:p>
       <w:r>
         <w:tab/>
-        <w:t>currentLanguage es el idioma por defecto que usará el motor al abrir el juego, este puede ser cambiado en la configuración del juego mismo. La otra variable llamada allLanguages, lista todos los lenguajes que soporte tu historia</w:t>
-      </w:r>
-      <w:r>
-        <w:t>, se recuerda que es de fundamental importancia respetar el orden de estos lenguajes. En caso de que queramos agregar más lenguajes lo haríamos de la siguiente forma.</w:t>
+        <w:t>En este ejemplo tenemos un personaje con el nombre clave “tableman”, el código hexadecimal #ffffff corresponde al color blanco y luego tenemos las distintas variaciones de nombre dependiendo del idioma, en español, inglés, chino y portugués respectivamente.</w:t>
+      </w:r>
+    </w:p>
+    <w:p>
+      <w:r>
+        <w:tab/>
+      </w:r>
+      <w:r>
+        <w:t>En pocas palabras, siempre que un personaje hable al menos una vez en tu novela, debes definirlo aquí.</w:t>
+      </w:r>
+    </w:p>
+    <w:p>
+      <w:r>
+        <w:tab/>
+        <w:t>Por supuesto no todos los personajes tendrán variaciones de nombre acorde al idioma, si un personaje tiene el nombre de Katherine, ella debería llamarse así en todos los idiomas, por lo cual solo necesitas colocar su nombre una sola vez en la primera casilla de idioma</w:t>
+      </w:r>
+      <w:r>
+        <w:t xml:space="preserve"> de la siguiente forma</w:t>
+      </w:r>
+      <w:r>
+        <w:t>.</w:t>
       </w:r>
     </w:p>
     <w:p>
@@ -4164,10 +4113,10 @@
           <w:noProof/>
         </w:rPr>
         <w:drawing>
-          <wp:inline distT="0" distB="0" distL="0" distR="0" wp14:anchorId="61BC9EC5" wp14:editId="1C23CCE7">
-            <wp:extent cx="5181600" cy="228600"/>
-            <wp:effectExtent l="0" t="0" r="0" b="0"/>
-            <wp:docPr id="819092751" name="Imagen 1"/>
+          <wp:inline distT="0" distB="0" distL="0" distR="0" wp14:anchorId="1E1ABA1D" wp14:editId="494CE3FB">
+            <wp:extent cx="5400040" cy="379095"/>
+            <wp:effectExtent l="0" t="0" r="0" b="1905"/>
+            <wp:docPr id="1583683525" name="Imagen 1"/>
             <wp:cNvGraphicFramePr>
               <a:graphicFrameLocks xmlns:a="http://schemas.openxmlformats.org/drawingml/2006/main" noChangeAspect="1"/>
             </wp:cNvGraphicFramePr>
@@ -4175,7 +4124,7 @@
               <a:graphicData uri="http://schemas.openxmlformats.org/drawingml/2006/picture">
                 <pic:pic xmlns:pic="http://schemas.openxmlformats.org/drawingml/2006/picture">
                   <pic:nvPicPr>
-                    <pic:cNvPr id="819092751" name=""/>
+                    <pic:cNvPr id="1583683525" name=""/>
                     <pic:cNvPicPr/>
                   </pic:nvPicPr>
                   <pic:blipFill>
@@ -4187,7 +4136,7 @@
                   <pic:spPr>
                     <a:xfrm>
                       <a:off x="0" y="0"/>
-                      <a:ext cx="5181600" cy="228600"/>
+                      <a:ext cx="5400040" cy="379095"/>
                     </a:xfrm>
                     <a:prstGeom prst="rect">
                       <a:avLst/>
@@ -4203,47 +4152,13 @@
     <w:p>
       <w:r>
         <w:tab/>
-        <w:t>Se recuerda nuevamente que se debe mantener el orden y la manera exacta en la que están escritos.</w:t>
-      </w:r>
-    </w:p>
-    <w:p>
-      <w:pPr>
-        <w:pStyle w:val="Ttulo2"/>
-      </w:pPr>
-      <w:r>
-        <w:t>Definición de configuraciones técnicas</w:t>
+        <w:t>Al hacer eso, independientemente del idioma, cuando hagas referencia a Katherine, siempre mostrará su nombre “Katherine”.</w:t>
       </w:r>
     </w:p>
     <w:p>
       <w:r>
         <w:tab/>
-        <w:t xml:space="preserve">Si eres un escritor puedes saltarte esta sección. En caso de que quieras cambiar previamente algunos de </w:t>
-      </w:r>
-      <w:r>
-        <w:t>l</w:t>
-      </w:r>
-      <w:r>
-        <w:t xml:space="preserve">os valores predeterminados de Renpy puedes hacerlo en el archivo </w:t>
-      </w:r>
-      <w:r>
-        <w:rPr>
-          <w:i/>
-          <w:iCs/>
-        </w:rPr>
-        <w:t>configDefine.rpy</w:t>
-      </w:r>
-      <w:r>
-        <w:t xml:space="preserve"> ubicado en la carpeta </w:t>
-      </w:r>
-      <w:r>
-        <w:rPr>
-          <w:i/>
-          <w:iCs/>
-        </w:rPr>
-        <w:t>game/definitions.</w:t>
-      </w:r>
-      <w:r>
-        <w:t xml:space="preserve"> Allí encontrarás algo así.</w:t>
+        <w:t>De todas formas, si el personaje tiene una variación en un idioma específico como por ejemplo en chino, solo debes colocar su traducción en la columna del idioma chino.</w:t>
       </w:r>
     </w:p>
     <w:p>
@@ -4252,10 +4167,10 @@
           <w:noProof/>
         </w:rPr>
         <w:drawing>
-          <wp:inline distT="0" distB="0" distL="0" distR="0" wp14:anchorId="6E2605BB" wp14:editId="43B6CC45">
-            <wp:extent cx="5248275" cy="495300"/>
-            <wp:effectExtent l="0" t="0" r="9525" b="0"/>
-            <wp:docPr id="2119835003" name="Imagen 1"/>
+          <wp:inline distT="0" distB="0" distL="0" distR="0" wp14:anchorId="2C8A9C55" wp14:editId="67BF58F2">
+            <wp:extent cx="5400040" cy="264160"/>
+            <wp:effectExtent l="0" t="0" r="0" b="2540"/>
+            <wp:docPr id="1264398120" name="Imagen 1"/>
             <wp:cNvGraphicFramePr>
               <a:graphicFrameLocks xmlns:a="http://schemas.openxmlformats.org/drawingml/2006/main" noChangeAspect="1"/>
             </wp:cNvGraphicFramePr>
@@ -4263,7 +4178,7 @@
               <a:graphicData uri="http://schemas.openxmlformats.org/drawingml/2006/picture">
                 <pic:pic xmlns:pic="http://schemas.openxmlformats.org/drawingml/2006/picture">
                   <pic:nvPicPr>
-                    <pic:cNvPr id="2119835003" name=""/>
+                    <pic:cNvPr id="1264398120" name=""/>
                     <pic:cNvPicPr/>
                   </pic:nvPicPr>
                   <pic:blipFill>
@@ -4275,7 +4190,7 @@
                   <pic:spPr>
                     <a:xfrm>
                       <a:off x="0" y="0"/>
-                      <a:ext cx="5248275" cy="495300"/>
+                      <a:ext cx="5400040" cy="264160"/>
                     </a:xfrm>
                     <a:prstGeom prst="rect">
                       <a:avLst/>
@@ -4291,74 +4206,74 @@
     <w:p>
       <w:r>
         <w:tab/>
-        <w:t>Por defecto Atlax Renpy utiliza esas configuraciones allí mostradas, establece el tiempo de fadeout de las canciones a 3 segundos y define los layers. Si tienes conocimientos sobre Renpy y necesitas establecer alguna configuración específica debes hacerlo ahí.</w:t>
-      </w:r>
-    </w:p>
-    <w:p>
-      <w:r>
-        <w:tab/>
-        <w:t>Con las configuraciones ya definidas, ahora sí podemos proceder con la estructura y elaboración de los archivos de control.</w:t>
-      </w:r>
-    </w:p>
-    <w:p>
-      <w:pPr>
-        <w:pStyle w:val="Ttulo1"/>
-      </w:pPr>
-      <w:bookmarkStart w:id="5" w:name="_Toc199261558"/>
-      <w:r>
-        <w:t>Archivo</w:t>
-      </w:r>
-      <w:r>
-        <w:t>s</w:t>
-      </w:r>
-      <w:r>
-        <w:t xml:space="preserve"> de control</w:t>
-      </w:r>
-      <w:bookmarkEnd w:id="5"/>
-    </w:p>
-    <w:p>
-      <w:r>
-        <w:tab/>
-        <w:t xml:space="preserve">Un archivo de control representa literalmente una escena en su totalidad, su contenido consiste en múltiples diálogos representados en líneas </w:t>
-      </w:r>
-      <w:r>
-        <w:t xml:space="preserve">de </w:t>
-      </w:r>
-      <w:r>
-        <w:t>texto estructurado y ordenado. El formato de estos archivos es .CSV, es decir, un archivo separado por comas, específicamente por puntos y comas.</w:t>
-      </w:r>
-      <w:r>
-        <w:t xml:space="preserve"> Si bien es cierto que este tipo de archivo se puede </w:t>
-      </w:r>
+        <w:t>Tomando como ejemplo la imagen anterior, si el juego estuviese en inglés, como la variación de Katherine en inglés no existe, mostrará el nombre del idioma por defecto.</w:t>
+      </w:r>
+    </w:p>
+    <w:p>
+      <w:pPr>
+        <w:pStyle w:val="Ttulo2"/>
+      </w:pPr>
+      <w:r>
+        <w:t>Definición de fondos</w:t>
+      </w:r>
+    </w:p>
+    <w:p>
+      <w:pPr>
+        <w:ind w:firstLine="708"/>
+      </w:pPr>
+      <w:r>
+        <w:t>Los fondos son los escenarios que se muestran detrás de los personajes como por ejemplo un salón, un parque o un cielo estrellado</w:t>
+      </w:r>
+      <w:r>
+        <w:t>.</w:t>
+      </w:r>
+    </w:p>
+    <w:p>
+      <w:pPr>
+        <w:ind w:firstLine="708"/>
+      </w:pPr>
+      <w:r>
+        <w:t>Los fondos se encuentran en la carpeta</w:t>
+      </w:r>
+      <w:r>
+        <w:rPr>
+          <w:i/>
+          <w:iCs/>
+        </w:rPr>
+        <w:t xml:space="preserve"> game/images/backgrounds</w:t>
+      </w:r>
+      <w:r>
+        <w:t>, deben ser en formato .png y preferiblemente tener la misma resolución, el tamaño recomendado es 1920x1080</w:t>
+      </w:r>
+      <w:r>
+        <w:t>.</w:t>
+      </w:r>
+    </w:p>
+    <w:p>
+      <w:pPr>
+        <w:ind w:firstLine="708"/>
+      </w:pPr>
       <w:r>
         <w:lastRenderedPageBreak/>
-        <w:t>abrir con bloc de notas, se recomienda encarecidamente utilizar Microsoft Excel para mayor comodidad.</w:t>
-      </w:r>
-    </w:p>
-    <w:p>
-      <w:r>
-        <w:tab/>
-        <w:t>Crear un archivo de control es muy sencillo, tenemos dos formas de hacerlo, la forma “complicada” es creando un archivo de texto en nuestro computador y colocarle al final .csv, llamémoslo “ejemplo.csv”. Es posible que al abrirlo se ejecute el bloc de notas, para ello tenemos que ir a la configuración de nuestro sistema operativo para que nos permita ver las extensiones o formatos de los archivos, una vez cambiado debemos cambiar “.txt” por “.csv”.</w:t>
-      </w:r>
-    </w:p>
-    <w:p>
+        <w:t>Para agregar los fondos de nuestra novela, siguiendo el mismo formato</w:t>
+      </w:r>
+      <w:r>
+        <w:t>, esta vez usando el key “background” definiremos un fondo. En este caso solo tendremos que escribir el nombre del archivo .png.</w:t>
+      </w:r>
+    </w:p>
+    <w:p>
+      <w:pPr>
+        <w:ind w:firstLine="708"/>
+      </w:pPr>
       <w:r>
         <w:rPr>
           <w:noProof/>
         </w:rPr>
         <w:drawing>
-          <wp:anchor distT="0" distB="0" distL="114300" distR="114300" simplePos="0" relativeHeight="251658240" behindDoc="0" locked="0" layoutInCell="1" allowOverlap="1" wp14:anchorId="698E50CD" wp14:editId="37E85077">
-            <wp:simplePos x="0" y="0"/>
-            <wp:positionH relativeFrom="margin">
-              <wp:posOffset>-605155</wp:posOffset>
-            </wp:positionH>
-            <wp:positionV relativeFrom="margin">
-              <wp:posOffset>1224915</wp:posOffset>
-            </wp:positionV>
-            <wp:extent cx="6532245" cy="3914775"/>
-            <wp:effectExtent l="0" t="0" r="1905" b="9525"/>
-            <wp:wrapSquare wrapText="bothSides"/>
-            <wp:docPr id="430674590" name="Imagen 1"/>
+          <wp:inline distT="0" distB="0" distL="0" distR="0" wp14:anchorId="37A2F863" wp14:editId="021FC39D">
+            <wp:extent cx="4219575" cy="6905625"/>
+            <wp:effectExtent l="0" t="0" r="9525" b="9525"/>
+            <wp:docPr id="837284710" name="Imagen 1"/>
             <wp:cNvGraphicFramePr>
               <a:graphicFrameLocks xmlns:a="http://schemas.openxmlformats.org/drawingml/2006/main" noChangeAspect="1"/>
             </wp:cNvGraphicFramePr>
@@ -4366,11 +4281,282 @@
               <a:graphicData uri="http://schemas.openxmlformats.org/drawingml/2006/picture">
                 <pic:pic xmlns:pic="http://schemas.openxmlformats.org/drawingml/2006/picture">
                   <pic:nvPicPr>
-                    <pic:cNvPr id="430674590" name=""/>
+                    <pic:cNvPr id="837284710" name=""/>
                     <pic:cNvPicPr/>
                   </pic:nvPicPr>
                   <pic:blipFill>
-                    <a:blip r:embed="rId18">
+                    <a:blip r:embed="rId18"/>
+                    <a:stretch>
+                      <a:fillRect/>
+                    </a:stretch>
+                  </pic:blipFill>
+                  <pic:spPr>
+                    <a:xfrm>
+                      <a:off x="0" y="0"/>
+                      <a:ext cx="4219575" cy="6905625"/>
+                    </a:xfrm>
+                    <a:prstGeom prst="rect">
+                      <a:avLst/>
+                    </a:prstGeom>
+                  </pic:spPr>
+                </pic:pic>
+              </a:graphicData>
+            </a:graphic>
+          </wp:inline>
+        </w:drawing>
+      </w:r>
+    </w:p>
+    <w:p>
+      <w:pPr>
+        <w:ind w:firstLine="708"/>
+      </w:pPr>
+      <w:r>
+        <w:t>Se recomienda no quitar los fondos flash y blackout ya que el motor los necesita para hacer algunas transiciones.</w:t>
+      </w:r>
+    </w:p>
+    <w:p>
+      <w:pPr>
+        <w:pStyle w:val="Ttulo2"/>
+      </w:pPr>
+      <w:r>
+        <w:lastRenderedPageBreak/>
+        <w:t>Configuraciones de rutas de archivos</w:t>
+      </w:r>
+    </w:p>
+    <w:p>
+      <w:r>
+        <w:tab/>
+        <w:t>En esta sección se definen las distintas rutas de las carpetas que contendrán los sprites, fondos, musicas, sonidos y escenas. Si bien se pueden modificar para tener tu propia estructura de proyecto, lo recomendable es dejarlo tal cual.</w:t>
+      </w:r>
+    </w:p>
+    <w:p>
+      <w:r>
+        <w:rPr>
+          <w:noProof/>
+        </w:rPr>
+        <w:drawing>
+          <wp:inline distT="0" distB="0" distL="0" distR="0" wp14:anchorId="3E52944A" wp14:editId="2083916C">
+            <wp:extent cx="5400040" cy="2806700"/>
+            <wp:effectExtent l="0" t="0" r="0" b="0"/>
+            <wp:docPr id="1349799865" name="Imagen 1"/>
+            <wp:cNvGraphicFramePr>
+              <a:graphicFrameLocks xmlns:a="http://schemas.openxmlformats.org/drawingml/2006/main" noChangeAspect="1"/>
+            </wp:cNvGraphicFramePr>
+            <a:graphic xmlns:a="http://schemas.openxmlformats.org/drawingml/2006/main">
+              <a:graphicData uri="http://schemas.openxmlformats.org/drawingml/2006/picture">
+                <pic:pic xmlns:pic="http://schemas.openxmlformats.org/drawingml/2006/picture">
+                  <pic:nvPicPr>
+                    <pic:cNvPr id="1349799865" name=""/>
+                    <pic:cNvPicPr/>
+                  </pic:nvPicPr>
+                  <pic:blipFill>
+                    <a:blip r:embed="rId19"/>
+                    <a:stretch>
+                      <a:fillRect/>
+                    </a:stretch>
+                  </pic:blipFill>
+                  <pic:spPr>
+                    <a:xfrm>
+                      <a:off x="0" y="0"/>
+                      <a:ext cx="5400040" cy="2806700"/>
+                    </a:xfrm>
+                    <a:prstGeom prst="rect">
+                      <a:avLst/>
+                    </a:prstGeom>
+                  </pic:spPr>
+                </pic:pic>
+              </a:graphicData>
+            </a:graphic>
+          </wp:inline>
+        </w:drawing>
+      </w:r>
+    </w:p>
+    <w:p>
+      <w:pPr>
+        <w:pStyle w:val="Ttulo2"/>
+      </w:pPr>
+      <w:r>
+        <w:t>Definición de configuraciones técnicas</w:t>
+      </w:r>
+    </w:p>
+    <w:p>
+      <w:r>
+        <w:tab/>
+        <w:t xml:space="preserve">Si eres un escritor puedes saltarte esta sección. En caso de que quieras cambiar previamente algunos de </w:t>
+      </w:r>
+      <w:r>
+        <w:t>l</w:t>
+      </w:r>
+      <w:r>
+        <w:t xml:space="preserve">os valores predeterminados de Renpy puedes hacerlo en el archivo </w:t>
+      </w:r>
+      <w:r>
+        <w:rPr>
+          <w:i/>
+          <w:iCs/>
+        </w:rPr>
+        <w:t>configDefine.rpy</w:t>
+      </w:r>
+      <w:r>
+        <w:t xml:space="preserve"> ubicado en la carpeta </w:t>
+      </w:r>
+      <w:r>
+        <w:rPr>
+          <w:i/>
+          <w:iCs/>
+        </w:rPr>
+        <w:t>game/definitions.</w:t>
+      </w:r>
+      <w:r>
+        <w:t xml:space="preserve"> Allí </w:t>
+      </w:r>
+      <w:r>
+        <w:t>podrás definir todas las configuraciones extras que quieras realizar en renpy.</w:t>
+      </w:r>
+    </w:p>
+    <w:p>
+      <w:r>
+        <w:tab/>
+        <w:t>Por defecto Atlax Renpy centra la caja de texto con el nombre del emisor entre otras configuraciones. Este es un archivo propio de renpy con el formato .rpy, por lo tanto lo recomendable es abrirlo con un editor de texto como Visual Studio Code o bloc de notas.</w:t>
+      </w:r>
+    </w:p>
+    <w:p>
+      <w:pPr>
+        <w:ind w:firstLine="708"/>
+      </w:pPr>
+      <w:r>
+        <w:t>Dentro encontrarás algo similar a esto.</w:t>
+      </w:r>
+    </w:p>
+    <w:p>
+      <w:pPr>
+        <w:ind w:firstLine="708"/>
+      </w:pPr>
+      <w:r>
+        <w:rPr>
+          <w:noProof/>
+        </w:rPr>
+        <w:drawing>
+          <wp:inline distT="0" distB="0" distL="0" distR="0" wp14:anchorId="480047DD" wp14:editId="59C9A900">
+            <wp:extent cx="5400040" cy="1911985"/>
+            <wp:effectExtent l="0" t="0" r="0" b="0"/>
+            <wp:docPr id="1422276432" name="Imagen 1"/>
+            <wp:cNvGraphicFramePr>
+              <a:graphicFrameLocks xmlns:a="http://schemas.openxmlformats.org/drawingml/2006/main" noChangeAspect="1"/>
+            </wp:cNvGraphicFramePr>
+            <a:graphic xmlns:a="http://schemas.openxmlformats.org/drawingml/2006/main">
+              <a:graphicData uri="http://schemas.openxmlformats.org/drawingml/2006/picture">
+                <pic:pic xmlns:pic="http://schemas.openxmlformats.org/drawingml/2006/picture">
+                  <pic:nvPicPr>
+                    <pic:cNvPr id="1422276432" name=""/>
+                    <pic:cNvPicPr/>
+                  </pic:nvPicPr>
+                  <pic:blipFill>
+                    <a:blip r:embed="rId20"/>
+                    <a:stretch>
+                      <a:fillRect/>
+                    </a:stretch>
+                  </pic:blipFill>
+                  <pic:spPr>
+                    <a:xfrm>
+                      <a:off x="0" y="0"/>
+                      <a:ext cx="5400040" cy="1911985"/>
+                    </a:xfrm>
+                    <a:prstGeom prst="rect">
+                      <a:avLst/>
+                    </a:prstGeom>
+                  </pic:spPr>
+                </pic:pic>
+              </a:graphicData>
+            </a:graphic>
+          </wp:inline>
+        </w:drawing>
+      </w:r>
+    </w:p>
+    <w:p>
+      <w:pPr>
+        <w:pStyle w:val="Ttulo1"/>
+      </w:pPr>
+      <w:bookmarkStart w:id="5" w:name="_Toc199261558"/>
+      <w:r>
+        <w:lastRenderedPageBreak/>
+        <w:t>Archivo</w:t>
+      </w:r>
+      <w:r>
+        <w:t>s</w:t>
+      </w:r>
+      <w:r>
+        <w:t xml:space="preserve"> de control</w:t>
+      </w:r>
+      <w:bookmarkEnd w:id="5"/>
+    </w:p>
+    <w:p>
+      <w:r>
+        <w:tab/>
+        <w:t xml:space="preserve">Un archivo de control representa literalmente una escena en su totalidad, su contenido consiste en múltiples diálogos representados en líneas </w:t>
+      </w:r>
+      <w:r>
+        <w:t xml:space="preserve">de </w:t>
+      </w:r>
+      <w:r>
+        <w:t>texto estructurado y ordenado. El formato de estos archivos es .CSV, es decir, un archivo separado por comas, específicamente por puntos y comas.</w:t>
+      </w:r>
+      <w:r>
+        <w:t xml:space="preserve"> Si bien es cierto que este tipo de archivo se puede abrir con bloc de notas, se recomienda encarecidamente utilizar Microsoft Excel para mayor comodidad.</w:t>
+      </w:r>
+    </w:p>
+    <w:p>
+      <w:r>
+        <w:tab/>
+        <w:t xml:space="preserve">Por defecto estos archivos deben ser guardados en la carpeta </w:t>
+      </w:r>
+      <w:r>
+        <w:rPr>
+          <w:i/>
+          <w:iCs/>
+        </w:rPr>
+        <w:t>scenes</w:t>
+      </w:r>
+      <w:r>
+        <w:t>.</w:t>
+      </w:r>
+    </w:p>
+    <w:p>
+      <w:r>
+        <w:tab/>
+        <w:t>Crear un archivo de control es muy sencillo, tenemos dos formas de hacerlo, la forma “complicada” es creando un archivo de texto en nuestro computador y colocarle al final .csv, llamémoslo “ejemplo.csv”. Es posible que al abrirlo se ejecute el bloc de notas, para ello tenemos que ir a la configuración de nuestro sistema operativo para que nos permita ver las extensiones o formatos de los archivos, una vez cambiado debemos cambiar “.txt” por “.csv”.</w:t>
+      </w:r>
+    </w:p>
+    <w:p>
+      <w:r>
+        <w:rPr>
+          <w:noProof/>
+        </w:rPr>
+        <w:drawing>
+          <wp:anchor distT="0" distB="0" distL="114300" distR="114300" simplePos="0" relativeHeight="251664384" behindDoc="0" locked="0" layoutInCell="1" allowOverlap="1" wp14:anchorId="2CC1E109" wp14:editId="719FFC7E">
+            <wp:simplePos x="0" y="0"/>
+            <wp:positionH relativeFrom="margin">
+              <wp:posOffset>-363220</wp:posOffset>
+            </wp:positionH>
+            <wp:positionV relativeFrom="margin">
+              <wp:posOffset>3850005</wp:posOffset>
+            </wp:positionV>
+            <wp:extent cx="6143625" cy="4603750"/>
+            <wp:effectExtent l="0" t="0" r="9525" b="6350"/>
+            <wp:wrapSquare wrapText="bothSides"/>
+            <wp:docPr id="1184477832" name="Imagen 1"/>
+            <wp:cNvGraphicFramePr>
+              <a:graphicFrameLocks xmlns:a="http://schemas.openxmlformats.org/drawingml/2006/main" noChangeAspect="1"/>
+            </wp:cNvGraphicFramePr>
+            <a:graphic xmlns:a="http://schemas.openxmlformats.org/drawingml/2006/main">
+              <a:graphicData uri="http://schemas.openxmlformats.org/drawingml/2006/picture">
+                <pic:pic xmlns:pic="http://schemas.openxmlformats.org/drawingml/2006/picture">
+                  <pic:nvPicPr>
+                    <pic:cNvPr id="1184477832" name=""/>
+                    <pic:cNvPicPr/>
+                  </pic:nvPicPr>
+                  <pic:blipFill>
+                    <a:blip r:embed="rId21">
                       <a:extLst>
                         <a:ext uri="{28A0092B-C50C-407E-A947-70E740481C1C}">
                           <a14:useLocalDpi xmlns:a14="http://schemas.microsoft.com/office/drawing/2010/main" val="0"/>
@@ -4384,7 +4570,7 @@
                   <pic:spPr>
                     <a:xfrm>
                       <a:off x="0" y="0"/>
-                      <a:ext cx="6532245" cy="3914775"/>
+                      <a:ext cx="6143625" cy="4603750"/>
                     </a:xfrm>
                     <a:prstGeom prst="rect">
                       <a:avLst/>
@@ -4413,35 +4599,65 @@
         <w:t xml:space="preserve"> escoger</w:t>
       </w:r>
       <w:r>
-        <w:t xml:space="preserve"> CSV.</w:t>
-      </w:r>
-    </w:p>
-    <w:p>
-      <w:r>
+        <w:t xml:space="preserve"> CSV</w:t>
+      </w:r>
+      <w:r>
+        <w:t xml:space="preserve"> UTF-8</w:t>
+      </w:r>
+      <w:r>
+        <w:t>.</w:t>
+      </w:r>
+    </w:p>
+    <w:p/>
+    <w:p>
+      <w:r>
+        <w:lastRenderedPageBreak/>
         <w:tab/>
         <w:t>Si tienes dudas puedes optar por simplemente copiar y pegar alguno de los archivos de control de ejemplo que proporciona Atlax Renpy, borrar su contenido y empezar desde allí.</w:t>
       </w:r>
     </w:p>
-    <w:p/>
     <w:p>
       <w:pPr>
         <w:ind w:firstLine="708"/>
       </w:pPr>
       <w:r>
+        <w:t>Guardas el archivo y listo, sin embargo</w:t>
+      </w:r>
+      <w:r>
+        <w:t>,</w:t>
+      </w:r>
+      <w:r>
+        <w:t xml:space="preserve"> se recomienda escribir cualquier cosa en su contenido y luego abrir el archivo usando bloc de notas para asegurarte de que las columnas se estén separando por puntos y comas</w:t>
+      </w:r>
+      <w:r>
+        <w:t>.</w:t>
+      </w:r>
+      <w:r>
+        <w:t xml:space="preserve"> Si no lo están, cambia la coma por un punto y coma y listo.</w:t>
+      </w:r>
+      <w:r>
+        <w:t xml:space="preserve"> </w:t>
+      </w:r>
+    </w:p>
+    <w:p>
+      <w:pPr>
+        <w:ind w:firstLine="708"/>
+      </w:pPr>
+      <w:r>
         <w:rPr>
           <w:noProof/>
         </w:rPr>
         <w:drawing>
-          <wp:anchor distT="0" distB="0" distL="114300" distR="114300" simplePos="0" relativeHeight="251659264" behindDoc="0" locked="0" layoutInCell="1" allowOverlap="1" wp14:anchorId="77406FC3" wp14:editId="4FD82AC0">
+          <wp:anchor distT="0" distB="0" distL="114300" distR="114300" simplePos="0" relativeHeight="251659264" behindDoc="0" locked="0" layoutInCell="1" allowOverlap="1" wp14:anchorId="77406FC3" wp14:editId="5F2FA5A3">
             <wp:simplePos x="0" y="0"/>
             <wp:positionH relativeFrom="margin">
-              <wp:posOffset>-33655</wp:posOffset>
+              <wp:posOffset>3206115</wp:posOffset>
             </wp:positionH>
             <wp:positionV relativeFrom="margin">
-              <wp:posOffset>7170420</wp:posOffset>
+              <wp:posOffset>1932305</wp:posOffset>
             </wp:positionV>
-            <wp:extent cx="1990725" cy="771525"/>
-            <wp:effectExtent l="0" t="0" r="9525" b="9525"/>
+            <wp:extent cx="2604770" cy="1009650"/>
+            <wp:effectExtent l="0" t="0" r="5080" b="0"/>
             <wp:wrapSquare wrapText="bothSides"/>
             <wp:docPr id="1120302398" name="Imagen 1"/>
             <wp:cNvGraphicFramePr>
@@ -4455,7 +4671,7 @@
                     <pic:cNvPicPr/>
                   </pic:nvPicPr>
                   <pic:blipFill>
-                    <a:blip r:embed="rId19">
+                    <a:blip r:embed="rId22">
                       <a:extLst>
                         <a:ext uri="{28A0092B-C50C-407E-A947-70E740481C1C}">
                           <a14:useLocalDpi xmlns:a14="http://schemas.microsoft.com/office/drawing/2010/main" val="0"/>
@@ -4469,7 +4685,7 @@
                   <pic:spPr>
                     <a:xfrm>
                       <a:off x="0" y="0"/>
-                      <a:ext cx="1990725" cy="771525"/>
+                      <a:ext cx="2604770" cy="1009650"/>
                     </a:xfrm>
                     <a:prstGeom prst="rect">
                       <a:avLst/>
@@ -4478,6 +4694,12 @@
                 </pic:pic>
               </a:graphicData>
             </a:graphic>
+            <wp14:sizeRelH relativeFrom="margin">
+              <wp14:pctWidth>0</wp14:pctWidth>
+            </wp14:sizeRelH>
+            <wp14:sizeRelV relativeFrom="margin">
+              <wp14:pctHeight>0</wp14:pctHeight>
+            </wp14:sizeRelV>
           </wp:anchor>
         </w:drawing>
       </w:r>
@@ -4486,16 +4708,16 @@
           <w:noProof/>
         </w:rPr>
         <w:drawing>
-          <wp:anchor distT="0" distB="0" distL="114300" distR="114300" simplePos="0" relativeHeight="251660288" behindDoc="0" locked="0" layoutInCell="1" allowOverlap="1" wp14:anchorId="06C461CE" wp14:editId="1C642C04">
+          <wp:anchor distT="0" distB="0" distL="114300" distR="114300" simplePos="0" relativeHeight="251660288" behindDoc="0" locked="0" layoutInCell="1" allowOverlap="1" wp14:anchorId="06C461CE" wp14:editId="481978B2">
             <wp:simplePos x="0" y="0"/>
             <wp:positionH relativeFrom="margin">
-              <wp:posOffset>2099945</wp:posOffset>
+              <wp:posOffset>-102235</wp:posOffset>
             </wp:positionH>
             <wp:positionV relativeFrom="margin">
-              <wp:posOffset>6951345</wp:posOffset>
+              <wp:posOffset>1945005</wp:posOffset>
             </wp:positionV>
-            <wp:extent cx="3381375" cy="1219200"/>
-            <wp:effectExtent l="0" t="0" r="9525" b="0"/>
+            <wp:extent cx="3060700" cy="1102995"/>
+            <wp:effectExtent l="0" t="0" r="6350" b="1905"/>
             <wp:wrapSquare wrapText="bothSides"/>
             <wp:docPr id="502975647" name="Imagen 1"/>
             <wp:cNvGraphicFramePr>
@@ -4509,7 +4731,7 @@
                     <pic:cNvPicPr/>
                   </pic:nvPicPr>
                   <pic:blipFill>
-                    <a:blip r:embed="rId20">
+                    <a:blip r:embed="rId23">
                       <a:extLst>
                         <a:ext uri="{28A0092B-C50C-407E-A947-70E740481C1C}">
                           <a14:useLocalDpi xmlns:a14="http://schemas.microsoft.com/office/drawing/2010/main" val="0"/>
@@ -4523,7 +4745,7 @@
                   <pic:spPr>
                     <a:xfrm>
                       <a:off x="0" y="0"/>
-                      <a:ext cx="3381375" cy="1219200"/>
+                      <a:ext cx="3060700" cy="1102995"/>
                     </a:xfrm>
                     <a:prstGeom prst="rect">
                       <a:avLst/>
@@ -4532,38 +4754,18 @@
                 </pic:pic>
               </a:graphicData>
             </a:graphic>
+            <wp14:sizeRelH relativeFrom="margin">
+              <wp14:pctWidth>0</wp14:pctWidth>
+            </wp14:sizeRelH>
+            <wp14:sizeRelV relativeFrom="margin">
+              <wp14:pctHeight>0</wp14:pctHeight>
+            </wp14:sizeRelV>
           </wp:anchor>
         </w:drawing>
       </w:r>
       <w:r>
-        <w:t>Guardas el archivo y listo, sin embargo</w:t>
-      </w:r>
-      <w:r>
-        <w:t>,</w:t>
-      </w:r>
-      <w:r>
-        <w:t xml:space="preserve"> se recomienda escribir cualquier cosa en su contenido y luego abrir el archivo usando bloc de notas para asegurarte de que las </w:t>
-      </w:r>
-      <w:r>
-        <w:lastRenderedPageBreak/>
-        <w:t>columnas se estén separando por puntos y comas</w:t>
-      </w:r>
-      <w:r>
-        <w:t>.</w:t>
-      </w:r>
-      <w:r>
-        <w:t xml:space="preserve"> Si no lo están, cambia la coma por un punto y coma y listo.</w:t>
-      </w:r>
-    </w:p>
-    <w:p>
-      <w:pPr>
-        <w:ind w:firstLine="708"/>
-      </w:pPr>
-    </w:p>
-    <w:p>
-      <w:pPr>
-        <w:ind w:firstLine="708"/>
-      </w:pPr>
+        <w:t>Aquí una comparativa de cómo se vería abierto con bloc de notas y con Excel</w:t>
+      </w:r>
     </w:p>
     <w:p>
       <w:bookmarkStart w:id="6" w:name="_Toc199261559"/>
@@ -4642,13 +4844,13 @@
           <w:noProof/>
         </w:rPr>
         <w:drawing>
-          <wp:anchor distT="0" distB="0" distL="114300" distR="114300" simplePos="0" relativeHeight="251661312" behindDoc="0" locked="0" layoutInCell="1" allowOverlap="1" wp14:anchorId="0E2A93C7" wp14:editId="05683628">
+          <wp:anchor distT="0" distB="0" distL="114300" distR="114300" simplePos="0" relativeHeight="251661312" behindDoc="0" locked="0" layoutInCell="1" allowOverlap="1" wp14:anchorId="0E2A93C7" wp14:editId="227B486E">
             <wp:simplePos x="0" y="0"/>
             <wp:positionH relativeFrom="margin">
-              <wp:posOffset>-671830</wp:posOffset>
+              <wp:align>center</wp:align>
             </wp:positionH>
             <wp:positionV relativeFrom="margin">
-              <wp:posOffset>2014220</wp:posOffset>
+              <wp:posOffset>5246370</wp:posOffset>
             </wp:positionV>
             <wp:extent cx="6641465" cy="390525"/>
             <wp:effectExtent l="0" t="0" r="6985" b="9525"/>
@@ -4665,7 +4867,7 @@
                     <pic:cNvPicPr/>
                   </pic:nvPicPr>
                   <pic:blipFill>
-                    <a:blip r:embed="rId21">
+                    <a:blip r:embed="rId24">
                       <a:extLst>
                         <a:ext uri="{28A0092B-C50C-407E-A947-70E740481C1C}">
                           <a14:useLocalDpi xmlns:a14="http://schemas.microsoft.com/office/drawing/2010/main" val="0"/>
@@ -4719,50 +4921,55 @@
         <w:ind w:firstLine="708"/>
       </w:pPr>
       <w:r>
-        <w:t xml:space="preserve">Recordemos que el archivo se entrada es el </w:t>
-      </w:r>
-      <w:r>
-        <w:rPr>
-          <w:i/>
-          <w:iCs/>
-        </w:rPr>
-        <w:t>testing.csv</w:t>
-      </w:r>
-      <w:r>
-        <w:t>, una forma de trabajo podría ser trabajar en dicho archivo y una vez esté listo podrías copiar y pegar su contenido al archivo correspondiente.</w:t>
-      </w:r>
-    </w:p>
-    <w:p>
-      <w:r>
-        <w:tab/>
-        <w:t>Al momento de utilizar números decimales utilizar puntos en vez de comas y escribir todo en minúsculas.</w:t>
-      </w:r>
-      <w:r>
-        <w:t xml:space="preserve"> Verás que </w:t>
-      </w:r>
-      <w:r>
-        <w:t>al momento de</w:t>
-      </w:r>
-      <w:r>
-        <w:t xml:space="preserve"> expli</w:t>
-      </w:r>
-      <w:r>
-        <w:t>car</w:t>
-      </w:r>
-      <w:r>
-        <w:t xml:space="preserve"> los parámetros de ciertos elementos estos tendrán unos paréntesis</w:t>
-      </w:r>
-      <w:r>
-        <w:t xml:space="preserve"> al final</w:t>
-      </w:r>
-      <w:r>
-        <w:t>, esto significa el valor que tienen por defecto.</w:t>
-      </w:r>
-    </w:p>
-    <w:p>
-      <w:r>
-        <w:tab/>
-        <w:t xml:space="preserve">Los ejemplos se marcarán con resaltador de </w:t>
+        <w:t>A continuación detallaremos cada una de las columnas, sin embargo, antes de ello hay que hacer algunas aclaraciones.</w:t>
+      </w:r>
+    </w:p>
+    <w:p>
+      <w:pPr>
+        <w:pStyle w:val="Prrafodelista"/>
+        <w:numPr>
+          <w:ilvl w:val="0"/>
+          <w:numId w:val="21"/>
+        </w:numPr>
+      </w:pPr>
+      <w:r>
+        <w:t>Los números decimales deben ser escritos con puntos en vez de coma.</w:t>
+      </w:r>
+    </w:p>
+    <w:p>
+      <w:pPr>
+        <w:pStyle w:val="Prrafodelista"/>
+        <w:numPr>
+          <w:ilvl w:val="0"/>
+          <w:numId w:val="21"/>
+        </w:numPr>
+      </w:pPr>
+      <w:r>
+        <w:t>Todas las palabras que escribas deben ser en minúscula.</w:t>
+      </w:r>
+    </w:p>
+    <w:p>
+      <w:pPr>
+        <w:pStyle w:val="Prrafodelista"/>
+        <w:numPr>
+          <w:ilvl w:val="0"/>
+          <w:numId w:val="21"/>
+        </w:numPr>
+      </w:pPr>
+      <w:r>
+        <w:t>Notarás que en las explicaciones de algunos campos hay un número entre paréntesis, ese número representa su valor por defecto.</w:t>
+      </w:r>
+    </w:p>
+    <w:p>
+      <w:pPr>
+        <w:pStyle w:val="Prrafodelista"/>
+        <w:numPr>
+          <w:ilvl w:val="0"/>
+          <w:numId w:val="21"/>
+        </w:numPr>
+      </w:pPr>
+      <w:r>
+        <w:t xml:space="preserve">Los ejemplos serán subrayados de </w:t>
       </w:r>
       <w:r>
         <w:rPr>
@@ -4777,6 +4984,7 @@
       </w:pPr>
       <w:bookmarkStart w:id="7" w:name="_Toc199261560"/>
       <w:r>
+        <w:lastRenderedPageBreak/>
         <w:t>Columna Key</w:t>
       </w:r>
       <w:bookmarkEnd w:id="7"/>
@@ -4790,11 +4998,7 @@
     <w:p>
       <w:r>
         <w:tab/>
-        <w:t xml:space="preserve">El valor recomendado para colocar en esta columna key es el siguiente: [ruta]_[capitulo]_[escena]_[dialogo], por ejemplo si queremos describir el diálogo número 89 de la escena noche de paseo del capítulo 3 de la ruta Stefannie, haríamos algo </w:t>
-      </w:r>
-      <w:r>
-        <w:lastRenderedPageBreak/>
-        <w:t>así: stefannie_3_night_out_89, el siguiente diálogo sería igual pero con un 90 en vez de 89 y siempre empezando en 1.</w:t>
+        <w:t>El valor recomendado para colocar en esta columna key es el siguiente: [ruta]_[capitulo]_[escena]_[dialogo], por ejemplo si queremos describir el diálogo número 89 de la escena noche de paseo del capítulo 3 de la ruta Stefannie, haríamos algo así: stefannie_3_night_out_89, el siguiente diálogo sería igual pero con un 90 en vez de 89 y siempre empezando en 1.</w:t>
       </w:r>
     </w:p>
     <w:p>
@@ -4837,7 +5041,7 @@
                     <pic:cNvPicPr/>
                   </pic:nvPicPr>
                   <pic:blipFill>
-                    <a:blip r:embed="rId22">
+                    <a:blip r:embed="rId25">
                       <a:extLst>
                         <a:ext uri="{28A0092B-C50C-407E-A947-70E740481C1C}">
                           <a14:useLocalDpi xmlns:a14="http://schemas.microsoft.com/office/drawing/2010/main" val="0"/>
@@ -4891,7 +5095,7 @@
                     <pic:cNvPicPr/>
                   </pic:nvPicPr>
                   <pic:blipFill>
-                    <a:blip r:embed="rId23">
+                    <a:blip r:embed="rId26">
                       <a:extLst>
                         <a:ext uri="{28A0092B-C50C-407E-A947-70E740481C1C}">
                           <a14:useLocalDpi xmlns:a14="http://schemas.microsoft.com/office/drawing/2010/main" val="0"/>
@@ -5002,6 +5206,7 @@
         <w:ind w:firstLine="708"/>
       </w:pPr>
       <w:r>
+        <w:lastRenderedPageBreak/>
         <w:t>Nombre del fondo : tipo de transición : parámetros de la transición</w:t>
       </w:r>
     </w:p>
@@ -5046,7 +5251,6 @@
         <w:rPr>
           <w:highlight w:val="yellow"/>
         </w:rPr>
-        <w:lastRenderedPageBreak/>
         <w:t>music_room</w:t>
       </w:r>
       <w:r>
@@ -5581,6 +5785,7 @@
       </w:pPr>
       <w:bookmarkStart w:id="9" w:name="_Toc199261562"/>
       <w:r>
+        <w:lastRenderedPageBreak/>
         <w:t>Columna Music</w:t>
       </w:r>
       <w:bookmarkEnd w:id="9"/>
@@ -5638,7 +5843,6 @@
         <w:ind w:firstLine="360"/>
       </w:pPr>
       <w:r>
-        <w:lastRenderedPageBreak/>
         <w:t>Cuando ocurre un cambio de música</w:t>
       </w:r>
       <w:r>
@@ -5819,6 +6023,7 @@
     </w:p>
     <w:p>
       <w:r>
+        <w:lastRenderedPageBreak/>
         <w:tab/>
         <w:t xml:space="preserve">Si colocamos el nombre del sonido sin más, este se reproducirá una sola vez. Para reproducir varios sonidos simultáneamente, debemos separarlos por comas. Si deseamos que el sonido se reproduzca constantemente debemos añadir :loop, es importante mencionar que hacer eso hará que el sonido se reproduzca indefinidamente hasta que volvamos a escribir la misma instrucción más adelante. </w:t>
       </w:r>
@@ -5850,7 +6055,6 @@
         <w:rPr>
           <w:highlight w:val="yellow"/>
         </w:rPr>
-        <w:lastRenderedPageBreak/>
         <w:t>Espadas chocando:loop</w:t>
       </w:r>
       <w:r>
@@ -6216,6 +6420,7 @@
         <w:rPr>
           <w:highlight w:val="yellow"/>
         </w:rPr>
+        <w:lastRenderedPageBreak/>
         <w:t>vpunch:50</w:t>
       </w:r>
       <w:r>
@@ -6625,6 +6830,7 @@
         <w:pStyle w:val="Ttulo3"/>
       </w:pPr>
       <w:r>
+        <w:lastRenderedPageBreak/>
         <w:t>Efectos que colocan una imagen encima del fondo</w:t>
       </w:r>
     </w:p>
@@ -6782,7 +6988,6 @@
     <w:p/>
     <w:p>
       <w:r>
-        <w:lastRenderedPageBreak/>
         <w:tab/>
         <w:t>Estos también sirven para mostrar imágenes</w:t>
       </w:r>
@@ -6898,6 +7103,7 @@
         <w:rPr>
           <w:noProof/>
         </w:rPr>
+        <w:lastRenderedPageBreak/>
         <w:t xml:space="preserve">              </w:t>
       </w:r>
       <w:r>
@@ -6920,7 +7126,7 @@
                     <pic:cNvPicPr/>
                   </pic:nvPicPr>
                   <pic:blipFill>
-                    <a:blip r:embed="rId24"/>
+                    <a:blip r:embed="rId27"/>
                     <a:stretch>
                       <a:fillRect/>
                     </a:stretch>
@@ -6972,7 +7178,7 @@
                     <pic:cNvPicPr/>
                   </pic:nvPicPr>
                   <pic:blipFill>
-                    <a:blip r:embed="rId25"/>
+                    <a:blip r:embed="rId28"/>
                     <a:stretch>
                       <a:fillRect/>
                     </a:stretch>
@@ -6995,7 +7201,6 @@
     </w:p>
     <w:p>
       <w:r>
-        <w:lastRenderedPageBreak/>
         <w:tab/>
         <w:t xml:space="preserve">En este caso la imagen de la </w:t>
       </w:r>
@@ -7089,6 +7294,7 @@
         <w:ind w:firstLine="708"/>
       </w:pPr>
       <w:r>
+        <w:lastRenderedPageBreak/>
         <w:t>Posiciones y valores</w:t>
       </w:r>
     </w:p>
@@ -7449,7 +7655,6 @@
               <w:jc w:val="center"/>
             </w:pPr>
             <w:r>
-              <w:lastRenderedPageBreak/>
               <w:t>120</w:t>
             </w:r>
           </w:p>
@@ -7679,6 +7884,7 @@
               <w:jc w:val="center"/>
             </w:pPr>
             <w:r>
+              <w:lastRenderedPageBreak/>
               <w:t>appear</w:t>
             </w:r>
           </w:p>
@@ -8081,7 +8287,6 @@
               <w:jc w:val="center"/>
             </w:pPr>
             <w:r>
-              <w:lastRenderedPageBreak/>
               <w:t>tremble</w:t>
             </w:r>
           </w:p>
@@ -8577,7 +8782,6 @@
     </w:p>
     <w:p>
       <w:r>
-        <w:lastRenderedPageBreak/>
         <w:tab/>
         <w:t>Existen algunas animaciones predeterminadas, estas permiten que un personaje entre en una animación por tiempo indefinido, es similar a los efectos continuos solo que esta vez son los personajes que hacen un movimiento indefinidamente hasta que se vuelva a llamar la animación.</w:t>
       </w:r>
@@ -8805,6 +9009,7 @@
     <w:p/>
     <w:p>
       <w:r>
+        <w:lastRenderedPageBreak/>
         <w:tab/>
         <w:t xml:space="preserve">A </w:t>
       </w:r>
@@ -9057,7 +9262,6 @@
         </w:numPr>
       </w:pPr>
       <w:r>
-        <w:lastRenderedPageBreak/>
         <w:t>dereck:pop:120</w:t>
       </w:r>
       <w:r>
@@ -9269,6 +9473,7 @@
     </w:p>
     <w:p>
       <w:r>
+        <w:lastRenderedPageBreak/>
         <w:tab/>
       </w:r>
       <w:r>
@@ -9333,7 +9538,6 @@
         <w:ind w:left="708"/>
       </w:pPr>
       <w:r>
-        <w:lastRenderedPageBreak/>
         <w:t>"No se que hora o que día es hoy, creo que es miércoles en la tarde.No se que hora o que día es hoy, creo que es miércoles en la tarde.No se que hora o que día es hoy, creo que es miércoles en la tarde.No se que hora o que día es hoy, creo que es miércoles en la tarde.No se que hora o que día es hoy, creo que es miércoles en la"</w:t>
       </w:r>
     </w:p>
@@ -9352,7 +9556,7 @@
       <w:r>
         <w:t xml:space="preserve">Para saber cuantos pixeles tiene tu diálogo puedes utilizar el siguiente sitio web: </w:t>
       </w:r>
-      <w:hyperlink r:id="rId26" w:history="1">
+      <w:hyperlink r:id="rId29" w:history="1">
         <w:r>
           <w:rPr>
             <w:rStyle w:val="Hipervnculo"/>
@@ -9368,7 +9572,7 @@
       <w:r>
         <w:t xml:space="preserve">Renpy posee diversos modificadores de texto, estos se escriben en medio del diálogo y son perfectamente utilizables en la columnas de idioma. Existen muchos modificadores de texto así que te recomiendo leer la documentación de Renpy para intentar implementarlos. </w:t>
       </w:r>
-      <w:hyperlink r:id="rId27" w:anchor="text-tag-alpha" w:history="1">
+      <w:hyperlink r:id="rId30" w:anchor="text-tag-alpha" w:history="1">
         <w:r>
           <w:rPr>
             <w:rStyle w:val="Hipervnculo"/>
@@ -9412,6 +9616,7 @@
           <w:i/>
           <w:iCs/>
         </w:rPr>
+        <w:lastRenderedPageBreak/>
         <w:t xml:space="preserve">Mostrando el diálogo “Ahora a bailar wuuuu </w:t>
       </w:r>
       <w:r>
@@ -9449,7 +9654,7 @@
                     <pic:cNvPicPr/>
                   </pic:nvPicPr>
                   <pic:blipFill>
-                    <a:blip r:embed="rId28"/>
+                    <a:blip r:embed="rId31"/>
                     <a:stretch>
                       <a:fillRect/>
                     </a:stretch>
@@ -9575,7 +9780,7 @@
                     <pic:cNvPicPr/>
                   </pic:nvPicPr>
                   <pic:blipFill>
-                    <a:blip r:embed="rId29"/>
+                    <a:blip r:embed="rId32"/>
                     <a:stretch>
                       <a:fillRect/>
                     </a:stretch>
@@ -9778,6 +9983,7 @@
         <w:spacing w:after="0"/>
       </w:pPr>
       <w:r>
+        <w:lastRenderedPageBreak/>
         <w:tab/>
       </w:r>
       <w:r>
@@ -9918,7 +10124,6 @@
         <w:pStyle w:val="Ttulo3"/>
       </w:pPr>
       <w:r>
-        <w:lastRenderedPageBreak/>
         <w:t>Lineal</w:t>
       </w:r>
     </w:p>
@@ -9955,7 +10160,7 @@
                     <pic:cNvPicPr/>
                   </pic:nvPicPr>
                   <pic:blipFill>
-                    <a:blip r:embed="rId30"/>
+                    <a:blip r:embed="rId33"/>
                     <a:stretch>
                       <a:fillRect/>
                     </a:stretch>
@@ -9984,6 +10189,7 @@
     </w:p>
     <w:p>
       <w:r>
+        <w:lastRenderedPageBreak/>
         <w:t xml:space="preserve">             </w:t>
       </w:r>
       <w:r>
@@ -10006,7 +10212,7 @@
                     <pic:cNvPicPr/>
                   </pic:nvPicPr>
                   <pic:blipFill>
-                    <a:blip r:embed="rId31"/>
+                    <a:blip r:embed="rId34"/>
                     <a:stretch>
                       <a:fillRect/>
                     </a:stretch>
@@ -10146,7 +10352,6 @@
         </w:sectPr>
       </w:pPr>
       <w:r>
-        <w:lastRenderedPageBreak/>
         <w:tab/>
       </w:r>
     </w:p>
@@ -10310,6 +10515,7 @@
         <w:pStyle w:val="Ttulo3"/>
       </w:pPr>
       <w:r>
+        <w:lastRenderedPageBreak/>
         <w:t>Decisión</w:t>
       </w:r>
     </w:p>
@@ -10455,7 +10661,7 @@
                     <pic:cNvPicPr/>
                   </pic:nvPicPr>
                   <pic:blipFill>
-                    <a:blip r:embed="rId32"/>
+                    <a:blip r:embed="rId35"/>
                     <a:stretch>
                       <a:fillRect/>
                     </a:stretch>
@@ -10478,7 +10684,6 @@
     </w:p>
     <w:p>
       <w:r>
-        <w:lastRenderedPageBreak/>
         <w:t xml:space="preserve">       </w:t>
       </w:r>
       <w:r>
@@ -10501,7 +10706,7 @@
                     <pic:cNvPicPr/>
                   </pic:nvPicPr>
                   <pic:blipFill>
-                    <a:blip r:embed="rId33"/>
+                    <a:blip r:embed="rId36"/>
                     <a:stretch>
                       <a:fillRect/>
                     </a:stretch>
@@ -10530,6 +10735,7 @@
     </w:p>
     <w:p>
       <w:r>
+        <w:lastRenderedPageBreak/>
         <w:t xml:space="preserve">            </w:t>
       </w:r>
       <w:r>
@@ -10552,7 +10758,7 @@
                     <pic:cNvPicPr/>
                   </pic:nvPicPr>
                   <pic:blipFill>
-                    <a:blip r:embed="rId34"/>
+                    <a:blip r:embed="rId37"/>
                     <a:stretch>
                       <a:fillRect/>
                     </a:stretch>
@@ -10786,7 +10992,6 @@
         <w:pStyle w:val="Ttulo3"/>
       </w:pPr>
       <w:r>
-        <w:lastRenderedPageBreak/>
         <w:t>Condición</w:t>
       </w:r>
     </w:p>
@@ -10827,6 +11032,7 @@
         <w:pStyle w:val="Ttulo4"/>
       </w:pPr>
       <w:r>
+        <w:lastRenderedPageBreak/>
         <w:t>Condición por puntos</w:t>
       </w:r>
     </w:p>
@@ -10851,7 +11057,7 @@
                     <pic:cNvPicPr/>
                   </pic:nvPicPr>
                   <pic:blipFill>
-                    <a:blip r:embed="rId35"/>
+                    <a:blip r:embed="rId38"/>
                     <a:stretch>
                       <a:fillRect/>
                     </a:stretch>
@@ -11013,7 +11219,6 @@
         <w:rPr>
           <w:highlight w:val="yellow"/>
         </w:rPr>
-        <w:lastRenderedPageBreak/>
         <w:t>#condition points</w:t>
       </w:r>
     </w:p>
@@ -11124,6 +11329,7 @@
     </w:p>
     <w:p>
       <w:r>
+        <w:lastRenderedPageBreak/>
         <w:t xml:space="preserve">      </w:t>
       </w:r>
       <w:r>
@@ -11146,7 +11352,7 @@
                     <pic:cNvPicPr/>
                   </pic:nvPicPr>
                   <pic:blipFill>
-                    <a:blip r:embed="rId36"/>
+                    <a:blip r:embed="rId39"/>
                     <a:stretch>
                       <a:fillRect/>
                     </a:stretch>
@@ -11303,7 +11509,6 @@
         <w:pStyle w:val="Ttulo4"/>
       </w:pPr>
       <w:r>
-        <w:lastRenderedPageBreak/>
         <w:t>Condición por escena</w:t>
       </w:r>
     </w:p>
@@ -11321,6 +11526,7 @@
         <w:rPr>
           <w:noProof/>
         </w:rPr>
+        <w:lastRenderedPageBreak/>
         <w:drawing>
           <wp:inline distT="0" distB="0" distL="0" distR="0" wp14:anchorId="37687B73" wp14:editId="05682B4E">
             <wp:extent cx="5400040" cy="2165350"/>
@@ -11337,7 +11543,7 @@
                     <pic:cNvPicPr/>
                   </pic:nvPicPr>
                   <pic:blipFill>
-                    <a:blip r:embed="rId37"/>
+                    <a:blip r:embed="rId40"/>
                     <a:stretch>
                       <a:fillRect/>
                     </a:stretch>
@@ -11514,7 +11720,6 @@
         <w:spacing w:after="0"/>
       </w:pPr>
       <w:r>
-        <w:lastRenderedPageBreak/>
         <w:tab/>
       </w:r>
       <w:r>
@@ -11723,7 +11928,6 @@
     </w:p>
     <w:p>
       <w:r>
-        <w:lastRenderedPageBreak/>
         <w:tab/>
       </w:r>
       <w:r>
@@ -11746,7 +11950,7 @@
                     <pic:cNvPicPr/>
                   </pic:nvPicPr>
                   <pic:blipFill>
-                    <a:blip r:embed="rId38"/>
+                    <a:blip r:embed="rId41"/>
                     <a:stretch>
                       <a:fillRect/>
                     </a:stretch>
@@ -11772,6 +11976,7 @@
         <w:ind w:firstLine="708"/>
       </w:pPr>
       <w:r>
+        <w:lastRenderedPageBreak/>
         <w:t xml:space="preserve">Si requireSceneEncryption </w:t>
       </w:r>
       <w:r>
@@ -11836,7 +12041,7 @@
                     <pic:cNvPicPr/>
                   </pic:nvPicPr>
                   <pic:blipFill>
-                    <a:blip r:embed="rId39"/>
+                    <a:blip r:embed="rId42"/>
                     <a:stretch>
                       <a:fillRect/>
                     </a:stretch>
@@ -11980,16 +12185,16 @@
     <w:p/>
     <w:p>
       <w:r>
+        <w:tab/>
+      </w:r>
+    </w:p>
+    <w:p>
+      <w:pPr>
+        <w:pStyle w:val="Ttulo1"/>
+      </w:pPr>
+      <w:bookmarkStart w:id="19" w:name="_Toc199261572"/>
+      <w:r>
         <w:lastRenderedPageBreak/>
-        <w:tab/>
-      </w:r>
-    </w:p>
-    <w:p>
-      <w:pPr>
-        <w:pStyle w:val="Ttulo1"/>
-      </w:pPr>
-      <w:bookmarkStart w:id="19" w:name="_Toc199261572"/>
-      <w:r>
         <w:t>Testing</w:t>
       </w:r>
       <w:bookmarkEnd w:id="19"/>
@@ -12127,7 +12332,7 @@
                     <pic:cNvPicPr/>
                   </pic:nvPicPr>
                   <pic:blipFill>
-                    <a:blip r:embed="rId40"/>
+                    <a:blip r:embed="rId43"/>
                     <a:stretch>
                       <a:fillRect/>
                     </a:stretch>
@@ -12263,7 +12468,6 @@
     </w:p>
     <w:p>
       <w:r>
-        <w:lastRenderedPageBreak/>
         <w:tab/>
         <w:t xml:space="preserve">Aunque la animación no tenga parámetros, puedes colocarla en </w:t>
       </w:r>
@@ -12355,7 +12559,7 @@
     <w:p/>
     <w:p/>
     <w:p>
-      <w:hyperlink r:id="rId41" w:history="1">
+      <w:hyperlink r:id="rId44" w:history="1">
         <w:r>
           <w:rPr>
             <w:rStyle w:val="Hipervnculo"/>
@@ -12368,7 +12572,7 @@
       </w:r>
     </w:p>
     <w:p>
-      <w:hyperlink r:id="rId42" w:history="1">
+      <w:hyperlink r:id="rId45" w:history="1">
         <w:r>
           <w:rPr>
             <w:rStyle w:val="Hipervnculo"/>
@@ -12381,7 +12585,7 @@
       </w:r>
     </w:p>
     <w:p>
-      <w:hyperlink r:id="rId43" w:history="1">
+      <w:hyperlink r:id="rId46" w:history="1">
         <w:r>
           <w:rPr>
             <w:rStyle w:val="Hipervnculo"/>
@@ -12391,7 +12595,7 @@
       </w:hyperlink>
     </w:p>
     <w:p>
-      <w:hyperlink r:id="rId44" w:anchor="text-tag-alpha" w:history="1">
+      <w:hyperlink r:id="rId47" w:anchor="text-tag-alpha" w:history="1">
         <w:r>
           <w:rPr>
             <w:rStyle w:val="Hipervnculo"/>
@@ -14337,6 +14541,119 @@
     </w:lvl>
   </w:abstractNum>
   <w:abstractNum w:abstractNumId="18" w15:restartNumberingAfterBreak="0">
+    <w:nsid w:val="753D730E"/>
+    <w:multiLevelType w:val="hybridMultilevel"/>
+    <w:tmpl w:val="75E0B6C2"/>
+    <w:lvl w:ilvl="0" w:tplc="200A0001">
+      <w:start w:val="1"/>
+      <w:numFmt w:val="bullet"/>
+      <w:lvlText w:val=""/>
+      <w:lvlJc w:val="left"/>
+      <w:pPr>
+        <w:ind w:left="1428" w:hanging="360"/>
+      </w:pPr>
+      <w:rPr>
+        <w:rFonts w:ascii="Symbol" w:hAnsi="Symbol" w:hint="default"/>
+      </w:rPr>
+    </w:lvl>
+    <w:lvl w:ilvl="1" w:tplc="200A0003" w:tentative="1">
+      <w:start w:val="1"/>
+      <w:numFmt w:val="bullet"/>
+      <w:lvlText w:val="o"/>
+      <w:lvlJc w:val="left"/>
+      <w:pPr>
+        <w:ind w:left="2148" w:hanging="360"/>
+      </w:pPr>
+      <w:rPr>
+        <w:rFonts w:ascii="Courier New" w:hAnsi="Courier New" w:cs="Courier New" w:hint="default"/>
+      </w:rPr>
+    </w:lvl>
+    <w:lvl w:ilvl="2" w:tplc="200A0005" w:tentative="1">
+      <w:start w:val="1"/>
+      <w:numFmt w:val="bullet"/>
+      <w:lvlText w:val=""/>
+      <w:lvlJc w:val="left"/>
+      <w:pPr>
+        <w:ind w:left="2868" w:hanging="360"/>
+      </w:pPr>
+      <w:rPr>
+        <w:rFonts w:ascii="Wingdings" w:hAnsi="Wingdings" w:hint="default"/>
+      </w:rPr>
+    </w:lvl>
+    <w:lvl w:ilvl="3" w:tplc="200A0001" w:tentative="1">
+      <w:start w:val="1"/>
+      <w:numFmt w:val="bullet"/>
+      <w:lvlText w:val=""/>
+      <w:lvlJc w:val="left"/>
+      <w:pPr>
+        <w:ind w:left="3588" w:hanging="360"/>
+      </w:pPr>
+      <w:rPr>
+        <w:rFonts w:ascii="Symbol" w:hAnsi="Symbol" w:hint="default"/>
+      </w:rPr>
+    </w:lvl>
+    <w:lvl w:ilvl="4" w:tplc="200A0003" w:tentative="1">
+      <w:start w:val="1"/>
+      <w:numFmt w:val="bullet"/>
+      <w:lvlText w:val="o"/>
+      <w:lvlJc w:val="left"/>
+      <w:pPr>
+        <w:ind w:left="4308" w:hanging="360"/>
+      </w:pPr>
+      <w:rPr>
+        <w:rFonts w:ascii="Courier New" w:hAnsi="Courier New" w:cs="Courier New" w:hint="default"/>
+      </w:rPr>
+    </w:lvl>
+    <w:lvl w:ilvl="5" w:tplc="200A0005" w:tentative="1">
+      <w:start w:val="1"/>
+      <w:numFmt w:val="bullet"/>
+      <w:lvlText w:val=""/>
+      <w:lvlJc w:val="left"/>
+      <w:pPr>
+        <w:ind w:left="5028" w:hanging="360"/>
+      </w:pPr>
+      <w:rPr>
+        <w:rFonts w:ascii="Wingdings" w:hAnsi="Wingdings" w:hint="default"/>
+      </w:rPr>
+    </w:lvl>
+    <w:lvl w:ilvl="6" w:tplc="200A0001" w:tentative="1">
+      <w:start w:val="1"/>
+      <w:numFmt w:val="bullet"/>
+      <w:lvlText w:val=""/>
+      <w:lvlJc w:val="left"/>
+      <w:pPr>
+        <w:ind w:left="5748" w:hanging="360"/>
+      </w:pPr>
+      <w:rPr>
+        <w:rFonts w:ascii="Symbol" w:hAnsi="Symbol" w:hint="default"/>
+      </w:rPr>
+    </w:lvl>
+    <w:lvl w:ilvl="7" w:tplc="200A0003" w:tentative="1">
+      <w:start w:val="1"/>
+      <w:numFmt w:val="bullet"/>
+      <w:lvlText w:val="o"/>
+      <w:lvlJc w:val="left"/>
+      <w:pPr>
+        <w:ind w:left="6468" w:hanging="360"/>
+      </w:pPr>
+      <w:rPr>
+        <w:rFonts w:ascii="Courier New" w:hAnsi="Courier New" w:cs="Courier New" w:hint="default"/>
+      </w:rPr>
+    </w:lvl>
+    <w:lvl w:ilvl="8" w:tplc="200A0005" w:tentative="1">
+      <w:start w:val="1"/>
+      <w:numFmt w:val="bullet"/>
+      <w:lvlText w:val=""/>
+      <w:lvlJc w:val="left"/>
+      <w:pPr>
+        <w:ind w:left="7188" w:hanging="360"/>
+      </w:pPr>
+      <w:rPr>
+        <w:rFonts w:ascii="Wingdings" w:hAnsi="Wingdings" w:hint="default"/>
+      </w:rPr>
+    </w:lvl>
+  </w:abstractNum>
+  <w:abstractNum w:abstractNumId="19" w15:restartNumberingAfterBreak="0">
     <w:nsid w:val="77037EA0"/>
     <w:multiLevelType w:val="hybridMultilevel"/>
     <w:tmpl w:val="1D7C8B04"/>
@@ -14449,7 +14766,7 @@
       </w:rPr>
     </w:lvl>
   </w:abstractNum>
-  <w:abstractNum w:abstractNumId="19" w15:restartNumberingAfterBreak="0">
+  <w:abstractNum w:abstractNumId="20" w15:restartNumberingAfterBreak="0">
     <w:nsid w:val="7B12378A"/>
     <w:multiLevelType w:val="hybridMultilevel"/>
     <w:tmpl w:val="E6EC6DD6"/>
@@ -14566,13 +14883,13 @@
     <w:abstractNumId w:val="10"/>
   </w:num>
   <w:num w:numId="11" w16cid:durableId="1776826764">
-    <w:abstractNumId w:val="18"/>
+    <w:abstractNumId w:val="19"/>
   </w:num>
   <w:num w:numId="12" w16cid:durableId="1998149375">
     <w:abstractNumId w:val="0"/>
   </w:num>
   <w:num w:numId="13" w16cid:durableId="2030794282">
-    <w:abstractNumId w:val="19"/>
+    <w:abstractNumId w:val="20"/>
   </w:num>
   <w:num w:numId="14" w16cid:durableId="389350923">
     <w:abstractNumId w:val="6"/>
@@ -14594,6 +14911,9 @@
   </w:num>
   <w:num w:numId="20" w16cid:durableId="1597127380">
     <w:abstractNumId w:val="4"/>
+  </w:num>
+  <w:num w:numId="21" w16cid:durableId="1672026176">
+    <w:abstractNumId w:val="18"/>
   </w:num>
 </w:numbering>
 </file>
@@ -15662,6 +15982,18 @@
       </w:tblBorders>
     </w:tblPr>
   </w:style>
+  <w:style w:type="character" w:styleId="Hipervnculovisitado">
+    <w:name w:val="FollowedHyperlink"/>
+    <w:basedOn w:val="Fuentedeprrafopredeter"/>
+    <w:uiPriority w:val="99"/>
+    <w:semiHidden/>
+    <w:unhideWhenUsed/>
+    <w:rsid w:val="0007667A"/>
+    <w:rPr>
+      <w:color w:val="954F72" w:themeColor="followedHyperlink"/>
+      <w:u w:val="single"/>
+    </w:rPr>
+  </w:style>
 </w:styles>
 </file>
 

</xml_diff>

<commit_message>
<doc> writting docx documentation
</commit_message>
<xml_diff>
--- a/Manual de desarrollo en Atlax Renpy.docx
+++ b/Manual de desarrollo en Atlax Renpy.docx
@@ -2690,10 +2690,26 @@
         <w:t>,</w:t>
       </w:r>
       <w:r>
-        <w:t xml:space="preserve"> y por ende, distintas rutas o caminos </w:t>
-      </w:r>
-      <w:r>
-        <w:t xml:space="preserve"> con distintos finales</w:t>
+        <w:t xml:space="preserve"> </w:t>
+      </w:r>
+      <w:proofErr w:type="gramStart"/>
+      <w:r>
+        <w:t>y</w:t>
+      </w:r>
+      <w:proofErr w:type="gramEnd"/>
+      <w:r>
+        <w:t xml:space="preserve"> por ende, distintas rutas o </w:t>
+      </w:r>
+      <w:proofErr w:type="gramStart"/>
+      <w:r>
+        <w:t xml:space="preserve">caminos </w:t>
+      </w:r>
+      <w:r>
+        <w:t xml:space="preserve"> con</w:t>
+      </w:r>
+      <w:proofErr w:type="gramEnd"/>
+      <w:r>
+        <w:t xml:space="preserve"> distintos finales</w:t>
       </w:r>
       <w:r>
         <w:t>. Sin embargo, s</w:t>
@@ -2826,8 +2842,13 @@
           <w:numId w:val="3"/>
         </w:numPr>
       </w:pPr>
-      <w:r>
-        <w:t>Texto a mostrar en pantalla</w:t>
+      <w:proofErr w:type="gramStart"/>
+      <w:r>
+        <w:t>Texto a mostrar</w:t>
+      </w:r>
+      <w:proofErr w:type="gramEnd"/>
+      <w:r>
+        <w:t xml:space="preserve"> en pantalla</w:t>
       </w:r>
     </w:p>
     <w:p>
@@ -3063,14 +3084,19 @@
         <w:t>Deberías dar prioridad a organizar estos archivos de control de la mejor manera posible, el orden recomendado es crear</w:t>
       </w:r>
       <w:r>
-        <w:t xml:space="preserve"> una </w:t>
-      </w:r>
-      <w:r>
         <w:t xml:space="preserve"> </w:t>
       </w:r>
+      <w:proofErr w:type="gramStart"/>
+      <w:r>
+        <w:t xml:space="preserve">una </w:t>
+      </w:r>
+      <w:r>
+        <w:t xml:space="preserve"> </w:t>
+      </w:r>
       <w:r>
         <w:t>carpeta</w:t>
       </w:r>
+      <w:proofErr w:type="gramEnd"/>
       <w:r>
         <w:t xml:space="preserve"> para cada</w:t>
       </w:r>
@@ -3198,7 +3224,23 @@
         <w:t>diálogos</w:t>
       </w:r>
       <w:r>
-        <w:t xml:space="preserve"> como de costumbre, uno a uno, click a click. Una vez llegado el final de la </w:t>
+        <w:t xml:space="preserve"> como de costumbre, uno a uno, </w:t>
+      </w:r>
+      <w:proofErr w:type="gramStart"/>
+      <w:r>
+        <w:t>click</w:t>
+      </w:r>
+      <w:proofErr w:type="gramEnd"/>
+      <w:r>
+        <w:t xml:space="preserve"> a </w:t>
+      </w:r>
+      <w:proofErr w:type="gramStart"/>
+      <w:r>
+        <w:t>click</w:t>
+      </w:r>
+      <w:proofErr w:type="gramEnd"/>
+      <w:r>
+        <w:t xml:space="preserve">. Una vez llegado el final de la </w:t>
       </w:r>
       <w:r>
         <w:rPr>
@@ -3560,7 +3602,15 @@
     <w:p>
       <w:r>
         <w:tab/>
-        <w:t xml:space="preserve">El instalador creará el sistema de carpetas así como el archivo de configuración, además de modificar algunos archivos del proyecto como el </w:t>
+        <w:t xml:space="preserve">El instalador creará el sistema de </w:t>
+      </w:r>
+      <w:proofErr w:type="gramStart"/>
+      <w:r>
+        <w:t>carpetas</w:t>
+      </w:r>
+      <w:proofErr w:type="gramEnd"/>
+      <w:r>
+        <w:t xml:space="preserve"> así como el archivo de configuración, además de modificar algunos archivos del proyecto como el </w:t>
       </w:r>
       <w:r>
         <w:rPr>
@@ -3693,7 +3743,15 @@
         <w:t xml:space="preserve">La estructura es sencilla, la columna “Key” representa qué se está definiendo, las columnas “Value1” y “Value2” aguardan los distintos valores </w:t>
       </w:r>
       <w:r>
-        <w:t>del objeto que se va a definir. Por último tenemos las columnas de los idiomas disponibles en nuestra novela.</w:t>
+        <w:t xml:space="preserve">del objeto que se va a definir. Por </w:t>
+      </w:r>
+      <w:proofErr w:type="gramStart"/>
+      <w:r>
+        <w:t>último</w:t>
+      </w:r>
+      <w:proofErr w:type="gramEnd"/>
+      <w:r>
+        <w:t xml:space="preserve"> tenemos las columnas de los idiomas disponibles en nuestra novela.</w:t>
       </w:r>
     </w:p>
     <w:p>
@@ -3780,7 +3838,15 @@
         <w:t>el nombre de</w:t>
       </w:r>
       <w:r>
-        <w:t xml:space="preserve">l archivo de control o script personalizado desde la cual comenzará la novela. Por ejemplo si nuestra escena de inicio está ubicada en la carpeta </w:t>
+        <w:t xml:space="preserve">l archivo de control o script personalizado desde la cual comenzará la novela. Por </w:t>
+      </w:r>
+      <w:proofErr w:type="gramStart"/>
+      <w:r>
+        <w:t>ejemplo</w:t>
+      </w:r>
+      <w:proofErr w:type="gramEnd"/>
+      <w:r>
+        <w:t xml:space="preserve"> si nuestra escena de inicio está ubicada en la carpeta </w:t>
       </w:r>
       <w:r>
         <w:rPr>
@@ -4311,7 +4377,15 @@
         <w:ind w:firstLine="708"/>
       </w:pPr>
       <w:r>
-        <w:t>Se recomienda no quitar los fondos flash y blackout ya que el motor los necesita para hacer algunas transiciones.</w:t>
+        <w:t xml:space="preserve">Se recomienda no quitar los fondos </w:t>
+      </w:r>
+      <w:proofErr w:type="gramStart"/>
+      <w:r>
+        <w:t>flash</w:t>
+      </w:r>
+      <w:proofErr w:type="gramEnd"/>
+      <w:r>
+        <w:t xml:space="preserve"> y blackout ya que el motor los necesita para hacer algunas transiciones.</w:t>
       </w:r>
     </w:p>
     <w:p>
@@ -4417,7 +4491,23 @@
     <w:p>
       <w:r>
         <w:tab/>
-        <w:t>Por defecto Atlax Renpy centra la caja de texto con el nombre del emisor entre otras configuraciones. Este es un archivo propio de renpy con el formato .rpy, por lo tanto lo recomendable es abrirlo con un editor de texto como Visual Studio Code o bloc de notas.</w:t>
+        <w:t xml:space="preserve">Por defecto Atlax Renpy centra la caja de texto con el nombre del emisor entre otras configuraciones. Este es un archivo propio de renpy con el </w:t>
+      </w:r>
+      <w:proofErr w:type="gramStart"/>
+      <w:r>
+        <w:t>formato .rpy</w:t>
+      </w:r>
+      <w:proofErr w:type="gramEnd"/>
+      <w:r>
+        <w:t xml:space="preserve">, por lo </w:t>
+      </w:r>
+      <w:proofErr w:type="gramStart"/>
+      <w:r>
+        <w:t>tanto</w:t>
+      </w:r>
+      <w:proofErr w:type="gramEnd"/>
+      <w:r>
+        <w:t xml:space="preserve"> lo recomendable es abrirlo con un editor de texto como Visual Studio Code o bloc de notas.</w:t>
       </w:r>
     </w:p>
     <w:p>
@@ -4811,13 +4901,95 @@
           <w:szCs w:val="20"/>
         </w:rPr>
       </w:pPr>
+      <w:proofErr w:type="gramStart"/>
       <w:r>
         <w:rPr>
           <w:sz w:val="20"/>
           <w:szCs w:val="20"/>
         </w:rPr>
-        <w:t>Key;Background;Music;Sound;Single effect;Continuous effect;Events;Delay;Emisor</w:t>
-      </w:r>
+        <w:t>Key;Background</w:t>
+      </w:r>
+      <w:proofErr w:type="gramEnd"/>
+      <w:r>
+        <w:rPr>
+          <w:sz w:val="20"/>
+          <w:szCs w:val="20"/>
+        </w:rPr>
+        <w:t>;</w:t>
+      </w:r>
+      <w:proofErr w:type="gramStart"/>
+      <w:r>
+        <w:rPr>
+          <w:sz w:val="20"/>
+          <w:szCs w:val="20"/>
+        </w:rPr>
+        <w:t>Music;Sound</w:t>
+      </w:r>
+      <w:proofErr w:type="gramEnd"/>
+      <w:r>
+        <w:rPr>
+          <w:sz w:val="20"/>
+          <w:szCs w:val="20"/>
+        </w:rPr>
+        <w:t>;</w:t>
+      </w:r>
+      <w:proofErr w:type="gramStart"/>
+      <w:r>
+        <w:rPr>
+          <w:sz w:val="20"/>
+          <w:szCs w:val="20"/>
+        </w:rPr>
+        <w:t>Single</w:t>
+      </w:r>
+      <w:proofErr w:type="gramEnd"/>
+      <w:r>
+        <w:rPr>
+          <w:sz w:val="20"/>
+          <w:szCs w:val="20"/>
+        </w:rPr>
+        <w:t xml:space="preserve"> </w:t>
+      </w:r>
+      <w:proofErr w:type="gramStart"/>
+      <w:r>
+        <w:rPr>
+          <w:sz w:val="20"/>
+          <w:szCs w:val="20"/>
+        </w:rPr>
+        <w:t>effect;Continuous</w:t>
+      </w:r>
+      <w:proofErr w:type="gramEnd"/>
+      <w:r>
+        <w:rPr>
+          <w:sz w:val="20"/>
+          <w:szCs w:val="20"/>
+        </w:rPr>
+        <w:t xml:space="preserve"> </w:t>
+      </w:r>
+      <w:proofErr w:type="gramStart"/>
+      <w:r>
+        <w:rPr>
+          <w:sz w:val="20"/>
+          <w:szCs w:val="20"/>
+        </w:rPr>
+        <w:t>effect;Events</w:t>
+      </w:r>
+      <w:proofErr w:type="gramEnd"/>
+      <w:r>
+        <w:rPr>
+          <w:sz w:val="20"/>
+          <w:szCs w:val="20"/>
+        </w:rPr>
+        <w:t>;</w:t>
+      </w:r>
+      <w:proofErr w:type="gramStart"/>
+      <w:r>
+        <w:rPr>
+          <w:sz w:val="20"/>
+          <w:szCs w:val="20"/>
+        </w:rPr>
+        <w:t>Delay;Emisor</w:t>
+      </w:r>
+      <w:proofErr w:type="gramEnd"/>
       <w:r>
         <w:rPr>
           <w:b/>
@@ -4827,6 +4999,7 @@
         </w:rPr>
         <w:t>;</w:t>
       </w:r>
+      <w:proofErr w:type="gramStart"/>
       <w:r>
         <w:rPr>
           <w:sz w:val="20"/>
@@ -4834,6 +5007,7 @@
         </w:rPr>
         <w:t>Spanish;English</w:t>
       </w:r>
+      <w:proofErr w:type="gramEnd"/>
     </w:p>
     <w:p>
       <w:pPr>
@@ -4921,7 +5095,13 @@
         <w:ind w:firstLine="708"/>
       </w:pPr>
       <w:r>
-        <w:t>A continuación detallaremos cada una de las columnas, sin embargo, antes de ello hay que hacer algunas aclaraciones.</w:t>
+        <w:t>A continuación</w:t>
+      </w:r>
+      <w:r>
+        <w:t>,</w:t>
+      </w:r>
+      <w:r>
+        <w:t xml:space="preserve"> detallaremos cada una de las columnas, sin embargo, antes de ello hay que hacer algunas aclaraciones.</w:t>
       </w:r>
     </w:p>
     <w:p>
@@ -4957,7 +5137,19 @@
         </w:numPr>
       </w:pPr>
       <w:r>
-        <w:t>Notarás que en las explicaciones de algunos campos hay un número entre paréntesis, ese número representa su valor por defecto.</w:t>
+        <w:t xml:space="preserve">Notarás que en las explicaciones de algunos campos hay un </w:t>
+      </w:r>
+      <w:r>
+        <w:t>valor</w:t>
+      </w:r>
+      <w:r>
+        <w:t xml:space="preserve"> entre paréntesis, ese </w:t>
+      </w:r>
+      <w:r>
+        <w:t>valor</w:t>
+      </w:r>
+      <w:r>
+        <w:t xml:space="preserve"> representa su valor por defecto.</w:t>
       </w:r>
     </w:p>
     <w:p>
@@ -4992,13 +5184,37 @@
     <w:p>
       <w:r>
         <w:tab/>
-        <w:t>Esta columna representa un identificador único que debe tener cada diálogo, ese identificador debe ser estrictamente irrepetible en el resto de escenas del juego. Esto ayudará en la organización al momento de corregir errores ya que sabrás exactamente en qué línea está el problema.</w:t>
+        <w:t xml:space="preserve">Esta columna representa un identificador único que debe tener cada diálogo, ese identificador debe ser estrictamente irrepetible en el resto de </w:t>
+      </w:r>
+      <w:proofErr w:type="gramStart"/>
+      <w:r>
+        <w:t>escenas</w:t>
+      </w:r>
+      <w:proofErr w:type="gramEnd"/>
+      <w:r>
+        <w:t xml:space="preserve"> del juego. Esto ayudará en la organización al momento de corregir errores ya que sabrás exactamente en qué línea está el problema.</w:t>
       </w:r>
     </w:p>
     <w:p>
       <w:r>
         <w:tab/>
-        <w:t>El valor recomendado para colocar en esta columna key es el siguiente: [ruta]_[capitulo]_[escena]_[dialogo], por ejemplo si queremos describir el diálogo número 89 de la escena noche de paseo del capítulo 3 de la ruta Stefannie, haríamos algo así: stefannie_3_night_out_89, el siguiente diálogo sería igual pero con un 90 en vez de 89 y siempre empezando en 1.</w:t>
+        <w:t xml:space="preserve">El valor recomendado para colocar en esta columna key es el siguiente: [ruta]_[capitulo]_[escena]_[dialogo], por </w:t>
+      </w:r>
+      <w:proofErr w:type="gramStart"/>
+      <w:r>
+        <w:t>ejemplo</w:t>
+      </w:r>
+      <w:proofErr w:type="gramEnd"/>
+      <w:r>
+        <w:t xml:space="preserve"> si queremos describir el diálogo número 89 de la escena noche de paseo del capítulo 3 de la ruta Stefannie, haríamos algo así: stefannie_3_night_out_89, el siguiente diálogo sería </w:t>
+      </w:r>
+      <w:proofErr w:type="gramStart"/>
+      <w:r>
+        <w:t>igual</w:t>
+      </w:r>
+      <w:proofErr w:type="gramEnd"/>
+      <w:r>
+        <w:t xml:space="preserve"> pero con un 90 en vez de 89 y siempre empezando en 1.</w:t>
       </w:r>
     </w:p>
     <w:p>
@@ -5006,7 +5222,15 @@
         <w:ind w:firstLine="708"/>
       </w:pPr>
       <w:r>
-        <w:t>Debido a que puede llegar a ser demasiado tedioso escribir a mano todos los números, Excel nos brinda una ayuda, primero abrimos el archivo usando Excel, escribimos en la primera fila (después de la cabecera) stefannie_3_night_out_1, acto seguido dirigimos el cursor a la esquina inferior derecha de la celda seleccionada y manteniendo el click, lo arrastramos hacia abajo hasta donde veamos necesario.</w:t>
+        <w:t xml:space="preserve">Debido a que puede llegar a ser demasiado tedioso escribir a mano todos los números, Excel nos brinda una ayuda, primero abrimos el archivo usando Excel, escribimos en la primera fila (después de la cabecera) stefannie_3_night_out_1, acto seguido dirigimos el cursor a la esquina inferior derecha de la celda seleccionada y manteniendo el </w:t>
+      </w:r>
+      <w:proofErr w:type="gramStart"/>
+      <w:r>
+        <w:t>click</w:t>
+      </w:r>
+      <w:proofErr w:type="gramEnd"/>
+      <w:r>
+        <w:t>, lo arrastramos hacia abajo hasta donde veamos necesario.</w:t>
       </w:r>
     </w:p>
     <w:p>
@@ -5018,13 +5242,72 @@
           <w:noProof/>
         </w:rPr>
         <w:drawing>
-          <wp:anchor distT="0" distB="0" distL="114300" distR="114300" simplePos="0" relativeHeight="251662336" behindDoc="0" locked="0" layoutInCell="1" allowOverlap="1" wp14:anchorId="64B85F69" wp14:editId="2245589D">
+          <wp:anchor distT="0" distB="0" distL="114300" distR="114300" simplePos="0" relativeHeight="251663360" behindDoc="0" locked="0" layoutInCell="1" allowOverlap="1" wp14:anchorId="461CB017" wp14:editId="0AE9517A">
+            <wp:simplePos x="0" y="0"/>
+            <wp:positionH relativeFrom="margin">
+              <wp:align>right</wp:align>
+            </wp:positionH>
+            <wp:positionV relativeFrom="margin">
+              <wp:posOffset>3595370</wp:posOffset>
+            </wp:positionV>
+            <wp:extent cx="2466975" cy="2581275"/>
+            <wp:effectExtent l="0" t="0" r="9525" b="9525"/>
+            <wp:wrapSquare wrapText="bothSides"/>
+            <wp:docPr id="1359445564" name="Imagen 1"/>
+            <wp:cNvGraphicFramePr>
+              <a:graphicFrameLocks xmlns:a="http://schemas.openxmlformats.org/drawingml/2006/main" noChangeAspect="1"/>
+            </wp:cNvGraphicFramePr>
+            <a:graphic xmlns:a="http://schemas.openxmlformats.org/drawingml/2006/main">
+              <a:graphicData uri="http://schemas.openxmlformats.org/drawingml/2006/picture">
+                <pic:pic xmlns:pic="http://schemas.openxmlformats.org/drawingml/2006/picture">
+                  <pic:nvPicPr>
+                    <pic:cNvPr id="1359445564" name=""/>
+                    <pic:cNvPicPr/>
+                  </pic:nvPicPr>
+                  <pic:blipFill>
+                    <a:blip r:embed="rId25">
+                      <a:extLst>
+                        <a:ext uri="{28A0092B-C50C-407E-A947-70E740481C1C}">
+                          <a14:useLocalDpi xmlns:a14="http://schemas.microsoft.com/office/drawing/2010/main" val="0"/>
+                        </a:ext>
+                      </a:extLst>
+                    </a:blip>
+                    <a:stretch>
+                      <a:fillRect/>
+                    </a:stretch>
+                  </pic:blipFill>
+                  <pic:spPr>
+                    <a:xfrm>
+                      <a:off x="0" y="0"/>
+                      <a:ext cx="2466975" cy="2581275"/>
+                    </a:xfrm>
+                    <a:prstGeom prst="rect">
+                      <a:avLst/>
+                    </a:prstGeom>
+                  </pic:spPr>
+                </pic:pic>
+              </a:graphicData>
+            </a:graphic>
+          </wp:anchor>
+        </w:drawing>
+      </w:r>
+    </w:p>
+    <w:p>
+      <w:pPr>
+        <w:ind w:firstLine="708"/>
+      </w:pPr>
+      <w:r>
+        <w:rPr>
+          <w:noProof/>
+        </w:rPr>
+        <w:drawing>
+          <wp:anchor distT="0" distB="0" distL="114300" distR="114300" simplePos="0" relativeHeight="251662336" behindDoc="0" locked="0" layoutInCell="1" allowOverlap="1" wp14:anchorId="64B85F69" wp14:editId="659DC692">
             <wp:simplePos x="0" y="0"/>
             <wp:positionH relativeFrom="margin">
               <wp:posOffset>123825</wp:posOffset>
             </wp:positionH>
             <wp:positionV relativeFrom="margin">
-              <wp:posOffset>798195</wp:posOffset>
+              <wp:posOffset>4011295</wp:posOffset>
             </wp:positionV>
             <wp:extent cx="2228850" cy="733425"/>
             <wp:effectExtent l="0" t="0" r="0" b="9525"/>
@@ -5041,7 +5324,7 @@
                     <pic:cNvPicPr/>
                   </pic:nvPicPr>
                   <pic:blipFill>
-                    <a:blip r:embed="rId25">
+                    <a:blip r:embed="rId26">
                       <a:extLst>
                         <a:ext uri="{28A0092B-C50C-407E-A947-70E740481C1C}">
                           <a14:useLocalDpi xmlns:a14="http://schemas.microsoft.com/office/drawing/2010/main" val="0"/>
@@ -5067,60 +5350,36 @@
           </wp:anchor>
         </w:drawing>
       </w:r>
-      <w:r>
-        <w:rPr>
-          <w:noProof/>
-        </w:rPr>
-        <w:drawing>
-          <wp:anchor distT="0" distB="0" distL="114300" distR="114300" simplePos="0" relativeHeight="251663360" behindDoc="0" locked="0" layoutInCell="1" allowOverlap="1" wp14:anchorId="461CB017" wp14:editId="21BB9DD7">
-            <wp:simplePos x="0" y="0"/>
-            <wp:positionH relativeFrom="margin">
-              <wp:posOffset>2776220</wp:posOffset>
-            </wp:positionH>
-            <wp:positionV relativeFrom="margin">
-              <wp:posOffset>712470</wp:posOffset>
-            </wp:positionV>
-            <wp:extent cx="2466975" cy="2581275"/>
-            <wp:effectExtent l="0" t="0" r="9525" b="9525"/>
-            <wp:wrapSquare wrapText="bothSides"/>
-            <wp:docPr id="1359445564" name="Imagen 1"/>
-            <wp:cNvGraphicFramePr>
-              <a:graphicFrameLocks xmlns:a="http://schemas.openxmlformats.org/drawingml/2006/main" noChangeAspect="1"/>
-            </wp:cNvGraphicFramePr>
-            <a:graphic xmlns:a="http://schemas.openxmlformats.org/drawingml/2006/main">
-              <a:graphicData uri="http://schemas.openxmlformats.org/drawingml/2006/picture">
-                <pic:pic xmlns:pic="http://schemas.openxmlformats.org/drawingml/2006/picture">
-                  <pic:nvPicPr>
-                    <pic:cNvPr id="1359445564" name=""/>
-                    <pic:cNvPicPr/>
-                  </pic:nvPicPr>
-                  <pic:blipFill>
-                    <a:blip r:embed="rId26">
-                      <a:extLst>
-                        <a:ext uri="{28A0092B-C50C-407E-A947-70E740481C1C}">
-                          <a14:useLocalDpi xmlns:a14="http://schemas.microsoft.com/office/drawing/2010/main" val="0"/>
-                        </a:ext>
-                      </a:extLst>
-                    </a:blip>
-                    <a:stretch>
-                      <a:fillRect/>
-                    </a:stretch>
-                  </pic:blipFill>
-                  <pic:spPr>
-                    <a:xfrm>
-                      <a:off x="0" y="0"/>
-                      <a:ext cx="2466975" cy="2581275"/>
-                    </a:xfrm>
-                    <a:prstGeom prst="rect">
-                      <a:avLst/>
-                    </a:prstGeom>
-                  </pic:spPr>
-                </pic:pic>
-              </a:graphicData>
-            </a:graphic>
-          </wp:anchor>
-        </w:drawing>
-      </w:r>
+    </w:p>
+    <w:p>
+      <w:pPr>
+        <w:ind w:firstLine="708"/>
+      </w:pPr>
+    </w:p>
+    <w:p>
+      <w:pPr>
+        <w:ind w:firstLine="708"/>
+      </w:pPr>
+    </w:p>
+    <w:p>
+      <w:pPr>
+        <w:ind w:firstLine="708"/>
+      </w:pPr>
+    </w:p>
+    <w:p>
+      <w:pPr>
+        <w:ind w:firstLine="708"/>
+      </w:pPr>
+    </w:p>
+    <w:p>
+      <w:pPr>
+        <w:ind w:firstLine="708"/>
+      </w:pPr>
+    </w:p>
+    <w:p>
+      <w:pPr>
+        <w:ind w:firstLine="708"/>
+      </w:pPr>
       <w:r>
         <w:t xml:space="preserve"> </w:t>
       </w:r>
@@ -5169,6 +5428,7 @@
         <w:pStyle w:val="Ttulo2"/>
       </w:pPr>
       <w:r>
+        <w:lastRenderedPageBreak/>
         <w:t>Columna Background</w:t>
       </w:r>
       <w:bookmarkEnd w:id="8"/>
@@ -5176,10 +5436,28 @@
     <w:p>
       <w:r>
         <w:tab/>
-        <w:t>En esta columna vamos a escribir los fondos que queremos que muestre el juego, así como la forma en que aparecen,</w:t>
-      </w:r>
-      <w:r>
-        <w:t xml:space="preserve"> deben estar en formato .png y tener una resolución de 1920x1080</w:t>
+        <w:t xml:space="preserve">En esta columna vamos a escribir los fondos que queremos que muestre el juego, así como </w:t>
+      </w:r>
+      <w:r>
+        <w:t>el método de aparición</w:t>
+      </w:r>
+      <w:r>
+        <w:t xml:space="preserve"> </w:t>
+      </w:r>
+      <w:r>
+        <w:t>que ejecutan</w:t>
+      </w:r>
+      <w:r>
+        <w:t>,</w:t>
+      </w:r>
+      <w:r>
+        <w:t xml:space="preserve"> deben estar en formato .png</w:t>
+      </w:r>
+      <w:r>
+        <w:t>,</w:t>
+      </w:r>
+      <w:r>
+        <w:t xml:space="preserve"> tener una resolución de 1920x1080</w:t>
       </w:r>
       <w:r>
         <w:t xml:space="preserve"> y estar ubicados en</w:t>
@@ -5206,8 +5484,23 @@
         <w:ind w:firstLine="708"/>
       </w:pPr>
       <w:r>
-        <w:lastRenderedPageBreak/>
-        <w:t>Nombre del fondo : tipo de transición : parámetros de la transición</w:t>
+        <w:t xml:space="preserve">Nombre del </w:t>
+      </w:r>
+      <w:proofErr w:type="gramStart"/>
+      <w:r>
+        <w:t>fondo :</w:t>
+      </w:r>
+      <w:proofErr w:type="gramEnd"/>
+      <w:r>
+        <w:t xml:space="preserve"> tipo de </w:t>
+      </w:r>
+      <w:proofErr w:type="gramStart"/>
+      <w:r>
+        <w:t>transición :</w:t>
+      </w:r>
+      <w:proofErr w:type="gramEnd"/>
+      <w:r>
+        <w:t xml:space="preserve"> parámetros de la transición</w:t>
       </w:r>
     </w:p>
     <w:p>
@@ -5215,63 +5508,37 @@
         <w:ind w:firstLine="708"/>
       </w:pPr>
       <w:r>
-        <w:t xml:space="preserve">El nombre del fondo es el que hayamos colocado en la definición de fondos, por supuesto, sustituyendo los espacios con _. Si colocamos el nombre del fondo sin más, por defecto el motor mostrará el fondo con desvanecimiento del fondo actual y una aparición del </w:t>
+        <w:t>El nombre del fondo es el que hayamos colocado en la definición de fondos</w:t>
+      </w:r>
+      <w:r>
+        <w:t xml:space="preserve"> del archivo </w:t>
+      </w:r>
+      <w:r>
+        <w:rPr>
+          <w:i/>
+          <w:iCs/>
+        </w:rPr>
+        <w:t>config.csv</w:t>
+      </w:r>
+      <w:r>
+        <w:t xml:space="preserve">. </w:t>
+      </w:r>
+      <w:r>
+        <w:t xml:space="preserve">Si colocamos el nombre del fondo sin más, por defecto el motor mostrará el fondo con desvanecimiento del fondo actual y una aparición del </w:t>
       </w:r>
       <w:r>
         <w:t>siguiente fondo</w:t>
       </w:r>
       <w:r>
-        <w:t xml:space="preserve"> a lo largo de 2 segundos.</w:t>
-      </w:r>
-    </w:p>
-    <w:p>
-      <w:r>
-        <w:rPr>
-          <w:highlight w:val="yellow"/>
-        </w:rPr>
-        <w:t>school_hall_3:dissolve:4</w:t>
-      </w:r>
-      <w:r>
-        <w:t xml:space="preserve"> (El fondo school_hall_3 aparece a lo largo de 4 segundos)</w:t>
-      </w:r>
-    </w:p>
-    <w:p>
-      <w:r>
-        <w:rPr>
-          <w:highlight w:val="yellow"/>
-        </w:rPr>
-        <w:t>campus:fade:1:3:1</w:t>
-      </w:r>
-      <w:r>
-        <w:t xml:space="preserve"> (El fondo campus aparece luego de un fundido a negro)</w:t>
-      </w:r>
-    </w:p>
-    <w:p>
-      <w:r>
-        <w:rPr>
-          <w:highlight w:val="yellow"/>
-        </w:rPr>
-        <w:t>music_room</w:t>
-      </w:r>
-      <w:r>
-        <w:t xml:space="preserve"> (Aparece con la transición por defecto)</w:t>
-      </w:r>
-    </w:p>
-    <w:p>
-      <w:pPr>
-        <w:pStyle w:val="Prrafodelista"/>
-        <w:ind w:left="1428"/>
-      </w:pPr>
-    </w:p>
-    <w:p>
-      <w:pPr>
-        <w:pStyle w:val="Prrafodelista"/>
-        <w:ind w:left="1428"/>
-      </w:pPr>
-    </w:p>
-    <w:p/>
-    <w:p/>
-    <w:p/>
+        <w:t xml:space="preserve"> a lo largo de </w:t>
+      </w:r>
+      <w:r>
+        <w:t>3</w:t>
+      </w:r>
+      <w:r>
+        <w:t xml:space="preserve"> segundos.</w:t>
+      </w:r>
+    </w:p>
     <w:p>
       <w:pPr>
         <w:pStyle w:val="Ttulo3"/>
@@ -5422,7 +5689,13 @@
               <w:t>1. Los segundos que los fondos tardan en cambiar</w:t>
             </w:r>
             <w:r>
-              <w:t xml:space="preserve"> (2)</w:t>
+              <w:t xml:space="preserve"> (</w:t>
+            </w:r>
+            <w:r>
+              <w:t>3</w:t>
+            </w:r>
+            <w:r>
+              <w:t>)</w:t>
             </w:r>
           </w:p>
         </w:tc>
@@ -5588,9 +5861,11 @@
             <w:pPr>
               <w:jc w:val="center"/>
             </w:pPr>
+            <w:proofErr w:type="gramStart"/>
             <w:r>
               <w:t>pixel</w:t>
             </w:r>
+            <w:proofErr w:type="gramEnd"/>
           </w:p>
           <w:p>
             <w:pPr>
@@ -5781,9 +6056,71 @@
     </w:tbl>
     <w:p>
       <w:pPr>
+        <w:rPr>
+          <w:highlight w:val="yellow"/>
+        </w:rPr>
+      </w:pPr>
+      <w:bookmarkStart w:id="9" w:name="_Toc199261562"/>
+    </w:p>
+    <w:p>
+      <w:r>
+        <w:rPr>
+          <w:highlight w:val="yellow"/>
+        </w:rPr>
+        <w:t>school_hall_</w:t>
+      </w:r>
+      <w:proofErr w:type="gramStart"/>
+      <w:r>
+        <w:rPr>
+          <w:highlight w:val="yellow"/>
+        </w:rPr>
+        <w:t>3:dissolve</w:t>
+      </w:r>
+      <w:proofErr w:type="gramEnd"/>
+      <w:r>
+        <w:rPr>
+          <w:highlight w:val="yellow"/>
+        </w:rPr>
+        <w:t>:4</w:t>
+      </w:r>
+      <w:r>
+        <w:t xml:space="preserve"> (El fondo school_hall_3 aparece a lo largo de 4 segundos)</w:t>
+      </w:r>
+    </w:p>
+    <w:p>
+      <w:proofErr w:type="gramStart"/>
+      <w:r>
+        <w:rPr>
+          <w:highlight w:val="yellow"/>
+        </w:rPr>
+        <w:t>campus:fade</w:t>
+      </w:r>
+      <w:proofErr w:type="gramEnd"/>
+      <w:r>
+        <w:rPr>
+          <w:highlight w:val="yellow"/>
+        </w:rPr>
+        <w:t>:1:3:1</w:t>
+      </w:r>
+      <w:r>
+        <w:t xml:space="preserve"> (El fondo campus aparece luego de un fundido a negro)</w:t>
+      </w:r>
+    </w:p>
+    <w:p>
+      <w:r>
+        <w:rPr>
+          <w:highlight w:val="yellow"/>
+        </w:rPr>
+        <w:t>music_room</w:t>
+      </w:r>
+      <w:r>
+        <w:t xml:space="preserve"> (Aparece con la transición por defecto)</w:t>
+      </w:r>
+    </w:p>
+    <w:p>
+      <w:pPr>
         <w:pStyle w:val="Ttulo2"/>
       </w:pPr>
-      <w:bookmarkStart w:id="9" w:name="_Toc199261562"/>
       <w:r>
         <w:lastRenderedPageBreak/>
         <w:t>Columna Music</w:t>
@@ -5862,120 +6199,143 @@
           <w:i/>
           <w:iCs/>
         </w:rPr>
-        <w:t>configDefine.rpy</w:t>
-      </w:r>
-      <w:r>
-        <w:t>), será igual para las músicas entrantes si no se les coloca un tiempo de fade-in</w:t>
-      </w:r>
-      <w:r>
-        <w:t xml:space="preserve">. </w:t>
-      </w:r>
-      <w:r>
-        <w:t>Su sintaxis es la siguiente:</w:t>
-      </w:r>
-    </w:p>
-    <w:p>
-      <w:pPr>
-        <w:ind w:left="708" w:firstLine="708"/>
-      </w:pPr>
-      <w:r>
-        <w:t>nombre_de_la_musica : fade-in en segundos</w:t>
-      </w:r>
-    </w:p>
-    <w:p>
-      <w:pPr>
-        <w:ind w:firstLine="708"/>
-      </w:pPr>
-      <w:r>
-        <w:t xml:space="preserve">En esta ocasión, los nombres de las canciones </w:t>
-      </w:r>
-      <w:r>
-        <w:t>pueden llevar espacios</w:t>
-      </w:r>
-      <w:r>
-        <w:t xml:space="preserve"> o utilizar _, como mejor prefieras. El nombre de la canción que debes escribir es el del nombre del archivo de audio.</w:t>
-      </w:r>
-    </w:p>
-    <w:p>
-      <w:pPr>
-        <w:ind w:firstLine="708"/>
-      </w:pPr>
-      <w:r>
-        <w:t>Para quitar la música y crear un silencio, simplemente debemos colocar un *, por supuesto, también podemos acompañarlo del parámetro de fade-in</w:t>
-      </w:r>
-      <w:r>
-        <w:t xml:space="preserve"> que en este caso tomará el rol de fade-out.</w:t>
-      </w:r>
-    </w:p>
-    <w:p>
-      <w:r>
-        <w:rPr>
-          <w:highlight w:val="yellow"/>
-        </w:rPr>
-        <w:t>while we speak:4</w:t>
-      </w:r>
-      <w:r>
-        <w:t xml:space="preserve"> (La música actual hace el fade-out por defecto y la nueva fade-in de 4 segundos)</w:t>
-      </w:r>
-    </w:p>
-    <w:p>
-      <w:r>
-        <w:rPr>
-          <w:highlight w:val="yellow"/>
-        </w:rPr>
-        <w:t>stride</w:t>
-      </w:r>
-      <w:r>
-        <w:t xml:space="preserve"> (Tanto la música actual y la entrante harán un fade-out y fide-in por defecto)</w:t>
-      </w:r>
-    </w:p>
-    <w:p>
-      <w:r>
-        <w:rPr>
-          <w:highlight w:val="yellow"/>
-        </w:rPr>
-        <w:t>*:5</w:t>
-      </w:r>
-      <w:r>
-        <w:t xml:space="preserve"> (La canción actual hace un fade-out de 5 segundos al silencio)</w:t>
-      </w:r>
-    </w:p>
-    <w:p>
-      <w:r>
-        <w:rPr>
-          <w:highlight w:val="yellow"/>
-        </w:rPr>
-        <w:t>*:0</w:t>
-      </w:r>
-      <w:r>
-        <w:t xml:space="preserve"> (La canción actual se detiene de golpe)</w:t>
-      </w:r>
-    </w:p>
-    <w:p>
-      <w:pPr>
-        <w:ind w:left="708"/>
-      </w:pPr>
-    </w:p>
-    <w:p>
-      <w:pPr>
-        <w:pStyle w:val="Ttulo2"/>
-      </w:pPr>
-      <w:bookmarkStart w:id="10" w:name="_Toc199261563"/>
-      <w:r>
-        <w:t>Columna Sound</w:t>
-      </w:r>
-      <w:bookmarkEnd w:id="10"/>
-    </w:p>
-    <w:p>
-      <w:r>
-        <w:tab/>
-        <w:t xml:space="preserve">Los sonidos que se reproducen en el diálogo, pueden ser varios a la vez. Deben estar en formato .wav y estar ubicados en la carpeta </w:t>
+        <w:t>definitions/</w:t>
       </w:r>
       <w:r>
         <w:rPr>
           <w:i/>
           <w:iCs/>
         </w:rPr>
+        <w:t>configDefine.rpy</w:t>
+      </w:r>
+      <w:r>
+        <w:t>), será igual para las músicas entrantes si no se les coloca un tiempo de fade-in</w:t>
+      </w:r>
+      <w:r>
+        <w:t xml:space="preserve">. </w:t>
+      </w:r>
+      <w:r>
+        <w:t>Su sintaxis es la siguiente:</w:t>
+      </w:r>
+    </w:p>
+    <w:p>
+      <w:pPr>
+        <w:ind w:left="708" w:firstLine="708"/>
+      </w:pPr>
+      <w:r>
+        <w:t>nombre_de_la_</w:t>
+      </w:r>
+      <w:proofErr w:type="gramStart"/>
+      <w:r>
+        <w:t>musica :</w:t>
+      </w:r>
+      <w:proofErr w:type="gramEnd"/>
+      <w:r>
+        <w:t xml:space="preserve"> fade-in en segundos</w:t>
+      </w:r>
+    </w:p>
+    <w:p>
+      <w:pPr>
+        <w:ind w:firstLine="708"/>
+      </w:pPr>
+      <w:r>
+        <w:t xml:space="preserve">En esta ocasión, los nombres de las canciones </w:t>
+      </w:r>
+      <w:r>
+        <w:t>pueden llevar espacios</w:t>
+      </w:r>
+      <w:r>
+        <w:t>, como mejor prefieras. El nombre de la canción que debes escribir es el del nombre del archivo de audio.</w:t>
+      </w:r>
+    </w:p>
+    <w:p>
+      <w:pPr>
+        <w:ind w:firstLine="708"/>
+      </w:pPr>
+      <w:r>
+        <w:t>Para quitar la música y crear un silencio, simplemente debemos colocar un *, por supuesto, también podemos acompañarlo del parámetro de fade-in</w:t>
+      </w:r>
+      <w:r>
+        <w:t xml:space="preserve"> que en este caso tomará el rol de fade-out.</w:t>
+      </w:r>
+    </w:p>
+    <w:p>
+      <w:r>
+        <w:rPr>
+          <w:highlight w:val="yellow"/>
+        </w:rPr>
+        <w:t>while we speak:4</w:t>
+      </w:r>
+      <w:r>
+        <w:t xml:space="preserve"> (La música actual hace el fade-out por defecto y la nueva fade-in de 4 segundos)</w:t>
+      </w:r>
+    </w:p>
+    <w:p>
+      <w:r>
+        <w:rPr>
+          <w:highlight w:val="yellow"/>
+        </w:rPr>
+        <w:t>stride</w:t>
+      </w:r>
+      <w:r>
+        <w:t xml:space="preserve"> (Tanto la música actual y la entrante harán un fade-out y fide-in por defecto)</w:t>
+      </w:r>
+    </w:p>
+    <w:p>
+      <w:r>
+        <w:rPr>
+          <w:highlight w:val="yellow"/>
+        </w:rPr>
+        <w:t>*:5</w:t>
+      </w:r>
+      <w:r>
+        <w:t xml:space="preserve"> (La canción actual hace un fade-out de 5 segundos al silencio)</w:t>
+      </w:r>
+    </w:p>
+    <w:p>
+      <w:r>
+        <w:rPr>
+          <w:highlight w:val="yellow"/>
+        </w:rPr>
+        <w:t>*:0</w:t>
+      </w:r>
+      <w:r>
+        <w:t xml:space="preserve"> (La canción actual se detiene de golpe)</w:t>
+      </w:r>
+    </w:p>
+    <w:p>
+      <w:pPr>
+        <w:ind w:left="708"/>
+      </w:pPr>
+    </w:p>
+    <w:p>
+      <w:pPr>
+        <w:pStyle w:val="Ttulo2"/>
+      </w:pPr>
+      <w:bookmarkStart w:id="10" w:name="_Toc199261563"/>
+      <w:r>
+        <w:t>Columna Sound</w:t>
+      </w:r>
+      <w:bookmarkEnd w:id="10"/>
+    </w:p>
+    <w:p>
+      <w:r>
+        <w:tab/>
+        <w:t xml:space="preserve">Los sonidos que se reproducen en el </w:t>
+      </w:r>
+      <w:proofErr w:type="gramStart"/>
+      <w:r>
+        <w:t>diálogo,</w:t>
+      </w:r>
+      <w:proofErr w:type="gramEnd"/>
+      <w:r>
+        <w:t xml:space="preserve"> pueden ser varios a la vez. Deben estar en formato .wav y estar ubicados en la carpeta </w:t>
+      </w:r>
+      <w:r>
+        <w:rPr>
+          <w:i/>
+          <w:iCs/>
+        </w:rPr>
         <w:t>games/audio/sounds</w:t>
       </w:r>
       <w:r>
@@ -6003,37 +6363,67 @@
     <w:p>
       <w:r>
         <w:tab/>
-        <w:t>Nombre del sonido : loop</w:t>
+        <w:t xml:space="preserve">Nombre del </w:t>
+      </w:r>
+      <w:proofErr w:type="gramStart"/>
+      <w:r>
+        <w:t>sonido :</w:t>
+      </w:r>
+      <w:proofErr w:type="gramEnd"/>
+      <w:r>
+        <w:t xml:space="preserve"> loop</w:t>
       </w:r>
     </w:p>
     <w:p>
       <w:r>
         <w:tab/>
-        <w:t xml:space="preserve">El nombre del sonido que se va a escribir debe ser el mismo que el archivo de audio, puedes utilizar espacios en los nombres o reemplazarlos por _, sin embargo, en los nombres de los archivos de audio siempre deben estar por </w:t>
-      </w:r>
-      <w:r>
-        <w:t>espacios</w:t>
+        <w:t xml:space="preserve">El nombre del sonido que se va a escribir debe ser el mismo que el archivo de audio, puedes utilizar espacios en los </w:t>
+      </w:r>
+      <w:r>
+        <w:t>nombres</w:t>
       </w:r>
       <w:r>
         <w:t>.</w:t>
       </w:r>
       <w:r>
-        <w:t xml:space="preserve"> Las mayúsculas no se respetan, de todas formas se recomienda escribirlo todo en minúscula.</w:t>
+        <w:t xml:space="preserve"> Las mayúsculas no se respetan, de todas </w:t>
+      </w:r>
+      <w:proofErr w:type="gramStart"/>
+      <w:r>
+        <w:t>formas</w:t>
+      </w:r>
+      <w:proofErr w:type="gramEnd"/>
+      <w:r>
+        <w:t xml:space="preserve"> se recomienda escribirlo todo en minúscula.</w:t>
       </w:r>
     </w:p>
     <w:p>
       <w:r>
         <w:lastRenderedPageBreak/>
         <w:tab/>
-        <w:t xml:space="preserve">Si colocamos el nombre del sonido sin más, este se reproducirá una sola vez. Para reproducir varios sonidos simultáneamente, debemos separarlos por comas. Si deseamos que el sonido se reproduzca constantemente debemos añadir :loop, es importante mencionar que hacer eso hará que el sonido se reproduzca indefinidamente hasta que volvamos a escribir la misma instrucción más adelante. </w:t>
-      </w:r>
-    </w:p>
-    <w:p>
-      <w:r>
-        <w:rPr>
-          <w:highlight w:val="yellow"/>
-        </w:rPr>
-        <w:t>Golpe</w:t>
+        <w:t xml:space="preserve">Si colocamos el nombre del sonido sin más, este se reproducirá una sola vez. Para reproducir varios sonidos simultáneamente, debemos separarlos por comas. Si deseamos que el sonido se reproduzca constantemente debemos </w:t>
+      </w:r>
+      <w:proofErr w:type="gramStart"/>
+      <w:r>
+        <w:t>añadir :loop</w:t>
+      </w:r>
+      <w:proofErr w:type="gramEnd"/>
+      <w:r>
+        <w:t xml:space="preserve">, es importante mencionar que hacer eso hará que el sonido se reproduzca indefinidamente hasta que volvamos a escribir la misma instrucción más adelante. </w:t>
+      </w:r>
+    </w:p>
+    <w:p>
+      <w:r>
+        <w:rPr>
+          <w:highlight w:val="yellow"/>
+        </w:rPr>
+        <w:t>g</w:t>
+      </w:r>
+      <w:r>
+        <w:rPr>
+          <w:highlight w:val="yellow"/>
+        </w:rPr>
+        <w:t>olpe</w:t>
       </w:r>
       <w:r>
         <w:t xml:space="preserve"> (Reproduce golpe una sola vez)</w:t>
@@ -6044,7 +6434,25 @@
         <w:rPr>
           <w:highlight w:val="yellow"/>
         </w:rPr>
-        <w:t>Golpe, Latidos</w:t>
+        <w:t>g</w:t>
+      </w:r>
+      <w:r>
+        <w:rPr>
+          <w:highlight w:val="yellow"/>
+        </w:rPr>
+        <w:t xml:space="preserve">olpe, </w:t>
+      </w:r>
+      <w:r>
+        <w:rPr>
+          <w:highlight w:val="yellow"/>
+        </w:rPr>
+        <w:t>l</w:t>
+      </w:r>
+      <w:r>
+        <w:rPr>
+          <w:highlight w:val="yellow"/>
+        </w:rPr>
+        <w:t>atidos</w:t>
       </w:r>
       <w:r>
         <w:t xml:space="preserve"> (Reproduce golpe y latidos una sola vez al mismo tiempo) </w:t>
@@ -6055,10 +6463,38 @@
         <w:rPr>
           <w:highlight w:val="yellow"/>
         </w:rPr>
-        <w:t>Espadas chocando:loop</w:t>
-      </w:r>
-      <w:r>
-        <w:t xml:space="preserve"> (Reproduce espadas chocando indefinidamente hasta que se vuelva a escribir Espadas chocando:loop en un diálogo posterior).</w:t>
+        <w:t>e</w:t>
+      </w:r>
+      <w:r>
+        <w:rPr>
+          <w:highlight w:val="yellow"/>
+        </w:rPr>
+        <w:t xml:space="preserve">spadas </w:t>
+      </w:r>
+      <w:proofErr w:type="gramStart"/>
+      <w:r>
+        <w:rPr>
+          <w:highlight w:val="yellow"/>
+        </w:rPr>
+        <w:t>chocando:loop</w:t>
+      </w:r>
+      <w:proofErr w:type="gramEnd"/>
+      <w:r>
+        <w:t xml:space="preserve"> (Reproduce espadas chocando indefinidamente hasta que se vuelva a escribir </w:t>
+      </w:r>
+      <w:r>
+        <w:t>e</w:t>
+      </w:r>
+      <w:r>
+        <w:t xml:space="preserve">spadas </w:t>
+      </w:r>
+      <w:proofErr w:type="gramStart"/>
+      <w:r>
+        <w:t>chocando:loop</w:t>
+      </w:r>
+      <w:proofErr w:type="gramEnd"/>
+      <w:r>
+        <w:t xml:space="preserve"> en un diálogo posterior).</w:t>
       </w:r>
     </w:p>
     <w:p>
@@ -6066,7 +6502,15 @@
         <w:ind w:left="360" w:firstLine="348"/>
       </w:pPr>
       <w:r>
-        <w:t xml:space="preserve">Se debe tener en cuenta que si un sonido está en loop y se reproduce </w:t>
+        <w:t xml:space="preserve">Se debe tener en cuenta </w:t>
+      </w:r>
+      <w:proofErr w:type="gramStart"/>
+      <w:r>
+        <w:t>que</w:t>
+      </w:r>
+      <w:proofErr w:type="gramEnd"/>
+      <w:r>
+        <w:t xml:space="preserve"> si un sonido está en loop y se reproduce </w:t>
       </w:r>
       <w:r>
         <w:t>otro</w:t>
@@ -6095,27 +6539,64 @@
       </w:pPr>
       <w:bookmarkStart w:id="11" w:name="_Toc199261564"/>
       <w:r>
-        <w:t>Columna Single effect</w:t>
+        <w:t xml:space="preserve">Columna </w:t>
+      </w:r>
+      <w:proofErr w:type="gramStart"/>
+      <w:r>
+        <w:t>Single</w:t>
+      </w:r>
+      <w:proofErr w:type="gramEnd"/>
+      <w:r>
+        <w:t xml:space="preserve"> effect</w:t>
       </w:r>
       <w:bookmarkEnd w:id="11"/>
     </w:p>
     <w:p>
       <w:r>
         <w:tab/>
-        <w:t>Son efectos visuales que suceden una única vez, como una sacudida de pantalla o flash repentino. Sintaxis:</w:t>
+        <w:t xml:space="preserve">Son efectos visuales que suceden una única vez, como una sacudida de pantalla o </w:t>
+      </w:r>
+      <w:proofErr w:type="gramStart"/>
+      <w:r>
+        <w:t>flash</w:t>
+      </w:r>
+      <w:proofErr w:type="gramEnd"/>
+      <w:r>
+        <w:t xml:space="preserve"> repentino. Sintaxis:</w:t>
       </w:r>
     </w:p>
     <w:p>
       <w:r>
         <w:tab/>
-        <w:t>Nombre_del_efecto : parámetros</w:t>
+        <w:t>Nombre_del_</w:t>
+      </w:r>
+      <w:proofErr w:type="gramStart"/>
+      <w:r>
+        <w:t>efecto :</w:t>
+      </w:r>
+      <w:proofErr w:type="gramEnd"/>
+      <w:r>
+        <w:t xml:space="preserve"> parámetros</w:t>
       </w:r>
     </w:p>
     <w:p>
       <w:r>
         <w:tab/>
-        <w:t>Nombre_del_efecto_1:parámetros, Nombre_del_efecto_2:parámetros</w:t>
-      </w:r>
+        <w:t>Nombre_del_efecto_</w:t>
+      </w:r>
+      <w:proofErr w:type="gramStart"/>
+      <w:r>
+        <w:t>1:parámetros</w:t>
+      </w:r>
+      <w:proofErr w:type="gramEnd"/>
+      <w:r>
+        <w:t>, Nombre_del_efecto_</w:t>
+      </w:r>
+      <w:proofErr w:type="gramStart"/>
+      <w:r>
+        <w:t>2:parámetros</w:t>
+      </w:r>
+      <w:proofErr w:type="gramEnd"/>
     </w:p>
     <w:p>
       <w:r>
@@ -6441,15 +6922,26 @@
         <w:t xml:space="preserve"> mostrando el fondo 0.1 segundos cada vez</w:t>
       </w:r>
       <w:r>
+        <w:t xml:space="preserve"> simulando una especie de flashback</w:t>
+      </w:r>
+      <w:r>
         <w:t>)</w:t>
       </w:r>
     </w:p>
     <w:p>
-      <w:r>
-        <w:rPr>
-          <w:highlight w:val="yellow"/>
-        </w:rPr>
-        <w:t>flash:0.25:1</w:t>
+      <w:proofErr w:type="gramStart"/>
+      <w:r>
+        <w:rPr>
+          <w:highlight w:val="yellow"/>
+        </w:rPr>
+        <w:t>flash</w:t>
+      </w:r>
+      <w:proofErr w:type="gramEnd"/>
+      <w:r>
+        <w:rPr>
+          <w:highlight w:val="yellow"/>
+        </w:rPr>
+        <w:t>:0.25:1</w:t>
       </w:r>
       <w:r>
         <w:t xml:space="preserve"> (Muestra un fondo blanco una única vez durante 0.25 segundos simulando un destello repentino)</w:t>
@@ -6480,7 +6972,15 @@
     <w:p>
       <w:r>
         <w:tab/>
-        <w:t>Es similar a los Single Effects, solo que esta vez es un efecto que sucede constantemente en pantalla y persiste indefinidamente hasta que se vuelva a llamar</w:t>
+        <w:t xml:space="preserve">Es similar a los </w:t>
+      </w:r>
+      <w:proofErr w:type="gramStart"/>
+      <w:r>
+        <w:t>Single</w:t>
+      </w:r>
+      <w:proofErr w:type="gramEnd"/>
+      <w:r>
+        <w:t xml:space="preserve"> Effects, solo que esta vez es un efecto que sucede constantemente en pantalla y persiste indefinidamente hasta que se vuelva a llamar</w:t>
       </w:r>
       <w:r>
         <w:t>. Se pueden dividir en dos, aquellos efectos continuos que interactúan con el fondo actual, y aquellos que colocan una imagen por encima.</w:t>
@@ -6495,19 +6995,51 @@
         <w:t>a sintaxis es la misma que la de</w:t>
       </w:r>
       <w:r>
-        <w:t xml:space="preserve"> los Single Effects.</w:t>
+        <w:t xml:space="preserve"> los </w:t>
+      </w:r>
+      <w:proofErr w:type="gramStart"/>
+      <w:r>
+        <w:t>Single</w:t>
+      </w:r>
+      <w:proofErr w:type="gramEnd"/>
+      <w:r>
+        <w:t xml:space="preserve"> Effects.</w:t>
       </w:r>
     </w:p>
     <w:p>
       <w:r>
         <w:tab/>
-        <w:t>Nombre_del_efecto : parámetros</w:t>
+        <w:t>Nombre_del_</w:t>
+      </w:r>
+      <w:proofErr w:type="gramStart"/>
+      <w:r>
+        <w:t>efecto :</w:t>
+      </w:r>
+      <w:proofErr w:type="gramEnd"/>
+      <w:r>
+        <w:t xml:space="preserve"> parámetros</w:t>
       </w:r>
     </w:p>
     <w:p>
       <w:r>
         <w:tab/>
-        <w:t>Nombre_del_efecto_1 : parámetros, Nombre_del_efecto_2 : parámetros</w:t>
+        <w:t>Nombre_del_efecto_</w:t>
+      </w:r>
+      <w:proofErr w:type="gramStart"/>
+      <w:r>
+        <w:t>1 :</w:t>
+      </w:r>
+      <w:proofErr w:type="gramEnd"/>
+      <w:r>
+        <w:t xml:space="preserve"> parámetros, Nombre_del_efecto_</w:t>
+      </w:r>
+      <w:proofErr w:type="gramStart"/>
+      <w:r>
+        <w:t>2 :</w:t>
+      </w:r>
+      <w:proofErr w:type="gramEnd"/>
+      <w:r>
+        <w:t xml:space="preserve"> parámetros</w:t>
       </w:r>
     </w:p>
     <w:p>
@@ -7073,17 +7605,40 @@
         <w:t xml:space="preserve">Aquí describiremos todas las acciones relacionadas con los personajes que se verán en pantalla, desde su aparición, destrucción, movimientos, cambios de Sprite y algunas animaciones predefinidas. </w:t>
       </w:r>
       <w:r>
-        <w:t>En cuanto a las medidas del Sprite, estos son muy flexibles, la altura recomendada es de 1168 pixeles y en cuanto al ancho, dependerá del personaje. Se recomienda recortar los espacios vacíos</w:t>
-      </w:r>
-      <w:r>
-        <w:t xml:space="preserve"> a los lados</w:t>
-      </w:r>
-      <w:r>
-        <w:t xml:space="preserve"> para que el personaje ocupe menos espacio.</w:t>
-      </w:r>
-    </w:p>
-    <w:p>
-      <w:r>
+        <w:t>En cuanto a las medidas del Sprite, estos son muy flexibles</w:t>
+      </w:r>
+      <w:r>
+        <w:t>.</w:t>
+      </w:r>
+    </w:p>
+    <w:p>
+      <w:r>
+        <w:tab/>
+        <w:t>La altura del Sprite debe ser de 1080, es decir, toda la altura de la pantalla, de esta manera un personaje que ocupe los 1080 pixeles de altura ocupará todo el alto, permitiendo así</w:t>
+      </w:r>
+      <w:r>
+        <w:t xml:space="preserve"> definir la altura de los personajes</w:t>
+      </w:r>
+    </w:p>
+    <w:p>
+      <w:r>
+        <w:tab/>
+        <w:t>En cuanto al ancho, se recomienda recortar los espacios en blanco a los lados, con la excepción de que el Sprite debe mostrarse centrado, si necesitas dejar espacio en blanco para que se vea centrado, entonces hazlo.</w:t>
+      </w:r>
+    </w:p>
+    <w:p>
+      <w:r>
+        <w:tab/>
+        <w:t>Hay que mantener todos los sprites de un personaje lo más centrados posible para que al haber un cambio de Sprite no se mueva repentinamente de su sitio.</w:t>
+      </w:r>
+    </w:p>
+    <w:p/>
+    <w:p/>
+    <w:p/>
+    <w:p/>
+    <w:p>
+      <w:r>
+        <w:lastRenderedPageBreak/>
         <w:t xml:space="preserve">                Con espacio vacío a los lados                          Con los espacio</w:t>
       </w:r>
       <w:r>
@@ -7103,7 +7658,6 @@
         <w:rPr>
           <w:noProof/>
         </w:rPr>
-        <w:lastRenderedPageBreak/>
         <w:t xml:space="preserve">              </w:t>
       </w:r>
       <w:r>
@@ -7238,7 +7792,15 @@
         <w:t xml:space="preserve"> </w:t>
       </w:r>
       <w:r>
-        <w:t>En este caso la sintaxis es algo variada pero en esencia es la siguiente.</w:t>
+        <w:t xml:space="preserve">En este caso la sintaxis es algo </w:t>
+      </w:r>
+      <w:proofErr w:type="gramStart"/>
+      <w:r>
+        <w:t>variada</w:t>
+      </w:r>
+      <w:proofErr w:type="gramEnd"/>
+      <w:r>
+        <w:t xml:space="preserve"> pero en esencia es la siguiente.</w:t>
       </w:r>
     </w:p>
     <w:p>
@@ -7247,10 +7809,26 @@
         <w:t>Nombre_del_personaje</w:t>
       </w:r>
       <w:r>
-        <w:t xml:space="preserve"> Sprite</w:t>
-      </w:r>
-      <w:r>
-        <w:t xml:space="preserve"> : acción : parámetros de la acción</w:t>
+        <w:t xml:space="preserve"> </w:t>
+      </w:r>
+      <w:proofErr w:type="gramStart"/>
+      <w:r>
+        <w:t>Sprite</w:t>
+      </w:r>
+      <w:r>
+        <w:t xml:space="preserve"> :</w:t>
+      </w:r>
+      <w:proofErr w:type="gramEnd"/>
+      <w:r>
+        <w:t xml:space="preserve"> </w:t>
+      </w:r>
+      <w:proofErr w:type="gramStart"/>
+      <w:r>
+        <w:t>acción :</w:t>
+      </w:r>
+      <w:proofErr w:type="gramEnd"/>
+      <w:r>
+        <w:t xml:space="preserve"> parámetros de la acción</w:t>
       </w:r>
     </w:p>
     <w:p>
@@ -7261,19 +7839,126 @@
         <w:t>El nombre del personaje debe estar en m</w:t>
       </w:r>
       <w:r>
-        <w:t>inúscula y coincidir con el nombre del archivo que contiene el Sprite del personaje. El Sprite del personaje va separado de un espacio de su nombre, este Sprite es opcional y representa la variación del personaje, por ejemplo “Amber uniform_happy”, “Amber casual_happy” o “Amber_uniform_scared”.</w:t>
+        <w:t xml:space="preserve">inúscula y coincidir con el nombre </w:t>
+      </w:r>
+      <w:r>
+        <w:t xml:space="preserve">clave definito en </w:t>
+      </w:r>
+      <w:r>
+        <w:rPr>
+          <w:i/>
+          <w:iCs/>
+        </w:rPr>
+        <w:t>configs.csv.</w:t>
+      </w:r>
+      <w:r>
+        <w:t xml:space="preserve"> </w:t>
+      </w:r>
+      <w:r>
+        <w:t>Si queremos mostrar al personaje con un Sprite específico, lo escribiremos luego de un espacio</w:t>
+      </w:r>
+      <w:r>
+        <w:t>, “amber uniform happy left”, “amber casual angry right”</w:t>
       </w:r>
     </w:p>
     <w:p>
       <w:r>
         <w:tab/>
-        <w:t>En este caso Amber sería el personaje y uniform_happy, casual_happy y uniform_scared serían los Sprite específicos a nombrar. Si no se especifica el Sprite se mostrará el archivo que se llame “Amber.png”, de no existir, el juego arrojará un error.</w:t>
+        <w:t>En este caso Amber sería el personaje y uniform</w:t>
+      </w:r>
+      <w:r>
+        <w:t xml:space="preserve"> </w:t>
+      </w:r>
+      <w:r>
+        <w:t>happy</w:t>
+      </w:r>
+      <w:r>
+        <w:t xml:space="preserve"> left y</w:t>
+      </w:r>
+      <w:r>
+        <w:t xml:space="preserve"> casual</w:t>
+      </w:r>
+      <w:r>
+        <w:t xml:space="preserve"> angry right</w:t>
+      </w:r>
+      <w:r>
+        <w:t xml:space="preserve"> serían </w:t>
+      </w:r>
+      <w:proofErr w:type="gramStart"/>
+      <w:r>
+        <w:t>los Sprite específicos a nombrar</w:t>
+      </w:r>
+      <w:proofErr w:type="gramEnd"/>
+      <w:r>
+        <w:t xml:space="preserve">. </w:t>
+      </w:r>
+      <w:r>
+        <w:t xml:space="preserve">Estos sprites pueden estar en cualquier sitio del proyecto, la recomendación es que estén en la carpeta </w:t>
+      </w:r>
+      <w:r>
+        <w:rPr>
+          <w:i/>
+          <w:iCs/>
+        </w:rPr>
+        <w:t>images/characters</w:t>
+      </w:r>
+      <w:proofErr w:type="gramStart"/>
+      <w:r>
+        <w:rPr>
+          <w:i/>
+          <w:iCs/>
+        </w:rPr>
+        <w:t>/[</w:t>
+      </w:r>
+      <w:proofErr w:type="gramEnd"/>
+      <w:r>
+        <w:rPr>
+          <w:i/>
+          <w:iCs/>
+        </w:rPr>
+        <w:t>nombre del personaje]/Sprite</w:t>
+      </w:r>
+      <w:r>
+        <w:t>.</w:t>
       </w:r>
     </w:p>
     <w:p>
       <w:r>
         <w:tab/>
-        <w:t>La acción es el evento que el personaje hará, ya sea aparecer o moverse acorde a los parámetros dados.</w:t>
+        <w:t>Algo muy interesante de Atlax Renpy es que en ocasiones querremos que los sprites de nuestros personajes se volteen horizontalmente</w:t>
+      </w:r>
+      <w:r>
+        <w:t>, podrías llegar a pensar en copiar y pegar el mismo Sprite y voltearlo, sin embargo, Atlax Renpy cuenta con un sistema que ayuda a ahorrar ese tipo de sprites.</w:t>
+      </w:r>
+    </w:p>
+    <w:p>
+      <w:r>
+        <w:lastRenderedPageBreak/>
+        <w:tab/>
+        <w:t>Si intentas mostrar “amber uniform left”, el motor intentará buscar el Sprite, si no lo encuentra buscará entonces “amber uniform right”, si lo encuentra lo volteará automáticamente y viceversa.</w:t>
+      </w:r>
+    </w:p>
+    <w:p>
+      <w:r>
+        <w:tab/>
+        <w:t>Por supuesto, no todos los personajes son simétricos, si un personaje de nuestra novela tiene un parche, al voltearlo tendrá el parche del otro lado, en esos casos sí que tendremos la obligación de crear sprites de “left” y “right” manualmente.</w:t>
+      </w:r>
+    </w:p>
+    <w:p>
+      <w:r>
+        <w:tab/>
+      </w:r>
+      <w:r>
+        <w:t>Una vez definido el apartado de los personajes, vamos con la</w:t>
+      </w:r>
+      <w:r>
+        <w:t xml:space="preserve"> acción</w:t>
+      </w:r>
+      <w:r>
+        <w:t>, este</w:t>
+      </w:r>
+      <w:r>
+        <w:t xml:space="preserve"> es el evento que el personaje hará, ya sea aparecer o moverse acorde a los parámetros dados.</w:t>
       </w:r>
       <w:r>
         <w:t xml:space="preserve"> Muchos de estos parámetros se relacionan con la posición del personaje.</w:t>
@@ -7294,7 +7979,6 @@
         <w:ind w:firstLine="708"/>
       </w:pPr>
       <w:r>
-        <w:lastRenderedPageBreak/>
         <w:t>Posiciones y valores</w:t>
       </w:r>
     </w:p>
@@ -7706,17 +8390,44 @@
       </w:r>
       <w:r>
         <w:rPr>
-          <w:highlight w:val="yellow"/>
+          <w:highlight w:val="red"/>
         </w:rPr>
         <w:t>Nota:</w:t>
       </w:r>
       <w:r>
-        <w:t xml:space="preserve"> Si presentas problemas al momento de mostrar personajes, por ejemplo que el Sprite del personaje se cambia, verifica que estás utilizando el nombre del personaje correcto, por ejemplo: Katherine left happy, Berto right surprised, en cada uno de los eventos que escribas.</w:t>
-      </w:r>
-    </w:p>
-    <w:p/>
-    <w:p/>
-    <w:p/>
+        <w:t xml:space="preserve"> Si presentas problemas al momento de mostrar personajes, por ejemplo</w:t>
+      </w:r>
+      <w:r>
+        <w:t>,</w:t>
+      </w:r>
+      <w:r>
+        <w:t xml:space="preserve"> que el Sprite del personaje se cambia, verifica que estás utilizando el nombre del personaje </w:t>
+      </w:r>
+      <w:r>
+        <w:lastRenderedPageBreak/>
+        <w:t>con su respectivo sprite</w:t>
+      </w:r>
+      <w:r>
+        <w:t xml:space="preserve">, por ejemplo: </w:t>
+      </w:r>
+      <w:r>
+        <w:t>k</w:t>
+      </w:r>
+      <w:r>
+        <w:t xml:space="preserve">atherine left happy, </w:t>
+      </w:r>
+      <w:r>
+        <w:t>b</w:t>
+      </w:r>
+      <w:r>
+        <w:t>erto right surprised, en cada uno de los eventos que escribas.</w:t>
+      </w:r>
+    </w:p>
+    <w:p>
+      <w:pPr>
+        <w:pStyle w:val="Ttulo3"/>
+      </w:pPr>
+    </w:p>
     <w:p>
       <w:pPr>
         <w:pStyle w:val="Ttulo3"/>
@@ -7884,7 +8595,6 @@
               <w:jc w:val="center"/>
             </w:pPr>
             <w:r>
-              <w:lastRenderedPageBreak/>
               <w:t>appear</w:t>
             </w:r>
           </w:p>
@@ -7971,6 +8681,11 @@
       <w:pPr>
         <w:pStyle w:val="Ttulo3"/>
       </w:pPr>
+    </w:p>
+    <w:p>
+      <w:pPr>
+        <w:pStyle w:val="Ttulo3"/>
+      </w:pPr>
       <w:r>
         <w:t>Eventos de personajes en pantalla</w:t>
       </w:r>
@@ -8405,13 +9120,9 @@
             <w:vAlign w:val="center"/>
           </w:tcPr>
           <w:p>
-            <w:pPr>
-              <w:pStyle w:val="Prrafodelista"/>
-              <w:numPr>
-                <w:ilvl w:val="0"/>
-                <w:numId w:val="12"/>
-              </w:numPr>
-            </w:pPr>
+            <w:r>
+              <w:t xml:space="preserve">1. </w:t>
+            </w:r>
             <w:r>
               <w:t>La duración del derribo en segundos (0.5)</w:t>
             </w:r>
@@ -8479,9 +9190,12 @@
             <w:pPr>
               <w:jc w:val="center"/>
             </w:pPr>
-            <w:r>
+            <w:proofErr w:type="gramStart"/>
+            <w:r>
+              <w:lastRenderedPageBreak/>
               <w:t>zoom</w:t>
             </w:r>
+            <w:proofErr w:type="gramEnd"/>
           </w:p>
         </w:tc>
         <w:tc>
@@ -8509,7 +9223,15 @@
               <w:jc w:val="center"/>
             </w:pPr>
             <w:r>
-              <w:t>1. El factor del zoom (2)</w:t>
+              <w:t xml:space="preserve">1. El factor del </w:t>
+            </w:r>
+            <w:proofErr w:type="gramStart"/>
+            <w:r>
+              <w:t>zoom</w:t>
+            </w:r>
+            <w:proofErr w:type="gramEnd"/>
+            <w:r>
+              <w:t xml:space="preserve"> (2)</w:t>
             </w:r>
           </w:p>
         </w:tc>
@@ -8556,7 +9278,15 @@
               </w:numPr>
             </w:pPr>
             <w:r>
-              <w:t>La duración del zoom (2)</w:t>
+              <w:t xml:space="preserve">La duración del </w:t>
+            </w:r>
+            <w:proofErr w:type="gramStart"/>
+            <w:r>
+              <w:t>zoom</w:t>
+            </w:r>
+            <w:proofErr w:type="gramEnd"/>
+            <w:r>
+              <w:t xml:space="preserve"> (2)</w:t>
             </w:r>
           </w:p>
         </w:tc>
@@ -8740,7 +9470,21 @@
         <w:rPr>
           <w:highlight w:val="yellow"/>
         </w:rPr>
-        <w:t>Stefannie &amp; Calcercio : appear</w:t>
+        <w:t xml:space="preserve">Stefannie &amp; </w:t>
+      </w:r>
+      <w:proofErr w:type="gramStart"/>
+      <w:r>
+        <w:rPr>
+          <w:highlight w:val="yellow"/>
+        </w:rPr>
+        <w:t>Calcercio :</w:t>
+      </w:r>
+      <w:proofErr w:type="gramEnd"/>
+      <w:r>
+        <w:rPr>
+          <w:highlight w:val="yellow"/>
+        </w:rPr>
+        <w:t xml:space="preserve"> appear</w:t>
       </w:r>
       <w:r>
         <w:t xml:space="preserve"> (Stefannie y Calcercio aparecen al mismo tiempo, Stefannie al 33% de la pantalla y Calcercio al 66%)</w:t>
@@ -8751,13 +9495,35 @@
         <w:rPr>
           <w:highlight w:val="yellow"/>
         </w:rPr>
-        <w:t xml:space="preserve">Calcercio happy &amp; Stefannie : </w:t>
-      </w:r>
-      <w:r>
-        <w:rPr>
-          <w:highlight w:val="yellow"/>
-        </w:rPr>
-        <w:t>move : 30: 85</w:t>
+        <w:t xml:space="preserve">Calcercio happy &amp; </w:t>
+      </w:r>
+      <w:proofErr w:type="gramStart"/>
+      <w:r>
+        <w:rPr>
+          <w:highlight w:val="yellow"/>
+        </w:rPr>
+        <w:t>Stefannie :</w:t>
+      </w:r>
+      <w:proofErr w:type="gramEnd"/>
+      <w:r>
+        <w:rPr>
+          <w:highlight w:val="yellow"/>
+        </w:rPr>
+        <w:t xml:space="preserve"> </w:t>
+      </w:r>
+      <w:proofErr w:type="gramStart"/>
+      <w:r>
+        <w:rPr>
+          <w:highlight w:val="yellow"/>
+        </w:rPr>
+        <w:t>move :</w:t>
+      </w:r>
+      <w:proofErr w:type="gramEnd"/>
+      <w:r>
+        <w:rPr>
+          <w:highlight w:val="yellow"/>
+        </w:rPr>
+        <w:t xml:space="preserve"> 30: 85</w:t>
       </w:r>
       <w:r>
         <w:t xml:space="preserve"> (Calcercio cambia de expresión y se mueve a la posición 30 al mismo tiempo que Stefannie se mueve a la posición 85)</w:t>
@@ -8770,11 +9536,47 @@
       </w:r>
     </w:p>
     <w:p>
-      <w:r>
-        <w:rPr>
-          <w:highlight w:val="yellow"/>
-        </w:rPr>
-        <w:t>Stefannie : move : 30, Calcercio : move :120</w:t>
+      <w:proofErr w:type="gramStart"/>
+      <w:r>
+        <w:rPr>
+          <w:highlight w:val="yellow"/>
+        </w:rPr>
+        <w:t>Stefannie :</w:t>
+      </w:r>
+      <w:proofErr w:type="gramEnd"/>
+      <w:r>
+        <w:rPr>
+          <w:highlight w:val="yellow"/>
+        </w:rPr>
+        <w:t xml:space="preserve"> </w:t>
+      </w:r>
+      <w:proofErr w:type="gramStart"/>
+      <w:r>
+        <w:rPr>
+          <w:highlight w:val="yellow"/>
+        </w:rPr>
+        <w:t>move :</w:t>
+      </w:r>
+      <w:proofErr w:type="gramEnd"/>
+      <w:r>
+        <w:rPr>
+          <w:highlight w:val="yellow"/>
+        </w:rPr>
+        <w:t xml:space="preserve"> 30, </w:t>
+      </w:r>
+      <w:proofErr w:type="gramStart"/>
+      <w:r>
+        <w:rPr>
+          <w:highlight w:val="yellow"/>
+        </w:rPr>
+        <w:t>Calcercio :</w:t>
+      </w:r>
+      <w:proofErr w:type="gramEnd"/>
+      <w:r>
+        <w:rPr>
+          <w:highlight w:val="yellow"/>
+        </w:rPr>
+        <w:t xml:space="preserve"> move :120</w:t>
       </w:r>
       <w:r>
         <w:t xml:space="preserve"> (Stefannie se mueve a la posición 30 y luego Calcercio sale de la pantalla por la derecha)</w:t>
@@ -8783,7 +9585,13 @@
     <w:p>
       <w:r>
         <w:tab/>
-        <w:t>Existen algunas animaciones predeterminadas, estas permiten que un personaje entre en una animación por tiempo indefinido, es similar a los efectos continuos solo que esta vez son los personajes que hacen un movimiento indefinidamente hasta que se vuelva a llamar la animación.</w:t>
+        <w:t>También existen animaciones continuas, similares a los efectos continuos estos se ejecutarán en bucle hasta que sean llamados nuevamente. Aquí hay algunas animaciones constantes ya definidas en Atlax Renpy.</w:t>
+      </w:r>
+    </w:p>
+    <w:p>
+      <w:r>
+        <w:tab/>
+        <w:t>Si necesitas crear animaciones personalizadas, ve al módulo de personalización más adelante en este documento.</w:t>
       </w:r>
     </w:p>
     <w:p>
@@ -8949,6 +9757,7 @@
               <w:jc w:val="center"/>
             </w:pPr>
             <w:r>
+              <w:lastRenderedPageBreak/>
               <w:t>jumping</w:t>
             </w:r>
           </w:p>
@@ -9002,22 +9811,35 @@
         <w:t xml:space="preserve">Importante: </w:t>
       </w:r>
       <w:r>
-        <w:t>Renpy no soporta ciertas animaciones al mismo tiempo, por ejemplo no soporta un cambio de fondo y la aparición de un personaje, si hacemos esto el fondo aparecerá de golpe y el personaje hará la aparición normal. Es cuestión de probar e intentar crear diálogos intermedios para poder recrear estas escenas lo más fluidas e inmersivas posible.</w:t>
-      </w:r>
-    </w:p>
-    <w:p/>
-    <w:p/>
-    <w:p>
-      <w:r>
-        <w:lastRenderedPageBreak/>
+        <w:t xml:space="preserve">Renpy no soporta ciertas animaciones al mismo tiempo, por </w:t>
+      </w:r>
+      <w:proofErr w:type="gramStart"/>
+      <w:r>
+        <w:t>ejemplo</w:t>
+      </w:r>
+      <w:proofErr w:type="gramEnd"/>
+      <w:r>
+        <w:t xml:space="preserve"> no soporta un cambio de fondo y la aparición de un personaje, si hacemos esto el fondo aparecerá de golpe y el personaje hará la aparición normal. Es cuestión de probar e intentar crear diálogos intermedios para poder recrear estas escenas lo más fluidas e inmersivas posible.</w:t>
+      </w:r>
+    </w:p>
+    <w:p>
+      <w:r>
         <w:tab/>
-        <w:t xml:space="preserve">A </w:t>
-      </w:r>
-      <w:r>
-        <w:t>continuación,</w:t>
-      </w:r>
-      <w:r>
-        <w:t xml:space="preserve"> se presentarán algunos ejemplos de escenas con personajes.</w:t>
+        <w:t xml:space="preserve">Es entendible que los eventos aguardan mucha información, es por eso </w:t>
+      </w:r>
+      <w:proofErr w:type="gramStart"/>
+      <w:r>
+        <w:t>que</w:t>
+      </w:r>
+      <w:proofErr w:type="gramEnd"/>
+      <w:r>
+        <w:t xml:space="preserve"> a continuación se presentarán unos cuantos escenarios</w:t>
+      </w:r>
+      <w:r>
+        <w:t xml:space="preserve"> de ejemplo</w:t>
+      </w:r>
+      <w:r>
+        <w:t xml:space="preserve"> utilizando estos eventos.</w:t>
       </w:r>
     </w:p>
     <w:p>
@@ -9040,8 +9862,13 @@
           <w:numId w:val="15"/>
         </w:numPr>
       </w:pPr>
-      <w:r>
-        <w:t xml:space="preserve">saijo:appear </w:t>
+      <w:proofErr w:type="gramStart"/>
+      <w:r>
+        <w:t>saijo:appear</w:t>
+      </w:r>
+      <w:proofErr w:type="gramEnd"/>
+      <w:r>
+        <w:t xml:space="preserve"> </w:t>
       </w:r>
       <w:r>
         <w:t>(S</w:t>
@@ -9061,8 +9888,13 @@
           <w:numId w:val="15"/>
         </w:numPr>
       </w:pPr>
-      <w:r>
-        <w:t>saijo:move:90</w:t>
+      <w:proofErr w:type="gramStart"/>
+      <w:r>
+        <w:t>saijo:move</w:t>
+      </w:r>
+      <w:proofErr w:type="gramEnd"/>
+      <w:r>
+        <w:t>:90</w:t>
       </w:r>
       <w:r>
         <w:t xml:space="preserve"> (</w:t>
@@ -9082,8 +9914,13 @@
           <w:numId w:val="15"/>
         </w:numPr>
       </w:pPr>
-      <w:r>
-        <w:t xml:space="preserve">saijo:hitr </w:t>
+      <w:proofErr w:type="gramStart"/>
+      <w:r>
+        <w:t>saijo:hitr</w:t>
+      </w:r>
+      <w:proofErr w:type="gramEnd"/>
+      <w:r>
+        <w:t xml:space="preserve"> </w:t>
       </w:r>
       <w:r>
         <w:t>(</w:t>
@@ -9122,7 +9959,15 @@
         <w:t>Dereck</w:t>
       </w:r>
       <w:r>
-        <w:t xml:space="preserve"> sale de la habitación pero luego regresa y nuevamente se retira</w:t>
+        <w:t xml:space="preserve"> sale de la </w:t>
+      </w:r>
+      <w:proofErr w:type="gramStart"/>
+      <w:r>
+        <w:t>habitación</w:t>
+      </w:r>
+      <w:proofErr w:type="gramEnd"/>
+      <w:r>
+        <w:t xml:space="preserve"> pero luego regresa y nuevamente se retira</w:t>
       </w:r>
     </w:p>
     <w:p>
@@ -9157,8 +10002,13 @@
           <w:numId w:val="15"/>
         </w:numPr>
       </w:pPr>
-      <w:r>
-        <w:t>dereck:move:-25:5</w:t>
+      <w:proofErr w:type="gramStart"/>
+      <w:r>
+        <w:t>dereck:move</w:t>
+      </w:r>
+      <w:proofErr w:type="gramEnd"/>
+      <w:r>
+        <w:t>:-25:5</w:t>
       </w:r>
       <w:r>
         <w:t xml:space="preserve"> (</w:t>
@@ -9181,8 +10031,13 @@
           <w:numId w:val="15"/>
         </w:numPr>
       </w:pPr>
-      <w:r>
-        <w:t>dereck:move:18:1</w:t>
+      <w:proofErr w:type="gramStart"/>
+      <w:r>
+        <w:t>dereck:move</w:t>
+      </w:r>
+      <w:proofErr w:type="gramEnd"/>
+      <w:r>
+        <w:t>:18:1</w:t>
       </w:r>
       <w:r>
         <w:t xml:space="preserve"> (D</w:t>
@@ -9202,8 +10057,13 @@
           <w:numId w:val="15"/>
         </w:numPr>
       </w:pPr>
-      <w:r>
-        <w:t>dereck:move:-25</w:t>
+      <w:proofErr w:type="gramStart"/>
+      <w:r>
+        <w:t>dereck:move</w:t>
+      </w:r>
+      <w:proofErr w:type="gramEnd"/>
+      <w:r>
+        <w:t>:-25</w:t>
       </w:r>
       <w:r>
         <w:t xml:space="preserve"> (D</w:t>
@@ -9223,9 +10083,11 @@
           <w:numId w:val="15"/>
         </w:numPr>
       </w:pPr>
+      <w:proofErr w:type="gramStart"/>
       <w:r>
         <w:t>dereck:destroy</w:t>
       </w:r>
+      <w:proofErr w:type="gramEnd"/>
       <w:r>
         <w:t xml:space="preserve"> (</w:t>
       </w:r>
@@ -9261,8 +10123,13 @@
           <w:numId w:val="15"/>
         </w:numPr>
       </w:pPr>
-      <w:r>
-        <w:t>dereck:pop:120</w:t>
+      <w:proofErr w:type="gramStart"/>
+      <w:r>
+        <w:t>dereck:pop</w:t>
+      </w:r>
+      <w:proofErr w:type="gramEnd"/>
+      <w:r>
+        <w:t>:120</w:t>
       </w:r>
       <w:r>
         <w:t xml:space="preserve"> (D</w:t>
@@ -9282,14 +10149,19 @@
           <w:numId w:val="15"/>
         </w:numPr>
       </w:pPr>
-      <w:r>
-        <w:t>dereck:move:33</w:t>
+      <w:proofErr w:type="gramStart"/>
+      <w:r>
+        <w:t>dereck:move</w:t>
+      </w:r>
+      <w:proofErr w:type="gramEnd"/>
+      <w:r>
+        <w:t>:33</w:t>
       </w:r>
       <w:r>
         <w:t xml:space="preserve"> (D</w:t>
       </w:r>
       <w:r>
-        <w:t xml:space="preserve">ereck se mueve hasta un tercio de la pantalla </w:t>
+        <w:t>ereck se mueve hasta un tercio de la pantalla</w:t>
       </w:r>
       <w:r>
         <w:t>)</w:t>
@@ -9304,10 +10176,18 @@
         </w:numPr>
       </w:pPr>
       <w:r>
-        <w:t>dereck surprised, dereck:jum</w:t>
-      </w:r>
-      <w:r>
-        <w:t>p (D</w:t>
+        <w:t xml:space="preserve">dereck surprised, </w:t>
+      </w:r>
+      <w:proofErr w:type="gramStart"/>
+      <w:r>
+        <w:t>dereck:jum</w:t>
+      </w:r>
+      <w:r>
+        <w:t>p</w:t>
+      </w:r>
+      <w:proofErr w:type="gramEnd"/>
+      <w:r>
+        <w:t xml:space="preserve"> (D</w:t>
       </w:r>
       <w:r>
         <w:t>ereck se sorprende e inmediatamente después da un salto</w:t>
@@ -9330,7 +10210,15 @@
         </w:numPr>
       </w:pPr>
       <w:r>
-        <w:t>Hay una pelea entre mutou y dereck, mutou lo golpea y logra derribarlo pero dereck se levanta y derriba a mutou quedando victorioso</w:t>
+        <w:t xml:space="preserve">Hay una pelea entre mutou y dereck, mutou lo golpea y logra </w:t>
+      </w:r>
+      <w:proofErr w:type="gramStart"/>
+      <w:r>
+        <w:t>derribarlo</w:t>
+      </w:r>
+      <w:proofErr w:type="gramEnd"/>
+      <w:r>
+        <w:t xml:space="preserve"> pero dereck se levanta y derriba a mutou quedando victorioso</w:t>
       </w:r>
     </w:p>
     <w:p>
@@ -9341,9 +10229,19 @@
           <w:numId w:val="15"/>
         </w:numPr>
       </w:pPr>
-      <w:r>
-        <w:t>mutou:hitl, dereck:knockl</w:t>
-      </w:r>
+      <w:proofErr w:type="gramStart"/>
+      <w:r>
+        <w:t>mutou:hitl</w:t>
+      </w:r>
+      <w:proofErr w:type="gramEnd"/>
+      <w:r>
+        <w:t xml:space="preserve">, </w:t>
+      </w:r>
+      <w:proofErr w:type="gramStart"/>
+      <w:r>
+        <w:t>dereck:knockl</w:t>
+      </w:r>
+      <w:proofErr w:type="gramEnd"/>
       <w:r>
         <w:t xml:space="preserve"> (</w:t>
       </w:r>
@@ -9362,9 +10260,11 @@
           <w:numId w:val="15"/>
         </w:numPr>
       </w:pPr>
+      <w:proofErr w:type="gramStart"/>
       <w:r>
         <w:t>dereck:raisel</w:t>
       </w:r>
+      <w:proofErr w:type="gramEnd"/>
       <w:r>
         <w:t xml:space="preserve"> (</w:t>
       </w:r>
@@ -9383,9 +10283,19 @@
           <w:numId w:val="15"/>
         </w:numPr>
       </w:pPr>
-      <w:r>
-        <w:t>dereck:hitr, mutou:knockr</w:t>
-      </w:r>
+      <w:proofErr w:type="gramStart"/>
+      <w:r>
+        <w:t>dereck:hitr</w:t>
+      </w:r>
+      <w:proofErr w:type="gramEnd"/>
+      <w:r>
+        <w:t xml:space="preserve">, </w:t>
+      </w:r>
+      <w:proofErr w:type="gramStart"/>
+      <w:r>
+        <w:t>mutou:knockr</w:t>
+      </w:r>
+      <w:proofErr w:type="gramEnd"/>
       <w:r>
         <w:t xml:space="preserve"> (</w:t>
       </w:r>
@@ -9402,6 +10312,7 @@
       </w:pPr>
       <w:bookmarkStart w:id="14" w:name="_Toc199261567"/>
       <w:r>
+        <w:lastRenderedPageBreak/>
         <w:t>Columna Delay</w:t>
       </w:r>
       <w:bookmarkEnd w:id="14"/>
@@ -9473,7 +10384,6 @@
     </w:p>
     <w:p>
       <w:r>
-        <w:lastRenderedPageBreak/>
         <w:tab/>
       </w:r>
       <w:r>
@@ -9524,7 +10434,15 @@
     <w:p>
       <w:r>
         <w:tab/>
-        <w:t>A partir de esta columna se escribirá el texto de los diálogos que será mostrado en pantalla en los distintos idiomas declarados en la cabecera del archivo de control respetando el orden. En caso de necesitar añadir más idiomas es tan sencillo como escribir un ; en el último idioma y empezar a traducir todos los diálogos.</w:t>
+        <w:t xml:space="preserve">A partir de esta columna se escribirá el texto de los diálogos que será mostrado en pantalla en los distintos idiomas declarados en la cabecera del archivo de control respetando el orden. En caso de necesitar añadir más idiomas es tan sencillo como escribir </w:t>
+      </w:r>
+      <w:proofErr w:type="gramStart"/>
+      <w:r>
+        <w:t>un ;</w:t>
+      </w:r>
+      <w:proofErr w:type="gramEnd"/>
+      <w:r>
+        <w:t xml:space="preserve"> en el último idioma y empezar a traducir todos los diálogos.</w:t>
       </w:r>
     </w:p>
     <w:p>
@@ -9538,7 +10456,39 @@
         <w:ind w:left="708"/>
       </w:pPr>
       <w:r>
-        <w:t>"No se que hora o que día es hoy, creo que es miércoles en la tarde.No se que hora o que día es hoy, creo que es miércoles en la tarde.No se que hora o que día es hoy, creo que es miércoles en la tarde.No se que hora o que día es hoy, creo que es miércoles en la tarde.No se que hora o que día es hoy, creo que es miércoles en la"</w:t>
+        <w:t xml:space="preserve">"No se que hora o que día es hoy, creo que es miércoles en la </w:t>
+      </w:r>
+      <w:proofErr w:type="gramStart"/>
+      <w:r>
+        <w:t>tarde.No</w:t>
+      </w:r>
+      <w:proofErr w:type="gramEnd"/>
+      <w:r>
+        <w:t xml:space="preserve"> se que hora o que día es hoy, creo que es miércoles en la </w:t>
+      </w:r>
+      <w:proofErr w:type="gramStart"/>
+      <w:r>
+        <w:t>tarde.No</w:t>
+      </w:r>
+      <w:proofErr w:type="gramEnd"/>
+      <w:r>
+        <w:t xml:space="preserve"> se que hora o que día es hoy, creo que es miércoles en la </w:t>
+      </w:r>
+      <w:proofErr w:type="gramStart"/>
+      <w:r>
+        <w:t>tarde.No</w:t>
+      </w:r>
+      <w:proofErr w:type="gramEnd"/>
+      <w:r>
+        <w:t xml:space="preserve"> se que hora o que día es hoy, creo que es miércoles en la </w:t>
+      </w:r>
+      <w:proofErr w:type="gramStart"/>
+      <w:r>
+        <w:t>tarde.No</w:t>
+      </w:r>
+      <w:proofErr w:type="gramEnd"/>
+      <w:r>
+        <w:t xml:space="preserve"> se que hora o que día es hoy, creo que es miércoles en la"</w:t>
       </w:r>
     </w:p>
     <w:p>
@@ -9570,7 +10520,16 @@
         <w:ind w:firstLine="708"/>
       </w:pPr>
       <w:r>
-        <w:t xml:space="preserve">Renpy posee diversos modificadores de texto, estos se escriben en medio del diálogo y son perfectamente utilizables en la columnas de idioma. Existen muchos modificadores de texto así que te recomiendo leer la documentación de Renpy para intentar implementarlos. </w:t>
+        <w:lastRenderedPageBreak/>
+        <w:t xml:space="preserve">Renpy posee diversos modificadores de texto, estos se escriben en medio del diálogo y son perfectamente utilizables en </w:t>
+      </w:r>
+      <w:proofErr w:type="gramStart"/>
+      <w:r>
+        <w:t>la columnas</w:t>
+      </w:r>
+      <w:proofErr w:type="gramEnd"/>
+      <w:r>
+        <w:t xml:space="preserve"> de idioma. Existen muchos modificadores de texto así que te recomiendo leer la documentación de Renpy para intentar implementarlos. </w:t>
       </w:r>
       <w:hyperlink r:id="rId30" w:anchor="text-tag-alpha" w:history="1">
         <w:r>
@@ -9589,7 +10548,15 @@
         <w:ind w:firstLine="708"/>
       </w:pPr>
       <w:r>
-        <w:t>Dependiendo de la fuente que utilices en tu proyecto, es posible que ciertos caracteres no se muestren, por ejemplo el carácter “</w:t>
+        <w:t xml:space="preserve">Dependiendo de la fuente que utilices en tu proyecto, es posible que ciertos caracteres no se muestren, por </w:t>
+      </w:r>
+      <w:proofErr w:type="gramStart"/>
+      <w:r>
+        <w:t>ejemplo</w:t>
+      </w:r>
+      <w:proofErr w:type="gramEnd"/>
+      <w:r>
+        <w:t xml:space="preserve"> el carácter “</w:t>
       </w:r>
       <w:r>
         <w:t>♪</w:t>
@@ -9616,7 +10583,6 @@
           <w:i/>
           <w:iCs/>
         </w:rPr>
-        <w:lastRenderedPageBreak/>
         <w:t xml:space="preserve">Mostrando el diálogo “Ahora a bailar wuuuu </w:t>
       </w:r>
       <w:r>
@@ -9696,7 +10662,15 @@
         <w:ind w:firstLine="708"/>
       </w:pPr>
       <w:r>
-        <w:t>{font=DejaVuSans.ttf}♪♪♪{/font}</w:t>
+        <w:t>{font=</w:t>
+      </w:r>
+      <w:proofErr w:type="gramStart"/>
+      <w:r>
+        <w:t>DejaVuSans.ttf}♪</w:t>
+      </w:r>
+      <w:proofErr w:type="gramEnd"/>
+      <w:r>
+        <w:t>♪♪{/font}</w:t>
       </w:r>
     </w:p>
     <w:p>
@@ -9746,7 +10720,23 @@
           <w:i/>
           <w:iCs/>
         </w:rPr>
-        <w:t>{font=DejaVuSans.ttf}♪♪♪{/font}</w:t>
+        <w:t>{font=</w:t>
+      </w:r>
+      <w:proofErr w:type="gramStart"/>
+      <w:r>
+        <w:rPr>
+          <w:i/>
+          <w:iCs/>
+        </w:rPr>
+        <w:t>DejaVuSans.ttf}♪</w:t>
+      </w:r>
+      <w:proofErr w:type="gramEnd"/>
+      <w:r>
+        <w:rPr>
+          <w:i/>
+          <w:iCs/>
+        </w:rPr>
+        <w:t>♪♪{/font}</w:t>
       </w:r>
       <w:r>
         <w:rPr>
@@ -9876,6 +10866,7 @@
         </w:numPr>
       </w:pPr>
       <w:r>
+        <w:lastRenderedPageBreak/>
         <w:t>Efectos</w:t>
       </w:r>
     </w:p>
@@ -9972,10 +10963,26 @@
         <w:t>T</w:t>
       </w:r>
       <w:r>
-        <w:t>ipo de terminación de escena</w:t>
-      </w:r>
-      <w:r>
-        <w:t xml:space="preserve"> ; transición : parámetros de transición</w:t>
+        <w:t xml:space="preserve">ipo de terminación de </w:t>
+      </w:r>
+      <w:proofErr w:type="gramStart"/>
+      <w:r>
+        <w:t>escena</w:t>
+      </w:r>
+      <w:r>
+        <w:t xml:space="preserve"> ;</w:t>
+      </w:r>
+      <w:proofErr w:type="gramEnd"/>
+      <w:r>
+        <w:t xml:space="preserve"> </w:t>
+      </w:r>
+      <w:proofErr w:type="gramStart"/>
+      <w:r>
+        <w:t>transición :</w:t>
+      </w:r>
+      <w:proofErr w:type="gramEnd"/>
+      <w:r>
+        <w:t xml:space="preserve"> parámetros de transición</w:t>
       </w:r>
     </w:p>
     <w:p>
@@ -9983,7 +10990,6 @@
         <w:spacing w:after="0"/>
       </w:pPr>
       <w:r>
-        <w:lastRenderedPageBreak/>
         <w:tab/>
       </w:r>
       <w:r>
@@ -9992,24 +10998,36 @@
       <w:r>
         <w:t>_</w:t>
       </w:r>
+      <w:proofErr w:type="gramStart"/>
       <w:r>
         <w:t xml:space="preserve">1 </w:t>
       </w:r>
       <w:r>
         <w:t>;</w:t>
       </w:r>
-      <w:r>
-        <w:t xml:space="preserve"> valor 1 </w:t>
+      <w:proofErr w:type="gramEnd"/>
+      <w:r>
+        <w:t xml:space="preserve"> valor </w:t>
+      </w:r>
+      <w:proofErr w:type="gramStart"/>
+      <w:r>
+        <w:t xml:space="preserve">1 </w:t>
       </w:r>
       <w:r>
         <w:t>;</w:t>
       </w:r>
-      <w:r>
-        <w:t xml:space="preserve"> valor 2 </w:t>
+      <w:proofErr w:type="gramEnd"/>
+      <w:r>
+        <w:t xml:space="preserve"> valor </w:t>
+      </w:r>
+      <w:proofErr w:type="gramStart"/>
+      <w:r>
+        <w:t xml:space="preserve">2 </w:t>
       </w:r>
       <w:r>
         <w:t>;</w:t>
       </w:r>
+      <w:proofErr w:type="gramEnd"/>
       <w:r>
         <w:t xml:space="preserve"> valor 3</w:t>
       </w:r>
@@ -10028,23 +11046,38 @@
         <w:t>_</w:t>
       </w:r>
       <w:r>
-        <w:t xml:space="preserve"> 2 </w:t>
+        <w:t xml:space="preserve"> </w:t>
+      </w:r>
+      <w:proofErr w:type="gramStart"/>
+      <w:r>
+        <w:t xml:space="preserve">2 </w:t>
       </w:r>
       <w:r>
         <w:t>;</w:t>
       </w:r>
-      <w:r>
-        <w:t xml:space="preserve"> valor 1 </w:t>
+      <w:proofErr w:type="gramEnd"/>
+      <w:r>
+        <w:t xml:space="preserve"> valor </w:t>
+      </w:r>
+      <w:proofErr w:type="gramStart"/>
+      <w:r>
+        <w:t xml:space="preserve">1 </w:t>
       </w:r>
       <w:r>
         <w:t>;</w:t>
       </w:r>
-      <w:r>
-        <w:t xml:space="preserve"> valor 2 </w:t>
+      <w:proofErr w:type="gramEnd"/>
+      <w:r>
+        <w:t xml:space="preserve"> valor </w:t>
+      </w:r>
+      <w:proofErr w:type="gramStart"/>
+      <w:r>
+        <w:t xml:space="preserve">2 </w:t>
       </w:r>
       <w:r>
         <w:t>;</w:t>
       </w:r>
+      <w:proofErr w:type="gramEnd"/>
       <w:r>
         <w:t xml:space="preserve"> valor 3</w:t>
       </w:r>
@@ -10060,7 +11093,14 @@
       </w:pPr>
       <w:r>
         <w:tab/>
-        <w:t>La filas siguientes después de definir el tipo de terminación, son cada uno de los elementos que acompañan al tipo de terminación, en este caso nombrados “</w:t>
+      </w:r>
+      <w:proofErr w:type="gramStart"/>
+      <w:r>
+        <w:t>La filas siguientes después</w:t>
+      </w:r>
+      <w:proofErr w:type="gramEnd"/>
+      <w:r>
+        <w:t xml:space="preserve"> de definir el tipo de terminación, son cada uno de los elementos que acompañan al tipo de terminación, en este caso nombrados “</w:t>
       </w:r>
       <w:r>
         <w:t>Key</w:t>
@@ -10184,12 +11224,15 @@
     <w:p>
       <w:r>
         <w:tab/>
-        <w:t>En este ejemplo podemos ver como la Escena A siempre conlleva a la Escena B. Si bien es cierto que podríamos escribir todo un capítulo dentro de una misma escena, lo recomendable es utilizar varias escenas y que cada una englobe un arco o situación dentro de la historia.</w:t>
-      </w:r>
-    </w:p>
-    <w:p>
+        <w:t xml:space="preserve">En este ejemplo podemos ver como la Escena A siempre conlleva a la Escena B. Si bien es cierto que podríamos escribir todo un capítulo dentro de una misma escena, lo </w:t>
+      </w:r>
       <w:r>
         <w:lastRenderedPageBreak/>
+        <w:t>recomendable es utilizar varias escenas y que cada una englobe un arco o situación dentro de la historia.</w:t>
+      </w:r>
+    </w:p>
+    <w:p>
+      <w:r>
         <w:t xml:space="preserve">             </w:t>
       </w:r>
       <w:r>
@@ -10254,7 +11297,15 @@
     <w:p>
       <w:r>
         <w:tab/>
-        <w:t>Key_de_fin_de_escena_A ; Nombre_de_la_siguiente_escena</w:t>
+        <w:t>Key_de_fin_de_escena_</w:t>
+      </w:r>
+      <w:proofErr w:type="gramStart"/>
+      <w:r>
+        <w:t>A ;</w:t>
+      </w:r>
+      <w:proofErr w:type="gramEnd"/>
+      <w:r>
+        <w:t xml:space="preserve"> Nombre_de_la_siguiente_escena</w:t>
       </w:r>
     </w:p>
     <w:p>
@@ -10315,7 +11366,21 @@
         <w:rPr>
           <w:highlight w:val="yellow"/>
         </w:rPr>
-        <w:t xml:space="preserve">_end ; </w:t>
+        <w:t>_</w:t>
+      </w:r>
+      <w:proofErr w:type="gramStart"/>
+      <w:r>
+        <w:rPr>
+          <w:highlight w:val="yellow"/>
+        </w:rPr>
+        <w:t>end ;</w:t>
+      </w:r>
+      <w:proofErr w:type="gramEnd"/>
+      <w:r>
+        <w:rPr>
+          <w:highlight w:val="yellow"/>
+        </w:rPr>
+        <w:t xml:space="preserve"> </w:t>
       </w:r>
       <w:r>
         <w:rPr>
@@ -10382,7 +11447,21 @@
         <w:rPr>
           <w:highlight w:val="yellow"/>
         </w:rPr>
-        <w:t>katherine_scene_end ; the_x_exam</w:t>
+        <w:t>katherine_scene_</w:t>
+      </w:r>
+      <w:proofErr w:type="gramStart"/>
+      <w:r>
+        <w:rPr>
+          <w:highlight w:val="yellow"/>
+        </w:rPr>
+        <w:t>end ;</w:t>
+      </w:r>
+      <w:proofErr w:type="gramEnd"/>
+      <w:r>
+        <w:rPr>
+          <w:highlight w:val="yellow"/>
+        </w:rPr>
+        <w:t xml:space="preserve"> the_x_exam</w:t>
       </w:r>
     </w:p>
     <w:p/>
@@ -10414,7 +11493,21 @@
         <w:rPr>
           <w:highlight w:val="yellow"/>
         </w:rPr>
-        <w:t>amber_scene_end ; the_x_exam</w:t>
+        <w:t>amber_scene_</w:t>
+      </w:r>
+      <w:proofErr w:type="gramStart"/>
+      <w:r>
+        <w:rPr>
+          <w:highlight w:val="yellow"/>
+        </w:rPr>
+        <w:t>end ;</w:t>
+      </w:r>
+      <w:proofErr w:type="gramEnd"/>
+      <w:r>
+        <w:rPr>
+          <w:highlight w:val="yellow"/>
+        </w:rPr>
+        <w:t xml:space="preserve"> the_x_exam</w:t>
       </w:r>
     </w:p>
     <w:p>
@@ -10444,7 +11537,21 @@
         <w:rPr>
           <w:highlight w:val="yellow"/>
         </w:rPr>
-        <w:t>mariangeles_scene_end ; the_x_exam</w:t>
+        <w:t>mariangeles_scene_</w:t>
+      </w:r>
+      <w:proofErr w:type="gramStart"/>
+      <w:r>
+        <w:rPr>
+          <w:highlight w:val="yellow"/>
+        </w:rPr>
+        <w:t>end ;</w:t>
+      </w:r>
+      <w:proofErr w:type="gramEnd"/>
+      <w:r>
+        <w:rPr>
+          <w:highlight w:val="yellow"/>
+        </w:rPr>
+        <w:t xml:space="preserve"> the_x_exam</w:t>
       </w:r>
     </w:p>
     <w:p/>
@@ -10483,7 +11590,21 @@
         <w:rPr>
           <w:highlight w:val="yellow"/>
         </w:rPr>
-        <w:t>stefannie_scene_end ; the_x_exam</w:t>
+        <w:t>stefannie_scene_</w:t>
+      </w:r>
+      <w:proofErr w:type="gramStart"/>
+      <w:r>
+        <w:rPr>
+          <w:highlight w:val="yellow"/>
+        </w:rPr>
+        <w:t>end ;</w:t>
+      </w:r>
+      <w:proofErr w:type="gramEnd"/>
+      <w:r>
+        <w:rPr>
+          <w:highlight w:val="yellow"/>
+        </w:rPr>
+        <w:t xml:space="preserve"> the_x_exam</w:t>
       </w:r>
     </w:p>
     <w:p>
@@ -10515,14 +11636,21 @@
         <w:pStyle w:val="Ttulo3"/>
       </w:pPr>
       <w:r>
-        <w:lastRenderedPageBreak/>
         <w:t>Decisión</w:t>
       </w:r>
     </w:p>
     <w:p>
       <w:r>
         <w:tab/>
-        <w:t>La decisión es la mecánica principal de la mayoría de novelas visuales, este consiste en plasmar ante el jugador una situación en la que deba tomar una decisión. Con las decisiones podemos dividir la historia en caminos distintos y además Atlax Renpy nos permitirá agregar un sistema de puntos. Sintaxis.</w:t>
+        <w:t xml:space="preserve">La decisión es la mecánica principal de la mayoría de </w:t>
+      </w:r>
+      <w:proofErr w:type="gramStart"/>
+      <w:r>
+        <w:t>novelas</w:t>
+      </w:r>
+      <w:proofErr w:type="gramEnd"/>
+      <w:r>
+        <w:t xml:space="preserve"> visuales, este consiste en plasmar ante el jugador una situación en la que deba tomar una decisión. Con las decisiones podemos dividir la historia en caminos distintos y además Atlax Renpy nos permitirá agregar un sistema de puntos. Sintaxis.</w:t>
       </w:r>
     </w:p>
     <w:p>
@@ -10548,22 +11676,79 @@
           <w:sz w:val="22"/>
           <w:szCs w:val="22"/>
         </w:rPr>
-        <w:t>key_opcion_1 ; punto_1 : valor_punto_1 ; siguiente escena</w:t>
-      </w:r>
+        <w:t>key_opcion_</w:t>
+      </w:r>
+      <w:proofErr w:type="gramStart"/>
       <w:r>
         <w:rPr>
           <w:sz w:val="22"/>
           <w:szCs w:val="22"/>
         </w:rPr>
-        <w:t xml:space="preserve"> ;</w:t>
-      </w:r>
+        <w:t>1 ;</w:t>
+      </w:r>
+      <w:proofErr w:type="gramEnd"/>
       <w:r>
         <w:rPr>
           <w:sz w:val="22"/>
           <w:szCs w:val="22"/>
         </w:rPr>
+        <w:t xml:space="preserve"> punto_</w:t>
+      </w:r>
+      <w:proofErr w:type="gramStart"/>
+      <w:r>
+        <w:rPr>
+          <w:sz w:val="22"/>
+          <w:szCs w:val="22"/>
+        </w:rPr>
+        <w:t>1 :</w:t>
+      </w:r>
+      <w:proofErr w:type="gramEnd"/>
+      <w:r>
+        <w:rPr>
+          <w:sz w:val="22"/>
+          <w:szCs w:val="22"/>
+        </w:rPr>
+        <w:t xml:space="preserve"> valor_punto_</w:t>
+      </w:r>
+      <w:proofErr w:type="gramStart"/>
+      <w:r>
+        <w:rPr>
+          <w:sz w:val="22"/>
+          <w:szCs w:val="22"/>
+        </w:rPr>
+        <w:t>1 ;</w:t>
+      </w:r>
+      <w:proofErr w:type="gramEnd"/>
+      <w:r>
+        <w:rPr>
+          <w:sz w:val="22"/>
+          <w:szCs w:val="22"/>
+        </w:rPr>
+        <w:t xml:space="preserve"> siguiente </w:t>
+      </w:r>
+      <w:proofErr w:type="gramStart"/>
+      <w:r>
+        <w:rPr>
+          <w:sz w:val="22"/>
+          <w:szCs w:val="22"/>
+        </w:rPr>
+        <w:t>escena</w:t>
+      </w:r>
+      <w:r>
+        <w:rPr>
+          <w:sz w:val="22"/>
+          <w:szCs w:val="22"/>
+        </w:rPr>
+        <w:t xml:space="preserve"> ;</w:t>
+      </w:r>
+      <w:r>
+        <w:rPr>
+          <w:sz w:val="22"/>
+          <w:szCs w:val="22"/>
+        </w:rPr>
         <w:t>texto</w:t>
       </w:r>
+      <w:proofErr w:type="gramEnd"/>
     </w:p>
     <w:p>
       <w:pPr>
@@ -10579,14 +11764,46 @@
           <w:sz w:val="22"/>
           <w:szCs w:val="22"/>
         </w:rPr>
-        <w:t>key_opcion_2 ;; siguiente escena</w:t>
-      </w:r>
+        <w:t>key_opcion_</w:t>
+      </w:r>
+      <w:proofErr w:type="gramStart"/>
       <w:r>
         <w:rPr>
           <w:sz w:val="22"/>
           <w:szCs w:val="22"/>
         </w:rPr>
-        <w:t xml:space="preserve"> ; texto</w:t>
+        <w:t>2 ;</w:t>
+      </w:r>
+      <w:proofErr w:type="gramEnd"/>
+      <w:r>
+        <w:rPr>
+          <w:sz w:val="22"/>
+          <w:szCs w:val="22"/>
+        </w:rPr>
+        <w:t xml:space="preserve">; siguiente </w:t>
+      </w:r>
+      <w:proofErr w:type="gramStart"/>
+      <w:r>
+        <w:rPr>
+          <w:sz w:val="22"/>
+          <w:szCs w:val="22"/>
+        </w:rPr>
+        <w:t>escena</w:t>
+      </w:r>
+      <w:r>
+        <w:rPr>
+          <w:sz w:val="22"/>
+          <w:szCs w:val="22"/>
+        </w:rPr>
+        <w:t xml:space="preserve"> ;</w:t>
+      </w:r>
+      <w:proofErr w:type="gramEnd"/>
+      <w:r>
+        <w:rPr>
+          <w:sz w:val="22"/>
+          <w:szCs w:val="22"/>
+        </w:rPr>
+        <w:t xml:space="preserve"> texto</w:t>
       </w:r>
     </w:p>
     <w:p>
@@ -10603,14 +11820,94 @@
           <w:sz w:val="22"/>
           <w:szCs w:val="22"/>
         </w:rPr>
-        <w:t xml:space="preserve">key_opcion_3 ; punto1:valor_punto1, punto2:valor_punto2 ; siguiente escena </w:t>
-      </w:r>
+        <w:t>key_opcion_</w:t>
+      </w:r>
+      <w:proofErr w:type="gramStart"/>
       <w:r>
         <w:rPr>
           <w:sz w:val="22"/>
           <w:szCs w:val="22"/>
         </w:rPr>
-        <w:t>; texto</w:t>
+        <w:t>3 ;</w:t>
+      </w:r>
+      <w:proofErr w:type="gramEnd"/>
+      <w:r>
+        <w:rPr>
+          <w:sz w:val="22"/>
+          <w:szCs w:val="22"/>
+        </w:rPr>
+        <w:t xml:space="preserve"> punto</w:t>
+      </w:r>
+      <w:proofErr w:type="gramStart"/>
+      <w:r>
+        <w:rPr>
+          <w:sz w:val="22"/>
+          <w:szCs w:val="22"/>
+        </w:rPr>
+        <w:t>1:valor</w:t>
+      </w:r>
+      <w:proofErr w:type="gramEnd"/>
+      <w:r>
+        <w:rPr>
+          <w:sz w:val="22"/>
+          <w:szCs w:val="22"/>
+        </w:rPr>
+        <w:t>_punto1, punto</w:t>
+      </w:r>
+      <w:proofErr w:type="gramStart"/>
+      <w:r>
+        <w:rPr>
+          <w:sz w:val="22"/>
+          <w:szCs w:val="22"/>
+        </w:rPr>
+        <w:t>2:valor</w:t>
+      </w:r>
+      <w:proofErr w:type="gramEnd"/>
+      <w:r>
+        <w:rPr>
+          <w:sz w:val="22"/>
+          <w:szCs w:val="22"/>
+        </w:rPr>
+        <w:t>_punto</w:t>
+      </w:r>
+      <w:proofErr w:type="gramStart"/>
+      <w:r>
+        <w:rPr>
+          <w:sz w:val="22"/>
+          <w:szCs w:val="22"/>
+        </w:rPr>
+        <w:t>2 ;</w:t>
+      </w:r>
+      <w:proofErr w:type="gramEnd"/>
+      <w:r>
+        <w:rPr>
+          <w:sz w:val="22"/>
+          <w:szCs w:val="22"/>
+        </w:rPr>
+        <w:t xml:space="preserve"> siguiente </w:t>
+      </w:r>
+      <w:proofErr w:type="gramStart"/>
+      <w:r>
+        <w:rPr>
+          <w:sz w:val="22"/>
+          <w:szCs w:val="22"/>
+        </w:rPr>
+        <w:t xml:space="preserve">escena </w:t>
+      </w:r>
+      <w:r>
+        <w:rPr>
+          <w:sz w:val="22"/>
+          <w:szCs w:val="22"/>
+        </w:rPr>
+        <w:t>;</w:t>
+      </w:r>
+      <w:proofErr w:type="gramEnd"/>
+      <w:r>
+        <w:rPr>
+          <w:sz w:val="22"/>
+          <w:szCs w:val="22"/>
+        </w:rPr>
+        <w:t xml:space="preserve"> texto</w:t>
       </w:r>
     </w:p>
     <w:p>
@@ -10730,7 +12027,15 @@
     <w:p>
       <w:r>
         <w:tab/>
-        <w:t>Como se dijo anteriormente, también se pueden modificar los puntos, estos puntos pueden llevar el nombre que se desee, el único detalle es que debes asegurarte de escribirlo bien ya que si lo escribes mal, el motor lo interpretará como un punto distinto.</w:t>
+        <w:t xml:space="preserve">Como se dijo anteriormente, también se pueden modificar los puntos, estos puntos pueden llevar el nombre que se desee, el único detalle es que debes asegurarte de escribirlo bien </w:t>
+      </w:r>
+      <w:proofErr w:type="gramStart"/>
+      <w:r>
+        <w:t>ya que</w:t>
+      </w:r>
+      <w:proofErr w:type="gramEnd"/>
+      <w:r>
+        <w:t xml:space="preserve"> si lo escribes mal, el motor lo interpretará como un punto distinto.</w:t>
       </w:r>
     </w:p>
     <w:p>
@@ -10822,7 +12127,28 @@
         <w:rPr>
           <w:highlight w:val="yellow"/>
         </w:rPr>
-        <w:t>give_sushi ; ; scene_B</w:t>
+        <w:t>give_</w:t>
+      </w:r>
+      <w:proofErr w:type="gramStart"/>
+      <w:r>
+        <w:rPr>
+          <w:highlight w:val="yellow"/>
+        </w:rPr>
+        <w:t>sushi ;</w:t>
+      </w:r>
+      <w:proofErr w:type="gramEnd"/>
+      <w:r>
+        <w:rPr>
+          <w:highlight w:val="yellow"/>
+        </w:rPr>
+        <w:t xml:space="preserve"> ; scene_</w:t>
+      </w:r>
+      <w:proofErr w:type="gramStart"/>
+      <w:r>
+        <w:rPr>
+          <w:highlight w:val="yellow"/>
+        </w:rPr>
+        <w:t>B</w:t>
       </w:r>
       <w:r>
         <w:rPr>
@@ -10836,6 +12162,7 @@
         </w:rPr>
         <w:t>;</w:t>
       </w:r>
+      <w:proofErr w:type="gramEnd"/>
       <w:r>
         <w:rPr>
           <w:highlight w:val="yellow"/>
@@ -10863,20 +12190,70 @@
         <w:rPr>
           <w:highlight w:val="yellow"/>
         </w:rPr>
-        <w:t>give_salad ; amistad : -1 ; scene_C</w:t>
-      </w:r>
+        <w:t>give_</w:t>
+      </w:r>
+      <w:proofErr w:type="gramStart"/>
+      <w:r>
+        <w:rPr>
+          <w:highlight w:val="yellow"/>
+        </w:rPr>
+        <w:t>salad ;</w:t>
+      </w:r>
+      <w:proofErr w:type="gramEnd"/>
       <w:r>
         <w:rPr>
           <w:highlight w:val="yellow"/>
         </w:rPr>
         <w:t xml:space="preserve"> </w:t>
       </w:r>
+      <w:proofErr w:type="gramStart"/>
+      <w:r>
+        <w:rPr>
+          <w:highlight w:val="yellow"/>
+        </w:rPr>
+        <w:t>amistad :</w:t>
+      </w:r>
+      <w:proofErr w:type="gramEnd"/>
+      <w:r>
+        <w:rPr>
+          <w:highlight w:val="yellow"/>
+        </w:rPr>
+        <w:t xml:space="preserve"> -</w:t>
+      </w:r>
+      <w:proofErr w:type="gramStart"/>
+      <w:r>
+        <w:rPr>
+          <w:highlight w:val="yellow"/>
+        </w:rPr>
+        <w:t>1 ;</w:t>
+      </w:r>
+      <w:proofErr w:type="gramEnd"/>
+      <w:r>
+        <w:rPr>
+          <w:highlight w:val="yellow"/>
+        </w:rPr>
+        <w:t xml:space="preserve"> scene_</w:t>
+      </w:r>
+      <w:proofErr w:type="gramStart"/>
+      <w:r>
+        <w:rPr>
+          <w:highlight w:val="yellow"/>
+        </w:rPr>
+        <w:t>C</w:t>
+      </w:r>
+      <w:r>
+        <w:rPr>
+          <w:highlight w:val="yellow"/>
+        </w:rPr>
+        <w:t xml:space="preserve"> </w:t>
+      </w:r>
       <w:r>
         <w:rPr>
           <w:highlight w:val="yellow"/>
         </w:rPr>
         <w:t>;</w:t>
       </w:r>
+      <w:proofErr w:type="gramEnd"/>
       <w:r>
         <w:rPr>
           <w:highlight w:val="yellow"/>
@@ -10901,20 +12278,70 @@
         <w:rPr>
           <w:highlight w:val="yellow"/>
         </w:rPr>
-        <w:t>give_beef ; amistad : 1 ; scene_D</w:t>
-      </w:r>
+        <w:t>give_</w:t>
+      </w:r>
+      <w:proofErr w:type="gramStart"/>
+      <w:r>
+        <w:rPr>
+          <w:highlight w:val="yellow"/>
+        </w:rPr>
+        <w:t>beef ;</w:t>
+      </w:r>
+      <w:proofErr w:type="gramEnd"/>
       <w:r>
         <w:rPr>
           <w:highlight w:val="yellow"/>
         </w:rPr>
         <w:t xml:space="preserve"> </w:t>
       </w:r>
+      <w:proofErr w:type="gramStart"/>
+      <w:r>
+        <w:rPr>
+          <w:highlight w:val="yellow"/>
+        </w:rPr>
+        <w:t>amistad :</w:t>
+      </w:r>
+      <w:proofErr w:type="gramEnd"/>
+      <w:r>
+        <w:rPr>
+          <w:highlight w:val="yellow"/>
+        </w:rPr>
+        <w:t xml:space="preserve"> </w:t>
+      </w:r>
+      <w:proofErr w:type="gramStart"/>
+      <w:r>
+        <w:rPr>
+          <w:highlight w:val="yellow"/>
+        </w:rPr>
+        <w:t>1 ;</w:t>
+      </w:r>
+      <w:proofErr w:type="gramEnd"/>
+      <w:r>
+        <w:rPr>
+          <w:highlight w:val="yellow"/>
+        </w:rPr>
+        <w:t xml:space="preserve"> scene_</w:t>
+      </w:r>
+      <w:proofErr w:type="gramStart"/>
+      <w:r>
+        <w:rPr>
+          <w:highlight w:val="yellow"/>
+        </w:rPr>
+        <w:t>D</w:t>
+      </w:r>
+      <w:r>
+        <w:rPr>
+          <w:highlight w:val="yellow"/>
+        </w:rPr>
+        <w:t xml:space="preserve"> </w:t>
+      </w:r>
       <w:r>
         <w:rPr>
           <w:highlight w:val="yellow"/>
         </w:rPr>
         <w:t>;</w:t>
       </w:r>
+      <w:proofErr w:type="gramEnd"/>
       <w:r>
         <w:rPr>
           <w:highlight w:val="yellow"/>
@@ -10949,7 +12376,15 @@
         <w:t>consecuencias</w:t>
       </w:r>
       <w:r>
-        <w:t>, este caso son “give_sushi”, “give_salad” y “give_beef”, estos identificadores jamás deben repetirse, o al menos, en la</w:t>
+        <w:t xml:space="preserve">, </w:t>
+      </w:r>
+      <w:proofErr w:type="gramStart"/>
+      <w:r>
+        <w:t>este caso son</w:t>
+      </w:r>
+      <w:proofErr w:type="gramEnd"/>
+      <w:r>
+        <w:t xml:space="preserve"> “give_sushi”, “give_salad” y “give_beef”, estos identificadores jamás deben repetirse, o al menos, en la</w:t>
       </w:r>
       <w:r>
         <w:t xml:space="preserve"> misma</w:t>
@@ -10984,7 +12419,15 @@
         <w:t>diálogos</w:t>
       </w:r>
       <w:r>
-        <w:t>, para agregar nuevos textos dependiendo del idioma, debemos seguir agregando ; y añadiendo los textos correspondientes al idioma.</w:t>
+        <w:t xml:space="preserve">, para agregar nuevos textos dependiendo del idioma, debemos seguir </w:t>
+      </w:r>
+      <w:proofErr w:type="gramStart"/>
+      <w:r>
+        <w:t>agregando ;</w:t>
+      </w:r>
+      <w:proofErr w:type="gramEnd"/>
+      <w:r>
+        <w:t xml:space="preserve"> y añadiendo los textos correspondientes al idioma.</w:t>
       </w:r>
     </w:p>
     <w:p>
@@ -11013,7 +12456,15 @@
         <w:t>y por decisión.</w:t>
       </w:r>
       <w:r>
-        <w:t xml:space="preserve"> Para estas condiciones se debe tener especial control sobre los valores posibles de los puntos así como los posibles diálogos y escenas pasadas, esto para saber si de verdad las condiciones que estás escribiendo se pueden cumplir. </w:t>
+        <w:t xml:space="preserve"> Para estas condiciones se debe tener especial control sobre los valores posibles de los </w:t>
+      </w:r>
+      <w:proofErr w:type="gramStart"/>
+      <w:r>
+        <w:t>puntos</w:t>
+      </w:r>
+      <w:proofErr w:type="gramEnd"/>
+      <w:r>
+        <w:t xml:space="preserve"> así como los posibles diálogos y escenas pasadas, esto para saber si de verdad las condiciones que estás escribiendo se pueden cumplir. </w:t>
       </w:r>
     </w:p>
     <w:p>
@@ -11103,7 +12554,35 @@
         <w:rPr>
           <w:highlight w:val="yellow"/>
         </w:rPr>
-        <w:t>exam_positive_grade ; calificación &gt; 10 ; aprobado</w:t>
+        <w:t>exam_positive_</w:t>
+      </w:r>
+      <w:proofErr w:type="gramStart"/>
+      <w:r>
+        <w:rPr>
+          <w:highlight w:val="yellow"/>
+        </w:rPr>
+        <w:t>grade ;</w:t>
+      </w:r>
+      <w:proofErr w:type="gramEnd"/>
+      <w:r>
+        <w:rPr>
+          <w:highlight w:val="yellow"/>
+        </w:rPr>
+        <w:t xml:space="preserve"> calificación &gt; </w:t>
+      </w:r>
+      <w:proofErr w:type="gramStart"/>
+      <w:r>
+        <w:rPr>
+          <w:highlight w:val="yellow"/>
+        </w:rPr>
+        <w:t>10 ;</w:t>
+      </w:r>
+      <w:proofErr w:type="gramEnd"/>
+      <w:r>
+        <w:rPr>
+          <w:highlight w:val="yellow"/>
+        </w:rPr>
+        <w:t xml:space="preserve"> aprobado</w:t>
       </w:r>
     </w:p>
     <w:p>
@@ -11117,7 +12596,21 @@
         <w:rPr>
           <w:highlight w:val="yellow"/>
         </w:rPr>
-        <w:t>exam_negative_grade ; ; reprobado</w:t>
+        <w:t>exam_negative_</w:t>
+      </w:r>
+      <w:proofErr w:type="gramStart"/>
+      <w:r>
+        <w:rPr>
+          <w:highlight w:val="yellow"/>
+        </w:rPr>
+        <w:t>grade ;</w:t>
+      </w:r>
+      <w:proofErr w:type="gramEnd"/>
+      <w:r>
+        <w:rPr>
+          <w:highlight w:val="yellow"/>
+        </w:rPr>
+        <w:t xml:space="preserve"> ; reprobado</w:t>
       </w:r>
     </w:p>
     <w:p>
@@ -11199,7 +12692,15 @@
         <w:ind w:firstLine="708"/>
       </w:pPr>
       <w:r>
-        <w:t>Como Atlax Renpy verifica todas las condiciones y si ninguna se cumple toma la última por defecto, no hace falta colocar condición en la última opción, ya que si no se cumple una, irá a la otra.</w:t>
+        <w:t xml:space="preserve">Como Atlax Renpy verifica todas las condiciones y si ninguna se cumple toma la última por defecto, no hace falta colocar condición en la última opción, </w:t>
+      </w:r>
+      <w:proofErr w:type="gramStart"/>
+      <w:r>
+        <w:t>ya que</w:t>
+      </w:r>
+      <w:proofErr w:type="gramEnd"/>
+      <w:r>
+        <w:t xml:space="preserve"> si no se cumple una, irá a la otra.</w:t>
       </w:r>
     </w:p>
     <w:p>
@@ -11234,7 +12735,35 @@
         <w:rPr>
           <w:highlight w:val="yellow"/>
         </w:rPr>
-        <w:t>Katherine_route_good_end ; amistad &gt; 18, calificación &gt; 10 ; final_bueno</w:t>
+        <w:t>Katherine_route_good_</w:t>
+      </w:r>
+      <w:proofErr w:type="gramStart"/>
+      <w:r>
+        <w:rPr>
+          <w:highlight w:val="yellow"/>
+        </w:rPr>
+        <w:t>end ;</w:t>
+      </w:r>
+      <w:proofErr w:type="gramEnd"/>
+      <w:r>
+        <w:rPr>
+          <w:highlight w:val="yellow"/>
+        </w:rPr>
+        <w:t xml:space="preserve"> amistad &gt; 18, calificación &gt; </w:t>
+      </w:r>
+      <w:proofErr w:type="gramStart"/>
+      <w:r>
+        <w:rPr>
+          <w:highlight w:val="yellow"/>
+        </w:rPr>
+        <w:t>10 ;</w:t>
+      </w:r>
+      <w:proofErr w:type="gramEnd"/>
+      <w:r>
+        <w:rPr>
+          <w:highlight w:val="yellow"/>
+        </w:rPr>
+        <w:t xml:space="preserve"> final_bueno</w:t>
       </w:r>
     </w:p>
     <w:p>
@@ -11261,7 +12790,21 @@
         <w:rPr>
           <w:highlight w:val="yellow"/>
         </w:rPr>
-        <w:t xml:space="preserve">_end ; amistad &gt; </w:t>
+        <w:t>_</w:t>
+      </w:r>
+      <w:proofErr w:type="gramStart"/>
+      <w:r>
+        <w:rPr>
+          <w:highlight w:val="yellow"/>
+        </w:rPr>
+        <w:t>end ;</w:t>
+      </w:r>
+      <w:proofErr w:type="gramEnd"/>
+      <w:r>
+        <w:rPr>
+          <w:highlight w:val="yellow"/>
+        </w:rPr>
+        <w:t xml:space="preserve"> amistad &gt; </w:t>
       </w:r>
       <w:r>
         <w:rPr>
@@ -11279,13 +12822,27 @@
         <w:rPr>
           <w:highlight w:val="yellow"/>
         </w:rPr>
-        <w:t>calificación &gt; 5</w:t>
-      </w:r>
-      <w:r>
-        <w:rPr>
-          <w:highlight w:val="yellow"/>
-        </w:rPr>
-        <w:t xml:space="preserve"> ; final_</w:t>
+        <w:t xml:space="preserve">calificación &gt; </w:t>
+      </w:r>
+      <w:proofErr w:type="gramStart"/>
+      <w:r>
+        <w:rPr>
+          <w:highlight w:val="yellow"/>
+        </w:rPr>
+        <w:t>5</w:t>
+      </w:r>
+      <w:r>
+        <w:rPr>
+          <w:highlight w:val="yellow"/>
+        </w:rPr>
+        <w:t xml:space="preserve"> ;</w:t>
+      </w:r>
+      <w:proofErr w:type="gramEnd"/>
+      <w:r>
+        <w:rPr>
+          <w:highlight w:val="yellow"/>
+        </w:rPr>
+        <w:t xml:space="preserve"> final_</w:t>
       </w:r>
       <w:r>
         <w:rPr>
@@ -11303,7 +12860,21 @@
         <w:rPr>
           <w:highlight w:val="yellow"/>
         </w:rPr>
-        <w:t>Katherine_route_bad_end ; ; final_malo</w:t>
+        <w:t>Katherine_route_bad_</w:t>
+      </w:r>
+      <w:proofErr w:type="gramStart"/>
+      <w:r>
+        <w:rPr>
+          <w:highlight w:val="yellow"/>
+        </w:rPr>
+        <w:t>end ;</w:t>
+      </w:r>
+      <w:proofErr w:type="gramEnd"/>
+      <w:r>
+        <w:rPr>
+          <w:highlight w:val="yellow"/>
+        </w:rPr>
+        <w:t xml:space="preserve"> ; final_malo</w:t>
       </w:r>
     </w:p>
     <w:p>
@@ -11398,7 +12969,35 @@
         <w:rPr>
           <w:highlight w:val="yellow"/>
         </w:rPr>
-        <w:t>sushi_gived ; give_sushi ; escena_B</w:t>
+        <w:t>sushi_</w:t>
+      </w:r>
+      <w:proofErr w:type="gramStart"/>
+      <w:r>
+        <w:rPr>
+          <w:highlight w:val="yellow"/>
+        </w:rPr>
+        <w:t>gived ;</w:t>
+      </w:r>
+      <w:proofErr w:type="gramEnd"/>
+      <w:r>
+        <w:rPr>
+          <w:highlight w:val="yellow"/>
+        </w:rPr>
+        <w:t xml:space="preserve"> give_</w:t>
+      </w:r>
+      <w:proofErr w:type="gramStart"/>
+      <w:r>
+        <w:rPr>
+          <w:highlight w:val="yellow"/>
+        </w:rPr>
+        <w:t>sushi ;</w:t>
+      </w:r>
+      <w:proofErr w:type="gramEnd"/>
+      <w:r>
+        <w:rPr>
+          <w:highlight w:val="yellow"/>
+        </w:rPr>
+        <w:t xml:space="preserve"> escena_B</w:t>
       </w:r>
     </w:p>
     <w:p>
@@ -11412,7 +13011,35 @@
         <w:rPr>
           <w:highlight w:val="yellow"/>
         </w:rPr>
-        <w:t>salad_gived ; give_salad ; escena_C</w:t>
+        <w:t>salad_</w:t>
+      </w:r>
+      <w:proofErr w:type="gramStart"/>
+      <w:r>
+        <w:rPr>
+          <w:highlight w:val="yellow"/>
+        </w:rPr>
+        <w:t>gived ;</w:t>
+      </w:r>
+      <w:proofErr w:type="gramEnd"/>
+      <w:r>
+        <w:rPr>
+          <w:highlight w:val="yellow"/>
+        </w:rPr>
+        <w:t xml:space="preserve"> give_</w:t>
+      </w:r>
+      <w:proofErr w:type="gramStart"/>
+      <w:r>
+        <w:rPr>
+          <w:highlight w:val="yellow"/>
+        </w:rPr>
+        <w:t>salad ;</w:t>
+      </w:r>
+      <w:proofErr w:type="gramEnd"/>
+      <w:r>
+        <w:rPr>
+          <w:highlight w:val="yellow"/>
+        </w:rPr>
+        <w:t xml:space="preserve"> escena_C</w:t>
       </w:r>
     </w:p>
     <w:p>
@@ -11424,7 +13051,35 @@
         <w:rPr>
           <w:highlight w:val="yellow"/>
         </w:rPr>
-        <w:t>beef_gived ; give_beef ; escena_D</w:t>
+        <w:t>beef_</w:t>
+      </w:r>
+      <w:proofErr w:type="gramStart"/>
+      <w:r>
+        <w:rPr>
+          <w:highlight w:val="yellow"/>
+        </w:rPr>
+        <w:t>gived ;</w:t>
+      </w:r>
+      <w:proofErr w:type="gramEnd"/>
+      <w:r>
+        <w:rPr>
+          <w:highlight w:val="yellow"/>
+        </w:rPr>
+        <w:t xml:space="preserve"> give_</w:t>
+      </w:r>
+      <w:proofErr w:type="gramStart"/>
+      <w:r>
+        <w:rPr>
+          <w:highlight w:val="yellow"/>
+        </w:rPr>
+        <w:t>beef ;</w:t>
+      </w:r>
+      <w:proofErr w:type="gramEnd"/>
+      <w:r>
+        <w:rPr>
+          <w:highlight w:val="yellow"/>
+        </w:rPr>
+        <w:t xml:space="preserve"> escena_D</w:t>
       </w:r>
     </w:p>
     <w:p>
@@ -11614,7 +13269,35 @@
         <w:rPr>
           <w:highlight w:val="yellow"/>
         </w:rPr>
-        <w:t>earthquake_lived_in_home ; earthquake_in_home ; tell_home_earthquake</w:t>
+        <w:t>earthquake_lived_in_</w:t>
+      </w:r>
+      <w:proofErr w:type="gramStart"/>
+      <w:r>
+        <w:rPr>
+          <w:highlight w:val="yellow"/>
+        </w:rPr>
+        <w:t>home ;</w:t>
+      </w:r>
+      <w:proofErr w:type="gramEnd"/>
+      <w:r>
+        <w:rPr>
+          <w:highlight w:val="yellow"/>
+        </w:rPr>
+        <w:t xml:space="preserve"> earthquake_in_</w:t>
+      </w:r>
+      <w:proofErr w:type="gramStart"/>
+      <w:r>
+        <w:rPr>
+          <w:highlight w:val="yellow"/>
+        </w:rPr>
+        <w:t>home ;</w:t>
+      </w:r>
+      <w:proofErr w:type="gramEnd"/>
+      <w:r>
+        <w:rPr>
+          <w:highlight w:val="yellow"/>
+        </w:rPr>
+        <w:t xml:space="preserve"> tell_home_earthquake</w:t>
       </w:r>
     </w:p>
     <w:p>
@@ -11629,8 +13312,23 @@
         <w:rPr>
           <w:highlight w:val="yellow"/>
         </w:rPr>
-        <w:t>earthquake_lived_in_shop ; earthquake_in_</w:t>
-      </w:r>
+        <w:t>earthquake_lived_in_</w:t>
+      </w:r>
+      <w:proofErr w:type="gramStart"/>
+      <w:r>
+        <w:rPr>
+          <w:highlight w:val="yellow"/>
+        </w:rPr>
+        <w:t>shop ;</w:t>
+      </w:r>
+      <w:proofErr w:type="gramEnd"/>
+      <w:r>
+        <w:rPr>
+          <w:highlight w:val="yellow"/>
+        </w:rPr>
+        <w:t xml:space="preserve"> earthquake_in_</w:t>
+      </w:r>
+      <w:proofErr w:type="gramStart"/>
       <w:r>
         <w:rPr>
           <w:highlight w:val="yellow"/>
@@ -11641,7 +13339,14 @@
         <w:rPr>
           <w:highlight w:val="yellow"/>
         </w:rPr>
-        <w:t xml:space="preserve"> ; tell_shop_earthquake</w:t>
+        <w:t xml:space="preserve"> ;</w:t>
+      </w:r>
+      <w:proofErr w:type="gramEnd"/>
+      <w:r>
+        <w:rPr>
+          <w:highlight w:val="yellow"/>
+        </w:rPr>
+        <w:t xml:space="preserve"> tell_shop_earthquake</w:t>
       </w:r>
     </w:p>
     <w:p>
@@ -11652,19 +13357,47 @@
         <w:rPr>
           <w:highlight w:val="yellow"/>
         </w:rPr>
-        <w:t>earthquake_lived_in_gym ; earthquake_in</w:t>
-      </w:r>
-      <w:r>
-        <w:rPr>
-          <w:highlight w:val="yellow"/>
-        </w:rPr>
-        <w:t>_gym</w:t>
-      </w:r>
-      <w:r>
-        <w:rPr>
-          <w:highlight w:val="yellow"/>
-        </w:rPr>
-        <w:t xml:space="preserve"> ; tell_gym_earthquake</w:t>
+        <w:t>earthquake_lived_in_</w:t>
+      </w:r>
+      <w:proofErr w:type="gramStart"/>
+      <w:r>
+        <w:rPr>
+          <w:highlight w:val="yellow"/>
+        </w:rPr>
+        <w:t>gym ;</w:t>
+      </w:r>
+      <w:proofErr w:type="gramEnd"/>
+      <w:r>
+        <w:rPr>
+          <w:highlight w:val="yellow"/>
+        </w:rPr>
+        <w:t xml:space="preserve"> earthquake_in</w:t>
+      </w:r>
+      <w:r>
+        <w:rPr>
+          <w:highlight w:val="yellow"/>
+        </w:rPr>
+        <w:t>_</w:t>
+      </w:r>
+      <w:proofErr w:type="gramStart"/>
+      <w:r>
+        <w:rPr>
+          <w:highlight w:val="yellow"/>
+        </w:rPr>
+        <w:t>gym</w:t>
+      </w:r>
+      <w:r>
+        <w:rPr>
+          <w:highlight w:val="yellow"/>
+        </w:rPr>
+        <w:t xml:space="preserve"> ;</w:t>
+      </w:r>
+      <w:proofErr w:type="gramEnd"/>
+      <w:r>
+        <w:rPr>
+          <w:highlight w:val="yellow"/>
+        </w:rPr>
+        <w:t xml:space="preserve"> tell_gym_earthquake</w:t>
       </w:r>
     </w:p>
     <w:p>
@@ -11712,8 +13445,21 @@
     <w:p>
       <w:r>
         <w:tab/>
-        <w:t>Estas transiciones irán separadas por un ; y sus parámetros por :</w:t>
-      </w:r>
+        <w:t xml:space="preserve">Estas transiciones irán separadas por </w:t>
+      </w:r>
+      <w:proofErr w:type="gramStart"/>
+      <w:r>
+        <w:t>un ;</w:t>
+      </w:r>
+      <w:proofErr w:type="gramEnd"/>
+      <w:r>
+        <w:t xml:space="preserve"> y sus parámetros </w:t>
+      </w:r>
+      <w:proofErr w:type="gramStart"/>
+      <w:r>
+        <w:t>por :</w:t>
+      </w:r>
+      <w:proofErr w:type="gramEnd"/>
     </w:p>
     <w:p>
       <w:pPr>
@@ -11726,7 +13472,63 @@
         <w:rPr>
           <w:highlight w:val="yellow"/>
         </w:rPr>
-        <w:t>#decision ; fade : 1 : 3 : 1</w:t>
+        <w:t>#</w:t>
+      </w:r>
+      <w:proofErr w:type="gramStart"/>
+      <w:r>
+        <w:rPr>
+          <w:highlight w:val="yellow"/>
+        </w:rPr>
+        <w:t>decision ;</w:t>
+      </w:r>
+      <w:proofErr w:type="gramEnd"/>
+      <w:r>
+        <w:rPr>
+          <w:highlight w:val="yellow"/>
+        </w:rPr>
+        <w:t xml:space="preserve"> </w:t>
+      </w:r>
+      <w:proofErr w:type="gramStart"/>
+      <w:r>
+        <w:rPr>
+          <w:highlight w:val="yellow"/>
+        </w:rPr>
+        <w:t>fade :</w:t>
+      </w:r>
+      <w:proofErr w:type="gramEnd"/>
+      <w:r>
+        <w:rPr>
+          <w:highlight w:val="yellow"/>
+        </w:rPr>
+        <w:t xml:space="preserve"> </w:t>
+      </w:r>
+      <w:proofErr w:type="gramStart"/>
+      <w:r>
+        <w:rPr>
+          <w:highlight w:val="yellow"/>
+        </w:rPr>
+        <w:t>1 :</w:t>
+      </w:r>
+      <w:proofErr w:type="gramEnd"/>
+      <w:r>
+        <w:rPr>
+          <w:highlight w:val="yellow"/>
+        </w:rPr>
+        <w:t xml:space="preserve"> </w:t>
+      </w:r>
+      <w:proofErr w:type="gramStart"/>
+      <w:r>
+        <w:rPr>
+          <w:highlight w:val="yellow"/>
+        </w:rPr>
+        <w:t>3 :</w:t>
+      </w:r>
+      <w:proofErr w:type="gramEnd"/>
+      <w:r>
+        <w:rPr>
+          <w:highlight w:val="yellow"/>
+        </w:rPr>
+        <w:t xml:space="preserve"> 1</w:t>
       </w:r>
       <w:r>
         <w:t xml:space="preserve"> (Hace un fade entre escenas)</w:t>
@@ -11740,7 +13542,35 @@
         <w:rPr>
           <w:highlight w:val="yellow"/>
         </w:rPr>
-        <w:t>#linear ; video : nombre_del_video</w:t>
+        <w:t>#</w:t>
+      </w:r>
+      <w:proofErr w:type="gramStart"/>
+      <w:r>
+        <w:rPr>
+          <w:highlight w:val="yellow"/>
+        </w:rPr>
+        <w:t>linear ;</w:t>
+      </w:r>
+      <w:proofErr w:type="gramEnd"/>
+      <w:r>
+        <w:rPr>
+          <w:highlight w:val="yellow"/>
+        </w:rPr>
+        <w:t xml:space="preserve"> </w:t>
+      </w:r>
+      <w:proofErr w:type="gramStart"/>
+      <w:r>
+        <w:rPr>
+          <w:highlight w:val="yellow"/>
+        </w:rPr>
+        <w:t>video :</w:t>
+      </w:r>
+      <w:proofErr w:type="gramEnd"/>
+      <w:r>
+        <w:rPr>
+          <w:highlight w:val="yellow"/>
+        </w:rPr>
+        <w:t xml:space="preserve"> nombre_del_video</w:t>
       </w:r>
       <w:r>
         <w:t xml:space="preserve"> (Muestra un video antes de pasar a la siguiente secena)</w:t>
@@ -11749,7 +13579,15 @@
     <w:p>
       <w:r>
         <w:tab/>
-        <w:t>Si se desea mostrar un video este debe estar en formato .webp.</w:t>
+        <w:t xml:space="preserve">Si se desea mostrar un video este debe estar en </w:t>
+      </w:r>
+      <w:proofErr w:type="gramStart"/>
+      <w:r>
+        <w:t>formato .webp</w:t>
+      </w:r>
+      <w:proofErr w:type="gramEnd"/>
+      <w:r>
+        <w:t>.</w:t>
       </w:r>
     </w:p>
     <w:p/>
@@ -11764,8 +13602,13 @@
     <w:p>
       <w:r>
         <w:tab/>
-        <w:t>Por razones de ahorro de recursos es conveniente que de vez en cuando limpiemos nuestra escena, esto lo hacemos añadiendo la opción “clear” al final de un fin de diálogo, este debe ir separado por un ;</w:t>
-      </w:r>
+        <w:t xml:space="preserve">Por razones de ahorro de recursos es conveniente que de vez en cuando limpiemos nuestra escena, esto lo hacemos añadiendo la opción “clear” al final de un fin de diálogo, este debe ir separado por </w:t>
+      </w:r>
+      <w:proofErr w:type="gramStart"/>
+      <w:r>
+        <w:t>un ;</w:t>
+      </w:r>
+      <w:proofErr w:type="gramEnd"/>
     </w:p>
     <w:p>
       <w:pPr>
@@ -11778,13 +13621,55 @@
         <w:rPr>
           <w:highlight w:val="yellow"/>
         </w:rPr>
-        <w:t xml:space="preserve">#decision ; video ; </w:t>
-      </w:r>
-      <w:r>
-        <w:rPr>
-          <w:highlight w:val="yellow"/>
-        </w:rPr>
-        <w:t>sun_rising ; clear</w:t>
+        <w:t>#</w:t>
+      </w:r>
+      <w:proofErr w:type="gramStart"/>
+      <w:r>
+        <w:rPr>
+          <w:highlight w:val="yellow"/>
+        </w:rPr>
+        <w:t>decision ;</w:t>
+      </w:r>
+      <w:proofErr w:type="gramEnd"/>
+      <w:r>
+        <w:rPr>
+          <w:highlight w:val="yellow"/>
+        </w:rPr>
+        <w:t xml:space="preserve"> </w:t>
+      </w:r>
+      <w:proofErr w:type="gramStart"/>
+      <w:r>
+        <w:rPr>
+          <w:highlight w:val="yellow"/>
+        </w:rPr>
+        <w:t>video ;</w:t>
+      </w:r>
+      <w:proofErr w:type="gramEnd"/>
+      <w:r>
+        <w:rPr>
+          <w:highlight w:val="yellow"/>
+        </w:rPr>
+        <w:t xml:space="preserve"> </w:t>
+      </w:r>
+      <w:r>
+        <w:rPr>
+          <w:highlight w:val="yellow"/>
+        </w:rPr>
+        <w:t>sun_</w:t>
+      </w:r>
+      <w:proofErr w:type="gramStart"/>
+      <w:r>
+        <w:rPr>
+          <w:highlight w:val="yellow"/>
+        </w:rPr>
+        <w:t>rising ;</w:t>
+      </w:r>
+      <w:proofErr w:type="gramEnd"/>
+      <w:r>
+        <w:rPr>
+          <w:highlight w:val="yellow"/>
+        </w:rPr>
+        <w:t xml:space="preserve"> clear</w:t>
       </w:r>
       <w:r>
         <w:t xml:space="preserve"> (Repro</w:t>
@@ -11807,7 +13692,77 @@
         <w:rPr>
           <w:highlight w:val="yellow"/>
         </w:rPr>
-        <w:t>#condition scene ; fade : 1 : 2 : 1 ; clear</w:t>
+        <w:t xml:space="preserve">#condition </w:t>
+      </w:r>
+      <w:proofErr w:type="gramStart"/>
+      <w:r>
+        <w:rPr>
+          <w:highlight w:val="yellow"/>
+        </w:rPr>
+        <w:t>scene ;</w:t>
+      </w:r>
+      <w:proofErr w:type="gramEnd"/>
+      <w:r>
+        <w:rPr>
+          <w:highlight w:val="yellow"/>
+        </w:rPr>
+        <w:t xml:space="preserve"> </w:t>
+      </w:r>
+      <w:proofErr w:type="gramStart"/>
+      <w:r>
+        <w:rPr>
+          <w:highlight w:val="yellow"/>
+        </w:rPr>
+        <w:t>fade :</w:t>
+      </w:r>
+      <w:proofErr w:type="gramEnd"/>
+      <w:r>
+        <w:rPr>
+          <w:highlight w:val="yellow"/>
+        </w:rPr>
+        <w:t xml:space="preserve"> </w:t>
+      </w:r>
+      <w:proofErr w:type="gramStart"/>
+      <w:r>
+        <w:rPr>
+          <w:highlight w:val="yellow"/>
+        </w:rPr>
+        <w:t>1 :</w:t>
+      </w:r>
+      <w:proofErr w:type="gramEnd"/>
+      <w:r>
+        <w:rPr>
+          <w:highlight w:val="yellow"/>
+        </w:rPr>
+        <w:t xml:space="preserve"> </w:t>
+      </w:r>
+      <w:proofErr w:type="gramStart"/>
+      <w:r>
+        <w:rPr>
+          <w:highlight w:val="yellow"/>
+        </w:rPr>
+        <w:t>2 :</w:t>
+      </w:r>
+      <w:proofErr w:type="gramEnd"/>
+      <w:r>
+        <w:rPr>
+          <w:highlight w:val="yellow"/>
+        </w:rPr>
+        <w:t xml:space="preserve"> </w:t>
+      </w:r>
+      <w:proofErr w:type="gramStart"/>
+      <w:r>
+        <w:rPr>
+          <w:highlight w:val="yellow"/>
+        </w:rPr>
+        <w:t>1 ;</w:t>
+      </w:r>
+      <w:proofErr w:type="gramEnd"/>
+      <w:r>
+        <w:rPr>
+          <w:highlight w:val="yellow"/>
+        </w:rPr>
+        <w:t xml:space="preserve"> clear</w:t>
       </w:r>
       <w:r>
         <w:t xml:space="preserve"> (Hace un fa</w:t>
@@ -11827,7 +13782,21 @@
         <w:rPr>
           <w:highlight w:val="yellow"/>
         </w:rPr>
-        <w:t>#condition decisión ; ; clear</w:t>
+        <w:t xml:space="preserve">#condition </w:t>
+      </w:r>
+      <w:proofErr w:type="gramStart"/>
+      <w:r>
+        <w:rPr>
+          <w:highlight w:val="yellow"/>
+        </w:rPr>
+        <w:t>decisión ;</w:t>
+      </w:r>
+      <w:proofErr w:type="gramEnd"/>
+      <w:r>
+        <w:rPr>
+          <w:highlight w:val="yellow"/>
+        </w:rPr>
+        <w:t xml:space="preserve"> ; clear</w:t>
       </w:r>
       <w:r>
         <w:t xml:space="preserve"> (Limpiando sin hacer una transición)</w:t>
@@ -11980,7 +13949,15 @@
         <w:t xml:space="preserve">Si requireSceneEncryption </w:t>
       </w:r>
       <w:r>
-        <w:t>dice True, significa que el motor espera que los archivos de control estén encriptados, por lo tanto los desencriptará utilizando el atlax_encryption_key.</w:t>
+        <w:t xml:space="preserve">dice True, significa que el motor espera que los archivos de control estén encriptados, por lo </w:t>
+      </w:r>
+      <w:proofErr w:type="gramStart"/>
+      <w:r>
+        <w:t>tanto</w:t>
+      </w:r>
+      <w:proofErr w:type="gramEnd"/>
+      <w:r>
+        <w:t xml:space="preserve"> los desencriptará utilizando el atlax_encryption_key.</w:t>
       </w:r>
     </w:p>
     <w:p>
@@ -11989,10 +13966,18 @@
         <w:t xml:space="preserve">Si </w:t>
       </w:r>
       <w:r>
-        <w:t>requireSceneEncryption dice</w:t>
-      </w:r>
-      <w:r>
-        <w:t xml:space="preserve">  False, el motor asumirá que los archivos no están encriptados y los leerá tal cual.</w:t>
+        <w:t xml:space="preserve">requireSceneEncryption </w:t>
+      </w:r>
+      <w:proofErr w:type="gramStart"/>
+      <w:r>
+        <w:t>dice</w:t>
+      </w:r>
+      <w:r>
+        <w:t xml:space="preserve">  False</w:t>
+      </w:r>
+      <w:proofErr w:type="gramEnd"/>
+      <w:r>
+        <w:t>, el motor asumirá que los archivos no están encriptados y los leerá tal cual.</w:t>
       </w:r>
     </w:p>
     <w:p>
@@ -12009,12 +13994,21 @@
         <w:tab/>
         <w:t xml:space="preserve">Si deseas encriptar tus archivos de control deberás dirigirte a la carpeta </w:t>
       </w:r>
+      <w:proofErr w:type="gramStart"/>
       <w:r>
         <w:rPr>
           <w:i/>
           <w:iCs/>
         </w:rPr>
-        <w:t>apps/sceneEncrypter</w:t>
+        <w:t>apps</w:t>
+      </w:r>
+      <w:proofErr w:type="gramEnd"/>
+      <w:r>
+        <w:rPr>
+          <w:i/>
+          <w:iCs/>
+        </w:rPr>
+        <w:t>/sceneEncrypter</w:t>
       </w:r>
       <w:r>
         <w:t>. Allí encontrarás los siguientes archivos.</w:t>
@@ -12202,7 +14196,15 @@
     <w:p>
       <w:r>
         <w:tab/>
-        <w:t>Atlax Renpy no ofrece ninguna herramienta específica para facilitar la fase de testing de tu novela visual, sin embargo aquí dejaré algunas estrategias para agilizar el testeo de tus escenas.</w:t>
+        <w:t xml:space="preserve">Atlax Renpy no ofrece ninguna herramienta específica para facilitar la fase de testing de tu novela visual, sin </w:t>
+      </w:r>
+      <w:proofErr w:type="gramStart"/>
+      <w:r>
+        <w:t>embargo</w:t>
+      </w:r>
+      <w:proofErr w:type="gramEnd"/>
+      <w:r>
+        <w:t xml:space="preserve"> aquí dejaré algunas estrategias para agilizar el testeo de tus escenas.</w:t>
       </w:r>
     </w:p>
     <w:p>
@@ -12503,7 +14505,15 @@
         <w:t>twoParameterEvents</w:t>
       </w:r>
       <w:r>
-        <w:t xml:space="preserve">. IMPORTANTE: Si la animación utiliza la propiedad zoom, estrictamente debe estar en </w:t>
+        <w:t xml:space="preserve">. IMPORTANTE: Si la animación utiliza la propiedad </w:t>
+      </w:r>
+      <w:proofErr w:type="gramStart"/>
+      <w:r>
+        <w:t>zoom</w:t>
+      </w:r>
+      <w:proofErr w:type="gramEnd"/>
+      <w:r>
+        <w:t xml:space="preserve">, estrictamente debe estar en </w:t>
       </w:r>
       <w:r>
         <w:rPr>
@@ -12800,6 +14810,92 @@
     </w:lvl>
   </w:abstractNum>
   <w:abstractNum w:abstractNumId="1" w15:restartNumberingAfterBreak="0">
+    <w:nsid w:val="061051A8"/>
+    <w:multiLevelType w:val="hybridMultilevel"/>
+    <w:tmpl w:val="A18AD846"/>
+    <w:lvl w:ilvl="0" w:tplc="200A000F">
+      <w:start w:val="1"/>
+      <w:numFmt w:val="decimal"/>
+      <w:lvlText w:val="%1."/>
+      <w:lvlJc w:val="left"/>
+      <w:pPr>
+        <w:ind w:left="720" w:hanging="360"/>
+      </w:pPr>
+    </w:lvl>
+    <w:lvl w:ilvl="1" w:tplc="200A0019" w:tentative="1">
+      <w:start w:val="1"/>
+      <w:numFmt w:val="lowerLetter"/>
+      <w:lvlText w:val="%2."/>
+      <w:lvlJc w:val="left"/>
+      <w:pPr>
+        <w:ind w:left="1440" w:hanging="360"/>
+      </w:pPr>
+    </w:lvl>
+    <w:lvl w:ilvl="2" w:tplc="200A001B" w:tentative="1">
+      <w:start w:val="1"/>
+      <w:numFmt w:val="lowerRoman"/>
+      <w:lvlText w:val="%3."/>
+      <w:lvlJc w:val="right"/>
+      <w:pPr>
+        <w:ind w:left="2160" w:hanging="180"/>
+      </w:pPr>
+    </w:lvl>
+    <w:lvl w:ilvl="3" w:tplc="200A000F" w:tentative="1">
+      <w:start w:val="1"/>
+      <w:numFmt w:val="decimal"/>
+      <w:lvlText w:val="%4."/>
+      <w:lvlJc w:val="left"/>
+      <w:pPr>
+        <w:ind w:left="2880" w:hanging="360"/>
+      </w:pPr>
+    </w:lvl>
+    <w:lvl w:ilvl="4" w:tplc="200A0019" w:tentative="1">
+      <w:start w:val="1"/>
+      <w:numFmt w:val="lowerLetter"/>
+      <w:lvlText w:val="%5."/>
+      <w:lvlJc w:val="left"/>
+      <w:pPr>
+        <w:ind w:left="3600" w:hanging="360"/>
+      </w:pPr>
+    </w:lvl>
+    <w:lvl w:ilvl="5" w:tplc="200A001B" w:tentative="1">
+      <w:start w:val="1"/>
+      <w:numFmt w:val="lowerRoman"/>
+      <w:lvlText w:val="%6."/>
+      <w:lvlJc w:val="right"/>
+      <w:pPr>
+        <w:ind w:left="4320" w:hanging="180"/>
+      </w:pPr>
+    </w:lvl>
+    <w:lvl w:ilvl="6" w:tplc="200A000F" w:tentative="1">
+      <w:start w:val="1"/>
+      <w:numFmt w:val="decimal"/>
+      <w:lvlText w:val="%7."/>
+      <w:lvlJc w:val="left"/>
+      <w:pPr>
+        <w:ind w:left="5040" w:hanging="360"/>
+      </w:pPr>
+    </w:lvl>
+    <w:lvl w:ilvl="7" w:tplc="200A0019" w:tentative="1">
+      <w:start w:val="1"/>
+      <w:numFmt w:val="lowerLetter"/>
+      <w:lvlText w:val="%8."/>
+      <w:lvlJc w:val="left"/>
+      <w:pPr>
+        <w:ind w:left="5760" w:hanging="360"/>
+      </w:pPr>
+    </w:lvl>
+    <w:lvl w:ilvl="8" w:tplc="200A001B" w:tentative="1">
+      <w:start w:val="1"/>
+      <w:numFmt w:val="lowerRoman"/>
+      <w:lvlText w:val="%9."/>
+      <w:lvlJc w:val="right"/>
+      <w:pPr>
+        <w:ind w:left="6480" w:hanging="180"/>
+      </w:pPr>
+    </w:lvl>
+  </w:abstractNum>
+  <w:abstractNum w:abstractNumId="2" w15:restartNumberingAfterBreak="0">
     <w:nsid w:val="0CF00789"/>
     <w:multiLevelType w:val="hybridMultilevel"/>
     <w:tmpl w:val="807A709C"/>
@@ -12912,7 +15008,7 @@
       </w:rPr>
     </w:lvl>
   </w:abstractNum>
-  <w:abstractNum w:abstractNumId="2" w15:restartNumberingAfterBreak="0">
+  <w:abstractNum w:abstractNumId="3" w15:restartNumberingAfterBreak="0">
     <w:nsid w:val="20093117"/>
     <w:multiLevelType w:val="hybridMultilevel"/>
     <w:tmpl w:val="FAC280E6"/>
@@ -13025,7 +15121,7 @@
       </w:rPr>
     </w:lvl>
   </w:abstractNum>
-  <w:abstractNum w:abstractNumId="3" w15:restartNumberingAfterBreak="0">
+  <w:abstractNum w:abstractNumId="4" w15:restartNumberingAfterBreak="0">
     <w:nsid w:val="21142F3C"/>
     <w:multiLevelType w:val="hybridMultilevel"/>
     <w:tmpl w:val="9B5EE3D4"/>
@@ -13138,7 +15234,7 @@
       </w:rPr>
     </w:lvl>
   </w:abstractNum>
-  <w:abstractNum w:abstractNumId="4" w15:restartNumberingAfterBreak="0">
+  <w:abstractNum w:abstractNumId="5" w15:restartNumberingAfterBreak="0">
     <w:nsid w:val="22F95A1C"/>
     <w:multiLevelType w:val="hybridMultilevel"/>
     <w:tmpl w:val="79264C64"/>
@@ -13224,7 +15320,7 @@
       </w:pPr>
     </w:lvl>
   </w:abstractNum>
-  <w:abstractNum w:abstractNumId="5" w15:restartNumberingAfterBreak="0">
+  <w:abstractNum w:abstractNumId="6" w15:restartNumberingAfterBreak="0">
     <w:nsid w:val="2C933685"/>
     <w:multiLevelType w:val="hybridMultilevel"/>
     <w:tmpl w:val="A7AC24A0"/>
@@ -13310,7 +15406,7 @@
       </w:pPr>
     </w:lvl>
   </w:abstractNum>
-  <w:abstractNum w:abstractNumId="6" w15:restartNumberingAfterBreak="0">
+  <w:abstractNum w:abstractNumId="7" w15:restartNumberingAfterBreak="0">
     <w:nsid w:val="34E74BA5"/>
     <w:multiLevelType w:val="hybridMultilevel"/>
     <w:tmpl w:val="6B0E7984"/>
@@ -13399,7 +15495,7 @@
       </w:pPr>
     </w:lvl>
   </w:abstractNum>
-  <w:abstractNum w:abstractNumId="7" w15:restartNumberingAfterBreak="0">
+  <w:abstractNum w:abstractNumId="8" w15:restartNumberingAfterBreak="0">
     <w:nsid w:val="35BB7E8F"/>
     <w:multiLevelType w:val="hybridMultilevel"/>
     <w:tmpl w:val="2DF213C2"/>
@@ -13512,7 +15608,7 @@
       </w:rPr>
     </w:lvl>
   </w:abstractNum>
-  <w:abstractNum w:abstractNumId="8" w15:restartNumberingAfterBreak="0">
+  <w:abstractNum w:abstractNumId="9" w15:restartNumberingAfterBreak="0">
     <w:nsid w:val="391A4D18"/>
     <w:multiLevelType w:val="hybridMultilevel"/>
     <w:tmpl w:val="BFCC90D6"/>
@@ -13598,7 +15694,7 @@
       </w:pPr>
     </w:lvl>
   </w:abstractNum>
-  <w:abstractNum w:abstractNumId="9" w15:restartNumberingAfterBreak="0">
+  <w:abstractNum w:abstractNumId="10" w15:restartNumberingAfterBreak="0">
     <w:nsid w:val="3A74320C"/>
     <w:multiLevelType w:val="hybridMultilevel"/>
     <w:tmpl w:val="6E88E228"/>
@@ -13711,7 +15807,7 @@
       </w:rPr>
     </w:lvl>
   </w:abstractNum>
-  <w:abstractNum w:abstractNumId="10" w15:restartNumberingAfterBreak="0">
+  <w:abstractNum w:abstractNumId="11" w15:restartNumberingAfterBreak="0">
     <w:nsid w:val="3D616461"/>
     <w:multiLevelType w:val="hybridMultilevel"/>
     <w:tmpl w:val="5E869988"/>
@@ -13824,7 +15920,7 @@
       </w:rPr>
     </w:lvl>
   </w:abstractNum>
-  <w:abstractNum w:abstractNumId="11" w15:restartNumberingAfterBreak="0">
+  <w:abstractNum w:abstractNumId="12" w15:restartNumberingAfterBreak="0">
     <w:nsid w:val="3DC26F13"/>
     <w:multiLevelType w:val="hybridMultilevel"/>
     <w:tmpl w:val="98323762"/>
@@ -13937,7 +16033,7 @@
       </w:rPr>
     </w:lvl>
   </w:abstractNum>
-  <w:abstractNum w:abstractNumId="12" w15:restartNumberingAfterBreak="0">
+  <w:abstractNum w:abstractNumId="13" w15:restartNumberingAfterBreak="0">
     <w:nsid w:val="3E672CCD"/>
     <w:multiLevelType w:val="hybridMultilevel"/>
     <w:tmpl w:val="0BAE5ED6"/>
@@ -14026,7 +16122,7 @@
       </w:pPr>
     </w:lvl>
   </w:abstractNum>
-  <w:abstractNum w:abstractNumId="13" w15:restartNumberingAfterBreak="0">
+  <w:abstractNum w:abstractNumId="14" w15:restartNumberingAfterBreak="0">
     <w:nsid w:val="47C62F33"/>
     <w:multiLevelType w:val="hybridMultilevel"/>
     <w:tmpl w:val="F8989EB4"/>
@@ -14139,7 +16235,7 @@
       </w:rPr>
     </w:lvl>
   </w:abstractNum>
-  <w:abstractNum w:abstractNumId="14" w15:restartNumberingAfterBreak="0">
+  <w:abstractNum w:abstractNumId="15" w15:restartNumberingAfterBreak="0">
     <w:nsid w:val="4D794F7B"/>
     <w:multiLevelType w:val="hybridMultilevel"/>
     <w:tmpl w:val="ADB0E002"/>
@@ -14252,7 +16348,7 @@
       </w:rPr>
     </w:lvl>
   </w:abstractNum>
-  <w:abstractNum w:abstractNumId="15" w15:restartNumberingAfterBreak="0">
+  <w:abstractNum w:abstractNumId="16" w15:restartNumberingAfterBreak="0">
     <w:nsid w:val="615B20F0"/>
     <w:multiLevelType w:val="hybridMultilevel"/>
     <w:tmpl w:val="7AC4399A"/>
@@ -14338,7 +16434,7 @@
       </w:pPr>
     </w:lvl>
   </w:abstractNum>
-  <w:abstractNum w:abstractNumId="16" w15:restartNumberingAfterBreak="0">
+  <w:abstractNum w:abstractNumId="17" w15:restartNumberingAfterBreak="0">
     <w:nsid w:val="63556DA1"/>
     <w:multiLevelType w:val="hybridMultilevel"/>
     <w:tmpl w:val="FE8C0458"/>
@@ -14451,7 +16547,96 @@
       </w:rPr>
     </w:lvl>
   </w:abstractNum>
-  <w:abstractNum w:abstractNumId="17" w15:restartNumberingAfterBreak="0">
+  <w:abstractNum w:abstractNumId="18" w15:restartNumberingAfterBreak="0">
+    <w:nsid w:val="67597F94"/>
+    <w:multiLevelType w:val="hybridMultilevel"/>
+    <w:tmpl w:val="A6049668"/>
+    <w:lvl w:ilvl="0" w:tplc="200A000F">
+      <w:start w:val="1"/>
+      <w:numFmt w:val="decimal"/>
+      <w:lvlText w:val="%1."/>
+      <w:lvlJc w:val="left"/>
+      <w:pPr>
+        <w:ind w:left="720" w:hanging="360"/>
+      </w:pPr>
+      <w:rPr>
+        <w:rFonts w:hint="default"/>
+      </w:rPr>
+    </w:lvl>
+    <w:lvl w:ilvl="1" w:tplc="200A0019" w:tentative="1">
+      <w:start w:val="1"/>
+      <w:numFmt w:val="lowerLetter"/>
+      <w:lvlText w:val="%2."/>
+      <w:lvlJc w:val="left"/>
+      <w:pPr>
+        <w:ind w:left="1440" w:hanging="360"/>
+      </w:pPr>
+    </w:lvl>
+    <w:lvl w:ilvl="2" w:tplc="200A001B" w:tentative="1">
+      <w:start w:val="1"/>
+      <w:numFmt w:val="lowerRoman"/>
+      <w:lvlText w:val="%3."/>
+      <w:lvlJc w:val="right"/>
+      <w:pPr>
+        <w:ind w:left="2160" w:hanging="180"/>
+      </w:pPr>
+    </w:lvl>
+    <w:lvl w:ilvl="3" w:tplc="200A000F" w:tentative="1">
+      <w:start w:val="1"/>
+      <w:numFmt w:val="decimal"/>
+      <w:lvlText w:val="%4."/>
+      <w:lvlJc w:val="left"/>
+      <w:pPr>
+        <w:ind w:left="2880" w:hanging="360"/>
+      </w:pPr>
+    </w:lvl>
+    <w:lvl w:ilvl="4" w:tplc="200A0019" w:tentative="1">
+      <w:start w:val="1"/>
+      <w:numFmt w:val="lowerLetter"/>
+      <w:lvlText w:val="%5."/>
+      <w:lvlJc w:val="left"/>
+      <w:pPr>
+        <w:ind w:left="3600" w:hanging="360"/>
+      </w:pPr>
+    </w:lvl>
+    <w:lvl w:ilvl="5" w:tplc="200A001B" w:tentative="1">
+      <w:start w:val="1"/>
+      <w:numFmt w:val="lowerRoman"/>
+      <w:lvlText w:val="%6."/>
+      <w:lvlJc w:val="right"/>
+      <w:pPr>
+        <w:ind w:left="4320" w:hanging="180"/>
+      </w:pPr>
+    </w:lvl>
+    <w:lvl w:ilvl="6" w:tplc="200A000F" w:tentative="1">
+      <w:start w:val="1"/>
+      <w:numFmt w:val="decimal"/>
+      <w:lvlText w:val="%7."/>
+      <w:lvlJc w:val="left"/>
+      <w:pPr>
+        <w:ind w:left="5040" w:hanging="360"/>
+      </w:pPr>
+    </w:lvl>
+    <w:lvl w:ilvl="7" w:tplc="200A0019" w:tentative="1">
+      <w:start w:val="1"/>
+      <w:numFmt w:val="lowerLetter"/>
+      <w:lvlText w:val="%8."/>
+      <w:lvlJc w:val="left"/>
+      <w:pPr>
+        <w:ind w:left="5760" w:hanging="360"/>
+      </w:pPr>
+    </w:lvl>
+    <w:lvl w:ilvl="8" w:tplc="200A001B" w:tentative="1">
+      <w:start w:val="1"/>
+      <w:numFmt w:val="lowerRoman"/>
+      <w:lvlText w:val="%9."/>
+      <w:lvlJc w:val="right"/>
+      <w:pPr>
+        <w:ind w:left="6480" w:hanging="180"/>
+      </w:pPr>
+    </w:lvl>
+  </w:abstractNum>
+  <w:abstractNum w:abstractNumId="19" w15:restartNumberingAfterBreak="0">
     <w:nsid w:val="6AD52AD2"/>
     <w:multiLevelType w:val="hybridMultilevel"/>
     <w:tmpl w:val="9FCE4DB8"/>
@@ -14540,7 +16725,7 @@
       </w:pPr>
     </w:lvl>
   </w:abstractNum>
-  <w:abstractNum w:abstractNumId="18" w15:restartNumberingAfterBreak="0">
+  <w:abstractNum w:abstractNumId="20" w15:restartNumberingAfterBreak="0">
     <w:nsid w:val="753D730E"/>
     <w:multiLevelType w:val="hybridMultilevel"/>
     <w:tmpl w:val="75E0B6C2"/>
@@ -14653,7 +16838,7 @@
       </w:rPr>
     </w:lvl>
   </w:abstractNum>
-  <w:abstractNum w:abstractNumId="19" w15:restartNumberingAfterBreak="0">
+  <w:abstractNum w:abstractNumId="21" w15:restartNumberingAfterBreak="0">
     <w:nsid w:val="77037EA0"/>
     <w:multiLevelType w:val="hybridMultilevel"/>
     <w:tmpl w:val="1D7C8B04"/>
@@ -14766,7 +16951,7 @@
       </w:rPr>
     </w:lvl>
   </w:abstractNum>
-  <w:abstractNum w:abstractNumId="20" w15:restartNumberingAfterBreak="0">
+  <w:abstractNum w:abstractNumId="22" w15:restartNumberingAfterBreak="0">
     <w:nsid w:val="7B12378A"/>
     <w:multiLevelType w:val="hybridMultilevel"/>
     <w:tmpl w:val="E6EC6DD6"/>
@@ -14853,66 +17038,72 @@
     </w:lvl>
   </w:abstractNum>
   <w:num w:numId="1" w16cid:durableId="1293169672">
-    <w:abstractNumId w:val="14"/>
+    <w:abstractNumId w:val="15"/>
   </w:num>
   <w:num w:numId="2" w16cid:durableId="132523105">
-    <w:abstractNumId w:val="16"/>
+    <w:abstractNumId w:val="17"/>
   </w:num>
   <w:num w:numId="3" w16cid:durableId="550045339">
+    <w:abstractNumId w:val="3"/>
+  </w:num>
+  <w:num w:numId="4" w16cid:durableId="913316204">
+    <w:abstractNumId w:val="13"/>
+  </w:num>
+  <w:num w:numId="5" w16cid:durableId="1328904247">
+    <w:abstractNumId w:val="10"/>
+  </w:num>
+  <w:num w:numId="6" w16cid:durableId="675959527">
+    <w:abstractNumId w:val="9"/>
+  </w:num>
+  <w:num w:numId="7" w16cid:durableId="1954557278">
+    <w:abstractNumId w:val="4"/>
+  </w:num>
+  <w:num w:numId="8" w16cid:durableId="1356231617">
     <w:abstractNumId w:val="2"/>
   </w:num>
-  <w:num w:numId="4" w16cid:durableId="913316204">
-    <w:abstractNumId w:val="12"/>
-  </w:num>
-  <w:num w:numId="5" w16cid:durableId="1328904247">
-    <w:abstractNumId w:val="9"/>
-  </w:num>
-  <w:num w:numId="6" w16cid:durableId="675959527">
+  <w:num w:numId="9" w16cid:durableId="1882328899">
     <w:abstractNumId w:val="8"/>
   </w:num>
-  <w:num w:numId="7" w16cid:durableId="1954557278">
-    <w:abstractNumId w:val="3"/>
-  </w:num>
-  <w:num w:numId="8" w16cid:durableId="1356231617">
-    <w:abstractNumId w:val="1"/>
-  </w:num>
-  <w:num w:numId="9" w16cid:durableId="1882328899">
-    <w:abstractNumId w:val="7"/>
-  </w:num>
   <w:num w:numId="10" w16cid:durableId="870528595">
-    <w:abstractNumId w:val="10"/>
+    <w:abstractNumId w:val="11"/>
   </w:num>
   <w:num w:numId="11" w16cid:durableId="1776826764">
-    <w:abstractNumId w:val="19"/>
+    <w:abstractNumId w:val="21"/>
   </w:num>
   <w:num w:numId="12" w16cid:durableId="1998149375">
     <w:abstractNumId w:val="0"/>
   </w:num>
   <w:num w:numId="13" w16cid:durableId="2030794282">
+    <w:abstractNumId w:val="22"/>
+  </w:num>
+  <w:num w:numId="14" w16cid:durableId="389350923">
+    <w:abstractNumId w:val="7"/>
+  </w:num>
+  <w:num w:numId="15" w16cid:durableId="1450397852">
+    <w:abstractNumId w:val="6"/>
+  </w:num>
+  <w:num w:numId="16" w16cid:durableId="1198618860">
+    <w:abstractNumId w:val="14"/>
+  </w:num>
+  <w:num w:numId="17" w16cid:durableId="534732538">
+    <w:abstractNumId w:val="19"/>
+  </w:num>
+  <w:num w:numId="18" w16cid:durableId="1870793516">
+    <w:abstractNumId w:val="12"/>
+  </w:num>
+  <w:num w:numId="19" w16cid:durableId="1198272480">
+    <w:abstractNumId w:val="16"/>
+  </w:num>
+  <w:num w:numId="20" w16cid:durableId="1597127380">
+    <w:abstractNumId w:val="5"/>
+  </w:num>
+  <w:num w:numId="21" w16cid:durableId="1672026176">
     <w:abstractNumId w:val="20"/>
   </w:num>
-  <w:num w:numId="14" w16cid:durableId="389350923">
-    <w:abstractNumId w:val="6"/>
+  <w:num w:numId="22" w16cid:durableId="44453642">
+    <w:abstractNumId w:val="1"/>
   </w:num>
-  <w:num w:numId="15" w16cid:durableId="1450397852">
-    <w:abstractNumId w:val="5"/>
-  </w:num>
-  <w:num w:numId="16" w16cid:durableId="1198618860">
-    <w:abstractNumId w:val="13"/>
-  </w:num>
-  <w:num w:numId="17" w16cid:durableId="534732538">
-    <w:abstractNumId w:val="17"/>
-  </w:num>
-  <w:num w:numId="18" w16cid:durableId="1870793516">
-    <w:abstractNumId w:val="11"/>
-  </w:num>
-  <w:num w:numId="19" w16cid:durableId="1198272480">
-    <w:abstractNumId w:val="15"/>
-  </w:num>
-  <w:num w:numId="20" w16cid:durableId="1597127380">
-    <w:abstractNumId w:val="4"/>
-  </w:num>
-  <w:num w:numId="21" w16cid:durableId="1672026176">
+  <w:num w:numId="23" w16cid:durableId="158888792">
     <w:abstractNumId w:val="18"/>
   </w:num>
 </w:numbering>

</xml_diff>

<commit_message>
<docs> explaining columns of control files
</commit_message>
<xml_diff>
--- a/Manual de desarrollo en Atlax Renpy.docx
+++ b/Manual de desarrollo en Atlax Renpy.docx
@@ -2690,26 +2690,10 @@
         <w:t>,</w:t>
       </w:r>
       <w:r>
-        <w:t xml:space="preserve"> </w:t>
-      </w:r>
-      <w:proofErr w:type="gramStart"/>
-      <w:r>
-        <w:t>y</w:t>
-      </w:r>
-      <w:proofErr w:type="gramEnd"/>
-      <w:r>
-        <w:t xml:space="preserve"> por ende, distintas rutas o </w:t>
-      </w:r>
-      <w:proofErr w:type="gramStart"/>
-      <w:r>
-        <w:t xml:space="preserve">caminos </w:t>
-      </w:r>
-      <w:r>
-        <w:t xml:space="preserve"> con</w:t>
-      </w:r>
-      <w:proofErr w:type="gramEnd"/>
-      <w:r>
-        <w:t xml:space="preserve"> distintos finales</w:t>
+        <w:t xml:space="preserve"> y por ende, distintas rutas o caminos </w:t>
+      </w:r>
+      <w:r>
+        <w:t xml:space="preserve"> con distintos finales</w:t>
       </w:r>
       <w:r>
         <w:t>. Sin embargo, s</w:t>
@@ -2842,13 +2826,8 @@
           <w:numId w:val="3"/>
         </w:numPr>
       </w:pPr>
-      <w:proofErr w:type="gramStart"/>
-      <w:r>
-        <w:t>Texto a mostrar</w:t>
-      </w:r>
-      <w:proofErr w:type="gramEnd"/>
-      <w:r>
-        <w:t xml:space="preserve"> en pantalla</w:t>
+      <w:r>
+        <w:t>Texto a mostrar en pantalla</w:t>
       </w:r>
     </w:p>
     <w:p>
@@ -3084,19 +3063,14 @@
         <w:t>Deberías dar prioridad a organizar estos archivos de control de la mejor manera posible, el orden recomendado es crear</w:t>
       </w:r>
       <w:r>
+        <w:t xml:space="preserve"> una </w:t>
+      </w:r>
+      <w:r>
         <w:t xml:space="preserve"> </w:t>
       </w:r>
-      <w:proofErr w:type="gramStart"/>
-      <w:r>
-        <w:t xml:space="preserve">una </w:t>
-      </w:r>
-      <w:r>
-        <w:t xml:space="preserve"> </w:t>
-      </w:r>
       <w:r>
         <w:t>carpeta</w:t>
       </w:r>
-      <w:proofErr w:type="gramEnd"/>
       <w:r>
         <w:t xml:space="preserve"> para cada</w:t>
       </w:r>
@@ -3224,23 +3198,7 @@
         <w:t>diálogos</w:t>
       </w:r>
       <w:r>
-        <w:t xml:space="preserve"> como de costumbre, uno a uno, </w:t>
-      </w:r>
-      <w:proofErr w:type="gramStart"/>
-      <w:r>
-        <w:t>click</w:t>
-      </w:r>
-      <w:proofErr w:type="gramEnd"/>
-      <w:r>
-        <w:t xml:space="preserve"> a </w:t>
-      </w:r>
-      <w:proofErr w:type="gramStart"/>
-      <w:r>
-        <w:t>click</w:t>
-      </w:r>
-      <w:proofErr w:type="gramEnd"/>
-      <w:r>
-        <w:t xml:space="preserve">. Una vez llegado el final de la </w:t>
+        <w:t xml:space="preserve"> como de costumbre, uno a uno, click a click. Una vez llegado el final de la </w:t>
       </w:r>
       <w:r>
         <w:rPr>
@@ -3602,15 +3560,7 @@
     <w:p>
       <w:r>
         <w:tab/>
-        <w:t xml:space="preserve">El instalador creará el sistema de </w:t>
-      </w:r>
-      <w:proofErr w:type="gramStart"/>
-      <w:r>
-        <w:t>carpetas</w:t>
-      </w:r>
-      <w:proofErr w:type="gramEnd"/>
-      <w:r>
-        <w:t xml:space="preserve"> así como el archivo de configuración, además de modificar algunos archivos del proyecto como el </w:t>
+        <w:t xml:space="preserve">El instalador creará el sistema de carpetas así como el archivo de configuración, además de modificar algunos archivos del proyecto como el </w:t>
       </w:r>
       <w:r>
         <w:rPr>
@@ -3743,15 +3693,7 @@
         <w:t xml:space="preserve">La estructura es sencilla, la columna “Key” representa qué se está definiendo, las columnas “Value1” y “Value2” aguardan los distintos valores </w:t>
       </w:r>
       <w:r>
-        <w:t xml:space="preserve">del objeto que se va a definir. Por </w:t>
-      </w:r>
-      <w:proofErr w:type="gramStart"/>
-      <w:r>
-        <w:t>último</w:t>
-      </w:r>
-      <w:proofErr w:type="gramEnd"/>
-      <w:r>
-        <w:t xml:space="preserve"> tenemos las columnas de los idiomas disponibles en nuestra novela.</w:t>
+        <w:t>del objeto que se va a definir. Por último tenemos las columnas de los idiomas disponibles en nuestra novela.</w:t>
       </w:r>
     </w:p>
     <w:p>
@@ -3838,15 +3780,7 @@
         <w:t>el nombre de</w:t>
       </w:r>
       <w:r>
-        <w:t xml:space="preserve">l archivo de control o script personalizado desde la cual comenzará la novela. Por </w:t>
-      </w:r>
-      <w:proofErr w:type="gramStart"/>
-      <w:r>
-        <w:t>ejemplo</w:t>
-      </w:r>
-      <w:proofErr w:type="gramEnd"/>
-      <w:r>
-        <w:t xml:space="preserve"> si nuestra escena de inicio está ubicada en la carpeta </w:t>
+        <w:t xml:space="preserve">l archivo de control o script personalizado desde la cual comenzará la novela. Por ejemplo si nuestra escena de inicio está ubicada en la carpeta </w:t>
       </w:r>
       <w:r>
         <w:rPr>
@@ -4377,15 +4311,7 @@
         <w:ind w:firstLine="708"/>
       </w:pPr>
       <w:r>
-        <w:t xml:space="preserve">Se recomienda no quitar los fondos </w:t>
-      </w:r>
-      <w:proofErr w:type="gramStart"/>
-      <w:r>
-        <w:t>flash</w:t>
-      </w:r>
-      <w:proofErr w:type="gramEnd"/>
-      <w:r>
-        <w:t xml:space="preserve"> y blackout ya que el motor los necesita para hacer algunas transiciones.</w:t>
+        <w:t>Se recomienda no quitar los fondos flash y blackout ya que el motor los necesita para hacer algunas transiciones.</w:t>
       </w:r>
     </w:p>
     <w:p>
@@ -4491,23 +4417,7 @@
     <w:p>
       <w:r>
         <w:tab/>
-        <w:t xml:space="preserve">Por defecto Atlax Renpy centra la caja de texto con el nombre del emisor entre otras configuraciones. Este es un archivo propio de renpy con el </w:t>
-      </w:r>
-      <w:proofErr w:type="gramStart"/>
-      <w:r>
-        <w:t>formato .rpy</w:t>
-      </w:r>
-      <w:proofErr w:type="gramEnd"/>
-      <w:r>
-        <w:t xml:space="preserve">, por lo </w:t>
-      </w:r>
-      <w:proofErr w:type="gramStart"/>
-      <w:r>
-        <w:t>tanto</w:t>
-      </w:r>
-      <w:proofErr w:type="gramEnd"/>
-      <w:r>
-        <w:t xml:space="preserve"> lo recomendable es abrirlo con un editor de texto como Visual Studio Code o bloc de notas.</w:t>
+        <w:t>Por defecto Atlax Renpy centra la caja de texto con el nombre del emisor entre otras configuraciones. Este es un archivo propio de renpy con el formato .rpy, por lo tanto lo recomendable es abrirlo con un editor de texto como Visual Studio Code o bloc de notas.</w:t>
       </w:r>
     </w:p>
     <w:p>
@@ -4901,95 +4811,13 @@
           <w:szCs w:val="20"/>
         </w:rPr>
       </w:pPr>
-      <w:proofErr w:type="gramStart"/>
       <w:r>
         <w:rPr>
           <w:sz w:val="20"/>
           <w:szCs w:val="20"/>
         </w:rPr>
-        <w:t>Key;Background</w:t>
-      </w:r>
-      <w:proofErr w:type="gramEnd"/>
-      <w:r>
-        <w:rPr>
-          <w:sz w:val="20"/>
-          <w:szCs w:val="20"/>
-        </w:rPr>
-        <w:t>;</w:t>
-      </w:r>
-      <w:proofErr w:type="gramStart"/>
-      <w:r>
-        <w:rPr>
-          <w:sz w:val="20"/>
-          <w:szCs w:val="20"/>
-        </w:rPr>
-        <w:t>Music;Sound</w:t>
-      </w:r>
-      <w:proofErr w:type="gramEnd"/>
-      <w:r>
-        <w:rPr>
-          <w:sz w:val="20"/>
-          <w:szCs w:val="20"/>
-        </w:rPr>
-        <w:t>;</w:t>
-      </w:r>
-      <w:proofErr w:type="gramStart"/>
-      <w:r>
-        <w:rPr>
-          <w:sz w:val="20"/>
-          <w:szCs w:val="20"/>
-        </w:rPr>
-        <w:t>Single</w:t>
-      </w:r>
-      <w:proofErr w:type="gramEnd"/>
-      <w:r>
-        <w:rPr>
-          <w:sz w:val="20"/>
-          <w:szCs w:val="20"/>
-        </w:rPr>
-        <w:t xml:space="preserve"> </w:t>
-      </w:r>
-      <w:proofErr w:type="gramStart"/>
-      <w:r>
-        <w:rPr>
-          <w:sz w:val="20"/>
-          <w:szCs w:val="20"/>
-        </w:rPr>
-        <w:t>effect;Continuous</w:t>
-      </w:r>
-      <w:proofErr w:type="gramEnd"/>
-      <w:r>
-        <w:rPr>
-          <w:sz w:val="20"/>
-          <w:szCs w:val="20"/>
-        </w:rPr>
-        <w:t xml:space="preserve"> </w:t>
-      </w:r>
-      <w:proofErr w:type="gramStart"/>
-      <w:r>
-        <w:rPr>
-          <w:sz w:val="20"/>
-          <w:szCs w:val="20"/>
-        </w:rPr>
-        <w:t>effect;Events</w:t>
-      </w:r>
-      <w:proofErr w:type="gramEnd"/>
-      <w:r>
-        <w:rPr>
-          <w:sz w:val="20"/>
-          <w:szCs w:val="20"/>
-        </w:rPr>
-        <w:t>;</w:t>
-      </w:r>
-      <w:proofErr w:type="gramStart"/>
-      <w:r>
-        <w:rPr>
-          <w:sz w:val="20"/>
-          <w:szCs w:val="20"/>
-        </w:rPr>
-        <w:t>Delay;Emisor</w:t>
-      </w:r>
-      <w:proofErr w:type="gramEnd"/>
+        <w:t>Key;Background;Music;Sound;Single effect;Continuous effect;Events;Delay;Emisor</w:t>
+      </w:r>
       <w:r>
         <w:rPr>
           <w:b/>
@@ -4999,7 +4827,6 @@
         </w:rPr>
         <w:t>;</w:t>
       </w:r>
-      <w:proofErr w:type="gramStart"/>
       <w:r>
         <w:rPr>
           <w:sz w:val="20"/>
@@ -5007,7 +4834,6 @@
         </w:rPr>
         <w:t>Spanish;English</w:t>
       </w:r>
-      <w:proofErr w:type="gramEnd"/>
     </w:p>
     <w:p>
       <w:pPr>
@@ -5184,37 +5010,13 @@
     <w:p>
       <w:r>
         <w:tab/>
-        <w:t xml:space="preserve">Esta columna representa un identificador único que debe tener cada diálogo, ese identificador debe ser estrictamente irrepetible en el resto de </w:t>
-      </w:r>
-      <w:proofErr w:type="gramStart"/>
-      <w:r>
-        <w:t>escenas</w:t>
-      </w:r>
-      <w:proofErr w:type="gramEnd"/>
-      <w:r>
-        <w:t xml:space="preserve"> del juego. Esto ayudará en la organización al momento de corregir errores ya que sabrás exactamente en qué línea está el problema.</w:t>
+        <w:t>Esta columna representa un identificador único que debe tener cada diálogo, ese identificador debe ser estrictamente irrepetible en el resto de escenas del juego. Esto ayudará en la organización al momento de corregir errores ya que sabrás exactamente en qué línea está el problema.</w:t>
       </w:r>
     </w:p>
     <w:p>
       <w:r>
         <w:tab/>
-        <w:t xml:space="preserve">El valor recomendado para colocar en esta columna key es el siguiente: [ruta]_[capitulo]_[escena]_[dialogo], por </w:t>
-      </w:r>
-      <w:proofErr w:type="gramStart"/>
-      <w:r>
-        <w:t>ejemplo</w:t>
-      </w:r>
-      <w:proofErr w:type="gramEnd"/>
-      <w:r>
-        <w:t xml:space="preserve"> si queremos describir el diálogo número 89 de la escena noche de paseo del capítulo 3 de la ruta Stefannie, haríamos algo así: stefannie_3_night_out_89, el siguiente diálogo sería </w:t>
-      </w:r>
-      <w:proofErr w:type="gramStart"/>
-      <w:r>
-        <w:t>igual</w:t>
-      </w:r>
-      <w:proofErr w:type="gramEnd"/>
-      <w:r>
-        <w:t xml:space="preserve"> pero con un 90 en vez de 89 y siempre empezando en 1.</w:t>
+        <w:t>El valor recomendado para colocar en esta columna key es el siguiente: [ruta]_[capitulo]_[escena]_[dialogo], por ejemplo si queremos describir el diálogo número 89 de la escena noche de paseo del capítulo 3 de la ruta Stefannie, haríamos algo así: stefannie_3_night_out_89, el siguiente diálogo sería igual pero con un 90 en vez de 89 y siempre empezando en 1.</w:t>
       </w:r>
     </w:p>
     <w:p>
@@ -5222,15 +5024,7 @@
         <w:ind w:firstLine="708"/>
       </w:pPr>
       <w:r>
-        <w:t xml:space="preserve">Debido a que puede llegar a ser demasiado tedioso escribir a mano todos los números, Excel nos brinda una ayuda, primero abrimos el archivo usando Excel, escribimos en la primera fila (después de la cabecera) stefannie_3_night_out_1, acto seguido dirigimos el cursor a la esquina inferior derecha de la celda seleccionada y manteniendo el </w:t>
-      </w:r>
-      <w:proofErr w:type="gramStart"/>
-      <w:r>
-        <w:t>click</w:t>
-      </w:r>
-      <w:proofErr w:type="gramEnd"/>
-      <w:r>
-        <w:t>, lo arrastramos hacia abajo hasta donde veamos necesario.</w:t>
+        <w:t>Debido a que puede llegar a ser demasiado tedioso escribir a mano todos los números, Excel nos brinda una ayuda, primero abrimos el archivo usando Excel, escribimos en la primera fila (después de la cabecera) stefannie_3_night_out_1, acto seguido dirigimos el cursor a la esquina inferior derecha de la celda seleccionada y manteniendo el click, lo arrastramos hacia abajo hasta donde veamos necesario.</w:t>
       </w:r>
     </w:p>
     <w:p>
@@ -5484,23 +5278,7 @@
         <w:ind w:firstLine="708"/>
       </w:pPr>
       <w:r>
-        <w:t xml:space="preserve">Nombre del </w:t>
-      </w:r>
-      <w:proofErr w:type="gramStart"/>
-      <w:r>
-        <w:t>fondo :</w:t>
-      </w:r>
-      <w:proofErr w:type="gramEnd"/>
-      <w:r>
-        <w:t xml:space="preserve"> tipo de </w:t>
-      </w:r>
-      <w:proofErr w:type="gramStart"/>
-      <w:r>
-        <w:t>transición :</w:t>
-      </w:r>
-      <w:proofErr w:type="gramEnd"/>
-      <w:r>
-        <w:t xml:space="preserve"> parámetros de la transición</w:t>
+        <w:t>Nombre del fondo : tipo de transición : parámetros de la transición</w:t>
       </w:r>
     </w:p>
     <w:p>
@@ -5861,11 +5639,9 @@
             <w:pPr>
               <w:jc w:val="center"/>
             </w:pPr>
-            <w:proofErr w:type="gramStart"/>
             <w:r>
               <w:t>pixel</w:t>
             </w:r>
-            <w:proofErr w:type="gramEnd"/>
           </w:p>
           <w:p>
             <w:pPr>
@@ -6067,40 +5843,18 @@
         <w:rPr>
           <w:highlight w:val="yellow"/>
         </w:rPr>
-        <w:t>school_hall_</w:t>
-      </w:r>
-      <w:proofErr w:type="gramStart"/>
+        <w:t>school_hall_3:dissolve:4</w:t>
+      </w:r>
+      <w:r>
+        <w:t xml:space="preserve"> (El fondo school_hall_3 aparece a lo largo de 4 segundos)</w:t>
+      </w:r>
+    </w:p>
+    <w:p>
       <w:r>
         <w:rPr>
           <w:highlight w:val="yellow"/>
         </w:rPr>
-        <w:t>3:dissolve</w:t>
-      </w:r>
-      <w:proofErr w:type="gramEnd"/>
-      <w:r>
-        <w:rPr>
-          <w:highlight w:val="yellow"/>
-        </w:rPr>
-        <w:t>:4</w:t>
-      </w:r>
-      <w:r>
-        <w:t xml:space="preserve"> (El fondo school_hall_3 aparece a lo largo de 4 segundos)</w:t>
-      </w:r>
-    </w:p>
-    <w:p>
-      <w:proofErr w:type="gramStart"/>
-      <w:r>
-        <w:rPr>
-          <w:highlight w:val="yellow"/>
-        </w:rPr>
-        <w:t>campus:fade</w:t>
-      </w:r>
-      <w:proofErr w:type="gramEnd"/>
-      <w:r>
-        <w:rPr>
-          <w:highlight w:val="yellow"/>
-        </w:rPr>
-        <w:t>:1:3:1</w:t>
+        <w:t>campus:fade:1:3:1</w:t>
       </w:r>
       <w:r>
         <w:t xml:space="preserve"> (El fondo campus aparece luego de un fundido a negro)</w:t>
@@ -6223,15 +5977,7 @@
         <w:ind w:left="708" w:firstLine="708"/>
       </w:pPr>
       <w:r>
-        <w:t>nombre_de_la_</w:t>
-      </w:r>
-      <w:proofErr w:type="gramStart"/>
-      <w:r>
-        <w:t>musica :</w:t>
-      </w:r>
-      <w:proofErr w:type="gramEnd"/>
-      <w:r>
-        <w:t xml:space="preserve"> fade-in en segundos</w:t>
+        <w:t>nombre_de_la_musica : fade-in en segundos</w:t>
       </w:r>
     </w:p>
     <w:p>
@@ -6321,15 +6067,7 @@
     <w:p>
       <w:r>
         <w:tab/>
-        <w:t xml:space="preserve">Los sonidos que se reproducen en el </w:t>
-      </w:r>
-      <w:proofErr w:type="gramStart"/>
-      <w:r>
-        <w:t>diálogo,</w:t>
-      </w:r>
-      <w:proofErr w:type="gramEnd"/>
-      <w:r>
-        <w:t xml:space="preserve"> pueden ser varios a la vez. Deben estar en formato .wav y estar ubicados en la carpeta </w:t>
+        <w:t xml:space="preserve">Los sonidos que se reproducen en el diálogo, pueden ser varios a la vez. Deben estar en formato .wav y estar ubicados en la carpeta </w:t>
       </w:r>
       <w:r>
         <w:rPr>
@@ -6363,15 +6101,7 @@
     <w:p>
       <w:r>
         <w:tab/>
-        <w:t xml:space="preserve">Nombre del </w:t>
-      </w:r>
-      <w:proofErr w:type="gramStart"/>
-      <w:r>
-        <w:t>sonido :</w:t>
-      </w:r>
-      <w:proofErr w:type="gramEnd"/>
-      <w:r>
-        <w:t xml:space="preserve"> loop</w:t>
+        <w:t>Nombre del sonido : loop</w:t>
       </w:r>
     </w:p>
     <w:p>
@@ -6386,30 +6116,14 @@
         <w:t>.</w:t>
       </w:r>
       <w:r>
-        <w:t xml:space="preserve"> Las mayúsculas no se respetan, de todas </w:t>
-      </w:r>
-      <w:proofErr w:type="gramStart"/>
-      <w:r>
-        <w:t>formas</w:t>
-      </w:r>
-      <w:proofErr w:type="gramEnd"/>
-      <w:r>
-        <w:t xml:space="preserve"> se recomienda escribirlo todo en minúscula.</w:t>
+        <w:t xml:space="preserve"> Las mayúsculas no se respetan, de todas formas se recomienda escribirlo todo en minúscula.</w:t>
       </w:r>
     </w:p>
     <w:p>
       <w:r>
         <w:lastRenderedPageBreak/>
         <w:tab/>
-        <w:t xml:space="preserve">Si colocamos el nombre del sonido sin más, este se reproducirá una sola vez. Para reproducir varios sonidos simultáneamente, debemos separarlos por comas. Si deseamos que el sonido se reproduzca constantemente debemos </w:t>
-      </w:r>
-      <w:proofErr w:type="gramStart"/>
-      <w:r>
-        <w:t>añadir :loop</w:t>
-      </w:r>
-      <w:proofErr w:type="gramEnd"/>
-      <w:r>
-        <w:t xml:space="preserve">, es importante mencionar que hacer eso hará que el sonido se reproduzca indefinidamente hasta que volvamos a escribir la misma instrucción más adelante. </w:t>
+        <w:t xml:space="preserve">Si colocamos el nombre del sonido sin más, este se reproducirá una sola vez. Para reproducir varios sonidos simultáneamente, debemos separarlos por comas. Si deseamos que el sonido se reproduzca constantemente debemos añadir :loop, es importante mencionar que hacer eso hará que el sonido se reproduzca indefinidamente hasta que volvamos a escribir la misma instrucción más adelante. </w:t>
       </w:r>
     </w:p>
     <w:p>
@@ -6469,16 +6183,8 @@
         <w:rPr>
           <w:highlight w:val="yellow"/>
         </w:rPr>
-        <w:t xml:space="preserve">spadas </w:t>
-      </w:r>
-      <w:proofErr w:type="gramStart"/>
-      <w:r>
-        <w:rPr>
-          <w:highlight w:val="yellow"/>
-        </w:rPr>
-        <w:t>chocando:loop</w:t>
-      </w:r>
-      <w:proofErr w:type="gramEnd"/>
+        <w:t>spadas chocando:loop</w:t>
+      </w:r>
       <w:r>
         <w:t xml:space="preserve"> (Reproduce espadas chocando indefinidamente hasta que se vuelva a escribir </w:t>
       </w:r>
@@ -6486,15 +6192,7 @@
         <w:t>e</w:t>
       </w:r>
       <w:r>
-        <w:t xml:space="preserve">spadas </w:t>
-      </w:r>
-      <w:proofErr w:type="gramStart"/>
-      <w:r>
-        <w:t>chocando:loop</w:t>
-      </w:r>
-      <w:proofErr w:type="gramEnd"/>
-      <w:r>
-        <w:t xml:space="preserve"> en un diálogo posterior).</w:t>
+        <w:t>spadas chocando:loop en un diálogo posterior).</w:t>
       </w:r>
     </w:p>
     <w:p>
@@ -6502,15 +6200,7 @@
         <w:ind w:left="360" w:firstLine="348"/>
       </w:pPr>
       <w:r>
-        <w:t xml:space="preserve">Se debe tener en cuenta </w:t>
-      </w:r>
-      <w:proofErr w:type="gramStart"/>
-      <w:r>
-        <w:t>que</w:t>
-      </w:r>
-      <w:proofErr w:type="gramEnd"/>
-      <w:r>
-        <w:t xml:space="preserve"> si un sonido está en loop y se reproduce </w:t>
+        <w:t xml:space="preserve">Se debe tener en cuenta que si un sonido está en loop y se reproduce </w:t>
       </w:r>
       <w:r>
         <w:t>otro</w:t>
@@ -6539,64 +6229,27 @@
       </w:pPr>
       <w:bookmarkStart w:id="11" w:name="_Toc199261564"/>
       <w:r>
-        <w:t xml:space="preserve">Columna </w:t>
-      </w:r>
-      <w:proofErr w:type="gramStart"/>
-      <w:r>
-        <w:t>Single</w:t>
-      </w:r>
-      <w:proofErr w:type="gramEnd"/>
-      <w:r>
-        <w:t xml:space="preserve"> effect</w:t>
+        <w:t>Columna Single effect</w:t>
       </w:r>
       <w:bookmarkEnd w:id="11"/>
     </w:p>
     <w:p>
       <w:r>
         <w:tab/>
-        <w:t xml:space="preserve">Son efectos visuales que suceden una única vez, como una sacudida de pantalla o </w:t>
-      </w:r>
-      <w:proofErr w:type="gramStart"/>
-      <w:r>
-        <w:t>flash</w:t>
-      </w:r>
-      <w:proofErr w:type="gramEnd"/>
-      <w:r>
-        <w:t xml:space="preserve"> repentino. Sintaxis:</w:t>
+        <w:t>Son efectos visuales que suceden una única vez, como una sacudida de pantalla o flash repentino. Sintaxis:</w:t>
       </w:r>
     </w:p>
     <w:p>
       <w:r>
         <w:tab/>
-        <w:t>Nombre_del_</w:t>
-      </w:r>
-      <w:proofErr w:type="gramStart"/>
-      <w:r>
-        <w:t>efecto :</w:t>
-      </w:r>
-      <w:proofErr w:type="gramEnd"/>
-      <w:r>
-        <w:t xml:space="preserve"> parámetros</w:t>
+        <w:t>Nombre_del_efecto : parámetros</w:t>
       </w:r>
     </w:p>
     <w:p>
       <w:r>
         <w:tab/>
-        <w:t>Nombre_del_efecto_</w:t>
-      </w:r>
-      <w:proofErr w:type="gramStart"/>
-      <w:r>
-        <w:t>1:parámetros</w:t>
-      </w:r>
-      <w:proofErr w:type="gramEnd"/>
-      <w:r>
-        <w:t>, Nombre_del_efecto_</w:t>
-      </w:r>
-      <w:proofErr w:type="gramStart"/>
-      <w:r>
-        <w:t>2:parámetros</w:t>
-      </w:r>
-      <w:proofErr w:type="gramEnd"/>
+        <w:t>Nombre_del_efecto_1:parámetros, Nombre_del_efecto_2:parámetros</w:t>
+      </w:r>
     </w:p>
     <w:p>
       <w:r>
@@ -6929,29 +6582,21 @@
       </w:r>
     </w:p>
     <w:p>
-      <w:proofErr w:type="gramStart"/>
       <w:r>
         <w:rPr>
           <w:highlight w:val="yellow"/>
         </w:rPr>
-        <w:t>flash</w:t>
-      </w:r>
-      <w:proofErr w:type="gramEnd"/>
+        <w:t>flash:0.25:1</w:t>
+      </w:r>
+      <w:r>
+        <w:t xml:space="preserve"> (Muestra un fondo blanco una única vez durante 0.25 segundos simulando un destello repentino)</w:t>
+      </w:r>
+    </w:p>
+    <w:p>
       <w:r>
         <w:rPr>
           <w:highlight w:val="yellow"/>
         </w:rPr>
-        <w:t>:0.25:1</w:t>
-      </w:r>
-      <w:r>
-        <w:t xml:space="preserve"> (Muestra un fondo blanco una única vez durante 0.25 segundos simulando un destello repentino)</w:t>
-      </w:r>
-    </w:p>
-    <w:p>
-      <w:r>
-        <w:rPr>
-          <w:highlight w:val="yellow"/>
-        </w:rPr>
         <w:t>blackout:0.25:1</w:t>
       </w:r>
       <w:r>
@@ -6972,15 +6617,7 @@
     <w:p>
       <w:r>
         <w:tab/>
-        <w:t xml:space="preserve">Es similar a los </w:t>
-      </w:r>
-      <w:proofErr w:type="gramStart"/>
-      <w:r>
-        <w:t>Single</w:t>
-      </w:r>
-      <w:proofErr w:type="gramEnd"/>
-      <w:r>
-        <w:t xml:space="preserve"> Effects, solo que esta vez es un efecto que sucede constantemente en pantalla y persiste indefinidamente hasta que se vuelva a llamar</w:t>
+        <w:t>Es similar a los Single Effects, solo que esta vez es un efecto que sucede constantemente en pantalla y persiste indefinidamente hasta que se vuelva a llamar</w:t>
       </w:r>
       <w:r>
         <w:t>. Se pueden dividir en dos, aquellos efectos continuos que interactúan con el fondo actual, y aquellos que colocan una imagen por encima.</w:t>
@@ -6995,51 +6632,19 @@
         <w:t>a sintaxis es la misma que la de</w:t>
       </w:r>
       <w:r>
-        <w:t xml:space="preserve"> los </w:t>
-      </w:r>
-      <w:proofErr w:type="gramStart"/>
-      <w:r>
-        <w:t>Single</w:t>
-      </w:r>
-      <w:proofErr w:type="gramEnd"/>
-      <w:r>
-        <w:t xml:space="preserve"> Effects.</w:t>
+        <w:t xml:space="preserve"> los Single Effects.</w:t>
       </w:r>
     </w:p>
     <w:p>
       <w:r>
         <w:tab/>
-        <w:t>Nombre_del_</w:t>
-      </w:r>
-      <w:proofErr w:type="gramStart"/>
-      <w:r>
-        <w:t>efecto :</w:t>
-      </w:r>
-      <w:proofErr w:type="gramEnd"/>
-      <w:r>
-        <w:t xml:space="preserve"> parámetros</w:t>
+        <w:t>Nombre_del_efecto : parámetros</w:t>
       </w:r>
     </w:p>
     <w:p>
       <w:r>
         <w:tab/>
-        <w:t>Nombre_del_efecto_</w:t>
-      </w:r>
-      <w:proofErr w:type="gramStart"/>
-      <w:r>
-        <w:t>1 :</w:t>
-      </w:r>
-      <w:proofErr w:type="gramEnd"/>
-      <w:r>
-        <w:t xml:space="preserve"> parámetros, Nombre_del_efecto_</w:t>
-      </w:r>
-      <w:proofErr w:type="gramStart"/>
-      <w:r>
-        <w:t>2 :</w:t>
-      </w:r>
-      <w:proofErr w:type="gramEnd"/>
-      <w:r>
-        <w:t xml:space="preserve"> parámetros</w:t>
+        <w:t>Nombre_del_efecto_1 : parámetros, Nombre_del_efecto_2 : parámetros</w:t>
       </w:r>
     </w:p>
     <w:p>
@@ -7602,73 +7207,46 @@
     <w:p>
       <w:r>
         <w:tab/>
-        <w:t xml:space="preserve">Aquí describiremos todas las acciones relacionadas con los personajes que se verán en pantalla, desde su aparición, destrucción, movimientos, cambios de Sprite y algunas animaciones predefinidas. </w:t>
-      </w:r>
-      <w:r>
-        <w:t>En cuanto a las medidas del Sprite, estos son muy flexibles</w:t>
-      </w:r>
-      <w:r>
-        <w:t>.</w:t>
+        <w:t>Aquí describiremos todas las acciones relacionadas con los personajes que se verán en pantalla, desde su aparición, destrucción, movimientos, cambios de Sprite y algunas animaciones predefinidas.</w:t>
+      </w:r>
+      <w:r>
+        <w:t xml:space="preserve"> No obstante, empezaremos definiendo las medidas de los sprites para los personajes.</w:t>
       </w:r>
     </w:p>
     <w:p>
       <w:r>
         <w:tab/>
-        <w:t>La altura del Sprite debe ser de 1080, es decir, toda la altura de la pantalla, de esta manera un personaje que ocupe los 1080 pixeles de altura ocupará todo el alto, permitiendo así</w:t>
-      </w:r>
-      <w:r>
-        <w:t xml:space="preserve"> definir la altura de los personajes</w:t>
+        <w:t>Todos los sprit</w:t>
+      </w:r>
+      <w:r>
+        <w:t>e</w:t>
+      </w:r>
+      <w:r>
+        <w:t>s deben tener una altura de lienzo de 1080 pixeles, en cuanto al ancho, no hay ningún tipo de límite, solo debes tener en cuenta las siguientes consideraciones.</w:t>
+      </w:r>
+      <w:r>
+        <w:t xml:space="preserve"> Se recomienda que esté en formato .PNG</w:t>
       </w:r>
     </w:p>
     <w:p>
       <w:r>
         <w:tab/>
-        <w:t>En cuanto al ancho, se recomienda recortar los espacios en blanco a los lados, con la excepción de que el Sprite debe mostrarse centrado, si necesitas dejar espacio en blanco para que se vea centrado, entonces hazlo.</w:t>
-      </w:r>
-    </w:p>
-    <w:p>
-      <w:r>
-        <w:tab/>
-        <w:t>Hay que mantener todos los sprites de un personaje lo más centrados posible para que al haber un cambio de Sprite no se mueva repentinamente de su sitio.</w:t>
-      </w:r>
-    </w:p>
-    <w:p/>
-    <w:p/>
-    <w:p/>
-    <w:p/>
-    <w:p>
-      <w:r>
-        <w:lastRenderedPageBreak/>
-        <w:t xml:space="preserve">                Con espacio vacío a los lados                          Con los espacio</w:t>
-      </w:r>
-      <w:r>
-        <w:t>s</w:t>
-      </w:r>
-      <w:r>
-        <w:t xml:space="preserve"> recortados</w:t>
-      </w:r>
-    </w:p>
-    <w:p>
-      <w:pPr>
+        <w:t>El personaje será mostrado en pantalla tal cual esté en su Sprite.</w:t>
+      </w:r>
+    </w:p>
+    <w:p>
+      <w:r>
+        <w:t xml:space="preserve">               </w:t>
+      </w:r>
+      <w:r>
         <w:rPr>
           <w:noProof/>
         </w:rPr>
-      </w:pPr>
-      <w:r>
-        <w:rPr>
-          <w:noProof/>
-        </w:rPr>
-        <w:t xml:space="preserve">              </w:t>
-      </w:r>
-      <w:r>
-        <w:rPr>
-          <w:noProof/>
-        </w:rPr>
         <w:drawing>
-          <wp:inline distT="0" distB="0" distL="0" distR="0" wp14:anchorId="746A9AC9" wp14:editId="66629875">
-            <wp:extent cx="1994647" cy="3390900"/>
-            <wp:effectExtent l="0" t="0" r="5715" b="0"/>
-            <wp:docPr id="18304709" name="Imagen 1"/>
+          <wp:inline distT="0" distB="0" distL="0" distR="0" wp14:anchorId="5C617847" wp14:editId="3BF0F103">
+            <wp:extent cx="825500" cy="1858271"/>
+            <wp:effectExtent l="0" t="0" r="0" b="8890"/>
+            <wp:docPr id="1946779237" name="Imagen 1"/>
             <wp:cNvGraphicFramePr>
               <a:graphicFrameLocks xmlns:a="http://schemas.openxmlformats.org/drawingml/2006/main" noChangeAspect="1"/>
             </wp:cNvGraphicFramePr>
@@ -7676,7 +7254,7 @@
               <a:graphicData uri="http://schemas.openxmlformats.org/drawingml/2006/picture">
                 <pic:pic xmlns:pic="http://schemas.openxmlformats.org/drawingml/2006/picture">
                   <pic:nvPicPr>
-                    <pic:cNvPr id="18304709" name=""/>
+                    <pic:cNvPr id="1946779237" name=""/>
                     <pic:cNvPicPr/>
                   </pic:nvPicPr>
                   <pic:blipFill>
@@ -7688,7 +7266,7 @@
                   <pic:spPr>
                     <a:xfrm>
                       <a:off x="0" y="0"/>
-                      <a:ext cx="1997550" cy="3395835"/>
+                      <a:ext cx="830492" cy="1869508"/>
                     </a:xfrm>
                     <a:prstGeom prst="rect">
                       <a:avLst/>
@@ -7701,26 +7279,17 @@
         </w:drawing>
       </w:r>
       <w:r>
+        <w:t xml:space="preserve">                   </w:t>
+      </w:r>
+      <w:r>
         <w:rPr>
           <w:noProof/>
         </w:rPr>
-        <w:t xml:space="preserve"> </w:t>
-      </w:r>
-      <w:r>
-        <w:rPr>
-          <w:noProof/>
-        </w:rPr>
-        <w:t xml:space="preserve">                      </w:t>
-      </w:r>
-      <w:r>
-        <w:rPr>
-          <w:noProof/>
-        </w:rPr>
         <w:drawing>
-          <wp:inline distT="0" distB="0" distL="0" distR="0" wp14:anchorId="085B0548" wp14:editId="6D28FFF6">
-            <wp:extent cx="1657350" cy="3383564"/>
-            <wp:effectExtent l="0" t="0" r="0" b="7620"/>
-            <wp:docPr id="2131617622" name="Imagen 1"/>
+          <wp:inline distT="0" distB="0" distL="0" distR="0" wp14:anchorId="021BB7E1" wp14:editId="37069B1D">
+            <wp:extent cx="1041400" cy="1841849"/>
+            <wp:effectExtent l="0" t="0" r="6350" b="6350"/>
+            <wp:docPr id="1148987302" name="Imagen 1"/>
             <wp:cNvGraphicFramePr>
               <a:graphicFrameLocks xmlns:a="http://schemas.openxmlformats.org/drawingml/2006/main" noChangeAspect="1"/>
             </wp:cNvGraphicFramePr>
@@ -7728,7 +7297,7 @@
               <a:graphicData uri="http://schemas.openxmlformats.org/drawingml/2006/picture">
                 <pic:pic xmlns:pic="http://schemas.openxmlformats.org/drawingml/2006/picture">
                   <pic:nvPicPr>
-                    <pic:cNvPr id="2131617622" name=""/>
+                    <pic:cNvPr id="1148987302" name=""/>
                     <pic:cNvPicPr/>
                   </pic:nvPicPr>
                   <pic:blipFill>
@@ -7740,7 +7309,7 @@
                   <pic:spPr>
                     <a:xfrm>
                       <a:off x="0" y="0"/>
-                      <a:ext cx="1664275" cy="3397702"/>
+                      <a:ext cx="1048870" cy="1855061"/>
                     </a:xfrm>
                     <a:prstGeom prst="rect">
                       <a:avLst/>
@@ -7752,104 +7321,594 @@
           </wp:inline>
         </w:drawing>
       </w:r>
+      <w:r>
+        <w:t xml:space="preserve">                        </w:t>
+      </w:r>
+      <w:r>
+        <w:rPr>
+          <w:noProof/>
+        </w:rPr>
+        <w:drawing>
+          <wp:inline distT="0" distB="0" distL="0" distR="0" wp14:anchorId="66EBC18D" wp14:editId="616500F0">
+            <wp:extent cx="830239" cy="1847850"/>
+            <wp:effectExtent l="0" t="0" r="8255" b="0"/>
+            <wp:docPr id="1981455816" name="Imagen 1"/>
+            <wp:cNvGraphicFramePr>
+              <a:graphicFrameLocks xmlns:a="http://schemas.openxmlformats.org/drawingml/2006/main" noChangeAspect="1"/>
+            </wp:cNvGraphicFramePr>
+            <a:graphic xmlns:a="http://schemas.openxmlformats.org/drawingml/2006/main">
+              <a:graphicData uri="http://schemas.openxmlformats.org/drawingml/2006/picture">
+                <pic:pic xmlns:pic="http://schemas.openxmlformats.org/drawingml/2006/picture">
+                  <pic:nvPicPr>
+                    <pic:cNvPr id="1981455816" name=""/>
+                    <pic:cNvPicPr/>
+                  </pic:nvPicPr>
+                  <pic:blipFill>
+                    <a:blip r:embed="rId29"/>
+                    <a:stretch>
+                      <a:fillRect/>
+                    </a:stretch>
+                  </pic:blipFill>
+                  <pic:spPr>
+                    <a:xfrm>
+                      <a:off x="0" y="0"/>
+                      <a:ext cx="839340" cy="1868106"/>
+                    </a:xfrm>
+                    <a:prstGeom prst="rect">
+                      <a:avLst/>
+                    </a:prstGeom>
+                  </pic:spPr>
+                </pic:pic>
+              </a:graphicData>
+            </a:graphic>
+          </wp:inline>
+        </w:drawing>
+      </w:r>
+    </w:p>
+    <w:p/>
+    <w:p>
+      <w:pPr>
+        <w:ind w:firstLine="708"/>
+      </w:pPr>
+      <w:r>
+        <w:rPr>
+          <w:noProof/>
+        </w:rPr>
+        <w:drawing>
+          <wp:anchor distT="0" distB="0" distL="114300" distR="114300" simplePos="0" relativeHeight="251665408" behindDoc="0" locked="0" layoutInCell="1" allowOverlap="1" wp14:anchorId="51A0E446" wp14:editId="3E15DE6D">
+            <wp:simplePos x="0" y="0"/>
+            <wp:positionH relativeFrom="margin">
+              <wp:posOffset>-457835</wp:posOffset>
+            </wp:positionH>
+            <wp:positionV relativeFrom="margin">
+              <wp:posOffset>-572770</wp:posOffset>
+            </wp:positionV>
+            <wp:extent cx="6407150" cy="3653155"/>
+            <wp:effectExtent l="0" t="0" r="0" b="4445"/>
+            <wp:wrapSquare wrapText="bothSides"/>
+            <wp:docPr id="170776286" name="Imagen 1"/>
+            <wp:cNvGraphicFramePr>
+              <a:graphicFrameLocks xmlns:a="http://schemas.openxmlformats.org/drawingml/2006/main" noChangeAspect="1"/>
+            </wp:cNvGraphicFramePr>
+            <a:graphic xmlns:a="http://schemas.openxmlformats.org/drawingml/2006/main">
+              <a:graphicData uri="http://schemas.openxmlformats.org/drawingml/2006/picture">
+                <pic:pic xmlns:pic="http://schemas.openxmlformats.org/drawingml/2006/picture">
+                  <pic:nvPicPr>
+                    <pic:cNvPr id="170776286" name=""/>
+                    <pic:cNvPicPr/>
+                  </pic:nvPicPr>
+                  <pic:blipFill>
+                    <a:blip r:embed="rId30">
+                      <a:extLst>
+                        <a:ext uri="{28A0092B-C50C-407E-A947-70E740481C1C}">
+                          <a14:useLocalDpi xmlns:a14="http://schemas.microsoft.com/office/drawing/2010/main" val="0"/>
+                        </a:ext>
+                      </a:extLst>
+                    </a:blip>
+                    <a:stretch>
+                      <a:fillRect/>
+                    </a:stretch>
+                  </pic:blipFill>
+                  <pic:spPr>
+                    <a:xfrm>
+                      <a:off x="0" y="0"/>
+                      <a:ext cx="6407150" cy="3653155"/>
+                    </a:xfrm>
+                    <a:prstGeom prst="rect">
+                      <a:avLst/>
+                    </a:prstGeom>
+                  </pic:spPr>
+                </pic:pic>
+              </a:graphicData>
+            </a:graphic>
+            <wp14:sizeRelH relativeFrom="margin">
+              <wp14:pctWidth>0</wp14:pctWidth>
+            </wp14:sizeRelH>
+            <wp14:sizeRelV relativeFrom="margin">
+              <wp14:pctHeight>0</wp14:pctHeight>
+            </wp14:sizeRelV>
+          </wp:anchor>
+        </w:drawing>
+      </w:r>
+      <w:r>
+        <w:t xml:space="preserve">Aquí podemos apreciar de izquierda a derecha a Mutou, Tohiro y Keiko. </w:t>
+      </w:r>
+      <w:r>
+        <w:t>Todos los sprites mostrados tienen un tamaño de lienzo de 1080 pixeles, sin embargo, el personaje en sí tiene un</w:t>
+      </w:r>
+      <w:r>
+        <w:t>a altura distinta</w:t>
+      </w:r>
+      <w:r>
+        <w:t>. P</w:t>
+      </w:r>
+      <w:r>
+        <w:t>odemos jugar con la altura para mostrar las diferencias entre un personaje alto y otro bajito.</w:t>
+      </w:r>
+    </w:p>
+    <w:p>
+      <w:pPr>
+        <w:ind w:firstLine="708"/>
+      </w:pPr>
+      <w:r>
+        <w:t>Habrás notado que el Sprite de Keiko tiene un extraño espacio en blanco en su Sprite, en su lado derecho mientras que los demás se ven más ajustados.</w:t>
+      </w:r>
+    </w:p>
+    <w:p>
+      <w:pPr>
+        <w:ind w:firstLine="708"/>
+      </w:pPr>
+      <w:r>
+        <w:rPr>
+          <w:noProof/>
+        </w:rPr>
+        <w:drawing>
+          <wp:anchor distT="0" distB="0" distL="114300" distR="114300" simplePos="0" relativeHeight="251666432" behindDoc="0" locked="0" layoutInCell="1" allowOverlap="1" wp14:anchorId="7FAD91FA" wp14:editId="6EDC6FAE">
+            <wp:simplePos x="0" y="0"/>
+            <wp:positionH relativeFrom="margin">
+              <wp:posOffset>-101600</wp:posOffset>
+            </wp:positionH>
+            <wp:positionV relativeFrom="margin">
+              <wp:posOffset>4989830</wp:posOffset>
+            </wp:positionV>
+            <wp:extent cx="1885950" cy="3337651"/>
+            <wp:effectExtent l="0" t="0" r="0" b="0"/>
+            <wp:wrapSquare wrapText="bothSides"/>
+            <wp:docPr id="1515022617" name="Imagen 1"/>
+            <wp:cNvGraphicFramePr>
+              <a:graphicFrameLocks xmlns:a="http://schemas.openxmlformats.org/drawingml/2006/main" noChangeAspect="1"/>
+            </wp:cNvGraphicFramePr>
+            <a:graphic xmlns:a="http://schemas.openxmlformats.org/drawingml/2006/main">
+              <a:graphicData uri="http://schemas.openxmlformats.org/drawingml/2006/picture">
+                <pic:pic xmlns:pic="http://schemas.openxmlformats.org/drawingml/2006/picture">
+                  <pic:nvPicPr>
+                    <pic:cNvPr id="1515022617" name=""/>
+                    <pic:cNvPicPr/>
+                  </pic:nvPicPr>
+                  <pic:blipFill>
+                    <a:blip r:embed="rId31" cstate="print">
+                      <a:extLst>
+                        <a:ext uri="{28A0092B-C50C-407E-A947-70E740481C1C}">
+                          <a14:useLocalDpi xmlns:a14="http://schemas.microsoft.com/office/drawing/2010/main" val="0"/>
+                        </a:ext>
+                      </a:extLst>
+                    </a:blip>
+                    <a:stretch>
+                      <a:fillRect/>
+                    </a:stretch>
+                  </pic:blipFill>
+                  <pic:spPr>
+                    <a:xfrm>
+                      <a:off x="0" y="0"/>
+                      <a:ext cx="1885950" cy="3337651"/>
+                    </a:xfrm>
+                    <a:prstGeom prst="rect">
+                      <a:avLst/>
+                    </a:prstGeom>
+                  </pic:spPr>
+                </pic:pic>
+              </a:graphicData>
+            </a:graphic>
+          </wp:anchor>
+        </w:drawing>
+      </w:r>
+    </w:p>
+    <w:p>
+      <w:r>
+        <w:t>Esto es así para que el Sprite de Keiko quede centrado, si colocamos una línea en toda la mitad del Sprite veremos que el personaje se ve centrado.</w:t>
+      </w:r>
+    </w:p>
+    <w:p>
+      <w:r>
+        <w:rPr>
+          <w:noProof/>
+        </w:rPr>
+        <w:drawing>
+          <wp:anchor distT="0" distB="0" distL="114300" distR="114300" simplePos="0" relativeHeight="251667456" behindDoc="0" locked="0" layoutInCell="1" allowOverlap="1" wp14:anchorId="139AECF7" wp14:editId="7574A1D7">
+            <wp:simplePos x="0" y="0"/>
+            <wp:positionH relativeFrom="margin">
+              <wp:posOffset>2844165</wp:posOffset>
+            </wp:positionH>
+            <wp:positionV relativeFrom="margin">
+              <wp:posOffset>5831205</wp:posOffset>
+            </wp:positionV>
+            <wp:extent cx="1467485" cy="2565400"/>
+            <wp:effectExtent l="0" t="0" r="0" b="6350"/>
+            <wp:wrapSquare wrapText="bothSides"/>
+            <wp:docPr id="1993775522" name="Imagen 1"/>
+            <wp:cNvGraphicFramePr>
+              <a:graphicFrameLocks xmlns:a="http://schemas.openxmlformats.org/drawingml/2006/main" noChangeAspect="1"/>
+            </wp:cNvGraphicFramePr>
+            <a:graphic xmlns:a="http://schemas.openxmlformats.org/drawingml/2006/main">
+              <a:graphicData uri="http://schemas.openxmlformats.org/drawingml/2006/picture">
+                <pic:pic xmlns:pic="http://schemas.openxmlformats.org/drawingml/2006/picture">
+                  <pic:nvPicPr>
+                    <pic:cNvPr id="1993775522" name=""/>
+                    <pic:cNvPicPr/>
+                  </pic:nvPicPr>
+                  <pic:blipFill>
+                    <a:blip r:embed="rId32" cstate="print">
+                      <a:extLst>
+                        <a:ext uri="{28A0092B-C50C-407E-A947-70E740481C1C}">
+                          <a14:useLocalDpi xmlns:a14="http://schemas.microsoft.com/office/drawing/2010/main" val="0"/>
+                        </a:ext>
+                      </a:extLst>
+                    </a:blip>
+                    <a:stretch>
+                      <a:fillRect/>
+                    </a:stretch>
+                  </pic:blipFill>
+                  <pic:spPr>
+                    <a:xfrm>
+                      <a:off x="0" y="0"/>
+                      <a:ext cx="1467485" cy="2565400"/>
+                    </a:xfrm>
+                    <a:prstGeom prst="rect">
+                      <a:avLst/>
+                    </a:prstGeom>
+                  </pic:spPr>
+                </pic:pic>
+              </a:graphicData>
+            </a:graphic>
+            <wp14:sizeRelH relativeFrom="margin">
+              <wp14:pctWidth>0</wp14:pctWidth>
+            </wp14:sizeRelH>
+            <wp14:sizeRelV relativeFrom="margin">
+              <wp14:pctHeight>0</wp14:pctHeight>
+            </wp14:sizeRelV>
+          </wp:anchor>
+        </w:drawing>
+      </w:r>
+    </w:p>
+    <w:p/>
+    <w:p/>
+    <w:p/>
+    <w:p/>
+    <w:p/>
+    <w:p/>
+    <w:p/>
+    <w:p/>
+    <w:p/>
+    <w:p>
+      <w:pPr>
+        <w:ind w:firstLine="708"/>
+      </w:pPr>
+      <w:r>
+        <w:lastRenderedPageBreak/>
+        <w:t>Si recortásemos ese espacio en blanco su Sprite quedaría descentrado de la siguiente manera.</w:t>
+      </w:r>
+    </w:p>
+    <w:p>
+      <w:pPr>
+        <w:ind w:firstLine="708"/>
+      </w:pPr>
+      <w:r>
+        <w:rPr>
+          <w:noProof/>
+        </w:rPr>
+        <w:drawing>
+          <wp:anchor distT="0" distB="0" distL="114300" distR="114300" simplePos="0" relativeHeight="251669504" behindDoc="0" locked="0" layoutInCell="1" allowOverlap="1" wp14:anchorId="20D80200" wp14:editId="1C1BCD76">
+            <wp:simplePos x="0" y="0"/>
+            <wp:positionH relativeFrom="margin">
+              <wp:align>right</wp:align>
+            </wp:positionH>
+            <wp:positionV relativeFrom="margin">
+              <wp:posOffset>713105</wp:posOffset>
+            </wp:positionV>
+            <wp:extent cx="3745230" cy="2178050"/>
+            <wp:effectExtent l="0" t="0" r="7620" b="0"/>
+            <wp:wrapSquare wrapText="bothSides"/>
+            <wp:docPr id="266531409" name="Imagen 1"/>
+            <wp:cNvGraphicFramePr>
+              <a:graphicFrameLocks xmlns:a="http://schemas.openxmlformats.org/drawingml/2006/main" noChangeAspect="1"/>
+            </wp:cNvGraphicFramePr>
+            <a:graphic xmlns:a="http://schemas.openxmlformats.org/drawingml/2006/main">
+              <a:graphicData uri="http://schemas.openxmlformats.org/drawingml/2006/picture">
+                <pic:pic xmlns:pic="http://schemas.openxmlformats.org/drawingml/2006/picture">
+                  <pic:nvPicPr>
+                    <pic:cNvPr id="266531409" name=""/>
+                    <pic:cNvPicPr/>
+                  </pic:nvPicPr>
+                  <pic:blipFill>
+                    <a:blip r:embed="rId33" cstate="print">
+                      <a:extLst>
+                        <a:ext uri="{28A0092B-C50C-407E-A947-70E740481C1C}">
+                          <a14:useLocalDpi xmlns:a14="http://schemas.microsoft.com/office/drawing/2010/main" val="0"/>
+                        </a:ext>
+                      </a:extLst>
+                    </a:blip>
+                    <a:stretch>
+                      <a:fillRect/>
+                    </a:stretch>
+                  </pic:blipFill>
+                  <pic:spPr>
+                    <a:xfrm>
+                      <a:off x="0" y="0"/>
+                      <a:ext cx="3745230" cy="2178050"/>
+                    </a:xfrm>
+                    <a:prstGeom prst="rect">
+                      <a:avLst/>
+                    </a:prstGeom>
+                  </pic:spPr>
+                </pic:pic>
+              </a:graphicData>
+            </a:graphic>
+            <wp14:sizeRelH relativeFrom="margin">
+              <wp14:pctWidth>0</wp14:pctWidth>
+            </wp14:sizeRelH>
+            <wp14:sizeRelV relativeFrom="margin">
+              <wp14:pctHeight>0</wp14:pctHeight>
+            </wp14:sizeRelV>
+          </wp:anchor>
+        </w:drawing>
+      </w:r>
+    </w:p>
+    <w:p>
+      <w:pPr>
+        <w:ind w:firstLine="708"/>
+      </w:pPr>
+    </w:p>
+    <w:p>
+      <w:pPr>
+        <w:ind w:firstLine="708"/>
+      </w:pPr>
+    </w:p>
+    <w:p>
+      <w:pPr>
+        <w:ind w:firstLine="708"/>
+      </w:pPr>
+    </w:p>
+    <w:p>
+      <w:pPr>
+        <w:ind w:firstLine="708"/>
+      </w:pPr>
+    </w:p>
+    <w:p>
+      <w:pPr>
+        <w:ind w:firstLine="708"/>
+      </w:pPr>
+      <w:r>
+        <w:t>Y así se vería con el Sprite centrado usando espacio en blanco.</w:t>
+      </w:r>
+    </w:p>
+    <w:p>
+      <w:pPr>
+        <w:ind w:firstLine="708"/>
+      </w:pPr>
+      <w:r>
+        <w:rPr>
+          <w:noProof/>
+        </w:rPr>
+        <w:drawing>
+          <wp:anchor distT="0" distB="0" distL="114300" distR="114300" simplePos="0" relativeHeight="251670528" behindDoc="0" locked="0" layoutInCell="1" allowOverlap="1" wp14:anchorId="132FEEB8" wp14:editId="4C10DB63">
+            <wp:simplePos x="0" y="0"/>
+            <wp:positionH relativeFrom="margin">
+              <wp:align>center</wp:align>
+            </wp:positionH>
+            <wp:positionV relativeFrom="margin">
+              <wp:posOffset>4421505</wp:posOffset>
+            </wp:positionV>
+            <wp:extent cx="3524250" cy="2019300"/>
+            <wp:effectExtent l="0" t="0" r="0" b="0"/>
+            <wp:wrapSquare wrapText="bothSides"/>
+            <wp:docPr id="1025024610" name="Imagen 1"/>
+            <wp:cNvGraphicFramePr>
+              <a:graphicFrameLocks xmlns:a="http://schemas.openxmlformats.org/drawingml/2006/main" noChangeAspect="1"/>
+            </wp:cNvGraphicFramePr>
+            <a:graphic xmlns:a="http://schemas.openxmlformats.org/drawingml/2006/main">
+              <a:graphicData uri="http://schemas.openxmlformats.org/drawingml/2006/picture">
+                <pic:pic xmlns:pic="http://schemas.openxmlformats.org/drawingml/2006/picture">
+                  <pic:nvPicPr>
+                    <pic:cNvPr id="1025024610" name=""/>
+                    <pic:cNvPicPr/>
+                  </pic:nvPicPr>
+                  <pic:blipFill>
+                    <a:blip r:embed="rId34" cstate="print">
+                      <a:extLst>
+                        <a:ext uri="{28A0092B-C50C-407E-A947-70E740481C1C}">
+                          <a14:useLocalDpi xmlns:a14="http://schemas.microsoft.com/office/drawing/2010/main" val="0"/>
+                        </a:ext>
+                      </a:extLst>
+                    </a:blip>
+                    <a:stretch>
+                      <a:fillRect/>
+                    </a:stretch>
+                  </pic:blipFill>
+                  <pic:spPr>
+                    <a:xfrm>
+                      <a:off x="0" y="0"/>
+                      <a:ext cx="3524250" cy="2019300"/>
+                    </a:xfrm>
+                    <a:prstGeom prst="rect">
+                      <a:avLst/>
+                    </a:prstGeom>
+                  </pic:spPr>
+                </pic:pic>
+              </a:graphicData>
+            </a:graphic>
+            <wp14:sizeRelH relativeFrom="margin">
+              <wp14:pctWidth>0</wp14:pctWidth>
+            </wp14:sizeRelH>
+            <wp14:sizeRelV relativeFrom="margin">
+              <wp14:pctHeight>0</wp14:pctHeight>
+            </wp14:sizeRelV>
+          </wp:anchor>
+        </w:drawing>
+      </w:r>
+    </w:p>
+    <w:p>
+      <w:pPr>
+        <w:ind w:firstLine="708"/>
+      </w:pPr>
+    </w:p>
+    <w:p>
+      <w:pPr>
+        <w:ind w:firstLine="708"/>
+      </w:pPr>
+    </w:p>
+    <w:p>
+      <w:pPr>
+        <w:ind w:firstLine="708"/>
+      </w:pPr>
+    </w:p>
+    <w:p>
+      <w:pPr>
+        <w:ind w:firstLine="708"/>
+      </w:pPr>
+    </w:p>
+    <w:p>
+      <w:pPr>
+        <w:ind w:firstLine="708"/>
+      </w:pPr>
+    </w:p>
+    <w:p>
+      <w:pPr>
+        <w:ind w:firstLine="708"/>
+      </w:pPr>
+    </w:p>
+    <w:p>
+      <w:pPr>
+        <w:ind w:firstLine="708"/>
+      </w:pPr>
+    </w:p>
+    <w:p>
+      <w:pPr>
+        <w:ind w:firstLine="708"/>
+      </w:pPr>
+      <w:r>
+        <w:t>En conclusión, aprovecha los espacios en blanco para centrar sprites y evitar que un personaje se mueva bruscamente al hacer un cambio de expresión.</w:t>
+      </w:r>
+    </w:p>
+    <w:p>
+      <w:pPr>
+        <w:ind w:firstLine="708"/>
+      </w:pPr>
+      <w:r>
+        <w:t xml:space="preserve">Una vez aclarado las normas para creación de sprites, pasaremos </w:t>
+      </w:r>
+      <w:r>
+        <w:t>al siguiente apartado que explicará cómo mostrar a nuestros personajes, hacer que se muevan y hagan toda una variedad de animaciones que nos ofrece Atlax Renpy.</w:t>
+      </w:r>
+    </w:p>
+    <w:p>
+      <w:pPr>
+        <w:ind w:firstLine="708"/>
+      </w:pPr>
+      <w:r>
+        <w:rPr>
+          <w:noProof/>
+        </w:rPr>
+        <w:drawing>
+          <wp:anchor distT="0" distB="0" distL="114300" distR="114300" simplePos="0" relativeHeight="251668480" behindDoc="0" locked="0" layoutInCell="1" allowOverlap="1" wp14:anchorId="68EEACF9" wp14:editId="439AF9FD">
+            <wp:simplePos x="0" y="0"/>
+            <wp:positionH relativeFrom="margin">
+              <wp:align>left</wp:align>
+            </wp:positionH>
+            <wp:positionV relativeFrom="margin">
+              <wp:posOffset>636270</wp:posOffset>
+            </wp:positionV>
+            <wp:extent cx="1437640" cy="3086100"/>
+            <wp:effectExtent l="0" t="0" r="0" b="0"/>
+            <wp:wrapSquare wrapText="bothSides"/>
+            <wp:docPr id="1024841430" name="Imagen 1"/>
+            <wp:cNvGraphicFramePr>
+              <a:graphicFrameLocks xmlns:a="http://schemas.openxmlformats.org/drawingml/2006/main" noChangeAspect="1"/>
+            </wp:cNvGraphicFramePr>
+            <a:graphic xmlns:a="http://schemas.openxmlformats.org/drawingml/2006/main">
+              <a:graphicData uri="http://schemas.openxmlformats.org/drawingml/2006/picture">
+                <pic:pic xmlns:pic="http://schemas.openxmlformats.org/drawingml/2006/picture">
+                  <pic:nvPicPr>
+                    <pic:cNvPr id="1024841430" name=""/>
+                    <pic:cNvPicPr/>
+                  </pic:nvPicPr>
+                  <pic:blipFill>
+                    <a:blip r:embed="rId35" cstate="print">
+                      <a:extLst>
+                        <a:ext uri="{28A0092B-C50C-407E-A947-70E740481C1C}">
+                          <a14:useLocalDpi xmlns:a14="http://schemas.microsoft.com/office/drawing/2010/main" val="0"/>
+                        </a:ext>
+                      </a:extLst>
+                    </a:blip>
+                    <a:stretch>
+                      <a:fillRect/>
+                    </a:stretch>
+                  </pic:blipFill>
+                  <pic:spPr>
+                    <a:xfrm>
+                      <a:off x="0" y="0"/>
+                      <a:ext cx="1440035" cy="3090679"/>
+                    </a:xfrm>
+                    <a:prstGeom prst="rect">
+                      <a:avLst/>
+                    </a:prstGeom>
+                  </pic:spPr>
+                </pic:pic>
+              </a:graphicData>
+            </a:graphic>
+            <wp14:sizeRelH relativeFrom="margin">
+              <wp14:pctWidth>0</wp14:pctWidth>
+            </wp14:sizeRelH>
+            <wp14:sizeRelV relativeFrom="margin">
+              <wp14:pctHeight>0</wp14:pctHeight>
+            </wp14:sizeRelV>
+          </wp:anchor>
+        </w:drawing>
+      </w:r>
+      <w:r>
+        <w:t>Primeramente, al momento de colocar a los personajes en pantalla, se debe ser plenamente consciente de lo que está sucediendo en pantalla, es decir, si hacemos que aparezca el personaje “Amber”, ese personaje estará en pantalla hasta que sea destruido.</w:t>
+      </w:r>
+    </w:p>
+    <w:p>
+      <w:pPr>
+        <w:ind w:firstLine="708"/>
+      </w:pPr>
+      <w:r>
+        <w:lastRenderedPageBreak/>
+        <w:t>Mientras esté en pantalla podrá ejecutar acciones como moverse, saltar, temblar, etc. Por lo tanto si intentas que un personaje que NO esté en pantalla salte o se mueva, el motor arrojará un error porque dicho personaje no está en pantalla.</w:t>
+      </w:r>
     </w:p>
     <w:p>
       <w:r>
         <w:tab/>
-        <w:t xml:space="preserve">En este caso la imagen de la </w:t>
-      </w:r>
-      <w:r>
-        <w:t>izquierda</w:t>
-      </w:r>
-      <w:r>
-        <w:t xml:space="preserve"> tiene un ancho de 632 pixeles mientras que el de la </w:t>
-      </w:r>
-      <w:r>
-        <w:t>derecha</w:t>
-      </w:r>
-      <w:r>
-        <w:t xml:space="preserve"> tiene 504 haciendo el archivo más ligero y al personaje más fácil de manejar.</w:t>
-      </w:r>
-    </w:p>
-    <w:p>
-      <w:r>
-        <w:tab/>
-        <w:t>Aquí se debe tener algo en cuenta y es que debes ser consciente de los personajes que están en pantalla y los que no, por ejemplo</w:t>
-      </w:r>
-      <w:r>
-        <w:t>,</w:t>
-      </w:r>
-      <w:r>
-        <w:t xml:space="preserve"> si escribes “Amber” Aparecerá el personaje Amber y ya estando en pantalla podrás ejecutar otras acciones</w:t>
-      </w:r>
-      <w:r>
-        <w:t xml:space="preserve"> o eventos</w:t>
-      </w:r>
-      <w:r>
-        <w:t xml:space="preserve"> como por ejemplo moverla o hacerla cambiar de Sprite. Por supuesto que si el personaje no está en pantalla también puedes controlar la manera en que aparece.</w:t>
-      </w:r>
-      <w:r>
-        <w:t xml:space="preserve"> </w:t>
-      </w:r>
-      <w:r>
-        <w:t xml:space="preserve">En este caso la sintaxis es algo </w:t>
-      </w:r>
-      <w:proofErr w:type="gramStart"/>
-      <w:r>
-        <w:t>variada</w:t>
-      </w:r>
-      <w:proofErr w:type="gramEnd"/>
-      <w:r>
-        <w:t xml:space="preserve"> pero en esencia es la siguiente.</w:t>
-      </w:r>
-    </w:p>
-    <w:p>
-      <w:r>
-        <w:tab/>
-        <w:t>Nombre_del_personaje</w:t>
-      </w:r>
-      <w:r>
-        <w:t xml:space="preserve"> </w:t>
-      </w:r>
-      <w:proofErr w:type="gramStart"/>
-      <w:r>
-        <w:t>Sprite</w:t>
-      </w:r>
-      <w:r>
-        <w:t xml:space="preserve"> :</w:t>
-      </w:r>
-      <w:proofErr w:type="gramEnd"/>
-      <w:r>
-        <w:t xml:space="preserve"> </w:t>
-      </w:r>
-      <w:proofErr w:type="gramStart"/>
-      <w:r>
-        <w:t>acción :</w:t>
-      </w:r>
-      <w:proofErr w:type="gramEnd"/>
-      <w:r>
-        <w:t xml:space="preserve"> parámetros de la acción</w:t>
-      </w:r>
-    </w:p>
-    <w:p>
-      <w:r>
-        <w:tab/>
-      </w:r>
-      <w:r>
-        <w:t>El nombre del personaje debe estar en m</w:t>
-      </w:r>
-      <w:r>
-        <w:t xml:space="preserve">inúscula y coincidir con el nombre </w:t>
-      </w:r>
-      <w:r>
-        <w:t xml:space="preserve">clave definito en </w:t>
+      </w:r>
+      <w:r>
+        <w:t>E</w:t>
+      </w:r>
+      <w:r>
+        <w:t>n cuanto a las variaciones de sprites, el</w:t>
+      </w:r>
+      <w:r>
+        <w:t xml:space="preserve"> nombre del personaje debe estar en m</w:t>
+      </w:r>
+      <w:r>
+        <w:t>inúscula</w:t>
       </w:r>
       <w:r>
         <w:rPr>
           <w:i/>
           <w:iCs/>
         </w:rPr>
-        <w:t>configs.csv.</w:t>
+        <w:t>.</w:t>
       </w:r>
       <w:r>
         <w:t xml:space="preserve"> </w:t>
@@ -7859,6 +7918,9 @@
       </w:r>
       <w:r>
         <w:t>, “amber uniform happy left”, “amber casual angry right”</w:t>
+      </w:r>
+      <w:r>
+        <w:t>. Los archivos de los sprites deben tener ese mismo nombre.</w:t>
       </w:r>
     </w:p>
     <w:p>
@@ -7882,41 +7944,32 @@
         <w:t xml:space="preserve"> angry right</w:t>
       </w:r>
       <w:r>
-        <w:t xml:space="preserve"> serían </w:t>
-      </w:r>
-      <w:proofErr w:type="gramStart"/>
-      <w:r>
-        <w:t>los Sprite específicos a nombrar</w:t>
-      </w:r>
-      <w:proofErr w:type="gramEnd"/>
-      <w:r>
-        <w:t xml:space="preserve">. </w:t>
-      </w:r>
-      <w:r>
-        <w:t xml:space="preserve">Estos sprites pueden estar en cualquier sitio del proyecto, la recomendación es que estén en la carpeta </w:t>
+        <w:t xml:space="preserve"> serían los Sprite</w:t>
+      </w:r>
+      <w:r>
+        <w:t>s</w:t>
+      </w:r>
+      <w:r>
+        <w:t xml:space="preserve"> específicos. </w:t>
+      </w:r>
+      <w:r>
+        <w:t>Los archivos de los</w:t>
+      </w:r>
+      <w:r>
+        <w:t xml:space="preserve"> sprites pueden estar en cualquier sitio del proyecto, </w:t>
+      </w:r>
+      <w:r>
+        <w:t xml:space="preserve">pero, </w:t>
+      </w:r>
+      <w:r>
+        <w:t xml:space="preserve">la recomendación es que estén en la carpeta </w:t>
       </w:r>
       <w:r>
         <w:rPr>
           <w:i/>
           <w:iCs/>
         </w:rPr>
-        <w:t>images/characters</w:t>
-      </w:r>
-      <w:proofErr w:type="gramStart"/>
-      <w:r>
-        <w:rPr>
-          <w:i/>
-          <w:iCs/>
-        </w:rPr>
-        <w:t>/[</w:t>
-      </w:r>
-      <w:proofErr w:type="gramEnd"/>
-      <w:r>
-        <w:rPr>
-          <w:i/>
-          <w:iCs/>
-        </w:rPr>
-        <w:t>nombre del personaje]/Sprite</w:t>
+        <w:t>images/characters/[nombre del personaje]/Sprite</w:t>
       </w:r>
       <w:r>
         <w:t>.</w:t>
@@ -7928,49 +7981,61 @@
         <w:t>Algo muy interesante de Atlax Renpy es que en ocasiones querremos que los sprites de nuestros personajes se volteen horizontalmente</w:t>
       </w:r>
       <w:r>
-        <w:t>, podrías llegar a pensar en copiar y pegar el mismo Sprite y voltearlo, sin embargo, Atlax Renpy cuenta con un sistema que ayuda a ahorrar ese tipo de sprites.</w:t>
-      </w:r>
-    </w:p>
-    <w:p>
-      <w:r>
-        <w:lastRenderedPageBreak/>
+        <w:t>, podrías llegar a pensar en copiar</w:t>
+      </w:r>
+      <w:r>
+        <w:t xml:space="preserve"> el Sprite “amber uniform happy left”,</w:t>
+      </w:r>
+      <w:r>
+        <w:t xml:space="preserve"> pegar</w:t>
+      </w:r>
+      <w:r>
+        <w:t>lo bajo el nombre de “amber uniform happy right” y voltearlo verticalmente con un editor de imágenes</w:t>
+      </w:r>
+      <w:r>
+        <w:t>, sin embargo, Atlax Renpy cuenta con un sistema que ayuda a ahorrar ese tipo de sprites.</w:t>
+      </w:r>
+    </w:p>
+    <w:p>
+      <w:r>
         <w:tab/>
-        <w:t>Si intentas mostrar “amber uniform left”, el motor intentará buscar el Sprite, si no lo encuentra buscará entonces “amber uniform right”, si lo encuentra lo volteará automáticamente y viceversa.</w:t>
+        <w:t xml:space="preserve">Si intentas mostrar “amber uniform </w:t>
+      </w:r>
+      <w:r>
+        <w:t xml:space="preserve">happy </w:t>
+      </w:r>
+      <w:r>
+        <w:t>right</w:t>
+      </w:r>
+      <w:r>
+        <w:t>”, el motor intentará buscar el Sprite, si no lo encuentra buscará entonces “amber uniform</w:t>
+      </w:r>
+      <w:r>
+        <w:t xml:space="preserve"> happy</w:t>
+      </w:r>
+      <w:r>
+        <w:t xml:space="preserve"> </w:t>
+      </w:r>
+      <w:r>
+        <w:t>left</w:t>
+      </w:r>
+      <w:r>
+        <w:t>”, si lo encuentra lo volteará automáticamente y viceversa.</w:t>
       </w:r>
     </w:p>
     <w:p>
       <w:r>
         <w:tab/>
-        <w:t>Por supuesto, no todos los personajes son simétricos, si un personaje de nuestra novela tiene un parche, al voltearlo tendrá el parche del otro lado, en esos casos sí que tendremos la obligación de crear sprites de “left” y “right” manualmente.</w:t>
+        <w:t>Por supuesto, no todos los personajes son simétricos, si un personaje tiene un parche, al voltearlo tendrá el parche del otro lado, en esos casos sí que tendremos la obligación de crear sprites de “left” y “right” manualmente.</w:t>
       </w:r>
     </w:p>
     <w:p>
       <w:r>
         <w:tab/>
-      </w:r>
-      <w:r>
-        <w:t>Una vez definido el apartado de los personajes, vamos con la</w:t>
-      </w:r>
-      <w:r>
-        <w:t xml:space="preserve"> acción</w:t>
-      </w:r>
-      <w:r>
-        <w:t>, este</w:t>
-      </w:r>
-      <w:r>
-        <w:t xml:space="preserve"> es el evento que el personaje hará, ya sea aparecer o moverse acorde a los parámetros dados.</w:t>
-      </w:r>
-      <w:r>
-        <w:t xml:space="preserve"> Muchos de estos parámetros se relacionan con la posición del personaje.</w:t>
-      </w:r>
-      <w:r>
-        <w:t xml:space="preserve"> </w:t>
-      </w:r>
-      <w:r>
-        <w:t>E</w:t>
-      </w:r>
-      <w:r>
-        <w:t>stas posiciones son números enteros que pueden ir del -20 al 120 y estos representan la posición del personaje en proporción al ancho de la pantalla.</w:t>
+        <w:t>A lo largo de esta sección se hará referencia numerosas veces a la “posición”, esta posición consta de un número entero que representa un</w:t>
+      </w:r>
+      <w:r>
+        <w:t xml:space="preserve"> porcentaje del ancho de la pantalla.</w:t>
       </w:r>
     </w:p>
     <w:p>
@@ -8267,6 +8332,7 @@
               <w:jc w:val="center"/>
             </w:pPr>
             <w:r>
+              <w:lastRenderedPageBreak/>
               <w:t>85</w:t>
             </w:r>
           </w:p>
@@ -8372,27 +8438,55 @@
         <w:t xml:space="preserve"> </w:t>
       </w:r>
       <w:r>
-        <w:t>S</w:t>
-      </w:r>
-      <w:r>
-        <w:t>e debe tener en cuenta el ancho de los personajes.</w:t>
+        <w:t>Si tu personaje es muy ancho, es posible que las posiciones -20 y 120 no sean suficientes para ocultarlo del todo, por lo tanto, tendrás que colocar valores más grandes.</w:t>
       </w:r>
     </w:p>
     <w:p>
       <w:r>
         <w:tab/>
-        <w:t>Vamos a dividir las acciones o eventos en dos, en eventos de aparición y en eventos de personajes ya en pantalla.</w:t>
+        <w:t>Una vez dejado claro estos aspectos técnicos sobre los sprites, su nombre y posiciones, avancemos directamente a los eventos. Estos serán divididos en dos, eventos de aparición y eventos de personajes ya en pantalla.</w:t>
+      </w:r>
+    </w:p>
+    <w:p>
+      <w:pPr>
+        <w:ind w:firstLine="708"/>
+      </w:pPr>
+      <w:r>
+        <w:t>Comencemos con los</w:t>
+      </w:r>
+      <w:r>
+        <w:t xml:space="preserve"> eventos de aparición de personajes.</w:t>
+      </w:r>
+      <w:r>
+        <w:t xml:space="preserve"> Su sintaxis es la siguiente.</w:t>
       </w:r>
     </w:p>
     <w:p>
       <w:r>
         <w:tab/>
-      </w:r>
-      <w:r>
-        <w:rPr>
+        <w:t>Nombre_del_personaje Sprite : método de aparición : parámetros de la aparición</w:t>
+      </w:r>
+    </w:p>
+    <w:p/>
+    <w:p>
+      <w:r>
+        <w:tab/>
+      </w:r>
+      <w:r>
+        <w:rPr>
+          <w:b/>
+          <w:bCs/>
+          <w:sz w:val="28"/>
+          <w:szCs w:val="28"/>
           <w:highlight w:val="red"/>
         </w:rPr>
-        <w:t>Nota:</w:t>
+        <w:t>Nota</w:t>
+      </w:r>
+      <w:r>
+        <w:rPr>
+          <w:highlight w:val="red"/>
+        </w:rPr>
+        <w:t>:</w:t>
       </w:r>
       <w:r>
         <w:t xml:space="preserve"> Si presentas problemas al momento de mostrar personajes, por ejemplo</w:t>
@@ -8404,7 +8498,6 @@
         <w:t xml:space="preserve"> que el Sprite del personaje se cambia, verifica que estás utilizando el nombre del personaje </w:t>
       </w:r>
       <w:r>
-        <w:lastRenderedPageBreak/>
         <w:t>con su respectivo sprite</w:t>
       </w:r>
       <w:r>
@@ -8682,11 +8775,13 @@
         <w:pStyle w:val="Ttulo3"/>
       </w:pPr>
     </w:p>
+    <w:p/>
     <w:p>
       <w:pPr>
         <w:pStyle w:val="Ttulo3"/>
       </w:pPr>
       <w:r>
+        <w:lastRenderedPageBreak/>
         <w:t>Eventos de personajes en pantalla</w:t>
       </w:r>
     </w:p>
@@ -9190,12 +9285,9 @@
             <w:pPr>
               <w:jc w:val="center"/>
             </w:pPr>
-            <w:proofErr w:type="gramStart"/>
-            <w:r>
-              <w:lastRenderedPageBreak/>
+            <w:r>
               <w:t>zoom</w:t>
             </w:r>
-            <w:proofErr w:type="gramEnd"/>
           </w:p>
         </w:tc>
         <w:tc>
@@ -9223,15 +9315,7 @@
               <w:jc w:val="center"/>
             </w:pPr>
             <w:r>
-              <w:t xml:space="preserve">1. El factor del </w:t>
-            </w:r>
-            <w:proofErr w:type="gramStart"/>
-            <w:r>
-              <w:t>zoom</w:t>
-            </w:r>
-            <w:proofErr w:type="gramEnd"/>
-            <w:r>
-              <w:t xml:space="preserve"> (2)</w:t>
+              <w:t>1. El factor del zoom (2)</w:t>
             </w:r>
           </w:p>
         </w:tc>
@@ -9278,15 +9362,7 @@
               </w:numPr>
             </w:pPr>
             <w:r>
-              <w:t xml:space="preserve">La duración del </w:t>
-            </w:r>
-            <w:proofErr w:type="gramStart"/>
-            <w:r>
-              <w:t>zoom</w:t>
-            </w:r>
-            <w:proofErr w:type="gramEnd"/>
-            <w:r>
-              <w:t xml:space="preserve"> (2)</w:t>
+              <w:t>La duración del zoom (2)</w:t>
             </w:r>
           </w:p>
         </w:tc>
@@ -9461,6 +9537,7 @@
     <w:p/>
     <w:p>
       <w:r>
+        <w:lastRenderedPageBreak/>
         <w:tab/>
         <w:t>Así mismo, se pueden realizar acciones entre varios personajes, para ello tenemos que escribir a los personajes separados por “&amp;”. Utilizar eventos de aparición con &amp; para mostrar varios personajes al mismo en pantalla colocará a los personajes de forma equitativa dependiendo de cuantos sean.</w:t>
       </w:r>
@@ -9470,60 +9547,24 @@
         <w:rPr>
           <w:highlight w:val="yellow"/>
         </w:rPr>
-        <w:t xml:space="preserve">Stefannie &amp; </w:t>
-      </w:r>
-      <w:proofErr w:type="gramStart"/>
+        <w:t>Stefannie &amp; Calcercio : appear</w:t>
+      </w:r>
+      <w:r>
+        <w:t xml:space="preserve"> (Stefannie y Calcercio aparecen al mismo tiempo, Stefannie al 33% de la pantalla y Calcercio al 66%)</w:t>
+      </w:r>
+    </w:p>
+    <w:p>
       <w:r>
         <w:rPr>
           <w:highlight w:val="yellow"/>
         </w:rPr>
-        <w:t>Calcercio :</w:t>
-      </w:r>
-      <w:proofErr w:type="gramEnd"/>
+        <w:t xml:space="preserve">Calcercio happy &amp; Stefannie : </w:t>
+      </w:r>
       <w:r>
         <w:rPr>
           <w:highlight w:val="yellow"/>
         </w:rPr>
-        <w:t xml:space="preserve"> appear</w:t>
-      </w:r>
-      <w:r>
-        <w:t xml:space="preserve"> (Stefannie y Calcercio aparecen al mismo tiempo, Stefannie al 33% de la pantalla y Calcercio al 66%)</w:t>
-      </w:r>
-    </w:p>
-    <w:p>
-      <w:r>
-        <w:rPr>
-          <w:highlight w:val="yellow"/>
-        </w:rPr>
-        <w:t xml:space="preserve">Calcercio happy &amp; </w:t>
-      </w:r>
-      <w:proofErr w:type="gramStart"/>
-      <w:r>
-        <w:rPr>
-          <w:highlight w:val="yellow"/>
-        </w:rPr>
-        <w:t>Stefannie :</w:t>
-      </w:r>
-      <w:proofErr w:type="gramEnd"/>
-      <w:r>
-        <w:rPr>
-          <w:highlight w:val="yellow"/>
-        </w:rPr>
-        <w:t xml:space="preserve"> </w:t>
-      </w:r>
-      <w:proofErr w:type="gramStart"/>
-      <w:r>
-        <w:rPr>
-          <w:highlight w:val="yellow"/>
-        </w:rPr>
-        <w:t>move :</w:t>
-      </w:r>
-      <w:proofErr w:type="gramEnd"/>
-      <w:r>
-        <w:rPr>
-          <w:highlight w:val="yellow"/>
-        </w:rPr>
-        <w:t xml:space="preserve"> 30: 85</w:t>
+        <w:t>move : 30: 85</w:t>
       </w:r>
       <w:r>
         <w:t xml:space="preserve"> (Calcercio cambia de expresión y se mueve a la posición 30 al mismo tiempo que Stefannie se mueve a la posición 85)</w:t>
@@ -9536,47 +9577,11 @@
       </w:r>
     </w:p>
     <w:p>
-      <w:proofErr w:type="gramStart"/>
       <w:r>
         <w:rPr>
           <w:highlight w:val="yellow"/>
         </w:rPr>
-        <w:t>Stefannie :</w:t>
-      </w:r>
-      <w:proofErr w:type="gramEnd"/>
-      <w:r>
-        <w:rPr>
-          <w:highlight w:val="yellow"/>
-        </w:rPr>
-        <w:t xml:space="preserve"> </w:t>
-      </w:r>
-      <w:proofErr w:type="gramStart"/>
-      <w:r>
-        <w:rPr>
-          <w:highlight w:val="yellow"/>
-        </w:rPr>
-        <w:t>move :</w:t>
-      </w:r>
-      <w:proofErr w:type="gramEnd"/>
-      <w:r>
-        <w:rPr>
-          <w:highlight w:val="yellow"/>
-        </w:rPr>
-        <w:t xml:space="preserve"> 30, </w:t>
-      </w:r>
-      <w:proofErr w:type="gramStart"/>
-      <w:r>
-        <w:rPr>
-          <w:highlight w:val="yellow"/>
-        </w:rPr>
-        <w:t>Calcercio :</w:t>
-      </w:r>
-      <w:proofErr w:type="gramEnd"/>
-      <w:r>
-        <w:rPr>
-          <w:highlight w:val="yellow"/>
-        </w:rPr>
-        <w:t xml:space="preserve"> move :120</w:t>
+        <w:t>Stefannie : move : 30, Calcercio : move :120</w:t>
       </w:r>
       <w:r>
         <w:t xml:space="preserve"> (Stefannie se mueve a la posición 30 y luego Calcercio sale de la pantalla por la derecha)</w:t>
@@ -9757,7 +9762,6 @@
               <w:jc w:val="center"/>
             </w:pPr>
             <w:r>
-              <w:lastRenderedPageBreak/>
               <w:t>jumping</w:t>
             </w:r>
           </w:p>
@@ -9807,33 +9811,33 @@
           <w:bCs/>
           <w:sz w:val="28"/>
           <w:szCs w:val="28"/>
-        </w:rPr>
-        <w:t xml:space="preserve">Importante: </w:t>
-      </w:r>
-      <w:r>
-        <w:t xml:space="preserve">Renpy no soporta ciertas animaciones al mismo tiempo, por </w:t>
-      </w:r>
-      <w:proofErr w:type="gramStart"/>
-      <w:r>
-        <w:t>ejemplo</w:t>
-      </w:r>
-      <w:proofErr w:type="gramEnd"/>
-      <w:r>
-        <w:t xml:space="preserve"> no soporta un cambio de fondo y la aparición de un personaje, si hacemos esto el fondo aparecerá de golpe y el personaje hará la aparición normal. Es cuestión de probar e intentar crear diálogos intermedios para poder recrear estas escenas lo más fluidas e inmersivas posible.</w:t>
+          <w:highlight w:val="red"/>
+        </w:rPr>
+        <w:t>Importante</w:t>
+      </w:r>
+      <w:r>
+        <w:rPr>
+          <w:b/>
+          <w:bCs/>
+          <w:sz w:val="28"/>
+          <w:szCs w:val="28"/>
+        </w:rPr>
+        <w:t xml:space="preserve">: </w:t>
+      </w:r>
+      <w:r>
+        <w:t>Renpy no soporta ciertas animaciones al mismo tiempo, por ejemplo no soporta un cambio de fondo y la aparición de un personaje, si hacemos esto el fondo aparecerá de golpe y el personaje hará la aparición normal. Es cuestión de probar e intentar crear diálogos intermedios para poder recrear estas escenas lo más fluidas e inmersivas posible.</w:t>
       </w:r>
     </w:p>
     <w:p>
       <w:r>
         <w:tab/>
-        <w:t xml:space="preserve">Es entendible que los eventos aguardan mucha información, es por eso </w:t>
-      </w:r>
-      <w:proofErr w:type="gramStart"/>
-      <w:r>
-        <w:t>que</w:t>
-      </w:r>
-      <w:proofErr w:type="gramEnd"/>
-      <w:r>
-        <w:t xml:space="preserve"> a continuación se presentarán unos cuantos escenarios</w:t>
+        <w:t xml:space="preserve">Es entendible que los eventos </w:t>
+      </w:r>
+      <w:r>
+        <w:t>poseen mucha información y parámetros distintos</w:t>
+      </w:r>
+      <w:r>
+        <w:t>, es por eso que a continuación se presentarán unos cuantos escenarios</w:t>
       </w:r>
       <w:r>
         <w:t xml:space="preserve"> de ejemplo</w:t>
@@ -9842,6 +9846,9 @@
         <w:t xml:space="preserve"> utilizando estos eventos.</w:t>
       </w:r>
     </w:p>
+    <w:p/>
+    <w:p/>
+    <w:p/>
     <w:p>
       <w:pPr>
         <w:pStyle w:val="Prrafodelista"/>
@@ -9851,6 +9858,7 @@
         </w:numPr>
       </w:pPr>
       <w:r>
+        <w:lastRenderedPageBreak/>
         <w:t>Saijo aparece y corre hacia una puerta a intentar abrirla dándole golpes</w:t>
       </w:r>
     </w:p>
@@ -9862,13 +9870,8 @@
           <w:numId w:val="15"/>
         </w:numPr>
       </w:pPr>
-      <w:proofErr w:type="gramStart"/>
-      <w:r>
-        <w:t>saijo:appear</w:t>
-      </w:r>
-      <w:proofErr w:type="gramEnd"/>
-      <w:r>
-        <w:t xml:space="preserve"> </w:t>
+      <w:r>
+        <w:t xml:space="preserve">saijo:appear </w:t>
       </w:r>
       <w:r>
         <w:t>(S</w:t>
@@ -9888,19 +9891,17 @@
           <w:numId w:val="15"/>
         </w:numPr>
       </w:pPr>
-      <w:proofErr w:type="gramStart"/>
-      <w:r>
-        <w:t>saijo:move</w:t>
-      </w:r>
-      <w:proofErr w:type="gramEnd"/>
-      <w:r>
-        <w:t>:90</w:t>
+      <w:r>
+        <w:t>saijo:move:90</w:t>
       </w:r>
       <w:r>
         <w:t xml:space="preserve"> (</w:t>
       </w:r>
       <w:r>
         <w:t>Saijo se mueve hacia la derecha</w:t>
+      </w:r>
+      <w:r>
+        <w:t xml:space="preserve"> cerca del final</w:t>
       </w:r>
       <w:r>
         <w:t>)</w:t>
@@ -9914,13 +9915,8 @@
           <w:numId w:val="15"/>
         </w:numPr>
       </w:pPr>
-      <w:proofErr w:type="gramStart"/>
-      <w:r>
-        <w:t>saijo:hitr</w:t>
-      </w:r>
-      <w:proofErr w:type="gramEnd"/>
-      <w:r>
-        <w:t xml:space="preserve"> </w:t>
+      <w:r>
+        <w:t xml:space="preserve">saijo:hitr </w:t>
       </w:r>
       <w:r>
         <w:t>(</w:t>
@@ -9947,7 +9943,13 @@
         </w:numPr>
       </w:pPr>
       <w:r>
-        <w:t xml:space="preserve">El protagonista entra a una habitación donde está saijo y </w:t>
+        <w:t xml:space="preserve">El protagonista entra a una habitación donde está </w:t>
+      </w:r>
+      <w:r>
+        <w:t>S</w:t>
+      </w:r>
+      <w:r>
+        <w:t xml:space="preserve">aijo y </w:t>
       </w:r>
       <w:r>
         <w:t>Dereck</w:t>
@@ -9959,15 +9961,7 @@
         <w:t>Dereck</w:t>
       </w:r>
       <w:r>
-        <w:t xml:space="preserve"> sale de la </w:t>
-      </w:r>
-      <w:proofErr w:type="gramStart"/>
-      <w:r>
-        <w:t>habitación</w:t>
-      </w:r>
-      <w:proofErr w:type="gramEnd"/>
-      <w:r>
-        <w:t xml:space="preserve"> pero luego regresa y nuevamente se retira</w:t>
+        <w:t xml:space="preserve"> sale de la habitación pero luego regresa y nuevamente se retira</w:t>
       </w:r>
     </w:p>
     <w:p>
@@ -10002,13 +9996,8 @@
           <w:numId w:val="15"/>
         </w:numPr>
       </w:pPr>
-      <w:proofErr w:type="gramStart"/>
-      <w:r>
-        <w:t>dereck:move</w:t>
-      </w:r>
-      <w:proofErr w:type="gramEnd"/>
-      <w:r>
-        <w:t>:-25:5</w:t>
+      <w:r>
+        <w:t>dereck:move:-25:5</w:t>
       </w:r>
       <w:r>
         <w:t xml:space="preserve"> (</w:t>
@@ -10031,13 +10020,8 @@
           <w:numId w:val="15"/>
         </w:numPr>
       </w:pPr>
-      <w:proofErr w:type="gramStart"/>
-      <w:r>
-        <w:t>dereck:move</w:t>
-      </w:r>
-      <w:proofErr w:type="gramEnd"/>
-      <w:r>
-        <w:t>:18:1</w:t>
+      <w:r>
+        <w:t>dereck:move:18:1</w:t>
       </w:r>
       <w:r>
         <w:t xml:space="preserve"> (D</w:t>
@@ -10057,13 +10041,8 @@
           <w:numId w:val="15"/>
         </w:numPr>
       </w:pPr>
-      <w:proofErr w:type="gramStart"/>
-      <w:r>
-        <w:t>dereck:move</w:t>
-      </w:r>
-      <w:proofErr w:type="gramEnd"/>
-      <w:r>
-        <w:t>:-25</w:t>
+      <w:r>
+        <w:t>dereck:move:-25</w:t>
       </w:r>
       <w:r>
         <w:t xml:space="preserve"> (D</w:t>
@@ -10083,11 +10062,9 @@
           <w:numId w:val="15"/>
         </w:numPr>
       </w:pPr>
-      <w:proofErr w:type="gramStart"/>
       <w:r>
         <w:t>dereck:destroy</w:t>
       </w:r>
-      <w:proofErr w:type="gramEnd"/>
       <w:r>
         <w:t xml:space="preserve"> (</w:t>
       </w:r>
@@ -10112,7 +10089,13 @@
         </w:numPr>
       </w:pPr>
       <w:r>
-        <w:t>El protagonista le juega una broma a dereck y este se asusta</w:t>
+        <w:t xml:space="preserve">El protagonista le juega una broma a </w:t>
+      </w:r>
+      <w:r>
+        <w:t>D</w:t>
+      </w:r>
+      <w:r>
+        <w:t>ereck y este se asusta</w:t>
       </w:r>
     </w:p>
     <w:p>
@@ -10123,13 +10106,8 @@
           <w:numId w:val="15"/>
         </w:numPr>
       </w:pPr>
-      <w:proofErr w:type="gramStart"/>
-      <w:r>
-        <w:t>dereck:pop</w:t>
-      </w:r>
-      <w:proofErr w:type="gramEnd"/>
-      <w:r>
-        <w:t>:120</w:t>
+      <w:r>
+        <w:t>dereck:pop:120</w:t>
       </w:r>
       <w:r>
         <w:t xml:space="preserve"> (D</w:t>
@@ -10149,13 +10127,8 @@
           <w:numId w:val="15"/>
         </w:numPr>
       </w:pPr>
-      <w:proofErr w:type="gramStart"/>
-      <w:r>
-        <w:t>dereck:move</w:t>
-      </w:r>
-      <w:proofErr w:type="gramEnd"/>
-      <w:r>
-        <w:t>:33</w:t>
+      <w:r>
+        <w:t>dereck:move:33</w:t>
       </w:r>
       <w:r>
         <w:t xml:space="preserve"> (D</w:t>
@@ -10176,18 +10149,10 @@
         </w:numPr>
       </w:pPr>
       <w:r>
-        <w:t xml:space="preserve">dereck surprised, </w:t>
-      </w:r>
-      <w:proofErr w:type="gramStart"/>
-      <w:r>
-        <w:t>dereck:jum</w:t>
-      </w:r>
-      <w:r>
-        <w:t>p</w:t>
-      </w:r>
-      <w:proofErr w:type="gramEnd"/>
-      <w:r>
-        <w:t xml:space="preserve"> (D</w:t>
+        <w:t>dereck surprised, dereck:jum</w:t>
+      </w:r>
+      <w:r>
+        <w:t>p (D</w:t>
       </w:r>
       <w:r>
         <w:t>ereck se sorprende e inmediatamente después da un salto</w:t>
@@ -10210,15 +10175,31 @@
         </w:numPr>
       </w:pPr>
       <w:r>
-        <w:t xml:space="preserve">Hay una pelea entre mutou y dereck, mutou lo golpea y logra </w:t>
-      </w:r>
-      <w:proofErr w:type="gramStart"/>
-      <w:r>
-        <w:t>derribarlo</w:t>
-      </w:r>
-      <w:proofErr w:type="gramEnd"/>
-      <w:r>
-        <w:t xml:space="preserve"> pero dereck se levanta y derriba a mutou quedando victorioso</w:t>
+        <w:t xml:space="preserve">Hay una pelea entre </w:t>
+      </w:r>
+      <w:r>
+        <w:t>M</w:t>
+      </w:r>
+      <w:r>
+        <w:t xml:space="preserve">utou y </w:t>
+      </w:r>
+      <w:r>
+        <w:t>D</w:t>
+      </w:r>
+      <w:r>
+        <w:t xml:space="preserve">ereck, </w:t>
+      </w:r>
+      <w:r>
+        <w:t>M</w:t>
+      </w:r>
+      <w:r>
+        <w:t xml:space="preserve">utou lo golpea y logra derribarlo pero </w:t>
+      </w:r>
+      <w:r>
+        <w:t>D</w:t>
+      </w:r>
+      <w:r>
+        <w:t>ereck se levanta y derriba a mutou quedando victorioso</w:t>
       </w:r>
     </w:p>
     <w:p>
@@ -10229,19 +10210,9 @@
           <w:numId w:val="15"/>
         </w:numPr>
       </w:pPr>
-      <w:proofErr w:type="gramStart"/>
-      <w:r>
-        <w:t>mutou:hitl</w:t>
-      </w:r>
-      <w:proofErr w:type="gramEnd"/>
-      <w:r>
-        <w:t xml:space="preserve">, </w:t>
-      </w:r>
-      <w:proofErr w:type="gramStart"/>
-      <w:r>
-        <w:t>dereck:knockl</w:t>
-      </w:r>
-      <w:proofErr w:type="gramEnd"/>
+      <w:r>
+        <w:t>mutou:hitl, dereck:knockl</w:t>
+      </w:r>
       <w:r>
         <w:t xml:space="preserve"> (</w:t>
       </w:r>
@@ -10260,11 +10231,9 @@
           <w:numId w:val="15"/>
         </w:numPr>
       </w:pPr>
-      <w:proofErr w:type="gramStart"/>
       <w:r>
         <w:t>dereck:raisel</w:t>
       </w:r>
-      <w:proofErr w:type="gramEnd"/>
       <w:r>
         <w:t xml:space="preserve"> (</w:t>
       </w:r>
@@ -10283,19 +10252,9 @@
           <w:numId w:val="15"/>
         </w:numPr>
       </w:pPr>
-      <w:proofErr w:type="gramStart"/>
-      <w:r>
-        <w:t>dereck:hitr</w:t>
-      </w:r>
-      <w:proofErr w:type="gramEnd"/>
-      <w:r>
-        <w:t xml:space="preserve">, </w:t>
-      </w:r>
-      <w:proofErr w:type="gramStart"/>
-      <w:r>
-        <w:t>mutou:knockr</w:t>
-      </w:r>
-      <w:proofErr w:type="gramEnd"/>
+      <w:r>
+        <w:t>dereck:hitr, mutou:knockr</w:t>
+      </w:r>
       <w:r>
         <w:t xml:space="preserve"> (</w:t>
       </w:r>
@@ -10308,11 +10267,16 @@
     </w:p>
     <w:p>
       <w:pPr>
+        <w:pStyle w:val="Prrafodelista"/>
+        <w:ind w:left="1440"/>
+      </w:pPr>
+    </w:p>
+    <w:p>
+      <w:pPr>
         <w:pStyle w:val="Ttulo2"/>
       </w:pPr>
       <w:bookmarkStart w:id="14" w:name="_Toc199261567"/>
       <w:r>
-        <w:lastRenderedPageBreak/>
         <w:t>Columna Delay</w:t>
       </w:r>
       <w:bookmarkEnd w:id="14"/>
@@ -10384,6 +10348,7 @@
     </w:p>
     <w:p>
       <w:r>
+        <w:lastRenderedPageBreak/>
         <w:tab/>
       </w:r>
       <w:r>
@@ -10412,7 +10377,31 @@
         <w:t xml:space="preserve">Es el texto que aparece en el recuadro </w:t>
       </w:r>
       <w:r>
-        <w:t>arriba de la caja de texto, es decir, la persona o entidad que está hablando. El color de las letras del nombre del emisor dependerá de la definición de los personajes. Una vez colocado un emisor no hace falta ponerlo en los diálogos posteriores ya que este seguirá apareciendo hasta que se quite o se ponga otro emisor.</w:t>
+        <w:t>arriba de la caja de texto, es decir, la persona o entidad que está hablando. El color de las letras del nombre del emisor dependerá de la definición</w:t>
+      </w:r>
+      <w:r>
+        <w:t xml:space="preserve"> que le hayamos dado en el archivo </w:t>
+      </w:r>
+      <w:r>
+        <w:rPr>
+          <w:i/>
+          <w:iCs/>
+        </w:rPr>
+        <w:t>config.csv</w:t>
+      </w:r>
+      <w:r>
+        <w:t>, Así como el nombre del personaje dependiendo del idioma del juego.</w:t>
+      </w:r>
+    </w:p>
+    <w:p>
+      <w:r>
+        <w:t xml:space="preserve"> </w:t>
+      </w:r>
+      <w:r>
+        <w:tab/>
+      </w:r>
+      <w:r>
+        <w:t>Una vez colocado un emisor no hace falta ponerlo en los diálogos posteriores ya que este seguirá apareciendo hasta que se quite o se ponga otro emisor.</w:t>
       </w:r>
     </w:p>
     <w:p>
@@ -10434,15 +10423,32 @@
     <w:p>
       <w:r>
         <w:tab/>
-        <w:t xml:space="preserve">A partir de esta columna se escribirá el texto de los diálogos que será mostrado en pantalla en los distintos idiomas declarados en la cabecera del archivo de control respetando el orden. En caso de necesitar añadir más idiomas es tan sencillo como escribir </w:t>
-      </w:r>
-      <w:proofErr w:type="gramStart"/>
-      <w:r>
-        <w:t>un ;</w:t>
-      </w:r>
-      <w:proofErr w:type="gramEnd"/>
-      <w:r>
-        <w:t xml:space="preserve"> en el último idioma y empezar a traducir todos los diálogos.</w:t>
+        <w:t>A partir de esta columna se escribirá el texto de los diálogos que será</w:t>
+      </w:r>
+      <w:r>
+        <w:t>n</w:t>
+      </w:r>
+      <w:r>
+        <w:t xml:space="preserve"> mostrado en pantalla en los distintos idiomas declarados en la cabecera del archivo de control</w:t>
+      </w:r>
+      <w:r>
+        <w:t xml:space="preserve">. </w:t>
+      </w:r>
+      <w:r>
+        <w:t xml:space="preserve">En caso de necesitar añadir más idiomas es tan sencillo como </w:t>
+      </w:r>
+      <w:r>
+        <w:t xml:space="preserve">añadir una columna adicional y escribir en la cabecera el nombre del idioma. Cabe destacar que para que funcione correctamente el idioma debe estar definido en el archivo </w:t>
+      </w:r>
+      <w:r>
+        <w:rPr>
+          <w:i/>
+          <w:iCs/>
+        </w:rPr>
+        <w:t>config.csv</w:t>
+      </w:r>
+      <w:r>
+        <w:t>. Además de habilitar en los menús, la selección del idioma respectivo.</w:t>
       </w:r>
     </w:p>
     <w:p>
@@ -10456,39 +10462,7 @@
         <w:ind w:left="708"/>
       </w:pPr>
       <w:r>
-        <w:t xml:space="preserve">"No se que hora o que día es hoy, creo que es miércoles en la </w:t>
-      </w:r>
-      <w:proofErr w:type="gramStart"/>
-      <w:r>
-        <w:t>tarde.No</w:t>
-      </w:r>
-      <w:proofErr w:type="gramEnd"/>
-      <w:r>
-        <w:t xml:space="preserve"> se que hora o que día es hoy, creo que es miércoles en la </w:t>
-      </w:r>
-      <w:proofErr w:type="gramStart"/>
-      <w:r>
-        <w:t>tarde.No</w:t>
-      </w:r>
-      <w:proofErr w:type="gramEnd"/>
-      <w:r>
-        <w:t xml:space="preserve"> se que hora o que día es hoy, creo que es miércoles en la </w:t>
-      </w:r>
-      <w:proofErr w:type="gramStart"/>
-      <w:r>
-        <w:t>tarde.No</w:t>
-      </w:r>
-      <w:proofErr w:type="gramEnd"/>
-      <w:r>
-        <w:t xml:space="preserve"> se que hora o que día es hoy, creo que es miércoles en la </w:t>
-      </w:r>
-      <w:proofErr w:type="gramStart"/>
-      <w:r>
-        <w:t>tarde.No</w:t>
-      </w:r>
-      <w:proofErr w:type="gramEnd"/>
-      <w:r>
-        <w:t xml:space="preserve"> se que hora o que día es hoy, creo que es miércoles en la"</w:t>
+        <w:t>"No se que hora o que día es hoy, creo que es miércoles en la tarde.No se que hora o que día es hoy, creo que es miércoles en la tarde.No se que hora o que día es hoy, creo que es miércoles en la tarde.No se que hora o que día es hoy, creo que es miércoles en la tarde.No se que hora o que día es hoy, creo que es miércoles en la"</w:t>
       </w:r>
     </w:p>
     <w:p>
@@ -10504,9 +10478,15 @@
         <w:ind w:firstLine="708"/>
       </w:pPr>
       <w:r>
-        <w:t xml:space="preserve">Para saber cuantos pixeles tiene tu diálogo puedes utilizar el siguiente sitio web: </w:t>
-      </w:r>
-      <w:hyperlink r:id="rId29" w:history="1">
+        <w:t>Para saber cu</w:t>
+      </w:r>
+      <w:r>
+        <w:t>á</w:t>
+      </w:r>
+      <w:r>
+        <w:t xml:space="preserve">ntos pixeles tiene tu diálogo puedes utilizar el siguiente sitio web: </w:t>
+      </w:r>
+      <w:hyperlink r:id="rId36" w:history="1">
         <w:r>
           <w:rPr>
             <w:rStyle w:val="Hipervnculo"/>
@@ -10520,18 +10500,15 @@
         <w:ind w:firstLine="708"/>
       </w:pPr>
       <w:r>
-        <w:lastRenderedPageBreak/>
-        <w:t xml:space="preserve">Renpy posee diversos modificadores de texto, estos se escriben en medio del diálogo y son perfectamente utilizables en </w:t>
-      </w:r>
-      <w:proofErr w:type="gramStart"/>
-      <w:r>
-        <w:t>la columnas</w:t>
-      </w:r>
-      <w:proofErr w:type="gramEnd"/>
-      <w:r>
-        <w:t xml:space="preserve"> de idioma. Existen muchos modificadores de texto así que te recomiendo leer la documentación de Renpy para intentar implementarlos. </w:t>
-      </w:r>
-      <w:hyperlink r:id="rId30" w:anchor="text-tag-alpha" w:history="1">
+        <w:t>Renpy posee diversos modificadores de texto, estos se escriben en medio del diálogo y son perfectamente utilizables en la</w:t>
+      </w:r>
+      <w:r>
+        <w:t>s</w:t>
+      </w:r>
+      <w:r>
+        <w:t xml:space="preserve"> columnas de idioma. Existen muchos modificadores de texto así que te recomiendo leer la documentación de Renpy para intentar implementarlos. </w:t>
+      </w:r>
+      <w:hyperlink r:id="rId37" w:anchor="text-tag-alpha" w:history="1">
         <w:r>
           <w:rPr>
             <w:rStyle w:val="Hipervnculo"/>
@@ -10548,21 +10525,17 @@
         <w:ind w:firstLine="708"/>
       </w:pPr>
       <w:r>
-        <w:t xml:space="preserve">Dependiendo de la fuente que utilices en tu proyecto, es posible que ciertos caracteres no se muestren, por </w:t>
-      </w:r>
-      <w:proofErr w:type="gramStart"/>
-      <w:r>
-        <w:t>ejemplo</w:t>
-      </w:r>
-      <w:proofErr w:type="gramEnd"/>
-      <w:r>
-        <w:t xml:space="preserve"> el carácter “</w:t>
+        <w:t>Dependiendo de la fuente que utilices en tu proyecto, es posible que ciertos caracteres no se muestren, por ejemplo el carácter “</w:t>
       </w:r>
       <w:r>
         <w:t>♪</w:t>
       </w:r>
       <w:r>
-        <w:t>” no existe en la fuente “playtime” y en su lugar se mostrará un carácter extraño. En esos casos tendrás que usar obligatoriamente un modificador de texto especificando una fuente la cual sí que cuente con el carácter necesitado.</w:t>
+        <w:t xml:space="preserve">” no existe en la fuente “playtime” y en su lugar se mostrará un carácter extraño. En esos casos tendrás que usar </w:t>
+      </w:r>
+      <w:r>
+        <w:lastRenderedPageBreak/>
+        <w:t>obligatoriamente un modificador de texto especificando una fuente la cual sí que cuente con el carácter necesitado.</w:t>
       </w:r>
     </w:p>
     <w:p>
@@ -10620,7 +10593,7 @@
                     <pic:cNvPicPr/>
                   </pic:nvPicPr>
                   <pic:blipFill>
-                    <a:blip r:embed="rId31"/>
+                    <a:blip r:embed="rId38"/>
                     <a:stretch>
                       <a:fillRect/>
                     </a:stretch>
@@ -10662,15 +10635,7 @@
         <w:ind w:firstLine="708"/>
       </w:pPr>
       <w:r>
-        <w:t>{font=</w:t>
-      </w:r>
-      <w:proofErr w:type="gramStart"/>
-      <w:r>
-        <w:t>DejaVuSans.ttf}♪</w:t>
-      </w:r>
-      <w:proofErr w:type="gramEnd"/>
-      <w:r>
-        <w:t>♪♪{/font}</w:t>
+        <w:t>{font=DejaVuSans.ttf}♪♪♪{/font}</w:t>
       </w:r>
     </w:p>
     <w:p>
@@ -10720,23 +10685,7 @@
           <w:i/>
           <w:iCs/>
         </w:rPr>
-        <w:t>{font=</w:t>
-      </w:r>
-      <w:proofErr w:type="gramStart"/>
-      <w:r>
-        <w:rPr>
-          <w:i/>
-          <w:iCs/>
-        </w:rPr>
-        <w:t>DejaVuSans.ttf}♪</w:t>
-      </w:r>
-      <w:proofErr w:type="gramEnd"/>
-      <w:r>
-        <w:rPr>
-          <w:i/>
-          <w:iCs/>
-        </w:rPr>
-        <w:t>♪♪{/font}</w:t>
+        <w:t>{font=DejaVuSans.ttf}♪♪♪{/font}</w:t>
       </w:r>
       <w:r>
         <w:rPr>
@@ -10770,7 +10719,7 @@
                     <pic:cNvPicPr/>
                   </pic:nvPicPr>
                   <pic:blipFill>
-                    <a:blip r:embed="rId32"/>
+                    <a:blip r:embed="rId39"/>
                     <a:stretch>
                       <a:fillRect/>
                     </a:stretch>
@@ -10830,7 +10779,13 @@
         </w:numPr>
       </w:pPr>
       <w:r>
-        <w:t>Cambios de fondo</w:t>
+        <w:t>Finalización</w:t>
+      </w:r>
+      <w:r>
+        <w:t>/Inicio</w:t>
+      </w:r>
+      <w:r>
+        <w:t xml:space="preserve"> de escena.</w:t>
       </w:r>
     </w:p>
     <w:p>
@@ -10842,7 +10797,7 @@
         </w:numPr>
       </w:pPr>
       <w:r>
-        <w:t>Eventos</w:t>
+        <w:t>Cambios de fondo</w:t>
       </w:r>
     </w:p>
     <w:p>
@@ -10854,7 +10809,7 @@
         </w:numPr>
       </w:pPr>
       <w:r>
-        <w:t>Audios</w:t>
+        <w:t>Eventos</w:t>
       </w:r>
     </w:p>
     <w:p>
@@ -10866,8 +10821,7 @@
         </w:numPr>
       </w:pPr>
       <w:r>
-        <w:lastRenderedPageBreak/>
-        <w:t>Efectos</w:t>
+        <w:t>Audios</w:t>
       </w:r>
     </w:p>
     <w:p>
@@ -10879,7 +10833,7 @@
         </w:numPr>
       </w:pPr>
       <w:r>
-        <w:t>Efectos continuos y parpadeos</w:t>
+        <w:t>Efectos</w:t>
       </w:r>
     </w:p>
     <w:p>
@@ -10891,7 +10845,7 @@
         </w:numPr>
       </w:pPr>
       <w:r>
-        <w:t>Delay (tiempos de espera)</w:t>
+        <w:t>Efectos continuos y parpadeos</w:t>
       </w:r>
     </w:p>
     <w:p>
@@ -10903,7 +10857,7 @@
         </w:numPr>
       </w:pPr>
       <w:r>
-        <w:t>Mostrar texto del diálogo.</w:t>
+        <w:t>Delay (tiempos de espera)</w:t>
       </w:r>
     </w:p>
     <w:p>
@@ -10915,10 +10869,7 @@
         </w:numPr>
       </w:pPr>
       <w:r>
-        <w:t xml:space="preserve">Terminación de </w:t>
-      </w:r>
-      <w:r>
-        <w:t>escena</w:t>
+        <w:t>Mostrar texto del diálogo.</w:t>
       </w:r>
     </w:p>
     <w:p>
@@ -10926,7 +10877,11 @@
         <w:pStyle w:val="Ttulo2"/>
       </w:pPr>
       <w:r>
-        <w:t xml:space="preserve">Terminación de </w:t>
+        <w:lastRenderedPageBreak/>
+        <w:t>Finalización</w:t>
+      </w:r>
+      <w:r>
+        <w:t xml:space="preserve"> de </w:t>
       </w:r>
       <w:bookmarkEnd w:id="17"/>
       <w:r>
@@ -10963,26 +10918,10 @@
         <w:t>T</w:t>
       </w:r>
       <w:r>
-        <w:t xml:space="preserve">ipo de terminación de </w:t>
-      </w:r>
-      <w:proofErr w:type="gramStart"/>
-      <w:r>
-        <w:t>escena</w:t>
-      </w:r>
-      <w:r>
-        <w:t xml:space="preserve"> ;</w:t>
-      </w:r>
-      <w:proofErr w:type="gramEnd"/>
-      <w:r>
-        <w:t xml:space="preserve"> </w:t>
-      </w:r>
-      <w:proofErr w:type="gramStart"/>
-      <w:r>
-        <w:t>transición :</w:t>
-      </w:r>
-      <w:proofErr w:type="gramEnd"/>
-      <w:r>
-        <w:t xml:space="preserve"> parámetros de transición</w:t>
+        <w:t>ipo de terminación de escena</w:t>
+      </w:r>
+      <w:r>
+        <w:t xml:space="preserve"> ; transición : parámetros de transición</w:t>
       </w:r>
     </w:p>
     <w:p>
@@ -10998,36 +10937,24 @@
       <w:r>
         <w:t>_</w:t>
       </w:r>
-      <w:proofErr w:type="gramStart"/>
       <w:r>
         <w:t xml:space="preserve">1 </w:t>
       </w:r>
       <w:r>
         <w:t>;</w:t>
       </w:r>
-      <w:proofErr w:type="gramEnd"/>
-      <w:r>
-        <w:t xml:space="preserve"> valor </w:t>
-      </w:r>
-      <w:proofErr w:type="gramStart"/>
-      <w:r>
-        <w:t xml:space="preserve">1 </w:t>
+      <w:r>
+        <w:t xml:space="preserve"> valor 1 </w:t>
       </w:r>
       <w:r>
         <w:t>;</w:t>
       </w:r>
-      <w:proofErr w:type="gramEnd"/>
-      <w:r>
-        <w:t xml:space="preserve"> valor </w:t>
-      </w:r>
-      <w:proofErr w:type="gramStart"/>
-      <w:r>
-        <w:t xml:space="preserve">2 </w:t>
+      <w:r>
+        <w:t xml:space="preserve"> valor 2 </w:t>
       </w:r>
       <w:r>
         <w:t>;</w:t>
       </w:r>
-      <w:proofErr w:type="gramEnd"/>
       <w:r>
         <w:t xml:space="preserve"> valor 3</w:t>
       </w:r>
@@ -11046,38 +10973,23 @@
         <w:t>_</w:t>
       </w:r>
       <w:r>
-        <w:t xml:space="preserve"> </w:t>
-      </w:r>
-      <w:proofErr w:type="gramStart"/>
-      <w:r>
-        <w:t xml:space="preserve">2 </w:t>
+        <w:t xml:space="preserve"> 2 </w:t>
       </w:r>
       <w:r>
         <w:t>;</w:t>
       </w:r>
-      <w:proofErr w:type="gramEnd"/>
-      <w:r>
-        <w:t xml:space="preserve"> valor </w:t>
-      </w:r>
-      <w:proofErr w:type="gramStart"/>
-      <w:r>
-        <w:t xml:space="preserve">1 </w:t>
+      <w:r>
+        <w:t xml:space="preserve"> valor 1 </w:t>
       </w:r>
       <w:r>
         <w:t>;</w:t>
       </w:r>
-      <w:proofErr w:type="gramEnd"/>
-      <w:r>
-        <w:t xml:space="preserve"> valor </w:t>
-      </w:r>
-      <w:proofErr w:type="gramStart"/>
-      <w:r>
-        <w:t xml:space="preserve">2 </w:t>
+      <w:r>
+        <w:t xml:space="preserve"> valor 2 </w:t>
       </w:r>
       <w:r>
         <w:t>;</w:t>
       </w:r>
-      <w:proofErr w:type="gramEnd"/>
       <w:r>
         <w:t xml:space="preserve"> valor 3</w:t>
       </w:r>
@@ -11093,14 +11005,7 @@
       </w:pPr>
       <w:r>
         <w:tab/>
-      </w:r>
-      <w:proofErr w:type="gramStart"/>
-      <w:r>
-        <w:t>La filas siguientes después</w:t>
-      </w:r>
-      <w:proofErr w:type="gramEnd"/>
-      <w:r>
-        <w:t xml:space="preserve"> de definir el tipo de terminación, son cada uno de los elementos que acompañan al tipo de terminación, en este caso nombrados “</w:t>
+        <w:t>La filas siguientes después de definir el tipo de terminación, son cada uno de los elementos que acompañan al tipo de terminación, en este caso nombrados “</w:t>
       </w:r>
       <w:r>
         <w:t>Key</w:t>
@@ -11200,7 +11105,7 @@
                     <pic:cNvPicPr/>
                   </pic:nvPicPr>
                   <pic:blipFill>
-                    <a:blip r:embed="rId33"/>
+                    <a:blip r:embed="rId40"/>
                     <a:stretch>
                       <a:fillRect/>
                     </a:stretch>
@@ -11224,15 +11129,12 @@
     <w:p>
       <w:r>
         <w:tab/>
-        <w:t xml:space="preserve">En este ejemplo podemos ver como la Escena A siempre conlleva a la Escena B. Si bien es cierto que podríamos escribir todo un capítulo dentro de una misma escena, lo </w:t>
-      </w:r>
+        <w:t>En este ejemplo podemos ver como la Escena A siempre conlleva a la Escena B. Si bien es cierto que podríamos escribir todo un capítulo dentro de una misma escena, lo recomendable es utilizar varias escenas y que cada una englobe un arco o situación dentro de la historia.</w:t>
+      </w:r>
+    </w:p>
+    <w:p>
       <w:r>
         <w:lastRenderedPageBreak/>
-        <w:t>recomendable es utilizar varias escenas y que cada una englobe un arco o situación dentro de la historia.</w:t>
-      </w:r>
-    </w:p>
-    <w:p>
-      <w:r>
         <w:t xml:space="preserve">             </w:t>
       </w:r>
       <w:r>
@@ -11255,7 +11157,7 @@
                     <pic:cNvPicPr/>
                   </pic:nvPicPr>
                   <pic:blipFill>
-                    <a:blip r:embed="rId34"/>
+                    <a:blip r:embed="rId41"/>
                     <a:stretch>
                       <a:fillRect/>
                     </a:stretch>
@@ -11297,15 +11199,7 @@
     <w:p>
       <w:r>
         <w:tab/>
-        <w:t>Key_de_fin_de_escena_</w:t>
-      </w:r>
-      <w:proofErr w:type="gramStart"/>
-      <w:r>
-        <w:t>A ;</w:t>
-      </w:r>
-      <w:proofErr w:type="gramEnd"/>
-      <w:r>
-        <w:t xml:space="preserve"> Nombre_de_la_siguiente_escena</w:t>
+        <w:t>Key_de_fin_de_escena_A ; Nombre_de_la_siguiente_escena</w:t>
       </w:r>
     </w:p>
     <w:p>
@@ -11366,21 +11260,7 @@
         <w:rPr>
           <w:highlight w:val="yellow"/>
         </w:rPr>
-        <w:t>_</w:t>
-      </w:r>
-      <w:proofErr w:type="gramStart"/>
-      <w:r>
-        <w:rPr>
-          <w:highlight w:val="yellow"/>
-        </w:rPr>
-        <w:t>end ;</w:t>
-      </w:r>
-      <w:proofErr w:type="gramEnd"/>
-      <w:r>
-        <w:rPr>
-          <w:highlight w:val="yellow"/>
-        </w:rPr>
-        <w:t xml:space="preserve"> </w:t>
+        <w:t xml:space="preserve">_end ; </w:t>
       </w:r>
       <w:r>
         <w:rPr>
@@ -11447,21 +11327,7 @@
         <w:rPr>
           <w:highlight w:val="yellow"/>
         </w:rPr>
-        <w:t>katherine_scene_</w:t>
-      </w:r>
-      <w:proofErr w:type="gramStart"/>
-      <w:r>
-        <w:rPr>
-          <w:highlight w:val="yellow"/>
-        </w:rPr>
-        <w:t>end ;</w:t>
-      </w:r>
-      <w:proofErr w:type="gramEnd"/>
-      <w:r>
-        <w:rPr>
-          <w:highlight w:val="yellow"/>
-        </w:rPr>
-        <w:t xml:space="preserve"> the_x_exam</w:t>
+        <w:t>katherine_scene_end ; the_x_exam</w:t>
       </w:r>
     </w:p>
     <w:p/>
@@ -11493,65 +11359,37 @@
         <w:rPr>
           <w:highlight w:val="yellow"/>
         </w:rPr>
-        <w:t>amber_scene_</w:t>
-      </w:r>
-      <w:proofErr w:type="gramStart"/>
-      <w:r>
+        <w:t>amber_scene_end ; the_x_exam</w:t>
+      </w:r>
+    </w:p>
+    <w:p>
+      <w:r>
+        <w:t>(En la ruta de Mariangeles)</w:t>
+      </w:r>
+    </w:p>
+    <w:p>
+      <w:pPr>
+        <w:spacing w:after="0"/>
         <w:rPr>
           <w:highlight w:val="yellow"/>
         </w:rPr>
-        <w:t>end ;</w:t>
-      </w:r>
-      <w:proofErr w:type="gramEnd"/>
+      </w:pPr>
       <w:r>
         <w:rPr>
           <w:highlight w:val="yellow"/>
         </w:rPr>
-        <w:t xml:space="preserve"> the_x_exam</w:t>
-      </w:r>
-    </w:p>
-    <w:p>
-      <w:r>
-        <w:t>(En la ruta de Mariangeles)</w:t>
+        <w:t>#linear</w:t>
       </w:r>
     </w:p>
     <w:p>
       <w:pPr>
         <w:spacing w:after="0"/>
+      </w:pPr>
+      <w:r>
         <w:rPr>
           <w:highlight w:val="yellow"/>
         </w:rPr>
-      </w:pPr>
-      <w:r>
-        <w:rPr>
-          <w:highlight w:val="yellow"/>
-        </w:rPr>
-        <w:t>#linear</w:t>
-      </w:r>
-    </w:p>
-    <w:p>
-      <w:pPr>
-        <w:spacing w:after="0"/>
-      </w:pPr>
-      <w:r>
-        <w:rPr>
-          <w:highlight w:val="yellow"/>
-        </w:rPr>
-        <w:t>mariangeles_scene_</w:t>
-      </w:r>
-      <w:proofErr w:type="gramStart"/>
-      <w:r>
-        <w:rPr>
-          <w:highlight w:val="yellow"/>
-        </w:rPr>
-        <w:t>end ;</w:t>
-      </w:r>
-      <w:proofErr w:type="gramEnd"/>
-      <w:r>
-        <w:rPr>
-          <w:highlight w:val="yellow"/>
-        </w:rPr>
-        <w:t xml:space="preserve"> the_x_exam</w:t>
+        <w:t>mariangeles_scene_end ; the_x_exam</w:t>
       </w:r>
     </w:p>
     <w:p/>
@@ -11590,21 +11428,7 @@
         <w:rPr>
           <w:highlight w:val="yellow"/>
         </w:rPr>
-        <w:t>stefannie_scene_</w:t>
-      </w:r>
-      <w:proofErr w:type="gramStart"/>
-      <w:r>
-        <w:rPr>
-          <w:highlight w:val="yellow"/>
-        </w:rPr>
-        <w:t>end ;</w:t>
-      </w:r>
-      <w:proofErr w:type="gramEnd"/>
-      <w:r>
-        <w:rPr>
-          <w:highlight w:val="yellow"/>
-        </w:rPr>
-        <w:t xml:space="preserve"> the_x_exam</w:t>
+        <w:t>stefannie_scene_end ; the_x_exam</w:t>
       </w:r>
     </w:p>
     <w:p>
@@ -11636,21 +11460,14 @@
         <w:pStyle w:val="Ttulo3"/>
       </w:pPr>
       <w:r>
+        <w:lastRenderedPageBreak/>
         <w:t>Decisión</w:t>
       </w:r>
     </w:p>
     <w:p>
       <w:r>
         <w:tab/>
-        <w:t xml:space="preserve">La decisión es la mecánica principal de la mayoría de </w:t>
-      </w:r>
-      <w:proofErr w:type="gramStart"/>
-      <w:r>
-        <w:t>novelas</w:t>
-      </w:r>
-      <w:proofErr w:type="gramEnd"/>
-      <w:r>
-        <w:t xml:space="preserve"> visuales, este consiste en plasmar ante el jugador una situación en la que deba tomar una decisión. Con las decisiones podemos dividir la historia en caminos distintos y además Atlax Renpy nos permitirá agregar un sistema de puntos. Sintaxis.</w:t>
+        <w:t>La decisión es la mecánica principal de la mayoría de novelas visuales, este consiste en plasmar ante el jugador una situación en la que deba tomar una decisión. Con las decisiones podemos dividir la historia en caminos distintos y además Atlax Renpy nos permitirá agregar un sistema de puntos. Sintaxis.</w:t>
       </w:r>
     </w:p>
     <w:p>
@@ -11676,238 +11493,69 @@
           <w:sz w:val="22"/>
           <w:szCs w:val="22"/>
         </w:rPr>
-        <w:t>key_opcion_</w:t>
-      </w:r>
-      <w:proofErr w:type="gramStart"/>
+        <w:t>key_opcion_1 ; punto_1 : valor_punto_1 ; siguiente escena</w:t>
+      </w:r>
       <w:r>
         <w:rPr>
           <w:sz w:val="22"/>
           <w:szCs w:val="22"/>
         </w:rPr>
-        <w:t>1 ;</w:t>
-      </w:r>
-      <w:proofErr w:type="gramEnd"/>
+        <w:t xml:space="preserve"> ;</w:t>
+      </w:r>
       <w:r>
         <w:rPr>
           <w:sz w:val="22"/>
           <w:szCs w:val="22"/>
         </w:rPr>
-        <w:t xml:space="preserve"> punto_</w:t>
-      </w:r>
-      <w:proofErr w:type="gramStart"/>
-      <w:r>
+        <w:t>texto</w:t>
+      </w:r>
+    </w:p>
+    <w:p>
+      <w:pPr>
+        <w:spacing w:after="0"/>
+        <w:ind w:firstLine="708"/>
         <w:rPr>
           <w:sz w:val="22"/>
           <w:szCs w:val="22"/>
         </w:rPr>
-        <w:t>1 :</w:t>
-      </w:r>
-      <w:proofErr w:type="gramEnd"/>
+      </w:pPr>
       <w:r>
         <w:rPr>
           <w:sz w:val="22"/>
           <w:szCs w:val="22"/>
         </w:rPr>
-        <w:t xml:space="preserve"> valor_punto_</w:t>
-      </w:r>
-      <w:proofErr w:type="gramStart"/>
+        <w:t>key_opcion_2 ;; siguiente escena</w:t>
+      </w:r>
       <w:r>
         <w:rPr>
           <w:sz w:val="22"/>
           <w:szCs w:val="22"/>
         </w:rPr>
-        <w:t>1 ;</w:t>
-      </w:r>
-      <w:proofErr w:type="gramEnd"/>
-      <w:r>
+        <w:t xml:space="preserve"> ; texto</w:t>
+      </w:r>
+    </w:p>
+    <w:p>
+      <w:pPr>
+        <w:spacing w:after="0"/>
+        <w:ind w:firstLine="708"/>
         <w:rPr>
           <w:sz w:val="22"/>
           <w:szCs w:val="22"/>
         </w:rPr>
-        <w:t xml:space="preserve"> siguiente </w:t>
-      </w:r>
-      <w:proofErr w:type="gramStart"/>
+      </w:pPr>
       <w:r>
         <w:rPr>
           <w:sz w:val="22"/>
           <w:szCs w:val="22"/>
         </w:rPr>
-        <w:t>escena</w:t>
+        <w:t xml:space="preserve">key_opcion_3 ; punto1:valor_punto1, punto2:valor_punto2 ; siguiente escena </w:t>
       </w:r>
       <w:r>
         <w:rPr>
           <w:sz w:val="22"/>
           <w:szCs w:val="22"/>
         </w:rPr>
-        <w:t xml:space="preserve"> ;</w:t>
-      </w:r>
-      <w:r>
-        <w:rPr>
-          <w:sz w:val="22"/>
-          <w:szCs w:val="22"/>
-        </w:rPr>
-        <w:t>texto</w:t>
-      </w:r>
-      <w:proofErr w:type="gramEnd"/>
-    </w:p>
-    <w:p>
-      <w:pPr>
-        <w:spacing w:after="0"/>
-        <w:ind w:firstLine="708"/>
-        <w:rPr>
-          <w:sz w:val="22"/>
-          <w:szCs w:val="22"/>
-        </w:rPr>
-      </w:pPr>
-      <w:r>
-        <w:rPr>
-          <w:sz w:val="22"/>
-          <w:szCs w:val="22"/>
-        </w:rPr>
-        <w:t>key_opcion_</w:t>
-      </w:r>
-      <w:proofErr w:type="gramStart"/>
-      <w:r>
-        <w:rPr>
-          <w:sz w:val="22"/>
-          <w:szCs w:val="22"/>
-        </w:rPr>
-        <w:t>2 ;</w:t>
-      </w:r>
-      <w:proofErr w:type="gramEnd"/>
-      <w:r>
-        <w:rPr>
-          <w:sz w:val="22"/>
-          <w:szCs w:val="22"/>
-        </w:rPr>
-        <w:t xml:space="preserve">; siguiente </w:t>
-      </w:r>
-      <w:proofErr w:type="gramStart"/>
-      <w:r>
-        <w:rPr>
-          <w:sz w:val="22"/>
-          <w:szCs w:val="22"/>
-        </w:rPr>
-        <w:t>escena</w:t>
-      </w:r>
-      <w:r>
-        <w:rPr>
-          <w:sz w:val="22"/>
-          <w:szCs w:val="22"/>
-        </w:rPr>
-        <w:t xml:space="preserve"> ;</w:t>
-      </w:r>
-      <w:proofErr w:type="gramEnd"/>
-      <w:r>
-        <w:rPr>
-          <w:sz w:val="22"/>
-          <w:szCs w:val="22"/>
-        </w:rPr>
-        <w:t xml:space="preserve"> texto</w:t>
-      </w:r>
-    </w:p>
-    <w:p>
-      <w:pPr>
-        <w:spacing w:after="0"/>
-        <w:ind w:firstLine="708"/>
-        <w:rPr>
-          <w:sz w:val="22"/>
-          <w:szCs w:val="22"/>
-        </w:rPr>
-      </w:pPr>
-      <w:r>
-        <w:rPr>
-          <w:sz w:val="22"/>
-          <w:szCs w:val="22"/>
-        </w:rPr>
-        <w:t>key_opcion_</w:t>
-      </w:r>
-      <w:proofErr w:type="gramStart"/>
-      <w:r>
-        <w:rPr>
-          <w:sz w:val="22"/>
-          <w:szCs w:val="22"/>
-        </w:rPr>
-        <w:t>3 ;</w:t>
-      </w:r>
-      <w:proofErr w:type="gramEnd"/>
-      <w:r>
-        <w:rPr>
-          <w:sz w:val="22"/>
-          <w:szCs w:val="22"/>
-        </w:rPr>
-        <w:t xml:space="preserve"> punto</w:t>
-      </w:r>
-      <w:proofErr w:type="gramStart"/>
-      <w:r>
-        <w:rPr>
-          <w:sz w:val="22"/>
-          <w:szCs w:val="22"/>
-        </w:rPr>
-        <w:t>1:valor</w:t>
-      </w:r>
-      <w:proofErr w:type="gramEnd"/>
-      <w:r>
-        <w:rPr>
-          <w:sz w:val="22"/>
-          <w:szCs w:val="22"/>
-        </w:rPr>
-        <w:t>_punto1, punto</w:t>
-      </w:r>
-      <w:proofErr w:type="gramStart"/>
-      <w:r>
-        <w:rPr>
-          <w:sz w:val="22"/>
-          <w:szCs w:val="22"/>
-        </w:rPr>
-        <w:t>2:valor</w:t>
-      </w:r>
-      <w:proofErr w:type="gramEnd"/>
-      <w:r>
-        <w:rPr>
-          <w:sz w:val="22"/>
-          <w:szCs w:val="22"/>
-        </w:rPr>
-        <w:t>_punto</w:t>
-      </w:r>
-      <w:proofErr w:type="gramStart"/>
-      <w:r>
-        <w:rPr>
-          <w:sz w:val="22"/>
-          <w:szCs w:val="22"/>
-        </w:rPr>
-        <w:t>2 ;</w:t>
-      </w:r>
-      <w:proofErr w:type="gramEnd"/>
-      <w:r>
-        <w:rPr>
-          <w:sz w:val="22"/>
-          <w:szCs w:val="22"/>
-        </w:rPr>
-        <w:t xml:space="preserve"> siguiente </w:t>
-      </w:r>
-      <w:proofErr w:type="gramStart"/>
-      <w:r>
-        <w:rPr>
-          <w:sz w:val="22"/>
-          <w:szCs w:val="22"/>
-        </w:rPr>
-        <w:t xml:space="preserve">escena </w:t>
-      </w:r>
-      <w:r>
-        <w:rPr>
-          <w:sz w:val="22"/>
-          <w:szCs w:val="22"/>
-        </w:rPr>
-        <w:t>;</w:t>
-      </w:r>
-      <w:proofErr w:type="gramEnd"/>
-      <w:r>
-        <w:rPr>
-          <w:sz w:val="22"/>
-          <w:szCs w:val="22"/>
-        </w:rPr>
-        <w:t xml:space="preserve"> texto</w:t>
+        <w:t>; texto</w:t>
       </w:r>
     </w:p>
     <w:p>
@@ -11958,7 +11606,7 @@
                     <pic:cNvPicPr/>
                   </pic:nvPicPr>
                   <pic:blipFill>
-                    <a:blip r:embed="rId35"/>
+                    <a:blip r:embed="rId42"/>
                     <a:stretch>
                       <a:fillRect/>
                     </a:stretch>
@@ -12003,7 +11651,7 @@
                     <pic:cNvPicPr/>
                   </pic:nvPicPr>
                   <pic:blipFill>
-                    <a:blip r:embed="rId36"/>
+                    <a:blip r:embed="rId43"/>
                     <a:stretch>
                       <a:fillRect/>
                     </a:stretch>
@@ -12027,15 +11675,7 @@
     <w:p>
       <w:r>
         <w:tab/>
-        <w:t xml:space="preserve">Como se dijo anteriormente, también se pueden modificar los puntos, estos puntos pueden llevar el nombre que se desee, el único detalle es que debes asegurarte de escribirlo bien </w:t>
-      </w:r>
-      <w:proofErr w:type="gramStart"/>
-      <w:r>
-        <w:t>ya que</w:t>
-      </w:r>
-      <w:proofErr w:type="gramEnd"/>
-      <w:r>
-        <w:t xml:space="preserve"> si lo escribes mal, el motor lo interpretará como un punto distinto.</w:t>
+        <w:t>Como se dijo anteriormente, también se pueden modificar los puntos, estos puntos pueden llevar el nombre que se desee, el único detalle es que debes asegurarte de escribirlo bien ya que si lo escribes mal, el motor lo interpretará como un punto distinto.</w:t>
       </w:r>
     </w:p>
     <w:p>
@@ -12063,7 +11703,7 @@
                     <pic:cNvPicPr/>
                   </pic:nvPicPr>
                   <pic:blipFill>
-                    <a:blip r:embed="rId37"/>
+                    <a:blip r:embed="rId44"/>
                     <a:stretch>
                       <a:fillRect/>
                     </a:stretch>
@@ -12127,33 +11767,53 @@
         <w:rPr>
           <w:highlight w:val="yellow"/>
         </w:rPr>
-        <w:t>give_</w:t>
-      </w:r>
-      <w:proofErr w:type="gramStart"/>
+        <w:t>give_sushi ; ; scene_B</w:t>
+      </w:r>
       <w:r>
         <w:rPr>
           <w:highlight w:val="yellow"/>
         </w:rPr>
-        <w:t>sushi ;</w:t>
-      </w:r>
-      <w:proofErr w:type="gramEnd"/>
+        <w:t xml:space="preserve"> </w:t>
+      </w:r>
       <w:r>
         <w:rPr>
           <w:highlight w:val="yellow"/>
         </w:rPr>
-        <w:t xml:space="preserve"> ; scene_</w:t>
-      </w:r>
-      <w:proofErr w:type="gramStart"/>
+        <w:t>;</w:t>
+      </w:r>
       <w:r>
         <w:rPr>
           <w:highlight w:val="yellow"/>
         </w:rPr>
-        <w:t>B</w:t>
+        <w:t xml:space="preserve"> </w:t>
       </w:r>
       <w:r>
         <w:rPr>
           <w:highlight w:val="yellow"/>
         </w:rPr>
+        <w:t>Sushi</w:t>
+      </w:r>
+    </w:p>
+    <w:p>
+      <w:pPr>
+        <w:spacing w:after="0"/>
+        <w:rPr>
+          <w:highlight w:val="yellow"/>
+        </w:rPr>
+      </w:pPr>
+      <w:r>
+        <w:tab/>
+      </w:r>
+      <w:r>
+        <w:rPr>
+          <w:highlight w:val="yellow"/>
+        </w:rPr>
+        <w:t>give_salad ; amistad : -1 ; scene_C</w:t>
+      </w:r>
+      <w:r>
+        <w:rPr>
+          <w:highlight w:val="yellow"/>
+        </w:rPr>
         <w:t xml:space="preserve"> </w:t>
       </w:r>
       <w:r>
@@ -12162,7 +11822,6 @@
         </w:rPr>
         <w:t>;</w:t>
       </w:r>
-      <w:proofErr w:type="gramEnd"/>
       <w:r>
         <w:rPr>
           <w:highlight w:val="yellow"/>
@@ -12173,175 +11832,34 @@
         <w:rPr>
           <w:highlight w:val="yellow"/>
         </w:rPr>
-        <w:t>Sushi</w:t>
+        <w:t>Ensalada</w:t>
       </w:r>
     </w:p>
     <w:p>
       <w:pPr>
         <w:spacing w:after="0"/>
+      </w:pPr>
+      <w:r>
+        <w:tab/>
+      </w:r>
+      <w:r>
         <w:rPr>
           <w:highlight w:val="yellow"/>
         </w:rPr>
-      </w:pPr>
-      <w:r>
-        <w:tab/>
+        <w:t>give_beef ; amistad : 1 ; scene_D</w:t>
       </w:r>
       <w:r>
         <w:rPr>
           <w:highlight w:val="yellow"/>
         </w:rPr>
-        <w:t>give_</w:t>
-      </w:r>
-      <w:proofErr w:type="gramStart"/>
+        <w:t xml:space="preserve"> </w:t>
+      </w:r>
       <w:r>
         <w:rPr>
           <w:highlight w:val="yellow"/>
         </w:rPr>
-        <w:t>salad ;</w:t>
-      </w:r>
-      <w:proofErr w:type="gramEnd"/>
-      <w:r>
-        <w:rPr>
-          <w:highlight w:val="yellow"/>
-        </w:rPr>
-        <w:t xml:space="preserve"> </w:t>
-      </w:r>
-      <w:proofErr w:type="gramStart"/>
-      <w:r>
-        <w:rPr>
-          <w:highlight w:val="yellow"/>
-        </w:rPr>
-        <w:t>amistad :</w:t>
-      </w:r>
-      <w:proofErr w:type="gramEnd"/>
-      <w:r>
-        <w:rPr>
-          <w:highlight w:val="yellow"/>
-        </w:rPr>
-        <w:t xml:space="preserve"> -</w:t>
-      </w:r>
-      <w:proofErr w:type="gramStart"/>
-      <w:r>
-        <w:rPr>
-          <w:highlight w:val="yellow"/>
-        </w:rPr>
-        <w:t>1 ;</w:t>
-      </w:r>
-      <w:proofErr w:type="gramEnd"/>
-      <w:r>
-        <w:rPr>
-          <w:highlight w:val="yellow"/>
-        </w:rPr>
-        <w:t xml:space="preserve"> scene_</w:t>
-      </w:r>
-      <w:proofErr w:type="gramStart"/>
-      <w:r>
-        <w:rPr>
-          <w:highlight w:val="yellow"/>
-        </w:rPr>
-        <w:t>C</w:t>
-      </w:r>
-      <w:r>
-        <w:rPr>
-          <w:highlight w:val="yellow"/>
-        </w:rPr>
-        <w:t xml:space="preserve"> </w:t>
-      </w:r>
-      <w:r>
-        <w:rPr>
-          <w:highlight w:val="yellow"/>
-        </w:rPr>
         <w:t>;</w:t>
       </w:r>
-      <w:proofErr w:type="gramEnd"/>
-      <w:r>
-        <w:rPr>
-          <w:highlight w:val="yellow"/>
-        </w:rPr>
-        <w:t xml:space="preserve"> </w:t>
-      </w:r>
-      <w:r>
-        <w:rPr>
-          <w:highlight w:val="yellow"/>
-        </w:rPr>
-        <w:t>Ensalada</w:t>
-      </w:r>
-    </w:p>
-    <w:p>
-      <w:pPr>
-        <w:spacing w:after="0"/>
-      </w:pPr>
-      <w:r>
-        <w:tab/>
-      </w:r>
-      <w:r>
-        <w:rPr>
-          <w:highlight w:val="yellow"/>
-        </w:rPr>
-        <w:t>give_</w:t>
-      </w:r>
-      <w:proofErr w:type="gramStart"/>
-      <w:r>
-        <w:rPr>
-          <w:highlight w:val="yellow"/>
-        </w:rPr>
-        <w:t>beef ;</w:t>
-      </w:r>
-      <w:proofErr w:type="gramEnd"/>
-      <w:r>
-        <w:rPr>
-          <w:highlight w:val="yellow"/>
-        </w:rPr>
-        <w:t xml:space="preserve"> </w:t>
-      </w:r>
-      <w:proofErr w:type="gramStart"/>
-      <w:r>
-        <w:rPr>
-          <w:highlight w:val="yellow"/>
-        </w:rPr>
-        <w:t>amistad :</w:t>
-      </w:r>
-      <w:proofErr w:type="gramEnd"/>
-      <w:r>
-        <w:rPr>
-          <w:highlight w:val="yellow"/>
-        </w:rPr>
-        <w:t xml:space="preserve"> </w:t>
-      </w:r>
-      <w:proofErr w:type="gramStart"/>
-      <w:r>
-        <w:rPr>
-          <w:highlight w:val="yellow"/>
-        </w:rPr>
-        <w:t>1 ;</w:t>
-      </w:r>
-      <w:proofErr w:type="gramEnd"/>
-      <w:r>
-        <w:rPr>
-          <w:highlight w:val="yellow"/>
-        </w:rPr>
-        <w:t xml:space="preserve"> scene_</w:t>
-      </w:r>
-      <w:proofErr w:type="gramStart"/>
-      <w:r>
-        <w:rPr>
-          <w:highlight w:val="yellow"/>
-        </w:rPr>
-        <w:t>D</w:t>
-      </w:r>
-      <w:r>
-        <w:rPr>
-          <w:highlight w:val="yellow"/>
-        </w:rPr>
-        <w:t xml:space="preserve"> </w:t>
-      </w:r>
-      <w:r>
-        <w:rPr>
-          <w:highlight w:val="yellow"/>
-        </w:rPr>
-        <w:t>;</w:t>
-      </w:r>
-      <w:proofErr w:type="gramEnd"/>
       <w:r>
         <w:rPr>
           <w:highlight w:val="yellow"/>
@@ -12376,15 +11894,7 @@
         <w:t>consecuencias</w:t>
       </w:r>
       <w:r>
-        <w:t xml:space="preserve">, </w:t>
-      </w:r>
-      <w:proofErr w:type="gramStart"/>
-      <w:r>
-        <w:t>este caso son</w:t>
-      </w:r>
-      <w:proofErr w:type="gramEnd"/>
-      <w:r>
-        <w:t xml:space="preserve"> “give_sushi”, “give_salad” y “give_beef”, estos identificadores jamás deben repetirse, o al menos, en la</w:t>
+        <w:t>, este caso son “give_sushi”, “give_salad” y “give_beef”, estos identificadores jamás deben repetirse, o al menos, en la</w:t>
       </w:r>
       <w:r>
         <w:t xml:space="preserve"> misma</w:t>
@@ -12419,15 +11929,7 @@
         <w:t>diálogos</w:t>
       </w:r>
       <w:r>
-        <w:t xml:space="preserve">, para agregar nuevos textos dependiendo del idioma, debemos seguir </w:t>
-      </w:r>
-      <w:proofErr w:type="gramStart"/>
-      <w:r>
-        <w:t>agregando ;</w:t>
-      </w:r>
-      <w:proofErr w:type="gramEnd"/>
-      <w:r>
-        <w:t xml:space="preserve"> y añadiendo los textos correspondientes al idioma.</w:t>
+        <w:t>, para agregar nuevos textos dependiendo del idioma, debemos seguir agregando ; y añadiendo los textos correspondientes al idioma.</w:t>
       </w:r>
     </w:p>
     <w:p>
@@ -12456,15 +11958,7 @@
         <w:t>y por decisión.</w:t>
       </w:r>
       <w:r>
-        <w:t xml:space="preserve"> Para estas condiciones se debe tener especial control sobre los valores posibles de los </w:t>
-      </w:r>
-      <w:proofErr w:type="gramStart"/>
-      <w:r>
-        <w:t>puntos</w:t>
-      </w:r>
-      <w:proofErr w:type="gramEnd"/>
-      <w:r>
-        <w:t xml:space="preserve"> así como los posibles diálogos y escenas pasadas, esto para saber si de verdad las condiciones que estás escribiendo se pueden cumplir. </w:t>
+        <w:t xml:space="preserve"> Para estas condiciones se debe tener especial control sobre los valores posibles de los puntos así como los posibles diálogos y escenas pasadas, esto para saber si de verdad las condiciones que estás escribiendo se pueden cumplir. </w:t>
       </w:r>
     </w:p>
     <w:p>
@@ -12508,7 +12002,7 @@
                     <pic:cNvPicPr/>
                   </pic:nvPicPr>
                   <pic:blipFill>
-                    <a:blip r:embed="rId38"/>
+                    <a:blip r:embed="rId45"/>
                     <a:stretch>
                       <a:fillRect/>
                     </a:stretch>
@@ -12554,63 +12048,21 @@
         <w:rPr>
           <w:highlight w:val="yellow"/>
         </w:rPr>
-        <w:t>exam_positive_</w:t>
-      </w:r>
-      <w:proofErr w:type="gramStart"/>
+        <w:t>exam_positive_grade ; calificación &gt; 10 ; aprobado</w:t>
+      </w:r>
+    </w:p>
+    <w:p>
+      <w:pPr>
+        <w:spacing w:after="0"/>
+      </w:pPr>
+      <w:r>
+        <w:tab/>
+      </w:r>
       <w:r>
         <w:rPr>
           <w:highlight w:val="yellow"/>
         </w:rPr>
-        <w:t>grade ;</w:t>
-      </w:r>
-      <w:proofErr w:type="gramEnd"/>
-      <w:r>
-        <w:rPr>
-          <w:highlight w:val="yellow"/>
-        </w:rPr>
-        <w:t xml:space="preserve"> calificación &gt; </w:t>
-      </w:r>
-      <w:proofErr w:type="gramStart"/>
-      <w:r>
-        <w:rPr>
-          <w:highlight w:val="yellow"/>
-        </w:rPr>
-        <w:t>10 ;</w:t>
-      </w:r>
-      <w:proofErr w:type="gramEnd"/>
-      <w:r>
-        <w:rPr>
-          <w:highlight w:val="yellow"/>
-        </w:rPr>
-        <w:t xml:space="preserve"> aprobado</w:t>
-      </w:r>
-    </w:p>
-    <w:p>
-      <w:pPr>
-        <w:spacing w:after="0"/>
-      </w:pPr>
-      <w:r>
-        <w:tab/>
-      </w:r>
-      <w:r>
-        <w:rPr>
-          <w:highlight w:val="yellow"/>
-        </w:rPr>
-        <w:t>exam_negative_</w:t>
-      </w:r>
-      <w:proofErr w:type="gramStart"/>
-      <w:r>
-        <w:rPr>
-          <w:highlight w:val="yellow"/>
-        </w:rPr>
-        <w:t>grade ;</w:t>
-      </w:r>
-      <w:proofErr w:type="gramEnd"/>
-      <w:r>
-        <w:rPr>
-          <w:highlight w:val="yellow"/>
-        </w:rPr>
-        <w:t xml:space="preserve"> ; reprobado</w:t>
+        <w:t>exam_negative_grade ; ; reprobado</w:t>
       </w:r>
     </w:p>
     <w:p>
@@ -12692,15 +12144,7 @@
         <w:ind w:firstLine="708"/>
       </w:pPr>
       <w:r>
-        <w:t xml:space="preserve">Como Atlax Renpy verifica todas las condiciones y si ninguna se cumple toma la última por defecto, no hace falta colocar condición en la última opción, </w:t>
-      </w:r>
-      <w:proofErr w:type="gramStart"/>
-      <w:r>
-        <w:t>ya que</w:t>
-      </w:r>
-      <w:proofErr w:type="gramEnd"/>
-      <w:r>
-        <w:t xml:space="preserve"> si no se cumple una, irá a la otra.</w:t>
+        <w:t>Como Atlax Renpy verifica todas las condiciones y si ninguna se cumple toma la última por defecto, no hace falta colocar condición en la última opción, ya que si no se cumple una, irá a la otra.</w:t>
       </w:r>
     </w:p>
     <w:p>
@@ -12735,35 +12179,7 @@
         <w:rPr>
           <w:highlight w:val="yellow"/>
         </w:rPr>
-        <w:t>Katherine_route_good_</w:t>
-      </w:r>
-      <w:proofErr w:type="gramStart"/>
-      <w:r>
-        <w:rPr>
-          <w:highlight w:val="yellow"/>
-        </w:rPr>
-        <w:t>end ;</w:t>
-      </w:r>
-      <w:proofErr w:type="gramEnd"/>
-      <w:r>
-        <w:rPr>
-          <w:highlight w:val="yellow"/>
-        </w:rPr>
-        <w:t xml:space="preserve"> amistad &gt; 18, calificación &gt; </w:t>
-      </w:r>
-      <w:proofErr w:type="gramStart"/>
-      <w:r>
-        <w:rPr>
-          <w:highlight w:val="yellow"/>
-        </w:rPr>
-        <w:t>10 ;</w:t>
-      </w:r>
-      <w:proofErr w:type="gramEnd"/>
-      <w:r>
-        <w:rPr>
-          <w:highlight w:val="yellow"/>
-        </w:rPr>
-        <w:t xml:space="preserve"> final_bueno</w:t>
+        <w:t>Katherine_route_good_end ; amistad &gt; 18, calificación &gt; 10 ; final_bueno</w:t>
       </w:r>
     </w:p>
     <w:p>
@@ -12790,59 +12206,31 @@
         <w:rPr>
           <w:highlight w:val="yellow"/>
         </w:rPr>
-        <w:t>_</w:t>
-      </w:r>
-      <w:proofErr w:type="gramStart"/>
+        <w:t xml:space="preserve">_end ; amistad &gt; </w:t>
+      </w:r>
       <w:r>
         <w:rPr>
           <w:highlight w:val="yellow"/>
         </w:rPr>
-        <w:t>end ;</w:t>
-      </w:r>
-      <w:proofErr w:type="gramEnd"/>
+        <w:t>12</w:t>
+      </w:r>
       <w:r>
         <w:rPr>
           <w:highlight w:val="yellow"/>
         </w:rPr>
-        <w:t xml:space="preserve"> amistad &gt; </w:t>
+        <w:t xml:space="preserve">, </w:t>
       </w:r>
       <w:r>
         <w:rPr>
           <w:highlight w:val="yellow"/>
         </w:rPr>
-        <w:t>12</w:t>
+        <w:t>calificación &gt; 5</w:t>
       </w:r>
       <w:r>
         <w:rPr>
           <w:highlight w:val="yellow"/>
         </w:rPr>
-        <w:t xml:space="preserve">, </w:t>
-      </w:r>
-      <w:r>
-        <w:rPr>
-          <w:highlight w:val="yellow"/>
-        </w:rPr>
-        <w:t xml:space="preserve">calificación &gt; </w:t>
-      </w:r>
-      <w:proofErr w:type="gramStart"/>
-      <w:r>
-        <w:rPr>
-          <w:highlight w:val="yellow"/>
-        </w:rPr>
-        <w:t>5</w:t>
-      </w:r>
-      <w:r>
-        <w:rPr>
-          <w:highlight w:val="yellow"/>
-        </w:rPr>
-        <w:t xml:space="preserve"> ;</w:t>
-      </w:r>
-      <w:proofErr w:type="gramEnd"/>
-      <w:r>
-        <w:rPr>
-          <w:highlight w:val="yellow"/>
-        </w:rPr>
-        <w:t xml:space="preserve"> final_</w:t>
+        <w:t xml:space="preserve"> ; final_</w:t>
       </w:r>
       <w:r>
         <w:rPr>
@@ -12860,21 +12248,7 @@
         <w:rPr>
           <w:highlight w:val="yellow"/>
         </w:rPr>
-        <w:t>Katherine_route_bad_</w:t>
-      </w:r>
-      <w:proofErr w:type="gramStart"/>
-      <w:r>
-        <w:rPr>
-          <w:highlight w:val="yellow"/>
-        </w:rPr>
-        <w:t>end ;</w:t>
-      </w:r>
-      <w:proofErr w:type="gramEnd"/>
-      <w:r>
-        <w:rPr>
-          <w:highlight w:val="yellow"/>
-        </w:rPr>
-        <w:t xml:space="preserve"> ; final_malo</w:t>
+        <w:t>Katherine_route_bad_end ; ; final_malo</w:t>
       </w:r>
     </w:p>
     <w:p>
@@ -12923,7 +12297,7 @@
                     <pic:cNvPicPr/>
                   </pic:nvPicPr>
                   <pic:blipFill>
-                    <a:blip r:embed="rId39"/>
+                    <a:blip r:embed="rId46"/>
                     <a:stretch>
                       <a:fillRect/>
                     </a:stretch>
@@ -12969,77 +12343,21 @@
         <w:rPr>
           <w:highlight w:val="yellow"/>
         </w:rPr>
-        <w:t>sushi_</w:t>
-      </w:r>
-      <w:proofErr w:type="gramStart"/>
+        <w:t>sushi_gived ; give_sushi ; escena_B</w:t>
+      </w:r>
+    </w:p>
+    <w:p>
+      <w:pPr>
+        <w:spacing w:after="0"/>
+      </w:pPr>
+      <w:r>
+        <w:tab/>
+      </w:r>
       <w:r>
         <w:rPr>
           <w:highlight w:val="yellow"/>
         </w:rPr>
-        <w:t>gived ;</w:t>
-      </w:r>
-      <w:proofErr w:type="gramEnd"/>
-      <w:r>
-        <w:rPr>
-          <w:highlight w:val="yellow"/>
-        </w:rPr>
-        <w:t xml:space="preserve"> give_</w:t>
-      </w:r>
-      <w:proofErr w:type="gramStart"/>
-      <w:r>
-        <w:rPr>
-          <w:highlight w:val="yellow"/>
-        </w:rPr>
-        <w:t>sushi ;</w:t>
-      </w:r>
-      <w:proofErr w:type="gramEnd"/>
-      <w:r>
-        <w:rPr>
-          <w:highlight w:val="yellow"/>
-        </w:rPr>
-        <w:t xml:space="preserve"> escena_B</w:t>
-      </w:r>
-    </w:p>
-    <w:p>
-      <w:pPr>
-        <w:spacing w:after="0"/>
-      </w:pPr>
-      <w:r>
-        <w:tab/>
-      </w:r>
-      <w:r>
-        <w:rPr>
-          <w:highlight w:val="yellow"/>
-        </w:rPr>
-        <w:t>salad_</w:t>
-      </w:r>
-      <w:proofErr w:type="gramStart"/>
-      <w:r>
-        <w:rPr>
-          <w:highlight w:val="yellow"/>
-        </w:rPr>
-        <w:t>gived ;</w:t>
-      </w:r>
-      <w:proofErr w:type="gramEnd"/>
-      <w:r>
-        <w:rPr>
-          <w:highlight w:val="yellow"/>
-        </w:rPr>
-        <w:t xml:space="preserve"> give_</w:t>
-      </w:r>
-      <w:proofErr w:type="gramStart"/>
-      <w:r>
-        <w:rPr>
-          <w:highlight w:val="yellow"/>
-        </w:rPr>
-        <w:t>salad ;</w:t>
-      </w:r>
-      <w:proofErr w:type="gramEnd"/>
-      <w:r>
-        <w:rPr>
-          <w:highlight w:val="yellow"/>
-        </w:rPr>
-        <w:t xml:space="preserve"> escena_C</w:t>
+        <w:t>salad_gived ; give_salad ; escena_C</w:t>
       </w:r>
     </w:p>
     <w:p>
@@ -13051,35 +12369,7 @@
         <w:rPr>
           <w:highlight w:val="yellow"/>
         </w:rPr>
-        <w:t>beef_</w:t>
-      </w:r>
-      <w:proofErr w:type="gramStart"/>
-      <w:r>
-        <w:rPr>
-          <w:highlight w:val="yellow"/>
-        </w:rPr>
-        <w:t>gived ;</w:t>
-      </w:r>
-      <w:proofErr w:type="gramEnd"/>
-      <w:r>
-        <w:rPr>
-          <w:highlight w:val="yellow"/>
-        </w:rPr>
-        <w:t xml:space="preserve"> give_</w:t>
-      </w:r>
-      <w:proofErr w:type="gramStart"/>
-      <w:r>
-        <w:rPr>
-          <w:highlight w:val="yellow"/>
-        </w:rPr>
-        <w:t>beef ;</w:t>
-      </w:r>
-      <w:proofErr w:type="gramEnd"/>
-      <w:r>
-        <w:rPr>
-          <w:highlight w:val="yellow"/>
-        </w:rPr>
-        <w:t xml:space="preserve"> escena_D</w:t>
+        <w:t>beef_gived ; give_beef ; escena_D</w:t>
       </w:r>
     </w:p>
     <w:p>
@@ -13198,7 +12488,7 @@
                     <pic:cNvPicPr/>
                   </pic:nvPicPr>
                   <pic:blipFill>
-                    <a:blip r:embed="rId40"/>
+                    <a:blip r:embed="rId47"/>
                     <a:stretch>
                       <a:fillRect/>
                     </a:stretch>
@@ -13269,35 +12559,7 @@
         <w:rPr>
           <w:highlight w:val="yellow"/>
         </w:rPr>
-        <w:t>earthquake_lived_in_</w:t>
-      </w:r>
-      <w:proofErr w:type="gramStart"/>
-      <w:r>
-        <w:rPr>
-          <w:highlight w:val="yellow"/>
-        </w:rPr>
-        <w:t>home ;</w:t>
-      </w:r>
-      <w:proofErr w:type="gramEnd"/>
-      <w:r>
-        <w:rPr>
-          <w:highlight w:val="yellow"/>
-        </w:rPr>
-        <w:t xml:space="preserve"> earthquake_in_</w:t>
-      </w:r>
-      <w:proofErr w:type="gramStart"/>
-      <w:r>
-        <w:rPr>
-          <w:highlight w:val="yellow"/>
-        </w:rPr>
-        <w:t>home ;</w:t>
-      </w:r>
-      <w:proofErr w:type="gramEnd"/>
-      <w:r>
-        <w:rPr>
-          <w:highlight w:val="yellow"/>
-        </w:rPr>
-        <w:t xml:space="preserve"> tell_home_earthquake</w:t>
+        <w:t>earthquake_lived_in_home ; earthquake_in_home ; tell_home_earthquake</w:t>
       </w:r>
     </w:p>
     <w:p>
@@ -13312,92 +12574,42 @@
         <w:rPr>
           <w:highlight w:val="yellow"/>
         </w:rPr>
-        <w:t>earthquake_lived_in_</w:t>
-      </w:r>
-      <w:proofErr w:type="gramStart"/>
+        <w:t>earthquake_lived_in_shop ; earthquake_in_</w:t>
+      </w:r>
       <w:r>
         <w:rPr>
           <w:highlight w:val="yellow"/>
         </w:rPr>
-        <w:t>shop ;</w:t>
-      </w:r>
-      <w:proofErr w:type="gramEnd"/>
+        <w:t>shop</w:t>
+      </w:r>
       <w:r>
         <w:rPr>
           <w:highlight w:val="yellow"/>
         </w:rPr>
-        <w:t xml:space="preserve"> earthquake_in_</w:t>
-      </w:r>
-      <w:proofErr w:type="gramStart"/>
+        <w:t xml:space="preserve"> ; tell_shop_earthquake</w:t>
+      </w:r>
+    </w:p>
+    <w:p>
+      <w:pPr>
+        <w:ind w:firstLine="708"/>
+      </w:pPr>
       <w:r>
         <w:rPr>
           <w:highlight w:val="yellow"/>
         </w:rPr>
-        <w:t>shop</w:t>
+        <w:t>earthquake_lived_in_gym ; earthquake_in</w:t>
       </w:r>
       <w:r>
         <w:rPr>
           <w:highlight w:val="yellow"/>
         </w:rPr>
-        <w:t xml:space="preserve"> ;</w:t>
-      </w:r>
-      <w:proofErr w:type="gramEnd"/>
+        <w:t>_gym</w:t>
+      </w:r>
       <w:r>
         <w:rPr>
           <w:highlight w:val="yellow"/>
         </w:rPr>
-        <w:t xml:space="preserve"> tell_shop_earthquake</w:t>
-      </w:r>
-    </w:p>
-    <w:p>
-      <w:pPr>
-        <w:ind w:firstLine="708"/>
-      </w:pPr>
-      <w:r>
-        <w:rPr>
-          <w:highlight w:val="yellow"/>
-        </w:rPr>
-        <w:t>earthquake_lived_in_</w:t>
-      </w:r>
-      <w:proofErr w:type="gramStart"/>
-      <w:r>
-        <w:rPr>
-          <w:highlight w:val="yellow"/>
-        </w:rPr>
-        <w:t>gym ;</w:t>
-      </w:r>
-      <w:proofErr w:type="gramEnd"/>
-      <w:r>
-        <w:rPr>
-          <w:highlight w:val="yellow"/>
-        </w:rPr>
-        <w:t xml:space="preserve"> earthquake_in</w:t>
-      </w:r>
-      <w:r>
-        <w:rPr>
-          <w:highlight w:val="yellow"/>
-        </w:rPr>
-        <w:t>_</w:t>
-      </w:r>
-      <w:proofErr w:type="gramStart"/>
-      <w:r>
-        <w:rPr>
-          <w:highlight w:val="yellow"/>
-        </w:rPr>
-        <w:t>gym</w:t>
-      </w:r>
-      <w:r>
-        <w:rPr>
-          <w:highlight w:val="yellow"/>
-        </w:rPr>
-        <w:t xml:space="preserve"> ;</w:t>
-      </w:r>
-      <w:proofErr w:type="gramEnd"/>
-      <w:r>
-        <w:rPr>
-          <w:highlight w:val="yellow"/>
-        </w:rPr>
-        <w:t xml:space="preserve"> tell_gym_earthquake</w:t>
+        <w:t xml:space="preserve"> ; tell_gym_earthquake</w:t>
       </w:r>
     </w:p>
     <w:p>
@@ -13445,21 +12657,8 @@
     <w:p>
       <w:r>
         <w:tab/>
-        <w:t xml:space="preserve">Estas transiciones irán separadas por </w:t>
-      </w:r>
-      <w:proofErr w:type="gramStart"/>
-      <w:r>
-        <w:t>un ;</w:t>
-      </w:r>
-      <w:proofErr w:type="gramEnd"/>
-      <w:r>
-        <w:t xml:space="preserve"> y sus parámetros </w:t>
-      </w:r>
-      <w:proofErr w:type="gramStart"/>
-      <w:r>
-        <w:t>por :</w:t>
-      </w:r>
-      <w:proofErr w:type="gramEnd"/>
+        <w:t>Estas transiciones irán separadas por un ; y sus parámetros por :</w:t>
+      </w:r>
     </w:p>
     <w:p>
       <w:pPr>
@@ -13472,331 +12671,108 @@
         <w:rPr>
           <w:highlight w:val="yellow"/>
         </w:rPr>
-        <w:t>#</w:t>
-      </w:r>
-      <w:proofErr w:type="gramStart"/>
+        <w:t>#decision ; fade : 1 : 3 : 1</w:t>
+      </w:r>
+      <w:r>
+        <w:t xml:space="preserve"> (Hace un fade entre escenas)</w:t>
+      </w:r>
+    </w:p>
+    <w:p>
+      <w:r>
+        <w:tab/>
+      </w:r>
       <w:r>
         <w:rPr>
           <w:highlight w:val="yellow"/>
         </w:rPr>
-        <w:t>decision ;</w:t>
-      </w:r>
-      <w:proofErr w:type="gramEnd"/>
+        <w:t>#linear ; video : nombre_del_video</w:t>
+      </w:r>
+      <w:r>
+        <w:t xml:space="preserve"> (Muestra un video antes de pasar a la siguiente secena)</w:t>
+      </w:r>
+    </w:p>
+    <w:p>
+      <w:r>
+        <w:tab/>
+        <w:t>Si se desea mostrar un video este debe estar en formato .webp.</w:t>
+      </w:r>
+    </w:p>
+    <w:p/>
+    <w:p>
+      <w:pPr>
+        <w:pStyle w:val="Ttulo3"/>
+      </w:pPr>
+      <w:r>
+        <w:t>Limpieza del juego</w:t>
+      </w:r>
+    </w:p>
+    <w:p>
+      <w:r>
+        <w:tab/>
+        <w:t>Por razones de ahorro de recursos es conveniente que de vez en cuando limpiemos nuestra escena, esto lo hacemos añadiendo la opción “clear” al final de un fin de diálogo, este debe ir separado por un ;</w:t>
+      </w:r>
+    </w:p>
+    <w:p>
+      <w:pPr>
+        <w:spacing w:after="0"/>
+      </w:pPr>
+      <w:r>
+        <w:tab/>
+      </w:r>
       <w:r>
         <w:rPr>
           <w:highlight w:val="yellow"/>
         </w:rPr>
-        <w:t xml:space="preserve"> </w:t>
-      </w:r>
-      <w:proofErr w:type="gramStart"/>
+        <w:t xml:space="preserve">#decision ; video ; </w:t>
+      </w:r>
       <w:r>
         <w:rPr>
           <w:highlight w:val="yellow"/>
         </w:rPr>
-        <w:t>fade :</w:t>
-      </w:r>
-      <w:proofErr w:type="gramEnd"/>
+        <w:t>sun_rising ; clear</w:t>
+      </w:r>
+      <w:r>
+        <w:t xml:space="preserve"> (Repro</w:t>
+      </w:r>
+      <w:r>
+        <w:t>d</w:t>
+      </w:r>
+      <w:r>
+        <w:t>uce el video sun_rising y luego limpia el juego)</w:t>
+      </w:r>
+    </w:p>
+    <w:p>
+      <w:pPr>
+        <w:spacing w:after="0"/>
+      </w:pPr>
+      <w:r>
+        <w:tab/>
+      </w:r>
       <w:r>
         <w:rPr>
           <w:highlight w:val="yellow"/>
         </w:rPr>
-        <w:t xml:space="preserve"> </w:t>
-      </w:r>
-      <w:proofErr w:type="gramStart"/>
+        <w:t>#condition scene ; fade : 1 : 2 : 1 ; clear</w:t>
+      </w:r>
+      <w:r>
+        <w:t xml:space="preserve"> (Hace un fa</w:t>
+      </w:r>
+      <w:r>
+        <w:t>d</w:t>
+      </w:r>
+      <w:r>
+        <w:t>e y luego limpia el juego)</w:t>
+      </w:r>
+    </w:p>
+    <w:p>
+      <w:r>
+        <w:tab/>
+      </w:r>
       <w:r>
         <w:rPr>
           <w:highlight w:val="yellow"/>
         </w:rPr>
-        <w:t>1 :</w:t>
-      </w:r>
-      <w:proofErr w:type="gramEnd"/>
-      <w:r>
-        <w:rPr>
-          <w:highlight w:val="yellow"/>
-        </w:rPr>
-        <w:t xml:space="preserve"> </w:t>
-      </w:r>
-      <w:proofErr w:type="gramStart"/>
-      <w:r>
-        <w:rPr>
-          <w:highlight w:val="yellow"/>
-        </w:rPr>
-        <w:t>3 :</w:t>
-      </w:r>
-      <w:proofErr w:type="gramEnd"/>
-      <w:r>
-        <w:rPr>
-          <w:highlight w:val="yellow"/>
-        </w:rPr>
-        <w:t xml:space="preserve"> 1</w:t>
-      </w:r>
-      <w:r>
-        <w:t xml:space="preserve"> (Hace un fade entre escenas)</w:t>
-      </w:r>
-    </w:p>
-    <w:p>
-      <w:r>
-        <w:tab/>
-      </w:r>
-      <w:r>
-        <w:rPr>
-          <w:highlight w:val="yellow"/>
-        </w:rPr>
-        <w:t>#</w:t>
-      </w:r>
-      <w:proofErr w:type="gramStart"/>
-      <w:r>
-        <w:rPr>
-          <w:highlight w:val="yellow"/>
-        </w:rPr>
-        <w:t>linear ;</w:t>
-      </w:r>
-      <w:proofErr w:type="gramEnd"/>
-      <w:r>
-        <w:rPr>
-          <w:highlight w:val="yellow"/>
-        </w:rPr>
-        <w:t xml:space="preserve"> </w:t>
-      </w:r>
-      <w:proofErr w:type="gramStart"/>
-      <w:r>
-        <w:rPr>
-          <w:highlight w:val="yellow"/>
-        </w:rPr>
-        <w:t>video :</w:t>
-      </w:r>
-      <w:proofErr w:type="gramEnd"/>
-      <w:r>
-        <w:rPr>
-          <w:highlight w:val="yellow"/>
-        </w:rPr>
-        <w:t xml:space="preserve"> nombre_del_video</w:t>
-      </w:r>
-      <w:r>
-        <w:t xml:space="preserve"> (Muestra un video antes de pasar a la siguiente secena)</w:t>
-      </w:r>
-    </w:p>
-    <w:p>
-      <w:r>
-        <w:tab/>
-        <w:t xml:space="preserve">Si se desea mostrar un video este debe estar en </w:t>
-      </w:r>
-      <w:proofErr w:type="gramStart"/>
-      <w:r>
-        <w:t>formato .webp</w:t>
-      </w:r>
-      <w:proofErr w:type="gramEnd"/>
-      <w:r>
-        <w:t>.</w:t>
-      </w:r>
-    </w:p>
-    <w:p/>
-    <w:p>
-      <w:pPr>
-        <w:pStyle w:val="Ttulo3"/>
-      </w:pPr>
-      <w:r>
-        <w:t>Limpieza del juego</w:t>
-      </w:r>
-    </w:p>
-    <w:p>
-      <w:r>
-        <w:tab/>
-        <w:t xml:space="preserve">Por razones de ahorro de recursos es conveniente que de vez en cuando limpiemos nuestra escena, esto lo hacemos añadiendo la opción “clear” al final de un fin de diálogo, este debe ir separado por </w:t>
-      </w:r>
-      <w:proofErr w:type="gramStart"/>
-      <w:r>
-        <w:t>un ;</w:t>
-      </w:r>
-      <w:proofErr w:type="gramEnd"/>
-    </w:p>
-    <w:p>
-      <w:pPr>
-        <w:spacing w:after="0"/>
-      </w:pPr>
-      <w:r>
-        <w:tab/>
-      </w:r>
-      <w:r>
-        <w:rPr>
-          <w:highlight w:val="yellow"/>
-        </w:rPr>
-        <w:t>#</w:t>
-      </w:r>
-      <w:proofErr w:type="gramStart"/>
-      <w:r>
-        <w:rPr>
-          <w:highlight w:val="yellow"/>
-        </w:rPr>
-        <w:t>decision ;</w:t>
-      </w:r>
-      <w:proofErr w:type="gramEnd"/>
-      <w:r>
-        <w:rPr>
-          <w:highlight w:val="yellow"/>
-        </w:rPr>
-        <w:t xml:space="preserve"> </w:t>
-      </w:r>
-      <w:proofErr w:type="gramStart"/>
-      <w:r>
-        <w:rPr>
-          <w:highlight w:val="yellow"/>
-        </w:rPr>
-        <w:t>video ;</w:t>
-      </w:r>
-      <w:proofErr w:type="gramEnd"/>
-      <w:r>
-        <w:rPr>
-          <w:highlight w:val="yellow"/>
-        </w:rPr>
-        <w:t xml:space="preserve"> </w:t>
-      </w:r>
-      <w:r>
-        <w:rPr>
-          <w:highlight w:val="yellow"/>
-        </w:rPr>
-        <w:t>sun_</w:t>
-      </w:r>
-      <w:proofErr w:type="gramStart"/>
-      <w:r>
-        <w:rPr>
-          <w:highlight w:val="yellow"/>
-        </w:rPr>
-        <w:t>rising ;</w:t>
-      </w:r>
-      <w:proofErr w:type="gramEnd"/>
-      <w:r>
-        <w:rPr>
-          <w:highlight w:val="yellow"/>
-        </w:rPr>
-        <w:t xml:space="preserve"> clear</w:t>
-      </w:r>
-      <w:r>
-        <w:t xml:space="preserve"> (Repro</w:t>
-      </w:r>
-      <w:r>
-        <w:t>d</w:t>
-      </w:r>
-      <w:r>
-        <w:t>uce el video sun_rising y luego limpia el juego)</w:t>
-      </w:r>
-    </w:p>
-    <w:p>
-      <w:pPr>
-        <w:spacing w:after="0"/>
-      </w:pPr>
-      <w:r>
-        <w:tab/>
-      </w:r>
-      <w:r>
-        <w:rPr>
-          <w:highlight w:val="yellow"/>
-        </w:rPr>
-        <w:t xml:space="preserve">#condition </w:t>
-      </w:r>
-      <w:proofErr w:type="gramStart"/>
-      <w:r>
-        <w:rPr>
-          <w:highlight w:val="yellow"/>
-        </w:rPr>
-        <w:t>scene ;</w:t>
-      </w:r>
-      <w:proofErr w:type="gramEnd"/>
-      <w:r>
-        <w:rPr>
-          <w:highlight w:val="yellow"/>
-        </w:rPr>
-        <w:t xml:space="preserve"> </w:t>
-      </w:r>
-      <w:proofErr w:type="gramStart"/>
-      <w:r>
-        <w:rPr>
-          <w:highlight w:val="yellow"/>
-        </w:rPr>
-        <w:t>fade :</w:t>
-      </w:r>
-      <w:proofErr w:type="gramEnd"/>
-      <w:r>
-        <w:rPr>
-          <w:highlight w:val="yellow"/>
-        </w:rPr>
-        <w:t xml:space="preserve"> </w:t>
-      </w:r>
-      <w:proofErr w:type="gramStart"/>
-      <w:r>
-        <w:rPr>
-          <w:highlight w:val="yellow"/>
-        </w:rPr>
-        <w:t>1 :</w:t>
-      </w:r>
-      <w:proofErr w:type="gramEnd"/>
-      <w:r>
-        <w:rPr>
-          <w:highlight w:val="yellow"/>
-        </w:rPr>
-        <w:t xml:space="preserve"> </w:t>
-      </w:r>
-      <w:proofErr w:type="gramStart"/>
-      <w:r>
-        <w:rPr>
-          <w:highlight w:val="yellow"/>
-        </w:rPr>
-        <w:t>2 :</w:t>
-      </w:r>
-      <w:proofErr w:type="gramEnd"/>
-      <w:r>
-        <w:rPr>
-          <w:highlight w:val="yellow"/>
-        </w:rPr>
-        <w:t xml:space="preserve"> </w:t>
-      </w:r>
-      <w:proofErr w:type="gramStart"/>
-      <w:r>
-        <w:rPr>
-          <w:highlight w:val="yellow"/>
-        </w:rPr>
-        <w:t>1 ;</w:t>
-      </w:r>
-      <w:proofErr w:type="gramEnd"/>
-      <w:r>
-        <w:rPr>
-          <w:highlight w:val="yellow"/>
-        </w:rPr>
-        <w:t xml:space="preserve"> clear</w:t>
-      </w:r>
-      <w:r>
-        <w:t xml:space="preserve"> (Hace un fa</w:t>
-      </w:r>
-      <w:r>
-        <w:t>d</w:t>
-      </w:r>
-      <w:r>
-        <w:t>e y luego limpia el juego)</w:t>
-      </w:r>
-    </w:p>
-    <w:p>
-      <w:r>
-        <w:tab/>
-      </w:r>
-      <w:r>
-        <w:rPr>
-          <w:highlight w:val="yellow"/>
-        </w:rPr>
-        <w:t xml:space="preserve">#condition </w:t>
-      </w:r>
-      <w:proofErr w:type="gramStart"/>
-      <w:r>
-        <w:rPr>
-          <w:highlight w:val="yellow"/>
-        </w:rPr>
-        <w:t>decisión ;</w:t>
-      </w:r>
-      <w:proofErr w:type="gramEnd"/>
-      <w:r>
-        <w:rPr>
-          <w:highlight w:val="yellow"/>
-        </w:rPr>
-        <w:t xml:space="preserve"> ; clear</w:t>
+        <w:t>#condition decisión ; ; clear</w:t>
       </w:r>
       <w:r>
         <w:t xml:space="preserve"> (Limpiando sin hacer una transición)</w:t>
@@ -13919,7 +12895,7 @@
                     <pic:cNvPicPr/>
                   </pic:nvPicPr>
                   <pic:blipFill>
-                    <a:blip r:embed="rId41"/>
+                    <a:blip r:embed="rId48"/>
                     <a:stretch>
                       <a:fillRect/>
                     </a:stretch>
@@ -13949,15 +12925,7 @@
         <w:t xml:space="preserve">Si requireSceneEncryption </w:t>
       </w:r>
       <w:r>
-        <w:t xml:space="preserve">dice True, significa que el motor espera que los archivos de control estén encriptados, por lo </w:t>
-      </w:r>
-      <w:proofErr w:type="gramStart"/>
-      <w:r>
-        <w:t>tanto</w:t>
-      </w:r>
-      <w:proofErr w:type="gramEnd"/>
-      <w:r>
-        <w:t xml:space="preserve"> los desencriptará utilizando el atlax_encryption_key.</w:t>
+        <w:t>dice True, significa que el motor espera que los archivos de control estén encriptados, por lo tanto los desencriptará utilizando el atlax_encryption_key.</w:t>
       </w:r>
     </w:p>
     <w:p>
@@ -13966,18 +12934,10 @@
         <w:t xml:space="preserve">Si </w:t>
       </w:r>
       <w:r>
-        <w:t xml:space="preserve">requireSceneEncryption </w:t>
-      </w:r>
-      <w:proofErr w:type="gramStart"/>
-      <w:r>
-        <w:t>dice</w:t>
-      </w:r>
-      <w:r>
-        <w:t xml:space="preserve">  False</w:t>
-      </w:r>
-      <w:proofErr w:type="gramEnd"/>
-      <w:r>
-        <w:t>, el motor asumirá que los archivos no están encriptados y los leerá tal cual.</w:t>
+        <w:t>requireSceneEncryption dice</w:t>
+      </w:r>
+      <w:r>
+        <w:t xml:space="preserve">  False, el motor asumirá que los archivos no están encriptados y los leerá tal cual.</w:t>
       </w:r>
     </w:p>
     <w:p>
@@ -13994,21 +12954,12 @@
         <w:tab/>
         <w:t xml:space="preserve">Si deseas encriptar tus archivos de control deberás dirigirte a la carpeta </w:t>
       </w:r>
-      <w:proofErr w:type="gramStart"/>
       <w:r>
         <w:rPr>
           <w:i/>
           <w:iCs/>
         </w:rPr>
-        <w:t>apps</w:t>
-      </w:r>
-      <w:proofErr w:type="gramEnd"/>
-      <w:r>
-        <w:rPr>
-          <w:i/>
-          <w:iCs/>
-        </w:rPr>
-        <w:t>/sceneEncrypter</w:t>
+        <w:t>apps/sceneEncrypter</w:t>
       </w:r>
       <w:r>
         <w:t>. Allí encontrarás los siguientes archivos.</w:t>
@@ -14035,7 +12986,7 @@
                     <pic:cNvPicPr/>
                   </pic:nvPicPr>
                   <pic:blipFill>
-                    <a:blip r:embed="rId42"/>
+                    <a:blip r:embed="rId49"/>
                     <a:stretch>
                       <a:fillRect/>
                     </a:stretch>
@@ -14196,15 +13147,7 @@
     <w:p>
       <w:r>
         <w:tab/>
-        <w:t xml:space="preserve">Atlax Renpy no ofrece ninguna herramienta específica para facilitar la fase de testing de tu novela visual, sin </w:t>
-      </w:r>
-      <w:proofErr w:type="gramStart"/>
-      <w:r>
-        <w:t>embargo</w:t>
-      </w:r>
-      <w:proofErr w:type="gramEnd"/>
-      <w:r>
-        <w:t xml:space="preserve"> aquí dejaré algunas estrategias para agilizar el testeo de tus escenas.</w:t>
+        <w:t>Atlax Renpy no ofrece ninguna herramienta específica para facilitar la fase de testing de tu novela visual, sin embargo aquí dejaré algunas estrategias para agilizar el testeo de tus escenas.</w:t>
       </w:r>
     </w:p>
     <w:p>
@@ -14334,7 +13277,7 @@
                     <pic:cNvPicPr/>
                   </pic:nvPicPr>
                   <pic:blipFill>
-                    <a:blip r:embed="rId43"/>
+                    <a:blip r:embed="rId50"/>
                     <a:stretch>
                       <a:fillRect/>
                     </a:stretch>
@@ -14505,15 +13448,7 @@
         <w:t>twoParameterEvents</w:t>
       </w:r>
       <w:r>
-        <w:t xml:space="preserve">. IMPORTANTE: Si la animación utiliza la propiedad </w:t>
-      </w:r>
-      <w:proofErr w:type="gramStart"/>
-      <w:r>
-        <w:t>zoom</w:t>
-      </w:r>
-      <w:proofErr w:type="gramEnd"/>
-      <w:r>
-        <w:t xml:space="preserve">, estrictamente debe estar en </w:t>
+        <w:t xml:space="preserve">. IMPORTANTE: Si la animación utiliza la propiedad zoom, estrictamente debe estar en </w:t>
       </w:r>
       <w:r>
         <w:rPr>
@@ -14569,7 +13504,7 @@
     <w:p/>
     <w:p/>
     <w:p>
-      <w:hyperlink r:id="rId44" w:history="1">
+      <w:hyperlink r:id="rId51" w:history="1">
         <w:r>
           <w:rPr>
             <w:rStyle w:val="Hipervnculo"/>
@@ -14582,7 +13517,7 @@
       </w:r>
     </w:p>
     <w:p>
-      <w:hyperlink r:id="rId45" w:history="1">
+      <w:hyperlink r:id="rId52" w:history="1">
         <w:r>
           <w:rPr>
             <w:rStyle w:val="Hipervnculo"/>
@@ -14595,7 +13530,7 @@
       </w:r>
     </w:p>
     <w:p>
-      <w:hyperlink r:id="rId46" w:history="1">
+      <w:hyperlink r:id="rId53" w:history="1">
         <w:r>
           <w:rPr>
             <w:rStyle w:val="Hipervnculo"/>
@@ -14605,7 +13540,7 @@
       </w:hyperlink>
     </w:p>
     <w:p>
-      <w:hyperlink r:id="rId47" w:anchor="text-tag-alpha" w:history="1">
+      <w:hyperlink r:id="rId54" w:anchor="text-tag-alpha" w:history="1">
         <w:r>
           <w:rPr>
             <w:rStyle w:val="Hipervnculo"/>

</xml_diff>

<commit_message>
<doc> documentation almost ready, developing atlax renpy installer
</commit_message>
<xml_diff>
--- a/Manual de desarrollo en Atlax Renpy.docx
+++ b/Manual de desarrollo en Atlax Renpy.docx
@@ -12946,54 +12946,42 @@
         <w:rPr>
           <w:highlight w:val="yellow"/>
         </w:rPr>
-        <w:t>Key_</w:t>
+        <w:t xml:space="preserve">Key_2 </w:t>
       </w:r>
       <w:r>
         <w:rPr>
           <w:highlight w:val="yellow"/>
         </w:rPr>
-        <w:t xml:space="preserve">2 </w:t>
+        <w:t xml:space="preserve">; </w:t>
       </w:r>
       <w:r>
         <w:rPr>
           <w:highlight w:val="yellow"/>
         </w:rPr>
-        <w:t xml:space="preserve">; </w:t>
+        <w:t>expected response 2</w:t>
       </w:r>
       <w:r>
         <w:rPr>
           <w:highlight w:val="yellow"/>
         </w:rPr>
-        <w:t>expected response 2</w:t>
+        <w:t xml:space="preserve"> ; </w:t>
       </w:r>
       <w:r>
         <w:rPr>
           <w:highlight w:val="yellow"/>
         </w:rPr>
-        <w:t xml:space="preserve"> ; </w:t>
-      </w:r>
+        <w:t>next_scene2</w:t>
+      </w:r>
+    </w:p>
+    <w:p>
+      <w:pPr>
+        <w:ind w:firstLine="708"/>
+      </w:pPr>
       <w:r>
         <w:rPr>
           <w:highlight w:val="yellow"/>
         </w:rPr>
-        <w:t>next_scene2</w:t>
-      </w:r>
-    </w:p>
-    <w:p>
-      <w:pPr>
-        <w:ind w:firstLine="708"/>
-      </w:pPr>
-      <w:r>
-        <w:rPr>
-          <w:highlight w:val="yellow"/>
-        </w:rPr>
-        <w:t>Key_</w:t>
-      </w:r>
-      <w:r>
-        <w:rPr>
-          <w:highlight w:val="yellow"/>
-        </w:rPr>
-        <w:t xml:space="preserve">3 </w:t>
+        <w:t xml:space="preserve">Key_3 </w:t>
       </w:r>
       <w:r>
         <w:rPr>
@@ -13417,7 +13405,19 @@
       </w:pPr>
       <w:r>
         <w:lastRenderedPageBreak/>
-        <w:t>Si la novela visual finaliza con un script personalizado, al final de esta debemos colocar la siguiente línea de código para indicar que termina el juego. Lo que sucederá después es que se moverá a la pantalla del menú de inicio con un fade.</w:t>
+        <w:t xml:space="preserve">Si </w:t>
+      </w:r>
+      <w:r>
+        <w:t>se desea que el final de la</w:t>
+      </w:r>
+      <w:r>
+        <w:t xml:space="preserve"> novela visual </w:t>
+      </w:r>
+      <w:r>
+        <w:t>se realice con u</w:t>
+      </w:r>
+      <w:r>
+        <w:t>n script personalizado, al final de esta debemos colocar la siguiente línea de código para indicar que termina el juego. Lo que sucederá después es que se moverá a la pantalla del menú de inicio con un fade.</w:t>
       </w:r>
     </w:p>
     <w:p>
@@ -13457,6 +13457,24 @@
     <w:p>
       <w:pPr>
         <w:pStyle w:val="Prrafodelista"/>
+        <w:numPr>
+          <w:ilvl w:val="0"/>
+          <w:numId w:val="24"/>
+        </w:numPr>
+      </w:pPr>
+      <w:r>
+        <w:t>Al mostrar un personaje en pantalla obligatoriamente debes colocar “</w:t>
+      </w:r>
+      <w:r>
+        <w:t>onlayer characters</w:t>
+      </w:r>
+      <w:r>
+        <w:t>”, de lo contrario el personaje se mostrará en una capa distinta y no será visible.</w:t>
+      </w:r>
+    </w:p>
+    <w:p>
+      <w:pPr>
+        <w:pStyle w:val="Prrafodelista"/>
       </w:pPr>
     </w:p>
     <w:p>
@@ -13505,6 +13523,9 @@
       <w:r>
         <w:t>, ese archivo tendrá un label llamado my_credits con ciertos estilos y facilidades para crear tus propios créditos.</w:t>
       </w:r>
+      <w:r>
+        <w:t xml:space="preserve"> Evidentemente estos créditos se hacen en lenguaje renpy así que si quieres cambiarlos, tendrás que tener ciertos conocimientos.</w:t>
+      </w:r>
     </w:p>
     <w:p>
       <w:r>
@@ -13524,6 +13545,7 @@
         <w:t>Al hacer eso Atlax Renpy intentará ejecutar el label “my_credits” y luego mandará al jugador a la pantalla del menú principal con un fade.</w:t>
       </w:r>
     </w:p>
+    <w:p/>
     <w:p>
       <w:pPr>
         <w:pStyle w:val="Ttulo3"/>
@@ -13541,7 +13563,13 @@
         <w:t xml:space="preserve"> a otra</w:t>
       </w:r>
       <w:r>
-        <w:t xml:space="preserve"> queramos ejecutar una transición, ya sea porque cambia el día o simplemente la escena tiene lugar tiempo después. Esto lo podemos definir en la misma línea donde definimos el tipo de fin de diálogo. Cabe destacar que esta transición siempre ocurrirá sin importar el camino o la opción que se tome.</w:t>
+        <w:t xml:space="preserve"> queramos ejecutar una transición, ya sea porque cambia el día o simplemente la escena tiene lugar tiempo después. Esto lo podemos definir en la misma línea donde definimos el tipo de fin</w:t>
+      </w:r>
+      <w:r>
+        <w:t>alización</w:t>
+      </w:r>
+      <w:r>
+        <w:t xml:space="preserve"> de diálogo. Cabe destacar que esta transición siempre ocurrirá sin importar el camino o la opción que se tome.</w:t>
       </w:r>
     </w:p>
     <w:p>
@@ -13607,7 +13635,6 @@
         <w:spacing w:after="0"/>
       </w:pPr>
       <w:r>
-        <w:lastRenderedPageBreak/>
         <w:tab/>
       </w:r>
       <w:r>
@@ -13704,10 +13731,10 @@
     <w:p>
       <w:r>
         <w:tab/>
-        <w:t>El “ejemplo2” muestra un enfrentamiento entre el protagonista y otro personaje en un combate de prueba usando espadas de madera.</w:t>
-      </w:r>
-      <w:r>
-        <w:t xml:space="preserve"> En medio del combate hay una decisión la cual tiene repercusiones al final del combate.</w:t>
+        <w:t xml:space="preserve">El “ejemplo2” muestra un </w:t>
+      </w:r>
+      <w:r>
+        <w:t>entrenamiento entre el protagonista y otro personaje. Igualmente hay una decisión y dos finales.</w:t>
       </w:r>
     </w:p>
     <w:p/>
@@ -13737,7 +13764,21 @@
           <w:i/>
           <w:iCs/>
         </w:rPr>
-        <w:t>game/definitions/AtlaxEncryptionKey.example.rpy</w:t>
+        <w:t>game/definitions/AtlaxEncryptionKey</w:t>
+      </w:r>
+      <w:r>
+        <w:rPr>
+          <w:i/>
+          <w:iCs/>
+        </w:rPr>
+        <w:t>.example</w:t>
+      </w:r>
+      <w:r>
+        <w:rPr>
+          <w:i/>
+          <w:iCs/>
+        </w:rPr>
+        <w:t>.rpy</w:t>
       </w:r>
       <w:r>
         <w:rPr>
@@ -13812,6 +13853,7 @@
         <w:ind w:firstLine="708"/>
       </w:pPr>
       <w:r>
+        <w:lastRenderedPageBreak/>
         <w:t xml:space="preserve">Si requireSceneEncryption </w:t>
       </w:r>
       <w:r>
@@ -13836,11 +13878,7 @@
         <w:t>La atlax_encryption_key es una cadena de caracteres que funciona como la llave que utiliza el motor para desencriptar los archivos</w:t>
       </w:r>
       <w:r>
-        <w:t xml:space="preserve">, la mostrada anteriormente es un simple </w:t>
-      </w:r>
-      <w:r>
-        <w:lastRenderedPageBreak/>
-        <w:t>ejemplo, puedes utilizar la cadena de caracteres que mejor te parezca y guardarla en algún lado de tu PC o en un papel.</w:t>
+        <w:t>, la mostrada anteriormente es un simple ejemplo, puedes utilizar la cadena de caracteres que mejor te parezca y guardarla en algún lado de tu PC o en un papel.</w:t>
       </w:r>
     </w:p>
     <w:p>
@@ -13904,7 +13942,16 @@
     <w:p>
       <w:r>
         <w:tab/>
-        <w:t>Un ejecutable, dos carpetas y una llave de encriptación. La llave de encriptación es un simple documento de texto con la llave de ejemplo anteriormente mencionada (recuerda que puedes cambiarla).</w:t>
+        <w:t xml:space="preserve">Un ejecutable, dos carpetas y una llave de encriptación. La llave de encriptación </w:t>
+      </w:r>
+      <w:r>
+        <w:t xml:space="preserve">(encryption.key) puedes abrirlo con un simple editor de texto como el bloc de </w:t>
+      </w:r>
+      <w:r>
+        <w:t xml:space="preserve">y esta contiene </w:t>
+      </w:r>
+      <w:r>
+        <w:t>la llave de ejemplo anteriormente mencionada (recuerda que puedes cambiarla).</w:t>
       </w:r>
     </w:p>
     <w:p>
@@ -13966,7 +14013,17 @@
         <w:t>funcionamiento</w:t>
       </w:r>
       <w:r>
-        <w:t xml:space="preserve"> que tendría un virus del tipo Ransomware.</w:t>
+        <w:t xml:space="preserve"> que tendría un virus del tipo </w:t>
+      </w:r>
+      <w:r>
+        <w:rPr>
+          <w:b/>
+          <w:bCs/>
+        </w:rPr>
+        <w:t>Ransomware</w:t>
+      </w:r>
+      <w:r>
+        <w:t>.</w:t>
       </w:r>
     </w:p>
     <w:p>
@@ -14027,12 +14084,15 @@
         <w:tab/>
       </w:r>
     </w:p>
+    <w:p/>
+    <w:p/>
     <w:p>
       <w:pPr>
         <w:pStyle w:val="Ttulo1"/>
       </w:pPr>
       <w:bookmarkStart w:id="19" w:name="_Toc199261572"/>
       <w:r>
+        <w:lastRenderedPageBreak/>
         <w:t>Testing</w:t>
       </w:r>
       <w:bookmarkEnd w:id="19"/>
@@ -14040,7 +14100,9 @@
     <w:p>
       <w:r>
         <w:tab/>
-        <w:t>Atlax Renpy no ofrece ninguna herramienta específica para facilitar la fase de testing de tu novela visual, sin embargo aquí dejaré algunas estrategias para agilizar el testeo de tus escenas.</w:t>
+      </w:r>
+      <w:r>
+        <w:t>Si nuestra novela visual comienza a ser de un tamaño considerable, requeriremos de buenas herramientas para testearlo y verificar que todo funcione. A continuación, se mostrarán algunas facilidades que nos ofrece Atlax Renpy para probar nuestro juego de manera más eficaz.</w:t>
       </w:r>
     </w:p>
     <w:p>
@@ -14052,45 +14114,85 @@
         </w:numPr>
       </w:pPr>
       <w:r>
-        <w:t xml:space="preserve">Si tu novela se compone de varios archivos de control y quieres probar uno en específico, </w:t>
-      </w:r>
-      <w:r>
-        <w:t xml:space="preserve">siempre </w:t>
-      </w:r>
-      <w:r>
-        <w:t xml:space="preserve">puedes cambiar la variable </w:t>
+        <w:t xml:space="preserve">Si deseas probar una escena en específico utiliza el archivo </w:t>
       </w:r>
       <w:r>
         <w:rPr>
           <w:i/>
           <w:iCs/>
         </w:rPr>
-        <w:t>firstDialogue</w:t>
-      </w:r>
-      <w:r>
-        <w:t xml:space="preserve"> en el archivo </w:t>
+        <w:t>config.csv</w:t>
+      </w:r>
+      <w:r>
+        <w:t xml:space="preserve"> y cambiar el valor de la variable “begin” por la ruta y nombre del archivo de control. Por ejemplo si está ubicado en </w:t>
       </w:r>
       <w:r>
         <w:rPr>
           <w:i/>
           <w:iCs/>
         </w:rPr>
-        <w:t>games/script.rpy</w:t>
-      </w:r>
-      <w:r>
-        <w:rPr>
-          <w:i/>
-          <w:iCs/>
-        </w:rPr>
-        <w:t xml:space="preserve"> </w:t>
-      </w:r>
-      <w:r>
-        <w:t>colocándole la ruta de la escena que quieres ejecutar.</w:t>
+        <w:t xml:space="preserve">amber/chapter2/studying_for_exam.csv, </w:t>
+      </w:r>
+      <w:r>
+        <w:t>en el archivo de configuración colocarías lo siguiente</w:t>
+      </w:r>
+      <w:r>
+        <w:t>.</w:t>
       </w:r>
     </w:p>
     <w:p>
       <w:pPr>
         <w:pStyle w:val="Prrafodelista"/>
+        <w:numPr>
+          <w:ilvl w:val="1"/>
+          <w:numId w:val="20"/>
+        </w:numPr>
+      </w:pPr>
+      <w:r>
+        <w:rPr>
+          <w:noProof/>
+        </w:rPr>
+        <w:drawing>
+          <wp:inline distT="0" distB="0" distL="0" distR="0" wp14:anchorId="630AE5CF" wp14:editId="1F56F786">
+            <wp:extent cx="3651250" cy="409618"/>
+            <wp:effectExtent l="0" t="0" r="6350" b="9525"/>
+            <wp:docPr id="172105129" name="Imagen 1"/>
+            <wp:cNvGraphicFramePr>
+              <a:graphicFrameLocks xmlns:a="http://schemas.openxmlformats.org/drawingml/2006/main" noChangeAspect="1"/>
+            </wp:cNvGraphicFramePr>
+            <a:graphic xmlns:a="http://schemas.openxmlformats.org/drawingml/2006/main">
+              <a:graphicData uri="http://schemas.openxmlformats.org/drawingml/2006/picture">
+                <pic:pic xmlns:pic="http://schemas.openxmlformats.org/drawingml/2006/picture">
+                  <pic:nvPicPr>
+                    <pic:cNvPr id="172105129" name=""/>
+                    <pic:cNvPicPr/>
+                  </pic:nvPicPr>
+                  <pic:blipFill>
+                    <a:blip r:embed="rId50"/>
+                    <a:stretch>
+                      <a:fillRect/>
+                    </a:stretch>
+                  </pic:blipFill>
+                  <pic:spPr>
+                    <a:xfrm>
+                      <a:off x="0" y="0"/>
+                      <a:ext cx="3720250" cy="417359"/>
+                    </a:xfrm>
+                    <a:prstGeom prst="rect">
+                      <a:avLst/>
+                    </a:prstGeom>
+                  </pic:spPr>
+                </pic:pic>
+              </a:graphicData>
+            </a:graphic>
+          </wp:inline>
+        </w:drawing>
+      </w:r>
+    </w:p>
+    <w:p>
+      <w:pPr>
+        <w:pStyle w:val="Prrafodelista"/>
+        <w:ind w:left="1440"/>
       </w:pPr>
     </w:p>
     <w:p>
@@ -14100,9 +14202,38 @@
           <w:ilvl w:val="0"/>
           <w:numId w:val="20"/>
         </w:numPr>
-      </w:pPr>
-      <w:r>
-        <w:lastRenderedPageBreak/>
+        <w:spacing w:before="240"/>
+      </w:pPr>
+      <w:r>
+        <w:t>Se puede llega a ser tedioso tener que empezar la escena desde el inicio para probar que una parte cerca del final funcione correctamente, para ello podemos escribir en la columna Key del archivo de control un asterisco. Al colocar un asterisco, el motor saltará todos los diálogos hasta llegar al diálogo marcado, desde allí empezará a ejecutar esa escena.</w:t>
+      </w:r>
+    </w:p>
+    <w:p>
+      <w:pPr>
+        <w:pStyle w:val="Prrafodelista"/>
+        <w:numPr>
+          <w:ilvl w:val="1"/>
+          <w:numId w:val="20"/>
+        </w:numPr>
+      </w:pPr>
+      <w:r>
+        <w:t>Ten en cuenta que la escena al iniciar en ese punto, ignorará por completo los fondos, personajes y músicas previas.</w:t>
+      </w:r>
+    </w:p>
+    <w:p>
+      <w:pPr>
+        <w:pStyle w:val="Prrafodelista"/>
+      </w:pPr>
+    </w:p>
+    <w:p>
+      <w:pPr>
+        <w:pStyle w:val="Prrafodelista"/>
+        <w:numPr>
+          <w:ilvl w:val="0"/>
+          <w:numId w:val="20"/>
+        </w:numPr>
+      </w:pPr>
+      <w:r>
         <w:t xml:space="preserve">Para probar consecuencias de tipo puntos, escenas o de decisión, en el archivo </w:t>
       </w:r>
       <w:r>
@@ -14171,7 +14302,7 @@
                     <pic:cNvPicPr/>
                   </pic:nvPicPr>
                   <pic:blipFill>
-                    <a:blip r:embed="rId50"/>
+                    <a:blip r:embed="rId51"/>
                     <a:stretch>
                       <a:fillRect/>
                     </a:stretch>
@@ -14194,24 +14325,6 @@
     </w:p>
     <w:p>
       <w:pPr>
-        <w:pStyle w:val="Prrafodelista"/>
-      </w:pPr>
-    </w:p>
-    <w:p>
-      <w:pPr>
-        <w:pStyle w:val="Prrafodelista"/>
-        <w:numPr>
-          <w:ilvl w:val="0"/>
-          <w:numId w:val="20"/>
-        </w:numPr>
-      </w:pPr>
-      <w:r>
-        <w:t>Si una escena es muy larga y necesitas testear una parte alejada del inicio, en coloca un * en la columna key del diálogo en el que quieras iniciar, el juego empezará desde ese diálogo. Por supuesto que al iniciar así tendrás que mostrar los personajes en pantalla (si los hay) y background (si es necesario). Al finalizar de testear la escena puedes quitar el *, deshacer las modificaciones de testeo pertinentes y corregir el nombre del key del diálogo.</w:t>
-      </w:r>
-    </w:p>
-    <w:p/>
-    <w:p>
-      <w:pPr>
         <w:pStyle w:val="Ttulo1"/>
       </w:pPr>
       <w:bookmarkStart w:id="20" w:name="_Toc199261573"/>
@@ -14230,16 +14343,30 @@
           <w:i/>
           <w:iCs/>
         </w:rPr>
-        <w:t>game/definitions/configDefine.rpy</w:t>
-      </w:r>
-      <w:r>
-        <w:t xml:space="preserve"> para definir configuraciones específicas de Renpy y el archivo </w:t>
+        <w:t>game/definitions/</w:t>
       </w:r>
       <w:r>
         <w:rPr>
           <w:i/>
           <w:iCs/>
         </w:rPr>
+        <w:t>customConfig</w:t>
+      </w:r>
+      <w:r>
+        <w:rPr>
+          <w:i/>
+          <w:iCs/>
+        </w:rPr>
+        <w:t>.rpy</w:t>
+      </w:r>
+      <w:r>
+        <w:t xml:space="preserve"> para definir configuraciones específicas de Renpy y el archivo </w:t>
+      </w:r>
+      <w:r>
+        <w:rPr>
+          <w:i/>
+          <w:iCs/>
+        </w:rPr>
         <w:t>game/animations/animations.rpy</w:t>
       </w:r>
       <w:r>
@@ -14307,6 +14434,7 @@
     </w:p>
     <w:p>
       <w:r>
+        <w:lastRenderedPageBreak/>
         <w:tab/>
         <w:t xml:space="preserve">Aunque la animación no tenga parámetros, puedes colocarla en </w:t>
       </w:r>
@@ -14342,7 +14470,25 @@
         <w:t>twoParameterEvents</w:t>
       </w:r>
       <w:r>
-        <w:t xml:space="preserve">. IMPORTANTE: Si la animación utiliza la propiedad zoom, estrictamente debe estar en </w:t>
+        <w:t xml:space="preserve">. </w:t>
+      </w:r>
+    </w:p>
+    <w:p>
+      <w:pPr>
+        <w:ind w:firstLine="708"/>
+      </w:pPr>
+      <w:r>
+        <w:rPr>
+          <w:b/>
+          <w:bCs/>
+          <w:sz w:val="28"/>
+          <w:szCs w:val="28"/>
+          <w:highlight w:val="red"/>
+        </w:rPr>
+        <w:t>Nota</w:t>
+      </w:r>
+      <w:r>
+        <w:t xml:space="preserve">: Si la animación utiliza la propiedad zoom, estrictamente debe estar en </w:t>
       </w:r>
       <w:r>
         <w:rPr>
@@ -14364,6 +14510,14 @@
         <w:t xml:space="preserve"> </w:t>
       </w:r>
     </w:p>
+    <w:p>
+      <w:pPr>
+        <w:pStyle w:val="Ttulo1"/>
+      </w:pPr>
+      <w:r>
+        <w:t>Instalación</w:t>
+      </w:r>
+    </w:p>
     <w:p/>
     <w:p>
       <w:pPr>
@@ -14375,31 +14529,184 @@
       </w:r>
       <w:bookmarkEnd w:id="21"/>
     </w:p>
-    <w:p/>
-    <w:p>
-      <w:pPr>
-        <w:pStyle w:val="Ttulo1"/>
-      </w:pPr>
-      <w:bookmarkStart w:id="22" w:name="_Toc199261575"/>
-      <w:r>
+    <w:p>
+      <w:r>
+        <w:tab/>
+        <w:t>Si tu novela visual es lineal y carece de decisiones y consecuencias puedes saltarte este módulo.</w:t>
+      </w:r>
+    </w:p>
+    <w:p>
+      <w:r>
+        <w:tab/>
+        <w:t>Lo ideal es que las decisiones de una novela visual influyan de una u otra manera sobre el futuro, esto ocasiona que pueda haber X cantidad de caminos posibles, por ejemplo si nuestra novela visual tiene 2 decisiones de 2 opciones cada una, tendríamos un total de 4 caminos posibles.</w:t>
+      </w:r>
+    </w:p>
+    <w:p>
+      <w:r>
+        <w:tab/>
+        <w:t>Sin embargo, la cosa se puede complicar en gran medida pudiendo llegar a los millones de caminos posibles. Esto no es necesariamente un problema, al menos que nuestra novela tenga condiciones estrictas para alcanzar ciertos finales específicos.</w:t>
+      </w:r>
+    </w:p>
+    <w:p>
+      <w:r>
+        <w:tab/>
+        <w:t>Por ejemplo, en la novela visual Tales of Venslla (Actualmente en escritura) el protagonista puede ser expulsado numerosas veces si no cumple con ciertos puntos de calificación, cada una de esas expulsiones se traduce a un final.</w:t>
+      </w:r>
+    </w:p>
+    <w:p>
+      <w:r>
+        <w:tab/>
+        <w:t>Teniendo en cuenta que el final “bueno” de cada ruta requiere cumplir con cierta cantidad de puntos de amistad y de calificación, esto genera aun más finales posibles, si el sistema de puntos y decisiones no se balancea de manera correcta, va a ocasionar que el juego sea extremadamente difícil teniendo que escoger decisiones específicas para no terminar expulsado.</w:t>
+      </w:r>
+    </w:p>
+    <w:p>
+      <w:r>
+        <w:tab/>
+        <w:t>Es por esto que el balanceo es importante y existe una herramienta desarrollada por mí cuyo nombre es Visual Novel Technical Assistant (VNTA)</w:t>
+      </w:r>
+    </w:p>
+    <w:p>
+      <w:r>
+        <w:tab/>
+        <w:t>En pocas palabras, VNTA es una herramienta que recibe las decisiones y consecuencias relevantes de tu novela visual, los analiza y te arroja resultados estadísticos sobre los finales posibles, pudiendo así, evaluar qué finales son más propensos a ocurrir y así definir qué tan fácil o difícil es nuestra novela visual.</w:t>
+      </w:r>
+    </w:p>
+    <w:p>
+      <w:r>
+        <w:rPr>
+          <w:noProof/>
+        </w:rPr>
         <w:lastRenderedPageBreak/>
-        <w:t>Derechos</w:t>
-      </w:r>
-      <w:bookmarkEnd w:id="22"/>
-    </w:p>
-    <w:p>
-      <w:pPr>
-        <w:pStyle w:val="Ttulo1"/>
-      </w:pPr>
-      <w:r>
-        <w:t>Referencias</w:t>
-      </w:r>
-    </w:p>
-    <w:p/>
-    <w:p/>
-    <w:p/>
-    <w:p>
-      <w:hyperlink r:id="rId51" w:history="1">
+        <w:drawing>
+          <wp:anchor distT="0" distB="0" distL="114300" distR="114300" simplePos="0" relativeHeight="251671552" behindDoc="0" locked="0" layoutInCell="1" allowOverlap="1" wp14:anchorId="0ECDDFF2" wp14:editId="1FD462BC">
+            <wp:simplePos x="0" y="0"/>
+            <wp:positionH relativeFrom="margin">
+              <wp:posOffset>-603885</wp:posOffset>
+            </wp:positionH>
+            <wp:positionV relativeFrom="margin">
+              <wp:posOffset>-226695</wp:posOffset>
+            </wp:positionV>
+            <wp:extent cx="2514600" cy="5003800"/>
+            <wp:effectExtent l="0" t="0" r="0" b="6350"/>
+            <wp:wrapSquare wrapText="bothSides"/>
+            <wp:docPr id="477519739" name="Imagen 1"/>
+            <wp:cNvGraphicFramePr>
+              <a:graphicFrameLocks xmlns:a="http://schemas.openxmlformats.org/drawingml/2006/main" noChangeAspect="1"/>
+            </wp:cNvGraphicFramePr>
+            <a:graphic xmlns:a="http://schemas.openxmlformats.org/drawingml/2006/main">
+              <a:graphicData uri="http://schemas.openxmlformats.org/drawingml/2006/picture">
+                <pic:pic xmlns:pic="http://schemas.openxmlformats.org/drawingml/2006/picture">
+                  <pic:nvPicPr>
+                    <pic:cNvPr id="477519739" name=""/>
+                    <pic:cNvPicPr/>
+                  </pic:nvPicPr>
+                  <pic:blipFill>
+                    <a:blip r:embed="rId52">
+                      <a:extLst>
+                        <a:ext uri="{28A0092B-C50C-407E-A947-70E740481C1C}">
+                          <a14:useLocalDpi xmlns:a14="http://schemas.microsoft.com/office/drawing/2010/main" val="0"/>
+                        </a:ext>
+                      </a:extLst>
+                    </a:blip>
+                    <a:stretch>
+                      <a:fillRect/>
+                    </a:stretch>
+                  </pic:blipFill>
+                  <pic:spPr>
+                    <a:xfrm>
+                      <a:off x="0" y="0"/>
+                      <a:ext cx="2514600" cy="5003800"/>
+                    </a:xfrm>
+                    <a:prstGeom prst="rect">
+                      <a:avLst/>
+                    </a:prstGeom>
+                  </pic:spPr>
+                </pic:pic>
+              </a:graphicData>
+            </a:graphic>
+            <wp14:sizeRelH relativeFrom="margin">
+              <wp14:pctWidth>0</wp14:pctWidth>
+            </wp14:sizeRelH>
+            <wp14:sizeRelV relativeFrom="margin">
+              <wp14:pctHeight>0</wp14:pctHeight>
+            </wp14:sizeRelV>
+          </wp:anchor>
+        </w:drawing>
+      </w:r>
+      <w:r>
+        <w:tab/>
+      </w:r>
+      <w:r>
+        <w:t xml:space="preserve"> </w:t>
+      </w:r>
+      <w:r>
+        <w:t>En esta imagen podemos apreciar los resultados estadísticos de la ruta de Liz’Amar, personaje principal de Tales of Venslla.</w:t>
+      </w:r>
+    </w:p>
+    <w:p>
+      <w:r>
+        <w:tab/>
+        <w:t>Con un total de 11 millones de caminos posibles, la cantidad de rutas en la que el protagonista termina expulsado en el capítulo 2 y 3 son tan mínimas que son inferiores al 0.0%</w:t>
+      </w:r>
+    </w:p>
+    <w:p>
+      <w:r>
+        <w:tab/>
+        <w:t>A medida que avanzan los capítulos, el jugador es más propenso a cometer errores y se alcanza a ver cómo en el capítulo 5, el 29% de los caminos posibles terminan en una expulsión.</w:t>
+      </w:r>
+    </w:p>
+    <w:p>
+      <w:r>
+        <w:tab/>
+        <w:t>Pese a todo, el camino más común sigue siendo el final bueno con un 43%</w:t>
+      </w:r>
+    </w:p>
+    <w:p>
+      <w:r>
+        <w:tab/>
+        <w:t xml:space="preserve">Sin embargo, he de admitir que no fue así en un inicio, al usar por primera vez la herramienta </w:t>
+      </w:r>
+      <w:r>
+        <w:t>más del</w:t>
+      </w:r>
+      <w:r>
+        <w:t xml:space="preserve"> 80% de todos los camino</w:t>
+      </w:r>
+      <w:r>
+        <w:t>s</w:t>
+      </w:r>
+      <w:r>
+        <w:t xml:space="preserve"> posibles</w:t>
+      </w:r>
+      <w:r>
+        <w:t>,</w:t>
+      </w:r>
+      <w:r>
+        <w:t xml:space="preserve"> terminaban en finales malos o expulsiones.</w:t>
+      </w:r>
+    </w:p>
+    <w:p>
+      <w:r>
+        <w:tab/>
+        <w:t>Es por esto que me vi en la necesidad de balancear Tales of Venslla jugando con los puntos de las decisiones hasta alcanzar un buen 43% de finales buenos.</w:t>
+      </w:r>
+    </w:p>
+    <w:p>
+      <w:r>
+        <w:tab/>
+      </w:r>
+    </w:p>
+    <w:p>
+      <w:r>
+        <w:t>Si estás interesado en probar esta herramienta te dejo el enlace al video de Youtube donde explico c</w:t>
+      </w:r>
+      <w:r>
+        <w:t>ó</w:t>
+      </w:r>
+      <w:r>
+        <w:t xml:space="preserve">mo usarla. </w:t>
+      </w:r>
+      <w:hyperlink r:id="rId53" w:history="1">
         <w:r>
           <w:rPr>
             <w:rStyle w:val="Hipervnculo"/>
@@ -14411,8 +14718,61 @@
         <w:t xml:space="preserve"> </w:t>
       </w:r>
     </w:p>
-    <w:p>
-      <w:hyperlink r:id="rId52" w:history="1">
+    <w:p/>
+    <w:p/>
+    <w:p/>
+    <w:p/>
+    <w:p/>
+    <w:p/>
+    <w:p/>
+    <w:p/>
+    <w:p/>
+    <w:p/>
+    <w:p/>
+    <w:p/>
+    <w:p/>
+    <w:p>
+      <w:pPr>
+        <w:pStyle w:val="Ttulo1"/>
+      </w:pPr>
+      <w:bookmarkStart w:id="22" w:name="_Toc199261575"/>
+      <w:r>
+        <w:t>Derechos</w:t>
+      </w:r>
+      <w:bookmarkEnd w:id="22"/>
+    </w:p>
+    <w:p>
+      <w:pPr>
+        <w:pStyle w:val="Ttulo1"/>
+      </w:pPr>
+      <w:r>
+        <w:t>Referencias</w:t>
+      </w:r>
+    </w:p>
+    <w:p/>
+    <w:p/>
+    <w:p/>
+    <w:p>
+      <w:r>
+        <w:t xml:space="preserve">Visual Novel Technical Assistant: </w:t>
+      </w:r>
+      <w:hyperlink r:id="rId54" w:history="1">
+        <w:r>
+          <w:rPr>
+            <w:rStyle w:val="Hipervnculo"/>
+          </w:rPr>
+          <w:t>https://www.youtube.com/watch?v=a2dJ_Ge2RAg</w:t>
+        </w:r>
+      </w:hyperlink>
+      <w:r>
+        <w:t xml:space="preserve"> </w:t>
+      </w:r>
+    </w:p>
+    <w:p>
+      <w:r>
+        <w:t xml:space="preserve">Códigos de colores hexadecimales: </w:t>
+      </w:r>
+      <w:hyperlink r:id="rId55" w:history="1">
         <w:r>
           <w:rPr>
             <w:rStyle w:val="Hipervnculo"/>
@@ -14425,7 +14785,10 @@
       </w:r>
     </w:p>
     <w:p>
-      <w:hyperlink r:id="rId53" w:history="1">
+      <w:r>
+        <w:t xml:space="preserve">Calculadora de ancho de pixeles de un texto: </w:t>
+      </w:r>
+      <w:hyperlink r:id="rId56" w:history="1">
         <w:r>
           <w:rPr>
             <w:rStyle w:val="Hipervnculo"/>
@@ -14435,7 +14798,10 @@
       </w:hyperlink>
     </w:p>
     <w:p>
-      <w:hyperlink r:id="rId54" w:anchor="text-tag-alpha" w:history="1">
+      <w:r>
+        <w:t xml:space="preserve">Modificadores de texto en Renpy: </w:t>
+      </w:r>
+      <w:hyperlink r:id="rId57" w:history="1">
         <w:r>
           <w:rPr>
             <w:rStyle w:val="Hipervnculo"/>
@@ -15190,7 +15556,7 @@
         <w:ind w:left="720" w:hanging="360"/>
       </w:pPr>
     </w:lvl>
-    <w:lvl w:ilvl="1" w:tplc="0C0A0019" w:tentative="1">
+    <w:lvl w:ilvl="1" w:tplc="0C0A0019">
       <w:start w:val="1"/>
       <w:numFmt w:val="lowerLetter"/>
       <w:lvlText w:val="%2."/>
@@ -17668,6 +18034,7 @@
   <w:style w:type="character" w:default="1" w:styleId="Fuentedeprrafopredeter">
     <w:name w:val="Default Paragraph Font"/>
     <w:uiPriority w:val="1"/>
+    <w:semiHidden/>
     <w:unhideWhenUsed/>
   </w:style>
   <w:style w:type="table" w:default="1" w:styleId="Tablanormal">

</xml_diff>

<commit_message>
<doc> re verifying documentation
</commit_message>
<xml_diff>
--- a/Manual de desarrollo en Atlax Renpy.docx
+++ b/Manual de desarrollo en Atlax Renpy.docx
@@ -5217,123 +5217,16 @@
     </w:p>
     <w:p>
       <w:pPr>
-        <w:pStyle w:val="Ttulo1"/>
-      </w:pPr>
-      <w:bookmarkStart w:id="12" w:name="_Toc227172386"/>
-      <w:r>
-        <w:t>Flujo de trabajo</w:t>
-      </w:r>
-      <w:bookmarkEnd w:id="12"/>
-    </w:p>
-    <w:p>
-      <w:pPr>
-        <w:pStyle w:val="Ttulo2"/>
-      </w:pPr>
-      <w:bookmarkStart w:id="13" w:name="_Toc227172387"/>
-      <w:r>
-        <w:t>¿Cómo funciona Atlax Renpy?</w:t>
-      </w:r>
-      <w:bookmarkEnd w:id="13"/>
-    </w:p>
-    <w:p>
-      <w:r>
-        <w:tab/>
-        <w:t xml:space="preserve">El motor funciona gracias a unos archivos de control que en esencia cada uno representa una </w:t>
-      </w:r>
-      <w:r>
-        <w:rPr>
-          <w:b/>
-          <w:bCs/>
-        </w:rPr>
-        <w:t>escena</w:t>
-      </w:r>
-      <w:r>
-        <w:t xml:space="preserve"> distinta con sus </w:t>
-      </w:r>
-      <w:r>
-        <w:rPr>
-          <w:b/>
-          <w:bCs/>
-        </w:rPr>
-        <w:t>diálogos</w:t>
-      </w:r>
-      <w:r>
-        <w:t xml:space="preserve"> y final, estas escenas son leídas por el motor y hacen exactamente lo que dicen estos archivos. </w:t>
-      </w:r>
-      <w:r>
-        <w:t>Deberías dar prioridad a organizar estos archivos de control de la mejor manera posible, el orden recomendado es crear</w:t>
-      </w:r>
-      <w:r>
-        <w:t xml:space="preserve"> una </w:t>
-      </w:r>
-      <w:r>
-        <w:t xml:space="preserve"> </w:t>
-      </w:r>
-      <w:r>
-        <w:t>carpeta</w:t>
-      </w:r>
-      <w:r>
-        <w:t xml:space="preserve"> para cada</w:t>
-      </w:r>
-      <w:r>
-        <w:t xml:space="preserve"> </w:t>
-      </w:r>
-      <w:r>
-        <w:rPr>
-          <w:b/>
-          <w:bCs/>
-        </w:rPr>
-        <w:t>ruta</w:t>
-      </w:r>
-      <w:r>
-        <w:t>,</w:t>
-      </w:r>
-      <w:r>
-        <w:t xml:space="preserve"> </w:t>
-      </w:r>
-      <w:r>
-        <w:t>a</w:t>
-      </w:r>
-      <w:r>
-        <w:t>dentro, una carpeta para cada</w:t>
-      </w:r>
-      <w:r>
-        <w:t xml:space="preserve"> </w:t>
-      </w:r>
-      <w:r>
-        <w:rPr>
-          <w:b/>
-          <w:bCs/>
-        </w:rPr>
-        <w:t>capítulo</w:t>
-      </w:r>
-      <w:r>
-        <w:t xml:space="preserve"> y dependiendo de la complejidad del </w:t>
-      </w:r>
-      <w:r>
-        <w:rPr>
-          <w:b/>
-          <w:bCs/>
-        </w:rPr>
-        <w:t>capítulo</w:t>
-      </w:r>
-      <w:r>
-        <w:t xml:space="preserve"> puedes crear carpetas para diferenciar distintas etapas de este. Por supuesto, </w:t>
-      </w:r>
-      <w:r>
-        <w:t xml:space="preserve">todo esto </w:t>
-      </w:r>
-      <w:r>
-        <w:t xml:space="preserve">debe estar </w:t>
-      </w:r>
-      <w:r>
-        <w:t xml:space="preserve">contenido dentro </w:t>
-      </w:r>
-      <w:r>
-        <w:t>de</w:t>
-      </w:r>
-      <w:r>
-        <w:t xml:space="preserve"> la carpeta “</w:t>
+        <w:ind w:firstLine="708"/>
+      </w:pPr>
+      <w:r>
+        <w:t>Un buen ejercicio sería dividir tu novela visual en rutas, capítulos y escenas, para así, ir armando un sistema de carpetas organizadas.</w:t>
+      </w:r>
+      <w:r>
+        <w:t xml:space="preserve"> Mi recomendación es asignar una carpeta a cada ruta y desde ahí, una para cada capítulo y dependiendo de la complejidad de este, agregar subcarpetas para las escenas relacionadas.</w:t>
+      </w:r>
+      <w:r>
+        <w:t xml:space="preserve"> Por supuesto, todo dentro de la carpeta </w:t>
       </w:r>
       <w:r>
         <w:rPr>
@@ -5343,516 +5236,22 @@
         <w:t>scenes</w:t>
       </w:r>
       <w:r>
-        <w:t>”.</w:t>
-      </w:r>
-    </w:p>
-    <w:p>
-      <w:r>
-        <w:tab/>
-        <w:t>Así mismo, nuestro punto de entrada,</w:t>
-      </w:r>
-      <w:r>
-        <w:t xml:space="preserve"> es decir,</w:t>
-      </w:r>
-      <w:r>
-        <w:t xml:space="preserve"> nuestro comienzo debería tener su propia carpeta</w:t>
-      </w:r>
-      <w:r>
-        <w:t xml:space="preserve"> como si fuese una ruta,</w:t>
-      </w:r>
-      <w:r>
-        <w:t xml:space="preserve"> quizás una llamada “intro” o “comienzo”, ponle el nombre que desees.</w:t>
-      </w:r>
-      <w:r>
-        <w:t xml:space="preserve"> Lo que sí, debes indicarle al motor cuál es la </w:t>
-      </w:r>
-      <w:r>
-        <w:rPr>
-          <w:b/>
-          <w:bCs/>
-        </w:rPr>
-        <w:t>escena</w:t>
-      </w:r>
-      <w:r>
-        <w:t xml:space="preserve"> de entrada, de momento no vamos a explicar como hacerlo ya que será más adelante, solo ten presente que debes indicarle al motor por dónde empezar</w:t>
-      </w:r>
-      <w:r>
         <w:t>.</w:t>
       </w:r>
     </w:p>
     <w:p>
-      <w:r>
-        <w:tab/>
-        <w:t xml:space="preserve">Atlax Renpy va a leer ese primer archivo de control y </w:t>
-      </w:r>
-      <w:r>
-        <w:t>comenzará</w:t>
-      </w:r>
-      <w:r>
-        <w:t xml:space="preserve"> a mostrar los </w:t>
-      </w:r>
-      <w:r>
-        <w:rPr>
-          <w:b/>
-          <w:bCs/>
-        </w:rPr>
-        <w:t>diálogos</w:t>
-      </w:r>
-      <w:r>
-        <w:t xml:space="preserve"> como de costumbre, uno a uno, click a click. Una vez llegado el final de la </w:t>
-      </w:r>
-      <w:r>
-        <w:rPr>
-          <w:b/>
-          <w:bCs/>
-        </w:rPr>
-        <w:t>escena</w:t>
-      </w:r>
-      <w:r>
-        <w:t xml:space="preserve">, esta puede tener distintas formas de terminar, puede terminar de una forma lineal, es decir, que conduzca a una única </w:t>
-      </w:r>
-      <w:r>
-        <w:rPr>
-          <w:b/>
-          <w:bCs/>
-        </w:rPr>
-        <w:t>escena</w:t>
-      </w:r>
-      <w:r>
-        <w:t xml:space="preserve"> o que presente una </w:t>
-      </w:r>
-      <w:r>
-        <w:rPr>
-          <w:b/>
-          <w:bCs/>
-        </w:rPr>
-        <w:t>decisión</w:t>
-      </w:r>
-      <w:r>
-        <w:t>.</w:t>
-      </w:r>
-    </w:p>
-    <w:p>
-      <w:r>
-        <w:tab/>
-        <w:t xml:space="preserve">Mediante </w:t>
-      </w:r>
-      <w:r>
-        <w:t>l</w:t>
-      </w:r>
-      <w:r>
-        <w:t>a</w:t>
-      </w:r>
-      <w:r>
-        <w:t>s</w:t>
-      </w:r>
-      <w:r>
-        <w:t xml:space="preserve"> </w:t>
-      </w:r>
-      <w:r>
-        <w:rPr>
-          <w:b/>
-          <w:bCs/>
-        </w:rPr>
-        <w:t>decisi</w:t>
-      </w:r>
-      <w:r>
-        <w:rPr>
-          <w:b/>
-          <w:bCs/>
-        </w:rPr>
-        <w:t>ones</w:t>
-      </w:r>
-      <w:r>
-        <w:t xml:space="preserve"> podemos empezar a jugar con las </w:t>
-      </w:r>
-      <w:r>
-        <w:rPr>
-          <w:b/>
-          <w:bCs/>
-        </w:rPr>
-        <w:t>puntuaciones</w:t>
-      </w:r>
-      <w:r>
-        <w:t xml:space="preserve"> o </w:t>
-      </w:r>
-      <w:r>
-        <w:rPr>
-          <w:b/>
-          <w:bCs/>
-        </w:rPr>
-        <w:t>ramificaciones</w:t>
-      </w:r>
-      <w:r>
-        <w:t>,</w:t>
-      </w:r>
-      <w:r>
-        <w:t xml:space="preserve"> esto será fundamental</w:t>
-      </w:r>
-      <w:r>
-        <w:t xml:space="preserve"> si nuestr</w:t>
-      </w:r>
-      <w:r>
-        <w:t xml:space="preserve">a novela presenta varias </w:t>
-      </w:r>
-      <w:r>
-        <w:rPr>
-          <w:b/>
-          <w:bCs/>
-        </w:rPr>
-        <w:t>rutas</w:t>
-      </w:r>
-      <w:r>
-        <w:t xml:space="preserve">. Se recomienda encarecidamente crear un esquema o árbol de decisiones para cada una de las </w:t>
-      </w:r>
-      <w:r>
-        <w:rPr>
-          <w:b/>
-          <w:bCs/>
-        </w:rPr>
-        <w:t>rutas</w:t>
-      </w:r>
-      <w:r>
-        <w:t xml:space="preserve"> para así tener una idea de la complejidad de elección de cada un</w:t>
-      </w:r>
-      <w:r>
-        <w:t>a</w:t>
-      </w:r>
-      <w:r>
-        <w:t xml:space="preserve"> de estas</w:t>
-      </w:r>
-      <w:r>
-        <w:t>.</w:t>
-      </w:r>
-    </w:p>
-    <w:p>
-      <w:r>
-        <w:tab/>
-        <w:t xml:space="preserve">Yo mismo he desarrollado una herramienta para definir qué tan compleja son las decisiones de tu novela visual, se llama Visual Novel Technical Assitant y te dejo aquí el enlace de cómo usarlo: </w:t>
-      </w:r>
-      <w:hyperlink r:id="rId9" w:history="1">
-        <w:r>
-          <w:rPr>
-            <w:rStyle w:val="Hipervnculo"/>
-          </w:rPr>
-          <w:t>https://www.youtube.com/watch?v=a2dJ_Ge2RAg</w:t>
-        </w:r>
-      </w:hyperlink>
-      <w:r>
-        <w:t xml:space="preserve"> </w:t>
-      </w:r>
-    </w:p>
-    <w:p>
-      <w:r>
-        <w:tab/>
-        <w:t xml:space="preserve">Una vez hayamos acabado este primer </w:t>
-      </w:r>
-      <w:r>
-        <w:rPr>
-          <w:b/>
-          <w:bCs/>
-        </w:rPr>
-        <w:t>capítulo</w:t>
-      </w:r>
-      <w:r>
-        <w:t xml:space="preserve"> llegará el punto donde se tendrá que hacer la gran ramificación ¿en qué </w:t>
-      </w:r>
-      <w:r>
-        <w:rPr>
-          <w:b/>
-          <w:bCs/>
-        </w:rPr>
-        <w:t>ruta</w:t>
-      </w:r>
-      <w:r>
-        <w:t xml:space="preserve"> ha caído nuestro jugador? Como se dijo anteriormente, esa pregunta la responderá las acciones que haya tomado el </w:t>
-      </w:r>
-      <w:r>
-        <w:t>usuario</w:t>
-      </w:r>
-      <w:r>
-        <w:t xml:space="preserve"> a lo largo del </w:t>
-      </w:r>
-      <w:r>
-        <w:rPr>
-          <w:b/>
-          <w:bCs/>
-        </w:rPr>
-        <w:t>capítulo</w:t>
-      </w:r>
-      <w:r>
-        <w:t>.</w:t>
-      </w:r>
-    </w:p>
-    <w:p>
-      <w:r>
-        <w:lastRenderedPageBreak/>
-        <w:tab/>
-        <w:t xml:space="preserve">¿Has definido ya la manera en que el jugador se encaminará a cada una de las </w:t>
-      </w:r>
-      <w:r>
-        <w:rPr>
-          <w:b/>
-          <w:bCs/>
-        </w:rPr>
-        <w:t>rutas</w:t>
-      </w:r>
-      <w:r>
-        <w:t xml:space="preserve">? Es hora de ir creando las carpetas para cada </w:t>
-      </w:r>
-      <w:r>
-        <w:rPr>
-          <w:b/>
-          <w:bCs/>
-        </w:rPr>
-        <w:t>ruta</w:t>
-      </w:r>
-      <w:r>
-        <w:t xml:space="preserve"> con sus </w:t>
-      </w:r>
-      <w:r>
-        <w:rPr>
-          <w:b/>
-          <w:bCs/>
-        </w:rPr>
-        <w:t>capítulos</w:t>
-      </w:r>
-      <w:r>
-        <w:t xml:space="preserve"> y si has prestado atención te darás cuenta de que el ciclo se repite, vuelves a crear </w:t>
-      </w:r>
-      <w:r>
-        <w:rPr>
-          <w:b/>
-          <w:bCs/>
-        </w:rPr>
-        <w:t>escenas</w:t>
-      </w:r>
-      <w:r>
-        <w:t xml:space="preserve">, las llenas de </w:t>
-      </w:r>
-      <w:r>
-        <w:rPr>
-          <w:b/>
-          <w:bCs/>
-        </w:rPr>
-        <w:t>diálogos</w:t>
-      </w:r>
-      <w:r>
-        <w:t xml:space="preserve">, las </w:t>
-      </w:r>
-      <w:r>
-        <w:rPr>
-          <w:b/>
-          <w:bCs/>
-        </w:rPr>
-        <w:t>escenas</w:t>
-      </w:r>
-      <w:r>
-        <w:t xml:space="preserve"> terminan en otras </w:t>
-      </w:r>
-      <w:r>
-        <w:rPr>
-          <w:b/>
-          <w:bCs/>
-        </w:rPr>
-        <w:t>escenas</w:t>
-      </w:r>
-      <w:r>
-        <w:t xml:space="preserve"> que a su vez llevan a otras </w:t>
-      </w:r>
-      <w:r>
-        <w:rPr>
-          <w:b/>
-          <w:bCs/>
-        </w:rPr>
-        <w:t>escenas</w:t>
-      </w:r>
-      <w:r>
-        <w:t xml:space="preserve">, es cuestión de escribir y escribir y escribir tu historia conectando </w:t>
-      </w:r>
-      <w:r>
-        <w:rPr>
-          <w:b/>
-          <w:bCs/>
-        </w:rPr>
-        <w:t>escenas</w:t>
-      </w:r>
-      <w:r>
-        <w:t xml:space="preserve"> mediante </w:t>
-      </w:r>
-      <w:r>
-        <w:rPr>
-          <w:b/>
-          <w:bCs/>
-        </w:rPr>
-        <w:t>decisiones</w:t>
-      </w:r>
-      <w:r>
-        <w:t xml:space="preserve">, </w:t>
-      </w:r>
-      <w:r>
-        <w:rPr>
-          <w:b/>
-          <w:bCs/>
-        </w:rPr>
-        <w:t>consecuencias</w:t>
-      </w:r>
-      <w:r>
-        <w:t xml:space="preserve"> y más.</w:t>
-      </w:r>
-    </w:p>
-    <w:p>
-      <w:r>
-        <w:tab/>
-        <w:t xml:space="preserve">De esa forma varios escritores pueden trabajar en simultaneo en su propia historia </w:t>
-      </w:r>
-      <w:r>
-        <w:t xml:space="preserve">o </w:t>
-      </w:r>
-      <w:r>
-        <w:rPr>
-          <w:b/>
-          <w:bCs/>
-        </w:rPr>
-        <w:t>ruta</w:t>
-      </w:r>
-      <w:r>
-        <w:t>,</w:t>
-      </w:r>
-      <w:r>
-        <w:t xml:space="preserve"> </w:t>
-      </w:r>
-      <w:r>
-        <w:t xml:space="preserve">a trabajar me refiero a escribir la historia, pasarla a los archivos de control de forma ordenada y ejecutar el juego para ver que todo sucede como lo </w:t>
-      </w:r>
-      <w:r>
-        <w:t>esperado</w:t>
-      </w:r>
-      <w:r>
-        <w:t>.</w:t>
-      </w:r>
-    </w:p>
-    <w:p>
-      <w:r>
-        <w:tab/>
-        <w:t>En resumen, Atlax Renpy es un lector de escenas</w:t>
-      </w:r>
-      <w:r>
-        <w:t xml:space="preserve"> que nos da todas las herramientas para ilustrar una historia utilizando únicamente estos archivos de control y escribiendo una cantidad mínima de código de programación.</w:t>
-      </w:r>
-    </w:p>
-    <w:p>
-      <w:pPr>
-        <w:pStyle w:val="Ttulo1"/>
-      </w:pPr>
-      <w:bookmarkStart w:id="14" w:name="_Toc227172388"/>
-      <w:r>
-        <w:t>Instalación</w:t>
-      </w:r>
-      <w:bookmarkEnd w:id="14"/>
-    </w:p>
-    <w:p>
-      <w:r>
-        <w:tab/>
-        <w:t>Para instalar Atlax Renpy primero debes instalar Renpy en su versión 8.1.3 (Es posible que funcione en versiones posteriores)</w:t>
-      </w:r>
-      <w:r>
-        <w:t>. Acto seguido crear un proyecto, descargar el instalador de Atlax Renpy desde el repositorio oficial XXX, moverlo a la carpeta raíz del proyecto Renpy y ejecutarlo.</w:t>
-      </w:r>
-    </w:p>
-    <w:p>
-      <w:r>
-        <w:tab/>
-        <w:t xml:space="preserve">El instalador creará el sistema de carpetas así como el archivo de configuración, además de modificar algunos archivos del proyecto como el </w:t>
-      </w:r>
-      <w:r>
-        <w:rPr>
-          <w:i/>
-          <w:iCs/>
-        </w:rPr>
-        <w:t>screens.rpy</w:t>
-      </w:r>
-    </w:p>
-    <w:p/>
-    <w:p>
-      <w:pPr>
-        <w:pStyle w:val="Ttulo1"/>
-      </w:pPr>
-      <w:bookmarkStart w:id="15" w:name="_Toc227172389"/>
-      <w:r>
-        <w:t>Configuración</w:t>
-      </w:r>
-      <w:bookmarkEnd w:id="15"/>
-    </w:p>
-    <w:p>
-      <w:pPr>
+      <w:pPr>
+        <w:ind w:firstLine="708"/>
+      </w:pPr>
+      <w:r>
         <w:rPr>
           <w:noProof/>
         </w:rPr>
-      </w:pPr>
-      <w:r>
-        <w:tab/>
-      </w:r>
-      <w:r>
-        <w:t xml:space="preserve">Dentro de la carpeta </w:t>
-      </w:r>
-      <w:r>
-        <w:rPr>
-          <w:i/>
-          <w:iCs/>
-        </w:rPr>
-        <w:t>game</w:t>
-      </w:r>
-      <w:r>
-        <w:rPr>
-          <w:i/>
-          <w:iCs/>
-        </w:rPr>
-        <w:t xml:space="preserve"> </w:t>
-      </w:r>
-      <w:r>
-        <w:t>habrá</w:t>
-      </w:r>
-      <w:r>
-        <w:t xml:space="preserve"> un archivo llamado</w:t>
-      </w:r>
-      <w:r>
-        <w:t xml:space="preserve"> </w:t>
-      </w:r>
-      <w:r>
-        <w:rPr>
-          <w:i/>
-          <w:iCs/>
-        </w:rPr>
-        <w:t>config.csv</w:t>
-      </w:r>
-      <w:r>
-        <w:t xml:space="preserve"> que debe ser abierto con algún software que permita procesar archivos .CSV separados por comas, mi recomendación es que lo abra</w:t>
-      </w:r>
-      <w:r>
-        <w:t>s</w:t>
-      </w:r>
-      <w:r>
-        <w:t xml:space="preserve"> con Excel, siempre guardándolo con el formato CSV UTF-8. Si lo abres con Excel encontrarás algo similar a esto.</w:t>
-      </w:r>
-      <w:r>
-        <w:rPr>
-          <w:noProof/>
-        </w:rPr>
-        <w:t xml:space="preserve"> </w:t>
-      </w:r>
-    </w:p>
-    <w:p>
-      <w:r>
-        <w:rPr>
-          <w:noProof/>
-        </w:rPr>
-        <w:lastRenderedPageBreak/>
         <w:drawing>
-          <wp:inline distT="0" distB="0" distL="0" distR="0" wp14:anchorId="3493B6DB" wp14:editId="2AF38733">
-            <wp:extent cx="5400040" cy="5745480"/>
-            <wp:effectExtent l="0" t="0" r="0" b="7620"/>
-            <wp:docPr id="1682740595" name="Imagen 1"/>
+          <wp:inline distT="0" distB="0" distL="0" distR="0" wp14:anchorId="4C9F18FD" wp14:editId="0E8E735C">
+            <wp:extent cx="4819650" cy="3524250"/>
+            <wp:effectExtent l="0" t="0" r="0" b="0"/>
+            <wp:docPr id="2022422527" name="Imagen 1"/>
             <wp:cNvGraphicFramePr>
               <a:graphicFrameLocks xmlns:a="http://schemas.openxmlformats.org/drawingml/2006/main" noChangeAspect="1"/>
             </wp:cNvGraphicFramePr>
@@ -5860,11 +5259,11 @@
               <a:graphicData uri="http://schemas.openxmlformats.org/drawingml/2006/picture">
                 <pic:pic xmlns:pic="http://schemas.openxmlformats.org/drawingml/2006/picture">
                   <pic:nvPicPr>
-                    <pic:cNvPr id="1682740595" name=""/>
+                    <pic:cNvPr id="2022422527" name=""/>
                     <pic:cNvPicPr/>
                   </pic:nvPicPr>
                   <pic:blipFill>
-                    <a:blip r:embed="rId10"/>
+                    <a:blip r:embed="rId9"/>
                     <a:stretch>
                       <a:fillRect/>
                     </a:stretch>
@@ -5872,7 +5271,7 @@
                   <pic:spPr>
                     <a:xfrm>
                       <a:off x="0" y="0"/>
-                      <a:ext cx="5400040" cy="5745480"/>
+                      <a:ext cx="4819650" cy="3524250"/>
                     </a:xfrm>
                     <a:prstGeom prst="rect">
                       <a:avLst/>
@@ -5885,20 +5284,289 @@
         </w:drawing>
       </w:r>
     </w:p>
-    <w:p/>
+    <w:p>
+      <w:pPr>
+        <w:pStyle w:val="Ttulo1"/>
+      </w:pPr>
+      <w:bookmarkStart w:id="12" w:name="_Toc227172386"/>
+      <w:r>
+        <w:t>Flujo de trabajo</w:t>
+      </w:r>
+      <w:bookmarkEnd w:id="12"/>
+    </w:p>
+    <w:p>
+      <w:pPr>
+        <w:pStyle w:val="Ttulo2"/>
+      </w:pPr>
+      <w:bookmarkStart w:id="13" w:name="_Toc227172387"/>
+      <w:r>
+        <w:t>¿Cómo funciona Atlax Renpy?</w:t>
+      </w:r>
+      <w:bookmarkEnd w:id="13"/>
+    </w:p>
     <w:p>
       <w:r>
         <w:tab/>
-        <w:t>En este archivo vamos a definir el punto inicial de la novela, así como la definición de todos los fondos y personajes en sus distintos idiomas. En este archivo, todas las filas que empiecen con “#” serán ignoradas.</w:t>
+        <w:t xml:space="preserve">El motor funciona gracias a </w:t>
+      </w:r>
+      <w:r>
+        <w:t>los</w:t>
+      </w:r>
+      <w:r>
+        <w:t xml:space="preserve"> </w:t>
+      </w:r>
+      <w:r>
+        <w:rPr>
+          <w:b/>
+          <w:bCs/>
+        </w:rPr>
+        <w:t>archivos de control</w:t>
+      </w:r>
+      <w:r>
+        <w:t>,</w:t>
+      </w:r>
+      <w:r>
+        <w:t xml:space="preserve"> que en esencia cada uno representa una </w:t>
+      </w:r>
+      <w:r>
+        <w:rPr>
+          <w:b/>
+          <w:bCs/>
+        </w:rPr>
+        <w:t>escena</w:t>
+      </w:r>
+      <w:r>
+        <w:t xml:space="preserve"> distinta</w:t>
+      </w:r>
+      <w:r>
+        <w:t>, el motor lee estos archivos de control y los ejecuta línea por línea</w:t>
+      </w:r>
+      <w:r>
+        <w:t xml:space="preserve"> mostrando al jugador los diálogos, fondos, personajes, efectos y demás</w:t>
+      </w:r>
+      <w:r>
+        <w:t>.</w:t>
       </w:r>
     </w:p>
     <w:p>
       <w:r>
         <w:tab/>
-        <w:t xml:space="preserve">La estructura es sencilla, la columna “Key” representa qué se está definiendo, las columnas “Value1” y “Value2” aguardan los distintos valores </w:t>
-      </w:r>
-      <w:r>
-        <w:t>del objeto que se va a definir. Por último tenemos las columnas de los idiomas disponibles en nuestra novela.</w:t>
+      </w:r>
+      <w:r>
+        <w:t>Toda novela visual tiene un inicio, así que tendrás que definir un primer</w:t>
+      </w:r>
+      <w:r>
+        <w:rPr>
+          <w:b/>
+          <w:bCs/>
+        </w:rPr>
+        <w:t xml:space="preserve"> archivo de control</w:t>
+      </w:r>
+      <w:r>
+        <w:t xml:space="preserve">, ya sea un prólogo o capítulo 1, una vez definido, </w:t>
+      </w:r>
+      <w:r>
+        <w:rPr>
+          <w:b/>
+          <w:bCs/>
+        </w:rPr>
+        <w:t>Atlax Renpy</w:t>
+      </w:r>
+      <w:r>
+        <w:t xml:space="preserve"> va a leer ese </w:t>
+      </w:r>
+      <w:r>
+        <w:lastRenderedPageBreak/>
+        <w:t xml:space="preserve">primer archivo de control y </w:t>
+      </w:r>
+      <w:r>
+        <w:t>comenzará</w:t>
+      </w:r>
+      <w:r>
+        <w:t xml:space="preserve"> a mostrar los </w:t>
+      </w:r>
+      <w:r>
+        <w:rPr>
+          <w:b/>
+          <w:bCs/>
+        </w:rPr>
+        <w:t>diálogos</w:t>
+      </w:r>
+      <w:r>
+        <w:t xml:space="preserve"> como de costumbre, uno a uno, click a click. </w:t>
+      </w:r>
+    </w:p>
+    <w:p>
+      <w:pPr>
+        <w:ind w:firstLine="708"/>
+      </w:pPr>
+      <w:r>
+        <w:t>Cuando el motor llega al</w:t>
+      </w:r>
+      <w:r>
+        <w:t xml:space="preserve"> final de </w:t>
+      </w:r>
+      <w:r>
+        <w:t xml:space="preserve">una </w:t>
+      </w:r>
+      <w:r>
+        <w:rPr>
+          <w:b/>
+          <w:bCs/>
+        </w:rPr>
+        <w:t>escena</w:t>
+      </w:r>
+      <w:r>
+        <w:t>, esta puede tener distintas formas de terminar, puede terminar de forma lineal,</w:t>
+      </w:r>
+      <w:r>
+        <w:t xml:space="preserve"> con una decisión, con una bifurcación o incluso mostra</w:t>
+      </w:r>
+      <w:r>
+        <w:t>ndo</w:t>
+      </w:r>
+      <w:r>
+        <w:t xml:space="preserve"> los créditos finales.</w:t>
+      </w:r>
+    </w:p>
+    <w:p>
+      <w:pPr>
+        <w:ind w:firstLine="708"/>
+      </w:pPr>
+      <w:r>
+        <w:t xml:space="preserve">Usualmente una </w:t>
+      </w:r>
+      <w:r>
+        <w:rPr>
+          <w:b/>
+          <w:bCs/>
+        </w:rPr>
+        <w:t>escena</w:t>
+      </w:r>
+      <w:r>
+        <w:t xml:space="preserve"> </w:t>
+      </w:r>
+      <w:r>
+        <w:t xml:space="preserve">terminará conduciendo al jugador </w:t>
+      </w:r>
+      <w:r>
+        <w:t>a otra</w:t>
+      </w:r>
+      <w:r>
+        <w:t xml:space="preserve"> </w:t>
+      </w:r>
+      <w:r>
+        <w:rPr>
+          <w:b/>
+          <w:bCs/>
+        </w:rPr>
+        <w:t>escena</w:t>
+      </w:r>
+      <w:r>
+        <w:t xml:space="preserve"> </w:t>
+      </w:r>
+      <w:r>
+        <w:t xml:space="preserve">distinta, y esa escena a otra más, </w:t>
+      </w:r>
+      <w:r>
+        <w:t xml:space="preserve">y así sucesivamente creando una </w:t>
+      </w:r>
+      <w:r>
+        <w:rPr>
+          <w:b/>
+          <w:bCs/>
+        </w:rPr>
+        <w:t>cadena</w:t>
+      </w:r>
+      <w:r>
+        <w:t xml:space="preserve"> de </w:t>
+      </w:r>
+      <w:r>
+        <w:rPr>
+          <w:b/>
+          <w:bCs/>
+        </w:rPr>
+        <w:t>escenas</w:t>
+      </w:r>
+      <w:r>
+        <w:t xml:space="preserve"> que se ejecutan de manera ordenada una después de otra</w:t>
+      </w:r>
+      <w:r>
+        <w:t>.</w:t>
+      </w:r>
+    </w:p>
+    <w:p>
+      <w:pPr>
+        <w:ind w:firstLine="708"/>
+      </w:pPr>
+      <w:r>
+        <w:t xml:space="preserve">Haciendo uso de las </w:t>
+      </w:r>
+      <w:r>
+        <w:rPr>
+          <w:b/>
+          <w:bCs/>
+        </w:rPr>
+        <w:t>decisiones</w:t>
+      </w:r>
+      <w:r>
+        <w:t xml:space="preserve"> podemos crear </w:t>
+      </w:r>
+      <w:r>
+        <w:rPr>
+          <w:b/>
+          <w:bCs/>
+        </w:rPr>
+        <w:t>ramificaciones</w:t>
+      </w:r>
+      <w:r>
+        <w:t xml:space="preserve"> y añadir o quitar </w:t>
+      </w:r>
+      <w:r>
+        <w:rPr>
+          <w:b/>
+          <w:bCs/>
+        </w:rPr>
+        <w:t>puntuaciones.</w:t>
+      </w:r>
+      <w:r>
+        <w:t xml:space="preserve"> Si tu novela visual posee </w:t>
+      </w:r>
+      <w:r>
+        <w:rPr>
+          <w:b/>
+          <w:bCs/>
+        </w:rPr>
+        <w:t>decisiones</w:t>
+      </w:r>
+      <w:r>
+        <w:t xml:space="preserve"> y </w:t>
+      </w:r>
+      <w:r>
+        <w:rPr>
+          <w:b/>
+          <w:bCs/>
+        </w:rPr>
+        <w:t>consecuencias</w:t>
+      </w:r>
+      <w:r>
+        <w:t>, se aconseja encarecidamente mantener un esquema con todas las decisiones,</w:t>
+      </w:r>
+      <w:r>
+        <w:t xml:space="preserve"> bifurcaciones y puntos,</w:t>
+      </w:r>
+      <w:r>
+        <w:t xml:space="preserve"> de esta forma podrás tener una idea sobre la complejidad de los </w:t>
+      </w:r>
+      <w:r>
+        <w:rPr>
+          <w:b/>
+          <w:bCs/>
+        </w:rPr>
+        <w:t>caminos posibles</w:t>
+      </w:r>
+      <w:r>
+        <w:t xml:space="preserve"> de tu historia.</w:t>
       </w:r>
     </w:p>
     <w:p>
@@ -5906,67 +5574,769 @@
         <w:tab/>
       </w:r>
       <w:r>
-        <w:t xml:space="preserve">Al momento de definir los idiomas es importante que recuerdes escribirlos todos de la misma forma, </w:t>
-      </w:r>
-      <w:r>
-        <w:t>ya que en otros sitios del motor haremos referencias a estos idiomas. En</w:t>
-      </w:r>
-      <w:r>
-        <w:t xml:space="preserve"> este caso </w:t>
-      </w:r>
-      <w:r>
-        <w:t>todos están escritos en minúscula.</w:t>
-      </w:r>
-    </w:p>
-    <w:p>
-      <w:pPr>
+        <w:t>Si tienes dudas sobre cómo hacerlo</w:t>
+      </w:r>
+      <w:r>
+        <w:t xml:space="preserve"> de manera efectiva</w:t>
+      </w:r>
+      <w:r>
+        <w:t>, y</w:t>
+      </w:r>
+      <w:r>
+        <w:t xml:space="preserve">o mismo he desarrollado una herramienta para definir qué tan compleja son las decisiones de tu novela visual, se llama Visual Novel Technical Assitant y te dejo aquí el enlace de cómo usarlo: </w:t>
+      </w:r>
+      <w:hyperlink r:id="rId10" w:history="1">
+        <w:r>
+          <w:rPr>
+            <w:rStyle w:val="Hipervnculo"/>
+          </w:rPr>
+          <w:t>https://www.youtube.com/watch?v=a2dJ_Ge2RAg</w:t>
+        </w:r>
+      </w:hyperlink>
+      <w:r>
+        <w:t xml:space="preserve"> </w:t>
+      </w:r>
+    </w:p>
+    <w:p>
+      <w:r>
+        <w:tab/>
+        <w:t xml:space="preserve">Una de las principales ventajas que nos ofrece </w:t>
+      </w:r>
+      <w:r>
+        <w:rPr>
+          <w:b/>
+          <w:bCs/>
+        </w:rPr>
+        <w:t>Atlax Renpy</w:t>
+      </w:r>
+      <w:r>
+        <w:t xml:space="preserve"> es permitir que distintos escritores trabajen de manera simultánea con sus propias </w:t>
+      </w:r>
+      <w:r>
+        <w:rPr>
+          <w:b/>
+          <w:bCs/>
+        </w:rPr>
+        <w:t>escenas</w:t>
+      </w:r>
+      <w:r>
+        <w:rPr>
+          <w:b/>
+          <w:bCs/>
+        </w:rPr>
+        <w:t>, capítulos y rutas</w:t>
+      </w:r>
+      <w:r>
+        <w:t xml:space="preserve"> ¿Lo mejor? Serán capaces de </w:t>
+      </w:r>
+      <w:r>
+        <w:t>testear</w:t>
+      </w:r>
+      <w:r>
+        <w:t xml:space="preserve"> y </w:t>
+      </w:r>
+      <w:r>
+        <w:t>ver</w:t>
+      </w:r>
+      <w:r>
+        <w:t xml:space="preserve"> con sus propios ojos las </w:t>
+      </w:r>
+      <w:r>
+        <w:rPr>
+          <w:b/>
+          <w:bCs/>
+        </w:rPr>
+        <w:t>escenas</w:t>
+      </w:r>
+      <w:r>
+        <w:t xml:space="preserve"> que escriban, viéndolas tal cual las vería un usuario final.</w:t>
+      </w:r>
+    </w:p>
+    <w:p>
+      <w:pPr>
+        <w:ind w:firstLine="708"/>
+      </w:pPr>
+      <w:r>
+        <w:rPr>
+          <w:b/>
+          <w:bCs/>
+          <w:sz w:val="28"/>
+          <w:szCs w:val="28"/>
+          <w:highlight w:val="blue"/>
+        </w:rPr>
+        <w:t>Recomendación</w:t>
+      </w:r>
+      <w:r>
+        <w:t>: Escribe tu novela utilizando un archivo Word, procurando que cada línea de texto sea un diálogo.</w:t>
+      </w:r>
+    </w:p>
+    <w:p>
+      <w:r>
+        <w:rPr>
+          <w:noProof/>
+        </w:rPr>
+        <w:drawing>
+          <wp:anchor distT="0" distB="0" distL="114300" distR="114300" simplePos="0" relativeHeight="251673600" behindDoc="0" locked="0" layoutInCell="1" allowOverlap="1" wp14:anchorId="566A4858" wp14:editId="6399E49F">
+            <wp:simplePos x="0" y="0"/>
+            <wp:positionH relativeFrom="margin">
+              <wp:align>left</wp:align>
+            </wp:positionH>
+            <wp:positionV relativeFrom="margin">
+              <wp:posOffset>5582224</wp:posOffset>
+            </wp:positionV>
+            <wp:extent cx="5426075" cy="1632585"/>
+            <wp:effectExtent l="0" t="0" r="3175" b="5715"/>
+            <wp:wrapSquare wrapText="bothSides"/>
+            <wp:docPr id="1898143434" name="Imagen 1"/>
+            <wp:cNvGraphicFramePr>
+              <a:graphicFrameLocks xmlns:a="http://schemas.openxmlformats.org/drawingml/2006/main" noChangeAspect="1"/>
+            </wp:cNvGraphicFramePr>
+            <a:graphic xmlns:a="http://schemas.openxmlformats.org/drawingml/2006/main">
+              <a:graphicData uri="http://schemas.openxmlformats.org/drawingml/2006/picture">
+                <pic:pic xmlns:pic="http://schemas.openxmlformats.org/drawingml/2006/picture">
+                  <pic:nvPicPr>
+                    <pic:cNvPr id="1898143434" name=""/>
+                    <pic:cNvPicPr/>
+                  </pic:nvPicPr>
+                  <pic:blipFill>
+                    <a:blip r:embed="rId11">
+                      <a:extLst>
+                        <a:ext uri="{28A0092B-C50C-407E-A947-70E740481C1C}">
+                          <a14:useLocalDpi xmlns:a14="http://schemas.microsoft.com/office/drawing/2010/main" val="0"/>
+                        </a:ext>
+                      </a:extLst>
+                    </a:blip>
+                    <a:stretch>
+                      <a:fillRect/>
+                    </a:stretch>
+                  </pic:blipFill>
+                  <pic:spPr>
+                    <a:xfrm>
+                      <a:off x="0" y="0"/>
+                      <a:ext cx="5426075" cy="1632585"/>
+                    </a:xfrm>
+                    <a:prstGeom prst="rect">
+                      <a:avLst/>
+                    </a:prstGeom>
+                  </pic:spPr>
+                </pic:pic>
+              </a:graphicData>
+            </a:graphic>
+            <wp14:sizeRelH relativeFrom="margin">
+              <wp14:pctWidth>0</wp14:pctWidth>
+            </wp14:sizeRelH>
+            <wp14:sizeRelV relativeFrom="margin">
+              <wp14:pctHeight>0</wp14:pctHeight>
+            </wp14:sizeRelV>
+          </wp:anchor>
+        </w:drawing>
+      </w:r>
+      <w:r>
         <w:rPr>
           <w:i/>
           <w:iCs/>
-        </w:rPr>
-      </w:pPr>
+          <w:sz w:val="20"/>
+          <w:szCs w:val="20"/>
+        </w:rPr>
+        <w:t>Escribiendo un solo salto de línea para cada diálogo.</w:t>
+      </w:r>
+    </w:p>
+    <w:p>
+      <w:pPr>
+        <w:ind w:firstLine="708"/>
+      </w:pPr>
+    </w:p>
+    <w:p>
+      <w:pPr>
+        <w:ind w:firstLine="708"/>
+      </w:pPr>
+      <w:r>
+        <w:t xml:space="preserve">¿Has terminado de escribir tu novela? ¿Has definido ya las rutas, decisiones, consecuencias y puntuaciones de tu </w:t>
+      </w:r>
+      <w:r>
+        <w:t>historia</w:t>
+      </w:r>
+      <w:r>
+        <w:t>?</w:t>
+      </w:r>
+      <w:r>
+        <w:t xml:space="preserve"> Ha llegado la hora de traducir los textos de tu novela en </w:t>
+      </w:r>
+      <w:r>
+        <w:rPr>
+          <w:b/>
+          <w:bCs/>
+        </w:rPr>
+        <w:t>archivos de control</w:t>
+      </w:r>
+      <w:r>
+        <w:t>.</w:t>
+      </w:r>
+    </w:p>
+    <w:p>
+      <w:pPr>
+        <w:pStyle w:val="Ttulo1"/>
+      </w:pPr>
+      <w:bookmarkStart w:id="14" w:name="_Toc227172388"/>
+      <w:r>
+        <w:lastRenderedPageBreak/>
+        <w:t>Instalación</w:t>
+      </w:r>
+      <w:bookmarkEnd w:id="14"/>
+    </w:p>
+    <w:p>
       <w:r>
         <w:tab/>
-        <w:t>Es importante mencionar que el primer idioma que coloques será considerado el idioma por defecto.</w:t>
-      </w:r>
-    </w:p>
-    <w:p>
-      <w:pPr>
+        <w:t xml:space="preserve">Puedes optar por ver el siguiente video explicativo sobre </w:t>
+      </w:r>
+      <w:r>
+        <w:rPr>
+          <w:b/>
+          <w:bCs/>
+        </w:rPr>
+        <w:t>Atlax Renpy</w:t>
+      </w:r>
+      <w:r>
+        <w:t xml:space="preserve"> y su instalación: XXX</w:t>
+      </w:r>
+    </w:p>
+    <w:p>
+      <w:r>
+        <w:tab/>
+        <w:t>Sin embargo, en esta sección de todas formas se explicará cómo instalarlo.</w:t>
+      </w:r>
+    </w:p>
+    <w:p>
+      <w:pPr>
+        <w:pStyle w:val="Prrafodelista"/>
+        <w:numPr>
+          <w:ilvl w:val="0"/>
+          <w:numId w:val="25"/>
+        </w:numPr>
+      </w:pPr>
+      <w:r>
+        <w:t xml:space="preserve">Descargar el instalador de </w:t>
+      </w:r>
+      <w:r>
+        <w:rPr>
+          <w:b/>
+          <w:bCs/>
+        </w:rPr>
+        <w:t>Atlax Renpy</w:t>
+      </w:r>
+      <w:r>
+        <w:t xml:space="preserve"> desde el repositorio oficial: XXX</w:t>
+      </w:r>
+    </w:p>
+    <w:p>
+      <w:pPr>
+        <w:pStyle w:val="Prrafodelista"/>
+        <w:numPr>
+          <w:ilvl w:val="0"/>
+          <w:numId w:val="25"/>
+        </w:numPr>
+      </w:pPr>
+      <w:r>
+        <w:t xml:space="preserve">Descargar e instalar </w:t>
+      </w:r>
+      <w:r>
+        <w:rPr>
+          <w:b/>
+          <w:bCs/>
+        </w:rPr>
+        <w:t>Renpy</w:t>
+      </w:r>
+      <w:r>
+        <w:t xml:space="preserve"> en su versión 8.1.3 (Es posible que </w:t>
+      </w:r>
+      <w:r>
+        <w:rPr>
+          <w:b/>
+          <w:bCs/>
+        </w:rPr>
+        <w:t>Atlax Renpy</w:t>
+      </w:r>
+      <w:r>
+        <w:t xml:space="preserve"> siga siendo compatible con versiones posteriores)</w:t>
+      </w:r>
+    </w:p>
+    <w:p>
+      <w:pPr>
+        <w:pStyle w:val="Prrafodelista"/>
+        <w:numPr>
+          <w:ilvl w:val="0"/>
+          <w:numId w:val="25"/>
+        </w:numPr>
+      </w:pPr>
+      <w:r>
+        <w:t xml:space="preserve">Crear un nuevo proyecto con </w:t>
+      </w:r>
+      <w:r>
+        <w:rPr>
+          <w:b/>
+          <w:bCs/>
+        </w:rPr>
+        <w:t>Renpy</w:t>
+      </w:r>
+      <w:r>
+        <w:t>.</w:t>
+      </w:r>
+    </w:p>
+    <w:p>
+      <w:pPr>
+        <w:pStyle w:val="Prrafodelista"/>
+        <w:numPr>
+          <w:ilvl w:val="0"/>
+          <w:numId w:val="25"/>
+        </w:numPr>
+      </w:pPr>
+      <w:r>
+        <w:t xml:space="preserve">Mover el instalador (.exe) a la carpeta raíz del proyecto creado. El instalador debe estar en el mismo nivel que la carpeta </w:t>
+      </w:r>
+      <w:r>
         <w:rPr>
           <w:i/>
           <w:iCs/>
         </w:rPr>
-      </w:pPr>
-    </w:p>
-    <w:p>
-      <w:pPr>
-        <w:pStyle w:val="Ttulo2"/>
-      </w:pPr>
-      <w:bookmarkStart w:id="16" w:name="_Toc227172390"/>
-      <w:r>
-        <w:t xml:space="preserve">Archivo de </w:t>
-      </w:r>
-      <w:r>
-        <w:t>inicio</w:t>
-      </w:r>
-      <w:bookmarkEnd w:id="16"/>
+        <w:t>game</w:t>
+      </w:r>
+      <w:r>
+        <w:t>.</w:t>
+      </w:r>
+    </w:p>
+    <w:p>
+      <w:pPr>
+        <w:pStyle w:val="Prrafodelista"/>
+        <w:numPr>
+          <w:ilvl w:val="0"/>
+          <w:numId w:val="25"/>
+        </w:numPr>
+      </w:pPr>
+      <w:r>
+        <w:t>Ejecutar el instalador. Esto creará todo el sistema de carpetas además de los archivos necesarios para su correcto funcionamiento además de este manual y un par de ejemplos.</w:t>
+      </w:r>
+    </w:p>
+    <w:p>
+      <w:pPr>
+        <w:pStyle w:val="Prrafodelista"/>
+        <w:numPr>
+          <w:ilvl w:val="0"/>
+          <w:numId w:val="25"/>
+        </w:numPr>
+      </w:pPr>
+      <w:r>
+        <w:t>La instalación ha sido terminada, ya puedes iniciar el desarrollo de tu novela visual.</w:t>
+      </w:r>
+    </w:p>
+    <w:p>
+      <w:pPr>
+        <w:ind w:firstLine="708"/>
+      </w:pPr>
+      <w:r>
+        <w:t xml:space="preserve">Es importante que al momento de desarrollar tu novela visual consideres utilizar un repositorio para respaldar tu proyecto. Mi recomendación es utilizar Github: </w:t>
+      </w:r>
+      <w:hyperlink r:id="rId12" w:history="1">
+        <w:r>
+          <w:rPr>
+            <w:rStyle w:val="Hipervnculo"/>
+          </w:rPr>
+          <w:t>https://github.com/</w:t>
+        </w:r>
+      </w:hyperlink>
+      <w:r>
+        <w:t xml:space="preserve"> se puede llegar a hacer algo confuso como utilizarlo así que te recomiendo buscar tutoriales para respaldar de manera segura los avances que vayas realizando.</w:t>
+      </w:r>
+    </w:p>
+    <w:p>
+      <w:pPr>
+        <w:ind w:firstLine="708"/>
+      </w:pPr>
+      <w:r>
+        <w:t xml:space="preserve">Por supuesto, también puedes optar por utilizar respaldos manuales usando Google Drive o Mega, </w:t>
+      </w:r>
+      <w:r>
+        <w:t>no obstante</w:t>
+      </w:r>
+      <w:r>
+        <w:t>, mi recomendación siempre será usar Github.</w:t>
+      </w:r>
+      <w:r>
+        <w:t xml:space="preserve"> El editor de texto Visual Studio Code tiene una gran compatibilidad con Github.</w:t>
+      </w:r>
+    </w:p>
+    <w:p>
+      <w:pPr>
+        <w:pStyle w:val="Ttulo1"/>
+      </w:pPr>
+      <w:bookmarkStart w:id="15" w:name="_Toc227172389"/>
+      <w:r>
+        <w:t>Configuración</w:t>
+      </w:r>
+      <w:bookmarkEnd w:id="15"/>
     </w:p>
     <w:p>
       <w:r>
         <w:tab/>
       </w:r>
       <w:r>
-        <w:t xml:space="preserve">En el archivo </w:t>
+        <w:t xml:space="preserve">Una vez ya instalado </w:t>
+      </w:r>
+      <w:r>
+        <w:rPr>
+          <w:b/>
+          <w:bCs/>
+        </w:rPr>
+        <w:t>Atlax Renpy</w:t>
+      </w:r>
+      <w:r>
+        <w:t xml:space="preserve">, </w:t>
+      </w:r>
+      <w:r>
+        <w:t xml:space="preserve">lo primero será acudir al archivo de configuración, este estará </w:t>
+      </w:r>
+      <w:r>
+        <w:t>d</w:t>
+      </w:r>
+      <w:r>
+        <w:t xml:space="preserve">entro de la carpeta </w:t>
       </w:r>
       <w:r>
         <w:rPr>
           <w:i/>
           <w:iCs/>
         </w:rPr>
+        <w:t>game</w:t>
+      </w:r>
+      <w:r>
+        <w:rPr>
+          <w:i/>
+          <w:iCs/>
+        </w:rPr>
+        <w:t xml:space="preserve"> </w:t>
+      </w:r>
+      <w:r>
+        <w:t xml:space="preserve">y su nombre será </w:t>
+      </w:r>
+      <w:r>
+        <w:rPr>
+          <w:i/>
+          <w:iCs/>
+        </w:rPr>
         <w:t>config.csv</w:t>
       </w:r>
       <w:r>
-        <w:t xml:space="preserve"> ubicaremos la línea que comience con “begin”, en la imagen de antes es la fila número 5.</w:t>
+        <w:t>. Los archivos de formato .CSV (Comma-Separated Values) pueden ser abiertos con Excel (altamente recomendado) o con algún editor de texto como bloc de notas o Visual Studio Code.</w:t>
+      </w:r>
+    </w:p>
+    <w:p>
+      <w:r>
+        <w:tab/>
+      </w:r>
+      <w:r>
+        <w:rPr>
+          <w:b/>
+          <w:bCs/>
+          <w:sz w:val="28"/>
+          <w:szCs w:val="28"/>
+          <w:highlight w:val="green"/>
+        </w:rPr>
+        <w:t>Importante</w:t>
+      </w:r>
+      <w:r>
+        <w:t>: Si abres un archivo .CSV con Excel, procura guardarlo en el formato CSV UTF-8.</w:t>
+      </w:r>
+    </w:p>
+    <w:p>
+      <w:r>
+        <w:tab/>
+        <w:t>Al abrir el archivo de configuración usando Excel, encontrarás una tabla similar a la siguiente.</w:t>
+      </w:r>
+    </w:p>
+    <w:p>
+      <w:r>
+        <w:rPr>
+          <w:noProof/>
+        </w:rPr>
+        <w:lastRenderedPageBreak/>
+        <w:drawing>
+          <wp:anchor distT="0" distB="0" distL="114300" distR="114300" simplePos="0" relativeHeight="251676672" behindDoc="0" locked="0" layoutInCell="1" allowOverlap="1" wp14:anchorId="338485B2" wp14:editId="7D8C6199">
+            <wp:simplePos x="0" y="0"/>
+            <wp:positionH relativeFrom="margin">
+              <wp:align>center</wp:align>
+            </wp:positionH>
+            <wp:positionV relativeFrom="margin">
+              <wp:posOffset>190059</wp:posOffset>
+            </wp:positionV>
+            <wp:extent cx="6003290" cy="2718435"/>
+            <wp:effectExtent l="0" t="0" r="0" b="5715"/>
+            <wp:wrapSquare wrapText="bothSides"/>
+            <wp:docPr id="1596032430" name="Imagen 1"/>
+            <wp:cNvGraphicFramePr>
+              <a:graphicFrameLocks xmlns:a="http://schemas.openxmlformats.org/drawingml/2006/main" noChangeAspect="1"/>
+            </wp:cNvGraphicFramePr>
+            <a:graphic xmlns:a="http://schemas.openxmlformats.org/drawingml/2006/main">
+              <a:graphicData uri="http://schemas.openxmlformats.org/drawingml/2006/picture">
+                <pic:pic xmlns:pic="http://schemas.openxmlformats.org/drawingml/2006/picture">
+                  <pic:nvPicPr>
+                    <pic:cNvPr id="1596032430" name=""/>
+                    <pic:cNvPicPr/>
+                  </pic:nvPicPr>
+                  <pic:blipFill>
+                    <a:blip r:embed="rId13" cstate="print">
+                      <a:extLst>
+                        <a:ext uri="{28A0092B-C50C-407E-A947-70E740481C1C}">
+                          <a14:useLocalDpi xmlns:a14="http://schemas.microsoft.com/office/drawing/2010/main" val="0"/>
+                        </a:ext>
+                      </a:extLst>
+                    </a:blip>
+                    <a:stretch>
+                      <a:fillRect/>
+                    </a:stretch>
+                  </pic:blipFill>
+                  <pic:spPr>
+                    <a:xfrm>
+                      <a:off x="0" y="0"/>
+                      <a:ext cx="6003290" cy="2718435"/>
+                    </a:xfrm>
+                    <a:prstGeom prst="rect">
+                      <a:avLst/>
+                    </a:prstGeom>
+                  </pic:spPr>
+                </pic:pic>
+              </a:graphicData>
+            </a:graphic>
+            <wp14:sizeRelH relativeFrom="margin">
+              <wp14:pctWidth>0</wp14:pctWidth>
+            </wp14:sizeRelH>
+            <wp14:sizeRelV relativeFrom="margin">
+              <wp14:pctHeight>0</wp14:pctHeight>
+            </wp14:sizeRelV>
+          </wp:anchor>
+        </w:drawing>
+      </w:r>
+      <w:r>
+        <w:rPr>
+          <w:i/>
+          <w:iCs/>
+          <w:sz w:val="20"/>
+          <w:szCs w:val="20"/>
+        </w:rPr>
+        <w:t>Archivo de configuración. Ubicado en game/config.csv</w:t>
+      </w:r>
+    </w:p>
+    <w:p/>
+    <w:p>
+      <w:r>
+        <w:tab/>
+        <w:t xml:space="preserve">El archivo de control se compone por columnas, estas son </w:t>
+      </w:r>
+      <w:r>
+        <w:rPr>
+          <w:i/>
+          <w:iCs/>
+        </w:rPr>
+        <w:t>Key, Value1 y Value2</w:t>
+      </w:r>
+      <w:r>
+        <w:t>. Las demás columnas corresponden a los idiomas admitidos por nuestra novela visual, siéntete en libertad de</w:t>
+      </w:r>
+      <w:r>
+        <w:t xml:space="preserve"> </w:t>
+      </w:r>
+      <w:r>
+        <w:t>reorganizar o</w:t>
+      </w:r>
+      <w:r>
+        <w:t xml:space="preserve"> agregar nuevos idiomas</w:t>
+      </w:r>
+      <w:r>
+        <w:t>, también puedes</w:t>
+      </w:r>
+      <w:r>
+        <w:t xml:space="preserve"> quitar los que no necesites.</w:t>
+      </w:r>
+    </w:p>
+    <w:p>
+      <w:r>
+        <w:tab/>
+        <w:t>El primer idioma será considerado el idioma por defecto de la novela.</w:t>
+      </w:r>
+    </w:p>
+    <w:p>
+      <w:r>
+        <w:tab/>
+      </w:r>
+      <w:r>
+        <w:rPr>
+          <w:b/>
+          <w:bCs/>
+          <w:sz w:val="28"/>
+          <w:szCs w:val="28"/>
+          <w:highlight w:val="green"/>
+        </w:rPr>
+        <w:t>Importante</w:t>
+      </w:r>
+      <w:r>
+        <w:rPr>
+          <w:sz w:val="28"/>
+          <w:szCs w:val="28"/>
+        </w:rPr>
+        <w:t xml:space="preserve">: </w:t>
+      </w:r>
+      <w:r>
+        <w:t>Una vez definas los idiomas, procura escribirlos</w:t>
+      </w:r>
+      <w:r>
+        <w:t xml:space="preserve"> siempre en minúscula</w:t>
+      </w:r>
+      <w:r>
+        <w:t>, ya que estos idiomas serán utilizados en varios sitios del motor.</w:t>
+      </w:r>
+    </w:p>
+    <w:p>
+      <w:r>
+        <w:tab/>
+        <w:t xml:space="preserve">El propósito de cada columna </w:t>
+      </w:r>
+      <w:r>
+        <w:t>es el siguiente:</w:t>
+      </w:r>
+    </w:p>
+    <w:p>
+      <w:pPr>
+        <w:pStyle w:val="Prrafodelista"/>
+        <w:numPr>
+          <w:ilvl w:val="0"/>
+          <w:numId w:val="26"/>
+        </w:numPr>
+      </w:pPr>
+      <w:r>
+        <w:t xml:space="preserve">Siempre que una fila comience con el carácter “#”, la </w:t>
+      </w:r>
+      <w:r>
+        <w:t>fila</w:t>
+      </w:r>
+      <w:r>
+        <w:t xml:space="preserve"> será ignorada y se pasará a la siguiente.</w:t>
+      </w:r>
+    </w:p>
+    <w:p>
+      <w:pPr>
+        <w:pStyle w:val="Prrafodelista"/>
+        <w:numPr>
+          <w:ilvl w:val="0"/>
+          <w:numId w:val="26"/>
+        </w:numPr>
+      </w:pPr>
+      <w:r>
+        <w:t>Columna Key: Esta explica qué elemento se está definiendo, estos pueden ser: personajes, fondos, inicio de la novela y rutas base (base_paths).</w:t>
+      </w:r>
+    </w:p>
+    <w:p>
+      <w:pPr>
+        <w:pStyle w:val="Prrafodelista"/>
+        <w:numPr>
+          <w:ilvl w:val="1"/>
+          <w:numId w:val="26"/>
+        </w:numPr>
+      </w:pPr>
+      <w:r>
+        <w:t>Se recomienda no tocar las rutas base.</w:t>
+      </w:r>
+    </w:p>
+    <w:p>
+      <w:pPr>
+        <w:pStyle w:val="Prrafodelista"/>
+        <w:numPr>
+          <w:ilvl w:val="0"/>
+          <w:numId w:val="26"/>
+        </w:numPr>
+      </w:pPr>
+      <w:r>
+        <w:t>Columnas Value1 y Value2: Establecen el o los valores del elemento que se esté definiendo.</w:t>
+      </w:r>
+    </w:p>
+    <w:p>
+      <w:pPr>
+        <w:pStyle w:val="Prrafodelista"/>
+        <w:numPr>
+          <w:ilvl w:val="0"/>
+          <w:numId w:val="26"/>
+        </w:numPr>
+      </w:pPr>
+      <w:r>
+        <w:t>Columnas de idioma: Se usan para definir las variaciones de nombres de personajes dependiendo del idioma. Si un idioma no tiene una variación de nombre, utilizará la primera (la variación por defecto).</w:t>
+      </w:r>
+    </w:p>
+    <w:p>
+      <w:pPr>
+        <w:ind w:left="360" w:firstLine="348"/>
+      </w:pPr>
+      <w:r>
+        <w:t>A continuación</w:t>
+      </w:r>
+      <w:r>
+        <w:t>,</w:t>
+      </w:r>
+      <w:r>
+        <w:t xml:space="preserve"> se detallará como definir correctamente cada uno de los posibles elementos.</w:t>
+      </w:r>
+    </w:p>
+    <w:p>
+      <w:pPr>
+        <w:ind w:left="360" w:firstLine="348"/>
+      </w:pPr>
+    </w:p>
+    <w:p>
+      <w:pPr>
+        <w:ind w:left="360" w:firstLine="348"/>
+        <w:rPr>
+          <w:i/>
+          <w:iCs/>
+        </w:rPr>
+      </w:pPr>
+    </w:p>
+    <w:p>
+      <w:pPr>
+        <w:pStyle w:val="Ttulo2"/>
+      </w:pPr>
+      <w:bookmarkStart w:id="16" w:name="_Toc227172390"/>
+      <w:r>
+        <w:lastRenderedPageBreak/>
+        <w:t>Definiendo el punto</w:t>
+      </w:r>
+      <w:r>
+        <w:t xml:space="preserve"> de </w:t>
+      </w:r>
+      <w:r>
+        <w:t>inicio</w:t>
+      </w:r>
+      <w:bookmarkEnd w:id="16"/>
+    </w:p>
+    <w:p>
+      <w:r>
+        <w:tab/>
+        <w:t xml:space="preserve">El </w:t>
+      </w:r>
+      <w:r>
+        <w:rPr>
+          <w:i/>
+          <w:iCs/>
+        </w:rPr>
+        <w:t>Key</w:t>
+      </w:r>
+      <w:r>
+        <w:t xml:space="preserve"> correspondiente al punto de inicio de la novela es el “begin”, lo encontraremos aproximadamente en la fila 5 y esta solo utilizará la columna </w:t>
+      </w:r>
+      <w:r>
+        <w:rPr>
+          <w:i/>
+          <w:iCs/>
+        </w:rPr>
+        <w:t>Value1</w:t>
+      </w:r>
+      <w:r>
+        <w:t>.</w:t>
       </w:r>
     </w:p>
     <w:p>
@@ -5987,7 +6357,36 @@
         <w:t>el nombre de</w:t>
       </w:r>
       <w:r>
-        <w:t xml:space="preserve">l archivo de control o script personalizado desde la cual comenzará la novela. Por ejemplo si nuestra escena de inicio está ubicada en la carpeta </w:t>
+        <w:t xml:space="preserve">l </w:t>
+      </w:r>
+      <w:r>
+        <w:rPr>
+          <w:b/>
+          <w:bCs/>
+        </w:rPr>
+        <w:t xml:space="preserve">archivo de control </w:t>
+      </w:r>
+      <w:r>
+        <w:t xml:space="preserve">o </w:t>
+      </w:r>
+      <w:r>
+        <w:t xml:space="preserve">el label del </w:t>
+      </w:r>
+      <w:r>
+        <w:rPr>
+          <w:b/>
+          <w:bCs/>
+        </w:rPr>
+        <w:t>script personalizado</w:t>
+      </w:r>
+      <w:r>
+        <w:t xml:space="preserve"> desde la cual comenzará la novela. Por ejemplo</w:t>
+      </w:r>
+      <w:r>
+        <w:t>,</w:t>
+      </w:r>
+      <w:r>
+        <w:t xml:space="preserve"> si nuestra escena de inicio está ubicada en la carpeta </w:t>
       </w:r>
       <w:r>
         <w:rPr>
@@ -6014,21 +6413,36 @@
           <w:i/>
           <w:iCs/>
         </w:rPr>
-        <w:t>config.csv</w:t>
-      </w:r>
-      <w:r>
-        <w:t xml:space="preserve"> se vería así.</w:t>
-      </w:r>
-    </w:p>
+        <w:t>begin</w:t>
+      </w:r>
+      <w:r>
+        <w:t xml:space="preserve"> </w:t>
+      </w:r>
+      <w:r>
+        <w:t>se</w:t>
+      </w:r>
+      <w:r>
+        <w:t xml:space="preserve"> vería así.</w:t>
+      </w:r>
+    </w:p>
+    <w:p/>
     <w:p>
       <w:r>
         <w:rPr>
           <w:noProof/>
         </w:rPr>
         <w:drawing>
-          <wp:inline distT="0" distB="0" distL="0" distR="0" wp14:anchorId="59BA811D" wp14:editId="20C183C6">
+          <wp:anchor distT="0" distB="0" distL="114300" distR="114300" simplePos="0" relativeHeight="251675648" behindDoc="0" locked="0" layoutInCell="1" allowOverlap="1" wp14:anchorId="5A4EA266" wp14:editId="2AA1B65A">
+            <wp:simplePos x="0" y="0"/>
+            <wp:positionH relativeFrom="margin">
+              <wp:posOffset>-127136</wp:posOffset>
+            </wp:positionH>
+            <wp:positionV relativeFrom="margin">
+              <wp:posOffset>2265313</wp:posOffset>
+            </wp:positionV>
             <wp:extent cx="5400040" cy="536575"/>
             <wp:effectExtent l="0" t="0" r="0" b="0"/>
+            <wp:wrapSquare wrapText="bothSides"/>
             <wp:docPr id="814949175" name="Imagen 1"/>
             <wp:cNvGraphicFramePr>
               <a:graphicFrameLocks xmlns:a="http://schemas.openxmlformats.org/drawingml/2006/main" noChangeAspect="1"/>
@@ -6041,7 +6455,13 @@
                     <pic:cNvPicPr/>
                   </pic:nvPicPr>
                   <pic:blipFill>
-                    <a:blip r:embed="rId11"/>
+                    <a:blip r:embed="rId14">
+                      <a:extLst>
+                        <a:ext uri="{28A0092B-C50C-407E-A947-70E740481C1C}">
+                          <a14:useLocalDpi xmlns:a14="http://schemas.microsoft.com/office/drawing/2010/main" val="0"/>
+                        </a:ext>
+                      </a:extLst>
+                    </a:blip>
                     <a:stretch>
                       <a:fillRect/>
                     </a:stretch>
@@ -6058,32 +6478,712 @@
                 </pic:pic>
               </a:graphicData>
             </a:graphic>
+          </wp:anchor>
+        </w:drawing>
+      </w:r>
+      <w:r>
+        <w:rPr>
+          <w:i/>
+          <w:iCs/>
+          <w:sz w:val="20"/>
+          <w:szCs w:val="20"/>
+        </w:rPr>
+        <w:t>Ejemplo de punto de inicio al archivo ubicado en game/scenes/game_introduction.csv</w:t>
+      </w:r>
+    </w:p>
+    <w:p/>
+    <w:p>
+      <w:r>
+        <w:tab/>
+        <w:t xml:space="preserve">Siempre que se haga referencia a un archivo de control, escribe solamente su nombre, no hace falta que escribas </w:t>
+      </w:r>
+      <w:r>
+        <w:rPr>
+          <w:i/>
+          <w:iCs/>
+        </w:rPr>
+        <w:t>.csv</w:t>
+      </w:r>
+    </w:p>
+    <w:p>
+      <w:r>
+        <w:tab/>
+        <w:t>Por otro lado</w:t>
+      </w:r>
+      <w:r>
+        <w:t>,</w:t>
+      </w:r>
+      <w:r>
+        <w:t xml:space="preserve"> si el inicio de nuestra novela es un </w:t>
+      </w:r>
+      <w:r>
+        <w:rPr>
+          <w:b/>
+          <w:bCs/>
+        </w:rPr>
+        <w:t>script personalizado</w:t>
+      </w:r>
+      <w:r>
+        <w:t xml:space="preserve">, colocaremos el nombre del </w:t>
+      </w:r>
+      <w:r>
+        <w:rPr>
+          <w:b/>
+          <w:bCs/>
+        </w:rPr>
+        <w:t>label</w:t>
+      </w:r>
+      <w:r>
+        <w:t xml:space="preserve"> de nuestro script. Sin embargo, este asunto de los</w:t>
+      </w:r>
+      <w:r>
+        <w:rPr>
+          <w:b/>
+          <w:bCs/>
+        </w:rPr>
+        <w:t xml:space="preserve"> scripts personalizados </w:t>
+      </w:r>
+      <w:r>
+        <w:t>será tratado más adelante con precisión.</w:t>
+      </w:r>
+    </w:p>
+    <w:p/>
+    <w:p>
+      <w:pPr>
+        <w:pStyle w:val="Ttulo2"/>
+      </w:pPr>
+      <w:r>
+        <w:t>Definiendo rutas base</w:t>
+      </w:r>
+    </w:p>
+    <w:p>
+      <w:pPr>
+        <w:rPr>
+          <w:i/>
+          <w:iCs/>
+        </w:rPr>
+      </w:pPr>
+      <w:r>
+        <w:tab/>
+        <w:t xml:space="preserve">El </w:t>
+      </w:r>
+      <w:r>
+        <w:rPr>
+          <w:i/>
+          <w:iCs/>
+        </w:rPr>
+        <w:t>Key</w:t>
+      </w:r>
+      <w:r>
+        <w:t xml:space="preserve"> correspondiente a una definición de ruta base comienza por “</w:t>
+      </w:r>
+      <w:r>
+        <w:rPr>
+          <w:i/>
+          <w:iCs/>
+        </w:rPr>
+        <w:t>path_”</w:t>
+      </w:r>
+      <w:r>
+        <w:t xml:space="preserve"> y son 5 rutas base en total</w:t>
+      </w:r>
+      <w:r>
+        <w:t xml:space="preserve">, lo encontraremos aproximadamente por la fila 9 hasta la fila 13 y solo utilizará la columna </w:t>
+      </w:r>
+      <w:r>
+        <w:rPr>
+          <w:i/>
+          <w:iCs/>
+        </w:rPr>
+        <w:t>Value1.</w:t>
+      </w:r>
+    </w:p>
+    <w:p>
+      <w:r>
+        <w:tab/>
+        <w:t>Las rutas base son las rutas</w:t>
+      </w:r>
+      <w:r>
+        <w:t xml:space="preserve"> dentro de la carpeta </w:t>
+      </w:r>
+      <w:r>
+        <w:rPr>
+          <w:i/>
+          <w:iCs/>
+        </w:rPr>
+        <w:t>game</w:t>
+      </w:r>
+      <w:r>
+        <w:t xml:space="preserve"> desde las cuales </w:t>
+      </w:r>
+      <w:r>
+        <w:rPr>
+          <w:b/>
+          <w:bCs/>
+        </w:rPr>
+        <w:t>Atlax Renpy</w:t>
+      </w:r>
+      <w:r>
+        <w:t xml:space="preserve"> buscará los recursos asociados, es decir, los sprites, músicas, sonidos y demás.</w:t>
+      </w:r>
+      <w:r>
+        <w:t xml:space="preserve"> s</w:t>
+      </w:r>
+      <w:r>
+        <w:t>e recomienda encarecidamente no cambiar ninguno de estos valores.</w:t>
+      </w:r>
+    </w:p>
+    <w:p>
+      <w:pPr>
+        <w:rPr>
+          <w:i/>
+          <w:iCs/>
+          <w:sz w:val="20"/>
+          <w:szCs w:val="20"/>
+        </w:rPr>
+      </w:pPr>
+      <w:r>
+        <w:rPr>
+          <w:noProof/>
+        </w:rPr>
+        <w:drawing>
+          <wp:anchor distT="0" distB="0" distL="114300" distR="114300" simplePos="0" relativeHeight="251677696" behindDoc="0" locked="0" layoutInCell="1" allowOverlap="1" wp14:anchorId="3905314E" wp14:editId="5F139043">
+            <wp:simplePos x="0" y="0"/>
+            <wp:positionH relativeFrom="margin">
+              <wp:align>left</wp:align>
+            </wp:positionH>
+            <wp:positionV relativeFrom="margin">
+              <wp:posOffset>6566593</wp:posOffset>
+            </wp:positionV>
+            <wp:extent cx="3828415" cy="2006600"/>
+            <wp:effectExtent l="0" t="0" r="635" b="0"/>
+            <wp:wrapSquare wrapText="bothSides"/>
+            <wp:docPr id="372282176" name="Imagen 1"/>
+            <wp:cNvGraphicFramePr>
+              <a:graphicFrameLocks xmlns:a="http://schemas.openxmlformats.org/drawingml/2006/main" noChangeAspect="1"/>
+            </wp:cNvGraphicFramePr>
+            <a:graphic xmlns:a="http://schemas.openxmlformats.org/drawingml/2006/main">
+              <a:graphicData uri="http://schemas.openxmlformats.org/drawingml/2006/picture">
+                <pic:pic xmlns:pic="http://schemas.openxmlformats.org/drawingml/2006/picture">
+                  <pic:nvPicPr>
+                    <pic:cNvPr id="372282176" name=""/>
+                    <pic:cNvPicPr/>
+                  </pic:nvPicPr>
+                  <pic:blipFill>
+                    <a:blip r:embed="rId15">
+                      <a:extLst>
+                        <a:ext uri="{28A0092B-C50C-407E-A947-70E740481C1C}">
+                          <a14:useLocalDpi xmlns:a14="http://schemas.microsoft.com/office/drawing/2010/main" val="0"/>
+                        </a:ext>
+                      </a:extLst>
+                    </a:blip>
+                    <a:stretch>
+                      <a:fillRect/>
+                    </a:stretch>
+                  </pic:blipFill>
+                  <pic:spPr>
+                    <a:xfrm>
+                      <a:off x="0" y="0"/>
+                      <a:ext cx="3828415" cy="2006600"/>
+                    </a:xfrm>
+                    <a:prstGeom prst="rect">
+                      <a:avLst/>
+                    </a:prstGeom>
+                  </pic:spPr>
+                </pic:pic>
+              </a:graphicData>
+            </a:graphic>
+            <wp14:sizeRelH relativeFrom="margin">
+              <wp14:pctWidth>0</wp14:pctWidth>
+            </wp14:sizeRelH>
+            <wp14:sizeRelV relativeFrom="margin">
+              <wp14:pctHeight>0</wp14:pctHeight>
+            </wp14:sizeRelV>
+          </wp:anchor>
+        </w:drawing>
+      </w:r>
+      <w:r>
+        <w:rPr>
+          <w:i/>
+          <w:iCs/>
+          <w:sz w:val="20"/>
+          <w:szCs w:val="20"/>
+        </w:rPr>
+        <w:t>Definiendo las rutas base en el archivo de configuración</w:t>
+      </w:r>
+    </w:p>
+    <w:p>
+      <w:pPr>
+        <w:rPr>
+          <w:i/>
+          <w:iCs/>
+          <w:sz w:val="20"/>
+          <w:szCs w:val="20"/>
+        </w:rPr>
+      </w:pPr>
+    </w:p>
+    <w:p>
+      <w:pPr>
+        <w:rPr>
+          <w:i/>
+          <w:iCs/>
+          <w:sz w:val="20"/>
+          <w:szCs w:val="20"/>
+        </w:rPr>
+      </w:pPr>
+    </w:p>
+    <w:p>
+      <w:pPr>
+        <w:rPr>
+          <w:i/>
+          <w:iCs/>
+          <w:sz w:val="20"/>
+          <w:szCs w:val="20"/>
+        </w:rPr>
+      </w:pPr>
+    </w:p>
+    <w:p/>
+    <w:p/>
+    <w:p/>
+    <w:p/>
+    <w:p/>
+    <w:tbl>
+      <w:tblPr>
+        <w:tblStyle w:val="Tablaconcuadrcula"/>
+        <w:tblW w:w="0" w:type="auto"/>
+        <w:tblLook w:val="04A0" w:firstRow="1" w:lastRow="0" w:firstColumn="1" w:lastColumn="0" w:noHBand="0" w:noVBand="1"/>
+      </w:tblPr>
+      <w:tblGrid>
+        <w:gridCol w:w="2830"/>
+        <w:gridCol w:w="5664"/>
+      </w:tblGrid>
+      <w:tr>
+        <w:trPr>
+          <w:trHeight w:val="416"/>
+        </w:trPr>
+        <w:tc>
+          <w:tcPr>
+            <w:tcW w:w="2830" w:type="dxa"/>
+            <w:vAlign w:val="center"/>
+          </w:tcPr>
+          <w:p>
+            <w:pPr>
+              <w:jc w:val="center"/>
+            </w:pPr>
+            <w:r>
+              <w:lastRenderedPageBreak/>
+              <w:t>p</w:t>
+            </w:r>
+            <w:r>
+              <w:t>ath_background</w:t>
+            </w:r>
+          </w:p>
+        </w:tc>
+        <w:tc>
+          <w:tcPr>
+            <w:tcW w:w="5664" w:type="dxa"/>
+            <w:vAlign w:val="center"/>
+          </w:tcPr>
+          <w:p>
+            <w:pPr>
+              <w:jc w:val="center"/>
+            </w:pPr>
+            <w:r>
+              <w:t>La ruta de los fondos a mostrar.</w:t>
+            </w:r>
+          </w:p>
+        </w:tc>
+      </w:tr>
+      <w:tr>
+        <w:trPr>
+          <w:trHeight w:val="417"/>
+        </w:trPr>
+        <w:tc>
+          <w:tcPr>
+            <w:tcW w:w="2830" w:type="dxa"/>
+            <w:vAlign w:val="center"/>
+          </w:tcPr>
+          <w:p>
+            <w:pPr>
+              <w:jc w:val="center"/>
+            </w:pPr>
+            <w:r>
+              <w:t>p</w:t>
+            </w:r>
+            <w:r>
+              <w:t>ath_sound</w:t>
+            </w:r>
+          </w:p>
+        </w:tc>
+        <w:tc>
+          <w:tcPr>
+            <w:tcW w:w="5664" w:type="dxa"/>
+            <w:vAlign w:val="center"/>
+          </w:tcPr>
+          <w:p>
+            <w:pPr>
+              <w:jc w:val="center"/>
+            </w:pPr>
+            <w:r>
+              <w:t>La ruta de los efectos de sonido.</w:t>
+            </w:r>
+          </w:p>
+        </w:tc>
+      </w:tr>
+      <w:tr>
+        <w:trPr>
+          <w:trHeight w:val="409"/>
+        </w:trPr>
+        <w:tc>
+          <w:tcPr>
+            <w:tcW w:w="2830" w:type="dxa"/>
+            <w:vAlign w:val="center"/>
+          </w:tcPr>
+          <w:p>
+            <w:pPr>
+              <w:jc w:val="center"/>
+            </w:pPr>
+            <w:r>
+              <w:t>p</w:t>
+            </w:r>
+            <w:r>
+              <w:t>ath_music</w:t>
+            </w:r>
+          </w:p>
+        </w:tc>
+        <w:tc>
+          <w:tcPr>
+            <w:tcW w:w="5664" w:type="dxa"/>
+            <w:vAlign w:val="center"/>
+          </w:tcPr>
+          <w:p>
+            <w:pPr>
+              <w:jc w:val="center"/>
+            </w:pPr>
+            <w:r>
+              <w:t>La ruta de las canciones y músicas</w:t>
+            </w:r>
+            <w:r>
+              <w:t>.</w:t>
+            </w:r>
+          </w:p>
+        </w:tc>
+      </w:tr>
+      <w:tr>
+        <w:trPr>
+          <w:trHeight w:val="429"/>
+        </w:trPr>
+        <w:tc>
+          <w:tcPr>
+            <w:tcW w:w="2830" w:type="dxa"/>
+            <w:vAlign w:val="center"/>
+          </w:tcPr>
+          <w:p>
+            <w:pPr>
+              <w:jc w:val="center"/>
+            </w:pPr>
+            <w:r>
+              <w:t>p</w:t>
+            </w:r>
+            <w:r>
+              <w:t>ath_scene</w:t>
+            </w:r>
+          </w:p>
+        </w:tc>
+        <w:tc>
+          <w:tcPr>
+            <w:tcW w:w="5664" w:type="dxa"/>
+            <w:vAlign w:val="center"/>
+          </w:tcPr>
+          <w:p>
+            <w:pPr>
+              <w:jc w:val="center"/>
+            </w:pPr>
+            <w:r>
+              <w:t>La ruta donde se almacenarán todos los archivos de control (con su respectiva jerarquía de carpetas)</w:t>
+            </w:r>
+            <w:r>
+              <w:t>.</w:t>
+            </w:r>
+          </w:p>
+        </w:tc>
+      </w:tr>
+      <w:tr>
+        <w:trPr>
+          <w:trHeight w:val="406"/>
+        </w:trPr>
+        <w:tc>
+          <w:tcPr>
+            <w:tcW w:w="2830" w:type="dxa"/>
+            <w:vAlign w:val="center"/>
+          </w:tcPr>
+          <w:p>
+            <w:pPr>
+              <w:jc w:val="center"/>
+            </w:pPr>
+            <w:r>
+              <w:t>p</w:t>
+            </w:r>
+            <w:r>
+              <w:t>ath_displayable</w:t>
+            </w:r>
+          </w:p>
+        </w:tc>
+        <w:tc>
+          <w:tcPr>
+            <w:tcW w:w="5664" w:type="dxa"/>
+            <w:vAlign w:val="center"/>
+          </w:tcPr>
+          <w:p>
+            <w:pPr>
+              <w:jc w:val="center"/>
+            </w:pPr>
+            <w:r>
+              <w:t>La ruta de las imágenes que se mostrarán en pantalla (distinto a los fondos</w:t>
+            </w:r>
+            <w:r>
+              <w:t xml:space="preserve"> y personajes</w:t>
+            </w:r>
+            <w:r>
+              <w:t>)</w:t>
+            </w:r>
+            <w:r>
+              <w:t>.</w:t>
+            </w:r>
+          </w:p>
+        </w:tc>
+      </w:tr>
+    </w:tbl>
+    <w:p/>
+    <w:p>
+      <w:pPr>
+        <w:pStyle w:val="Ttulo2"/>
+      </w:pPr>
+      <w:bookmarkStart w:id="17" w:name="_Toc227172391"/>
+      <w:bookmarkStart w:id="18" w:name="_Toc227172392"/>
+      <w:r>
+        <w:t>Definición de fondos</w:t>
+      </w:r>
+      <w:bookmarkEnd w:id="18"/>
+    </w:p>
+    <w:p>
+      <w:r>
+        <w:tab/>
+      </w:r>
+      <w:r>
+        <w:tab/>
+        <w:t xml:space="preserve">El </w:t>
+      </w:r>
+      <w:r>
+        <w:rPr>
+          <w:i/>
+          <w:iCs/>
+        </w:rPr>
+        <w:t>Key</w:t>
+      </w:r>
+      <w:r>
+        <w:t xml:space="preserve"> correspondiente a una definición de </w:t>
+      </w:r>
+      <w:r>
+        <w:t>fondo</w:t>
+      </w:r>
+      <w:r>
+        <w:t xml:space="preserve"> comienza por “</w:t>
+      </w:r>
+      <w:r>
+        <w:rPr>
+          <w:i/>
+          <w:iCs/>
+        </w:rPr>
+        <w:t>background</w:t>
+      </w:r>
+      <w:r>
+        <w:rPr>
+          <w:i/>
+          <w:iCs/>
+        </w:rPr>
+        <w:t>”</w:t>
+      </w:r>
+      <w:r>
+        <w:t xml:space="preserve">, lo encontraremos aproximadamente por la fila </w:t>
+      </w:r>
+      <w:r>
+        <w:t>17</w:t>
+      </w:r>
+      <w:r>
+        <w:t xml:space="preserve"> y solo utilizará la columna </w:t>
+      </w:r>
+      <w:r>
+        <w:rPr>
+          <w:i/>
+          <w:iCs/>
+        </w:rPr>
+        <w:t>Value1.</w:t>
+      </w:r>
+    </w:p>
+    <w:p>
+      <w:pPr>
+        <w:ind w:firstLine="708"/>
+      </w:pPr>
+      <w:r>
+        <w:t>Los fondos son los escenarios que se muestran detrás de los personajes como por ejemplo un salón, un parque o un cielo estrellado.</w:t>
+      </w:r>
+    </w:p>
+    <w:p>
+      <w:pPr>
+        <w:ind w:firstLine="708"/>
+      </w:pPr>
+      <w:r>
+        <w:t>Los fondos se encuentran en la carpeta</w:t>
+      </w:r>
+      <w:r>
+        <w:rPr>
+          <w:i/>
+          <w:iCs/>
+        </w:rPr>
+        <w:t xml:space="preserve"> game/images/backgrounds</w:t>
+      </w:r>
+      <w:r>
+        <w:t>, deben ser en formato .png y preferiblemente tener la misma resolución, el tamaño recomendado es 1920x1080.</w:t>
+      </w:r>
+    </w:p>
+    <w:p>
+      <w:pPr>
+        <w:ind w:firstLine="708"/>
+      </w:pPr>
+      <w:r>
+        <w:t>Para agregar los fondos de nuestra novela, siguiendo el mismo formato, esta vez usando el key “background” definiremos un fondo. En este caso solo tendremos que escribir el nombre del archivo .png.</w:t>
+      </w:r>
+    </w:p>
+    <w:p>
+      <w:pPr>
+        <w:ind w:firstLine="708"/>
+      </w:pPr>
+      <w:r>
+        <w:rPr>
+          <w:noProof/>
+        </w:rPr>
+        <w:lastRenderedPageBreak/>
+        <w:drawing>
+          <wp:inline distT="0" distB="0" distL="0" distR="0" wp14:anchorId="2AEC27D1" wp14:editId="40C052B8">
+            <wp:extent cx="4219575" cy="6905625"/>
+            <wp:effectExtent l="0" t="0" r="9525" b="9525"/>
+            <wp:docPr id="837284710" name="Imagen 1"/>
+            <wp:cNvGraphicFramePr>
+              <a:graphicFrameLocks xmlns:a="http://schemas.openxmlformats.org/drawingml/2006/main" noChangeAspect="1"/>
+            </wp:cNvGraphicFramePr>
+            <a:graphic xmlns:a="http://schemas.openxmlformats.org/drawingml/2006/main">
+              <a:graphicData uri="http://schemas.openxmlformats.org/drawingml/2006/picture">
+                <pic:pic xmlns:pic="http://schemas.openxmlformats.org/drawingml/2006/picture">
+                  <pic:nvPicPr>
+                    <pic:cNvPr id="837284710" name=""/>
+                    <pic:cNvPicPr/>
+                  </pic:nvPicPr>
+                  <pic:blipFill>
+                    <a:blip r:embed="rId16"/>
+                    <a:stretch>
+                      <a:fillRect/>
+                    </a:stretch>
+                  </pic:blipFill>
+                  <pic:spPr>
+                    <a:xfrm>
+                      <a:off x="0" y="0"/>
+                      <a:ext cx="4219575" cy="6905625"/>
+                    </a:xfrm>
+                    <a:prstGeom prst="rect">
+                      <a:avLst/>
+                    </a:prstGeom>
+                  </pic:spPr>
+                </pic:pic>
+              </a:graphicData>
+            </a:graphic>
           </wp:inline>
         </w:drawing>
       </w:r>
     </w:p>
     <w:p>
+      <w:pPr>
+        <w:ind w:firstLine="708"/>
+      </w:pPr>
+      <w:r>
+        <w:t>Se recomienda no quitar los fondos flash y blackout ya que el motor los necesita para hacer algunas transiciones.</w:t>
+      </w:r>
+    </w:p>
+    <w:p>
+      <w:pPr>
+        <w:pStyle w:val="Ttulo2"/>
+      </w:pPr>
+    </w:p>
+    <w:p>
+      <w:pPr>
+        <w:pStyle w:val="Ttulo2"/>
+      </w:pPr>
+    </w:p>
+    <w:p>
+      <w:pPr>
+        <w:pStyle w:val="Ttulo2"/>
+      </w:pPr>
+      <w:r>
+        <w:t>Definición de personajes</w:t>
+      </w:r>
+      <w:bookmarkEnd w:id="17"/>
+    </w:p>
+    <w:p>
       <w:r>
         <w:tab/>
-        <w:t>Por otro lado</w:t>
-      </w:r>
-      <w:r>
-        <w:t>,</w:t>
-      </w:r>
-      <w:r>
-        <w:t xml:space="preserve"> si el inicio de nuestra novela es un script personalizado, colocaremos el nombre del label de nuestro script. Sin embargo, este asunto de los scripts personalizados será tratado más adelante con precisión.</w:t>
-      </w:r>
-    </w:p>
-    <w:p/>
-    <w:p>
-      <w:pPr>
-        <w:pStyle w:val="Ttulo2"/>
-      </w:pPr>
-      <w:bookmarkStart w:id="17" w:name="_Toc227172391"/>
-      <w:r>
-        <w:t>Definición de personajes</w:t>
-      </w:r>
-      <w:bookmarkEnd w:id="17"/>
+      </w:r>
+      <w:r>
+        <w:t xml:space="preserve">El </w:t>
+      </w:r>
+      <w:r>
+        <w:rPr>
+          <w:i/>
+          <w:iCs/>
+        </w:rPr>
+        <w:t>Key</w:t>
+      </w:r>
+      <w:r>
+        <w:t xml:space="preserve"> </w:t>
+      </w:r>
+      <w:r>
+        <w:t xml:space="preserve">correspondiente a una definición de </w:t>
+      </w:r>
+      <w:r>
+        <w:t xml:space="preserve">personaje </w:t>
+      </w:r>
+      <w:r>
+        <w:t>comienza por “</w:t>
+      </w:r>
+      <w:r>
+        <w:rPr>
+          <w:i/>
+          <w:iCs/>
+        </w:rPr>
+        <w:t>character</w:t>
+      </w:r>
+      <w:r>
+        <w:rPr>
+          <w:i/>
+          <w:iCs/>
+        </w:rPr>
+        <w:t>”</w:t>
+      </w:r>
+      <w:r>
+        <w:t xml:space="preserve">, lo encontraremos aproximadamente por la fila </w:t>
+      </w:r>
+      <w:r>
+        <w:t>21</w:t>
+      </w:r>
+      <w:r>
+        <w:t xml:space="preserve"> y solo utilizará la columna </w:t>
+      </w:r>
+      <w:r>
+        <w:rPr>
+          <w:i/>
+          <w:iCs/>
+        </w:rPr>
+        <w:t>Value1.</w:t>
+      </w:r>
     </w:p>
     <w:p>
       <w:r>
@@ -6115,7 +7215,7 @@
                     <pic:cNvPicPr/>
                   </pic:nvPicPr>
                   <pic:blipFill>
-                    <a:blip r:embed="rId12"/>
+                    <a:blip r:embed="rId17"/>
                     <a:stretch>
                       <a:fillRect/>
                     </a:stretch>
@@ -6147,7 +7247,7 @@
       <w:r>
         <w:t xml:space="preserve">es simplemente la representación de un color mediante un # y 6 dígitos, puedes usar herramientas como Paint o el sitio web </w:t>
       </w:r>
-      <w:hyperlink r:id="rId13" w:history="1">
+      <w:hyperlink r:id="rId18" w:history="1">
         <w:r>
           <w:rPr>
             <w:rStyle w:val="Hipervnculo"/>
@@ -6161,7 +7261,6 @@
     </w:p>
     <w:p>
       <w:r>
-        <w:lastRenderedPageBreak/>
         <w:tab/>
         <w:t xml:space="preserve">Si por ejemplo </w:t>
       </w:r>
@@ -6199,7 +7298,7 @@
                     <pic:cNvPicPr/>
                   </pic:nvPicPr>
                   <pic:blipFill>
-                    <a:blip r:embed="rId14"/>
+                    <a:blip r:embed="rId19"/>
                     <a:stretch>
                       <a:fillRect/>
                     </a:stretch>
@@ -6269,7 +7368,7 @@
                     <pic:cNvPicPr/>
                   </pic:nvPicPr>
                   <pic:blipFill>
-                    <a:blip r:embed="rId15"/>
+                    <a:blip r:embed="rId20"/>
                     <a:stretch>
                       <a:fillRect/>
                     </a:stretch>
@@ -6293,7 +7392,11 @@
     <w:p>
       <w:r>
         <w:tab/>
-        <w:t>En este ejemplo tenemos un personaje con el nombre clave “tableman”, el código hexadecimal #ffffff corresponde al color blanco y luego tenemos las distintas variaciones de nombre dependiendo del idioma, en español, inglés, chino y portugués respectivamente.</w:t>
+        <w:t xml:space="preserve">En este ejemplo tenemos un personaje con el nombre clave “tableman”, el código hexadecimal #ffffff corresponde al color blanco y luego tenemos las distintas variaciones </w:t>
+      </w:r>
+      <w:r>
+        <w:lastRenderedPageBreak/>
+        <w:t>de nombre dependiendo del idioma, en español, inglés, chino y portugués respectivamente.</w:t>
       </w:r>
     </w:p>
     <w:p>
@@ -6337,7 +7440,7 @@
                     <pic:cNvPicPr/>
                   </pic:nvPicPr>
                   <pic:blipFill>
-                    <a:blip r:embed="rId16"/>
+                    <a:blip r:embed="rId21"/>
                     <a:stretch>
                       <a:fillRect/>
                     </a:stretch>
@@ -6391,7 +7494,7 @@
                     <pic:cNvPicPr/>
                   </pic:nvPicPr>
                   <pic:blipFill>
-                    <a:blip r:embed="rId17"/>
+                    <a:blip r:embed="rId22"/>
                     <a:stretch>
                       <a:fillRect/>
                     </a:stretch>
@@ -6422,116 +7525,8 @@
       <w:pPr>
         <w:pStyle w:val="Ttulo2"/>
       </w:pPr>
-      <w:bookmarkStart w:id="18" w:name="_Toc227172392"/>
-      <w:r>
-        <w:t>Definición de fondos</w:t>
-      </w:r>
-      <w:bookmarkEnd w:id="18"/>
-    </w:p>
-    <w:p>
-      <w:pPr>
-        <w:ind w:firstLine="708"/>
-      </w:pPr>
-      <w:r>
-        <w:t>Los fondos son los escenarios que se muestran detrás de los personajes como por ejemplo un salón, un parque o un cielo estrellado</w:t>
-      </w:r>
-      <w:r>
-        <w:t>.</w:t>
-      </w:r>
-    </w:p>
-    <w:p>
-      <w:pPr>
-        <w:ind w:firstLine="708"/>
-      </w:pPr>
-      <w:r>
-        <w:t>Los fondos se encuentran en la carpeta</w:t>
-      </w:r>
-      <w:r>
-        <w:rPr>
-          <w:i/>
-          <w:iCs/>
-        </w:rPr>
-        <w:t xml:space="preserve"> game/images/backgrounds</w:t>
-      </w:r>
-      <w:r>
-        <w:t>, deben ser en formato .png y preferiblemente tener la misma resolución, el tamaño recomendado es 1920x1080</w:t>
-      </w:r>
-      <w:r>
-        <w:t>.</w:t>
-      </w:r>
-    </w:p>
-    <w:p>
-      <w:pPr>
-        <w:ind w:firstLine="708"/>
-      </w:pPr>
-      <w:r>
-        <w:lastRenderedPageBreak/>
-        <w:t>Para agregar los fondos de nuestra novela, siguiendo el mismo formato</w:t>
-      </w:r>
-      <w:r>
-        <w:t>, esta vez usando el key “background” definiremos un fondo. En este caso solo tendremos que escribir el nombre del archivo .png.</w:t>
-      </w:r>
-    </w:p>
-    <w:p>
-      <w:pPr>
-        <w:ind w:firstLine="708"/>
-      </w:pPr>
-      <w:r>
-        <w:rPr>
-          <w:noProof/>
-        </w:rPr>
-        <w:drawing>
-          <wp:inline distT="0" distB="0" distL="0" distR="0" wp14:anchorId="37A2F863" wp14:editId="021FC39D">
-            <wp:extent cx="4219575" cy="6905625"/>
-            <wp:effectExtent l="0" t="0" r="9525" b="9525"/>
-            <wp:docPr id="837284710" name="Imagen 1"/>
-            <wp:cNvGraphicFramePr>
-              <a:graphicFrameLocks xmlns:a="http://schemas.openxmlformats.org/drawingml/2006/main" noChangeAspect="1"/>
-            </wp:cNvGraphicFramePr>
-            <a:graphic xmlns:a="http://schemas.openxmlformats.org/drawingml/2006/main">
-              <a:graphicData uri="http://schemas.openxmlformats.org/drawingml/2006/picture">
-                <pic:pic xmlns:pic="http://schemas.openxmlformats.org/drawingml/2006/picture">
-                  <pic:nvPicPr>
-                    <pic:cNvPr id="837284710" name=""/>
-                    <pic:cNvPicPr/>
-                  </pic:nvPicPr>
-                  <pic:blipFill>
-                    <a:blip r:embed="rId18"/>
-                    <a:stretch>
-                      <a:fillRect/>
-                    </a:stretch>
-                  </pic:blipFill>
-                  <pic:spPr>
-                    <a:xfrm>
-                      <a:off x="0" y="0"/>
-                      <a:ext cx="4219575" cy="6905625"/>
-                    </a:xfrm>
-                    <a:prstGeom prst="rect">
-                      <a:avLst/>
-                    </a:prstGeom>
-                  </pic:spPr>
-                </pic:pic>
-              </a:graphicData>
-            </a:graphic>
-          </wp:inline>
-        </w:drawing>
-      </w:r>
-    </w:p>
-    <w:p>
-      <w:pPr>
-        <w:ind w:firstLine="708"/>
-      </w:pPr>
-      <w:r>
-        <w:t>Se recomienda no quitar los fondos flash y blackout ya que el motor los necesita para hacer algunas transiciones.</w:t>
-      </w:r>
-    </w:p>
-    <w:p>
-      <w:pPr>
-        <w:pStyle w:val="Ttulo2"/>
-      </w:pPr>
       <w:bookmarkStart w:id="19" w:name="_Toc227172393"/>
       <w:r>
-        <w:lastRenderedPageBreak/>
         <w:t>Configuraciones de rutas de archivos</w:t>
       </w:r>
       <w:bookmarkEnd w:id="19"/>
@@ -6563,7 +7558,7 @@
                     <pic:cNvPicPr/>
                   </pic:nvPicPr>
                   <pic:blipFill>
-                    <a:blip r:embed="rId19"/>
+                    <a:blip r:embed="rId23"/>
                     <a:stretch>
                       <a:fillRect/>
                     </a:stretch>
@@ -6590,6 +7585,7 @@
       </w:pPr>
       <w:bookmarkStart w:id="20" w:name="_Toc227172394"/>
       <w:r>
+        <w:lastRenderedPageBreak/>
         <w:t>Definición de configuraciones técnicas</w:t>
       </w:r>
       <w:bookmarkEnd w:id="20"/>
@@ -6667,7 +7663,7 @@
                     <pic:cNvPicPr/>
                   </pic:nvPicPr>
                   <pic:blipFill>
-                    <a:blip r:embed="rId20"/>
+                    <a:blip r:embed="rId24"/>
                     <a:stretch>
                       <a:fillRect/>
                     </a:stretch>
@@ -6694,7 +7690,6 @@
       </w:pPr>
       <w:bookmarkStart w:id="21" w:name="_Toc227172395"/>
       <w:r>
-        <w:lastRenderedPageBreak/>
         <w:t>Archivo</w:t>
       </w:r>
       <w:r>
@@ -6747,6 +7742,7 @@
         <w:rPr>
           <w:noProof/>
         </w:rPr>
+        <w:lastRenderedPageBreak/>
         <w:drawing>
           <wp:anchor distT="0" distB="0" distL="114300" distR="114300" simplePos="0" relativeHeight="251664384" behindDoc="0" locked="0" layoutInCell="1" allowOverlap="1" wp14:anchorId="2CC1E109" wp14:editId="719FFC7E">
             <wp:simplePos x="0" y="0"/>
@@ -6771,7 +7767,7 @@
                     <pic:cNvPicPr/>
                   </pic:nvPicPr>
                   <pic:blipFill>
-                    <a:blip r:embed="rId21">
+                    <a:blip r:embed="rId25">
                       <a:extLst>
                         <a:ext uri="{28A0092B-C50C-407E-A947-70E740481C1C}">
                           <a14:useLocalDpi xmlns:a14="http://schemas.microsoft.com/office/drawing/2010/main" val="0"/>
@@ -6826,7 +7822,6 @@
     <w:p/>
     <w:p>
       <w:r>
-        <w:lastRenderedPageBreak/>
         <w:tab/>
         <w:t>Si tienes dudas puedes optar por simplemente copiar y pegar alguno de los archivos de control de ejemplo que proporciona Atlax Renpy, borrar su contenido y empezar desde allí.</w:t>
       </w:r>
@@ -6886,7 +7881,7 @@
                     <pic:cNvPicPr/>
                   </pic:nvPicPr>
                   <pic:blipFill>
-                    <a:blip r:embed="rId22">
+                    <a:blip r:embed="rId26">
                       <a:extLst>
                         <a:ext uri="{28A0092B-C50C-407E-A947-70E740481C1C}">
                           <a14:useLocalDpi xmlns:a14="http://schemas.microsoft.com/office/drawing/2010/main" val="0"/>
@@ -6946,7 +7941,7 @@
                     <pic:cNvPicPr/>
                   </pic:nvPicPr>
                   <pic:blipFill>
-                    <a:blip r:embed="rId23">
+                    <a:blip r:embed="rId27">
                       <a:extLst>
                         <a:ext uri="{28A0092B-C50C-407E-A947-70E740481C1C}">
                           <a14:useLocalDpi xmlns:a14="http://schemas.microsoft.com/office/drawing/2010/main" val="0"/>
@@ -6989,6 +7984,7 @@
       </w:pPr>
       <w:bookmarkStart w:id="22" w:name="_Toc227172396"/>
       <w:r>
+        <w:lastRenderedPageBreak/>
         <w:t>Estructura</w:t>
       </w:r>
       <w:bookmarkEnd w:id="22"/>
@@ -7081,7 +8077,7 @@
                     <pic:cNvPicPr/>
                   </pic:nvPicPr>
                   <pic:blipFill>
-                    <a:blip r:embed="rId24">
+                    <a:blip r:embed="rId28">
                       <a:extLst>
                         <a:ext uri="{28A0092B-C50C-407E-A947-70E740481C1C}">
                           <a14:useLocalDpi xmlns:a14="http://schemas.microsoft.com/office/drawing/2010/main" val="0"/>
@@ -7216,7 +8212,6 @@
       </w:pPr>
       <w:bookmarkStart w:id="23" w:name="_Toc227172397"/>
       <w:r>
-        <w:lastRenderedPageBreak/>
         <w:t>Columna Key</w:t>
       </w:r>
       <w:bookmarkEnd w:id="23"/>
@@ -7249,6 +8244,7 @@
         <w:rPr>
           <w:noProof/>
         </w:rPr>
+        <w:lastRenderedPageBreak/>
         <w:drawing>
           <wp:anchor distT="0" distB="0" distL="114300" distR="114300" simplePos="0" relativeHeight="251663360" behindDoc="0" locked="0" layoutInCell="1" allowOverlap="1" wp14:anchorId="461CB017" wp14:editId="0AE9517A">
             <wp:simplePos x="0" y="0"/>
@@ -7273,7 +8269,7 @@
                     <pic:cNvPicPr/>
                   </pic:nvPicPr>
                   <pic:blipFill>
-                    <a:blip r:embed="rId25">
+                    <a:blip r:embed="rId29">
                       <a:extLst>
                         <a:ext uri="{28A0092B-C50C-407E-A947-70E740481C1C}">
                           <a14:useLocalDpi xmlns:a14="http://schemas.microsoft.com/office/drawing/2010/main" val="0"/>
@@ -7332,7 +8328,7 @@
                     <pic:cNvPicPr/>
                   </pic:nvPicPr>
                   <pic:blipFill>
-                    <a:blip r:embed="rId26">
+                    <a:blip r:embed="rId30">
                       <a:extLst>
                         <a:ext uri="{28A0092B-C50C-407E-A947-70E740481C1C}">
                           <a14:useLocalDpi xmlns:a14="http://schemas.microsoft.com/office/drawing/2010/main" val="0"/>
@@ -7436,7 +8432,6 @@
       </w:pPr>
       <w:bookmarkStart w:id="24" w:name="_Toc227172398"/>
       <w:r>
-        <w:lastRenderedPageBreak/>
         <w:t>Columna Background</w:t>
       </w:r>
       <w:bookmarkEnd w:id="24"/>
@@ -7652,6 +8647,7 @@
               <w:jc w:val="center"/>
             </w:pPr>
             <w:r>
+              <w:lastRenderedPageBreak/>
               <w:t>dissolve</w:t>
             </w:r>
           </w:p>
@@ -8092,7 +9088,6 @@
       </w:pPr>
       <w:bookmarkStart w:id="26" w:name="_Toc227172400"/>
       <w:r>
-        <w:lastRenderedPageBreak/>
         <w:t>Columna Music</w:t>
       </w:r>
       <w:bookmarkEnd w:id="26"/>
@@ -8215,6 +9210,7 @@
         <w:ind w:firstLine="708"/>
       </w:pPr>
       <w:r>
+        <w:lastRenderedPageBreak/>
         <w:t>Para quitar la música y crear un silencio, simplemente debemos colocar un *, por supuesto, también podemos acompañarlo del parámetro de fade-in</w:t>
       </w:r>
       <w:r>
@@ -8337,7 +9333,6 @@
     </w:p>
     <w:p>
       <w:r>
-        <w:lastRenderedPageBreak/>
         <w:tab/>
         <w:t xml:space="preserve">Si colocamos el nombre del sonido sin más, este se reproducirá una sola vez. Para reproducir varios sonidos simultáneamente, debemos separarlos por comas. Si deseamos que el sonido se reproduzca constantemente debemos añadir :loop, es importante mencionar que hacer eso hará que el sonido se reproduzca indefinidamente hasta que volvamos a escribir la misma instrucción más adelante. </w:t>
       </w:r>
@@ -8445,6 +9440,7 @@
       </w:pPr>
       <w:bookmarkStart w:id="28" w:name="_Toc227172402"/>
       <w:r>
+        <w:lastRenderedPageBreak/>
         <w:t>Columna Single effect</w:t>
       </w:r>
       <w:bookmarkEnd w:id="28"/>
@@ -8772,7 +9768,6 @@
         <w:rPr>
           <w:highlight w:val="yellow"/>
         </w:rPr>
-        <w:lastRenderedPageBreak/>
         <w:t>vpunch:50</w:t>
       </w:r>
       <w:r>
@@ -8838,7 +9833,11 @@
         <w:t>Es similar a los Single Effects, solo que esta vez es un efecto que sucede constantemente en pantalla y persiste indefinidamente hasta que se vuelva a llamar</w:t>
       </w:r>
       <w:r>
-        <w:t>. Se pueden dividir en dos, aquellos efectos continuos que interactúan con el fondo actual, y aquellos que colocan una imagen por encima.</w:t>
+        <w:t xml:space="preserve">. Se pueden dividir en dos, aquellos efectos continuos que interactúan con el fondo actual, y </w:t>
+      </w:r>
+      <w:r>
+        <w:lastRenderedPageBreak/>
+        <w:t>aquellos que colocan una imagen por encima.</w:t>
       </w:r>
       <w:r>
         <w:t xml:space="preserve"> </w:t>
@@ -9188,7 +10187,6 @@
       </w:pPr>
       <w:bookmarkStart w:id="32" w:name="_Toc227172406"/>
       <w:r>
-        <w:lastRenderedPageBreak/>
         <w:t>Efectos que colocan una imagen encima del fondo</w:t>
       </w:r>
       <w:bookmarkEnd w:id="32"/>
@@ -9359,6 +10357,7 @@
         <w:rPr>
           <w:highlight w:val="yellow"/>
         </w:rPr>
+        <w:lastRenderedPageBreak/>
         <w:t>Suffocation:</w:t>
       </w:r>
       <w:r>
@@ -9480,7 +10479,7 @@
                     <pic:cNvPicPr/>
                   </pic:nvPicPr>
                   <pic:blipFill>
-                    <a:blip r:embed="rId27"/>
+                    <a:blip r:embed="rId31"/>
                     <a:stretch>
                       <a:fillRect/>
                     </a:stretch>
@@ -9523,7 +10522,7 @@
                     <pic:cNvPicPr/>
                   </pic:nvPicPr>
                   <pic:blipFill>
-                    <a:blip r:embed="rId28"/>
+                    <a:blip r:embed="rId32"/>
                     <a:stretch>
                       <a:fillRect/>
                     </a:stretch>
@@ -9566,7 +10565,7 @@
                     <pic:cNvPicPr/>
                   </pic:nvPicPr>
                   <pic:blipFill>
-                    <a:blip r:embed="rId29"/>
+                    <a:blip r:embed="rId33"/>
                     <a:stretch>
                       <a:fillRect/>
                     </a:stretch>
@@ -9596,6 +10595,7 @@
         <w:rPr>
           <w:noProof/>
         </w:rPr>
+        <w:lastRenderedPageBreak/>
         <w:drawing>
           <wp:anchor distT="0" distB="0" distL="114300" distR="114300" simplePos="0" relativeHeight="251665408" behindDoc="0" locked="0" layoutInCell="1" allowOverlap="1" wp14:anchorId="51A0E446" wp14:editId="3E15DE6D">
             <wp:simplePos x="0" y="0"/>
@@ -9620,7 +10620,7 @@
                     <pic:cNvPicPr/>
                   </pic:nvPicPr>
                   <pic:blipFill>
-                    <a:blip r:embed="rId30">
+                    <a:blip r:embed="rId34">
                       <a:extLst>
                         <a:ext uri="{28A0092B-C50C-407E-A947-70E740481C1C}">
                           <a14:useLocalDpi xmlns:a14="http://schemas.microsoft.com/office/drawing/2010/main" val="0"/>
@@ -9708,7 +10708,7 @@
                     <pic:cNvPicPr/>
                   </pic:nvPicPr>
                   <pic:blipFill>
-                    <a:blip r:embed="rId31" cstate="print">
+                    <a:blip r:embed="rId35" cstate="print">
                       <a:extLst>
                         <a:ext uri="{28A0092B-C50C-407E-A947-70E740481C1C}">
                           <a14:useLocalDpi xmlns:a14="http://schemas.microsoft.com/office/drawing/2010/main" val="0"/>
@@ -9769,7 +10769,7 @@
                     <pic:cNvPicPr/>
                   </pic:nvPicPr>
                   <pic:blipFill>
-                    <a:blip r:embed="rId32" cstate="print">
+                    <a:blip r:embed="rId36" cstate="print">
                       <a:extLst>
                         <a:ext uri="{28A0092B-C50C-407E-A947-70E740481C1C}">
                           <a14:useLocalDpi xmlns:a14="http://schemas.microsoft.com/office/drawing/2010/main" val="0"/>
@@ -9816,18 +10816,18 @@
         <w:ind w:firstLine="708"/>
       </w:pPr>
       <w:r>
+        <w:t>Si recortásemos ese espacio en blanco su Sprite quedaría descentrado de la siguiente manera.</w:t>
+      </w:r>
+    </w:p>
+    <w:p>
+      <w:pPr>
+        <w:ind w:firstLine="708"/>
+      </w:pPr>
+      <w:r>
+        <w:rPr>
+          <w:noProof/>
+        </w:rPr>
         <w:lastRenderedPageBreak/>
-        <w:t>Si recortásemos ese espacio en blanco su Sprite quedaría descentrado de la siguiente manera.</w:t>
-      </w:r>
-    </w:p>
-    <w:p>
-      <w:pPr>
-        <w:ind w:firstLine="708"/>
-      </w:pPr>
-      <w:r>
-        <w:rPr>
-          <w:noProof/>
-        </w:rPr>
         <w:drawing>
           <wp:anchor distT="0" distB="0" distL="114300" distR="114300" simplePos="0" relativeHeight="251669504" behindDoc="0" locked="0" layoutInCell="1" allowOverlap="1" wp14:anchorId="20D80200" wp14:editId="1C1BCD76">
             <wp:simplePos x="0" y="0"/>
@@ -9852,7 +10852,7 @@
                     <pic:cNvPicPr/>
                   </pic:nvPicPr>
                   <pic:blipFill>
-                    <a:blip r:embed="rId33" cstate="print">
+                    <a:blip r:embed="rId37" cstate="print">
                       <a:extLst>
                         <a:ext uri="{28A0092B-C50C-407E-A947-70E740481C1C}">
                           <a14:useLocalDpi xmlns:a14="http://schemas.microsoft.com/office/drawing/2010/main" val="0"/>
@@ -9945,7 +10945,7 @@
                     <pic:cNvPicPr/>
                   </pic:nvPicPr>
                   <pic:blipFill>
-                    <a:blip r:embed="rId34" cstate="print">
+                    <a:blip r:embed="rId38" cstate="print">
                       <a:extLst>
                         <a:ext uri="{28A0092B-C50C-407E-A947-70E740481C1C}">
                           <a14:useLocalDpi xmlns:a14="http://schemas.microsoft.com/office/drawing/2010/main" val="0"/>
@@ -10064,7 +11064,7 @@
                     <pic:cNvPicPr/>
                   </pic:nvPicPr>
                   <pic:blipFill>
-                    <a:blip r:embed="rId35" cstate="print">
+                    <a:blip r:embed="rId39" cstate="print">
                       <a:extLst>
                         <a:ext uri="{28A0092B-C50C-407E-A947-70E740481C1C}">
                           <a14:useLocalDpi xmlns:a14="http://schemas.microsoft.com/office/drawing/2010/main" val="0"/>
@@ -12710,7 +13710,7 @@
       <w:r>
         <w:t xml:space="preserve">ntos pixeles tiene tu diálogo puedes utilizar el siguiente sitio web: </w:t>
       </w:r>
-      <w:hyperlink r:id="rId36" w:history="1">
+      <w:hyperlink r:id="rId40" w:history="1">
         <w:r>
           <w:rPr>
             <w:rStyle w:val="Hipervnculo"/>
@@ -12732,7 +13732,7 @@
       <w:r>
         <w:t xml:space="preserve"> columnas de idioma. Existen muchos modificadores de texto así que te recomiendo leer la documentación de Renpy para intentar implementarlos. </w:t>
       </w:r>
-      <w:hyperlink r:id="rId37" w:anchor="text-tag-alpha" w:history="1">
+      <w:hyperlink r:id="rId41" w:anchor="text-tag-alpha" w:history="1">
         <w:r>
           <w:rPr>
             <w:rStyle w:val="Hipervnculo"/>
@@ -12817,7 +13817,7 @@
                     <pic:cNvPicPr/>
                   </pic:nvPicPr>
                   <pic:blipFill>
-                    <a:blip r:embed="rId38"/>
+                    <a:blip r:embed="rId42"/>
                     <a:stretch>
                       <a:fillRect/>
                     </a:stretch>
@@ -12943,7 +13943,7 @@
                     <pic:cNvPicPr/>
                   </pic:nvPicPr>
                   <pic:blipFill>
-                    <a:blip r:embed="rId39"/>
+                    <a:blip r:embed="rId43"/>
                     <a:stretch>
                       <a:fillRect/>
                     </a:stretch>
@@ -13339,7 +14339,7 @@
                     <pic:cNvPicPr/>
                   </pic:nvPicPr>
                   <pic:blipFill>
-                    <a:blip r:embed="rId40"/>
+                    <a:blip r:embed="rId44"/>
                     <a:stretch>
                       <a:fillRect/>
                     </a:stretch>
@@ -13397,7 +14397,7 @@
                     <pic:cNvPicPr/>
                   </pic:nvPicPr>
                   <pic:blipFill>
-                    <a:blip r:embed="rId41"/>
+                    <a:blip r:embed="rId45"/>
                     <a:stretch>
                       <a:fillRect/>
                     </a:stretch>
@@ -13921,7 +14921,7 @@
                     <pic:cNvPicPr/>
                   </pic:nvPicPr>
                   <pic:blipFill>
-                    <a:blip r:embed="rId42"/>
+                    <a:blip r:embed="rId46"/>
                     <a:stretch>
                       <a:fillRect/>
                     </a:stretch>
@@ -13966,7 +14966,7 @@
                     <pic:cNvPicPr/>
                   </pic:nvPicPr>
                   <pic:blipFill>
-                    <a:blip r:embed="rId43"/>
+                    <a:blip r:embed="rId47"/>
                     <a:stretch>
                       <a:fillRect/>
                     </a:stretch>
@@ -14036,7 +15036,7 @@
                     <pic:cNvPicPr/>
                   </pic:nvPicPr>
                   <pic:blipFill>
-                    <a:blip r:embed="rId44"/>
+                    <a:blip r:embed="rId48"/>
                     <a:stretch>
                       <a:fillRect/>
                     </a:stretch>
@@ -14420,7 +15420,7 @@
                     <pic:cNvPicPr/>
                   </pic:nvPicPr>
                   <pic:blipFill>
-                    <a:blip r:embed="rId45"/>
+                    <a:blip r:embed="rId49"/>
                     <a:stretch>
                       <a:fillRect/>
                     </a:stretch>
@@ -14725,7 +15725,7 @@
                     <pic:cNvPicPr/>
                   </pic:nvPicPr>
                   <pic:blipFill>
-                    <a:blip r:embed="rId46"/>
+                    <a:blip r:embed="rId50"/>
                     <a:stretch>
                       <a:fillRect/>
                     </a:stretch>
@@ -14866,7 +15866,7 @@
                     <pic:cNvPicPr/>
                   </pic:nvPicPr>
                   <pic:blipFill>
-                    <a:blip r:embed="rId47"/>
+                    <a:blip r:embed="rId51"/>
                     <a:stretch>
                       <a:fillRect/>
                     </a:stretch>
@@ -16066,7 +17066,7 @@
                     <pic:cNvPicPr/>
                   </pic:nvPicPr>
                   <pic:blipFill>
-                    <a:blip r:embed="rId48"/>
+                    <a:blip r:embed="rId52"/>
                     <a:stretch>
                       <a:fillRect/>
                     </a:stretch>
@@ -16157,7 +17157,7 @@
                     <pic:cNvPicPr/>
                   </pic:nvPicPr>
                   <pic:blipFill>
-                    <a:blip r:embed="rId49"/>
+                    <a:blip r:embed="rId53"/>
                     <a:stretch>
                       <a:fillRect/>
                     </a:stretch>
@@ -16407,7 +17407,7 @@
                     <pic:cNvPicPr/>
                   </pic:nvPicPr>
                   <pic:blipFill>
-                    <a:blip r:embed="rId50"/>
+                    <a:blip r:embed="rId54"/>
                     <a:stretch>
                       <a:fillRect/>
                     </a:stretch>
@@ -16506,7 +17506,7 @@
                     <pic:cNvPicPr/>
                   </pic:nvPicPr>
                   <pic:blipFill>
-                    <a:blip r:embed="rId51">
+                    <a:blip r:embed="rId55">
                       <a:extLst>
                         <a:ext uri="{28A0092B-C50C-407E-A947-70E740481C1C}">
                           <a14:useLocalDpi xmlns:a14="http://schemas.microsoft.com/office/drawing/2010/main" val="0"/>
@@ -16928,7 +17928,7 @@
                     <pic:cNvPicPr/>
                   </pic:nvPicPr>
                   <pic:blipFill>
-                    <a:blip r:embed="rId52">
+                    <a:blip r:embed="rId56">
                       <a:extLst>
                         <a:ext uri="{28A0092B-C50C-407E-A947-70E740481C1C}">
                           <a14:useLocalDpi xmlns:a14="http://schemas.microsoft.com/office/drawing/2010/main" val="0"/>
@@ -17050,7 +18050,7 @@
       <w:r>
         <w:t xml:space="preserve">mo usarla. </w:t>
       </w:r>
-      <w:hyperlink r:id="rId53" w:history="1">
+      <w:hyperlink r:id="rId57" w:history="1">
         <w:r>
           <w:rPr>
             <w:rStyle w:val="Hipervnculo"/>
@@ -17131,7 +18131,7 @@
       <w:r>
         <w:t xml:space="preserve">Visual Novel Technical Assistant: </w:t>
       </w:r>
-      <w:hyperlink r:id="rId54" w:history="1">
+      <w:hyperlink r:id="rId58" w:history="1">
         <w:r>
           <w:rPr>
             <w:rStyle w:val="Hipervnculo"/>
@@ -17145,9 +18145,27 @@
     </w:p>
     <w:p>
       <w:r>
+        <w:t>Repositorio de Atlax Renpy:</w:t>
+      </w:r>
+    </w:p>
+    <w:p>
+      <w:r>
+        <w:t xml:space="preserve">Github: </w:t>
+      </w:r>
+      <w:hyperlink r:id="rId59" w:history="1">
+        <w:r>
+          <w:rPr>
+            <w:rStyle w:val="Hipervnculo"/>
+          </w:rPr>
+          <w:t>https://github.com/</w:t>
+        </w:r>
+      </w:hyperlink>
+    </w:p>
+    <w:p>
+      <w:r>
         <w:t xml:space="preserve">Códigos de colores hexadecimales: </w:t>
       </w:r>
-      <w:hyperlink r:id="rId55" w:history="1">
+      <w:hyperlink r:id="rId60" w:history="1">
         <w:r>
           <w:rPr>
             <w:rStyle w:val="Hipervnculo"/>
@@ -17163,7 +18181,7 @@
       <w:r>
         <w:t xml:space="preserve">Calculadora de ancho de pixeles de un texto: </w:t>
       </w:r>
-      <w:hyperlink r:id="rId56" w:history="1">
+      <w:hyperlink r:id="rId61" w:history="1">
         <w:r>
           <w:rPr>
             <w:rStyle w:val="Hipervnculo"/>
@@ -17176,7 +18194,7 @@
       <w:r>
         <w:t xml:space="preserve">Modificadores de texto en Renpy: </w:t>
       </w:r>
-      <w:hyperlink r:id="rId57" w:anchor="text-tag-alpha" w:history="1">
+      <w:hyperlink r:id="rId62" w:anchor="text-tag-alpha" w:history="1">
         <w:r>
           <w:rPr>
             <w:rStyle w:val="Hipervnculo"/>
@@ -17187,9 +18205,10 @@
     </w:p>
     <w:p>
       <w:r>
+        <w:lastRenderedPageBreak/>
         <w:t xml:space="preserve">Sitio web de Atlantox: </w:t>
       </w:r>
-      <w:hyperlink r:id="rId58" w:history="1">
+      <w:hyperlink r:id="rId63" w:history="1">
         <w:r>
           <w:rPr>
             <w:rStyle w:val="Hipervnculo"/>
@@ -17935,6 +18954,119 @@
     </w:lvl>
   </w:abstractNum>
   <w:abstractNum w:abstractNumId="6" w15:restartNumberingAfterBreak="0">
+    <w:nsid w:val="212B3076"/>
+    <w:multiLevelType w:val="hybridMultilevel"/>
+    <w:tmpl w:val="AD589D78"/>
+    <w:lvl w:ilvl="0" w:tplc="200A0001">
+      <w:start w:val="1"/>
+      <w:numFmt w:val="bullet"/>
+      <w:lvlText w:val=""/>
+      <w:lvlJc w:val="left"/>
+      <w:pPr>
+        <w:ind w:left="720" w:hanging="360"/>
+      </w:pPr>
+      <w:rPr>
+        <w:rFonts w:ascii="Symbol" w:hAnsi="Symbol" w:hint="default"/>
+      </w:rPr>
+    </w:lvl>
+    <w:lvl w:ilvl="1" w:tplc="200A0003">
+      <w:start w:val="1"/>
+      <w:numFmt w:val="bullet"/>
+      <w:lvlText w:val="o"/>
+      <w:lvlJc w:val="left"/>
+      <w:pPr>
+        <w:ind w:left="1440" w:hanging="360"/>
+      </w:pPr>
+      <w:rPr>
+        <w:rFonts w:ascii="Courier New" w:hAnsi="Courier New" w:cs="Courier New" w:hint="default"/>
+      </w:rPr>
+    </w:lvl>
+    <w:lvl w:ilvl="2" w:tplc="200A0005" w:tentative="1">
+      <w:start w:val="1"/>
+      <w:numFmt w:val="bullet"/>
+      <w:lvlText w:val=""/>
+      <w:lvlJc w:val="left"/>
+      <w:pPr>
+        <w:ind w:left="2160" w:hanging="360"/>
+      </w:pPr>
+      <w:rPr>
+        <w:rFonts w:ascii="Wingdings" w:hAnsi="Wingdings" w:hint="default"/>
+      </w:rPr>
+    </w:lvl>
+    <w:lvl w:ilvl="3" w:tplc="200A0001" w:tentative="1">
+      <w:start w:val="1"/>
+      <w:numFmt w:val="bullet"/>
+      <w:lvlText w:val=""/>
+      <w:lvlJc w:val="left"/>
+      <w:pPr>
+        <w:ind w:left="2880" w:hanging="360"/>
+      </w:pPr>
+      <w:rPr>
+        <w:rFonts w:ascii="Symbol" w:hAnsi="Symbol" w:hint="default"/>
+      </w:rPr>
+    </w:lvl>
+    <w:lvl w:ilvl="4" w:tplc="200A0003" w:tentative="1">
+      <w:start w:val="1"/>
+      <w:numFmt w:val="bullet"/>
+      <w:lvlText w:val="o"/>
+      <w:lvlJc w:val="left"/>
+      <w:pPr>
+        <w:ind w:left="3600" w:hanging="360"/>
+      </w:pPr>
+      <w:rPr>
+        <w:rFonts w:ascii="Courier New" w:hAnsi="Courier New" w:cs="Courier New" w:hint="default"/>
+      </w:rPr>
+    </w:lvl>
+    <w:lvl w:ilvl="5" w:tplc="200A0005" w:tentative="1">
+      <w:start w:val="1"/>
+      <w:numFmt w:val="bullet"/>
+      <w:lvlText w:val=""/>
+      <w:lvlJc w:val="left"/>
+      <w:pPr>
+        <w:ind w:left="4320" w:hanging="360"/>
+      </w:pPr>
+      <w:rPr>
+        <w:rFonts w:ascii="Wingdings" w:hAnsi="Wingdings" w:hint="default"/>
+      </w:rPr>
+    </w:lvl>
+    <w:lvl w:ilvl="6" w:tplc="200A0001" w:tentative="1">
+      <w:start w:val="1"/>
+      <w:numFmt w:val="bullet"/>
+      <w:lvlText w:val=""/>
+      <w:lvlJc w:val="left"/>
+      <w:pPr>
+        <w:ind w:left="5040" w:hanging="360"/>
+      </w:pPr>
+      <w:rPr>
+        <w:rFonts w:ascii="Symbol" w:hAnsi="Symbol" w:hint="default"/>
+      </w:rPr>
+    </w:lvl>
+    <w:lvl w:ilvl="7" w:tplc="200A0003" w:tentative="1">
+      <w:start w:val="1"/>
+      <w:numFmt w:val="bullet"/>
+      <w:lvlText w:val="o"/>
+      <w:lvlJc w:val="left"/>
+      <w:pPr>
+        <w:ind w:left="5760" w:hanging="360"/>
+      </w:pPr>
+      <w:rPr>
+        <w:rFonts w:ascii="Courier New" w:hAnsi="Courier New" w:cs="Courier New" w:hint="default"/>
+      </w:rPr>
+    </w:lvl>
+    <w:lvl w:ilvl="8" w:tplc="200A0005" w:tentative="1">
+      <w:start w:val="1"/>
+      <w:numFmt w:val="bullet"/>
+      <w:lvlText w:val=""/>
+      <w:lvlJc w:val="left"/>
+      <w:pPr>
+        <w:ind w:left="6480" w:hanging="360"/>
+      </w:pPr>
+      <w:rPr>
+        <w:rFonts w:ascii="Wingdings" w:hAnsi="Wingdings" w:hint="default"/>
+      </w:rPr>
+    </w:lvl>
+  </w:abstractNum>
+  <w:abstractNum w:abstractNumId="7" w15:restartNumberingAfterBreak="0">
     <w:nsid w:val="22F95A1C"/>
     <w:multiLevelType w:val="hybridMultilevel"/>
     <w:tmpl w:val="79264C64"/>
@@ -18020,7 +19152,7 @@
       </w:pPr>
     </w:lvl>
   </w:abstractNum>
-  <w:abstractNum w:abstractNumId="7" w15:restartNumberingAfterBreak="0">
+  <w:abstractNum w:abstractNumId="8" w15:restartNumberingAfterBreak="0">
     <w:nsid w:val="2C933685"/>
     <w:multiLevelType w:val="hybridMultilevel"/>
     <w:tmpl w:val="A7AC24A0"/>
@@ -18106,7 +19238,7 @@
       </w:pPr>
     </w:lvl>
   </w:abstractNum>
-  <w:abstractNum w:abstractNumId="8" w15:restartNumberingAfterBreak="0">
+  <w:abstractNum w:abstractNumId="9" w15:restartNumberingAfterBreak="0">
     <w:nsid w:val="34E74BA5"/>
     <w:multiLevelType w:val="hybridMultilevel"/>
     <w:tmpl w:val="6B0E7984"/>
@@ -18195,7 +19327,7 @@
       </w:pPr>
     </w:lvl>
   </w:abstractNum>
-  <w:abstractNum w:abstractNumId="9" w15:restartNumberingAfterBreak="0">
+  <w:abstractNum w:abstractNumId="10" w15:restartNumberingAfterBreak="0">
     <w:nsid w:val="35BB7E8F"/>
     <w:multiLevelType w:val="hybridMultilevel"/>
     <w:tmpl w:val="2DF213C2"/>
@@ -18308,7 +19440,7 @@
       </w:rPr>
     </w:lvl>
   </w:abstractNum>
-  <w:abstractNum w:abstractNumId="10" w15:restartNumberingAfterBreak="0">
+  <w:abstractNum w:abstractNumId="11" w15:restartNumberingAfterBreak="0">
     <w:nsid w:val="391A4D18"/>
     <w:multiLevelType w:val="hybridMultilevel"/>
     <w:tmpl w:val="BFCC90D6"/>
@@ -18394,7 +19526,7 @@
       </w:pPr>
     </w:lvl>
   </w:abstractNum>
-  <w:abstractNum w:abstractNumId="11" w15:restartNumberingAfterBreak="0">
+  <w:abstractNum w:abstractNumId="12" w15:restartNumberingAfterBreak="0">
     <w:nsid w:val="3A74320C"/>
     <w:multiLevelType w:val="hybridMultilevel"/>
     <w:tmpl w:val="6E88E228"/>
@@ -18507,7 +19639,7 @@
       </w:rPr>
     </w:lvl>
   </w:abstractNum>
-  <w:abstractNum w:abstractNumId="12" w15:restartNumberingAfterBreak="0">
+  <w:abstractNum w:abstractNumId="13" w15:restartNumberingAfterBreak="0">
     <w:nsid w:val="3D616461"/>
     <w:multiLevelType w:val="hybridMultilevel"/>
     <w:tmpl w:val="5E869988"/>
@@ -18620,7 +19752,7 @@
       </w:rPr>
     </w:lvl>
   </w:abstractNum>
-  <w:abstractNum w:abstractNumId="13" w15:restartNumberingAfterBreak="0">
+  <w:abstractNum w:abstractNumId="14" w15:restartNumberingAfterBreak="0">
     <w:nsid w:val="3DC26F13"/>
     <w:multiLevelType w:val="hybridMultilevel"/>
     <w:tmpl w:val="98323762"/>
@@ -18733,7 +19865,7 @@
       </w:rPr>
     </w:lvl>
   </w:abstractNum>
-  <w:abstractNum w:abstractNumId="14" w15:restartNumberingAfterBreak="0">
+  <w:abstractNum w:abstractNumId="15" w15:restartNumberingAfterBreak="0">
     <w:nsid w:val="3E672CCD"/>
     <w:multiLevelType w:val="hybridMultilevel"/>
     <w:tmpl w:val="0BAE5ED6"/>
@@ -18822,7 +19954,7 @@
       </w:pPr>
     </w:lvl>
   </w:abstractNum>
-  <w:abstractNum w:abstractNumId="15" w15:restartNumberingAfterBreak="0">
+  <w:abstractNum w:abstractNumId="16" w15:restartNumberingAfterBreak="0">
     <w:nsid w:val="47C62F33"/>
     <w:multiLevelType w:val="hybridMultilevel"/>
     <w:tmpl w:val="F8989EB4"/>
@@ -18935,7 +20067,7 @@
       </w:rPr>
     </w:lvl>
   </w:abstractNum>
-  <w:abstractNum w:abstractNumId="16" w15:restartNumberingAfterBreak="0">
+  <w:abstractNum w:abstractNumId="17" w15:restartNumberingAfterBreak="0">
     <w:nsid w:val="4D794F7B"/>
     <w:multiLevelType w:val="hybridMultilevel"/>
     <w:tmpl w:val="ADB0E002"/>
@@ -19048,7 +20180,93 @@
       </w:rPr>
     </w:lvl>
   </w:abstractNum>
-  <w:abstractNum w:abstractNumId="17" w15:restartNumberingAfterBreak="0">
+  <w:abstractNum w:abstractNumId="18" w15:restartNumberingAfterBreak="0">
+    <w:nsid w:val="5C381E8C"/>
+    <w:multiLevelType w:val="hybridMultilevel"/>
+    <w:tmpl w:val="5148D242"/>
+    <w:lvl w:ilvl="0" w:tplc="200A000F">
+      <w:start w:val="1"/>
+      <w:numFmt w:val="decimal"/>
+      <w:lvlText w:val="%1."/>
+      <w:lvlJc w:val="left"/>
+      <w:pPr>
+        <w:ind w:left="1068" w:hanging="360"/>
+      </w:pPr>
+    </w:lvl>
+    <w:lvl w:ilvl="1" w:tplc="200A0019" w:tentative="1">
+      <w:start w:val="1"/>
+      <w:numFmt w:val="lowerLetter"/>
+      <w:lvlText w:val="%2."/>
+      <w:lvlJc w:val="left"/>
+      <w:pPr>
+        <w:ind w:left="1788" w:hanging="360"/>
+      </w:pPr>
+    </w:lvl>
+    <w:lvl w:ilvl="2" w:tplc="200A001B" w:tentative="1">
+      <w:start w:val="1"/>
+      <w:numFmt w:val="lowerRoman"/>
+      <w:lvlText w:val="%3."/>
+      <w:lvlJc w:val="right"/>
+      <w:pPr>
+        <w:ind w:left="2508" w:hanging="180"/>
+      </w:pPr>
+    </w:lvl>
+    <w:lvl w:ilvl="3" w:tplc="200A000F" w:tentative="1">
+      <w:start w:val="1"/>
+      <w:numFmt w:val="decimal"/>
+      <w:lvlText w:val="%4."/>
+      <w:lvlJc w:val="left"/>
+      <w:pPr>
+        <w:ind w:left="3228" w:hanging="360"/>
+      </w:pPr>
+    </w:lvl>
+    <w:lvl w:ilvl="4" w:tplc="200A0019" w:tentative="1">
+      <w:start w:val="1"/>
+      <w:numFmt w:val="lowerLetter"/>
+      <w:lvlText w:val="%5."/>
+      <w:lvlJc w:val="left"/>
+      <w:pPr>
+        <w:ind w:left="3948" w:hanging="360"/>
+      </w:pPr>
+    </w:lvl>
+    <w:lvl w:ilvl="5" w:tplc="200A001B" w:tentative="1">
+      <w:start w:val="1"/>
+      <w:numFmt w:val="lowerRoman"/>
+      <w:lvlText w:val="%6."/>
+      <w:lvlJc w:val="right"/>
+      <w:pPr>
+        <w:ind w:left="4668" w:hanging="180"/>
+      </w:pPr>
+    </w:lvl>
+    <w:lvl w:ilvl="6" w:tplc="200A000F" w:tentative="1">
+      <w:start w:val="1"/>
+      <w:numFmt w:val="decimal"/>
+      <w:lvlText w:val="%7."/>
+      <w:lvlJc w:val="left"/>
+      <w:pPr>
+        <w:ind w:left="5388" w:hanging="360"/>
+      </w:pPr>
+    </w:lvl>
+    <w:lvl w:ilvl="7" w:tplc="200A0019" w:tentative="1">
+      <w:start w:val="1"/>
+      <w:numFmt w:val="lowerLetter"/>
+      <w:lvlText w:val="%8."/>
+      <w:lvlJc w:val="left"/>
+      <w:pPr>
+        <w:ind w:left="6108" w:hanging="360"/>
+      </w:pPr>
+    </w:lvl>
+    <w:lvl w:ilvl="8" w:tplc="200A001B" w:tentative="1">
+      <w:start w:val="1"/>
+      <w:numFmt w:val="lowerRoman"/>
+      <w:lvlText w:val="%9."/>
+      <w:lvlJc w:val="right"/>
+      <w:pPr>
+        <w:ind w:left="6828" w:hanging="180"/>
+      </w:pPr>
+    </w:lvl>
+  </w:abstractNum>
+  <w:abstractNum w:abstractNumId="19" w15:restartNumberingAfterBreak="0">
     <w:nsid w:val="615B20F0"/>
     <w:multiLevelType w:val="hybridMultilevel"/>
     <w:tmpl w:val="7AC4399A"/>
@@ -19134,7 +20352,7 @@
       </w:pPr>
     </w:lvl>
   </w:abstractNum>
-  <w:abstractNum w:abstractNumId="18" w15:restartNumberingAfterBreak="0">
+  <w:abstractNum w:abstractNumId="20" w15:restartNumberingAfterBreak="0">
     <w:nsid w:val="63556DA1"/>
     <w:multiLevelType w:val="hybridMultilevel"/>
     <w:tmpl w:val="FE8C0458"/>
@@ -19247,7 +20465,7 @@
       </w:rPr>
     </w:lvl>
   </w:abstractNum>
-  <w:abstractNum w:abstractNumId="19" w15:restartNumberingAfterBreak="0">
+  <w:abstractNum w:abstractNumId="21" w15:restartNumberingAfterBreak="0">
     <w:nsid w:val="67597F94"/>
     <w:multiLevelType w:val="hybridMultilevel"/>
     <w:tmpl w:val="A6049668"/>
@@ -19336,7 +20554,7 @@
       </w:pPr>
     </w:lvl>
   </w:abstractNum>
-  <w:abstractNum w:abstractNumId="20" w15:restartNumberingAfterBreak="0">
+  <w:abstractNum w:abstractNumId="22" w15:restartNumberingAfterBreak="0">
     <w:nsid w:val="6AD52AD2"/>
     <w:multiLevelType w:val="hybridMultilevel"/>
     <w:tmpl w:val="9FCE4DB8"/>
@@ -19425,7 +20643,7 @@
       </w:pPr>
     </w:lvl>
   </w:abstractNum>
-  <w:abstractNum w:abstractNumId="21" w15:restartNumberingAfterBreak="0">
+  <w:abstractNum w:abstractNumId="23" w15:restartNumberingAfterBreak="0">
     <w:nsid w:val="753D730E"/>
     <w:multiLevelType w:val="hybridMultilevel"/>
     <w:tmpl w:val="75E0B6C2"/>
@@ -19538,7 +20756,7 @@
       </w:rPr>
     </w:lvl>
   </w:abstractNum>
-  <w:abstractNum w:abstractNumId="22" w15:restartNumberingAfterBreak="0">
+  <w:abstractNum w:abstractNumId="24" w15:restartNumberingAfterBreak="0">
     <w:nsid w:val="77037EA0"/>
     <w:multiLevelType w:val="hybridMultilevel"/>
     <w:tmpl w:val="1D7C8B04"/>
@@ -19651,7 +20869,7 @@
       </w:rPr>
     </w:lvl>
   </w:abstractNum>
-  <w:abstractNum w:abstractNumId="23" w15:restartNumberingAfterBreak="0">
+  <w:abstractNum w:abstractNumId="25" w15:restartNumberingAfterBreak="0">
     <w:nsid w:val="7B12378A"/>
     <w:multiLevelType w:val="hybridMultilevel"/>
     <w:tmpl w:val="E6EC6DD6"/>
@@ -19738,22 +20956,22 @@
     </w:lvl>
   </w:abstractNum>
   <w:num w:numId="1" w16cid:durableId="1293169672">
-    <w:abstractNumId w:val="16"/>
+    <w:abstractNumId w:val="17"/>
   </w:num>
   <w:num w:numId="2" w16cid:durableId="132523105">
-    <w:abstractNumId w:val="18"/>
+    <w:abstractNumId w:val="20"/>
   </w:num>
   <w:num w:numId="3" w16cid:durableId="550045339">
     <w:abstractNumId w:val="4"/>
   </w:num>
   <w:num w:numId="4" w16cid:durableId="913316204">
-    <w:abstractNumId w:val="14"/>
+    <w:abstractNumId w:val="15"/>
   </w:num>
   <w:num w:numId="5" w16cid:durableId="1328904247">
-    <w:abstractNumId w:val="11"/>
+    <w:abstractNumId w:val="12"/>
   </w:num>
   <w:num w:numId="6" w16cid:durableId="675959527">
-    <w:abstractNumId w:val="10"/>
+    <w:abstractNumId w:val="11"/>
   </w:num>
   <w:num w:numId="7" w16cid:durableId="1954557278">
     <w:abstractNumId w:val="5"/>
@@ -19762,52 +20980,58 @@
     <w:abstractNumId w:val="2"/>
   </w:num>
   <w:num w:numId="9" w16cid:durableId="1882328899">
-    <w:abstractNumId w:val="9"/>
+    <w:abstractNumId w:val="10"/>
   </w:num>
   <w:num w:numId="10" w16cid:durableId="870528595">
-    <w:abstractNumId w:val="12"/>
+    <w:abstractNumId w:val="13"/>
   </w:num>
   <w:num w:numId="11" w16cid:durableId="1776826764">
-    <w:abstractNumId w:val="22"/>
+    <w:abstractNumId w:val="24"/>
   </w:num>
   <w:num w:numId="12" w16cid:durableId="1998149375">
     <w:abstractNumId w:val="0"/>
   </w:num>
   <w:num w:numId="13" w16cid:durableId="2030794282">
-    <w:abstractNumId w:val="23"/>
+    <w:abstractNumId w:val="25"/>
   </w:num>
   <w:num w:numId="14" w16cid:durableId="389350923">
+    <w:abstractNumId w:val="9"/>
+  </w:num>
+  <w:num w:numId="15" w16cid:durableId="1450397852">
     <w:abstractNumId w:val="8"/>
   </w:num>
-  <w:num w:numId="15" w16cid:durableId="1450397852">
+  <w:num w:numId="16" w16cid:durableId="1198618860">
+    <w:abstractNumId w:val="16"/>
+  </w:num>
+  <w:num w:numId="17" w16cid:durableId="534732538">
+    <w:abstractNumId w:val="22"/>
+  </w:num>
+  <w:num w:numId="18" w16cid:durableId="1870793516">
+    <w:abstractNumId w:val="14"/>
+  </w:num>
+  <w:num w:numId="19" w16cid:durableId="1198272480">
+    <w:abstractNumId w:val="19"/>
+  </w:num>
+  <w:num w:numId="20" w16cid:durableId="1597127380">
     <w:abstractNumId w:val="7"/>
   </w:num>
-  <w:num w:numId="16" w16cid:durableId="1198618860">
-    <w:abstractNumId w:val="15"/>
-  </w:num>
-  <w:num w:numId="17" w16cid:durableId="534732538">
-    <w:abstractNumId w:val="20"/>
-  </w:num>
-  <w:num w:numId="18" w16cid:durableId="1870793516">
-    <w:abstractNumId w:val="13"/>
-  </w:num>
-  <w:num w:numId="19" w16cid:durableId="1198272480">
-    <w:abstractNumId w:val="17"/>
-  </w:num>
-  <w:num w:numId="20" w16cid:durableId="1597127380">
-    <w:abstractNumId w:val="6"/>
-  </w:num>
   <w:num w:numId="21" w16cid:durableId="1672026176">
-    <w:abstractNumId w:val="21"/>
+    <w:abstractNumId w:val="23"/>
   </w:num>
   <w:num w:numId="22" w16cid:durableId="44453642">
     <w:abstractNumId w:val="1"/>
   </w:num>
   <w:num w:numId="23" w16cid:durableId="158888792">
-    <w:abstractNumId w:val="19"/>
+    <w:abstractNumId w:val="21"/>
   </w:num>
   <w:num w:numId="24" w16cid:durableId="1741439293">
     <w:abstractNumId w:val="3"/>
+  </w:num>
+  <w:num w:numId="25" w16cid:durableId="1514027647">
+    <w:abstractNumId w:val="18"/>
+  </w:num>
+  <w:num w:numId="26" w16cid:durableId="799080835">
+    <w:abstractNumId w:val="6"/>
   </w:num>
 </w:numbering>
 </file>

</xml_diff>

<commit_message>
<docs> config.csv docs ready
</commit_message>
<xml_diff>
--- a/Manual de desarrollo en Atlax Renpy.docx
+++ b/Manual de desarrollo en Atlax Renpy.docx
@@ -5179,7 +5179,13 @@
       </w:r>
       <w:r>
         <w:lastRenderedPageBreak/>
-        <w:t xml:space="preserve">tener cualquier nombre, amistad, calificación, fuerza, inteligencia, edad, etc. Los puntos nos sirven para crear bifurcaciones en la historia comparándolo con valores establecidos, por ejemplo puedes hacer que al final de la historia, si el jugador alcanzó </w:t>
+        <w:t>tener cualquier nombre, amistad, calificación, fuerza, inteligencia, edad, etc. Los puntos nos sirven para crear bifurcaciones en la historia comparándolo con valores establecidos, por ejemplo</w:t>
+      </w:r>
+      <w:r>
+        <w:t>,</w:t>
+      </w:r>
+      <w:r>
+        <w:t xml:space="preserve"> puedes hacer que al final de la historia, si el jugador alcanzó </w:t>
       </w:r>
       <w:r>
         <w:t>10 o más</w:t>
@@ -5242,15 +5248,29 @@
     <w:p>
       <w:pPr>
         <w:ind w:firstLine="708"/>
+        <w:rPr>
+          <w:i/>
+          <w:iCs/>
+          <w:sz w:val="20"/>
+          <w:szCs w:val="20"/>
+        </w:rPr>
       </w:pPr>
       <w:r>
         <w:rPr>
           <w:noProof/>
         </w:rPr>
         <w:drawing>
-          <wp:inline distT="0" distB="0" distL="0" distR="0" wp14:anchorId="4C9F18FD" wp14:editId="0E8E735C">
+          <wp:anchor distT="0" distB="0" distL="114300" distR="114300" simplePos="0" relativeHeight="251678720" behindDoc="0" locked="0" layoutInCell="1" allowOverlap="1" wp14:anchorId="4C9F18FD" wp14:editId="0F4369F7">
+            <wp:simplePos x="0" y="0"/>
+            <wp:positionH relativeFrom="margin">
+              <wp:align>center</wp:align>
+            </wp:positionH>
+            <wp:positionV relativeFrom="margin">
+              <wp:posOffset>3106626</wp:posOffset>
+            </wp:positionV>
             <wp:extent cx="4819650" cy="3524250"/>
             <wp:effectExtent l="0" t="0" r="0" b="0"/>
+            <wp:wrapSquare wrapText="bothSides"/>
             <wp:docPr id="2022422527" name="Imagen 1"/>
             <wp:cNvGraphicFramePr>
               <a:graphicFrameLocks xmlns:a="http://schemas.openxmlformats.org/drawingml/2006/main" noChangeAspect="1"/>
@@ -5263,7 +5283,13 @@
                     <pic:cNvPicPr/>
                   </pic:nvPicPr>
                   <pic:blipFill>
-                    <a:blip r:embed="rId9"/>
+                    <a:blip r:embed="rId9">
+                      <a:extLst>
+                        <a:ext uri="{28A0092B-C50C-407E-A947-70E740481C1C}">
+                          <a14:useLocalDpi xmlns:a14="http://schemas.microsoft.com/office/drawing/2010/main" val="0"/>
+                        </a:ext>
+                      </a:extLst>
+                    </a:blip>
                     <a:stretch>
                       <a:fillRect/>
                     </a:stretch>
@@ -5280,9 +5306,23 @@
                 </pic:pic>
               </a:graphicData>
             </a:graphic>
-          </wp:inline>
+          </wp:anchor>
         </w:drawing>
       </w:r>
+      <w:r>
+        <w:rPr>
+          <w:i/>
+          <w:iCs/>
+          <w:sz w:val="20"/>
+          <w:szCs w:val="20"/>
+        </w:rPr>
+        <w:t>Organizando las escenas de la ruta de Amber</w:t>
+      </w:r>
+    </w:p>
+    <w:p>
+      <w:pPr>
+        <w:ind w:firstLine="708"/>
+      </w:pPr>
     </w:p>
     <w:p>
       <w:pPr>
@@ -5350,6 +5390,7 @@
     </w:p>
     <w:p>
       <w:r>
+        <w:lastRenderedPageBreak/>
         <w:tab/>
       </w:r>
       <w:r>
@@ -5373,11 +5414,7 @@
         <w:t>Atlax Renpy</w:t>
       </w:r>
       <w:r>
-        <w:t xml:space="preserve"> va a leer ese </w:t>
-      </w:r>
-      <w:r>
-        <w:lastRenderedPageBreak/>
-        <w:t xml:space="preserve">primer archivo de control y </w:t>
+        <w:t xml:space="preserve"> va a leer ese primer archivo de control y </w:t>
       </w:r>
       <w:r>
         <w:t>comenzará</w:t>
@@ -5676,13 +5713,13 @@
           <w:noProof/>
         </w:rPr>
         <w:drawing>
-          <wp:anchor distT="0" distB="0" distL="114300" distR="114300" simplePos="0" relativeHeight="251673600" behindDoc="0" locked="0" layoutInCell="1" allowOverlap="1" wp14:anchorId="566A4858" wp14:editId="6399E49F">
+          <wp:anchor distT="0" distB="0" distL="114300" distR="114300" simplePos="0" relativeHeight="251673600" behindDoc="0" locked="0" layoutInCell="1" allowOverlap="1" wp14:anchorId="566A4858" wp14:editId="33AA767E">
             <wp:simplePos x="0" y="0"/>
             <wp:positionH relativeFrom="margin">
               <wp:align>left</wp:align>
             </wp:positionH>
             <wp:positionV relativeFrom="margin">
-              <wp:posOffset>5582224</wp:posOffset>
+              <wp:posOffset>6041493</wp:posOffset>
             </wp:positionV>
             <wp:extent cx="5426075" cy="1632585"/>
             <wp:effectExtent l="0" t="0" r="3175" b="5715"/>
@@ -5961,7 +5998,13 @@
         <w:t>, mi recomendación siempre será usar Github.</w:t>
       </w:r>
       <w:r>
-        <w:t xml:space="preserve"> El editor de texto Visual Studio Code tiene una gran compatibilidad con Github.</w:t>
+        <w:t xml:space="preserve"> El editor de texto Visual Studio Code tiene una </w:t>
+      </w:r>
+      <w:r>
+        <w:t xml:space="preserve">muy buena integración </w:t>
+      </w:r>
+      <w:r>
+        <w:t>con Github.</w:t>
       </w:r>
     </w:p>
     <w:p>
@@ -6059,7 +6102,7 @@
         </w:rPr>
         <w:lastRenderedPageBreak/>
         <w:drawing>
-          <wp:anchor distT="0" distB="0" distL="114300" distR="114300" simplePos="0" relativeHeight="251676672" behindDoc="0" locked="0" layoutInCell="1" allowOverlap="1" wp14:anchorId="338485B2" wp14:editId="7D8C6199">
+          <wp:anchor distT="0" distB="0" distL="114300" distR="114300" simplePos="0" relativeHeight="251676672" behindDoc="0" locked="0" layoutInCell="1" allowOverlap="1" wp14:anchorId="338485B2" wp14:editId="2844DF5B">
             <wp:simplePos x="0" y="0"/>
             <wp:positionH relativeFrom="margin">
               <wp:align>center</wp:align>
@@ -6959,17 +7002,14 @@
       <w:pPr>
         <w:pStyle w:val="Ttulo2"/>
       </w:pPr>
-      <w:bookmarkStart w:id="17" w:name="_Toc227172391"/>
-      <w:bookmarkStart w:id="18" w:name="_Toc227172392"/>
+      <w:bookmarkStart w:id="17" w:name="_Toc227172392"/>
+      <w:bookmarkStart w:id="18" w:name="_Toc227172391"/>
       <w:r>
         <w:t>Definición de fondos</w:t>
       </w:r>
-      <w:bookmarkEnd w:id="18"/>
-    </w:p>
-    <w:p>
-      <w:r>
-        <w:tab/>
-      </w:r>
+      <w:bookmarkEnd w:id="17"/>
+    </w:p>
+    <w:p>
       <w:r>
         <w:tab/>
         <w:t xml:space="preserve">El </w:t>
@@ -6982,69 +7022,84 @@
         <w:t>Key</w:t>
       </w:r>
       <w:r>
-        <w:t xml:space="preserve"> correspondiente a una definición de </w:t>
-      </w:r>
-      <w:r>
-        <w:t>fondo</w:t>
-      </w:r>
-      <w:r>
-        <w:t xml:space="preserve"> comienza por “</w:t>
+        <w:t xml:space="preserve"> correspondiente a una definición de fondo comienza por “</w:t>
       </w:r>
       <w:r>
         <w:rPr>
           <w:i/>
           <w:iCs/>
         </w:rPr>
-        <w:t>background</w:t>
+        <w:t>background”</w:t>
+      </w:r>
+      <w:r>
+        <w:t xml:space="preserve">, lo encontraremos aproximadamente por la fila 17 y solo utilizará la columna </w:t>
       </w:r>
       <w:r>
         <w:rPr>
           <w:i/>
           <w:iCs/>
         </w:rPr>
-        <w:t>”</w:t>
-      </w:r>
-      <w:r>
-        <w:t xml:space="preserve">, lo encontraremos aproximadamente por la fila </w:t>
-      </w:r>
-      <w:r>
-        <w:t>17</w:t>
-      </w:r>
-      <w:r>
-        <w:t xml:space="preserve"> y solo utilizará la columna </w:t>
+        <w:t>Value1.</w:t>
+      </w:r>
+    </w:p>
+    <w:p>
+      <w:pPr>
+        <w:ind w:firstLine="708"/>
+      </w:pPr>
+      <w:r>
+        <w:t>Los fondos son los escenarios que se muestran detrás de los personajes como por ejemplo un salón, un parque o un cielo estrellado.</w:t>
+      </w:r>
+    </w:p>
+    <w:p>
+      <w:pPr>
+        <w:ind w:firstLine="708"/>
+      </w:pPr>
+      <w:r>
+        <w:t>Debes guardar l</w:t>
+      </w:r>
+      <w:r>
+        <w:t>os fondos</w:t>
+      </w:r>
+      <w:r>
+        <w:t xml:space="preserve"> en la carpeta correspondiente al </w:t>
       </w:r>
       <w:r>
         <w:rPr>
           <w:i/>
           <w:iCs/>
         </w:rPr>
-        <w:t>Value1.</w:t>
-      </w:r>
-    </w:p>
-    <w:p>
-      <w:pPr>
-        <w:ind w:firstLine="708"/>
-      </w:pPr>
-      <w:r>
-        <w:t>Los fondos son los escenarios que se muestran detrás de los personajes como por ejemplo un salón, un parque o un cielo estrellado.</w:t>
-      </w:r>
-    </w:p>
-    <w:p>
-      <w:pPr>
-        <w:ind w:firstLine="708"/>
-      </w:pPr>
-      <w:r>
-        <w:t>Los fondos se encuentran en la carpeta</w:t>
+        <w:t>path_background</w:t>
+      </w:r>
+      <w:r>
+        <w:t xml:space="preserve">, por defecto será </w:t>
       </w:r>
       <w:r>
         <w:rPr>
           <w:i/>
           <w:iCs/>
         </w:rPr>
-        <w:t xml:space="preserve"> game/images/backgrounds</w:t>
-      </w:r>
-      <w:r>
-        <w:t>, deben ser en formato .png y preferiblemente tener la misma resolución, el tamaño recomendado es 1920x1080.</w:t>
+        <w:t>game/images/backgrounds.</w:t>
+      </w:r>
+      <w:r>
+        <w:t xml:space="preserve"> </w:t>
+      </w:r>
+      <w:r>
+        <w:t>D</w:t>
+      </w:r>
+      <w:r>
+        <w:t>eben ser en formato .png y preferiblemente tener la misma resolución</w:t>
+      </w:r>
+      <w:r>
+        <w:t>. E</w:t>
+      </w:r>
+      <w:r>
+        <w:t>l tamaño recomendado es 1920x1080</w:t>
+      </w:r>
+      <w:r>
+        <w:t xml:space="preserve"> pixeles</w:t>
+      </w:r>
+      <w:r>
+        <w:t>.</w:t>
       </w:r>
     </w:p>
     <w:p>
@@ -7052,12 +7107,184 @@
         <w:ind w:firstLine="708"/>
       </w:pPr>
       <w:r>
-        <w:t>Para agregar los fondos de nuestra novela, siguiendo el mismo formato, esta vez usando el key “background” definiremos un fondo. En este caso solo tendremos que escribir el nombre del archivo .png.</w:t>
+        <w:t xml:space="preserve">Para </w:t>
+      </w:r>
+      <w:r>
+        <w:t xml:space="preserve">definir un fondo simplemente debemos escribir en la columna </w:t>
+      </w:r>
+      <w:r>
+        <w:rPr>
+          <w:i/>
+          <w:iCs/>
+        </w:rPr>
+        <w:t>key</w:t>
+      </w:r>
+      <w:r>
+        <w:t xml:space="preserve"> “background” y en la columna </w:t>
+      </w:r>
+      <w:r>
+        <w:rPr>
+          <w:i/>
+          <w:iCs/>
+        </w:rPr>
+        <w:t>Value1</w:t>
+      </w:r>
+      <w:r>
+        <w:t xml:space="preserve"> escribir el nombre del archivo respetando los espacios. Por ejemplo, si deseamos implementar un fondo cuyo archivo es “dark forest.png”, la definición sería la siguiente.</w:t>
+      </w:r>
+    </w:p>
+    <w:p>
+      <w:pPr>
+        <w:rPr>
+          <w:i/>
+          <w:iCs/>
+          <w:sz w:val="20"/>
+          <w:szCs w:val="20"/>
+        </w:rPr>
+      </w:pPr>
+      <w:r>
+        <w:rPr>
+          <w:noProof/>
+        </w:rPr>
+        <w:drawing>
+          <wp:anchor distT="0" distB="0" distL="114300" distR="114300" simplePos="0" relativeHeight="251679744" behindDoc="0" locked="0" layoutInCell="1" allowOverlap="1" wp14:anchorId="46E3E1AE" wp14:editId="2F41658E">
+            <wp:simplePos x="0" y="0"/>
+            <wp:positionH relativeFrom="margin">
+              <wp:posOffset>-48895</wp:posOffset>
+            </wp:positionH>
+            <wp:positionV relativeFrom="margin">
+              <wp:posOffset>5020945</wp:posOffset>
+            </wp:positionV>
+            <wp:extent cx="4914900" cy="609600"/>
+            <wp:effectExtent l="0" t="0" r="0" b="0"/>
+            <wp:wrapSquare wrapText="bothSides"/>
+            <wp:docPr id="501187318" name="Imagen 1"/>
+            <wp:cNvGraphicFramePr>
+              <a:graphicFrameLocks xmlns:a="http://schemas.openxmlformats.org/drawingml/2006/main" noChangeAspect="1"/>
+            </wp:cNvGraphicFramePr>
+            <a:graphic xmlns:a="http://schemas.openxmlformats.org/drawingml/2006/main">
+              <a:graphicData uri="http://schemas.openxmlformats.org/drawingml/2006/picture">
+                <pic:pic xmlns:pic="http://schemas.openxmlformats.org/drawingml/2006/picture">
+                  <pic:nvPicPr>
+                    <pic:cNvPr id="501187318" name=""/>
+                    <pic:cNvPicPr/>
+                  </pic:nvPicPr>
+                  <pic:blipFill>
+                    <a:blip r:embed="rId16">
+                      <a:extLst>
+                        <a:ext uri="{28A0092B-C50C-407E-A947-70E740481C1C}">
+                          <a14:useLocalDpi xmlns:a14="http://schemas.microsoft.com/office/drawing/2010/main" val="0"/>
+                        </a:ext>
+                      </a:extLst>
+                    </a:blip>
+                    <a:stretch>
+                      <a:fillRect/>
+                    </a:stretch>
+                  </pic:blipFill>
+                  <pic:spPr>
+                    <a:xfrm>
+                      <a:off x="0" y="0"/>
+                      <a:ext cx="4914900" cy="609600"/>
+                    </a:xfrm>
+                    <a:prstGeom prst="rect">
+                      <a:avLst/>
+                    </a:prstGeom>
+                  </pic:spPr>
+                </pic:pic>
+              </a:graphicData>
+            </a:graphic>
+          </wp:anchor>
+        </w:drawing>
+      </w:r>
+      <w:r>
+        <w:rPr>
+          <w:i/>
+          <w:iCs/>
+          <w:sz w:val="20"/>
+          <w:szCs w:val="20"/>
+        </w:rPr>
+        <w:t>Definiendo el fondo cuyo nombre es “dark forest.png”</w:t>
       </w:r>
     </w:p>
     <w:p>
       <w:pPr>
         <w:ind w:firstLine="708"/>
+      </w:pPr>
+    </w:p>
+    <w:p>
+      <w:pPr>
+        <w:ind w:firstLine="708"/>
+      </w:pPr>
+      <w:r>
+        <w:t xml:space="preserve">Si revisamos el archivo de configuración notaremos que ya hay algunos fondos definidos, estos son </w:t>
+      </w:r>
+      <w:r>
+        <w:rPr>
+          <w:i/>
+          <w:iCs/>
+        </w:rPr>
+        <w:t>flash</w:t>
+      </w:r>
+      <w:r>
+        <w:t xml:space="preserve"> y </w:t>
+      </w:r>
+      <w:r>
+        <w:rPr>
+          <w:i/>
+          <w:iCs/>
+        </w:rPr>
+        <w:t>blackout</w:t>
+      </w:r>
+      <w:r>
+        <w:t>. Estos fondos son usados por el motor así que procura no moverlos o borrarlos.</w:t>
+      </w:r>
+    </w:p>
+    <w:p>
+      <w:pPr>
+        <w:ind w:firstLine="708"/>
+      </w:pPr>
+    </w:p>
+    <w:p>
+      <w:pPr>
+        <w:ind w:firstLine="708"/>
+      </w:pPr>
+      <w:r>
+        <w:t>Se recomienda no quitar los fondos flash y blackout ya que el motor los necesita para hacer algunas transiciones.</w:t>
+      </w:r>
+    </w:p>
+    <w:p>
+      <w:pPr>
+        <w:ind w:firstLine="708"/>
+      </w:pPr>
+    </w:p>
+    <w:p>
+      <w:pPr>
+        <w:ind w:firstLine="708"/>
+      </w:pPr>
+    </w:p>
+    <w:p>
+      <w:pPr>
+        <w:ind w:firstLine="708"/>
+      </w:pPr>
+    </w:p>
+    <w:p>
+      <w:pPr>
+        <w:ind w:firstLine="708"/>
+      </w:pPr>
+    </w:p>
+    <w:p>
+      <w:pPr>
+        <w:ind w:firstLine="708"/>
+      </w:pPr>
+    </w:p>
+    <w:p>
+      <w:pPr>
+        <w:rPr>
+          <w:i/>
+          <w:iCs/>
+          <w:sz w:val="20"/>
+          <w:szCs w:val="20"/>
+        </w:rPr>
       </w:pPr>
       <w:r>
         <w:rPr>
@@ -7065,9 +7292,17 @@
         </w:rPr>
         <w:lastRenderedPageBreak/>
         <w:drawing>
-          <wp:inline distT="0" distB="0" distL="0" distR="0" wp14:anchorId="2AEC27D1" wp14:editId="40C052B8">
-            <wp:extent cx="4219575" cy="6905625"/>
-            <wp:effectExtent l="0" t="0" r="9525" b="9525"/>
+          <wp:anchor distT="0" distB="0" distL="114300" distR="114300" simplePos="0" relativeHeight="251680768" behindDoc="0" locked="0" layoutInCell="1" allowOverlap="1" wp14:anchorId="2AEC27D1" wp14:editId="132B32B9">
+            <wp:simplePos x="0" y="0"/>
+            <wp:positionH relativeFrom="margin">
+              <wp:posOffset>-84569</wp:posOffset>
+            </wp:positionH>
+            <wp:positionV relativeFrom="margin">
+              <wp:posOffset>195522</wp:posOffset>
+            </wp:positionV>
+            <wp:extent cx="2366645" cy="3874135"/>
+            <wp:effectExtent l="0" t="0" r="0" b="0"/>
+            <wp:wrapSquare wrapText="bothSides"/>
             <wp:docPr id="837284710" name="Imagen 1"/>
             <wp:cNvGraphicFramePr>
               <a:graphicFrameLocks xmlns:a="http://schemas.openxmlformats.org/drawingml/2006/main" noChangeAspect="1"/>
@@ -7080,7 +7315,13 @@
                     <pic:cNvPicPr/>
                   </pic:nvPicPr>
                   <pic:blipFill>
-                    <a:blip r:embed="rId16"/>
+                    <a:blip r:embed="rId17">
+                      <a:extLst>
+                        <a:ext uri="{28A0092B-C50C-407E-A947-70E740481C1C}">
+                          <a14:useLocalDpi xmlns:a14="http://schemas.microsoft.com/office/drawing/2010/main" val="0"/>
+                        </a:ext>
+                      </a:extLst>
+                    </a:blip>
                     <a:stretch>
                       <a:fillRect/>
                     </a:stretch>
@@ -7088,7 +7329,7 @@
                   <pic:spPr>
                     <a:xfrm>
                       <a:off x="0" y="0"/>
-                      <a:ext cx="4219575" cy="6905625"/>
+                      <a:ext cx="2366645" cy="3874135"/>
                     </a:xfrm>
                     <a:prstGeom prst="rect">
                       <a:avLst/>
@@ -7097,112 +7338,286 @@
                 </pic:pic>
               </a:graphicData>
             </a:graphic>
-          </wp:inline>
+            <wp14:sizeRelH relativeFrom="margin">
+              <wp14:pctWidth>0</wp14:pctWidth>
+            </wp14:sizeRelH>
+            <wp14:sizeRelV relativeFrom="margin">
+              <wp14:pctHeight>0</wp14:pctHeight>
+            </wp14:sizeRelV>
+          </wp:anchor>
         </w:drawing>
-      </w:r>
-    </w:p>
-    <w:p>
-      <w:pPr>
-        <w:ind w:firstLine="708"/>
-      </w:pPr>
-      <w:r>
-        <w:t>Se recomienda no quitar los fondos flash y blackout ya que el motor los necesita para hacer algunas transiciones.</w:t>
-      </w:r>
-    </w:p>
-    <w:p>
-      <w:pPr>
-        <w:pStyle w:val="Ttulo2"/>
-      </w:pPr>
-    </w:p>
-    <w:p>
-      <w:pPr>
-        <w:pStyle w:val="Ttulo2"/>
-      </w:pPr>
-    </w:p>
-    <w:p>
-      <w:pPr>
-        <w:pStyle w:val="Ttulo2"/>
-      </w:pPr>
-      <w:r>
-        <w:t>Definición de personajes</w:t>
-      </w:r>
-      <w:bookmarkEnd w:id="17"/>
-    </w:p>
-    <w:p>
-      <w:r>
-        <w:tab/>
-      </w:r>
-      <w:r>
-        <w:t xml:space="preserve">El </w:t>
       </w:r>
       <w:r>
         <w:rPr>
           <w:i/>
           <w:iCs/>
-        </w:rPr>
-        <w:t>Key</w:t>
-      </w:r>
-      <w:r>
-        <w:t xml:space="preserve"> </w:t>
-      </w:r>
-      <w:r>
-        <w:t xml:space="preserve">correspondiente a una definición de </w:t>
-      </w:r>
-      <w:r>
-        <w:t xml:space="preserve">personaje </w:t>
-      </w:r>
-      <w:r>
-        <w:t>comienza por “</w:t>
+          <w:sz w:val="20"/>
+          <w:szCs w:val="20"/>
+        </w:rPr>
+        <w:t>Definiendo todos los fondos de nuestra novela</w:t>
+      </w:r>
+    </w:p>
+    <w:p>
+      <w:pPr>
+        <w:ind w:firstLine="708"/>
+      </w:pPr>
+      <w:r>
+        <w:t>Realizaremos este procedimiento para cada fondo de nuestra novela visual, al final nos quedará algo como la imagen de la izquierda.</w:t>
+      </w:r>
+    </w:p>
+    <w:p>
+      <w:pPr>
+        <w:ind w:firstLine="708"/>
+      </w:pPr>
+    </w:p>
+    <w:p>
+      <w:pPr>
+        <w:ind w:firstLine="708"/>
+      </w:pPr>
+    </w:p>
+    <w:p>
+      <w:pPr>
+        <w:ind w:firstLine="708"/>
+      </w:pPr>
+    </w:p>
+    <w:p>
+      <w:pPr>
+        <w:ind w:firstLine="708"/>
+      </w:pPr>
+    </w:p>
+    <w:p>
+      <w:pPr>
+        <w:ind w:firstLine="708"/>
+      </w:pPr>
+    </w:p>
+    <w:p>
+      <w:pPr>
+        <w:ind w:firstLine="708"/>
+      </w:pPr>
+    </w:p>
+    <w:p>
+      <w:pPr>
+        <w:ind w:firstLine="708"/>
+      </w:pPr>
+    </w:p>
+    <w:p>
+      <w:pPr>
+        <w:ind w:firstLine="708"/>
+      </w:pPr>
+    </w:p>
+    <w:p>
+      <w:pPr>
+        <w:ind w:firstLine="708"/>
+      </w:pPr>
+    </w:p>
+    <w:p>
+      <w:pPr>
+        <w:ind w:firstLine="708"/>
+      </w:pPr>
+    </w:p>
+    <w:p>
+      <w:pPr>
+        <w:pStyle w:val="Ttulo2"/>
+      </w:pPr>
+    </w:p>
+    <w:p>
+      <w:pPr>
+        <w:pStyle w:val="Ttulo2"/>
+      </w:pPr>
+      <w:r>
+        <w:t>Definición de personajes</w:t>
+      </w:r>
+      <w:bookmarkEnd w:id="18"/>
+    </w:p>
+    <w:p>
+      <w:r>
+        <w:tab/>
+        <w:t xml:space="preserve">El </w:t>
       </w:r>
       <w:r>
         <w:rPr>
           <w:i/>
           <w:iCs/>
         </w:rPr>
-        <w:t>character</w:t>
+        <w:t>Key</w:t>
+      </w:r>
+      <w:r>
+        <w:t xml:space="preserve"> correspondiente a una definición de personaje comienza por “</w:t>
       </w:r>
       <w:r>
         <w:rPr>
           <w:i/>
           <w:iCs/>
         </w:rPr>
-        <w:t>”</w:t>
+        <w:t>character”</w:t>
       </w:r>
       <w:r>
         <w:t xml:space="preserve">, lo encontraremos aproximadamente por la fila </w:t>
       </w:r>
       <w:r>
-        <w:t>21</w:t>
-      </w:r>
-      <w:r>
-        <w:t xml:space="preserve"> y solo utilizará la columna </w:t>
+        <w:t>2</w:t>
+      </w:r>
+      <w:r>
+        <w:t>2</w:t>
+      </w:r>
+      <w:r>
+        <w:t xml:space="preserve"> y utilizará</w:t>
+      </w:r>
+      <w:r>
+        <w:t xml:space="preserve"> tanto</w:t>
+      </w:r>
+      <w:r>
+        <w:t xml:space="preserve"> la columna </w:t>
       </w:r>
       <w:r>
         <w:rPr>
           <w:i/>
           <w:iCs/>
         </w:rPr>
-        <w:t>Value1.</w:t>
+        <w:t>Value1</w:t>
+      </w:r>
+      <w:r>
+        <w:t xml:space="preserve"> como </w:t>
+      </w:r>
+      <w:r>
+        <w:rPr>
+          <w:i/>
+          <w:iCs/>
+        </w:rPr>
+        <w:t>Value2</w:t>
+      </w:r>
+      <w:r>
+        <w:rPr>
+          <w:i/>
+          <w:iCs/>
+        </w:rPr>
+        <w:t>.</w:t>
+      </w:r>
+      <w:r>
+        <w:rPr>
+          <w:i/>
+          <w:iCs/>
+        </w:rPr>
+        <w:t xml:space="preserve"> </w:t>
+      </w:r>
+      <w:r>
+        <w:t>Además esta utilizará también la columnas de idiomas.</w:t>
       </w:r>
     </w:p>
     <w:p>
       <w:r>
         <w:tab/>
-        <w:t>Para definir personajes utilizaremos el key “character” colocando en la columna Value1 el nombre clave del personaje y en Value2 el color que tendrá al momento de mostrar su nombre en el namebox en hexadecimal</w:t>
+      </w:r>
+      <w:r>
+        <w:t xml:space="preserve">En la columna </w:t>
+      </w:r>
+      <w:r>
+        <w:rPr>
+          <w:i/>
+          <w:iCs/>
+        </w:rPr>
+        <w:t>Value1</w:t>
+      </w:r>
+      <w:r>
+        <w:t xml:space="preserve"> colocaremos el </w:t>
+      </w:r>
+      <w:r>
+        <w:rPr>
+          <w:b/>
+          <w:bCs/>
+        </w:rPr>
+        <w:t>nombre clave</w:t>
+      </w:r>
+      <w:r>
+        <w:t xml:space="preserve"> del personaje, mientras que en la columna </w:t>
+      </w:r>
+      <w:r>
+        <w:rPr>
+          <w:i/>
+          <w:iCs/>
+        </w:rPr>
+        <w:t>Value2</w:t>
+      </w:r>
+      <w:r>
+        <w:t xml:space="preserve"> escribiremos el color del nombre del personaje cuando este hable, este color debe ser escrito en código hexadecimal.</w:t>
+      </w:r>
+    </w:p>
+    <w:p>
+      <w:r>
+        <w:tab/>
+      </w:r>
+      <w:r>
+        <w:rPr>
+          <w:b/>
+          <w:bCs/>
+          <w:sz w:val="28"/>
+          <w:szCs w:val="28"/>
+          <w:highlight w:val="green"/>
+        </w:rPr>
+        <w:t>Importante</w:t>
+      </w:r>
+      <w:r>
+        <w:t>: Se recomienda que el nombre clave sea en minúscula.</w:t>
+      </w:r>
+    </w:p>
+    <w:p>
+      <w:r>
+        <w:tab/>
+        <w:t xml:space="preserve">Si desconoces lo que es un código hexadecimal, simplemente ten en cuenta que es un conjunto de caracteres que se usan para representar un color, puedes visitar el siguiente sitio web para descubrir los códigos hexadecimales de los colores que requieras </w:t>
+      </w:r>
+      <w:hyperlink r:id="rId18" w:history="1">
+        <w:r>
+          <w:rPr>
+            <w:rStyle w:val="Hipervnculo"/>
+          </w:rPr>
+          <w:t>https://htmlcolorcodes.com/es/selector-de-color/</w:t>
+        </w:r>
+      </w:hyperlink>
+      <w:r>
+        <w:t xml:space="preserve"> </w:t>
+      </w:r>
+    </w:p>
+    <w:p>
+      <w:r>
+        <w:tab/>
+        <w:t>Estos códigos comienzan con un “#” y le siguen 6 dígitos que pueden ir del 0</w:t>
+      </w:r>
+      <w:r>
+        <w:t xml:space="preserve"> al 9 y de la A</w:t>
+      </w:r>
+      <w:r>
+        <w:t xml:space="preserve"> hasta la F</w:t>
       </w:r>
       <w:r>
         <w:t>.</w:t>
       </w:r>
     </w:p>
     <w:p>
+      <w:pPr>
+        <w:rPr>
+          <w:i/>
+          <w:iCs/>
+          <w:sz w:val="20"/>
+          <w:szCs w:val="20"/>
+        </w:rPr>
+      </w:pPr>
       <w:r>
         <w:rPr>
           <w:noProof/>
         </w:rPr>
+        <w:lastRenderedPageBreak/>
         <w:drawing>
-          <wp:inline distT="0" distB="0" distL="0" distR="0" wp14:anchorId="6E6D79DC" wp14:editId="78E8E375">
-            <wp:extent cx="5010150" cy="2600325"/>
-            <wp:effectExtent l="0" t="0" r="0" b="9525"/>
+          <wp:anchor distT="0" distB="0" distL="114300" distR="114300" simplePos="0" relativeHeight="251681792" behindDoc="0" locked="0" layoutInCell="1" allowOverlap="1" wp14:anchorId="6E6D79DC" wp14:editId="64479C88">
+            <wp:simplePos x="0" y="0"/>
+            <wp:positionH relativeFrom="margin">
+              <wp:align>left</wp:align>
+            </wp:positionH>
+            <wp:positionV relativeFrom="margin">
+              <wp:posOffset>188463</wp:posOffset>
+            </wp:positionV>
+            <wp:extent cx="4434205" cy="2301240"/>
+            <wp:effectExtent l="0" t="0" r="4445" b="3810"/>
+            <wp:wrapSquare wrapText="bothSides"/>
             <wp:docPr id="427014048" name="Imagen 1"/>
             <wp:cNvGraphicFramePr>
               <a:graphicFrameLocks xmlns:a="http://schemas.openxmlformats.org/drawingml/2006/main" noChangeAspect="1"/>
@@ -7215,7 +7630,13 @@
                     <pic:cNvPicPr/>
                   </pic:nvPicPr>
                   <pic:blipFill>
-                    <a:blip r:embed="rId17"/>
+                    <a:blip r:embed="rId19">
+                      <a:extLst>
+                        <a:ext uri="{28A0092B-C50C-407E-A947-70E740481C1C}">
+                          <a14:useLocalDpi xmlns:a14="http://schemas.microsoft.com/office/drawing/2010/main" val="0"/>
+                        </a:ext>
+                      </a:extLst>
+                    </a:blip>
                     <a:stretch>
                       <a:fillRect/>
                     </a:stretch>
@@ -7223,7 +7644,7 @@
                   <pic:spPr>
                     <a:xfrm>
                       <a:off x="0" y="0"/>
-                      <a:ext cx="5010150" cy="2600325"/>
+                      <a:ext cx="4434205" cy="2301240"/>
                     </a:xfrm>
                     <a:prstGeom prst="rect">
                       <a:avLst/>
@@ -7232,33 +7653,97 @@
                 </pic:pic>
               </a:graphicData>
             </a:graphic>
-          </wp:inline>
+            <wp14:sizeRelH relativeFrom="margin">
+              <wp14:pctWidth>0</wp14:pctWidth>
+            </wp14:sizeRelH>
+            <wp14:sizeRelV relativeFrom="margin">
+              <wp14:pctHeight>0</wp14:pctHeight>
+            </wp14:sizeRelV>
+          </wp:anchor>
         </w:drawing>
       </w:r>
+      <w:r>
+        <w:rPr>
+          <w:i/>
+          <w:iCs/>
+          <w:sz w:val="20"/>
+          <w:szCs w:val="20"/>
+        </w:rPr>
+        <w:t>Definiendo una serie de personajes</w:t>
+      </w:r>
+    </w:p>
+    <w:p>
+      <w:pPr>
+        <w:rPr>
+          <w:i/>
+          <w:iCs/>
+          <w:sz w:val="20"/>
+          <w:szCs w:val="20"/>
+        </w:rPr>
+      </w:pPr>
+    </w:p>
+    <w:p>
+      <w:pPr>
+        <w:rPr>
+          <w:i/>
+          <w:iCs/>
+          <w:sz w:val="20"/>
+          <w:szCs w:val="20"/>
+        </w:rPr>
+      </w:pPr>
+    </w:p>
+    <w:p>
+      <w:pPr>
+        <w:rPr>
+          <w:i/>
+          <w:iCs/>
+          <w:sz w:val="20"/>
+          <w:szCs w:val="20"/>
+        </w:rPr>
+      </w:pPr>
+    </w:p>
+    <w:p>
+      <w:pPr>
+        <w:rPr>
+          <w:i/>
+          <w:iCs/>
+          <w:sz w:val="20"/>
+          <w:szCs w:val="20"/>
+        </w:rPr>
+      </w:pPr>
+    </w:p>
+    <w:p>
+      <w:pPr>
+        <w:rPr>
+          <w:i/>
+          <w:iCs/>
+          <w:sz w:val="20"/>
+          <w:szCs w:val="20"/>
+        </w:rPr>
+      </w:pPr>
+    </w:p>
+    <w:p>
+      <w:pPr>
+        <w:rPr>
+          <w:i/>
+          <w:iCs/>
+          <w:sz w:val="20"/>
+          <w:szCs w:val="20"/>
+        </w:rPr>
+      </w:pPr>
+    </w:p>
+    <w:p>
+      <w:pPr>
+        <w:rPr>
+          <w:i/>
+          <w:iCs/>
+          <w:sz w:val="20"/>
+          <w:szCs w:val="20"/>
+        </w:rPr>
+      </w:pPr>
     </w:p>
     <w:p/>
-    <w:p>
-      <w:pPr>
-        <w:ind w:firstLine="708"/>
-      </w:pPr>
-      <w:r>
-        <w:t xml:space="preserve">Si desconoces completamente el término “hexadecimal” para referirse a colores, </w:t>
-      </w:r>
-      <w:r>
-        <w:t xml:space="preserve">es simplemente la representación de un color mediante un # y 6 dígitos, puedes usar herramientas como Paint o el sitio web </w:t>
-      </w:r>
-      <w:hyperlink r:id="rId18" w:history="1">
-        <w:r>
-          <w:rPr>
-            <w:rStyle w:val="Hipervnculo"/>
-          </w:rPr>
-          <w:t>https://htmlcolorcodes.com/es/</w:t>
-        </w:r>
-      </w:hyperlink>
-      <w:r>
-        <w:t xml:space="preserve"> para descubrir los códigos hexadecimales para el color que necesites.</w:t>
-      </w:r>
-    </w:p>
+    <w:p/>
     <w:p>
       <w:r>
         <w:tab/>
@@ -7278,14 +7763,30 @@
       </w:r>
     </w:p>
     <w:p>
+      <w:pPr>
+        <w:rPr>
+          <w:i/>
+          <w:iCs/>
+          <w:sz w:val="20"/>
+          <w:szCs w:val="20"/>
+        </w:rPr>
+      </w:pPr>
       <w:r>
         <w:rPr>
           <w:noProof/>
         </w:rPr>
         <w:drawing>
-          <wp:inline distT="0" distB="0" distL="0" distR="0" wp14:anchorId="04FC4D77" wp14:editId="5E3481EE">
+          <wp:anchor distT="0" distB="0" distL="114300" distR="114300" simplePos="0" relativeHeight="251682816" behindDoc="0" locked="0" layoutInCell="1" allowOverlap="1" wp14:anchorId="04FC4D77" wp14:editId="71B59C3E">
+            <wp:simplePos x="0" y="0"/>
+            <wp:positionH relativeFrom="margin">
+              <wp:posOffset>-15541</wp:posOffset>
+            </wp:positionH>
+            <wp:positionV relativeFrom="margin">
+              <wp:posOffset>3462883</wp:posOffset>
+            </wp:positionV>
             <wp:extent cx="5219700" cy="476250"/>
             <wp:effectExtent l="0" t="0" r="0" b="0"/>
+            <wp:wrapSquare wrapText="bothSides"/>
             <wp:docPr id="1035006697" name="Imagen 1"/>
             <wp:cNvGraphicFramePr>
               <a:graphicFrameLocks xmlns:a="http://schemas.openxmlformats.org/drawingml/2006/main" noChangeAspect="1"/>
@@ -7298,7 +7799,13 @@
                     <pic:cNvPicPr/>
                   </pic:nvPicPr>
                   <pic:blipFill>
-                    <a:blip r:embed="rId19"/>
+                    <a:blip r:embed="rId20">
+                      <a:extLst>
+                        <a:ext uri="{28A0092B-C50C-407E-A947-70E740481C1C}">
+                          <a14:useLocalDpi xmlns:a14="http://schemas.microsoft.com/office/drawing/2010/main" val="0"/>
+                        </a:ext>
+                      </a:extLst>
+                    </a:blip>
                     <a:stretch>
                       <a:fillRect/>
                     </a:stretch>
@@ -7315,47 +7822,190 @@
                 </pic:pic>
               </a:graphicData>
             </a:graphic>
-          </wp:inline>
+          </wp:anchor>
         </w:drawing>
-      </w:r>
-    </w:p>
-    <w:p>
-      <w:pPr>
-        <w:rPr>
-          <w:noProof/>
-        </w:rPr>
-      </w:pPr>
-      <w:r>
-        <w:rPr>
-          <w:noProof/>
-        </w:rPr>
-        <w:tab/>
-        <w:t xml:space="preserve">¿Recuerdas que el archivo </w:t>
       </w:r>
       <w:r>
         <w:rPr>
           <w:i/>
           <w:iCs/>
+          <w:sz w:val="20"/>
+          <w:szCs w:val="20"/>
+        </w:rPr>
+        <w:t>Definiendo al personaje Katherine</w:t>
+      </w:r>
+    </w:p>
+    <w:p/>
+    <w:p>
+      <w:r>
+        <w:tab/>
+        <w:t xml:space="preserve">Ahora vamos con un aspecto interesante sobre los personajes, además de definir el </w:t>
+      </w:r>
+      <w:r>
+        <w:rPr>
+          <w:b/>
+          <w:bCs/>
+        </w:rPr>
+        <w:t>nombre clave</w:t>
+      </w:r>
+      <w:r>
+        <w:rPr>
+          <w:b/>
+          <w:bCs/>
+          <w:i/>
+          <w:iCs/>
+        </w:rPr>
+        <w:t xml:space="preserve"> </w:t>
+      </w:r>
+      <w:r>
+        <w:t>y el color, tendremos que definir el nombre del personaje en los distintos idiomas. En el caso de Katherine, simplemente debemos escribirlo una sola vez, ya que, este personaje tendrá siempre el mismo nombre en todos los idiomas.</w:t>
+      </w:r>
+    </w:p>
+    <w:p>
+      <w:r>
+        <w:tab/>
+        <w:t>Por lo tanto la definición completa de Katherine sería la siguiente.</w:t>
+      </w:r>
+    </w:p>
+    <w:p>
+      <w:pPr>
+        <w:rPr>
+          <w:sz w:val="20"/>
+          <w:szCs w:val="20"/>
+        </w:rPr>
+      </w:pPr>
+      <w:r>
+        <w:rPr>
           <w:noProof/>
         </w:rPr>
-        <w:t>config.csv</w:t>
-      </w:r>
-      <w:r>
+        <w:drawing>
+          <wp:anchor distT="0" distB="0" distL="114300" distR="114300" simplePos="0" relativeHeight="251683840" behindDoc="0" locked="0" layoutInCell="1" allowOverlap="1" wp14:anchorId="6F6B2828" wp14:editId="0F472871">
+            <wp:simplePos x="0" y="0"/>
+            <wp:positionH relativeFrom="margin">
+              <wp:posOffset>-147731</wp:posOffset>
+            </wp:positionH>
+            <wp:positionV relativeFrom="margin">
+              <wp:posOffset>5649536</wp:posOffset>
+            </wp:positionV>
+            <wp:extent cx="5400040" cy="448310"/>
+            <wp:effectExtent l="0" t="0" r="0" b="8890"/>
+            <wp:wrapSquare wrapText="bothSides"/>
+            <wp:docPr id="268712773" name="Imagen 1"/>
+            <wp:cNvGraphicFramePr>
+              <a:graphicFrameLocks xmlns:a="http://schemas.openxmlformats.org/drawingml/2006/main" noChangeAspect="1"/>
+            </wp:cNvGraphicFramePr>
+            <a:graphic xmlns:a="http://schemas.openxmlformats.org/drawingml/2006/main">
+              <a:graphicData uri="http://schemas.openxmlformats.org/drawingml/2006/picture">
+                <pic:pic xmlns:pic="http://schemas.openxmlformats.org/drawingml/2006/picture">
+                  <pic:nvPicPr>
+                    <pic:cNvPr id="268712773" name=""/>
+                    <pic:cNvPicPr/>
+                  </pic:nvPicPr>
+                  <pic:blipFill>
+                    <a:blip r:embed="rId21">
+                      <a:extLst>
+                        <a:ext uri="{28A0092B-C50C-407E-A947-70E740481C1C}">
+                          <a14:useLocalDpi xmlns:a14="http://schemas.microsoft.com/office/drawing/2010/main" val="0"/>
+                        </a:ext>
+                      </a:extLst>
+                    </a:blip>
+                    <a:stretch>
+                      <a:fillRect/>
+                    </a:stretch>
+                  </pic:blipFill>
+                  <pic:spPr>
+                    <a:xfrm>
+                      <a:off x="0" y="0"/>
+                      <a:ext cx="5400040" cy="448310"/>
+                    </a:xfrm>
+                    <a:prstGeom prst="rect">
+                      <a:avLst/>
+                    </a:prstGeom>
+                  </pic:spPr>
+                </pic:pic>
+              </a:graphicData>
+            </a:graphic>
+          </wp:anchor>
+        </w:drawing>
+      </w:r>
+      <w:r>
+        <w:rPr>
+          <w:sz w:val="20"/>
+          <w:szCs w:val="20"/>
+        </w:rPr>
+        <w:t>Definición completa de Katherine, personaje cuyo nombre es el mismo en todos los idiomas.</w:t>
+      </w:r>
+    </w:p>
+    <w:p>
+      <w:pPr>
+        <w:rPr>
+          <w:sz w:val="20"/>
+          <w:szCs w:val="20"/>
+        </w:rPr>
+      </w:pPr>
+    </w:p>
+    <w:p>
+      <w:r>
+        <w:rPr>
+          <w:sz w:val="20"/>
+          <w:szCs w:val="20"/>
+        </w:rPr>
+        <w:tab/>
+      </w:r>
+      <w:r>
+        <w:t>Si bien es cierto que generalmente los nombres de los personajes no van a variar dependiendo del idioma, existen algunos que sí, por ejemplo, un mesero. Si definiésemos al personaje bajo el nombre “Mesero”, dicho nombre aparecería en todos los idiomas, no tendría sentido que al jugar en inglés apareciese “Mesero”, este debería decir “Tableman”, lo mismo para otros idiomas.</w:t>
+      </w:r>
+    </w:p>
+    <w:p>
+      <w:r>
+        <w:tab/>
+        <w:t>En este caso, como el nombre del personaje puede variar según el idioma, utilizaremos el resto de columnas de idiomas, por lo tanto, nuestro personaje mesero se definiría de la siguiente manera.</w:t>
+      </w:r>
+    </w:p>
+    <w:p>
+      <w:r>
+        <w:t xml:space="preserve"> </w:t>
+      </w:r>
+    </w:p>
+    <w:p>
+      <w:pPr>
         <w:rPr>
           <w:noProof/>
         </w:rPr>
-        <w:t xml:space="preserve"> tiene varias columnas detallando los posibles idiomas de la novela? Cuando defines a un personaje debes definir cómo se escribirá su nombre en pantalla dependiendo del idioma.</w:t>
-      </w:r>
-    </w:p>
-    <w:p>
+      </w:pPr>
       <w:r>
         <w:rPr>
           <w:noProof/>
         </w:rPr>
+        <w:tab/>
+      </w:r>
+    </w:p>
+    <w:p>
+      <w:pPr>
+        <w:rPr>
+          <w:i/>
+          <w:iCs/>
+          <w:sz w:val="20"/>
+          <w:szCs w:val="20"/>
+        </w:rPr>
+      </w:pPr>
+      <w:r>
+        <w:rPr>
+          <w:noProof/>
+        </w:rPr>
+        <w:lastRenderedPageBreak/>
         <w:drawing>
-          <wp:inline distT="0" distB="0" distL="0" distR="0" wp14:anchorId="376B1191" wp14:editId="33F2174D">
+          <wp:anchor distT="0" distB="0" distL="114300" distR="114300" simplePos="0" relativeHeight="251684864" behindDoc="0" locked="0" layoutInCell="1" allowOverlap="1" wp14:anchorId="376B1191" wp14:editId="103DEB02">
+            <wp:simplePos x="0" y="0"/>
+            <wp:positionH relativeFrom="margin">
+              <wp:posOffset>-116018</wp:posOffset>
+            </wp:positionH>
+            <wp:positionV relativeFrom="margin">
+              <wp:posOffset>220301</wp:posOffset>
+            </wp:positionV>
             <wp:extent cx="5400040" cy="239395"/>
             <wp:effectExtent l="0" t="0" r="0" b="8255"/>
+            <wp:wrapSquare wrapText="bothSides"/>
             <wp:docPr id="1295631050" name="Imagen 1"/>
             <wp:cNvGraphicFramePr>
               <a:graphicFrameLocks xmlns:a="http://schemas.openxmlformats.org/drawingml/2006/main" noChangeAspect="1"/>
@@ -7368,7 +8018,13 @@
                     <pic:cNvPicPr/>
                   </pic:nvPicPr>
                   <pic:blipFill>
-                    <a:blip r:embed="rId20"/>
+                    <a:blip r:embed="rId22">
+                      <a:extLst>
+                        <a:ext uri="{28A0092B-C50C-407E-A947-70E740481C1C}">
+                          <a14:useLocalDpi xmlns:a14="http://schemas.microsoft.com/office/drawing/2010/main" val="0"/>
+                        </a:ext>
+                      </a:extLst>
+                    </a:blip>
                     <a:stretch>
                       <a:fillRect/>
                     </a:stretch>
@@ -7385,50 +8041,195 @@
                 </pic:pic>
               </a:graphicData>
             </a:graphic>
-          </wp:inline>
+          </wp:anchor>
         </w:drawing>
       </w:r>
+      <w:r>
+        <w:rPr>
+          <w:i/>
+          <w:iCs/>
+          <w:sz w:val="20"/>
+          <w:szCs w:val="20"/>
+        </w:rPr>
+        <w:t>Definiendo al personaje “Mesero” y colocando su nombre dependiendo del idioma.</w:t>
+      </w:r>
+    </w:p>
+    <w:p>
+      <w:pPr>
+        <w:rPr>
+          <w:i/>
+          <w:iCs/>
+          <w:sz w:val="20"/>
+          <w:szCs w:val="20"/>
+        </w:rPr>
+      </w:pPr>
     </w:p>
     <w:p>
       <w:r>
         <w:tab/>
-        <w:t xml:space="preserve">En este ejemplo tenemos un personaje con el nombre clave “tableman”, el código hexadecimal #ffffff corresponde al color blanco y luego tenemos las distintas variaciones </w:t>
-      </w:r>
-      <w:r>
-        <w:lastRenderedPageBreak/>
-        <w:t>de nombre dependiendo del idioma, en español, inglés, chino y portugués respectivamente.</w:t>
+        <w:t xml:space="preserve">Es necesario que </w:t>
+      </w:r>
+      <w:r>
+        <w:t>entiendas</w:t>
+      </w:r>
+      <w:r>
+        <w:t xml:space="preserve"> que el personaje puede tener múltiples variaciones de nombre, sin embargo cuando hagamos referencia a este personaje, lo haremos mediante su </w:t>
+      </w:r>
+      <w:r>
+        <w:rPr>
+          <w:b/>
+          <w:bCs/>
+        </w:rPr>
+        <w:t>nombre clave</w:t>
+      </w:r>
+      <w:r>
+        <w:rPr>
+          <w:b/>
+          <w:bCs/>
+          <w:i/>
+          <w:iCs/>
+        </w:rPr>
+        <w:t xml:space="preserve">, </w:t>
+      </w:r>
+      <w:r>
+        <w:t xml:space="preserve">en este caso “tableman” (definido en la columna </w:t>
+      </w:r>
+      <w:r>
+        <w:rPr>
+          <w:i/>
+          <w:iCs/>
+        </w:rPr>
+        <w:t>Value1</w:t>
+      </w:r>
+      <w:r>
+        <w:t>)</w:t>
+      </w:r>
+      <w:r>
+        <w:t>.</w:t>
       </w:r>
     </w:p>
     <w:p>
       <w:r>
         <w:tab/>
-      </w:r>
-      <w:r>
-        <w:t>En pocas palabras, siempre que un personaje hable al menos una vez en tu novela, debes definirlo aquí.</w:t>
+        <w:t>De esta manera siempre que el personaje “tableman” hable, su nombre se colocará en pantalla utilizando su idioma correspondiente.</w:t>
+      </w:r>
+      <w:r>
+        <w:t xml:space="preserve"> </w:t>
+      </w:r>
+      <w:r>
+        <w:t>El</w:t>
+      </w:r>
+      <w:r>
+        <w:t xml:space="preserve"> motor siempre intentará mostrar el nombre del personaje según el idioma actual, si este no tiene variación en dicho idioma, mostrará el nombre por defecto.</w:t>
       </w:r>
     </w:p>
     <w:p>
       <w:r>
         <w:tab/>
-        <w:t>Por supuesto no todos los personajes tendrán variaciones de nombre acorde al idioma, si un personaje tiene el nombre de Katherine, ella debería llamarse así en todos los idiomas, por lo cual solo necesitas colocar su nombre una sola vez en la primera casilla de idioma</w:t>
-      </w:r>
-      <w:r>
-        <w:t xml:space="preserve"> de la siguiente forma</w:t>
-      </w:r>
-      <w:r>
-        <w:t>.</w:t>
-      </w:r>
-    </w:p>
-    <w:p>
+        <w:t>Allí tienes que definir TODOS los personajes que hablen en tu novela.</w:t>
+      </w:r>
+    </w:p>
+    <w:p>
+      <w:pPr>
+        <w:pStyle w:val="Ttulo2"/>
+      </w:pPr>
+      <w:r>
+        <w:t>Definiendo los idiomas</w:t>
+      </w:r>
+    </w:p>
+    <w:p>
+      <w:r>
+        <w:tab/>
+      </w:r>
+      <w:r>
+        <w:t xml:space="preserve">Cuando crees un proyecto en </w:t>
+      </w:r>
+      <w:r>
+        <w:rPr>
+          <w:b/>
+          <w:bCs/>
+        </w:rPr>
+        <w:t>Renpy</w:t>
+      </w:r>
+      <w:r>
+        <w:t xml:space="preserve">, este generará una carpeta llamata </w:t>
+      </w:r>
+      <w:r>
+        <w:rPr>
+          <w:i/>
+          <w:iCs/>
+        </w:rPr>
+        <w:t>tl</w:t>
+      </w:r>
+      <w:r>
+        <w:t xml:space="preserve">, esta contendrá los idiomas y traducciones permitidos. </w:t>
+      </w:r>
+      <w:r>
+        <w:rPr>
+          <w:b/>
+          <w:bCs/>
+        </w:rPr>
+        <w:t>Renpy</w:t>
+      </w:r>
+      <w:r>
+        <w:t xml:space="preserve"> hace referencia al idioma por defecto bajo el nombre de “</w:t>
+      </w:r>
+      <w:r>
+        <w:rPr>
+          <w:i/>
+          <w:iCs/>
+        </w:rPr>
+        <w:t>None”</w:t>
+      </w:r>
+      <w:r>
+        <w:t xml:space="preserve">, es necesario que </w:t>
+      </w:r>
+      <w:r>
+        <w:t>copies y pegues esa carpeta bajo el nombre del idioma por defecto de tu novela. Luego de eso,</w:t>
+      </w:r>
+      <w:r>
+        <w:t xml:space="preserve"> accede al archivo </w:t>
+      </w:r>
+      <w:r>
+        <w:rPr>
+          <w:i/>
+          <w:iCs/>
+        </w:rPr>
+        <w:t>common.rpym</w:t>
+      </w:r>
+      <w:r>
+        <w:t xml:space="preserve"> y</w:t>
+      </w:r>
+      <w:r>
+        <w:t xml:space="preserve"> cambia “None” por “tu idioma por defecto”.</w:t>
+      </w:r>
+    </w:p>
+    <w:p>
+      <w:pPr>
+        <w:rPr>
+          <w:i/>
+          <w:iCs/>
+          <w:sz w:val="20"/>
+          <w:szCs w:val="20"/>
+        </w:rPr>
+      </w:pPr>
       <w:r>
         <w:rPr>
           <w:noProof/>
         </w:rPr>
         <w:drawing>
-          <wp:inline distT="0" distB="0" distL="0" distR="0" wp14:anchorId="1E1ABA1D" wp14:editId="494CE3FB">
-            <wp:extent cx="5400040" cy="379095"/>
-            <wp:effectExtent l="0" t="0" r="0" b="1905"/>
-            <wp:docPr id="1583683525" name="Imagen 1"/>
+          <wp:anchor distT="0" distB="0" distL="114300" distR="114300" simplePos="0" relativeHeight="251685888" behindDoc="0" locked="0" layoutInCell="1" allowOverlap="1" wp14:anchorId="20FE711B" wp14:editId="165615D8">
+            <wp:simplePos x="0" y="0"/>
+            <wp:positionH relativeFrom="margin">
+              <wp:posOffset>-10571</wp:posOffset>
+            </wp:positionH>
+            <wp:positionV relativeFrom="margin">
+              <wp:posOffset>4284800</wp:posOffset>
+            </wp:positionV>
+            <wp:extent cx="1666875" cy="1323975"/>
+            <wp:effectExtent l="0" t="0" r="9525" b="9525"/>
+            <wp:wrapSquare wrapText="bothSides"/>
+            <wp:docPr id="1706207827" name="Imagen 1"/>
             <wp:cNvGraphicFramePr>
               <a:graphicFrameLocks xmlns:a="http://schemas.openxmlformats.org/drawingml/2006/main" noChangeAspect="1"/>
             </wp:cNvGraphicFramePr>
@@ -7436,11 +8237,17 @@
               <a:graphicData uri="http://schemas.openxmlformats.org/drawingml/2006/picture">
                 <pic:pic xmlns:pic="http://schemas.openxmlformats.org/drawingml/2006/picture">
                   <pic:nvPicPr>
-                    <pic:cNvPr id="1583683525" name=""/>
+                    <pic:cNvPr id="1706207827" name=""/>
                     <pic:cNvPicPr/>
                   </pic:nvPicPr>
                   <pic:blipFill>
-                    <a:blip r:embed="rId21"/>
+                    <a:blip r:embed="rId23">
+                      <a:extLst>
+                        <a:ext uri="{28A0092B-C50C-407E-A947-70E740481C1C}">
+                          <a14:useLocalDpi xmlns:a14="http://schemas.microsoft.com/office/drawing/2010/main" val="0"/>
+                        </a:ext>
+                      </a:extLst>
+                    </a:blip>
                     <a:stretch>
                       <a:fillRect/>
                     </a:stretch>
@@ -7448,7 +8255,7 @@
                   <pic:spPr>
                     <a:xfrm>
                       <a:off x="0" y="0"/>
-                      <a:ext cx="5400040" cy="379095"/>
+                      <a:ext cx="1666875" cy="1323975"/>
                     </a:xfrm>
                     <a:prstGeom prst="rect">
                       <a:avLst/>
@@ -7457,32 +8264,42 @@
                 </pic:pic>
               </a:graphicData>
             </a:graphic>
-          </wp:inline>
+          </wp:anchor>
         </w:drawing>
       </w:r>
-    </w:p>
-    <w:p>
-      <w:r>
-        <w:tab/>
-        <w:t>Al hacer eso, independientemente del idioma, cuando hagas referencia a Katherine, siempre mostrará su nombre “Katherine”.</w:t>
-      </w:r>
-    </w:p>
-    <w:p>
-      <w:r>
-        <w:tab/>
-        <w:t>De todas formas, si el personaje tiene una variación en un idioma específico como por ejemplo en chino, solo debes colocar su traducción en la columna del idioma chino.</w:t>
-      </w:r>
-    </w:p>
+      <w:r>
+        <w:rPr>
+          <w:i/>
+          <w:iCs/>
+          <w:sz w:val="20"/>
+          <w:szCs w:val="20"/>
+        </w:rPr>
+        <w:t>Copiando la carpeta None y pegándola bajo el nombre de “spanish”</w:t>
+      </w:r>
+    </w:p>
+    <w:p/>
+    <w:p/>
+    <w:p/>
+    <w:p/>
+    <w:p/>
     <w:p>
       <w:r>
         <w:rPr>
           <w:noProof/>
         </w:rPr>
         <w:drawing>
-          <wp:inline distT="0" distB="0" distL="0" distR="0" wp14:anchorId="2C8A9C55" wp14:editId="67BF58F2">
-            <wp:extent cx="5400040" cy="264160"/>
-            <wp:effectExtent l="0" t="0" r="0" b="2540"/>
-            <wp:docPr id="1264398120" name="Imagen 1"/>
+          <wp:anchor distT="0" distB="0" distL="114300" distR="114300" simplePos="0" relativeHeight="251686912" behindDoc="0" locked="0" layoutInCell="1" allowOverlap="1" wp14:anchorId="6D9D0D8E" wp14:editId="707E865A">
+            <wp:simplePos x="0" y="0"/>
+            <wp:positionH relativeFrom="margin">
+              <wp:align>left</wp:align>
+            </wp:positionH>
+            <wp:positionV relativeFrom="margin">
+              <wp:posOffset>6101198</wp:posOffset>
+            </wp:positionV>
+            <wp:extent cx="3666490" cy="2039620"/>
+            <wp:effectExtent l="0" t="0" r="0" b="0"/>
+            <wp:wrapSquare wrapText="bothSides"/>
+            <wp:docPr id="1532023131" name="Imagen 1"/>
             <wp:cNvGraphicFramePr>
               <a:graphicFrameLocks xmlns:a="http://schemas.openxmlformats.org/drawingml/2006/main" noChangeAspect="1"/>
             </wp:cNvGraphicFramePr>
@@ -7490,11 +8307,17 @@
               <a:graphicData uri="http://schemas.openxmlformats.org/drawingml/2006/picture">
                 <pic:pic xmlns:pic="http://schemas.openxmlformats.org/drawingml/2006/picture">
                   <pic:nvPicPr>
-                    <pic:cNvPr id="1264398120" name=""/>
+                    <pic:cNvPr id="1532023131" name=""/>
                     <pic:cNvPicPr/>
                   </pic:nvPicPr>
                   <pic:blipFill>
-                    <a:blip r:embed="rId22"/>
+                    <a:blip r:embed="rId24">
+                      <a:extLst>
+                        <a:ext uri="{28A0092B-C50C-407E-A947-70E740481C1C}">
+                          <a14:useLocalDpi xmlns:a14="http://schemas.microsoft.com/office/drawing/2010/main" val="0"/>
+                        </a:ext>
+                      </a:extLst>
+                    </a:blip>
                     <a:stretch>
                       <a:fillRect/>
                     </a:stretch>
@@ -7502,7 +8325,7 @@
                   <pic:spPr>
                     <a:xfrm>
                       <a:off x="0" y="0"/>
-                      <a:ext cx="5400040" cy="264160"/>
+                      <a:ext cx="3666490" cy="2039620"/>
                     </a:xfrm>
                     <a:prstGeom prst="rect">
                       <a:avLst/>
@@ -7511,42 +8334,61 @@
                 </pic:pic>
               </a:graphicData>
             </a:graphic>
-          </wp:inline>
+            <wp14:sizeRelH relativeFrom="margin">
+              <wp14:pctWidth>0</wp14:pctWidth>
+            </wp14:sizeRelH>
+            <wp14:sizeRelV relativeFrom="margin">
+              <wp14:pctHeight>0</wp14:pctHeight>
+            </wp14:sizeRelV>
+          </wp:anchor>
         </w:drawing>
       </w:r>
-    </w:p>
-    <w:p>
-      <w:r>
-        <w:tab/>
-        <w:t>Tomando como ejemplo la imagen anterior, si el juego estuviese en inglés, como la variación de Katherine en inglés no existe, mostrará el nombre del idioma por defecto.</w:t>
-      </w:r>
-    </w:p>
-    <w:p>
-      <w:pPr>
-        <w:pStyle w:val="Ttulo2"/>
-      </w:pPr>
-      <w:bookmarkStart w:id="19" w:name="_Toc227172393"/>
-      <w:r>
-        <w:t>Configuraciones de rutas de archivos</w:t>
-      </w:r>
-      <w:bookmarkEnd w:id="19"/>
-    </w:p>
-    <w:p>
-      <w:r>
-        <w:tab/>
-        <w:t>En esta sección se definen las distintas rutas de las carpetas que contendrán los sprites, fondos, musicas, sonidos y escenas. Si bien se pueden modificar para tener tu propia estructura de proyecto, lo recomendable es dejarlo tal cual.</w:t>
-      </w:r>
-    </w:p>
-    <w:p>
+      <w:r>
+        <w:rPr>
+          <w:i/>
+          <w:iCs/>
+          <w:sz w:val="20"/>
+          <w:szCs w:val="20"/>
+        </w:rPr>
+        <w:t>Abriendo el archivo common.rpym usando Visual Studio Code</w:t>
+      </w:r>
+    </w:p>
+    <w:p/>
+    <w:p/>
+    <w:p/>
+    <w:p/>
+    <w:p/>
+    <w:p/>
+    <w:p/>
+    <w:p/>
+    <w:p/>
+    <w:p/>
+    <w:p>
+      <w:pPr>
+        <w:rPr>
+          <w:i/>
+          <w:iCs/>
+          <w:sz w:val="20"/>
+          <w:szCs w:val="20"/>
+        </w:rPr>
+      </w:pPr>
       <w:r>
         <w:rPr>
           <w:noProof/>
         </w:rPr>
         <w:drawing>
-          <wp:inline distT="0" distB="0" distL="0" distR="0" wp14:anchorId="3E52944A" wp14:editId="2083916C">
-            <wp:extent cx="5400040" cy="2806700"/>
+          <wp:anchor distT="0" distB="0" distL="114300" distR="114300" simplePos="0" relativeHeight="251687936" behindDoc="0" locked="0" layoutInCell="1" allowOverlap="1" wp14:anchorId="57CA873A" wp14:editId="16AFA55B">
+            <wp:simplePos x="0" y="0"/>
+            <wp:positionH relativeFrom="margin">
+              <wp:align>left</wp:align>
+            </wp:positionH>
+            <wp:positionV relativeFrom="margin">
+              <wp:posOffset>490301</wp:posOffset>
+            </wp:positionV>
+            <wp:extent cx="3601085" cy="1986915"/>
             <wp:effectExtent l="0" t="0" r="0" b="0"/>
-            <wp:docPr id="1349799865" name="Imagen 1"/>
+            <wp:wrapSquare wrapText="bothSides"/>
+            <wp:docPr id="1375320259" name="Imagen 1"/>
             <wp:cNvGraphicFramePr>
               <a:graphicFrameLocks xmlns:a="http://schemas.openxmlformats.org/drawingml/2006/main" noChangeAspect="1"/>
             </wp:cNvGraphicFramePr>
@@ -7554,11 +8396,17 @@
               <a:graphicData uri="http://schemas.openxmlformats.org/drawingml/2006/picture">
                 <pic:pic xmlns:pic="http://schemas.openxmlformats.org/drawingml/2006/picture">
                   <pic:nvPicPr>
-                    <pic:cNvPr id="1349799865" name=""/>
+                    <pic:cNvPr id="1375320259" name=""/>
                     <pic:cNvPicPr/>
                   </pic:nvPicPr>
                   <pic:blipFill>
-                    <a:blip r:embed="rId23"/>
+                    <a:blip r:embed="rId25">
+                      <a:extLst>
+                        <a:ext uri="{28A0092B-C50C-407E-A947-70E740481C1C}">
+                          <a14:useLocalDpi xmlns:a14="http://schemas.microsoft.com/office/drawing/2010/main" val="0"/>
+                        </a:ext>
+                      </a:extLst>
+                    </a:blip>
                     <a:stretch>
                       <a:fillRect/>
                     </a:stretch>
@@ -7566,7 +8414,7 @@
                   <pic:spPr>
                     <a:xfrm>
                       <a:off x="0" y="0"/>
-                      <a:ext cx="5400040" cy="2806700"/>
+                      <a:ext cx="3601085" cy="1986915"/>
                     </a:xfrm>
                     <a:prstGeom prst="rect">
                       <a:avLst/>
@@ -7575,20 +8423,84 @@
                 </pic:pic>
               </a:graphicData>
             </a:graphic>
-          </wp:inline>
+            <wp14:sizeRelH relativeFrom="margin">
+              <wp14:pctWidth>0</wp14:pctWidth>
+            </wp14:sizeRelH>
+            <wp14:sizeRelV relativeFrom="margin">
+              <wp14:pctHeight>0</wp14:pctHeight>
+            </wp14:sizeRelV>
+          </wp:anchor>
         </w:drawing>
       </w:r>
-    </w:p>
+      <w:r>
+        <w:rPr>
+          <w:i/>
+          <w:iCs/>
+          <w:sz w:val="20"/>
+          <w:szCs w:val="20"/>
+        </w:rPr>
+        <w:t>Cambiando “None” por el idioma por defecto “spanish”</w:t>
+      </w:r>
+    </w:p>
+    <w:p/>
+    <w:p/>
+    <w:p/>
+    <w:p/>
+    <w:p/>
+    <w:p/>
+    <w:p/>
+    <w:p>
+      <w:r>
+        <w:tab/>
+        <w:t xml:space="preserve">En caso de que requieras agregar más idiomas, procura ir al ejecutable de </w:t>
+      </w:r>
+      <w:r>
+        <w:rPr>
+          <w:b/>
+          <w:bCs/>
+        </w:rPr>
+        <w:t>Renpy</w:t>
+      </w:r>
+      <w:r>
+        <w:t xml:space="preserve"> y crear la traducción correspondiente.</w:t>
+      </w:r>
+      <w:r>
+        <w:t xml:space="preserve"> Al crear la traducción </w:t>
+      </w:r>
+      <w:r>
+        <w:rPr>
+          <w:b/>
+          <w:bCs/>
+        </w:rPr>
+        <w:t>Renpy</w:t>
+      </w:r>
+      <w:r>
+        <w:t xml:space="preserve"> generará la carpeta correspondiente en la carpeta </w:t>
+      </w:r>
+      <w:r>
+        <w:rPr>
+          <w:i/>
+          <w:iCs/>
+        </w:rPr>
+        <w:t>tl</w:t>
+      </w:r>
+      <w:r>
+        <w:t>.</w:t>
+      </w:r>
+      <w:r>
+        <w:t xml:space="preserve"> Recuerda nombrar los idiomas siempre en minúscula.</w:t>
+      </w:r>
+    </w:p>
+    <w:p/>
     <w:p>
       <w:pPr>
         <w:pStyle w:val="Ttulo2"/>
       </w:pPr>
-      <w:bookmarkStart w:id="20" w:name="_Toc227172394"/>
-      <w:r>
-        <w:lastRenderedPageBreak/>
+      <w:bookmarkStart w:id="19" w:name="_Toc227172394"/>
+      <w:r>
         <w:t>Definición de configuraciones técnicas</w:t>
       </w:r>
-      <w:bookmarkEnd w:id="20"/>
+      <w:bookmarkEnd w:id="19"/>
     </w:p>
     <w:p>
       <w:r>
@@ -7599,58 +8511,120 @@
         <w:t>l</w:t>
       </w:r>
       <w:r>
-        <w:t xml:space="preserve">os valores predeterminados de Renpy puedes hacerlo en el archivo </w:t>
+        <w:t xml:space="preserve">os valores predeterminados de </w:t>
+      </w:r>
+      <w:r>
+        <w:rPr>
+          <w:b/>
+          <w:bCs/>
+        </w:rPr>
+        <w:t>Renpy</w:t>
+      </w:r>
+      <w:r>
+        <w:t xml:space="preserve"> puedes hacerlo en el archivo </w:t>
       </w:r>
       <w:r>
         <w:rPr>
           <w:i/>
           <w:iCs/>
         </w:rPr>
-        <w:t>configDefine.rpy</w:t>
-      </w:r>
-      <w:r>
-        <w:t xml:space="preserve"> ubicado en la carpeta </w:t>
+        <w:t>customConfig</w:t>
       </w:r>
       <w:r>
         <w:rPr>
           <w:i/>
           <w:iCs/>
         </w:rPr>
+        <w:t>.rpy</w:t>
+      </w:r>
+      <w:r>
+        <w:t xml:space="preserve"> ubicado en la carpeta </w:t>
+      </w:r>
+      <w:r>
+        <w:rPr>
+          <w:i/>
+          <w:iCs/>
+        </w:rPr>
         <w:t>game/definitions.</w:t>
       </w:r>
       <w:r>
         <w:t xml:space="preserve"> Allí </w:t>
       </w:r>
       <w:r>
-        <w:t>podrás definir todas las configuraciones extras que quieras realizar en renpy.</w:t>
+        <w:t xml:space="preserve">podrás definir todas las configuraciones extras que quieras realizar en </w:t>
+      </w:r>
+      <w:r>
+        <w:rPr>
+          <w:b/>
+          <w:bCs/>
+        </w:rPr>
+        <w:t>R</w:t>
+      </w:r>
+      <w:r>
+        <w:rPr>
+          <w:b/>
+          <w:bCs/>
+        </w:rPr>
+        <w:t>enpy</w:t>
+      </w:r>
+      <w:r>
+        <w:t xml:space="preserve">, evidentemente estas configuraciones deben hacerse en lenguaje </w:t>
+      </w:r>
+      <w:r>
+        <w:rPr>
+          <w:b/>
+          <w:bCs/>
+        </w:rPr>
+        <w:t>Renpy</w:t>
+      </w:r>
+      <w:r>
+        <w:t>.</w:t>
       </w:r>
     </w:p>
     <w:p>
       <w:r>
         <w:tab/>
-        <w:t>Por defecto Atlax Renpy centra la caja de texto con el nombre del emisor entre otras configuraciones. Este es un archivo propio de renpy con el formato .rpy, por lo tanto lo recomendable es abrirlo con un editor de texto como Visual Studio Code o bloc de notas.</w:t>
-      </w:r>
-    </w:p>
-    <w:p>
-      <w:pPr>
-        <w:ind w:firstLine="708"/>
-      </w:pPr>
-      <w:r>
-        <w:t>Dentro encontrarás algo similar a esto.</w:t>
-      </w:r>
-    </w:p>
-    <w:p>
-      <w:pPr>
-        <w:ind w:firstLine="708"/>
+        <w:t xml:space="preserve">Por defecto </w:t>
+      </w:r>
+      <w:r>
+        <w:rPr>
+          <w:b/>
+          <w:bCs/>
+        </w:rPr>
+        <w:t>Atlax Renpy</w:t>
+      </w:r>
+      <w:r>
+        <w:t xml:space="preserve"> centra la caja de texto con el nombre del emisor entre otras configuraciones.</w:t>
+      </w:r>
+      <w:r>
+        <w:t xml:space="preserve"> Si decides abrir el archivo, dentro encontrarás algo como esto.</w:t>
+      </w:r>
+    </w:p>
+    <w:p>
+      <w:pPr>
+        <w:rPr>
+          <w:i/>
+          <w:iCs/>
+          <w:sz w:val="20"/>
+          <w:szCs w:val="20"/>
+        </w:rPr>
       </w:pPr>
       <w:r>
         <w:rPr>
           <w:noProof/>
         </w:rPr>
         <w:drawing>
-          <wp:inline distT="0" distB="0" distL="0" distR="0" wp14:anchorId="480047DD" wp14:editId="59C9A900">
+          <wp:anchor distT="0" distB="0" distL="114300" distR="114300" simplePos="0" relativeHeight="251688960" behindDoc="0" locked="0" layoutInCell="1" allowOverlap="1" wp14:anchorId="480047DD" wp14:editId="573815D8">
+            <wp:simplePos x="0" y="0"/>
+            <wp:positionH relativeFrom="margin">
+              <wp:posOffset>-68374</wp:posOffset>
+            </wp:positionH>
+            <wp:positionV relativeFrom="margin">
+              <wp:posOffset>5873916</wp:posOffset>
+            </wp:positionV>
             <wp:extent cx="5400040" cy="1911985"/>
             <wp:effectExtent l="0" t="0" r="0" b="0"/>
+            <wp:wrapSquare wrapText="bothSides"/>
             <wp:docPr id="1422276432" name="Imagen 1"/>
             <wp:cNvGraphicFramePr>
               <a:graphicFrameLocks xmlns:a="http://schemas.openxmlformats.org/drawingml/2006/main" noChangeAspect="1"/>
@@ -7663,7 +8637,13 @@
                     <pic:cNvPicPr/>
                   </pic:nvPicPr>
                   <pic:blipFill>
-                    <a:blip r:embed="rId24"/>
+                    <a:blip r:embed="rId26">
+                      <a:extLst>
+                        <a:ext uri="{28A0092B-C50C-407E-A947-70E740481C1C}">
+                          <a14:useLocalDpi xmlns:a14="http://schemas.microsoft.com/office/drawing/2010/main" val="0"/>
+                        </a:ext>
+                      </a:extLst>
+                    </a:blip>
                     <a:stretch>
                       <a:fillRect/>
                     </a:stretch>
@@ -7680,16 +8660,44 @@
                 </pic:pic>
               </a:graphicData>
             </a:graphic>
-          </wp:inline>
+          </wp:anchor>
         </w:drawing>
       </w:r>
+      <w:r>
+        <w:rPr>
+          <w:i/>
+          <w:iCs/>
+          <w:sz w:val="20"/>
+          <w:szCs w:val="20"/>
+        </w:rPr>
+        <w:t>El contenido del archivo game/definitions/customConfig.rpy</w:t>
+      </w:r>
+    </w:p>
+    <w:p>
+      <w:r>
+        <w:tab/>
+      </w:r>
+    </w:p>
+    <w:p>
+      <w:r>
+        <w:tab/>
+        <w:t xml:space="preserve">Una vez definida la configuración e idiomas de nuestro proyecto, podemos pasar a la creación de los </w:t>
+      </w:r>
+      <w:r>
+        <w:rPr>
+          <w:b/>
+          <w:bCs/>
+        </w:rPr>
+        <w:t>archivos de control.</w:t>
+      </w:r>
+      <w:bookmarkStart w:id="20" w:name="_Toc227172395"/>
     </w:p>
     <w:p>
       <w:pPr>
         <w:pStyle w:val="Ttulo1"/>
       </w:pPr>
-      <w:bookmarkStart w:id="21" w:name="_Toc227172395"/>
-      <w:r>
+      <w:r>
+        <w:lastRenderedPageBreak/>
         <w:t>Archivo</w:t>
       </w:r>
       <w:r>
@@ -7698,7 +8706,7 @@
       <w:r>
         <w:t xml:space="preserve"> de control</w:t>
       </w:r>
-      <w:bookmarkEnd w:id="21"/>
+      <w:bookmarkEnd w:id="20"/>
     </w:p>
     <w:p>
       <w:r>
@@ -7742,7 +8750,6 @@
         <w:rPr>
           <w:noProof/>
         </w:rPr>
-        <w:lastRenderedPageBreak/>
         <w:drawing>
           <wp:anchor distT="0" distB="0" distL="114300" distR="114300" simplePos="0" relativeHeight="251664384" behindDoc="0" locked="0" layoutInCell="1" allowOverlap="1" wp14:anchorId="2CC1E109" wp14:editId="719FFC7E">
             <wp:simplePos x="0" y="0"/>
@@ -7767,7 +8774,7 @@
                     <pic:cNvPicPr/>
                   </pic:nvPicPr>
                   <pic:blipFill>
-                    <a:blip r:embed="rId25">
+                    <a:blip r:embed="rId27">
                       <a:extLst>
                         <a:ext uri="{28A0092B-C50C-407E-A947-70E740481C1C}">
                           <a14:useLocalDpi xmlns:a14="http://schemas.microsoft.com/office/drawing/2010/main" val="0"/>
@@ -7822,6 +8829,7 @@
     <w:p/>
     <w:p>
       <w:r>
+        <w:lastRenderedPageBreak/>
         <w:tab/>
         <w:t>Si tienes dudas puedes optar por simplemente copiar y pegar alguno de los archivos de control de ejemplo que proporciona Atlax Renpy, borrar su contenido y empezar desde allí.</w:t>
       </w:r>
@@ -7881,7 +8889,7 @@
                     <pic:cNvPicPr/>
                   </pic:nvPicPr>
                   <pic:blipFill>
-                    <a:blip r:embed="rId26">
+                    <a:blip r:embed="rId28">
                       <a:extLst>
                         <a:ext uri="{28A0092B-C50C-407E-A947-70E740481C1C}">
                           <a14:useLocalDpi xmlns:a14="http://schemas.microsoft.com/office/drawing/2010/main" val="0"/>
@@ -7941,7 +8949,7 @@
                     <pic:cNvPicPr/>
                   </pic:nvPicPr>
                   <pic:blipFill>
-                    <a:blip r:embed="rId27">
+                    <a:blip r:embed="rId29">
                       <a:extLst>
                         <a:ext uri="{28A0092B-C50C-407E-A947-70E740481C1C}">
                           <a14:useLocalDpi xmlns:a14="http://schemas.microsoft.com/office/drawing/2010/main" val="0"/>
@@ -7982,12 +8990,11 @@
       <w:pPr>
         <w:pStyle w:val="Ttulo2"/>
       </w:pPr>
-      <w:bookmarkStart w:id="22" w:name="_Toc227172396"/>
-      <w:r>
-        <w:lastRenderedPageBreak/>
+      <w:bookmarkStart w:id="21" w:name="_Toc227172396"/>
+      <w:r>
         <w:t>Estructura</w:t>
       </w:r>
-      <w:bookmarkEnd w:id="22"/>
+      <w:bookmarkEnd w:id="21"/>
     </w:p>
     <w:p>
       <w:r>
@@ -8077,7 +9084,7 @@
                     <pic:cNvPicPr/>
                   </pic:nvPicPr>
                   <pic:blipFill>
-                    <a:blip r:embed="rId28">
+                    <a:blip r:embed="rId30">
                       <a:extLst>
                         <a:ext uri="{28A0092B-C50C-407E-A947-70E740481C1C}">
                           <a14:useLocalDpi xmlns:a14="http://schemas.microsoft.com/office/drawing/2010/main" val="0"/>
@@ -8210,11 +9217,12 @@
       <w:pPr>
         <w:pStyle w:val="Ttulo2"/>
       </w:pPr>
-      <w:bookmarkStart w:id="23" w:name="_Toc227172397"/>
-      <w:r>
+      <w:bookmarkStart w:id="22" w:name="_Toc227172397"/>
+      <w:r>
+        <w:lastRenderedPageBreak/>
         <w:t>Columna Key</w:t>
       </w:r>
-      <w:bookmarkEnd w:id="23"/>
+      <w:bookmarkEnd w:id="22"/>
     </w:p>
     <w:p>
       <w:r>
@@ -8244,7 +9252,6 @@
         <w:rPr>
           <w:noProof/>
         </w:rPr>
-        <w:lastRenderedPageBreak/>
         <w:drawing>
           <wp:anchor distT="0" distB="0" distL="114300" distR="114300" simplePos="0" relativeHeight="251663360" behindDoc="0" locked="0" layoutInCell="1" allowOverlap="1" wp14:anchorId="461CB017" wp14:editId="0AE9517A">
             <wp:simplePos x="0" y="0"/>
@@ -8269,7 +9276,7 @@
                     <pic:cNvPicPr/>
                   </pic:nvPicPr>
                   <pic:blipFill>
-                    <a:blip r:embed="rId29">
+                    <a:blip r:embed="rId31">
                       <a:extLst>
                         <a:ext uri="{28A0092B-C50C-407E-A947-70E740481C1C}">
                           <a14:useLocalDpi xmlns:a14="http://schemas.microsoft.com/office/drawing/2010/main" val="0"/>
@@ -8328,7 +9335,7 @@
                     <pic:cNvPicPr/>
                   </pic:nvPicPr>
                   <pic:blipFill>
-                    <a:blip r:embed="rId30">
+                    <a:blip r:embed="rId32">
                       <a:extLst>
                         <a:ext uri="{28A0092B-C50C-407E-A947-70E740481C1C}">
                           <a14:useLocalDpi xmlns:a14="http://schemas.microsoft.com/office/drawing/2010/main" val="0"/>
@@ -8430,11 +9437,12 @@
       <w:pPr>
         <w:pStyle w:val="Ttulo2"/>
       </w:pPr>
-      <w:bookmarkStart w:id="24" w:name="_Toc227172398"/>
-      <w:r>
+      <w:bookmarkStart w:id="23" w:name="_Toc227172398"/>
+      <w:r>
+        <w:lastRenderedPageBreak/>
         <w:t>Columna Background</w:t>
       </w:r>
-      <w:bookmarkEnd w:id="24"/>
+      <w:bookmarkEnd w:id="23"/>
     </w:p>
     <w:p>
       <w:r>
@@ -8530,14 +9538,14 @@
       <w:pPr>
         <w:pStyle w:val="Ttulo3"/>
       </w:pPr>
-      <w:bookmarkStart w:id="25" w:name="_Toc227172399"/>
+      <w:bookmarkStart w:id="24" w:name="_Toc227172399"/>
       <w:r>
         <w:t xml:space="preserve">Tipos de </w:t>
       </w:r>
       <w:r>
         <w:t>transición</w:t>
       </w:r>
-      <w:bookmarkEnd w:id="25"/>
+      <w:bookmarkEnd w:id="24"/>
     </w:p>
     <w:tbl>
       <w:tblPr>
@@ -8647,7 +9655,6 @@
               <w:jc w:val="center"/>
             </w:pPr>
             <w:r>
-              <w:lastRenderedPageBreak/>
               <w:t>dissolve</w:t>
             </w:r>
           </w:p>
@@ -9086,11 +10093,12 @@
       <w:pPr>
         <w:pStyle w:val="Ttulo2"/>
       </w:pPr>
-      <w:bookmarkStart w:id="26" w:name="_Toc227172400"/>
-      <w:r>
+      <w:bookmarkStart w:id="25" w:name="_Toc227172400"/>
+      <w:r>
+        <w:lastRenderedPageBreak/>
         <w:t>Columna Music</w:t>
       </w:r>
-      <w:bookmarkEnd w:id="26"/>
+      <w:bookmarkEnd w:id="25"/>
     </w:p>
     <w:p>
       <w:pPr>
@@ -9210,7 +10218,6 @@
         <w:ind w:firstLine="708"/>
       </w:pPr>
       <w:r>
-        <w:lastRenderedPageBreak/>
         <w:t>Para quitar la música y crear un silencio, simplemente debemos colocar un *, por supuesto, también podemos acompañarlo del parámetro de fade-in</w:t>
       </w:r>
       <w:r>
@@ -9270,11 +10277,11 @@
       <w:pPr>
         <w:pStyle w:val="Ttulo2"/>
       </w:pPr>
-      <w:bookmarkStart w:id="27" w:name="_Toc227172401"/>
+      <w:bookmarkStart w:id="26" w:name="_Toc227172401"/>
       <w:r>
         <w:t>Columna Sound</w:t>
       </w:r>
-      <w:bookmarkEnd w:id="27"/>
+      <w:bookmarkEnd w:id="26"/>
     </w:p>
     <w:p>
       <w:r>
@@ -9333,6 +10340,7 @@
     </w:p>
     <w:p>
       <w:r>
+        <w:lastRenderedPageBreak/>
         <w:tab/>
         <w:t xml:space="preserve">Si colocamos el nombre del sonido sin más, este se reproducirá una sola vez. Para reproducir varios sonidos simultáneamente, debemos separarlos por comas. Si deseamos que el sonido se reproduzca constantemente debemos añadir :loop, es importante mencionar que hacer eso hará que el sonido se reproduzca indefinidamente hasta que volvamos a escribir la misma instrucción más adelante. </w:t>
       </w:r>
@@ -9438,12 +10446,11 @@
       <w:pPr>
         <w:pStyle w:val="Ttulo2"/>
       </w:pPr>
-      <w:bookmarkStart w:id="28" w:name="_Toc227172402"/>
-      <w:r>
-        <w:lastRenderedPageBreak/>
+      <w:bookmarkStart w:id="27" w:name="_Toc227172402"/>
+      <w:r>
         <w:t>Columna Single effect</w:t>
       </w:r>
-      <w:bookmarkEnd w:id="28"/>
+      <w:bookmarkEnd w:id="27"/>
     </w:p>
     <w:p>
       <w:r>
@@ -9473,11 +10480,11 @@
       <w:pPr>
         <w:pStyle w:val="Ttulo3"/>
       </w:pPr>
-      <w:bookmarkStart w:id="29" w:name="_Toc227172403"/>
+      <w:bookmarkStart w:id="28" w:name="_Toc227172403"/>
       <w:r>
         <w:t>Efectos simples</w:t>
       </w:r>
-      <w:bookmarkEnd w:id="29"/>
+      <w:bookmarkEnd w:id="28"/>
     </w:p>
     <w:tbl>
       <w:tblPr>
@@ -9768,6 +10775,7 @@
         <w:rPr>
           <w:highlight w:val="yellow"/>
         </w:rPr>
+        <w:lastRenderedPageBreak/>
         <w:t>vpunch:50</w:t>
       </w:r>
       <w:r>
@@ -9821,11 +10829,11 @@
       <w:pPr>
         <w:pStyle w:val="Ttulo2"/>
       </w:pPr>
-      <w:bookmarkStart w:id="30" w:name="_Toc227172404"/>
+      <w:bookmarkStart w:id="29" w:name="_Toc227172404"/>
       <w:r>
         <w:t>Columna Continuous effect</w:t>
       </w:r>
-      <w:bookmarkEnd w:id="30"/>
+      <w:bookmarkEnd w:id="29"/>
     </w:p>
     <w:p>
       <w:r>
@@ -9833,11 +10841,7 @@
         <w:t>Es similar a los Single Effects, solo que esta vez es un efecto que sucede constantemente en pantalla y persiste indefinidamente hasta que se vuelva a llamar</w:t>
       </w:r>
       <w:r>
-        <w:t xml:space="preserve">. Se pueden dividir en dos, aquellos efectos continuos que interactúan con el fondo actual, y </w:t>
-      </w:r>
-      <w:r>
-        <w:lastRenderedPageBreak/>
-        <w:t>aquellos que colocan una imagen por encima.</w:t>
+        <w:t>. Se pueden dividir en dos, aquellos efectos continuos que interactúan con el fondo actual, y aquellos que colocan una imagen por encima.</w:t>
       </w:r>
       <w:r>
         <w:t xml:space="preserve"> </w:t>
@@ -9868,11 +10872,11 @@
       <w:pPr>
         <w:pStyle w:val="Ttulo3"/>
       </w:pPr>
-      <w:bookmarkStart w:id="31" w:name="_Toc227172405"/>
+      <w:bookmarkStart w:id="30" w:name="_Toc227172405"/>
       <w:r>
         <w:t>Efectos que interactúan con el fondo</w:t>
       </w:r>
-      <w:bookmarkEnd w:id="31"/>
+      <w:bookmarkEnd w:id="30"/>
     </w:p>
     <w:tbl>
       <w:tblPr>
@@ -10185,11 +11189,12 @@
       <w:pPr>
         <w:pStyle w:val="Ttulo3"/>
       </w:pPr>
-      <w:bookmarkStart w:id="32" w:name="_Toc227172406"/>
-      <w:r>
+      <w:bookmarkStart w:id="31" w:name="_Toc227172406"/>
+      <w:r>
+        <w:lastRenderedPageBreak/>
         <w:t>Efectos que colocan una imagen encima del fondo</w:t>
       </w:r>
-      <w:bookmarkEnd w:id="32"/>
+      <w:bookmarkEnd w:id="31"/>
     </w:p>
     <w:tbl>
       <w:tblPr>
@@ -10357,7 +11362,6 @@
         <w:rPr>
           <w:highlight w:val="yellow"/>
         </w:rPr>
-        <w:lastRenderedPageBreak/>
         <w:t>Suffocation:</w:t>
       </w:r>
       <w:r>
@@ -10419,11 +11423,11 @@
       <w:pPr>
         <w:pStyle w:val="Ttulo2"/>
       </w:pPr>
-      <w:bookmarkStart w:id="33" w:name="_Toc227172407"/>
+      <w:bookmarkStart w:id="32" w:name="_Toc227172407"/>
       <w:r>
         <w:t>Columna Events</w:t>
       </w:r>
-      <w:bookmarkEnd w:id="33"/>
+      <w:bookmarkEnd w:id="32"/>
     </w:p>
     <w:p>
       <w:r>
@@ -10479,7 +11483,7 @@
                     <pic:cNvPicPr/>
                   </pic:nvPicPr>
                   <pic:blipFill>
-                    <a:blip r:embed="rId31"/>
+                    <a:blip r:embed="rId33"/>
                     <a:stretch>
                       <a:fillRect/>
                     </a:stretch>
@@ -10522,7 +11526,7 @@
                     <pic:cNvPicPr/>
                   </pic:nvPicPr>
                   <pic:blipFill>
-                    <a:blip r:embed="rId32"/>
+                    <a:blip r:embed="rId34"/>
                     <a:stretch>
                       <a:fillRect/>
                     </a:stretch>
@@ -10565,7 +11569,7 @@
                     <pic:cNvPicPr/>
                   </pic:nvPicPr>
                   <pic:blipFill>
-                    <a:blip r:embed="rId33"/>
+                    <a:blip r:embed="rId35"/>
                     <a:stretch>
                       <a:fillRect/>
                     </a:stretch>
@@ -10595,7 +11599,6 @@
         <w:rPr>
           <w:noProof/>
         </w:rPr>
-        <w:lastRenderedPageBreak/>
         <w:drawing>
           <wp:anchor distT="0" distB="0" distL="114300" distR="114300" simplePos="0" relativeHeight="251665408" behindDoc="0" locked="0" layoutInCell="1" allowOverlap="1" wp14:anchorId="51A0E446" wp14:editId="3E15DE6D">
             <wp:simplePos x="0" y="0"/>
@@ -10620,7 +11623,7 @@
                     <pic:cNvPicPr/>
                   </pic:nvPicPr>
                   <pic:blipFill>
-                    <a:blip r:embed="rId34">
+                    <a:blip r:embed="rId36">
                       <a:extLst>
                         <a:ext uri="{28A0092B-C50C-407E-A947-70E740481C1C}">
                           <a14:useLocalDpi xmlns:a14="http://schemas.microsoft.com/office/drawing/2010/main" val="0"/>
@@ -10708,7 +11711,7 @@
                     <pic:cNvPicPr/>
                   </pic:nvPicPr>
                   <pic:blipFill>
-                    <a:blip r:embed="rId35" cstate="print">
+                    <a:blip r:embed="rId37" cstate="print">
                       <a:extLst>
                         <a:ext uri="{28A0092B-C50C-407E-A947-70E740481C1C}">
                           <a14:useLocalDpi xmlns:a14="http://schemas.microsoft.com/office/drawing/2010/main" val="0"/>
@@ -10769,7 +11772,7 @@
                     <pic:cNvPicPr/>
                   </pic:nvPicPr>
                   <pic:blipFill>
-                    <a:blip r:embed="rId36" cstate="print">
+                    <a:blip r:embed="rId38" cstate="print">
                       <a:extLst>
                         <a:ext uri="{28A0092B-C50C-407E-A947-70E740481C1C}">
                           <a14:useLocalDpi xmlns:a14="http://schemas.microsoft.com/office/drawing/2010/main" val="0"/>
@@ -10816,6 +11819,7 @@
         <w:ind w:firstLine="708"/>
       </w:pPr>
       <w:r>
+        <w:lastRenderedPageBreak/>
         <w:t>Si recortásemos ese espacio en blanco su Sprite quedaría descentrado de la siguiente manera.</w:t>
       </w:r>
     </w:p>
@@ -10827,7 +11831,6 @@
         <w:rPr>
           <w:noProof/>
         </w:rPr>
-        <w:lastRenderedPageBreak/>
         <w:drawing>
           <wp:anchor distT="0" distB="0" distL="114300" distR="114300" simplePos="0" relativeHeight="251669504" behindDoc="0" locked="0" layoutInCell="1" allowOverlap="1" wp14:anchorId="20D80200" wp14:editId="1C1BCD76">
             <wp:simplePos x="0" y="0"/>
@@ -10852,7 +11855,7 @@
                     <pic:cNvPicPr/>
                   </pic:nvPicPr>
                   <pic:blipFill>
-                    <a:blip r:embed="rId37" cstate="print">
+                    <a:blip r:embed="rId39" cstate="print">
                       <a:extLst>
                         <a:ext uri="{28A0092B-C50C-407E-A947-70E740481C1C}">
                           <a14:useLocalDpi xmlns:a14="http://schemas.microsoft.com/office/drawing/2010/main" val="0"/>
@@ -10945,7 +11948,7 @@
                     <pic:cNvPicPr/>
                   </pic:nvPicPr>
                   <pic:blipFill>
-                    <a:blip r:embed="rId38" cstate="print">
+                    <a:blip r:embed="rId40" cstate="print">
                       <a:extLst>
                         <a:ext uri="{28A0092B-C50C-407E-A947-70E740481C1C}">
                           <a14:useLocalDpi xmlns:a14="http://schemas.microsoft.com/office/drawing/2010/main" val="0"/>
@@ -11064,7 +12067,7 @@
                     <pic:cNvPicPr/>
                   </pic:nvPicPr>
                   <pic:blipFill>
-                    <a:blip r:embed="rId39" cstate="print">
+                    <a:blip r:embed="rId41" cstate="print">
                       <a:extLst>
                         <a:ext uri="{28A0092B-C50C-407E-A947-70E740481C1C}">
                           <a14:useLocalDpi xmlns:a14="http://schemas.microsoft.com/office/drawing/2010/main" val="0"/>
@@ -11265,11 +12268,11 @@
         <w:pStyle w:val="Ttulo3"/>
         <w:ind w:firstLine="708"/>
       </w:pPr>
-      <w:bookmarkStart w:id="34" w:name="_Toc227172408"/>
+      <w:bookmarkStart w:id="33" w:name="_Toc227172408"/>
       <w:r>
         <w:t>Posiciones y valores</w:t>
       </w:r>
-      <w:bookmarkEnd w:id="34"/>
+      <w:bookmarkEnd w:id="33"/>
     </w:p>
     <w:tbl>
       <w:tblPr>
@@ -11743,11 +12746,11 @@
       <w:pPr>
         <w:pStyle w:val="Ttulo3"/>
       </w:pPr>
-      <w:bookmarkStart w:id="35" w:name="_Toc227172409"/>
+      <w:bookmarkStart w:id="34" w:name="_Toc227172409"/>
       <w:r>
         <w:t>Eventos de aparición de personajes</w:t>
       </w:r>
-      <w:bookmarkEnd w:id="35"/>
+      <w:bookmarkEnd w:id="34"/>
     </w:p>
     <w:tbl>
       <w:tblPr>
@@ -12000,12 +13003,12 @@
       <w:pPr>
         <w:pStyle w:val="Ttulo3"/>
       </w:pPr>
-      <w:bookmarkStart w:id="36" w:name="_Toc227172410"/>
+      <w:bookmarkStart w:id="35" w:name="_Toc227172410"/>
       <w:r>
         <w:lastRenderedPageBreak/>
         <w:t>Eventos de personajes en pantalla</w:t>
       </w:r>
-      <w:bookmarkEnd w:id="36"/>
+      <w:bookmarkEnd w:id="35"/>
     </w:p>
     <w:tbl>
       <w:tblPr>
@@ -12825,11 +13828,11 @@
       <w:pPr>
         <w:pStyle w:val="Ttulo3"/>
       </w:pPr>
-      <w:bookmarkStart w:id="37" w:name="_Toc227172411"/>
+      <w:bookmarkStart w:id="36" w:name="_Toc227172411"/>
       <w:r>
         <w:t>Animaciones constantes</w:t>
       </w:r>
-      <w:bookmarkEnd w:id="37"/>
+      <w:bookmarkEnd w:id="36"/>
     </w:p>
     <w:tbl>
       <w:tblPr>
@@ -13499,11 +14502,11 @@
       <w:pPr>
         <w:pStyle w:val="Ttulo2"/>
       </w:pPr>
-      <w:bookmarkStart w:id="38" w:name="_Toc227172412"/>
+      <w:bookmarkStart w:id="37" w:name="_Toc227172412"/>
       <w:r>
         <w:t>Columna Delay</w:t>
       </w:r>
-      <w:bookmarkEnd w:id="38"/>
+      <w:bookmarkEnd w:id="37"/>
     </w:p>
     <w:p>
       <w:r>
@@ -13589,11 +14592,11 @@
       <w:pPr>
         <w:pStyle w:val="Ttulo2"/>
       </w:pPr>
-      <w:bookmarkStart w:id="39" w:name="_Toc227172413"/>
+      <w:bookmarkStart w:id="38" w:name="_Toc227172413"/>
       <w:r>
         <w:t>Columna Emisor</w:t>
       </w:r>
-      <w:bookmarkEnd w:id="39"/>
+      <w:bookmarkEnd w:id="38"/>
     </w:p>
     <w:p>
       <w:r>
@@ -13638,11 +14641,11 @@
       <w:pPr>
         <w:pStyle w:val="Ttulo2"/>
       </w:pPr>
-      <w:bookmarkStart w:id="40" w:name="_Toc227172414"/>
+      <w:bookmarkStart w:id="39" w:name="_Toc227172414"/>
       <w:r>
         <w:t>Columnas de Idioma</w:t>
       </w:r>
-      <w:bookmarkEnd w:id="40"/>
+      <w:bookmarkEnd w:id="39"/>
     </w:p>
     <w:p>
       <w:r>
@@ -13710,7 +14713,7 @@
       <w:r>
         <w:t xml:space="preserve">ntos pixeles tiene tu diálogo puedes utilizar el siguiente sitio web: </w:t>
       </w:r>
-      <w:hyperlink r:id="rId40" w:history="1">
+      <w:hyperlink r:id="rId42" w:history="1">
         <w:r>
           <w:rPr>
             <w:rStyle w:val="Hipervnculo"/>
@@ -13732,7 +14735,7 @@
       <w:r>
         <w:t xml:space="preserve"> columnas de idioma. Existen muchos modificadores de texto así que te recomiendo leer la documentación de Renpy para intentar implementarlos. </w:t>
       </w:r>
-      <w:hyperlink r:id="rId41" w:anchor="text-tag-alpha" w:history="1">
+      <w:hyperlink r:id="rId43" w:anchor="text-tag-alpha" w:history="1">
         <w:r>
           <w:rPr>
             <w:rStyle w:val="Hipervnculo"/>
@@ -13817,7 +14820,7 @@
                     <pic:cNvPicPr/>
                   </pic:nvPicPr>
                   <pic:blipFill>
-                    <a:blip r:embed="rId42"/>
+                    <a:blip r:embed="rId44"/>
                     <a:stretch>
                       <a:fillRect/>
                     </a:stretch>
@@ -13943,7 +14946,7 @@
                     <pic:cNvPicPr/>
                   </pic:nvPicPr>
                   <pic:blipFill>
-                    <a:blip r:embed="rId43"/>
+                    <a:blip r:embed="rId45"/>
                     <a:stretch>
                       <a:fillRect/>
                     </a:stretch>
@@ -13983,11 +14986,11 @@
       <w:pPr>
         <w:pStyle w:val="Ttulo2"/>
       </w:pPr>
-      <w:bookmarkStart w:id="41" w:name="_Toc227172415"/>
+      <w:bookmarkStart w:id="40" w:name="_Toc227172415"/>
       <w:r>
         <w:t>Orden de ejecución</w:t>
       </w:r>
-      <w:bookmarkEnd w:id="41"/>
+      <w:bookmarkEnd w:id="40"/>
     </w:p>
     <w:p>
       <w:r>
@@ -14095,7 +15098,7 @@
       <w:pPr>
         <w:pStyle w:val="Ttulo2"/>
       </w:pPr>
-      <w:bookmarkStart w:id="42" w:name="_Toc227172416"/>
+      <w:bookmarkStart w:id="41" w:name="_Toc227172416"/>
       <w:r>
         <w:lastRenderedPageBreak/>
         <w:t>Finalización</w:t>
@@ -14106,7 +15109,7 @@
       <w:r>
         <w:t>escena</w:t>
       </w:r>
-      <w:bookmarkEnd w:id="42"/>
+      <w:bookmarkEnd w:id="41"/>
     </w:p>
     <w:p>
       <w:r>
@@ -14300,11 +15303,11 @@
       <w:pPr>
         <w:pStyle w:val="Ttulo3"/>
       </w:pPr>
-      <w:bookmarkStart w:id="43" w:name="_Toc227172417"/>
+      <w:bookmarkStart w:id="42" w:name="_Toc227172417"/>
       <w:r>
         <w:t>Lineal</w:t>
       </w:r>
-      <w:bookmarkEnd w:id="43"/>
+      <w:bookmarkEnd w:id="42"/>
     </w:p>
     <w:p>
       <w:r>
@@ -14339,7 +15342,7 @@
                     <pic:cNvPicPr/>
                   </pic:nvPicPr>
                   <pic:blipFill>
-                    <a:blip r:embed="rId44"/>
+                    <a:blip r:embed="rId46"/>
                     <a:stretch>
                       <a:fillRect/>
                     </a:stretch>
@@ -14397,7 +15400,7 @@
                     <pic:cNvPicPr/>
                   </pic:nvPicPr>
                   <pic:blipFill>
-                    <a:blip r:embed="rId45"/>
+                    <a:blip r:embed="rId47"/>
                     <a:stretch>
                       <a:fillRect/>
                     </a:stretch>
@@ -14759,12 +15762,12 @@
       <w:pPr>
         <w:pStyle w:val="Ttulo3"/>
       </w:pPr>
-      <w:bookmarkStart w:id="44" w:name="_Toc227172418"/>
+      <w:bookmarkStart w:id="43" w:name="_Toc227172418"/>
       <w:r>
         <w:lastRenderedPageBreak/>
         <w:t>Decisión</w:t>
       </w:r>
-      <w:bookmarkEnd w:id="44"/>
+      <w:bookmarkEnd w:id="43"/>
     </w:p>
     <w:p>
       <w:r>
@@ -14921,7 +15924,7 @@
                     <pic:cNvPicPr/>
                   </pic:nvPicPr>
                   <pic:blipFill>
-                    <a:blip r:embed="rId46"/>
+                    <a:blip r:embed="rId48"/>
                     <a:stretch>
                       <a:fillRect/>
                     </a:stretch>
@@ -14966,7 +15969,7 @@
                     <pic:cNvPicPr/>
                   </pic:nvPicPr>
                   <pic:blipFill>
-                    <a:blip r:embed="rId47"/>
+                    <a:blip r:embed="rId49"/>
                     <a:stretch>
                       <a:fillRect/>
                     </a:stretch>
@@ -15036,7 +16039,7 @@
                     <pic:cNvPicPr/>
                   </pic:nvPicPr>
                   <pic:blipFill>
-                    <a:blip r:embed="rId48"/>
+                    <a:blip r:embed="rId50"/>
                     <a:stretch>
                       <a:fillRect/>
                     </a:stretch>
@@ -15352,11 +16355,11 @@
       <w:pPr>
         <w:pStyle w:val="Ttulo3"/>
       </w:pPr>
-      <w:bookmarkStart w:id="45" w:name="_Toc227172419"/>
+      <w:bookmarkStart w:id="44" w:name="_Toc227172419"/>
       <w:r>
         <w:t>Condición</w:t>
       </w:r>
-      <w:bookmarkEnd w:id="45"/>
+      <w:bookmarkEnd w:id="44"/>
     </w:p>
     <w:p>
       <w:r>
@@ -15420,7 +16423,7 @@
                     <pic:cNvPicPr/>
                   </pic:nvPicPr>
                   <pic:blipFill>
-                    <a:blip r:embed="rId49"/>
+                    <a:blip r:embed="rId51"/>
                     <a:stretch>
                       <a:fillRect/>
                     </a:stretch>
@@ -15725,7 +16728,7 @@
                     <pic:cNvPicPr/>
                   </pic:nvPicPr>
                   <pic:blipFill>
-                    <a:blip r:embed="rId50"/>
+                    <a:blip r:embed="rId52"/>
                     <a:stretch>
                       <a:fillRect/>
                     </a:stretch>
@@ -15866,7 +16869,7 @@
                     <pic:cNvPicPr/>
                   </pic:nvPicPr>
                   <pic:blipFill>
-                    <a:blip r:embed="rId51"/>
+                    <a:blip r:embed="rId53"/>
                     <a:stretch>
                       <a:fillRect/>
                     </a:stretch>
@@ -16028,11 +17031,11 @@
       <w:pPr>
         <w:pStyle w:val="Ttulo3"/>
       </w:pPr>
-      <w:bookmarkStart w:id="46" w:name="_Toc227172420"/>
+      <w:bookmarkStart w:id="45" w:name="_Toc227172420"/>
       <w:r>
         <w:t>Scripts personalizados</w:t>
       </w:r>
-      <w:bookmarkEnd w:id="46"/>
+      <w:bookmarkEnd w:id="45"/>
     </w:p>
     <w:p>
       <w:r>
@@ -16725,11 +17728,11 @@
       <w:pPr>
         <w:pStyle w:val="Ttulo3"/>
       </w:pPr>
-      <w:bookmarkStart w:id="47" w:name="_Toc227172421"/>
+      <w:bookmarkStart w:id="46" w:name="_Toc227172421"/>
       <w:r>
         <w:t>Créditos</w:t>
       </w:r>
-      <w:bookmarkEnd w:id="47"/>
+      <w:bookmarkEnd w:id="46"/>
     </w:p>
     <w:p>
       <w:r>
@@ -16783,11 +17786,11 @@
       <w:pPr>
         <w:pStyle w:val="Ttulo3"/>
       </w:pPr>
-      <w:bookmarkStart w:id="48" w:name="_Toc227172422"/>
+      <w:bookmarkStart w:id="47" w:name="_Toc227172422"/>
       <w:r>
         <w:t>Transiciones tras terminar una escena</w:t>
       </w:r>
-      <w:bookmarkEnd w:id="48"/>
+      <w:bookmarkEnd w:id="47"/>
     </w:p>
     <w:p>
       <w:r>
@@ -16855,11 +17858,11 @@
       <w:pPr>
         <w:pStyle w:val="Ttulo3"/>
       </w:pPr>
-      <w:bookmarkStart w:id="49" w:name="_Toc227172423"/>
+      <w:bookmarkStart w:id="48" w:name="_Toc227172423"/>
       <w:r>
         <w:t>Limpieza del juego</w:t>
       </w:r>
-      <w:bookmarkEnd w:id="49"/>
+      <w:bookmarkEnd w:id="48"/>
     </w:p>
     <w:p>
       <w:r>
@@ -16944,11 +17947,11 @@
       <w:pPr>
         <w:pStyle w:val="Ttulo2"/>
       </w:pPr>
-      <w:bookmarkStart w:id="50" w:name="_Toc227172424"/>
+      <w:bookmarkStart w:id="49" w:name="_Toc227172424"/>
       <w:r>
         <w:t>Ejemplos</w:t>
       </w:r>
-      <w:bookmarkEnd w:id="50"/>
+      <w:bookmarkEnd w:id="49"/>
     </w:p>
     <w:p>
       <w:r>
@@ -16979,11 +17982,11 @@
       <w:pPr>
         <w:pStyle w:val="Ttulo2"/>
       </w:pPr>
-      <w:bookmarkStart w:id="51" w:name="_Toc227172425"/>
+      <w:bookmarkStart w:id="50" w:name="_Toc227172425"/>
       <w:r>
         <w:t>Encriptar archivos de control</w:t>
       </w:r>
-      <w:bookmarkEnd w:id="51"/>
+      <w:bookmarkEnd w:id="50"/>
     </w:p>
     <w:p>
       <w:r>
@@ -17066,7 +18069,7 @@
                     <pic:cNvPicPr/>
                   </pic:nvPicPr>
                   <pic:blipFill>
-                    <a:blip r:embed="rId52"/>
+                    <a:blip r:embed="rId54"/>
                     <a:stretch>
                       <a:fillRect/>
                     </a:stretch>
@@ -17157,7 +18160,7 @@
                     <pic:cNvPicPr/>
                   </pic:nvPicPr>
                   <pic:blipFill>
-                    <a:blip r:embed="rId53"/>
+                    <a:blip r:embed="rId55"/>
                     <a:stretch>
                       <a:fillRect/>
                     </a:stretch>
@@ -17329,12 +18332,12 @@
       <w:pPr>
         <w:pStyle w:val="Ttulo1"/>
       </w:pPr>
-      <w:bookmarkStart w:id="52" w:name="_Toc227172426"/>
+      <w:bookmarkStart w:id="51" w:name="_Toc227172426"/>
       <w:r>
         <w:lastRenderedPageBreak/>
         <w:t>Testing</w:t>
       </w:r>
-      <w:bookmarkEnd w:id="52"/>
+      <w:bookmarkEnd w:id="51"/>
     </w:p>
     <w:p>
       <w:r>
@@ -17407,7 +18410,7 @@
                     <pic:cNvPicPr/>
                   </pic:nvPicPr>
                   <pic:blipFill>
-                    <a:blip r:embed="rId54"/>
+                    <a:blip r:embed="rId56"/>
                     <a:stretch>
                       <a:fillRect/>
                     </a:stretch>
@@ -17506,7 +18509,7 @@
                     <pic:cNvPicPr/>
                   </pic:nvPicPr>
                   <pic:blipFill>
-                    <a:blip r:embed="rId55">
+                    <a:blip r:embed="rId57">
                       <a:extLst>
                         <a:ext uri="{28A0092B-C50C-407E-A947-70E740481C1C}">
                           <a14:useLocalDpi xmlns:a14="http://schemas.microsoft.com/office/drawing/2010/main" val="0"/>
@@ -17612,11 +18615,11 @@
       <w:pPr>
         <w:pStyle w:val="Ttulo1"/>
       </w:pPr>
-      <w:bookmarkStart w:id="53" w:name="_Toc227172427"/>
+      <w:bookmarkStart w:id="52" w:name="_Toc227172427"/>
       <w:r>
         <w:t>Personalización</w:t>
       </w:r>
-      <w:bookmarkEnd w:id="53"/>
+      <w:bookmarkEnd w:id="52"/>
     </w:p>
     <w:p>
       <w:r>
@@ -17802,11 +18805,11 @@
       <w:pPr>
         <w:pStyle w:val="Ttulo1"/>
       </w:pPr>
-      <w:bookmarkStart w:id="54" w:name="_Toc227172428"/>
+      <w:bookmarkStart w:id="53" w:name="_Toc227172428"/>
       <w:r>
         <w:t>Instalación</w:t>
       </w:r>
-      <w:bookmarkEnd w:id="54"/>
+      <w:bookmarkEnd w:id="53"/>
     </w:p>
     <w:p>
       <w:r>
@@ -17841,11 +18844,11 @@
       <w:pPr>
         <w:pStyle w:val="Ttulo1"/>
       </w:pPr>
-      <w:bookmarkStart w:id="55" w:name="_Toc227172429"/>
+      <w:bookmarkStart w:id="54" w:name="_Toc227172429"/>
       <w:r>
         <w:t>Balanceo de novela visual</w:t>
       </w:r>
-      <w:bookmarkEnd w:id="55"/>
+      <w:bookmarkEnd w:id="54"/>
     </w:p>
     <w:p>
       <w:r>
@@ -17928,7 +18931,7 @@
                     <pic:cNvPicPr/>
                   </pic:nvPicPr>
                   <pic:blipFill>
-                    <a:blip r:embed="rId56">
+                    <a:blip r:embed="rId58">
                       <a:extLst>
                         <a:ext uri="{28A0092B-C50C-407E-A947-70E740481C1C}">
                           <a14:useLocalDpi xmlns:a14="http://schemas.microsoft.com/office/drawing/2010/main" val="0"/>
@@ -18050,7 +19053,7 @@
       <w:r>
         <w:t xml:space="preserve">mo usarla. </w:t>
       </w:r>
-      <w:hyperlink r:id="rId57" w:history="1">
+      <w:hyperlink r:id="rId59" w:history="1">
         <w:r>
           <w:rPr>
             <w:rStyle w:val="Hipervnculo"/>
@@ -18079,11 +19082,11 @@
       <w:pPr>
         <w:pStyle w:val="Ttulo1"/>
       </w:pPr>
-      <w:bookmarkStart w:id="56" w:name="_Toc227172430"/>
+      <w:bookmarkStart w:id="55" w:name="_Toc227172430"/>
       <w:r>
         <w:t>Derechos</w:t>
       </w:r>
-      <w:bookmarkEnd w:id="56"/>
+      <w:bookmarkEnd w:id="55"/>
     </w:p>
     <w:p>
       <w:r>
@@ -18120,18 +19123,18 @@
       <w:pPr>
         <w:pStyle w:val="Ttulo1"/>
       </w:pPr>
-      <w:bookmarkStart w:id="57" w:name="_Toc227172431"/>
+      <w:bookmarkStart w:id="56" w:name="_Toc227172431"/>
       <w:r>
         <w:t>Referencias</w:t>
       </w:r>
-      <w:bookmarkEnd w:id="57"/>
+      <w:bookmarkEnd w:id="56"/>
     </w:p>
     <w:p/>
     <w:p>
       <w:r>
         <w:t xml:space="preserve">Visual Novel Technical Assistant: </w:t>
       </w:r>
-      <w:hyperlink r:id="rId58" w:history="1">
+      <w:hyperlink r:id="rId60" w:history="1">
         <w:r>
           <w:rPr>
             <w:rStyle w:val="Hipervnculo"/>
@@ -18152,7 +19155,7 @@
       <w:r>
         <w:t xml:space="preserve">Github: </w:t>
       </w:r>
-      <w:hyperlink r:id="rId59" w:history="1">
+      <w:hyperlink r:id="rId61" w:history="1">
         <w:r>
           <w:rPr>
             <w:rStyle w:val="Hipervnculo"/>
@@ -18165,7 +19168,7 @@
       <w:r>
         <w:t xml:space="preserve">Códigos de colores hexadecimales: </w:t>
       </w:r>
-      <w:hyperlink r:id="rId60" w:history="1">
+      <w:hyperlink r:id="rId62" w:history="1">
         <w:r>
           <w:rPr>
             <w:rStyle w:val="Hipervnculo"/>
@@ -18181,7 +19184,7 @@
       <w:r>
         <w:t xml:space="preserve">Calculadora de ancho de pixeles de un texto: </w:t>
       </w:r>
-      <w:hyperlink r:id="rId61" w:history="1">
+      <w:hyperlink r:id="rId63" w:history="1">
         <w:r>
           <w:rPr>
             <w:rStyle w:val="Hipervnculo"/>
@@ -18194,7 +19197,7 @@
       <w:r>
         <w:t xml:space="preserve">Modificadores de texto en Renpy: </w:t>
       </w:r>
-      <w:hyperlink r:id="rId62" w:anchor="text-tag-alpha" w:history="1">
+      <w:hyperlink r:id="rId64" w:anchor="text-tag-alpha" w:history="1">
         <w:r>
           <w:rPr>
             <w:rStyle w:val="Hipervnculo"/>
@@ -18208,7 +19211,7 @@
         <w:lastRenderedPageBreak/>
         <w:t xml:space="preserve">Sitio web de Atlantox: </w:t>
       </w:r>
-      <w:hyperlink r:id="rId63" w:history="1">
+      <w:hyperlink r:id="rId65" w:history="1">
         <w:r>
           <w:rPr>
             <w:rStyle w:val="Hipervnculo"/>

</xml_diff>

<commit_message>
<fix> autopass ready, docs in progress
</commit_message>
<xml_diff>
--- a/Manual de desarrollo en Atlax Renpy.docx
+++ b/Manual de desarrollo en Atlax Renpy.docx
@@ -6484,7 +6484,7 @@
         </w:rPr>
         <w:lastRenderedPageBreak/>
         <w:drawing>
-          <wp:anchor distT="0" distB="0" distL="114300" distR="114300" simplePos="0" relativeHeight="251676672" behindDoc="0" locked="0" layoutInCell="1" allowOverlap="1" wp14:anchorId="338485B2" wp14:editId="56ED83CC">
+          <wp:anchor distT="0" distB="0" distL="114300" distR="114300" simplePos="0" relativeHeight="251676672" behindDoc="0" locked="0" layoutInCell="1" allowOverlap="1" wp14:anchorId="338485B2" wp14:editId="201B9E62">
             <wp:simplePos x="0" y="0"/>
             <wp:positionH relativeFrom="margin">
               <wp:align>center</wp:align>
@@ -10400,7 +10400,7 @@
           <w:noProof/>
         </w:rPr>
         <w:drawing>
-          <wp:anchor distT="0" distB="0" distL="114300" distR="114300" simplePos="0" relativeHeight="251693056" behindDoc="0" locked="0" layoutInCell="1" allowOverlap="1" wp14:anchorId="46113A86" wp14:editId="0D378C45">
+          <wp:anchor distT="0" distB="0" distL="114300" distR="114300" simplePos="0" relativeHeight="251693056" behindDoc="0" locked="0" layoutInCell="1" allowOverlap="1" wp14:anchorId="46113A86" wp14:editId="75859114">
             <wp:simplePos x="0" y="0"/>
             <wp:positionH relativeFrom="margin">
               <wp:posOffset>-260930</wp:posOffset>
@@ -14870,7 +14870,7 @@
           <w:noProof/>
         </w:rPr>
         <w:drawing>
-          <wp:anchor distT="0" distB="0" distL="114300" distR="114300" simplePos="0" relativeHeight="251668480" behindDoc="0" locked="0" layoutInCell="1" allowOverlap="1" wp14:anchorId="68EEACF9" wp14:editId="2D1491FA">
+          <wp:anchor distT="0" distB="0" distL="114300" distR="114300" simplePos="0" relativeHeight="251668480" behindDoc="0" locked="0" layoutInCell="1" allowOverlap="1" wp14:anchorId="68EEACF9" wp14:editId="19448A97">
             <wp:simplePos x="0" y="0"/>
             <wp:positionH relativeFrom="margin">
               <wp:align>center</wp:align>
@@ -19702,7 +19702,13 @@
         </w:numPr>
       </w:pPr>
       <w:r>
-        <w:t>Establecer la velocidad del texto.</w:t>
+        <w:t xml:space="preserve">Establecer la velocidad </w:t>
+      </w:r>
+      <w:r>
+        <w:t>en la que se muestra el texto</w:t>
+      </w:r>
+      <w:r>
+        <w:t>.</w:t>
       </w:r>
     </w:p>
     <w:p>
@@ -19714,7 +19720,13 @@
         </w:numPr>
       </w:pPr>
       <w:r>
-        <w:t>Que el texto se pase automáticamente al terminar de mostrar el diálogo.</w:t>
+        <w:t xml:space="preserve">Que el texto se pase automáticamente al terminar de mostrar el </w:t>
+      </w:r>
+      <w:r>
+        <w:t>texto</w:t>
+      </w:r>
+      <w:r>
+        <w:t>.</w:t>
       </w:r>
     </w:p>
     <w:p>
@@ -19723,6 +19735,14 @@
       </w:pPr>
       <w:r>
         <w:lastRenderedPageBreak/>
+        <w:t>Cabe aclarar que el tiempo de espera para mostrar el diálogo irá después de los movimientos y animaciones de los personajes.</w:t>
+      </w:r>
+    </w:p>
+    <w:p>
+      <w:pPr>
+        <w:ind w:firstLine="708"/>
+      </w:pPr>
+      <w:r>
         <w:t>Para tener una idea general de la velocidad del texto se presentará la siguiente lista.</w:t>
       </w:r>
     </w:p>
@@ -19735,7 +19755,22 @@
         </w:numPr>
       </w:pPr>
       <w:r>
-        <w:t>7 caracteres por segundo: velocidad de texto lenta.</w:t>
+        <w:t>20</w:t>
+      </w:r>
+      <w:r>
+        <w:t xml:space="preserve"> caracteres por segundo: </w:t>
+      </w:r>
+      <w:r>
+        <w:t>Texto</w:t>
+      </w:r>
+      <w:r>
+        <w:t xml:space="preserve"> lent</w:t>
+      </w:r>
+      <w:r>
+        <w:t>o</w:t>
+      </w:r>
+      <w:r>
+        <w:t>.</w:t>
       </w:r>
     </w:p>
     <w:p>
@@ -19747,7 +19782,10 @@
         </w:numPr>
       </w:pPr>
       <w:r>
-        <w:t>20 caracteres por segundo: velocidad de texto media</w:t>
+        <w:t>5</w:t>
+      </w:r>
+      <w:r>
+        <w:t>0 caracteres por segundo: velocidad de texto media</w:t>
       </w:r>
     </w:p>
     <w:p>
@@ -19759,7 +19797,30 @@
         </w:numPr>
       </w:pPr>
       <w:r>
-        <w:t>40 caracteres por segundo: velocidad de texto alta</w:t>
+        <w:t>10</w:t>
+      </w:r>
+      <w:r>
+        <w:t>0 caracteres por segundo: velocidad de texto alta</w:t>
+      </w:r>
+    </w:p>
+    <w:p>
+      <w:pPr>
+        <w:pStyle w:val="Prrafodelista"/>
+        <w:numPr>
+          <w:ilvl w:val="0"/>
+          <w:numId w:val="12"/>
+        </w:numPr>
+      </w:pPr>
+      <w:r>
+        <w:t>200 caracteres por segundo: Extremadamente rápido.</w:t>
+      </w:r>
+    </w:p>
+    <w:p>
+      <w:pPr>
+        <w:ind w:firstLine="708"/>
+      </w:pPr>
+      <w:r>
+        <w:t>Por defecto la velocidad de texto será la que el usuario defina en el menú de preferencias del juego.</w:t>
       </w:r>
     </w:p>
     <w:p>
@@ -19776,7 +19837,7 @@
         <w:t xml:space="preserve"> (Se esperan 5 segundos antes de mostrar el texto del diálogo y la velocidad del texto tendrá una velocidad de</w:t>
       </w:r>
       <w:r>
-        <w:t xml:space="preserve"> lenta-normal</w:t>
+        <w:t xml:space="preserve"> lenta</w:t>
       </w:r>
       <w:r>
         <w:t>)</w:t>
@@ -19790,10 +19851,54 @@
         <w:rPr>
           <w:highlight w:val="yellow"/>
         </w:rPr>
-        <w:t>0:60</w:t>
-      </w:r>
-      <w:r>
-        <w:t xml:space="preserve"> (No se espera ninguna cantidad de tiempo y el personaje habla a una velocidad sobrehumana)</w:t>
+        <w:t>0</w:t>
+      </w:r>
+      <w:r>
+        <w:rPr>
+          <w:highlight w:val="yellow"/>
+        </w:rPr>
+        <w:t>:</w:t>
+      </w:r>
+      <w:r>
+        <w:rPr>
+          <w:highlight w:val="yellow"/>
+        </w:rPr>
+        <w:t>75</w:t>
+      </w:r>
+      <w:r>
+        <w:t xml:space="preserve"> (No se espera ninguna cantidad de tiempo y el personaje habla a una velocidad </w:t>
+      </w:r>
+      <w:r>
+        <w:t>normal-rápida</w:t>
+      </w:r>
+      <w:r>
+        <w:t>)</w:t>
+      </w:r>
+    </w:p>
+    <w:p>
+      <w:pPr>
+        <w:ind w:firstLine="708"/>
+      </w:pPr>
+      <w:r>
+        <w:rPr>
+          <w:highlight w:val="yellow"/>
+        </w:rPr>
+        <w:t>0:</w:t>
+      </w:r>
+      <w:r>
+        <w:rPr>
+          <w:highlight w:val="yellow"/>
+        </w:rPr>
+        <w:t>200</w:t>
+      </w:r>
+      <w:r>
+        <w:t xml:space="preserve"> (</w:t>
+      </w:r>
+      <w:r>
+        <w:t>Sin tiempo de espera, el texto es mostrado a una velocidad increíble</w:t>
+      </w:r>
+      <w:r>
+        <w:t>)</w:t>
       </w:r>
     </w:p>
     <w:p>
@@ -19813,7 +19918,10 @@
     <w:p>
       <w:r>
         <w:tab/>
-        <w:t>Para hacer que el texto se pase automáticamente, al final debemos escribir “</w:t>
+        <w:t xml:space="preserve">Para hacer que el texto se pase automáticamente, </w:t>
+      </w:r>
+      <w:r>
+        <w:t>debemos escribir “</w:t>
       </w:r>
       <w:proofErr w:type="spellStart"/>
       <w:r>
@@ -19821,15 +19929,52 @@
       </w:r>
       <w:proofErr w:type="spellEnd"/>
       <w:r>
-        <w:t>” en cualquier lado de la columna como parámetro.</w:t>
+        <w:t>” como parámetro en cualquier columna, puedes colocar solo “</w:t>
+      </w:r>
+      <w:proofErr w:type="spellStart"/>
+      <w:r>
+        <w:t>pass</w:t>
+      </w:r>
+      <w:proofErr w:type="spellEnd"/>
+      <w:r>
+        <w:t>” o combinarlo con los parámetros previamente vistos.</w:t>
       </w:r>
     </w:p>
     <w:p>
       <w:r>
         <w:tab/>
       </w:r>
+      <w:proofErr w:type="spellStart"/>
+      <w:r>
+        <w:rPr>
+          <w:highlight w:val="yellow"/>
+        </w:rPr>
+        <w:t>pass</w:t>
+      </w:r>
+      <w:proofErr w:type="spellEnd"/>
+      <w:r>
+        <w:t xml:space="preserve"> (Al terminar de mostrar el diálogo, sea en </w:t>
+      </w:r>
+      <w:proofErr w:type="spellStart"/>
       <w:proofErr w:type="gramStart"/>
       <w:r>
+        <w:t>al</w:t>
+      </w:r>
+      <w:proofErr w:type="spellEnd"/>
+      <w:r>
+        <w:t xml:space="preserve"> velocidad</w:t>
+      </w:r>
+      <w:proofErr w:type="gramEnd"/>
+      <w:r>
+        <w:t xml:space="preserve"> que sea, este pasará automáticamente al siguiente)</w:t>
+      </w:r>
+    </w:p>
+    <w:p>
+      <w:r>
+        <w:tab/>
+      </w:r>
+      <w:proofErr w:type="gramStart"/>
+      <w:r>
         <w:rPr>
           <w:highlight w:val="yellow"/>
         </w:rPr>
@@ -19849,7 +19994,37 @@
         <w:rPr>
           <w:highlight w:val="yellow"/>
         </w:rPr>
-        <w:t>0:100:pass</w:t>
+        <w:t>P</w:t>
+      </w:r>
+      <w:r>
+        <w:rPr>
+          <w:highlight w:val="yellow"/>
+        </w:rPr>
+        <w:t>as</w:t>
+      </w:r>
+      <w:r>
+        <w:rPr>
+          <w:highlight w:val="yellow"/>
+        </w:rPr>
+        <w:t>s</w:t>
+      </w:r>
+      <w:r>
+        <w:rPr>
+          <w:highlight w:val="yellow"/>
+        </w:rPr>
+        <w:t>:</w:t>
+      </w:r>
+      <w:r>
+        <w:rPr>
+          <w:highlight w:val="yellow"/>
+        </w:rPr>
+        <w:t>0:</w:t>
+      </w:r>
+      <w:r>
+        <w:rPr>
+          <w:highlight w:val="yellow"/>
+        </w:rPr>
+        <w:t>180</w:t>
       </w:r>
       <w:proofErr w:type="gramEnd"/>
       <w:r>
@@ -19906,6 +20081,7 @@
     </w:p>
     <w:p>
       <w:r>
+        <w:lastRenderedPageBreak/>
         <w:tab/>
         <w:t>Para quitar un emisor se debe colocar un *</w:t>
       </w:r>
@@ -19962,7 +20138,6 @@
         <w:ind w:left="708"/>
       </w:pPr>
       <w:r>
-        <w:lastRenderedPageBreak/>
         <w:t xml:space="preserve">"No </w:t>
       </w:r>
       <w:proofErr w:type="spellStart"/>
@@ -20286,6 +20461,7 @@
         <w:ind w:firstLine="708"/>
       </w:pPr>
       <w:r>
+        <w:lastRenderedPageBreak/>
         <w:t>E</w:t>
       </w:r>
       <w:r>
@@ -20860,7 +21036,11 @@
       </w:r>
       <w:proofErr w:type="gramEnd"/>
       <w:r>
-        <w:t xml:space="preserve"> un nombre único, exclusivo e irrepetible en toda la novela visual, ya que estos Key serán los que usará el motor para definir consecuencias.</w:t>
+        <w:t xml:space="preserve"> </w:t>
+      </w:r>
+      <w:r>
+        <w:lastRenderedPageBreak/>
+        <w:t>un nombre único, exclusivo e irrepetible en toda la novela visual, ya que estos Key serán los que usará el motor para definir consecuencias.</w:t>
       </w:r>
     </w:p>
     <w:p>
@@ -20922,7 +21102,6 @@
         <w:rPr>
           <w:noProof/>
         </w:rPr>
-        <w:lastRenderedPageBreak/>
         <w:drawing>
           <wp:inline distT="0" distB="0" distL="0" distR="0" wp14:anchorId="5B7426F9" wp14:editId="63DB19C4">
             <wp:extent cx="5400040" cy="1024255"/>
@@ -21048,6 +21227,7 @@
         <w:ind w:firstLine="708"/>
       </w:pPr>
       <w:r>
+        <w:lastRenderedPageBreak/>
         <w:t>La sintaxis de una escena que termina linealmente es la siguiente.</w:t>
       </w:r>
     </w:p>
@@ -21229,7 +21409,6 @@
         </w:sectPr>
       </w:pPr>
       <w:r>
-        <w:lastRenderedPageBreak/>
         <w:tab/>
       </w:r>
     </w:p>
@@ -21855,6 +22034,7 @@
         <w:spacing w:after="0"/>
       </w:pPr>
       <w:r>
+        <w:lastRenderedPageBreak/>
         <w:t xml:space="preserve">       </w:t>
       </w:r>
       <w:r>
@@ -21900,7 +22080,6 @@
     </w:p>
     <w:p>
       <w:r>
-        <w:lastRenderedPageBreak/>
         <w:t xml:space="preserve">       </w:t>
       </w:r>
       <w:r>
@@ -22015,6 +22194,7 @@
     </w:p>
     <w:p>
       <w:r>
+        <w:lastRenderedPageBreak/>
         <w:tab/>
         <w:t>Por supuesto que los puntos no son obligatorios, puedes dejarlo en blanco. El ejemplo anterior se escribiría así.</w:t>
       </w:r>
@@ -22466,11 +22646,7 @@
       </w:r>
       <w:proofErr w:type="spellEnd"/>
       <w:r>
-        <w:t xml:space="preserve">”, </w:t>
-      </w:r>
-      <w:r>
-        <w:lastRenderedPageBreak/>
-        <w:t>“</w:t>
+        <w:t>”, “</w:t>
       </w:r>
       <w:proofErr w:type="spellStart"/>
       <w:r>
@@ -22618,6 +22794,7 @@
         <w:spacing w:after="0"/>
       </w:pPr>
       <w:r>
+        <w:lastRenderedPageBreak/>
         <w:tab/>
       </w:r>
       <w:r>
@@ -22800,7 +22977,6 @@
         <w:ind w:firstLine="708"/>
       </w:pPr>
       <w:r>
-        <w:lastRenderedPageBreak/>
         <w:t xml:space="preserve">Como </w:t>
       </w:r>
       <w:proofErr w:type="spellStart"/>
@@ -23139,6 +23315,7 @@
         <w:spacing w:after="0"/>
       </w:pPr>
       <w:r>
+        <w:lastRenderedPageBreak/>
         <w:tab/>
       </w:r>
       <w:r>
@@ -23381,7 +23558,6 @@
         <w:ind w:firstLine="708"/>
       </w:pPr>
       <w:r>
-        <w:lastRenderedPageBreak/>
         <w:t xml:space="preserve">De </w:t>
       </w:r>
       <w:r>
@@ -23750,6 +23926,7 @@
         <w:ind w:firstLine="708"/>
       </w:pPr>
       <w:r>
+        <w:lastRenderedPageBreak/>
         <w:t xml:space="preserve">De esa forma, el juego verifica ¿El jugador pasó por la escena “earthquake_in_home.csv”? Entonces lo mandamos a la escena </w:t>
       </w:r>
       <w:proofErr w:type="spellStart"/>
@@ -23816,7 +23993,6 @@
     </w:p>
     <w:p>
       <w:r>
-        <w:lastRenderedPageBreak/>
         <w:tab/>
         <w:t xml:space="preserve">No obstante, </w:t>
       </w:r>
@@ -24455,6 +24631,7 @@
         <w:rPr>
           <w:lang w:val="es-VE"/>
         </w:rPr>
+        <w:lastRenderedPageBreak/>
         <w:t xml:space="preserve">$ </w:t>
       </w:r>
       <w:proofErr w:type="spellStart"/>
@@ -24558,7 +24735,6 @@
         </w:numPr>
       </w:pPr>
       <w:r>
-        <w:lastRenderedPageBreak/>
         <w:t>Los personajes en pantalla antes de ejecutar el script personalizado no deben ser movidos ni destruidos.</w:t>
       </w:r>
     </w:p>
@@ -24963,6 +25139,7 @@
       </w:pPr>
       <w:bookmarkStart w:id="46" w:name="_Toc227172421"/>
       <w:r>
+        <w:lastRenderedPageBreak/>
         <w:t>Créditos</w:t>
       </w:r>
       <w:bookmarkEnd w:id="46"/>
@@ -25072,7 +25249,6 @@
     </w:p>
     <w:p>
       <w:r>
-        <w:lastRenderedPageBreak/>
         <w:tab/>
         <w:t xml:space="preserve"># </w:t>
       </w:r>
@@ -25649,6 +25825,7 @@
       </w:pPr>
       <w:bookmarkStart w:id="49" w:name="_Toc227172424"/>
       <w:r>
+        <w:lastRenderedPageBreak/>
         <w:t>Ejemplos</w:t>
       </w:r>
       <w:bookmarkEnd w:id="49"/>
@@ -25950,6 +26127,7 @@
         <w:rPr>
           <w:noProof/>
         </w:rPr>
+        <w:lastRenderedPageBreak/>
         <w:drawing>
           <wp:inline distT="0" distB="0" distL="0" distR="0" wp14:anchorId="5003A32F" wp14:editId="369824AE">
             <wp:extent cx="1571625" cy="1190625"/>
@@ -26067,11 +26245,7 @@
         <w:t>a</w:t>
       </w:r>
       <w:r>
-        <w:t xml:space="preserve">za y tendrá toda la razón, ya </w:t>
-      </w:r>
-      <w:r>
-        <w:lastRenderedPageBreak/>
-        <w:t xml:space="preserve">que el comportamiento de este ejecutable es encriptar una serie de archivos, es decir, el mismo </w:t>
+        <w:t xml:space="preserve">za y tendrá toda la razón, ya que el comportamiento de este ejecutable es encriptar una serie de archivos, es decir, el mismo </w:t>
       </w:r>
       <w:r>
         <w:t>funcionamiento</w:t>
@@ -26266,6 +26440,7 @@
         <w:rPr>
           <w:noProof/>
         </w:rPr>
+        <w:lastRenderedPageBreak/>
         <w:drawing>
           <wp:inline distT="0" distB="0" distL="0" distR="0" wp14:anchorId="630AE5CF" wp14:editId="1F56F786">
             <wp:extent cx="3651250" cy="409618"/>
@@ -26365,7 +26540,6 @@
         <w:rPr>
           <w:noProof/>
         </w:rPr>
-        <w:lastRenderedPageBreak/>
         <w:drawing>
           <wp:anchor distT="0" distB="0" distL="114300" distR="114300" simplePos="0" relativeHeight="251672576" behindDoc="0" locked="0" layoutInCell="1" allowOverlap="1" wp14:anchorId="0D3042F1" wp14:editId="1F87B594">
             <wp:simplePos x="0" y="0"/>
@@ -26839,6 +27013,7 @@
       </w:pPr>
       <w:bookmarkStart w:id="53" w:name="_Toc227172428"/>
       <w:r>
+        <w:lastRenderedPageBreak/>
         <w:t>Instalación</w:t>
       </w:r>
       <w:bookmarkEnd w:id="53"/>
@@ -26912,7 +27087,6 @@
       </w:pPr>
       <w:bookmarkStart w:id="54" w:name="_Toc227172429"/>
       <w:r>
-        <w:lastRenderedPageBreak/>
         <w:t>Balanceo de novela visual</w:t>
       </w:r>
       <w:bookmarkEnd w:id="54"/>
@@ -27018,6 +27192,7 @@
         <w:rPr>
           <w:noProof/>
         </w:rPr>
+        <w:lastRenderedPageBreak/>
         <w:drawing>
           <wp:anchor distT="0" distB="0" distL="114300" distR="114300" simplePos="0" relativeHeight="251671552" behindDoc="0" locked="0" layoutInCell="1" allowOverlap="1" wp14:anchorId="0ECDDFF2" wp14:editId="3F776A67">
             <wp:simplePos x="0" y="0"/>
@@ -27112,7 +27287,6 @@
     </w:p>
     <w:p>
       <w:r>
-        <w:lastRenderedPageBreak/>
         <w:tab/>
         <w:t>Con un total de 11 millones de caminos posibles, la cantidad de rutas en la que el protagonista termina expulsado en el capítulo 2 y 3 son tan mínimas que son inferiores al 0.0%</w:t>
       </w:r>
@@ -27287,7 +27461,6 @@
     </w:p>
     <w:p>
       <w:r>
-        <w:lastRenderedPageBreak/>
         <w:tab/>
         <w:t xml:space="preserve">Cabe destacar que </w:t>
       </w:r>

</xml_diff>

<commit_message>
<docs> delay, emisor and text docs ready, scene end in progress
</commit_message>
<xml_diff>
--- a/Manual de desarrollo en Atlax Renpy.docx
+++ b/Manual de desarrollo en Atlax Renpy.docx
@@ -6484,7 +6484,7 @@
         </w:rPr>
         <w:lastRenderedPageBreak/>
         <w:drawing>
-          <wp:anchor distT="0" distB="0" distL="114300" distR="114300" simplePos="0" relativeHeight="251676672" behindDoc="0" locked="0" layoutInCell="1" allowOverlap="1" wp14:anchorId="338485B2" wp14:editId="201B9E62">
+          <wp:anchor distT="0" distB="0" distL="114300" distR="114300" simplePos="0" relativeHeight="251676672" behindDoc="0" locked="0" layoutInCell="1" allowOverlap="1" wp14:anchorId="338485B2" wp14:editId="1A0499D6">
             <wp:simplePos x="0" y="0"/>
             <wp:positionH relativeFrom="margin">
               <wp:align>center</wp:align>
@@ -10400,7 +10400,7 @@
           <w:noProof/>
         </w:rPr>
         <w:drawing>
-          <wp:anchor distT="0" distB="0" distL="114300" distR="114300" simplePos="0" relativeHeight="251693056" behindDoc="0" locked="0" layoutInCell="1" allowOverlap="1" wp14:anchorId="46113A86" wp14:editId="75859114">
+          <wp:anchor distT="0" distB="0" distL="114300" distR="114300" simplePos="0" relativeHeight="251693056" behindDoc="0" locked="0" layoutInCell="1" allowOverlap="1" wp14:anchorId="46113A86" wp14:editId="09D3B648">
             <wp:simplePos x="0" y="0"/>
             <wp:positionH relativeFrom="margin">
               <wp:posOffset>-260930</wp:posOffset>
@@ -14870,7 +14870,7 @@
           <w:noProof/>
         </w:rPr>
         <w:drawing>
-          <wp:anchor distT="0" distB="0" distL="114300" distR="114300" simplePos="0" relativeHeight="251668480" behindDoc="0" locked="0" layoutInCell="1" allowOverlap="1" wp14:anchorId="68EEACF9" wp14:editId="19448A97">
+          <wp:anchor distT="0" distB="0" distL="114300" distR="114300" simplePos="0" relativeHeight="251668480" behindDoc="0" locked="0" layoutInCell="1" allowOverlap="1" wp14:anchorId="68EEACF9" wp14:editId="6BFAA689">
             <wp:simplePos x="0" y="0"/>
             <wp:positionH relativeFrom="margin">
               <wp:align>center</wp:align>
@@ -17178,6 +17178,75 @@
             <w:pPr>
               <w:jc w:val="center"/>
             </w:pPr>
+            <w:proofErr w:type="spellStart"/>
+            <w:r>
+              <w:t>decor</w:t>
+            </w:r>
+            <w:proofErr w:type="spellEnd"/>
+          </w:p>
+        </w:tc>
+        <w:tc>
+          <w:tcPr>
+            <w:tcW w:w="3402" w:type="dxa"/>
+            <w:vAlign w:val="center"/>
+          </w:tcPr>
+          <w:p>
+            <w:pPr>
+              <w:jc w:val="center"/>
+              <w:rPr>
+                <w:sz w:val="20"/>
+                <w:szCs w:val="20"/>
+              </w:rPr>
+            </w:pPr>
+            <w:r>
+              <w:rPr>
+                <w:sz w:val="20"/>
+                <w:szCs w:val="20"/>
+              </w:rPr>
+              <w:t>Un decorador. Encima del personaje se muestra una imagen, la cual se moverá junto al personaje.</w:t>
+            </w:r>
+          </w:p>
+        </w:tc>
+        <w:tc>
+          <w:tcPr>
+            <w:tcW w:w="3537" w:type="dxa"/>
+            <w:vAlign w:val="center"/>
+          </w:tcPr>
+          <w:p>
+            <w:pPr>
+              <w:pStyle w:val="Prrafodelista"/>
+              <w:numPr>
+                <w:ilvl w:val="0"/>
+                <w:numId w:val="29"/>
+              </w:numPr>
+              <w:rPr>
+                <w:sz w:val="20"/>
+                <w:szCs w:val="20"/>
+              </w:rPr>
+            </w:pPr>
+            <w:r>
+              <w:rPr>
+                <w:sz w:val="20"/>
+                <w:szCs w:val="20"/>
+              </w:rPr>
+              <w:t>El nombre de la imagen a mostrar.</w:t>
+            </w:r>
+          </w:p>
+        </w:tc>
+      </w:tr>
+      <w:tr>
+        <w:trPr>
+          <w:trHeight w:val="695"/>
+        </w:trPr>
+        <w:tc>
+          <w:tcPr>
+            <w:tcW w:w="1555" w:type="dxa"/>
+            <w:vAlign w:val="center"/>
+          </w:tcPr>
+          <w:p>
+            <w:pPr>
+              <w:jc w:val="center"/>
+            </w:pPr>
             <w:r>
               <w:t>tremble</w:t>
             </w:r>
@@ -18037,84 +18106,84 @@
     </w:p>
     <w:p>
       <w:r>
-        <w:tab/>
-      </w:r>
-      <w:proofErr w:type="spellStart"/>
-      <w:proofErr w:type="gramStart"/>
-      <w:r>
-        <w:rPr>
-          <w:highlight w:val="yellow"/>
-        </w:rPr>
-        <w:t>calcercio</w:t>
-      </w:r>
-      <w:proofErr w:type="spellEnd"/>
-      <w:r>
-        <w:rPr>
-          <w:highlight w:val="yellow"/>
-        </w:rPr>
-        <w:t xml:space="preserve"> :</w:t>
-      </w:r>
-      <w:proofErr w:type="gramEnd"/>
-      <w:r>
-        <w:rPr>
-          <w:highlight w:val="yellow"/>
-        </w:rPr>
-        <w:t xml:space="preserve"> </w:t>
-      </w:r>
-      <w:proofErr w:type="spellStart"/>
-      <w:proofErr w:type="gramStart"/>
-      <w:r>
-        <w:rPr>
-          <w:highlight w:val="yellow"/>
-        </w:rPr>
-        <w:t>move</w:t>
-      </w:r>
-      <w:proofErr w:type="spellEnd"/>
-      <w:r>
-        <w:rPr>
-          <w:highlight w:val="yellow"/>
-        </w:rPr>
-        <w:t xml:space="preserve"> :</w:t>
-      </w:r>
-      <w:proofErr w:type="gramEnd"/>
-      <w:r>
-        <w:rPr>
-          <w:highlight w:val="yellow"/>
-        </w:rPr>
-        <w:t xml:space="preserve"> </w:t>
-      </w:r>
-      <w:proofErr w:type="gramStart"/>
-      <w:r>
-        <w:rPr>
-          <w:highlight w:val="yellow"/>
-        </w:rPr>
-        <w:t>47 :</w:t>
-      </w:r>
-      <w:proofErr w:type="gramEnd"/>
-      <w:r>
-        <w:rPr>
-          <w:highlight w:val="yellow"/>
-        </w:rPr>
-        <w:t xml:space="preserve"> 0.5</w:t>
-      </w:r>
-      <w:r>
-        <w:t xml:space="preserve"> (</w:t>
-      </w:r>
-      <w:proofErr w:type="spellStart"/>
-      <w:r>
-        <w:t>Calcercio</w:t>
-      </w:r>
-      <w:proofErr w:type="spellEnd"/>
-      <w:r>
-        <w:t xml:space="preserve"> se mueve a la posición 47 en 0.5 segundos, es decir, con muchísima velocidad)</w:t>
-      </w:r>
-    </w:p>
-    <w:p>
-      <w:r>
         <w:lastRenderedPageBreak/>
         <w:tab/>
       </w:r>
       <w:proofErr w:type="spellStart"/>
+      <w:proofErr w:type="gramStart"/>
+      <w:r>
+        <w:rPr>
+          <w:highlight w:val="yellow"/>
+        </w:rPr>
+        <w:t>calcercio</w:t>
+      </w:r>
+      <w:proofErr w:type="spellEnd"/>
+      <w:r>
+        <w:rPr>
+          <w:highlight w:val="yellow"/>
+        </w:rPr>
+        <w:t xml:space="preserve"> :</w:t>
+      </w:r>
+      <w:proofErr w:type="gramEnd"/>
+      <w:r>
+        <w:rPr>
+          <w:highlight w:val="yellow"/>
+        </w:rPr>
+        <w:t xml:space="preserve"> </w:t>
+      </w:r>
+      <w:proofErr w:type="spellStart"/>
+      <w:proofErr w:type="gramStart"/>
+      <w:r>
+        <w:rPr>
+          <w:highlight w:val="yellow"/>
+        </w:rPr>
+        <w:t>move</w:t>
+      </w:r>
+      <w:proofErr w:type="spellEnd"/>
+      <w:r>
+        <w:rPr>
+          <w:highlight w:val="yellow"/>
+        </w:rPr>
+        <w:t xml:space="preserve"> :</w:t>
+      </w:r>
+      <w:proofErr w:type="gramEnd"/>
+      <w:r>
+        <w:rPr>
+          <w:highlight w:val="yellow"/>
+        </w:rPr>
+        <w:t xml:space="preserve"> </w:t>
+      </w:r>
+      <w:proofErr w:type="gramStart"/>
+      <w:r>
+        <w:rPr>
+          <w:highlight w:val="yellow"/>
+        </w:rPr>
+        <w:t>47 :</w:t>
+      </w:r>
+      <w:proofErr w:type="gramEnd"/>
+      <w:r>
+        <w:rPr>
+          <w:highlight w:val="yellow"/>
+        </w:rPr>
+        <w:t xml:space="preserve"> 0.5</w:t>
+      </w:r>
+      <w:r>
+        <w:t xml:space="preserve"> (</w:t>
+      </w:r>
+      <w:proofErr w:type="spellStart"/>
+      <w:r>
+        <w:t>Calcercio</w:t>
+      </w:r>
+      <w:proofErr w:type="spellEnd"/>
+      <w:r>
+        <w:t xml:space="preserve"> se mueve a la posición 47 en 0.5 segundos, es decir, con muchísima velocidad)</w:t>
+      </w:r>
+    </w:p>
+    <w:p>
+      <w:r>
+        <w:tab/>
+      </w:r>
+      <w:proofErr w:type="spellStart"/>
       <w:r>
         <w:rPr>
           <w:highlight w:val="yellow"/>
@@ -18526,6 +18595,166 @@
       </w:r>
       <w:r>
         <w:t>de la pantalla por la derecha)</w:t>
+      </w:r>
+    </w:p>
+    <w:p>
+      <w:pPr>
+        <w:ind w:firstLine="708"/>
+      </w:pPr>
+      <w:proofErr w:type="spellStart"/>
+      <w:r>
+        <w:rPr>
+          <w:highlight w:val="yellow"/>
+        </w:rPr>
+        <w:t>amber</w:t>
+      </w:r>
+      <w:proofErr w:type="spellEnd"/>
+      <w:r>
+        <w:rPr>
+          <w:highlight w:val="yellow"/>
+        </w:rPr>
+        <w:t xml:space="preserve"> </w:t>
+      </w:r>
+      <w:proofErr w:type="spellStart"/>
+      <w:proofErr w:type="gramStart"/>
+      <w:r>
+        <w:rPr>
+          <w:highlight w:val="yellow"/>
+        </w:rPr>
+        <w:t>happy</w:t>
+      </w:r>
+      <w:r>
+        <w:rPr>
+          <w:highlight w:val="yellow"/>
+        </w:rPr>
+        <w:t>:decor</w:t>
+      </w:r>
+      <w:proofErr w:type="gramEnd"/>
+      <w:r>
+        <w:rPr>
+          <w:highlight w:val="yellow"/>
+        </w:rPr>
+        <w:t>:stars</w:t>
+      </w:r>
+      <w:proofErr w:type="spellEnd"/>
+      <w:r>
+        <w:rPr>
+          <w:highlight w:val="yellow"/>
+        </w:rPr>
+        <w:t xml:space="preserve">, </w:t>
+      </w:r>
+      <w:proofErr w:type="spellStart"/>
+      <w:r>
+        <w:rPr>
+          <w:highlight w:val="yellow"/>
+        </w:rPr>
+        <w:t>amber</w:t>
+      </w:r>
+      <w:proofErr w:type="spellEnd"/>
+      <w:r>
+        <w:rPr>
+          <w:highlight w:val="yellow"/>
+        </w:rPr>
+        <w:t xml:space="preserve"> </w:t>
+      </w:r>
+      <w:proofErr w:type="spellStart"/>
+      <w:proofErr w:type="gramStart"/>
+      <w:r>
+        <w:rPr>
+          <w:highlight w:val="yellow"/>
+        </w:rPr>
+        <w:t>happy</w:t>
+      </w:r>
+      <w:r>
+        <w:rPr>
+          <w:highlight w:val="yellow"/>
+        </w:rPr>
+        <w:t>:jump</w:t>
+      </w:r>
+      <w:proofErr w:type="spellEnd"/>
+      <w:proofErr w:type="gramEnd"/>
+      <w:r>
+        <w:rPr>
+          <w:highlight w:val="yellow"/>
+        </w:rPr>
+        <w:t xml:space="preserve">, </w:t>
+      </w:r>
+      <w:r>
+        <w:t>(Amber se pone contenta</w:t>
+      </w:r>
+      <w:r>
+        <w:t xml:space="preserve"> y se coloca encima de ella un decorador de estrellas y luego da un saltito para hacer énfasis en lo contenta que está</w:t>
+      </w:r>
+      <w:r>
+        <w:t>)</w:t>
+      </w:r>
+    </w:p>
+    <w:p>
+      <w:pPr>
+        <w:ind w:firstLine="708"/>
+        <w:rPr>
+          <w:i/>
+          <w:iCs/>
+        </w:rPr>
+      </w:pPr>
+      <w:r>
+        <w:t>Se recomienda colocar los archivos de los decoradores (</w:t>
+      </w:r>
+      <w:proofErr w:type="spellStart"/>
+      <w:r>
+        <w:t>decors</w:t>
+      </w:r>
+      <w:proofErr w:type="spellEnd"/>
+      <w:r>
+        <w:t xml:space="preserve">) en la carpeta </w:t>
+      </w:r>
+      <w:proofErr w:type="spellStart"/>
+      <w:r>
+        <w:rPr>
+          <w:i/>
+          <w:iCs/>
+        </w:rPr>
+        <w:t>games</w:t>
+      </w:r>
+      <w:proofErr w:type="spellEnd"/>
+      <w:r>
+        <w:rPr>
+          <w:i/>
+          <w:iCs/>
+        </w:rPr>
+        <w:t>/</w:t>
+      </w:r>
+      <w:proofErr w:type="spellStart"/>
+      <w:r>
+        <w:rPr>
+          <w:i/>
+          <w:iCs/>
+        </w:rPr>
+        <w:t>images</w:t>
+      </w:r>
+      <w:proofErr w:type="spellEnd"/>
+      <w:r>
+        <w:rPr>
+          <w:i/>
+          <w:iCs/>
+        </w:rPr>
+        <w:t>/</w:t>
+      </w:r>
+      <w:proofErr w:type="spellStart"/>
+      <w:r>
+        <w:rPr>
+          <w:i/>
+          <w:iCs/>
+        </w:rPr>
+        <w:t>displayables</w:t>
+      </w:r>
+      <w:proofErr w:type="spellEnd"/>
+      <w:r>
+        <w:rPr>
+          <w:i/>
+          <w:iCs/>
+        </w:rPr>
+        <w:t>.</w:t>
       </w:r>
     </w:p>
     <w:p>
@@ -18803,11 +19032,20 @@
     </w:tbl>
     <w:p/>
     <w:p>
-      <w:r>
+      <w:pPr>
         <w:rPr>
           <w:b/>
           <w:bCs/>
         </w:rPr>
+      </w:pPr>
+    </w:p>
+    <w:p>
+      <w:r>
+        <w:rPr>
+          <w:b/>
+          <w:bCs/>
+        </w:rPr>
+        <w:lastRenderedPageBreak/>
         <w:tab/>
       </w:r>
       <w:r>
@@ -18883,7 +19121,6 @@
         <w:t xml:space="preserve"> utilizando estos eventos.</w:t>
       </w:r>
     </w:p>
-    <w:p/>
     <w:p>
       <w:pPr>
         <w:pStyle w:val="Prrafodelista"/>
@@ -18893,7 +19130,6 @@
         </w:numPr>
       </w:pPr>
       <w:r>
-        <w:lastRenderedPageBreak/>
         <w:t>Saijo aparece y corre hacia una puerta a intentar abrirla dándole golpes</w:t>
       </w:r>
     </w:p>
@@ -19659,16 +19895,11 @@
     </w:p>
     <w:p>
       <w:pPr>
-        <w:pStyle w:val="Prrafodelista"/>
-        <w:ind w:left="1440"/>
-      </w:pPr>
-    </w:p>
-    <w:p>
-      <w:pPr>
         <w:pStyle w:val="Ttulo2"/>
       </w:pPr>
       <w:bookmarkStart w:id="37" w:name="_Toc227172412"/>
       <w:r>
+        <w:lastRenderedPageBreak/>
         <w:t>Columna Delay</w:t>
       </w:r>
       <w:bookmarkEnd w:id="37"/>
@@ -19734,7 +19965,6 @@
         <w:ind w:firstLine="708"/>
       </w:pPr>
       <w:r>
-        <w:lastRenderedPageBreak/>
         <w:t>Cabe aclarar que el tiempo de espera para mostrar el diálogo irá después de los movimientos y animaciones de los personajes.</w:t>
       </w:r>
     </w:p>
@@ -19883,22 +20113,10 @@
         <w:rPr>
           <w:highlight w:val="yellow"/>
         </w:rPr>
-        <w:t>0:</w:t>
-      </w:r>
-      <w:r>
-        <w:rPr>
-          <w:highlight w:val="yellow"/>
-        </w:rPr>
-        <w:t>200</w:t>
-      </w:r>
-      <w:r>
-        <w:t xml:space="preserve"> (</w:t>
-      </w:r>
-      <w:r>
-        <w:t>Sin tiempo de espera, el texto es mostrado a una velocidad increíble</w:t>
-      </w:r>
-      <w:r>
-        <w:t>)</w:t>
+        <w:t>0:200</w:t>
+      </w:r>
+      <w:r>
+        <w:t xml:space="preserve"> (Sin tiempo de espera, el texto es mostrado a una velocidad increíble)</w:t>
       </w:r>
     </w:p>
     <w:p>
@@ -19953,20 +20171,29 @@
       </w:r>
       <w:proofErr w:type="spellEnd"/>
       <w:r>
-        <w:t xml:space="preserve"> (Al terminar de mostrar el diálogo, sea en </w:t>
-      </w:r>
-      <w:proofErr w:type="spellStart"/>
+        <w:t xml:space="preserve"> (Al terminar de mostrar el diálogo, sea en l</w:t>
+      </w:r>
+      <w:r>
+        <w:t>a</w:t>
+      </w:r>
+      <w:r>
+        <w:t xml:space="preserve"> velocidad que sea, este pasará automáticamente al siguiente)</w:t>
+      </w:r>
+    </w:p>
+    <w:p>
+      <w:r>
+        <w:tab/>
+      </w:r>
       <w:proofErr w:type="gramStart"/>
       <w:r>
-        <w:t>al</w:t>
-      </w:r>
-      <w:proofErr w:type="spellEnd"/>
-      <w:r>
-        <w:t xml:space="preserve"> velocidad</w:t>
+        <w:rPr>
+          <w:highlight w:val="yellow"/>
+        </w:rPr>
+        <w:t>0:15:pass</w:t>
       </w:r>
       <w:proofErr w:type="gramEnd"/>
       <w:r>
-        <w:t xml:space="preserve"> que sea, este pasará automáticamente al siguiente)</w:t>
+        <w:t xml:space="preserve"> (Sin espera, a velocidad de 15 caracteres por segundo, cuando se termine de mostrar se pasa el diálogo)</w:t>
       </w:r>
     </w:p>
     <w:p>
@@ -19978,62 +20205,113 @@
         <w:rPr>
           <w:highlight w:val="yellow"/>
         </w:rPr>
-        <w:t>0:15:pass</w:t>
+        <w:t>Pas</w:t>
+      </w:r>
+      <w:r>
+        <w:rPr>
+          <w:highlight w:val="yellow"/>
+        </w:rPr>
+        <w:t>s:</w:t>
+      </w:r>
+      <w:r>
+        <w:rPr>
+          <w:highlight w:val="yellow"/>
+        </w:rPr>
+        <w:t>0:</w:t>
+      </w:r>
+      <w:r>
+        <w:rPr>
+          <w:highlight w:val="yellow"/>
+        </w:rPr>
+        <w:t>180</w:t>
       </w:r>
       <w:proofErr w:type="gramEnd"/>
       <w:r>
-        <w:t xml:space="preserve"> (Sin espera, a velocidad de 15 caracteres por segundo, cuando se termine de mostrar se pasa el diálogo)</w:t>
+        <w:t xml:space="preserve"> (Sin espera, el texto se muestra a una velocidad tan alta que seguramente ni si quiera se pueda leer y una vez termine se pasa el diálogo, generando así un efecto de un personaje que habla extremadamente rápido sin ningún tipo de pausa)</w:t>
       </w:r>
     </w:p>
     <w:p>
       <w:r>
         <w:tab/>
-      </w:r>
-      <w:proofErr w:type="gramStart"/>
-      <w:r>
-        <w:rPr>
-          <w:highlight w:val="yellow"/>
-        </w:rPr>
-        <w:t>P</w:t>
-      </w:r>
-      <w:r>
-        <w:rPr>
-          <w:highlight w:val="yellow"/>
-        </w:rPr>
-        <w:t>as</w:t>
-      </w:r>
-      <w:r>
-        <w:rPr>
-          <w:highlight w:val="yellow"/>
-        </w:rPr>
-        <w:t>s</w:t>
-      </w:r>
-      <w:r>
-        <w:rPr>
-          <w:highlight w:val="yellow"/>
-        </w:rPr>
-        <w:t>:</w:t>
-      </w:r>
-      <w:r>
-        <w:rPr>
-          <w:highlight w:val="yellow"/>
-        </w:rPr>
-        <w:t>0:</w:t>
-      </w:r>
-      <w:r>
-        <w:rPr>
-          <w:highlight w:val="yellow"/>
-        </w:rPr>
-        <w:t>180</w:t>
-      </w:r>
-      <w:proofErr w:type="gramEnd"/>
-      <w:r>
-        <w:t xml:space="preserve"> (Sin espera, el texto se muestra a una velocidad tan alta que seguramente ni si quiera se pueda leer y una vez termine se pasa el diálogo, generando así un efecto de un personaje que habla extremadamente rápido sin ningún tipo de pausa)</w:t>
+        <w:t xml:space="preserve">En la configuración de </w:t>
+      </w:r>
+      <w:proofErr w:type="spellStart"/>
+      <w:r>
+        <w:rPr>
+          <w:b/>
+          <w:bCs/>
+        </w:rPr>
+        <w:t>Renpy</w:t>
+      </w:r>
+      <w:proofErr w:type="spellEnd"/>
+      <w:r>
+        <w:t xml:space="preserve"> es posible colocar la configuración de velocidad de texto al máximo, ocasionando que el texto se escriba de golpe en la caja de texto. En estos </w:t>
+      </w:r>
+      <w:r>
+        <w:lastRenderedPageBreak/>
+        <w:t>casos, si escribimos un “</w:t>
+      </w:r>
+      <w:proofErr w:type="spellStart"/>
+      <w:r>
+        <w:t>pass</w:t>
+      </w:r>
+      <w:proofErr w:type="spellEnd"/>
+      <w:r>
+        <w:t>”, el texto será pasado inmediatamente sin dar oportunidad a ver el texto.</w:t>
       </w:r>
     </w:p>
     <w:p>
       <w:r>
         <w:tab/>
+        <w:t xml:space="preserve">Si </w:t>
+      </w:r>
+      <w:proofErr w:type="spellStart"/>
+      <w:r>
+        <w:rPr>
+          <w:b/>
+          <w:bCs/>
+        </w:rPr>
+        <w:t>Atlax</w:t>
+      </w:r>
+      <w:proofErr w:type="spellEnd"/>
+      <w:r>
+        <w:rPr>
+          <w:b/>
+          <w:bCs/>
+        </w:rPr>
+        <w:t xml:space="preserve"> </w:t>
+      </w:r>
+      <w:proofErr w:type="spellStart"/>
+      <w:r>
+        <w:rPr>
+          <w:b/>
+          <w:bCs/>
+        </w:rPr>
+        <w:t>Renpy</w:t>
+      </w:r>
+      <w:proofErr w:type="spellEnd"/>
+      <w:r>
+        <w:t xml:space="preserve"> detecta este escenario, antes de pasar el diálogo, forzará la velocidad del texto a 180 caracteres por segundo, para dar oportunidad al jugador de experimentar dicho diálogo. De todas formas, la velocidad de texto que definas en la columna </w:t>
+      </w:r>
+      <w:proofErr w:type="spellStart"/>
+      <w:r>
+        <w:t>delay</w:t>
+      </w:r>
+      <w:proofErr w:type="spellEnd"/>
+      <w:r>
+        <w:t xml:space="preserve">, siempre será la prioridad absoluta por encima de la configuración de </w:t>
+      </w:r>
+      <w:proofErr w:type="spellStart"/>
+      <w:r>
+        <w:rPr>
+          <w:b/>
+          <w:bCs/>
+        </w:rPr>
+        <w:t>Renpy</w:t>
+      </w:r>
+      <w:proofErr w:type="spellEnd"/>
+      <w:r>
+        <w:t xml:space="preserve"> (para ese diálogo).</w:t>
       </w:r>
     </w:p>
     <w:p>
@@ -20058,6 +20336,9 @@
         <w:t xml:space="preserve"> que le hayamos dado en el archivo </w:t>
       </w:r>
       <w:r>
+        <w:t xml:space="preserve">de configuración </w:t>
+      </w:r>
+      <w:r>
         <w:rPr>
           <w:i/>
           <w:iCs/>
@@ -20070,28 +20351,267 @@
     </w:p>
     <w:p>
       <w:r>
-        <w:t xml:space="preserve"> </w:t>
-      </w:r>
-      <w:r>
         <w:tab/>
-      </w:r>
-      <w:r>
-        <w:t>Una vez colocado un emisor no hace falta ponerlo en los diálogos posteriores ya que este seguirá apareciendo hasta que se quite o se ponga otro emisor.</w:t>
-      </w:r>
-    </w:p>
-    <w:p>
+        <w:t xml:space="preserve">Para mostrar el nombre de un personaje, debemos escribir su </w:t>
+      </w:r>
+      <w:r>
+        <w:rPr>
+          <w:b/>
+          <w:bCs/>
+        </w:rPr>
+        <w:t>nombre clave</w:t>
+      </w:r>
+      <w:r>
+        <w:t xml:space="preserve"> definido en el archivo de configuración </w:t>
+      </w:r>
+      <w:r>
+        <w:rPr>
+          <w:i/>
+          <w:iCs/>
+        </w:rPr>
+        <w:t>config.csv</w:t>
+      </w:r>
+      <w:r>
+        <w:t>.</w:t>
+      </w:r>
+    </w:p>
+    <w:p>
+      <w:r>
+        <w:tab/>
+        <w:t>Un escenario muy común es que un personaje hable continuadamente por varios diálogos, en esos casos no será necesario que coloquemos su nombre en cada diálogo, con solo colocarlo una vez, su nombre se mostrará en pantalla hasta que se coloque otro o se quite.</w:t>
+      </w:r>
+    </w:p>
+    <w:p>
+      <w:r>
+        <w:tab/>
+        <w:t>Para quitar el nombre de la caja de texto, de manera similar a la columna music, debemos escribir un “*”. De esa forma el nombre será removido de pantalla hasta que se coloque uno nuevo.</w:t>
+      </w:r>
+    </w:p>
+    <w:p>
+      <w:pPr>
+        <w:sectPr>
+          <w:type w:val="continuous"/>
+          <w:pgSz w:w="11906" w:h="16838"/>
+          <w:pgMar w:top="1417" w:right="1701" w:bottom="1417" w:left="1701" w:header="708" w:footer="708" w:gutter="0"/>
+          <w:cols w:space="708"/>
+          <w:docGrid w:linePitch="360"/>
+        </w:sectPr>
+      </w:pPr>
+    </w:p>
+    <w:p>
+      <w:pPr>
+        <w:jc w:val="center"/>
+        <w:rPr>
+          <w:i/>
+          <w:iCs/>
+          <w:sz w:val="20"/>
+          <w:szCs w:val="20"/>
+        </w:rPr>
+      </w:pPr>
+      <w:r>
+        <w:rPr>
+          <w:noProof/>
+        </w:rPr>
+        <w:drawing>
+          <wp:anchor distT="0" distB="0" distL="114300" distR="114300" simplePos="0" relativeHeight="251694080" behindDoc="0" locked="0" layoutInCell="1" allowOverlap="1" wp14:anchorId="14F82A39" wp14:editId="10ADC30E">
+            <wp:simplePos x="0" y="0"/>
+            <wp:positionH relativeFrom="margin">
+              <wp:posOffset>689632</wp:posOffset>
+            </wp:positionH>
+            <wp:positionV relativeFrom="margin">
+              <wp:posOffset>5315416</wp:posOffset>
+            </wp:positionV>
+            <wp:extent cx="1210310" cy="2771140"/>
+            <wp:effectExtent l="0" t="0" r="8890" b="0"/>
+            <wp:wrapSquare wrapText="bothSides"/>
+            <wp:docPr id="1687009307" name="Imagen 1"/>
+            <wp:cNvGraphicFramePr>
+              <a:graphicFrameLocks xmlns:a="http://schemas.openxmlformats.org/drawingml/2006/main" noChangeAspect="1"/>
+            </wp:cNvGraphicFramePr>
+            <a:graphic xmlns:a="http://schemas.openxmlformats.org/drawingml/2006/main">
+              <a:graphicData uri="http://schemas.openxmlformats.org/drawingml/2006/picture">
+                <pic:pic xmlns:pic="http://schemas.openxmlformats.org/drawingml/2006/picture">
+                  <pic:nvPicPr>
+                    <pic:cNvPr id="1687009307" name=""/>
+                    <pic:cNvPicPr/>
+                  </pic:nvPicPr>
+                  <pic:blipFill>
+                    <a:blip r:embed="rId43">
+                      <a:extLst>
+                        <a:ext uri="{28A0092B-C50C-407E-A947-70E740481C1C}">
+                          <a14:useLocalDpi xmlns:a14="http://schemas.microsoft.com/office/drawing/2010/main" val="0"/>
+                        </a:ext>
+                      </a:extLst>
+                    </a:blip>
+                    <a:stretch>
+                      <a:fillRect/>
+                    </a:stretch>
+                  </pic:blipFill>
+                  <pic:spPr>
+                    <a:xfrm>
+                      <a:off x="0" y="0"/>
+                      <a:ext cx="1210310" cy="2771140"/>
+                    </a:xfrm>
+                    <a:prstGeom prst="rect">
+                      <a:avLst/>
+                    </a:prstGeom>
+                  </pic:spPr>
+                </pic:pic>
+              </a:graphicData>
+            </a:graphic>
+            <wp14:sizeRelH relativeFrom="margin">
+              <wp14:pctWidth>0</wp14:pctWidth>
+            </wp14:sizeRelH>
+            <wp14:sizeRelV relativeFrom="margin">
+              <wp14:pctHeight>0</wp14:pctHeight>
+            </wp14:sizeRelV>
+          </wp:anchor>
+        </w:drawing>
+      </w:r>
+      <w:r>
+        <w:rPr>
+          <w:i/>
+          <w:iCs/>
+          <w:sz w:val="20"/>
+          <w:szCs w:val="20"/>
+        </w:rPr>
+        <w:t>Repitiendo los nombres</w:t>
+      </w:r>
+      <w:r>
+        <w:rPr>
+          <w:i/>
+          <w:iCs/>
+          <w:sz w:val="20"/>
+          <w:szCs w:val="20"/>
+        </w:rPr>
+        <w:t xml:space="preserve"> para mostrar el nombre del emisor (incorrecto)</w:t>
+      </w:r>
+    </w:p>
+    <w:p>
+      <w:pPr>
+        <w:jc w:val="center"/>
+        <w:rPr>
+          <w:i/>
+          <w:iCs/>
+          <w:sz w:val="20"/>
+          <w:szCs w:val="20"/>
+        </w:rPr>
+      </w:pPr>
+    </w:p>
+    <w:p>
+      <w:pPr>
+        <w:jc w:val="center"/>
+        <w:rPr>
+          <w:i/>
+          <w:iCs/>
+        </w:rPr>
+        <w:sectPr>
+          <w:type w:val="continuous"/>
+          <w:pgSz w:w="11906" w:h="16838"/>
+          <w:pgMar w:top="1417" w:right="1701" w:bottom="1417" w:left="1701" w:header="708" w:footer="708" w:gutter="0"/>
+          <w:cols w:num="2" w:space="708"/>
+          <w:docGrid w:linePitch="360"/>
+        </w:sectPr>
+      </w:pPr>
+      <w:r>
+        <w:rPr>
+          <w:noProof/>
+        </w:rPr>
+        <w:drawing>
+          <wp:anchor distT="0" distB="0" distL="114300" distR="114300" simplePos="0" relativeHeight="251695104" behindDoc="0" locked="0" layoutInCell="1" allowOverlap="1" wp14:anchorId="2B971677" wp14:editId="0CD58C40">
+            <wp:simplePos x="0" y="0"/>
+            <wp:positionH relativeFrom="margin">
+              <wp:posOffset>3565525</wp:posOffset>
+            </wp:positionH>
+            <wp:positionV relativeFrom="margin">
+              <wp:posOffset>5332730</wp:posOffset>
+            </wp:positionV>
+            <wp:extent cx="1215390" cy="2762250"/>
+            <wp:effectExtent l="0" t="0" r="3810" b="0"/>
+            <wp:wrapSquare wrapText="bothSides"/>
+            <wp:docPr id="1168886223" name="Imagen 1"/>
+            <wp:cNvGraphicFramePr>
+              <a:graphicFrameLocks xmlns:a="http://schemas.openxmlformats.org/drawingml/2006/main" noChangeAspect="1"/>
+            </wp:cNvGraphicFramePr>
+            <a:graphic xmlns:a="http://schemas.openxmlformats.org/drawingml/2006/main">
+              <a:graphicData uri="http://schemas.openxmlformats.org/drawingml/2006/picture">
+                <pic:pic xmlns:pic="http://schemas.openxmlformats.org/drawingml/2006/picture">
+                  <pic:nvPicPr>
+                    <pic:cNvPr id="1168886223" name=""/>
+                    <pic:cNvPicPr/>
+                  </pic:nvPicPr>
+                  <pic:blipFill>
+                    <a:blip r:embed="rId44">
+                      <a:extLst>
+                        <a:ext uri="{28A0092B-C50C-407E-A947-70E740481C1C}">
+                          <a14:useLocalDpi xmlns:a14="http://schemas.microsoft.com/office/drawing/2010/main" val="0"/>
+                        </a:ext>
+                      </a:extLst>
+                    </a:blip>
+                    <a:stretch>
+                      <a:fillRect/>
+                    </a:stretch>
+                  </pic:blipFill>
+                  <pic:spPr>
+                    <a:xfrm>
+                      <a:off x="0" y="0"/>
+                      <a:ext cx="1215390" cy="2762250"/>
+                    </a:xfrm>
+                    <a:prstGeom prst="rect">
+                      <a:avLst/>
+                    </a:prstGeom>
+                  </pic:spPr>
+                </pic:pic>
+              </a:graphicData>
+            </a:graphic>
+            <wp14:sizeRelH relativeFrom="margin">
+              <wp14:pctWidth>0</wp14:pctWidth>
+            </wp14:sizeRelH>
+            <wp14:sizeRelV relativeFrom="margin">
+              <wp14:pctHeight>0</wp14:pctHeight>
+            </wp14:sizeRelV>
+          </wp:anchor>
+        </w:drawing>
+      </w:r>
+      <w:r>
+        <w:rPr>
+          <w:i/>
+          <w:iCs/>
+          <w:sz w:val="20"/>
+          <w:szCs w:val="20"/>
+        </w:rPr>
+        <w:t>Colocando el nombre las veces necesarias para mostrar el nombre del emisor (correcto)</w:t>
+      </w:r>
+    </w:p>
+    <w:p/>
+    <w:p>
+      <w:pPr>
+        <w:pStyle w:val="Ttulo2"/>
+        <w:rPr>
+          <w:noProof/>
+        </w:rPr>
+      </w:pPr>
+      <w:bookmarkStart w:id="39" w:name="_Toc227172414"/>
+    </w:p>
+    <w:p>
+      <w:pPr>
+        <w:pStyle w:val="Ttulo2"/>
+        <w:rPr>
+          <w:noProof/>
+        </w:rPr>
+      </w:pPr>
+    </w:p>
+    <w:p/>
+    <w:p/>
+    <w:p/>
+    <w:p/>
+    <w:p/>
+    <w:p>
+      <w:pPr>
+        <w:pStyle w:val="Ttulo2"/>
+      </w:pPr>
       <w:r>
         <w:lastRenderedPageBreak/>
-        <w:tab/>
-        <w:t>Para quitar un emisor se debe colocar un *</w:t>
-      </w:r>
-    </w:p>
-    <w:p>
-      <w:pPr>
-        <w:pStyle w:val="Ttulo2"/>
-      </w:pPr>
-      <w:bookmarkStart w:id="39" w:name="_Toc227172414"/>
-      <w:r>
         <w:t>Columnas de Idioma</w:t>
       </w:r>
       <w:bookmarkEnd w:id="39"/>
@@ -20105,16 +20625,10 @@
         <w:t>n</w:t>
       </w:r>
       <w:r>
-        <w:t xml:space="preserve"> mostrado en pantalla en los distintos idiomas declarados en la cabecera del archivo de control</w:t>
-      </w:r>
-      <w:r>
-        <w:t xml:space="preserve">. </w:t>
-      </w:r>
-      <w:r>
-        <w:t xml:space="preserve">En caso de necesitar añadir más idiomas es tan sencillo como </w:t>
-      </w:r>
-      <w:r>
-        <w:t xml:space="preserve">añadir una columna adicional y escribir en la cabecera el nombre del idioma. Cabe destacar que para que funcione correctamente el idioma debe estar definido en el archivo </w:t>
+        <w:t xml:space="preserve"> mostrado en pantalla en los distintos idiomas declarados en la cabecera del archivo de </w:t>
+      </w:r>
+      <w:r>
+        <w:t xml:space="preserve">configuración </w:t>
       </w:r>
       <w:r>
         <w:rPr>
@@ -20124,13 +20638,83 @@
         <w:t>config.csv</w:t>
       </w:r>
       <w:r>
-        <w:t>. Además de habilitar en los menús, la selección del idioma respectivo.</w:t>
+        <w:t xml:space="preserve">. </w:t>
+      </w:r>
+      <w:r>
+        <w:t xml:space="preserve">En caso de necesitar añadir más idiomas es tan sencillo como </w:t>
+      </w:r>
+      <w:r>
+        <w:t xml:space="preserve">añadir una columna adicional y escribir en la cabecera el nombre del idioma. </w:t>
+      </w:r>
+    </w:p>
+    <w:p>
+      <w:pPr>
+        <w:ind w:firstLine="708"/>
+        <w:rPr>
+          <w:i/>
+          <w:iCs/>
+        </w:rPr>
+      </w:pPr>
+      <w:r>
+        <w:t xml:space="preserve">En caso de que agregues un nuevo idioma, no olvides generar la traducción utilizando el </w:t>
+      </w:r>
+      <w:proofErr w:type="spellStart"/>
+      <w:r>
+        <w:t>launcher</w:t>
+      </w:r>
+      <w:proofErr w:type="spellEnd"/>
+      <w:r>
+        <w:t xml:space="preserve"> de </w:t>
+      </w:r>
+      <w:proofErr w:type="spellStart"/>
+      <w:r>
+        <w:t>Renpy</w:t>
+      </w:r>
+      <w:proofErr w:type="spellEnd"/>
+      <w:r>
+        <w:t xml:space="preserve">, a la vez que agregar el idioma en la pantalla de configuración de </w:t>
+      </w:r>
+      <w:proofErr w:type="spellStart"/>
+      <w:r>
+        <w:rPr>
+          <w:i/>
+          <w:iCs/>
+        </w:rPr>
+        <w:t>screens.rpy</w:t>
+      </w:r>
+      <w:proofErr w:type="spellEnd"/>
+      <w:r>
+        <w:rPr>
+          <w:i/>
+          <w:iCs/>
+        </w:rPr>
+        <w:t>.</w:t>
       </w:r>
     </w:p>
     <w:p>
       <w:r>
         <w:tab/>
-        <w:t>El límite de palabras que puede contener una caja de texto es de aproximadamente 2539 pixeles. Es decir, si escribimos lo siguiente.</w:t>
+        <w:t>El límite de palabras que puede contener una caja de texto</w:t>
+      </w:r>
+      <w:r>
+        <w:t xml:space="preserve"> puede depender de la fuente, su tamaño y </w:t>
+      </w:r>
+      <w:proofErr w:type="spellStart"/>
+      <w:r>
+        <w:t>el</w:t>
+      </w:r>
+      <w:proofErr w:type="spellEnd"/>
+      <w:r>
+        <w:t xml:space="preserve"> tamaño de la caja de texto.</w:t>
+      </w:r>
+      <w:r>
+        <w:t xml:space="preserve"> </w:t>
+      </w:r>
+      <w:r>
+        <w:t xml:space="preserve">Un límite aproximado es </w:t>
+      </w:r>
+      <w:r>
+        <w:t>2539 pixeles. Es decir, si escribimos lo siguiente.</w:t>
       </w:r>
     </w:p>
     <w:p>
@@ -20138,127 +20722,243 @@
         <w:ind w:left="708"/>
       </w:pPr>
       <w:r>
-        <w:t xml:space="preserve">"No </w:t>
-      </w:r>
-      <w:proofErr w:type="spellStart"/>
-      <w:r>
+        <w:rPr>
+          <w:i/>
+          <w:iCs/>
+        </w:rPr>
+        <w:t xml:space="preserve">No </w:t>
+      </w:r>
+      <w:proofErr w:type="spellStart"/>
+      <w:r>
+        <w:rPr>
+          <w:i/>
+          <w:iCs/>
+        </w:rPr>
         <w:t>se</w:t>
       </w:r>
       <w:proofErr w:type="spellEnd"/>
       <w:r>
+        <w:rPr>
+          <w:i/>
+          <w:iCs/>
+        </w:rPr>
         <w:t xml:space="preserve"> </w:t>
       </w:r>
       <w:proofErr w:type="spellStart"/>
       <w:r>
+        <w:rPr>
+          <w:i/>
+          <w:iCs/>
+        </w:rPr>
         <w:t>que</w:t>
       </w:r>
       <w:proofErr w:type="spellEnd"/>
       <w:r>
+        <w:rPr>
+          <w:i/>
+          <w:iCs/>
+        </w:rPr>
         <w:t xml:space="preserve"> hora o que día es hoy, creo que es miércoles en la </w:t>
       </w:r>
       <w:proofErr w:type="spellStart"/>
       <w:proofErr w:type="gramStart"/>
       <w:r>
+        <w:rPr>
+          <w:i/>
+          <w:iCs/>
+        </w:rPr>
         <w:t>tarde.No</w:t>
       </w:r>
       <w:proofErr w:type="spellEnd"/>
       <w:proofErr w:type="gramEnd"/>
       <w:r>
+        <w:rPr>
+          <w:i/>
+          <w:iCs/>
+        </w:rPr>
         <w:t xml:space="preserve"> </w:t>
       </w:r>
       <w:proofErr w:type="spellStart"/>
       <w:r>
+        <w:rPr>
+          <w:i/>
+          <w:iCs/>
+        </w:rPr>
         <w:t>se</w:t>
       </w:r>
       <w:proofErr w:type="spellEnd"/>
       <w:r>
+        <w:rPr>
+          <w:i/>
+          <w:iCs/>
+        </w:rPr>
         <w:t xml:space="preserve"> </w:t>
       </w:r>
       <w:proofErr w:type="spellStart"/>
       <w:r>
+        <w:rPr>
+          <w:i/>
+          <w:iCs/>
+        </w:rPr>
         <w:t>que</w:t>
       </w:r>
       <w:proofErr w:type="spellEnd"/>
       <w:r>
+        <w:rPr>
+          <w:i/>
+          <w:iCs/>
+        </w:rPr>
         <w:t xml:space="preserve"> hora o que día es hoy, creo que es miércoles en la </w:t>
       </w:r>
       <w:proofErr w:type="spellStart"/>
       <w:proofErr w:type="gramStart"/>
       <w:r>
+        <w:rPr>
+          <w:i/>
+          <w:iCs/>
+        </w:rPr>
         <w:t>tarde.No</w:t>
       </w:r>
       <w:proofErr w:type="spellEnd"/>
       <w:proofErr w:type="gramEnd"/>
       <w:r>
+        <w:rPr>
+          <w:i/>
+          <w:iCs/>
+        </w:rPr>
         <w:t xml:space="preserve"> </w:t>
       </w:r>
       <w:proofErr w:type="spellStart"/>
       <w:r>
+        <w:rPr>
+          <w:i/>
+          <w:iCs/>
+        </w:rPr>
         <w:t>se</w:t>
       </w:r>
       <w:proofErr w:type="spellEnd"/>
       <w:r>
+        <w:rPr>
+          <w:i/>
+          <w:iCs/>
+        </w:rPr>
         <w:t xml:space="preserve"> </w:t>
       </w:r>
       <w:proofErr w:type="spellStart"/>
       <w:r>
+        <w:rPr>
+          <w:i/>
+          <w:iCs/>
+        </w:rPr>
         <w:t>que</w:t>
       </w:r>
       <w:proofErr w:type="spellEnd"/>
       <w:r>
+        <w:rPr>
+          <w:i/>
+          <w:iCs/>
+        </w:rPr>
         <w:t xml:space="preserve"> hora o que día es hoy, creo que es miércoles en la </w:t>
       </w:r>
       <w:proofErr w:type="spellStart"/>
       <w:proofErr w:type="gramStart"/>
       <w:r>
+        <w:rPr>
+          <w:i/>
+          <w:iCs/>
+        </w:rPr>
         <w:t>tarde.No</w:t>
       </w:r>
       <w:proofErr w:type="spellEnd"/>
       <w:proofErr w:type="gramEnd"/>
       <w:r>
+        <w:rPr>
+          <w:i/>
+          <w:iCs/>
+        </w:rPr>
         <w:t xml:space="preserve"> </w:t>
       </w:r>
       <w:proofErr w:type="spellStart"/>
       <w:r>
+        <w:rPr>
+          <w:i/>
+          <w:iCs/>
+        </w:rPr>
         <w:t>se</w:t>
       </w:r>
       <w:proofErr w:type="spellEnd"/>
       <w:r>
+        <w:rPr>
+          <w:i/>
+          <w:iCs/>
+        </w:rPr>
         <w:t xml:space="preserve"> </w:t>
       </w:r>
       <w:proofErr w:type="spellStart"/>
       <w:r>
+        <w:rPr>
+          <w:i/>
+          <w:iCs/>
+        </w:rPr>
         <w:t>que</w:t>
       </w:r>
       <w:proofErr w:type="spellEnd"/>
       <w:r>
+        <w:rPr>
+          <w:i/>
+          <w:iCs/>
+        </w:rPr>
         <w:t xml:space="preserve"> hora o que día es hoy, creo que es miércoles en la </w:t>
       </w:r>
       <w:proofErr w:type="spellStart"/>
       <w:proofErr w:type="gramStart"/>
       <w:r>
+        <w:rPr>
+          <w:i/>
+          <w:iCs/>
+        </w:rPr>
         <w:t>tarde.No</w:t>
       </w:r>
       <w:proofErr w:type="spellEnd"/>
       <w:proofErr w:type="gramEnd"/>
       <w:r>
+        <w:rPr>
+          <w:i/>
+          <w:iCs/>
+        </w:rPr>
         <w:t xml:space="preserve"> </w:t>
       </w:r>
       <w:proofErr w:type="spellStart"/>
       <w:r>
+        <w:rPr>
+          <w:i/>
+          <w:iCs/>
+        </w:rPr>
         <w:t>se</w:t>
       </w:r>
       <w:proofErr w:type="spellEnd"/>
       <w:r>
+        <w:rPr>
+          <w:i/>
+          <w:iCs/>
+        </w:rPr>
         <w:t xml:space="preserve"> </w:t>
       </w:r>
       <w:proofErr w:type="spellStart"/>
       <w:r>
+        <w:rPr>
+          <w:i/>
+          <w:iCs/>
+        </w:rPr>
         <w:t>que</w:t>
       </w:r>
       <w:proofErr w:type="spellEnd"/>
       <w:r>
-        <w:t xml:space="preserve"> hora o que día es hoy, creo que es miércoles en la"</w:t>
+        <w:rPr>
+          <w:i/>
+          <w:iCs/>
+        </w:rPr>
+        <w:t xml:space="preserve"> hora o que día es hoy, creo que es miércoles en la</w:t>
       </w:r>
     </w:p>
     <w:p>
@@ -20282,7 +20982,7 @@
       <w:r>
         <w:t xml:space="preserve">ntos pixeles tiene tu diálogo puedes utilizar el siguiente sitio web: </w:t>
       </w:r>
-      <w:hyperlink r:id="rId43" w:history="1">
+      <w:hyperlink r:id="rId45" w:history="1">
         <w:r>
           <w:rPr>
             <w:rStyle w:val="Hipervnculo"/>
@@ -20290,6 +20990,9 @@
           <w:t>https://webutility.io/pixel-width-calculator</w:t>
         </w:r>
       </w:hyperlink>
+      <w:r>
+        <w:t xml:space="preserve"> siempre es importante saber con precisión el límite de caracteres de tu novela y tenerlo presente.</w:t>
+      </w:r>
     </w:p>
     <w:p>
       <w:pPr>
@@ -20297,6 +21000,10 @@
       </w:pPr>
       <w:proofErr w:type="spellStart"/>
       <w:r>
+        <w:rPr>
+          <w:b/>
+          <w:bCs/>
+        </w:rPr>
         <w:t>Renpy</w:t>
       </w:r>
       <w:proofErr w:type="spellEnd"/>
@@ -20311,13 +21018,17 @@
       </w:r>
       <w:proofErr w:type="spellStart"/>
       <w:r>
+        <w:rPr>
+          <w:b/>
+          <w:bCs/>
+        </w:rPr>
         <w:t>Renpy</w:t>
       </w:r>
       <w:proofErr w:type="spellEnd"/>
       <w:r>
         <w:t xml:space="preserve"> para intentar implementarlos. </w:t>
       </w:r>
-      <w:hyperlink r:id="rId44" w:anchor="text-tag-alpha" w:history="1">
+      <w:hyperlink r:id="rId46" w:anchor="text-tag-alpha" w:history="1">
         <w:r>
           <w:rPr>
             <w:rStyle w:val="Hipervnculo"/>
@@ -20334,13 +21045,11 @@
         <w:ind w:firstLine="708"/>
       </w:pPr>
       <w:r>
-        <w:t xml:space="preserve">Dependiendo de la fuente que utilices en tu proyecto, es posible que ciertos caracteres no se muestren, por </w:t>
-      </w:r>
-      <w:proofErr w:type="gramStart"/>
-      <w:r>
-        <w:t>ejemplo</w:t>
-      </w:r>
-      <w:proofErr w:type="gramEnd"/>
+        <w:t>Dependiendo de la fuente que utilices en tu proyecto, es posible que ciertos caracteres no se muestren, por ejemplo</w:t>
+      </w:r>
+      <w:r>
+        <w:t>,</w:t>
+      </w:r>
       <w:r>
         <w:t xml:space="preserve"> el carácter “</w:t>
       </w:r>
@@ -20356,13 +21065,14 @@
       </w:r>
       <w:proofErr w:type="spellEnd"/>
       <w:r>
-        <w:t>” y en su lugar se mostrará un carácter extraño. En esos casos tendrás que usar obligatoriamente un modificador de texto especificando una fuente la cual sí que cuente con el carácter necesitado.</w:t>
-      </w:r>
-    </w:p>
-    <w:p>
-      <w:pPr>
-        <w:ind w:firstLine="708"/>
-      </w:pPr>
+        <w:t xml:space="preserve">” y en su lugar se mostrará un carácter extraño. En esos casos tendrás que usar obligatoriamente un modificador de texto especificando una fuente la cual sí que </w:t>
+      </w:r>
+      <w:r>
+        <w:t xml:space="preserve">posea </w:t>
+      </w:r>
+      <w:r>
+        <w:t>el carácter necesitado.</w:t>
+      </w:r>
     </w:p>
     <w:p>
       <w:pPr>
@@ -20370,54 +21080,28 @@
         <w:rPr>
           <w:i/>
           <w:iCs/>
-        </w:rPr>
-      </w:pPr>
-      <w:r>
-        <w:rPr>
-          <w:i/>
-          <w:iCs/>
-        </w:rPr>
-        <w:t xml:space="preserve">Mostrando el diálogo “Ahora a bailar </w:t>
-      </w:r>
-      <w:proofErr w:type="spellStart"/>
-      <w:r>
-        <w:rPr>
-          <w:i/>
-          <w:iCs/>
-        </w:rPr>
-        <w:t>wuuuu</w:t>
-      </w:r>
-      <w:proofErr w:type="spellEnd"/>
-      <w:r>
-        <w:rPr>
-          <w:i/>
-          <w:iCs/>
-        </w:rPr>
-        <w:t xml:space="preserve"> </w:t>
-      </w:r>
-      <w:r>
-        <w:t>♪♪♪♪</w:t>
-      </w:r>
-      <w:r>
-        <w:rPr>
-          <w:i/>
-          <w:iCs/>
-        </w:rPr>
-        <w:t>”</w:t>
-      </w:r>
-    </w:p>
-    <w:p>
-      <w:pPr>
-        <w:ind w:firstLine="708"/>
+          <w:sz w:val="20"/>
+          <w:szCs w:val="20"/>
+        </w:rPr>
       </w:pPr>
       <w:r>
         <w:rPr>
           <w:noProof/>
+          <w:sz w:val="20"/>
+          <w:szCs w:val="20"/>
         </w:rPr>
         <w:drawing>
-          <wp:inline distT="0" distB="0" distL="0" distR="0" wp14:anchorId="51FFCB40" wp14:editId="5D252EBD">
+          <wp:anchor distT="0" distB="0" distL="114300" distR="114300" simplePos="0" relativeHeight="251696128" behindDoc="0" locked="0" layoutInCell="1" allowOverlap="1" wp14:anchorId="51FFCB40" wp14:editId="1568B3F6">
+            <wp:simplePos x="0" y="0"/>
+            <wp:positionH relativeFrom="margin">
+              <wp:posOffset>226695</wp:posOffset>
+            </wp:positionH>
+            <wp:positionV relativeFrom="margin">
+              <wp:posOffset>7654925</wp:posOffset>
+            </wp:positionV>
             <wp:extent cx="4267200" cy="771525"/>
             <wp:effectExtent l="0" t="0" r="0" b="9525"/>
+            <wp:wrapSquare wrapText="bothSides"/>
             <wp:docPr id="1468955270" name="Imagen 1"/>
             <wp:cNvGraphicFramePr>
               <a:graphicFrameLocks xmlns:a="http://schemas.openxmlformats.org/drawingml/2006/main" noChangeAspect="1"/>
@@ -20430,7 +21114,13 @@
                     <pic:cNvPicPr/>
                   </pic:nvPicPr>
                   <pic:blipFill>
-                    <a:blip r:embed="rId45"/>
+                    <a:blip r:embed="rId47">
+                      <a:extLst>
+                        <a:ext uri="{28A0092B-C50C-407E-A947-70E740481C1C}">
+                          <a14:useLocalDpi xmlns:a14="http://schemas.microsoft.com/office/drawing/2010/main" val="0"/>
+                        </a:ext>
+                      </a:extLst>
+                    </a:blip>
                     <a:stretch>
                       <a:fillRect/>
                     </a:stretch>
@@ -20447,9 +21137,69 @@
                 </pic:pic>
               </a:graphicData>
             </a:graphic>
-          </wp:inline>
+          </wp:anchor>
         </w:drawing>
       </w:r>
+      <w:r>
+        <w:rPr>
+          <w:i/>
+          <w:iCs/>
+          <w:sz w:val="20"/>
+          <w:szCs w:val="20"/>
+        </w:rPr>
+        <w:t xml:space="preserve">Mostrando el diálogo “Ahora a bailar </w:t>
+      </w:r>
+      <w:proofErr w:type="spellStart"/>
+      <w:r>
+        <w:rPr>
+          <w:i/>
+          <w:iCs/>
+          <w:sz w:val="20"/>
+          <w:szCs w:val="20"/>
+        </w:rPr>
+        <w:t>wuuuu</w:t>
+      </w:r>
+      <w:proofErr w:type="spellEnd"/>
+      <w:r>
+        <w:rPr>
+          <w:i/>
+          <w:iCs/>
+          <w:sz w:val="20"/>
+          <w:szCs w:val="20"/>
+        </w:rPr>
+        <w:t xml:space="preserve"> </w:t>
+      </w:r>
+      <w:r>
+        <w:rPr>
+          <w:sz w:val="20"/>
+          <w:szCs w:val="20"/>
+        </w:rPr>
+        <w:t>♪♪♪♪</w:t>
+      </w:r>
+      <w:r>
+        <w:rPr>
+          <w:i/>
+          <w:iCs/>
+          <w:sz w:val="20"/>
+          <w:szCs w:val="20"/>
+        </w:rPr>
+        <w:t>”</w:t>
+      </w:r>
+    </w:p>
+    <w:p>
+      <w:pPr>
+        <w:ind w:firstLine="708"/>
+      </w:pPr>
+    </w:p>
+    <w:p>
+      <w:pPr>
+        <w:ind w:firstLine="708"/>
+      </w:pPr>
+    </w:p>
+    <w:p>
+      <w:pPr>
+        <w:ind w:firstLine="708"/>
+      </w:pPr>
     </w:p>
     <w:p>
       <w:pPr>
@@ -20519,113 +21269,26 @@
         <w:rPr>
           <w:i/>
           <w:iCs/>
-        </w:rPr>
-      </w:pPr>
-      <w:r>
-        <w:rPr>
-          <w:i/>
-          <w:iCs/>
-        </w:rPr>
-        <w:t>Mostrando el diálogo “</w:t>
-      </w:r>
-      <w:r>
-        <w:rPr>
-          <w:i/>
-          <w:iCs/>
-        </w:rPr>
-        <w:t xml:space="preserve">Ahora a bailar </w:t>
-      </w:r>
-      <w:proofErr w:type="spellStart"/>
-      <w:r>
-        <w:rPr>
-          <w:i/>
-          <w:iCs/>
-        </w:rPr>
-        <w:t>wuuuu</w:t>
-      </w:r>
-      <w:proofErr w:type="spellEnd"/>
-      <w:r>
-        <w:rPr>
-          <w:i/>
-          <w:iCs/>
-        </w:rPr>
-        <w:t xml:space="preserve"> </w:t>
-      </w:r>
-      <w:r>
-        <w:rPr>
-          <w:i/>
-          <w:iCs/>
-        </w:rPr>
-        <w:t>{</w:t>
-      </w:r>
-      <w:proofErr w:type="spellStart"/>
-      <w:r>
-        <w:rPr>
-          <w:i/>
-          <w:iCs/>
-        </w:rPr>
-        <w:t>font</w:t>
-      </w:r>
-      <w:proofErr w:type="spellEnd"/>
-      <w:r>
-        <w:rPr>
-          <w:i/>
-          <w:iCs/>
-        </w:rPr>
-        <w:t>=</w:t>
-      </w:r>
-      <w:proofErr w:type="gramStart"/>
-      <w:r>
-        <w:rPr>
-          <w:i/>
-          <w:iCs/>
-        </w:rPr>
-        <w:t>DejaVuSans.ttf}♪</w:t>
-      </w:r>
-      <w:proofErr w:type="gramEnd"/>
-      <w:r>
-        <w:rPr>
-          <w:i/>
-          <w:iCs/>
-        </w:rPr>
-        <w:t>♪♪{/</w:t>
-      </w:r>
-      <w:proofErr w:type="spellStart"/>
-      <w:r>
-        <w:rPr>
-          <w:i/>
-          <w:iCs/>
-        </w:rPr>
-        <w:t>font</w:t>
-      </w:r>
-      <w:proofErr w:type="spellEnd"/>
-      <w:r>
-        <w:rPr>
-          <w:i/>
-          <w:iCs/>
-        </w:rPr>
-        <w:t>}</w:t>
-      </w:r>
-      <w:r>
-        <w:rPr>
-          <w:i/>
-          <w:iCs/>
-        </w:rPr>
-        <w:t>”</w:t>
-      </w:r>
-    </w:p>
-    <w:p>
-      <w:pPr>
-        <w:ind w:firstLine="708"/>
+          <w:sz w:val="20"/>
+          <w:szCs w:val="20"/>
+        </w:rPr>
       </w:pPr>
       <w:r>
         <w:rPr>
           <w:noProof/>
         </w:rPr>
         <w:drawing>
-          <wp:inline distT="0" distB="0" distL="0" distR="0" wp14:anchorId="39374C6B" wp14:editId="3997D87C">
+          <wp:anchor distT="0" distB="0" distL="114300" distR="114300" simplePos="0" relativeHeight="251697152" behindDoc="0" locked="0" layoutInCell="1" allowOverlap="1" wp14:anchorId="39374C6B" wp14:editId="3DE823C7">
+            <wp:simplePos x="0" y="0"/>
+            <wp:positionH relativeFrom="margin">
+              <wp:posOffset>181981</wp:posOffset>
+            </wp:positionH>
+            <wp:positionV relativeFrom="margin">
+              <wp:posOffset>1400175</wp:posOffset>
+            </wp:positionV>
             <wp:extent cx="4400550" cy="733425"/>
             <wp:effectExtent l="0" t="0" r="0" b="9525"/>
+            <wp:wrapSquare wrapText="bothSides"/>
             <wp:docPr id="1855658548" name="Imagen 1"/>
             <wp:cNvGraphicFramePr>
               <a:graphicFrameLocks xmlns:a="http://schemas.openxmlformats.org/drawingml/2006/main" noChangeAspect="1"/>
@@ -20638,7 +21301,13 @@
                     <pic:cNvPicPr/>
                   </pic:nvPicPr>
                   <pic:blipFill>
-                    <a:blip r:embed="rId46"/>
+                    <a:blip r:embed="rId48">
+                      <a:extLst>
+                        <a:ext uri="{28A0092B-C50C-407E-A947-70E740481C1C}">
+                          <a14:useLocalDpi xmlns:a14="http://schemas.microsoft.com/office/drawing/2010/main" val="0"/>
+                        </a:ext>
+                      </a:extLst>
+                    </a:blip>
                     <a:stretch>
                       <a:fillRect/>
                     </a:stretch>
@@ -20646,7 +21315,7 @@
                   <pic:spPr>
                     <a:xfrm>
                       <a:off x="0" y="0"/>
-                      <a:ext cx="4422468" cy="737078"/>
+                      <a:ext cx="4400550" cy="733425"/>
                     </a:xfrm>
                     <a:prstGeom prst="rect">
                       <a:avLst/>
@@ -20655,9 +21324,107 @@
                 </pic:pic>
               </a:graphicData>
             </a:graphic>
-          </wp:inline>
+          </wp:anchor>
         </w:drawing>
       </w:r>
+      <w:r>
+        <w:rPr>
+          <w:i/>
+          <w:iCs/>
+          <w:sz w:val="20"/>
+          <w:szCs w:val="20"/>
+        </w:rPr>
+        <w:t xml:space="preserve">Mostrando el diálogo “Ahora a bailar </w:t>
+      </w:r>
+      <w:proofErr w:type="spellStart"/>
+      <w:r>
+        <w:rPr>
+          <w:i/>
+          <w:iCs/>
+          <w:sz w:val="20"/>
+          <w:szCs w:val="20"/>
+        </w:rPr>
+        <w:t>wuuuu</w:t>
+      </w:r>
+      <w:proofErr w:type="spellEnd"/>
+      <w:r>
+        <w:rPr>
+          <w:i/>
+          <w:iCs/>
+          <w:sz w:val="20"/>
+          <w:szCs w:val="20"/>
+        </w:rPr>
+        <w:t xml:space="preserve"> </w:t>
+      </w:r>
+      <w:r>
+        <w:rPr>
+          <w:i/>
+          <w:iCs/>
+          <w:sz w:val="20"/>
+          <w:szCs w:val="20"/>
+        </w:rPr>
+        <w:t>{</w:t>
+      </w:r>
+      <w:proofErr w:type="spellStart"/>
+      <w:r>
+        <w:rPr>
+          <w:i/>
+          <w:iCs/>
+          <w:sz w:val="20"/>
+          <w:szCs w:val="20"/>
+        </w:rPr>
+        <w:t>font</w:t>
+      </w:r>
+      <w:proofErr w:type="spellEnd"/>
+      <w:r>
+        <w:rPr>
+          <w:i/>
+          <w:iCs/>
+          <w:sz w:val="20"/>
+          <w:szCs w:val="20"/>
+        </w:rPr>
+        <w:t>=</w:t>
+      </w:r>
+      <w:proofErr w:type="gramStart"/>
+      <w:r>
+        <w:rPr>
+          <w:i/>
+          <w:iCs/>
+          <w:sz w:val="20"/>
+          <w:szCs w:val="20"/>
+        </w:rPr>
+        <w:t>DejaVuSans.ttf}♪</w:t>
+      </w:r>
+      <w:proofErr w:type="gramEnd"/>
+      <w:r>
+        <w:rPr>
+          <w:i/>
+          <w:iCs/>
+          <w:sz w:val="20"/>
+          <w:szCs w:val="20"/>
+        </w:rPr>
+        <w:t>♪♪{/</w:t>
+      </w:r>
+      <w:proofErr w:type="spellStart"/>
+      <w:r>
+        <w:rPr>
+          <w:i/>
+          <w:iCs/>
+          <w:sz w:val="20"/>
+          <w:szCs w:val="20"/>
+        </w:rPr>
+        <w:t>font</w:t>
+      </w:r>
+      <w:proofErr w:type="spellEnd"/>
+      <w:r>
+        <w:rPr>
+          <w:i/>
+          <w:iCs/>
+          <w:sz w:val="20"/>
+          <w:szCs w:val="20"/>
+        </w:rPr>
+        <w:t>}”</w:t>
+      </w:r>
     </w:p>
     <w:p>
       <w:pPr>
@@ -20676,6 +21443,11 @@
     </w:p>
     <w:p>
       <w:pPr>
+        <w:ind w:firstLine="708"/>
+      </w:pPr>
+    </w:p>
+    <w:p>
+      <w:pPr>
         <w:pStyle w:val="Ttulo2"/>
       </w:pPr>
       <w:bookmarkStart w:id="40" w:name="_Toc227172415"/>
@@ -20690,14 +21462,26 @@
       </w:r>
       <w:proofErr w:type="spellStart"/>
       <w:r>
+        <w:rPr>
+          <w:b/>
+          <w:bCs/>
+        </w:rPr>
         <w:t>Atlax</w:t>
       </w:r>
       <w:proofErr w:type="spellEnd"/>
       <w:r>
+        <w:rPr>
+          <w:b/>
+          <w:bCs/>
+        </w:rPr>
         <w:t xml:space="preserve"> </w:t>
       </w:r>
       <w:proofErr w:type="spellStart"/>
       <w:r>
+        <w:rPr>
+          <w:b/>
+          <w:bCs/>
+        </w:rPr>
         <w:t>Renpy</w:t>
       </w:r>
       <w:proofErr w:type="spellEnd"/>
@@ -20803,6 +21587,12 @@
     </w:p>
     <w:p>
       <w:pPr>
+        <w:pStyle w:val="Prrafodelista"/>
+        <w:ind w:left="1428"/>
+      </w:pPr>
+    </w:p>
+    <w:p>
+      <w:pPr>
         <w:pStyle w:val="Ttulo2"/>
       </w:pPr>
       <w:bookmarkStart w:id="41" w:name="_Toc227172416"/>
@@ -20816,6 +21606,12 @@
         <w:t>escena</w:t>
       </w:r>
       <w:bookmarkEnd w:id="41"/>
+    </w:p>
+    <w:p>
+      <w:r>
+        <w:tab/>
+        <w:t>Una vez hayamos terminado la escena, es decir, el archivo de control hay que darle un final, este final puede ser lineal, una decisión, una consecuencia o un script personalizado.</w:t>
+      </w:r>
     </w:p>
     <w:p>
       <w:r>
@@ -20826,13 +21622,39 @@
         <w:t>finalización</w:t>
       </w:r>
       <w:r>
-        <w:t xml:space="preserve"> de escena describe la manera en que la escena va a terminar, define qué va a suceder cuando el archivo de control llegue a su fin. Para definir el final de una escena debemos empezar la </w:t>
-      </w:r>
-      <w:r>
-        <w:t>línea de texto</w:t>
-      </w:r>
-      <w:r>
-        <w:t xml:space="preserve"> con un # y acto seguido describir el tipo de final que tendrá nuestra escena</w:t>
+        <w:t xml:space="preserve"> de escena describe la manera en que la escena va a terminar</w:t>
+      </w:r>
+      <w:r>
+        <w:t xml:space="preserve">. </w:t>
+      </w:r>
+      <w:r>
+        <w:t xml:space="preserve">Para definir el final de una escena debemos empezar </w:t>
+      </w:r>
+      <w:r>
+        <w:t xml:space="preserve">la columna </w:t>
+      </w:r>
+      <w:proofErr w:type="spellStart"/>
+      <w:r>
+        <w:t>key</w:t>
+      </w:r>
+      <w:proofErr w:type="spellEnd"/>
+      <w:r>
+        <w:t xml:space="preserve"> </w:t>
+      </w:r>
+      <w:r>
+        <w:t xml:space="preserve">con un </w:t>
+      </w:r>
+      <w:r>
+        <w:t>“</w:t>
+      </w:r>
+      <w:r>
+        <w:t>#</w:t>
+      </w:r>
+      <w:r>
+        <w:t>”</w:t>
+      </w:r>
+      <w:r>
+        <w:t xml:space="preserve"> y acto seguido describir el tipo de final que tendrá nuestra escena</w:t>
       </w:r>
       <w:r>
         <w:t xml:space="preserve"> con sus respectivos parámetros</w:t>
@@ -20989,10 +21811,25 @@
       </w:r>
       <w:proofErr w:type="gramStart"/>
       <w:r>
-        <w:t>La filas siguientes después</w:t>
+        <w:t>La</w:t>
+      </w:r>
+      <w:r>
+        <w:t xml:space="preserve"> </w:t>
+      </w:r>
+      <w:r>
+        <w:t>siguientes</w:t>
+      </w:r>
+      <w:r>
+        <w:t xml:space="preserve"> filas</w:t>
       </w:r>
       <w:proofErr w:type="gramEnd"/>
       <w:r>
+        <w:t xml:space="preserve"> </w:t>
+      </w:r>
+      <w:r>
+        <w:t>luego</w:t>
+      </w:r>
+      <w:r>
         <w:t xml:space="preserve"> de definir el tipo de </w:t>
       </w:r>
       <w:r>
@@ -21005,7 +21842,30 @@
         <w:t>finalización</w:t>
       </w:r>
       <w:r>
-        <w:t>, en este caso nombrados “</w:t>
+        <w:t>,</w:t>
+      </w:r>
+      <w:r>
+        <w:t xml:space="preserve"> si se tratase de una decisión, estos elementos serían las opciones posibles a </w:t>
+      </w:r>
+      <w:proofErr w:type="spellStart"/>
+      <w:r>
+        <w:t>esoger</w:t>
+      </w:r>
+      <w:proofErr w:type="spellEnd"/>
+      <w:r>
+        <w:t>.</w:t>
+      </w:r>
+    </w:p>
+    <w:p>
+      <w:pPr>
+        <w:ind w:firstLine="708"/>
+      </w:pPr>
+      <w:r>
+        <w:lastRenderedPageBreak/>
+        <w:t>E</w:t>
+      </w:r>
+      <w:r>
+        <w:t>n este caso nombrados “</w:t>
       </w:r>
       <w:r>
         <w:t>Key</w:t>
@@ -21036,11 +21896,7 @@
       </w:r>
       <w:proofErr w:type="gramEnd"/>
       <w:r>
-        <w:t xml:space="preserve"> </w:t>
-      </w:r>
-      <w:r>
-        <w:lastRenderedPageBreak/>
-        <w:t>un nombre único, exclusivo e irrepetible en toda la novela visual, ya que estos Key serán los que usará el motor para definir consecuencias.</w:t>
+        <w:t xml:space="preserve"> un nombre único, exclusivo e irrepetible en toda la novela visual, ya que estos Key serán los que usará el motor para definir consecuencias.</w:t>
       </w:r>
     </w:p>
     <w:p>
@@ -21067,12 +21923,6 @@
     <w:p>
       <w:pPr>
         <w:spacing w:after="0"/>
-        <w:ind w:firstLine="708"/>
-      </w:pPr>
-    </w:p>
-    <w:p>
-      <w:pPr>
-        <w:spacing w:after="0"/>
       </w:pPr>
     </w:p>
     <w:p>
@@ -21081,7 +21931,10 @@
       </w:pPr>
       <w:bookmarkStart w:id="42" w:name="_Toc227172417"/>
       <w:r>
-        <w:t>Lineal</w:t>
+        <w:t>Finalización l</w:t>
+      </w:r>
+      <w:r>
+        <w:t>ineal</w:t>
       </w:r>
       <w:bookmarkEnd w:id="42"/>
     </w:p>
@@ -21103,9 +21956,17 @@
           <w:noProof/>
         </w:rPr>
         <w:drawing>
-          <wp:inline distT="0" distB="0" distL="0" distR="0" wp14:anchorId="5B7426F9" wp14:editId="63DB19C4">
+          <wp:anchor distT="0" distB="0" distL="114300" distR="114300" simplePos="0" relativeHeight="251698176" behindDoc="0" locked="0" layoutInCell="1" allowOverlap="1" wp14:anchorId="5B7426F9" wp14:editId="5FAF7D84">
+            <wp:simplePos x="0" y="0"/>
+            <wp:positionH relativeFrom="margin">
+              <wp:align>right</wp:align>
+            </wp:positionH>
+            <wp:positionV relativeFrom="margin">
+              <wp:posOffset>3005455</wp:posOffset>
+            </wp:positionV>
             <wp:extent cx="5400040" cy="1024255"/>
             <wp:effectExtent l="0" t="0" r="0" b="4445"/>
+            <wp:wrapSquare wrapText="bothSides"/>
             <wp:docPr id="1381373383" name="Imagen 1"/>
             <wp:cNvGraphicFramePr>
               <a:graphicFrameLocks xmlns:a="http://schemas.openxmlformats.org/drawingml/2006/main" noChangeAspect="1"/>
@@ -21118,7 +21979,13 @@
                     <pic:cNvPicPr/>
                   </pic:nvPicPr>
                   <pic:blipFill>
-                    <a:blip r:embed="rId47"/>
+                    <a:blip r:embed="rId49">
+                      <a:extLst>
+                        <a:ext uri="{28A0092B-C50C-407E-A947-70E740481C1C}">
+                          <a14:useLocalDpi xmlns:a14="http://schemas.microsoft.com/office/drawing/2010/main" val="0"/>
+                        </a:ext>
+                      </a:extLst>
+                    </a:blip>
                     <a:stretch>
                       <a:fillRect/>
                     </a:stretch>
@@ -21135,14 +22002,27 @@
                 </pic:pic>
               </a:graphicData>
             </a:graphic>
-          </wp:inline>
+          </wp:anchor>
         </w:drawing>
       </w:r>
-    </w:p>
+      <w:r>
+        <w:rPr>
+          <w:i/>
+          <w:iCs/>
+          <w:sz w:val="20"/>
+          <w:szCs w:val="20"/>
+        </w:rPr>
+        <w:t>La escena A siempre llevará a la escena B</w:t>
+      </w:r>
+    </w:p>
+    <w:p/>
     <w:p>
       <w:r>
         <w:tab/>
-        <w:t>En este ejemplo podemos ver como la Escena A siempre conlleva a la Escena B. Si bien es cierto que podríamos escribir todo un capítulo dentro de una misma escena, lo recomendable es utilizar varias escenas y que cada una englobe un arco o situación dentro de la historia.</w:t>
+        <w:t xml:space="preserve">En este ejemplo podemos ver como la Escena A siempre conlleva a la Escena B. Si bien es cierto que podríamos </w:t>
+      </w:r>
+      <w:r>
+        <w:t>obviar este salto y escribir ambas escenas en un mismo archivo, lo recomendable es que cada escena englobe una situación para así facilitar su organización.</w:t>
       </w:r>
     </w:p>
     <w:p>
@@ -21152,17 +22032,30 @@
       </w:r>
     </w:p>
     <w:p>
-      <w:r>
-        <w:t xml:space="preserve">             </w:t>
-      </w:r>
+      <w:pPr>
+        <w:rPr>
+          <w:i/>
+          <w:iCs/>
+          <w:sz w:val="20"/>
+          <w:szCs w:val="20"/>
+        </w:rPr>
+      </w:pPr>
       <w:r>
         <w:rPr>
           <w:noProof/>
         </w:rPr>
         <w:drawing>
-          <wp:inline distT="0" distB="0" distL="0" distR="0" wp14:anchorId="66B3A939" wp14:editId="251F2D69">
-            <wp:extent cx="4600575" cy="2345190"/>
-            <wp:effectExtent l="0" t="0" r="0" b="0"/>
+          <wp:anchor distT="0" distB="0" distL="114300" distR="114300" simplePos="0" relativeHeight="251699200" behindDoc="0" locked="0" layoutInCell="1" allowOverlap="1" wp14:anchorId="66B3A939" wp14:editId="7123050D">
+            <wp:simplePos x="0" y="0"/>
+            <wp:positionH relativeFrom="margin">
+              <wp:align>center</wp:align>
+            </wp:positionH>
+            <wp:positionV relativeFrom="margin">
+              <wp:posOffset>5954953</wp:posOffset>
+            </wp:positionV>
+            <wp:extent cx="4600575" cy="2345055"/>
+            <wp:effectExtent l="0" t="0" r="9525" b="0"/>
+            <wp:wrapSquare wrapText="bothSides"/>
             <wp:docPr id="1504239939" name="Imagen 1"/>
             <wp:cNvGraphicFramePr>
               <a:graphicFrameLocks xmlns:a="http://schemas.openxmlformats.org/drawingml/2006/main" noChangeAspect="1"/>
@@ -21175,7 +22068,13 @@
                     <pic:cNvPicPr/>
                   </pic:nvPicPr>
                   <pic:blipFill>
-                    <a:blip r:embed="rId48"/>
+                    <a:blip r:embed="rId50">
+                      <a:extLst>
+                        <a:ext uri="{28A0092B-C50C-407E-A947-70E740481C1C}">
+                          <a14:useLocalDpi xmlns:a14="http://schemas.microsoft.com/office/drawing/2010/main" val="0"/>
+                        </a:ext>
+                      </a:extLst>
+                    </a:blip>
                     <a:stretch>
                       <a:fillRect/>
                     </a:stretch>
@@ -21183,7 +22082,7 @@
                   <pic:spPr>
                     <a:xfrm>
                       <a:off x="0" y="0"/>
-                      <a:ext cx="4606794" cy="2348360"/>
+                      <a:ext cx="4600575" cy="2345055"/>
                     </a:xfrm>
                     <a:prstGeom prst="rect">
                       <a:avLst/>
@@ -21192,12 +22091,34 @@
                 </pic:pic>
               </a:graphicData>
             </a:graphic>
-          </wp:inline>
+          </wp:anchor>
         </w:drawing>
       </w:r>
-    </w:p>
-    <w:p>
-      <w:r>
+      <w:r>
+        <w:rPr>
+          <w:i/>
+          <w:iCs/>
+          <w:sz w:val="20"/>
+          <w:szCs w:val="20"/>
+        </w:rPr>
+        <w:t>Las escenas A, B y C siempre conducen a la escena D</w:t>
+      </w:r>
+    </w:p>
+    <w:p>
+      <w:r>
+        <w:t xml:space="preserve">             </w:t>
+      </w:r>
+    </w:p>
+    <w:p/>
+    <w:p/>
+    <w:p/>
+    <w:p/>
+    <w:p/>
+    <w:p/>
+    <w:p/>
+    <w:p>
+      <w:r>
+        <w:lastRenderedPageBreak/>
         <w:tab/>
       </w:r>
       <w:r>
@@ -21227,7 +22148,6 @@
         <w:ind w:firstLine="708"/>
       </w:pPr>
       <w:r>
-        <w:lastRenderedPageBreak/>
         <w:t>La sintaxis de una escena que termina linealmente es la siguiente.</w:t>
       </w:r>
     </w:p>
@@ -21704,7 +22624,10 @@
       </w:pPr>
       <w:bookmarkStart w:id="43" w:name="_Toc227172418"/>
       <w:r>
-        <w:t>Decisión</w:t>
+        <w:t>Finalización con d</w:t>
+      </w:r>
+      <w:r>
+        <w:t>ecisión</w:t>
       </w:r>
       <w:bookmarkEnd w:id="43"/>
     </w:p>
@@ -21725,18 +22648,36 @@
         <w:t>frente</w:t>
       </w:r>
       <w:r>
-        <w:t xml:space="preserve"> el jugador una situación en la que deba tomar una decisión. Con las decisiones podemos dividir la historia en caminos distintos y además </w:t>
-      </w:r>
-      <w:proofErr w:type="spellStart"/>
-      <w:r>
+        <w:t xml:space="preserve"> el jugador una situación en la que deba </w:t>
+      </w:r>
+      <w:r>
+        <w:t>escoger una opción de varias mostradas en pantalla</w:t>
+      </w:r>
+      <w:r>
+        <w:t xml:space="preserve">. Con las decisiones podemos dividir la historia en caminos distintos y además </w:t>
+      </w:r>
+      <w:proofErr w:type="spellStart"/>
+      <w:r>
+        <w:rPr>
+          <w:b/>
+          <w:bCs/>
+        </w:rPr>
         <w:t>Atlax</w:t>
       </w:r>
       <w:proofErr w:type="spellEnd"/>
       <w:r>
+        <w:rPr>
+          <w:b/>
+          <w:bCs/>
+        </w:rPr>
         <w:t xml:space="preserve"> </w:t>
       </w:r>
       <w:proofErr w:type="spellStart"/>
       <w:r>
+        <w:rPr>
+          <w:b/>
+          <w:bCs/>
+        </w:rPr>
         <w:t>Renpy</w:t>
       </w:r>
       <w:proofErr w:type="spellEnd"/>
@@ -21878,29 +22819,36 @@
           <w:sz w:val="22"/>
           <w:szCs w:val="22"/>
         </w:rPr>
-        <w:t xml:space="preserve">; siguiente </w:t>
-      </w:r>
-      <w:proofErr w:type="gramStart"/>
+        <w:t xml:space="preserve"> </w:t>
+      </w:r>
       <w:r>
         <w:rPr>
           <w:sz w:val="22"/>
           <w:szCs w:val="22"/>
         </w:rPr>
-        <w:t>escena</w:t>
-      </w:r>
+        <w:t xml:space="preserve">; siguiente </w:t>
+      </w:r>
+      <w:proofErr w:type="gramStart"/>
       <w:r>
         <w:rPr>
           <w:sz w:val="22"/>
           <w:szCs w:val="22"/>
         </w:rPr>
-        <w:t xml:space="preserve"> ;</w:t>
-      </w:r>
-      <w:proofErr w:type="gramEnd"/>
+        <w:t>escena</w:t>
+      </w:r>
       <w:r>
         <w:rPr>
           <w:sz w:val="22"/>
           <w:szCs w:val="22"/>
         </w:rPr>
+        <w:t xml:space="preserve"> ;</w:t>
+      </w:r>
+      <w:proofErr w:type="gramEnd"/>
+      <w:r>
+        <w:rPr>
+          <w:sz w:val="22"/>
+          <w:szCs w:val="22"/>
+        </w:rPr>
         <w:t xml:space="preserve"> texto</w:t>
       </w:r>
     </w:p>
@@ -22020,6 +22968,7 @@
         <w:ind w:firstLine="708"/>
       </w:pPr>
       <w:r>
+        <w:lastRenderedPageBreak/>
         <w:t>Podemos hacer que cada opción de la decisión lleve a una escena distinta o que algunas de ellas lleven a la misma.</w:t>
       </w:r>
     </w:p>
@@ -22034,7 +22983,6 @@
         <w:spacing w:after="0"/>
       </w:pPr>
       <w:r>
-        <w:lastRenderedPageBreak/>
         <w:t xml:space="preserve">       </w:t>
       </w:r>
       <w:r>
@@ -22057,7 +23005,7 @@
                     <pic:cNvPicPr/>
                   </pic:nvPicPr>
                   <pic:blipFill>
-                    <a:blip r:embed="rId49"/>
+                    <a:blip r:embed="rId51"/>
                     <a:stretch>
                       <a:fillRect/>
                     </a:stretch>
@@ -22102,7 +23050,7 @@
                     <pic:cNvPicPr/>
                   </pic:nvPicPr>
                   <pic:blipFill>
-                    <a:blip r:embed="rId50"/>
+                    <a:blip r:embed="rId52"/>
                     <a:stretch>
                       <a:fillRect/>
                     </a:stretch>
@@ -22149,6 +23097,7 @@
     </w:p>
     <w:p>
       <w:r>
+        <w:lastRenderedPageBreak/>
         <w:t xml:space="preserve">            </w:t>
       </w:r>
       <w:r>
@@ -22171,7 +23120,7 @@
                     <pic:cNvPicPr/>
                   </pic:nvPicPr>
                   <pic:blipFill>
-                    <a:blip r:embed="rId51"/>
+                    <a:blip r:embed="rId53"/>
                     <a:stretch>
                       <a:fillRect/>
                     </a:stretch>
@@ -22194,7 +23143,6 @@
     </w:p>
     <w:p>
       <w:r>
-        <w:lastRenderedPageBreak/>
         <w:tab/>
         <w:t>Por supuesto que los puntos no son obligatorios, puedes dejarlo en blanco. El ejemplo anterior se escribiría así.</w:t>
       </w:r>
@@ -22744,6 +23692,7 @@
         <w:pStyle w:val="Ttulo4"/>
       </w:pPr>
       <w:r>
+        <w:lastRenderedPageBreak/>
         <w:t>Condición por puntos</w:t>
       </w:r>
     </w:p>
@@ -22768,7 +23717,7 @@
                     <pic:cNvPicPr/>
                   </pic:nvPicPr>
                   <pic:blipFill>
-                    <a:blip r:embed="rId52"/>
+                    <a:blip r:embed="rId54"/>
                     <a:stretch>
                       <a:fillRect/>
                     </a:stretch>
@@ -22794,7 +23743,6 @@
         <w:spacing w:after="0"/>
       </w:pPr>
       <w:r>
-        <w:lastRenderedPageBreak/>
         <w:tab/>
       </w:r>
       <w:r>
@@ -23256,6 +24204,7 @@
         <w:pStyle w:val="Ttulo4"/>
       </w:pPr>
       <w:r>
+        <w:lastRenderedPageBreak/>
         <w:t>Condición por decisión</w:t>
       </w:r>
     </w:p>
@@ -23289,7 +24238,7 @@
                     <pic:cNvPicPr/>
                   </pic:nvPicPr>
                   <pic:blipFill>
-                    <a:blip r:embed="rId53"/>
+                    <a:blip r:embed="rId55"/>
                     <a:stretch>
                       <a:fillRect/>
                     </a:stretch>
@@ -23315,7 +24264,6 @@
         <w:spacing w:after="0"/>
       </w:pPr>
       <w:r>
-        <w:lastRenderedPageBreak/>
         <w:tab/>
       </w:r>
       <w:r>
@@ -23613,7 +24561,7 @@
                     <pic:cNvPicPr/>
                   </pic:nvPicPr>
                   <pic:blipFill>
-                    <a:blip r:embed="rId54"/>
+                    <a:blip r:embed="rId56"/>
                     <a:stretch>
                       <a:fillRect/>
                     </a:stretch>
@@ -23636,6 +24584,7 @@
     </w:p>
     <w:p>
       <w:r>
+        <w:lastRenderedPageBreak/>
         <w:tab/>
         <w:t>Imaginemos que en nuestra historia hay un terremoto que siempre ocurre, solo que</w:t>
       </w:r>
@@ -23926,7 +24875,6 @@
         <w:ind w:firstLine="708"/>
       </w:pPr>
       <w:r>
-        <w:lastRenderedPageBreak/>
         <w:t xml:space="preserve">De esa forma, el juego verifica ¿El jugador pasó por la escena “earthquake_in_home.csv”? Entonces lo mandamos a la escena </w:t>
       </w:r>
       <w:proofErr w:type="spellStart"/>
@@ -24366,6 +25314,7 @@
         <w:ind w:firstLine="708"/>
       </w:pPr>
       <w:r>
+        <w:lastRenderedPageBreak/>
         <w:t>Suponiendo que hay 3 opciones posibles, ganar, perder y empatar, la sintaxis de la escena previa al juego de ajedrez sería la siguiente.</w:t>
       </w:r>
     </w:p>
@@ -24631,7 +25580,6 @@
         <w:rPr>
           <w:lang w:val="es-VE"/>
         </w:rPr>
-        <w:lastRenderedPageBreak/>
         <w:t xml:space="preserve">$ </w:t>
       </w:r>
       <w:proofErr w:type="spellStart"/>
@@ -24988,6 +25936,7 @@
         </w:numPr>
       </w:pPr>
       <w:r>
+        <w:lastRenderedPageBreak/>
         <w:t xml:space="preserve">Si </w:t>
       </w:r>
       <w:r>
@@ -25139,7 +26088,6 @@
       </w:pPr>
       <w:bookmarkStart w:id="46" w:name="_Toc227172421"/>
       <w:r>
-        <w:lastRenderedPageBreak/>
         <w:t>Créditos</w:t>
       </w:r>
       <w:bookmarkEnd w:id="46"/>
@@ -25825,7 +26773,6 @@
       </w:pPr>
       <w:bookmarkStart w:id="49" w:name="_Toc227172424"/>
       <w:r>
-        <w:lastRenderedPageBreak/>
         <w:t>Ejemplos</w:t>
       </w:r>
       <w:bookmarkEnd w:id="49"/>
@@ -25990,7 +26937,7 @@
                     <pic:cNvPicPr/>
                   </pic:nvPicPr>
                   <pic:blipFill>
-                    <a:blip r:embed="rId55"/>
+                    <a:blip r:embed="rId57"/>
                     <a:stretch>
                       <a:fillRect/>
                     </a:stretch>
@@ -26016,6 +26963,7 @@
         <w:ind w:firstLine="708"/>
       </w:pPr>
       <w:r>
+        <w:lastRenderedPageBreak/>
         <w:t xml:space="preserve">Si </w:t>
       </w:r>
       <w:proofErr w:type="spellStart"/>
@@ -26127,7 +27075,6 @@
         <w:rPr>
           <w:noProof/>
         </w:rPr>
-        <w:lastRenderedPageBreak/>
         <w:drawing>
           <wp:inline distT="0" distB="0" distL="0" distR="0" wp14:anchorId="5003A32F" wp14:editId="369824AE">
             <wp:extent cx="1571625" cy="1190625"/>
@@ -26144,7 +27091,7 @@
                     <pic:cNvPicPr/>
                   </pic:nvPicPr>
                   <pic:blipFill>
-                    <a:blip r:embed="rId56"/>
+                    <a:blip r:embed="rId58"/>
                     <a:stretch>
                       <a:fillRect/>
                     </a:stretch>
@@ -26339,6 +27286,7 @@
       <w:bookmarkStart w:id="51" w:name="_Toc227172426"/>
       <w:proofErr w:type="spellStart"/>
       <w:r>
+        <w:lastRenderedPageBreak/>
         <w:t>Testing</w:t>
       </w:r>
       <w:bookmarkEnd w:id="51"/>
@@ -26440,7 +27388,6 @@
         <w:rPr>
           <w:noProof/>
         </w:rPr>
-        <w:lastRenderedPageBreak/>
         <w:drawing>
           <wp:inline distT="0" distB="0" distL="0" distR="0" wp14:anchorId="630AE5CF" wp14:editId="1F56F786">
             <wp:extent cx="3651250" cy="409618"/>
@@ -26457,7 +27404,7 @@
                     <pic:cNvPicPr/>
                   </pic:nvPicPr>
                   <pic:blipFill>
-                    <a:blip r:embed="rId57"/>
+                    <a:blip r:embed="rId59"/>
                     <a:stretch>
                       <a:fillRect/>
                     </a:stretch>
@@ -26564,7 +27511,7 @@
                     <pic:cNvPicPr/>
                   </pic:nvPicPr>
                   <pic:blipFill>
-                    <a:blip r:embed="rId58">
+                    <a:blip r:embed="rId60">
                       <a:extLst>
                         <a:ext uri="{28A0092B-C50C-407E-A947-70E740481C1C}">
                           <a14:useLocalDpi xmlns:a14="http://schemas.microsoft.com/office/drawing/2010/main" val="0"/>
@@ -26877,7 +27824,11 @@
       </w:r>
       <w:proofErr w:type="spellEnd"/>
       <w:r>
-        <w:t xml:space="preserve">, agregar el nombre de la animación en la variable </w:t>
+        <w:t xml:space="preserve">, agregar el nombre de la </w:t>
+      </w:r>
+      <w:r>
+        <w:lastRenderedPageBreak/>
+        <w:t xml:space="preserve">animación en la variable </w:t>
       </w:r>
       <w:proofErr w:type="spellStart"/>
       <w:r>
@@ -27013,7 +27964,6 @@
       </w:pPr>
       <w:bookmarkStart w:id="53" w:name="_Toc227172428"/>
       <w:r>
-        <w:lastRenderedPageBreak/>
         <w:t>Instalación</w:t>
       </w:r>
       <w:bookmarkEnd w:id="53"/>
@@ -27148,7 +28098,11 @@
       </w:r>
       <w:proofErr w:type="spellEnd"/>
       <w:r>
-        <w:t xml:space="preserve"> más finales posibles, si el sistema de puntos y decisiones no se balancea de manera correcta, va a ocasionar que el juego sea extremadamente difícil teniendo que escoger decisiones específicas para no terminar expulsado.</w:t>
+        <w:t xml:space="preserve"> más finales posibles, si el sistema de puntos y decisiones no se balancea de manera correcta, va a ocasionar que </w:t>
+      </w:r>
+      <w:r>
+        <w:lastRenderedPageBreak/>
+        <w:t>el juego sea extremadamente difícil teniendo que escoger decisiones específicas para no terminar expulsado.</w:t>
       </w:r>
     </w:p>
     <w:p>
@@ -27192,7 +28146,6 @@
         <w:rPr>
           <w:noProof/>
         </w:rPr>
-        <w:lastRenderedPageBreak/>
         <w:drawing>
           <wp:anchor distT="0" distB="0" distL="114300" distR="114300" simplePos="0" relativeHeight="251671552" behindDoc="0" locked="0" layoutInCell="1" allowOverlap="1" wp14:anchorId="0ECDDFF2" wp14:editId="3F776A67">
             <wp:simplePos x="0" y="0"/>
@@ -27217,7 +28170,7 @@
                     <pic:cNvPicPr/>
                   </pic:nvPicPr>
                   <pic:blipFill>
-                    <a:blip r:embed="rId59">
+                    <a:blip r:embed="rId61">
                       <a:extLst>
                         <a:ext uri="{28A0092B-C50C-407E-A947-70E740481C1C}">
                           <a14:useLocalDpi xmlns:a14="http://schemas.microsoft.com/office/drawing/2010/main" val="0"/>
@@ -27395,7 +28348,7 @@
       <w:r>
         <w:t xml:space="preserve">mo usarla. </w:t>
       </w:r>
-      <w:hyperlink r:id="rId60" w:history="1">
+      <w:hyperlink r:id="rId62" w:history="1">
         <w:r>
           <w:rPr>
             <w:rStyle w:val="Hipervnculo"/>
@@ -27547,7 +28500,7 @@
       <w:r>
         <w:t xml:space="preserve">: </w:t>
       </w:r>
-      <w:hyperlink r:id="rId61" w:history="1">
+      <w:hyperlink r:id="rId63" w:history="1">
         <w:r>
           <w:rPr>
             <w:rStyle w:val="Hipervnculo"/>
@@ -27589,7 +28542,7 @@
       <w:r>
         <w:t xml:space="preserve">: </w:t>
       </w:r>
-      <w:hyperlink r:id="rId62" w:history="1">
+      <w:hyperlink r:id="rId64" w:history="1">
         <w:r>
           <w:rPr>
             <w:rStyle w:val="Hipervnculo"/>
@@ -27602,7 +28555,7 @@
       <w:r>
         <w:t xml:space="preserve">Códigos de colores hexadecimales: </w:t>
       </w:r>
-      <w:hyperlink r:id="rId63" w:history="1">
+      <w:hyperlink r:id="rId65" w:history="1">
         <w:r>
           <w:rPr>
             <w:rStyle w:val="Hipervnculo"/>
@@ -27618,7 +28571,7 @@
       <w:r>
         <w:t xml:space="preserve">Calculadora de ancho de pixeles de un texto: </w:t>
       </w:r>
-      <w:hyperlink r:id="rId64" w:history="1">
+      <w:hyperlink r:id="rId66" w:history="1">
         <w:r>
           <w:rPr>
             <w:rStyle w:val="Hipervnculo"/>
@@ -27639,7 +28592,7 @@
       <w:r>
         <w:t xml:space="preserve">: </w:t>
       </w:r>
-      <w:hyperlink r:id="rId65" w:anchor="text-tag-alpha" w:history="1">
+      <w:hyperlink r:id="rId67" w:anchor="text-tag-alpha" w:history="1">
         <w:r>
           <w:rPr>
             <w:rStyle w:val="Hipervnculo"/>
@@ -27650,9 +28603,10 @@
     </w:p>
     <w:p>
       <w:r>
+        <w:lastRenderedPageBreak/>
         <w:t xml:space="preserve">Sitio web de Atlantox: </w:t>
       </w:r>
-      <w:hyperlink r:id="rId66" w:history="1">
+      <w:hyperlink r:id="rId68" w:history="1">
         <w:r>
           <w:rPr>
             <w:rStyle w:val="Hipervnculo"/>
@@ -28769,6 +29723,95 @@
     </w:lvl>
   </w:abstractNum>
   <w:abstractNum w:abstractNumId="10" w15:restartNumberingAfterBreak="0">
+    <w:nsid w:val="2CB30798"/>
+    <w:multiLevelType w:val="hybridMultilevel"/>
+    <w:tmpl w:val="1A3E35CE"/>
+    <w:lvl w:ilvl="0" w:tplc="2A5ED40A">
+      <w:start w:val="1"/>
+      <w:numFmt w:val="decimal"/>
+      <w:lvlText w:val="%1-"/>
+      <w:lvlJc w:val="left"/>
+      <w:pPr>
+        <w:ind w:left="720" w:hanging="360"/>
+      </w:pPr>
+      <w:rPr>
+        <w:rFonts w:hint="default"/>
+      </w:rPr>
+    </w:lvl>
+    <w:lvl w:ilvl="1" w:tplc="200A0019" w:tentative="1">
+      <w:start w:val="1"/>
+      <w:numFmt w:val="lowerLetter"/>
+      <w:lvlText w:val="%2."/>
+      <w:lvlJc w:val="left"/>
+      <w:pPr>
+        <w:ind w:left="1440" w:hanging="360"/>
+      </w:pPr>
+    </w:lvl>
+    <w:lvl w:ilvl="2" w:tplc="200A001B" w:tentative="1">
+      <w:start w:val="1"/>
+      <w:numFmt w:val="lowerRoman"/>
+      <w:lvlText w:val="%3."/>
+      <w:lvlJc w:val="right"/>
+      <w:pPr>
+        <w:ind w:left="2160" w:hanging="180"/>
+      </w:pPr>
+    </w:lvl>
+    <w:lvl w:ilvl="3" w:tplc="200A000F" w:tentative="1">
+      <w:start w:val="1"/>
+      <w:numFmt w:val="decimal"/>
+      <w:lvlText w:val="%4."/>
+      <w:lvlJc w:val="left"/>
+      <w:pPr>
+        <w:ind w:left="2880" w:hanging="360"/>
+      </w:pPr>
+    </w:lvl>
+    <w:lvl w:ilvl="4" w:tplc="200A0019" w:tentative="1">
+      <w:start w:val="1"/>
+      <w:numFmt w:val="lowerLetter"/>
+      <w:lvlText w:val="%5."/>
+      <w:lvlJc w:val="left"/>
+      <w:pPr>
+        <w:ind w:left="3600" w:hanging="360"/>
+      </w:pPr>
+    </w:lvl>
+    <w:lvl w:ilvl="5" w:tplc="200A001B" w:tentative="1">
+      <w:start w:val="1"/>
+      <w:numFmt w:val="lowerRoman"/>
+      <w:lvlText w:val="%6."/>
+      <w:lvlJc w:val="right"/>
+      <w:pPr>
+        <w:ind w:left="4320" w:hanging="180"/>
+      </w:pPr>
+    </w:lvl>
+    <w:lvl w:ilvl="6" w:tplc="200A000F" w:tentative="1">
+      <w:start w:val="1"/>
+      <w:numFmt w:val="decimal"/>
+      <w:lvlText w:val="%7."/>
+      <w:lvlJc w:val="left"/>
+      <w:pPr>
+        <w:ind w:left="5040" w:hanging="360"/>
+      </w:pPr>
+    </w:lvl>
+    <w:lvl w:ilvl="7" w:tplc="200A0019" w:tentative="1">
+      <w:start w:val="1"/>
+      <w:numFmt w:val="lowerLetter"/>
+      <w:lvlText w:val="%8."/>
+      <w:lvlJc w:val="left"/>
+      <w:pPr>
+        <w:ind w:left="5760" w:hanging="360"/>
+      </w:pPr>
+    </w:lvl>
+    <w:lvl w:ilvl="8" w:tplc="200A001B" w:tentative="1">
+      <w:start w:val="1"/>
+      <w:numFmt w:val="lowerRoman"/>
+      <w:lvlText w:val="%9."/>
+      <w:lvlJc w:val="right"/>
+      <w:pPr>
+        <w:ind w:left="6480" w:hanging="180"/>
+      </w:pPr>
+    </w:lvl>
+  </w:abstractNum>
+  <w:abstractNum w:abstractNumId="11" w15:restartNumberingAfterBreak="0">
     <w:nsid w:val="34E74BA5"/>
     <w:multiLevelType w:val="hybridMultilevel"/>
     <w:tmpl w:val="6B0E7984"/>
@@ -28857,7 +29900,7 @@
       </w:pPr>
     </w:lvl>
   </w:abstractNum>
-  <w:abstractNum w:abstractNumId="11" w15:restartNumberingAfterBreak="0">
+  <w:abstractNum w:abstractNumId="12" w15:restartNumberingAfterBreak="0">
     <w:nsid w:val="35BB7E8F"/>
     <w:multiLevelType w:val="hybridMultilevel"/>
     <w:tmpl w:val="2DF213C2"/>
@@ -28970,7 +30013,7 @@
       </w:rPr>
     </w:lvl>
   </w:abstractNum>
-  <w:abstractNum w:abstractNumId="12" w15:restartNumberingAfterBreak="0">
+  <w:abstractNum w:abstractNumId="13" w15:restartNumberingAfterBreak="0">
     <w:nsid w:val="391A4D18"/>
     <w:multiLevelType w:val="hybridMultilevel"/>
     <w:tmpl w:val="BFCC90D6"/>
@@ -29056,7 +30099,7 @@
       </w:pPr>
     </w:lvl>
   </w:abstractNum>
-  <w:abstractNum w:abstractNumId="13" w15:restartNumberingAfterBreak="0">
+  <w:abstractNum w:abstractNumId="14" w15:restartNumberingAfterBreak="0">
     <w:nsid w:val="3A74320C"/>
     <w:multiLevelType w:val="hybridMultilevel"/>
     <w:tmpl w:val="6E88E228"/>
@@ -29169,7 +30212,7 @@
       </w:rPr>
     </w:lvl>
   </w:abstractNum>
-  <w:abstractNum w:abstractNumId="14" w15:restartNumberingAfterBreak="0">
+  <w:abstractNum w:abstractNumId="15" w15:restartNumberingAfterBreak="0">
     <w:nsid w:val="3D616461"/>
     <w:multiLevelType w:val="hybridMultilevel"/>
     <w:tmpl w:val="5E869988"/>
@@ -29282,7 +30325,7 @@
       </w:rPr>
     </w:lvl>
   </w:abstractNum>
-  <w:abstractNum w:abstractNumId="15" w15:restartNumberingAfterBreak="0">
+  <w:abstractNum w:abstractNumId="16" w15:restartNumberingAfterBreak="0">
     <w:nsid w:val="3DC26F13"/>
     <w:multiLevelType w:val="hybridMultilevel"/>
     <w:tmpl w:val="98323762"/>
@@ -29292,7 +30335,7 @@
       <w:lvlText w:val="%1."/>
       <w:lvlJc w:val="left"/>
       <w:pPr>
-        <w:ind w:left="1068" w:hanging="360"/>
+        <w:ind w:left="1428" w:hanging="360"/>
       </w:pPr>
       <w:rPr>
         <w:rFonts w:hint="default"/>
@@ -29304,7 +30347,7 @@
       <w:lvlText w:val="o"/>
       <w:lvlJc w:val="left"/>
       <w:pPr>
-        <w:ind w:left="1788" w:hanging="360"/>
+        <w:ind w:left="2148" w:hanging="360"/>
       </w:pPr>
       <w:rPr>
         <w:rFonts w:ascii="Courier New" w:hAnsi="Courier New" w:cs="Courier New" w:hint="default"/>
@@ -29316,7 +30359,7 @@
       <w:lvlText w:val=""/>
       <w:lvlJc w:val="left"/>
       <w:pPr>
-        <w:ind w:left="2508" w:hanging="360"/>
+        <w:ind w:left="2868" w:hanging="360"/>
       </w:pPr>
       <w:rPr>
         <w:rFonts w:ascii="Wingdings" w:hAnsi="Wingdings" w:hint="default"/>
@@ -29328,7 +30371,7 @@
       <w:lvlText w:val=""/>
       <w:lvlJc w:val="left"/>
       <w:pPr>
-        <w:ind w:left="3228" w:hanging="360"/>
+        <w:ind w:left="3588" w:hanging="360"/>
       </w:pPr>
       <w:rPr>
         <w:rFonts w:ascii="Symbol" w:hAnsi="Symbol" w:hint="default"/>
@@ -29340,7 +30383,7 @@
       <w:lvlText w:val="o"/>
       <w:lvlJc w:val="left"/>
       <w:pPr>
-        <w:ind w:left="3948" w:hanging="360"/>
+        <w:ind w:left="4308" w:hanging="360"/>
       </w:pPr>
       <w:rPr>
         <w:rFonts w:ascii="Courier New" w:hAnsi="Courier New" w:cs="Courier New" w:hint="default"/>
@@ -29352,7 +30395,7 @@
       <w:lvlText w:val=""/>
       <w:lvlJc w:val="left"/>
       <w:pPr>
-        <w:ind w:left="4668" w:hanging="360"/>
+        <w:ind w:left="5028" w:hanging="360"/>
       </w:pPr>
       <w:rPr>
         <w:rFonts w:ascii="Wingdings" w:hAnsi="Wingdings" w:hint="default"/>
@@ -29364,7 +30407,7 @@
       <w:lvlText w:val=""/>
       <w:lvlJc w:val="left"/>
       <w:pPr>
-        <w:ind w:left="5388" w:hanging="360"/>
+        <w:ind w:left="5748" w:hanging="360"/>
       </w:pPr>
       <w:rPr>
         <w:rFonts w:ascii="Symbol" w:hAnsi="Symbol" w:hint="default"/>
@@ -29376,7 +30419,7 @@
       <w:lvlText w:val="o"/>
       <w:lvlJc w:val="left"/>
       <w:pPr>
-        <w:ind w:left="6108" w:hanging="360"/>
+        <w:ind w:left="6468" w:hanging="360"/>
       </w:pPr>
       <w:rPr>
         <w:rFonts w:ascii="Courier New" w:hAnsi="Courier New" w:cs="Courier New" w:hint="default"/>
@@ -29388,14 +30431,14 @@
       <w:lvlText w:val=""/>
       <w:lvlJc w:val="left"/>
       <w:pPr>
-        <w:ind w:left="6828" w:hanging="360"/>
+        <w:ind w:left="7188" w:hanging="360"/>
       </w:pPr>
       <w:rPr>
         <w:rFonts w:ascii="Wingdings" w:hAnsi="Wingdings" w:hint="default"/>
       </w:rPr>
     </w:lvl>
   </w:abstractNum>
-  <w:abstractNum w:abstractNumId="16" w15:restartNumberingAfterBreak="0">
+  <w:abstractNum w:abstractNumId="17" w15:restartNumberingAfterBreak="0">
     <w:nsid w:val="3E672CCD"/>
     <w:multiLevelType w:val="hybridMultilevel"/>
     <w:tmpl w:val="0BAE5ED6"/>
@@ -29484,7 +30527,96 @@
       </w:pPr>
     </w:lvl>
   </w:abstractNum>
-  <w:abstractNum w:abstractNumId="17" w15:restartNumberingAfterBreak="0">
+  <w:abstractNum w:abstractNumId="18" w15:restartNumberingAfterBreak="0">
+    <w:nsid w:val="3FBD7F10"/>
+    <w:multiLevelType w:val="hybridMultilevel"/>
+    <w:tmpl w:val="63AE9C56"/>
+    <w:lvl w:ilvl="0" w:tplc="200A000F">
+      <w:start w:val="1"/>
+      <w:numFmt w:val="decimal"/>
+      <w:lvlText w:val="%1."/>
+      <w:lvlJc w:val="left"/>
+      <w:pPr>
+        <w:ind w:left="720" w:hanging="360"/>
+      </w:pPr>
+      <w:rPr>
+        <w:rFonts w:hint="default"/>
+      </w:rPr>
+    </w:lvl>
+    <w:lvl w:ilvl="1" w:tplc="200A0019" w:tentative="1">
+      <w:start w:val="1"/>
+      <w:numFmt w:val="lowerLetter"/>
+      <w:lvlText w:val="%2."/>
+      <w:lvlJc w:val="left"/>
+      <w:pPr>
+        <w:ind w:left="1440" w:hanging="360"/>
+      </w:pPr>
+    </w:lvl>
+    <w:lvl w:ilvl="2" w:tplc="200A001B" w:tentative="1">
+      <w:start w:val="1"/>
+      <w:numFmt w:val="lowerRoman"/>
+      <w:lvlText w:val="%3."/>
+      <w:lvlJc w:val="right"/>
+      <w:pPr>
+        <w:ind w:left="2160" w:hanging="180"/>
+      </w:pPr>
+    </w:lvl>
+    <w:lvl w:ilvl="3" w:tplc="200A000F" w:tentative="1">
+      <w:start w:val="1"/>
+      <w:numFmt w:val="decimal"/>
+      <w:lvlText w:val="%4."/>
+      <w:lvlJc w:val="left"/>
+      <w:pPr>
+        <w:ind w:left="2880" w:hanging="360"/>
+      </w:pPr>
+    </w:lvl>
+    <w:lvl w:ilvl="4" w:tplc="200A0019" w:tentative="1">
+      <w:start w:val="1"/>
+      <w:numFmt w:val="lowerLetter"/>
+      <w:lvlText w:val="%5."/>
+      <w:lvlJc w:val="left"/>
+      <w:pPr>
+        <w:ind w:left="3600" w:hanging="360"/>
+      </w:pPr>
+    </w:lvl>
+    <w:lvl w:ilvl="5" w:tplc="200A001B" w:tentative="1">
+      <w:start w:val="1"/>
+      <w:numFmt w:val="lowerRoman"/>
+      <w:lvlText w:val="%6."/>
+      <w:lvlJc w:val="right"/>
+      <w:pPr>
+        <w:ind w:left="4320" w:hanging="180"/>
+      </w:pPr>
+    </w:lvl>
+    <w:lvl w:ilvl="6" w:tplc="200A000F" w:tentative="1">
+      <w:start w:val="1"/>
+      <w:numFmt w:val="decimal"/>
+      <w:lvlText w:val="%7."/>
+      <w:lvlJc w:val="left"/>
+      <w:pPr>
+        <w:ind w:left="5040" w:hanging="360"/>
+      </w:pPr>
+    </w:lvl>
+    <w:lvl w:ilvl="7" w:tplc="200A0019" w:tentative="1">
+      <w:start w:val="1"/>
+      <w:numFmt w:val="lowerLetter"/>
+      <w:lvlText w:val="%8."/>
+      <w:lvlJc w:val="left"/>
+      <w:pPr>
+        <w:ind w:left="5760" w:hanging="360"/>
+      </w:pPr>
+    </w:lvl>
+    <w:lvl w:ilvl="8" w:tplc="200A001B" w:tentative="1">
+      <w:start w:val="1"/>
+      <w:numFmt w:val="lowerRoman"/>
+      <w:lvlText w:val="%9."/>
+      <w:lvlJc w:val="right"/>
+      <w:pPr>
+        <w:ind w:left="6480" w:hanging="180"/>
+      </w:pPr>
+    </w:lvl>
+  </w:abstractNum>
+  <w:abstractNum w:abstractNumId="19" w15:restartNumberingAfterBreak="0">
     <w:nsid w:val="47C62F33"/>
     <w:multiLevelType w:val="hybridMultilevel"/>
     <w:tmpl w:val="F8989EB4"/>
@@ -29597,7 +30729,7 @@
       </w:rPr>
     </w:lvl>
   </w:abstractNum>
-  <w:abstractNum w:abstractNumId="18" w15:restartNumberingAfterBreak="0">
+  <w:abstractNum w:abstractNumId="20" w15:restartNumberingAfterBreak="0">
     <w:nsid w:val="4D794F7B"/>
     <w:multiLevelType w:val="hybridMultilevel"/>
     <w:tmpl w:val="ADB0E002"/>
@@ -29710,7 +30842,7 @@
       </w:rPr>
     </w:lvl>
   </w:abstractNum>
-  <w:abstractNum w:abstractNumId="19" w15:restartNumberingAfterBreak="0">
+  <w:abstractNum w:abstractNumId="21" w15:restartNumberingAfterBreak="0">
     <w:nsid w:val="5C381E8C"/>
     <w:multiLevelType w:val="hybridMultilevel"/>
     <w:tmpl w:val="5148D242"/>
@@ -29796,7 +30928,7 @@
       </w:pPr>
     </w:lvl>
   </w:abstractNum>
-  <w:abstractNum w:abstractNumId="20" w15:restartNumberingAfterBreak="0">
+  <w:abstractNum w:abstractNumId="22" w15:restartNumberingAfterBreak="0">
     <w:nsid w:val="615B20F0"/>
     <w:multiLevelType w:val="hybridMultilevel"/>
     <w:tmpl w:val="7AC4399A"/>
@@ -29882,7 +31014,7 @@
       </w:pPr>
     </w:lvl>
   </w:abstractNum>
-  <w:abstractNum w:abstractNumId="21" w15:restartNumberingAfterBreak="0">
+  <w:abstractNum w:abstractNumId="23" w15:restartNumberingAfterBreak="0">
     <w:nsid w:val="63556DA1"/>
     <w:multiLevelType w:val="hybridMultilevel"/>
     <w:tmpl w:val="FE8C0458"/>
@@ -29995,7 +31127,7 @@
       </w:rPr>
     </w:lvl>
   </w:abstractNum>
-  <w:abstractNum w:abstractNumId="22" w15:restartNumberingAfterBreak="0">
+  <w:abstractNum w:abstractNumId="24" w15:restartNumberingAfterBreak="0">
     <w:nsid w:val="67597F94"/>
     <w:multiLevelType w:val="hybridMultilevel"/>
     <w:tmpl w:val="A6049668"/>
@@ -30084,7 +31216,7 @@
       </w:pPr>
     </w:lvl>
   </w:abstractNum>
-  <w:abstractNum w:abstractNumId="23" w15:restartNumberingAfterBreak="0">
+  <w:abstractNum w:abstractNumId="25" w15:restartNumberingAfterBreak="0">
     <w:nsid w:val="6AD52AD2"/>
     <w:multiLevelType w:val="hybridMultilevel"/>
     <w:tmpl w:val="9FCE4DB8"/>
@@ -30173,7 +31305,7 @@
       </w:pPr>
     </w:lvl>
   </w:abstractNum>
-  <w:abstractNum w:abstractNumId="24" w15:restartNumberingAfterBreak="0">
+  <w:abstractNum w:abstractNumId="26" w15:restartNumberingAfterBreak="0">
     <w:nsid w:val="753D730E"/>
     <w:multiLevelType w:val="hybridMultilevel"/>
     <w:tmpl w:val="75E0B6C2"/>
@@ -30286,7 +31418,7 @@
       </w:rPr>
     </w:lvl>
   </w:abstractNum>
-  <w:abstractNum w:abstractNumId="25" w15:restartNumberingAfterBreak="0">
+  <w:abstractNum w:abstractNumId="27" w15:restartNumberingAfterBreak="0">
     <w:nsid w:val="77037EA0"/>
     <w:multiLevelType w:val="hybridMultilevel"/>
     <w:tmpl w:val="1D7C8B04"/>
@@ -30399,7 +31531,7 @@
       </w:rPr>
     </w:lvl>
   </w:abstractNum>
-  <w:abstractNum w:abstractNumId="26" w15:restartNumberingAfterBreak="0">
+  <w:abstractNum w:abstractNumId="28" w15:restartNumberingAfterBreak="0">
     <w:nsid w:val="7B12378A"/>
     <w:multiLevelType w:val="hybridMultilevel"/>
     <w:tmpl w:val="E6EC6DD6"/>
@@ -30486,22 +31618,22 @@
     </w:lvl>
   </w:abstractNum>
   <w:num w:numId="1" w16cid:durableId="1293169672">
-    <w:abstractNumId w:val="18"/>
+    <w:abstractNumId w:val="20"/>
   </w:num>
   <w:num w:numId="2" w16cid:durableId="132523105">
-    <w:abstractNumId w:val="21"/>
+    <w:abstractNumId w:val="23"/>
   </w:num>
   <w:num w:numId="3" w16cid:durableId="550045339">
     <w:abstractNumId w:val="5"/>
   </w:num>
   <w:num w:numId="4" w16cid:durableId="913316204">
-    <w:abstractNumId w:val="16"/>
+    <w:abstractNumId w:val="17"/>
   </w:num>
   <w:num w:numId="5" w16cid:durableId="1328904247">
-    <w:abstractNumId w:val="13"/>
+    <w:abstractNumId w:val="14"/>
   </w:num>
   <w:num w:numId="6" w16cid:durableId="675959527">
-    <w:abstractNumId w:val="12"/>
+    <w:abstractNumId w:val="13"/>
   </w:num>
   <w:num w:numId="7" w16cid:durableId="1954557278">
     <w:abstractNumId w:val="6"/>
@@ -30510,61 +31642,67 @@
     <w:abstractNumId w:val="3"/>
   </w:num>
   <w:num w:numId="9" w16cid:durableId="1882328899">
-    <w:abstractNumId w:val="11"/>
+    <w:abstractNumId w:val="12"/>
   </w:num>
   <w:num w:numId="10" w16cid:durableId="870528595">
-    <w:abstractNumId w:val="14"/>
+    <w:abstractNumId w:val="15"/>
   </w:num>
   <w:num w:numId="11" w16cid:durableId="1776826764">
-    <w:abstractNumId w:val="25"/>
+    <w:abstractNumId w:val="27"/>
   </w:num>
   <w:num w:numId="12" w16cid:durableId="1998149375">
     <w:abstractNumId w:val="0"/>
   </w:num>
   <w:num w:numId="13" w16cid:durableId="2030794282">
-    <w:abstractNumId w:val="26"/>
+    <w:abstractNumId w:val="28"/>
   </w:num>
   <w:num w:numId="14" w16cid:durableId="389350923">
-    <w:abstractNumId w:val="10"/>
+    <w:abstractNumId w:val="11"/>
   </w:num>
   <w:num w:numId="15" w16cid:durableId="1450397852">
     <w:abstractNumId w:val="9"/>
   </w:num>
   <w:num w:numId="16" w16cid:durableId="1198618860">
-    <w:abstractNumId w:val="17"/>
+    <w:abstractNumId w:val="19"/>
   </w:num>
   <w:num w:numId="17" w16cid:durableId="534732538">
-    <w:abstractNumId w:val="23"/>
+    <w:abstractNumId w:val="25"/>
   </w:num>
   <w:num w:numId="18" w16cid:durableId="1870793516">
-    <w:abstractNumId w:val="15"/>
+    <w:abstractNumId w:val="16"/>
   </w:num>
   <w:num w:numId="19" w16cid:durableId="1198272480">
-    <w:abstractNumId w:val="20"/>
+    <w:abstractNumId w:val="22"/>
   </w:num>
   <w:num w:numId="20" w16cid:durableId="1597127380">
     <w:abstractNumId w:val="8"/>
   </w:num>
   <w:num w:numId="21" w16cid:durableId="1672026176">
-    <w:abstractNumId w:val="24"/>
+    <w:abstractNumId w:val="26"/>
   </w:num>
   <w:num w:numId="22" w16cid:durableId="44453642">
     <w:abstractNumId w:val="1"/>
   </w:num>
   <w:num w:numId="23" w16cid:durableId="158888792">
-    <w:abstractNumId w:val="22"/>
+    <w:abstractNumId w:val="24"/>
   </w:num>
   <w:num w:numId="24" w16cid:durableId="1741439293">
     <w:abstractNumId w:val="4"/>
   </w:num>
   <w:num w:numId="25" w16cid:durableId="1514027647">
-    <w:abstractNumId w:val="19"/>
+    <w:abstractNumId w:val="21"/>
   </w:num>
   <w:num w:numId="26" w16cid:durableId="799080835">
     <w:abstractNumId w:val="7"/>
   </w:num>
   <w:num w:numId="27" w16cid:durableId="1869248346">
     <w:abstractNumId w:val="2"/>
+  </w:num>
+  <w:num w:numId="28" w16cid:durableId="1551306896">
+    <w:abstractNumId w:val="10"/>
+  </w:num>
+  <w:num w:numId="29" w16cid:durableId="716703061">
+    <w:abstractNumId w:val="18"/>
   </w:num>
 </w:numbering>
 </file>

</xml_diff>

<commit_message>
<doc> exporting manual as pdf
</commit_message>
<xml_diff>
--- a/Manual de desarrollo en Atlax Renpy.docx
+++ b/Manual de desarrollo en Atlax Renpy.docx
@@ -7563,7 +7563,7 @@
           <w:bCs/>
           <w:sz w:val="28"/>
           <w:szCs w:val="28"/>
-          <w:highlight w:val="blue"/>
+          <w:highlight w:val="yellow"/>
         </w:rPr>
         <w:t>Recomendación</w:t>
       </w:r>
@@ -7609,7 +7609,7 @@
         </w:rPr>
         <w:lastRenderedPageBreak/>
         <w:drawing>
-          <wp:anchor distT="0" distB="0" distL="114300" distR="114300" simplePos="0" relativeHeight="251673600" behindDoc="0" locked="0" layoutInCell="1" allowOverlap="1" wp14:anchorId="566A4858" wp14:editId="6B5E0B5E">
+          <wp:anchor distT="0" distB="0" distL="114300" distR="114300" simplePos="0" relativeHeight="251673600" behindDoc="0" locked="0" layoutInCell="1" allowOverlap="1" wp14:anchorId="566A4858" wp14:editId="517365BF">
             <wp:simplePos x="0" y="0"/>
             <wp:positionH relativeFrom="margin">
               <wp:posOffset>-86657</wp:posOffset>
@@ -7618,7 +7618,7 @@
               <wp:posOffset>178454</wp:posOffset>
             </wp:positionV>
             <wp:extent cx="5426075" cy="1632585"/>
-            <wp:effectExtent l="0" t="0" r="3175" b="5715"/>
+            <wp:effectExtent l="19050" t="19050" r="22225" b="24765"/>
             <wp:wrapSquare wrapText="bothSides"/>
             <wp:docPr id="1898143434" name="Imagen 1"/>
             <wp:cNvGraphicFramePr>
@@ -7651,6 +7651,11 @@
                     <a:prstGeom prst="rect">
                       <a:avLst/>
                     </a:prstGeom>
+                    <a:ln>
+                      <a:solidFill>
+                        <a:schemeClr val="tx1"/>
+                      </a:solidFill>
+                    </a:ln>
                   </pic:spPr>
                 </pic:pic>
               </a:graphicData>
@@ -8270,7 +8275,7 @@
           <w:noProof/>
         </w:rPr>
         <w:drawing>
-          <wp:anchor distT="0" distB="0" distL="114300" distR="114300" simplePos="0" relativeHeight="251676672" behindDoc="0" locked="0" layoutInCell="1" allowOverlap="1" wp14:anchorId="338485B2" wp14:editId="36B87FDA">
+          <wp:anchor distT="0" distB="0" distL="114300" distR="114300" simplePos="0" relativeHeight="251676672" behindDoc="0" locked="0" layoutInCell="1" allowOverlap="1" wp14:anchorId="338485B2" wp14:editId="13B9F4CB">
             <wp:simplePos x="0" y="0"/>
             <wp:positionH relativeFrom="margin">
               <wp:align>center</wp:align>
@@ -8279,7 +8284,7 @@
               <wp:posOffset>3435160</wp:posOffset>
             </wp:positionV>
             <wp:extent cx="6003290" cy="2718435"/>
-            <wp:effectExtent l="0" t="0" r="0" b="5715"/>
+            <wp:effectExtent l="19050" t="19050" r="16510" b="24765"/>
             <wp:wrapSquare wrapText="bothSides"/>
             <wp:docPr id="1596032430" name="Imagen 1"/>
             <wp:cNvGraphicFramePr>
@@ -8312,6 +8317,11 @@
                     <a:prstGeom prst="rect">
                       <a:avLst/>
                     </a:prstGeom>
+                    <a:ln>
+                      <a:solidFill>
+                        <a:schemeClr val="tx1"/>
+                      </a:solidFill>
+                    </a:ln>
                   </pic:spPr>
                 </pic:pic>
               </a:graphicData>
@@ -8712,7 +8722,7 @@
           <w:noProof/>
         </w:rPr>
         <w:drawing>
-          <wp:anchor distT="0" distB="0" distL="114300" distR="114300" simplePos="0" relativeHeight="251675648" behindDoc="0" locked="0" layoutInCell="1" allowOverlap="1" wp14:anchorId="5A4EA266" wp14:editId="58137ED3">
+          <wp:anchor distT="0" distB="0" distL="114300" distR="114300" simplePos="0" relativeHeight="251675648" behindDoc="0" locked="0" layoutInCell="1" allowOverlap="1" wp14:anchorId="5A4EA266" wp14:editId="498EFFF0">
             <wp:simplePos x="0" y="0"/>
             <wp:positionH relativeFrom="margin">
               <wp:align>right</wp:align>
@@ -8721,7 +8731,7 @@
               <wp:posOffset>5229922</wp:posOffset>
             </wp:positionV>
             <wp:extent cx="5400040" cy="536575"/>
-            <wp:effectExtent l="0" t="0" r="0" b="0"/>
+            <wp:effectExtent l="19050" t="19050" r="10160" b="15875"/>
             <wp:wrapSquare wrapText="bothSides"/>
             <wp:docPr id="814949175" name="Imagen 1"/>
             <wp:cNvGraphicFramePr>
@@ -8754,6 +8764,11 @@
                     <a:prstGeom prst="rect">
                       <a:avLst/>
                     </a:prstGeom>
+                    <a:ln>
+                      <a:solidFill>
+                        <a:schemeClr val="tx1"/>
+                      </a:solidFill>
+                    </a:ln>
                   </pic:spPr>
                 </pic:pic>
               </a:graphicData>
@@ -9021,16 +9036,16 @@
           <w:noProof/>
         </w:rPr>
         <w:drawing>
-          <wp:anchor distT="0" distB="0" distL="114300" distR="114300" simplePos="0" relativeHeight="251677696" behindDoc="0" locked="0" layoutInCell="1" allowOverlap="1" wp14:anchorId="3905314E" wp14:editId="26C8F8C1">
+          <wp:anchor distT="0" distB="0" distL="114300" distR="114300" simplePos="0" relativeHeight="251677696" behindDoc="0" locked="0" layoutInCell="1" allowOverlap="1" wp14:anchorId="3905314E" wp14:editId="23B7E3BE">
             <wp:simplePos x="0" y="0"/>
             <wp:positionH relativeFrom="margin">
               <wp:align>center</wp:align>
             </wp:positionH>
             <wp:positionV relativeFrom="margin">
-              <wp:posOffset>871855</wp:posOffset>
+              <wp:posOffset>897890</wp:posOffset>
             </wp:positionV>
             <wp:extent cx="3828415" cy="2006600"/>
-            <wp:effectExtent l="0" t="0" r="635" b="0"/>
+            <wp:effectExtent l="19050" t="19050" r="19685" b="12700"/>
             <wp:wrapSquare wrapText="bothSides"/>
             <wp:docPr id="372282176" name="Imagen 1"/>
             <wp:cNvGraphicFramePr>
@@ -9063,6 +9078,11 @@
                     <a:prstGeom prst="rect">
                       <a:avLst/>
                     </a:prstGeom>
+                    <a:ln>
+                      <a:solidFill>
+                        <a:schemeClr val="tx1"/>
+                      </a:solidFill>
+                    </a:ln>
                   </pic:spPr>
                 </pic:pic>
               </a:graphicData>
@@ -9555,7 +9575,7 @@
           <w:noProof/>
         </w:rPr>
         <w:drawing>
-          <wp:anchor distT="0" distB="0" distL="114300" distR="114300" simplePos="0" relativeHeight="251679744" behindDoc="0" locked="0" layoutInCell="1" allowOverlap="1" wp14:anchorId="46E3E1AE" wp14:editId="7749F82A">
+          <wp:anchor distT="0" distB="0" distL="114300" distR="114300" simplePos="0" relativeHeight="251679744" behindDoc="0" locked="0" layoutInCell="1" allowOverlap="1" wp14:anchorId="46E3E1AE" wp14:editId="2CD41AF3">
             <wp:simplePos x="0" y="0"/>
             <wp:positionH relativeFrom="margin">
               <wp:align>center</wp:align>
@@ -9564,7 +9584,7 @@
               <wp:posOffset>8034519</wp:posOffset>
             </wp:positionV>
             <wp:extent cx="4914900" cy="609600"/>
-            <wp:effectExtent l="0" t="0" r="0" b="0"/>
+            <wp:effectExtent l="19050" t="19050" r="19050" b="19050"/>
             <wp:wrapSquare wrapText="bothSides"/>
             <wp:docPr id="501187318" name="Imagen 1"/>
             <wp:cNvGraphicFramePr>
@@ -9597,6 +9617,11 @@
                     <a:prstGeom prst="rect">
                       <a:avLst/>
                     </a:prstGeom>
+                    <a:ln>
+                      <a:solidFill>
+                        <a:schemeClr val="tx1"/>
+                      </a:solidFill>
+                    </a:ln>
                   </pic:spPr>
                 </pic:pic>
               </a:graphicData>
@@ -9714,7 +9739,7 @@
           <w:noProof/>
         </w:rPr>
         <w:drawing>
-          <wp:anchor distT="0" distB="0" distL="114300" distR="114300" simplePos="0" relativeHeight="251680768" behindDoc="0" locked="0" layoutInCell="1" allowOverlap="1" wp14:anchorId="2AEC27D1" wp14:editId="7E8D6572">
+          <wp:anchor distT="0" distB="0" distL="114300" distR="114300" simplePos="0" relativeHeight="251680768" behindDoc="0" locked="0" layoutInCell="1" allowOverlap="1" wp14:anchorId="2AEC27D1" wp14:editId="3C184CEE">
             <wp:simplePos x="0" y="0"/>
             <wp:positionH relativeFrom="margin">
               <wp:posOffset>95140</wp:posOffset>
@@ -9723,7 +9748,7 @@
               <wp:posOffset>1695516</wp:posOffset>
             </wp:positionV>
             <wp:extent cx="2366645" cy="3874135"/>
-            <wp:effectExtent l="0" t="0" r="0" b="0"/>
+            <wp:effectExtent l="19050" t="19050" r="14605" b="12065"/>
             <wp:wrapSquare wrapText="bothSides"/>
             <wp:docPr id="837284710" name="Imagen 1"/>
             <wp:cNvGraphicFramePr>
@@ -9756,6 +9781,11 @@
                     <a:prstGeom prst="rect">
                       <a:avLst/>
                     </a:prstGeom>
+                    <a:ln>
+                      <a:solidFill>
+                        <a:schemeClr val="tx1"/>
+                      </a:solidFill>
+                    </a:ln>
                   </pic:spPr>
                 </pic:pic>
               </a:graphicData>
@@ -10046,7 +10076,7 @@
           <w:noProof/>
         </w:rPr>
         <w:drawing>
-          <wp:anchor distT="0" distB="0" distL="114300" distR="114300" simplePos="0" relativeHeight="251681792" behindDoc="0" locked="0" layoutInCell="1" allowOverlap="1" wp14:anchorId="6E6D79DC" wp14:editId="380B7B3C">
+          <wp:anchor distT="0" distB="0" distL="114300" distR="114300" simplePos="0" relativeHeight="251681792" behindDoc="0" locked="0" layoutInCell="1" allowOverlap="1" wp14:anchorId="6E6D79DC" wp14:editId="3B0A6F2E">
             <wp:simplePos x="0" y="0"/>
             <wp:positionH relativeFrom="margin">
               <wp:align>center</wp:align>
@@ -10055,7 +10085,7 @@
               <wp:posOffset>679281</wp:posOffset>
             </wp:positionV>
             <wp:extent cx="4434205" cy="2301240"/>
-            <wp:effectExtent l="0" t="0" r="4445" b="3810"/>
+            <wp:effectExtent l="19050" t="19050" r="23495" b="22860"/>
             <wp:wrapSquare wrapText="bothSides"/>
             <wp:docPr id="427014048" name="Imagen 1"/>
             <wp:cNvGraphicFramePr>
@@ -10088,6 +10118,11 @@
                     <a:prstGeom prst="rect">
                       <a:avLst/>
                     </a:prstGeom>
+                    <a:ln>
+                      <a:solidFill>
+                        <a:schemeClr val="tx1"/>
+                      </a:solidFill>
+                    </a:ln>
                   </pic:spPr>
                 </pic:pic>
               </a:graphicData>
@@ -10216,7 +10251,7 @@
           <w:noProof/>
         </w:rPr>
         <w:drawing>
-          <wp:anchor distT="0" distB="0" distL="114300" distR="114300" simplePos="0" relativeHeight="251682816" behindDoc="0" locked="0" layoutInCell="1" allowOverlap="1" wp14:anchorId="04FC4D77" wp14:editId="261FEB75">
+          <wp:anchor distT="0" distB="0" distL="114300" distR="114300" simplePos="0" relativeHeight="251682816" behindDoc="0" locked="0" layoutInCell="1" allowOverlap="1" wp14:anchorId="04FC4D77" wp14:editId="4700041B">
             <wp:simplePos x="0" y="0"/>
             <wp:positionH relativeFrom="margin">
               <wp:align>center</wp:align>
@@ -10225,7 +10260,7 @@
               <wp:posOffset>4006663</wp:posOffset>
             </wp:positionV>
             <wp:extent cx="5219700" cy="476250"/>
-            <wp:effectExtent l="0" t="0" r="0" b="0"/>
+            <wp:effectExtent l="19050" t="19050" r="19050" b="19050"/>
             <wp:wrapSquare wrapText="bothSides"/>
             <wp:docPr id="1035006697" name="Imagen 1"/>
             <wp:cNvGraphicFramePr>
@@ -10258,6 +10293,11 @@
                     <a:prstGeom prst="rect">
                       <a:avLst/>
                     </a:prstGeom>
+                    <a:ln>
+                      <a:solidFill>
+                        <a:schemeClr val="tx1"/>
+                      </a:solidFill>
+                    </a:ln>
                   </pic:spPr>
                 </pic:pic>
               </a:graphicData>
@@ -10330,7 +10370,7 @@
           <w:noProof/>
         </w:rPr>
         <w:drawing>
-          <wp:anchor distT="0" distB="0" distL="114300" distR="114300" simplePos="0" relativeHeight="251683840" behindDoc="0" locked="0" layoutInCell="1" allowOverlap="1" wp14:anchorId="6F6B2828" wp14:editId="5FE55A3A">
+          <wp:anchor distT="0" distB="0" distL="114300" distR="114300" simplePos="0" relativeHeight="251683840" behindDoc="0" locked="0" layoutInCell="1" allowOverlap="1" wp14:anchorId="6F6B2828" wp14:editId="0CB809B6">
             <wp:simplePos x="0" y="0"/>
             <wp:positionH relativeFrom="margin">
               <wp:align>right</wp:align>
@@ -10339,7 +10379,7 @@
               <wp:posOffset>6214110</wp:posOffset>
             </wp:positionV>
             <wp:extent cx="5400040" cy="448310"/>
-            <wp:effectExtent l="0" t="0" r="0" b="8890"/>
+            <wp:effectExtent l="19050" t="19050" r="10160" b="27940"/>
             <wp:wrapSquare wrapText="bothSides"/>
             <wp:docPr id="268712773" name="Imagen 1"/>
             <wp:cNvGraphicFramePr>
@@ -10372,6 +10412,11 @@
                     <a:prstGeom prst="rect">
                       <a:avLst/>
                     </a:prstGeom>
+                    <a:ln>
+                      <a:solidFill>
+                        <a:schemeClr val="tx1"/>
+                      </a:solidFill>
+                    </a:ln>
                   </pic:spPr>
                 </pic:pic>
               </a:graphicData>
@@ -10441,7 +10486,7 @@
         </w:rPr>
         <w:lastRenderedPageBreak/>
         <w:drawing>
-          <wp:anchor distT="0" distB="0" distL="114300" distR="114300" simplePos="0" relativeHeight="251684864" behindDoc="0" locked="0" layoutInCell="1" allowOverlap="1" wp14:anchorId="376B1191" wp14:editId="365A8B4D">
+          <wp:anchor distT="0" distB="0" distL="114300" distR="114300" simplePos="0" relativeHeight="251684864" behindDoc="0" locked="0" layoutInCell="1" allowOverlap="1" wp14:anchorId="376B1191" wp14:editId="163B87E6">
             <wp:simplePos x="0" y="0"/>
             <wp:positionH relativeFrom="margin">
               <wp:align>right</wp:align>
@@ -10450,7 +10495,7 @@
               <wp:posOffset>197977</wp:posOffset>
             </wp:positionV>
             <wp:extent cx="5400040" cy="239395"/>
-            <wp:effectExtent l="0" t="0" r="0" b="8255"/>
+            <wp:effectExtent l="19050" t="19050" r="10160" b="27305"/>
             <wp:wrapSquare wrapText="bothSides"/>
             <wp:docPr id="1295631050" name="Imagen 1"/>
             <wp:cNvGraphicFramePr>
@@ -10483,6 +10528,11 @@
                     <a:prstGeom prst="rect">
                       <a:avLst/>
                     </a:prstGeom>
+                    <a:ln>
+                      <a:solidFill>
+                        <a:schemeClr val="tx1"/>
+                      </a:solidFill>
+                    </a:ln>
                   </pic:spPr>
                 </pic:pic>
               </a:graphicData>
@@ -12253,7 +12303,7 @@
           <w:noProof/>
         </w:rPr>
         <w:drawing>
-          <wp:anchor distT="0" distB="0" distL="114300" distR="114300" simplePos="0" relativeHeight="251693056" behindDoc="0" locked="0" layoutInCell="1" allowOverlap="1" wp14:anchorId="46113A86" wp14:editId="40A5E113">
+          <wp:anchor distT="0" distB="0" distL="114300" distR="114300" simplePos="0" relativeHeight="251693056" behindDoc="0" locked="0" layoutInCell="1" allowOverlap="1" wp14:anchorId="46113A86" wp14:editId="2BF7E779">
             <wp:simplePos x="0" y="0"/>
             <wp:positionH relativeFrom="margin">
               <wp:posOffset>-260930</wp:posOffset>
@@ -12262,7 +12312,7 @@
               <wp:posOffset>2245023</wp:posOffset>
             </wp:positionV>
             <wp:extent cx="6170930" cy="316865"/>
-            <wp:effectExtent l="0" t="0" r="1270" b="6985"/>
+            <wp:effectExtent l="19050" t="19050" r="20320" b="26035"/>
             <wp:wrapSquare wrapText="bothSides"/>
             <wp:docPr id="562494513" name="Imagen 1"/>
             <wp:cNvGraphicFramePr>
@@ -12295,6 +12345,11 @@
                     <a:prstGeom prst="rect">
                       <a:avLst/>
                     </a:prstGeom>
+                    <a:ln>
+                      <a:solidFill>
+                        <a:schemeClr val="tx1"/>
+                      </a:solidFill>
+                    </a:ln>
                   </pic:spPr>
                 </pic:pic>
               </a:graphicData>
@@ -12609,7 +12664,7 @@
           <w:noProof/>
         </w:rPr>
         <w:drawing>
-          <wp:anchor distT="0" distB="0" distL="114300" distR="114300" simplePos="0" relativeHeight="251662336" behindDoc="0" locked="0" layoutInCell="1" allowOverlap="1" wp14:anchorId="64B85F69" wp14:editId="413AAA1C">
+          <wp:anchor distT="0" distB="0" distL="114300" distR="114300" simplePos="0" relativeHeight="251662336" behindDoc="0" locked="0" layoutInCell="1" allowOverlap="1" wp14:anchorId="64B85F69" wp14:editId="7F45402C">
             <wp:simplePos x="0" y="0"/>
             <wp:positionH relativeFrom="margin">
               <wp:posOffset>-77470</wp:posOffset>
@@ -12618,7 +12673,7 @@
               <wp:posOffset>892006</wp:posOffset>
             </wp:positionV>
             <wp:extent cx="2228850" cy="733425"/>
-            <wp:effectExtent l="0" t="0" r="0" b="9525"/>
+            <wp:effectExtent l="19050" t="19050" r="19050" b="28575"/>
             <wp:wrapSquare wrapText="bothSides"/>
             <wp:docPr id="519069507" name="Imagen 1"/>
             <wp:cNvGraphicFramePr>
@@ -12651,6 +12706,11 @@
                     <a:prstGeom prst="rect">
                       <a:avLst/>
                     </a:prstGeom>
+                    <a:ln>
+                      <a:solidFill>
+                        <a:schemeClr val="tx1"/>
+                      </a:solidFill>
+                    </a:ln>
                   </pic:spPr>
                 </pic:pic>
               </a:graphicData>
@@ -12692,7 +12752,7 @@
           <w:szCs w:val="20"/>
         </w:rPr>
         <w:drawing>
-          <wp:anchor distT="0" distB="0" distL="114300" distR="114300" simplePos="0" relativeHeight="251663360" behindDoc="0" locked="0" layoutInCell="1" allowOverlap="1" wp14:anchorId="461CB017" wp14:editId="397962AF">
+          <wp:anchor distT="0" distB="0" distL="114300" distR="114300" simplePos="0" relativeHeight="251663360" behindDoc="0" locked="0" layoutInCell="1" allowOverlap="1" wp14:anchorId="461CB017" wp14:editId="7CEF1D24">
             <wp:simplePos x="0" y="0"/>
             <wp:positionH relativeFrom="margin">
               <wp:posOffset>2886039</wp:posOffset>
@@ -12701,7 +12761,7 @@
               <wp:posOffset>909922</wp:posOffset>
             </wp:positionV>
             <wp:extent cx="2466975" cy="2581275"/>
-            <wp:effectExtent l="0" t="0" r="9525" b="9525"/>
+            <wp:effectExtent l="19050" t="19050" r="28575" b="28575"/>
             <wp:wrapSquare wrapText="bothSides"/>
             <wp:docPr id="1359445564" name="Imagen 1"/>
             <wp:cNvGraphicFramePr>
@@ -12734,6 +12794,11 @@
                     <a:prstGeom prst="rect">
                       <a:avLst/>
                     </a:prstGeom>
+                    <a:ln>
+                      <a:solidFill>
+                        <a:schemeClr val="tx1"/>
+                      </a:solidFill>
+                    </a:ln>
                   </pic:spPr>
                 </pic:pic>
               </a:graphicData>
@@ -16848,9 +16913,9 @@
           <w:noProof/>
         </w:rPr>
         <w:drawing>
-          <wp:inline distT="0" distB="0" distL="0" distR="0" wp14:anchorId="35614EF4" wp14:editId="711EC7AC">
+          <wp:inline distT="0" distB="0" distL="0" distR="0" wp14:anchorId="35614EF4" wp14:editId="016AB6B7">
             <wp:extent cx="830239" cy="1847850"/>
-            <wp:effectExtent l="0" t="0" r="8255" b="0"/>
+            <wp:effectExtent l="19050" t="19050" r="27305" b="19050"/>
             <wp:docPr id="1981455816" name="Imagen 1"/>
             <wp:cNvGraphicFramePr>
               <a:graphicFrameLocks xmlns:a="http://schemas.openxmlformats.org/drawingml/2006/main" noChangeAspect="1"/>
@@ -16876,6 +16941,11 @@
                     <a:prstGeom prst="rect">
                       <a:avLst/>
                     </a:prstGeom>
+                    <a:ln>
+                      <a:solidFill>
+                        <a:schemeClr val="tx1"/>
+                      </a:solidFill>
+                    </a:ln>
                   </pic:spPr>
                 </pic:pic>
               </a:graphicData>
@@ -16894,9 +16964,9 @@
           <w:noProof/>
         </w:rPr>
         <w:drawing>
-          <wp:inline distT="0" distB="0" distL="0" distR="0" wp14:anchorId="79905E97" wp14:editId="3289C9C2">
+          <wp:inline distT="0" distB="0" distL="0" distR="0" wp14:anchorId="79905E97" wp14:editId="3EF37EBE">
             <wp:extent cx="825500" cy="1858271"/>
-            <wp:effectExtent l="0" t="0" r="6350" b="0"/>
+            <wp:effectExtent l="19050" t="19050" r="12700" b="27940"/>
             <wp:docPr id="1946779237" name="Imagen 1"/>
             <wp:cNvGraphicFramePr>
               <a:graphicFrameLocks xmlns:a="http://schemas.openxmlformats.org/drawingml/2006/main" noChangeAspect="1"/>
@@ -16922,6 +16992,11 @@
                     <a:prstGeom prst="rect">
                       <a:avLst/>
                     </a:prstGeom>
+                    <a:ln>
+                      <a:solidFill>
+                        <a:schemeClr val="tx1"/>
+                      </a:solidFill>
+                    </a:ln>
                   </pic:spPr>
                 </pic:pic>
               </a:graphicData>
@@ -16943,9 +17018,9 @@
           <w:noProof/>
         </w:rPr>
         <w:drawing>
-          <wp:inline distT="0" distB="0" distL="0" distR="0" wp14:anchorId="5EE99111" wp14:editId="416F1E7B">
+          <wp:inline distT="0" distB="0" distL="0" distR="0" wp14:anchorId="5EE99111" wp14:editId="7CCBF41A">
             <wp:extent cx="1041400" cy="1841849"/>
-            <wp:effectExtent l="0" t="0" r="6350" b="6350"/>
+            <wp:effectExtent l="19050" t="19050" r="25400" b="25400"/>
             <wp:docPr id="1148987302" name="Imagen 1"/>
             <wp:cNvGraphicFramePr>
               <a:graphicFrameLocks xmlns:a="http://schemas.openxmlformats.org/drawingml/2006/main" noChangeAspect="1"/>
@@ -16971,6 +17046,11 @@
                     <a:prstGeom prst="rect">
                       <a:avLst/>
                     </a:prstGeom>
+                    <a:ln>
+                      <a:solidFill>
+                        <a:schemeClr val="tx1"/>
+                      </a:solidFill>
+                    </a:ln>
                   </pic:spPr>
                 </pic:pic>
               </a:graphicData>
@@ -17069,7 +17149,7 @@
           <w:szCs w:val="20"/>
         </w:rPr>
         <w:drawing>
-          <wp:anchor distT="0" distB="0" distL="114300" distR="114300" simplePos="0" relativeHeight="251666432" behindDoc="0" locked="0" layoutInCell="1" allowOverlap="1" wp14:anchorId="7FAD91FA" wp14:editId="5C906C7A">
+          <wp:anchor distT="0" distB="0" distL="114300" distR="114300" simplePos="0" relativeHeight="251666432" behindDoc="0" locked="0" layoutInCell="1" allowOverlap="1" wp14:anchorId="7FAD91FA" wp14:editId="34D67076">
             <wp:simplePos x="0" y="0"/>
             <wp:positionH relativeFrom="margin">
               <wp:posOffset>385382</wp:posOffset>
@@ -17078,7 +17158,7 @@
               <wp:posOffset>4304089</wp:posOffset>
             </wp:positionV>
             <wp:extent cx="1627505" cy="2880360"/>
-            <wp:effectExtent l="0" t="0" r="0" b="0"/>
+            <wp:effectExtent l="19050" t="19050" r="10795" b="15240"/>
             <wp:wrapSquare wrapText="bothSides"/>
             <wp:docPr id="1515022617" name="Imagen 1"/>
             <wp:cNvGraphicFramePr>
@@ -17111,6 +17191,11 @@
                     <a:prstGeom prst="rect">
                       <a:avLst/>
                     </a:prstGeom>
+                    <a:ln>
+                      <a:solidFill>
+                        <a:schemeClr val="tx1"/>
+                      </a:solidFill>
+                    </a:ln>
                   </pic:spPr>
                 </pic:pic>
               </a:graphicData>
@@ -17167,7 +17252,7 @@
           <w:szCs w:val="20"/>
         </w:rPr>
         <w:drawing>
-          <wp:anchor distT="0" distB="0" distL="114300" distR="114300" simplePos="0" relativeHeight="251667456" behindDoc="0" locked="0" layoutInCell="1" allowOverlap="1" wp14:anchorId="139AECF7" wp14:editId="0B5D0C31">
+          <wp:anchor distT="0" distB="0" distL="114300" distR="114300" simplePos="0" relativeHeight="251667456" behindDoc="0" locked="0" layoutInCell="1" allowOverlap="1" wp14:anchorId="139AECF7" wp14:editId="055029E3">
             <wp:simplePos x="0" y="0"/>
             <wp:positionH relativeFrom="margin">
               <wp:posOffset>3475278</wp:posOffset>
@@ -17176,7 +17261,7 @@
               <wp:posOffset>4300382</wp:posOffset>
             </wp:positionV>
             <wp:extent cx="1650365" cy="2885440"/>
-            <wp:effectExtent l="0" t="0" r="6985" b="0"/>
+            <wp:effectExtent l="19050" t="19050" r="26035" b="10160"/>
             <wp:wrapSquare wrapText="bothSides"/>
             <wp:docPr id="1993775522" name="Imagen 1"/>
             <wp:cNvGraphicFramePr>
@@ -17209,6 +17294,11 @@
                     <a:prstGeom prst="rect">
                       <a:avLst/>
                     </a:prstGeom>
+                    <a:ln>
+                      <a:solidFill>
+                        <a:schemeClr val="tx1"/>
+                      </a:solidFill>
+                    </a:ln>
                   </pic:spPr>
                 </pic:pic>
               </a:graphicData>
@@ -17329,7 +17419,7 @@
           <w:noProof/>
         </w:rPr>
         <w:drawing>
-          <wp:anchor distT="0" distB="0" distL="114300" distR="114300" simplePos="0" relativeHeight="251668480" behindDoc="0" locked="0" layoutInCell="1" allowOverlap="1" wp14:anchorId="68EEACF9" wp14:editId="6783A6E1">
+          <wp:anchor distT="0" distB="0" distL="114300" distR="114300" simplePos="0" relativeHeight="251668480" behindDoc="0" locked="0" layoutInCell="1" allowOverlap="1" wp14:anchorId="68EEACF9" wp14:editId="0D1E8D32">
             <wp:simplePos x="0" y="0"/>
             <wp:positionH relativeFrom="margin">
               <wp:align>center</wp:align>
@@ -17338,7 +17428,7 @@
               <wp:posOffset>273285</wp:posOffset>
             </wp:positionV>
             <wp:extent cx="1292225" cy="2774315"/>
-            <wp:effectExtent l="0" t="0" r="3175" b="6985"/>
+            <wp:effectExtent l="19050" t="19050" r="22225" b="26035"/>
             <wp:wrapSquare wrapText="bothSides"/>
             <wp:docPr id="1024841430" name="Imagen 1"/>
             <wp:cNvGraphicFramePr>
@@ -17371,6 +17461,11 @@
                     <a:prstGeom prst="rect">
                       <a:avLst/>
                     </a:prstGeom>
+                    <a:ln>
+                      <a:solidFill>
+                        <a:schemeClr val="tx1"/>
+                      </a:solidFill>
+                    </a:ln>
                   </pic:spPr>
                 </pic:pic>
               </a:graphicData>
@@ -23517,7 +23612,7 @@
           <w:noProof/>
         </w:rPr>
         <w:drawing>
-          <wp:anchor distT="0" distB="0" distL="114300" distR="114300" simplePos="0" relativeHeight="251694080" behindDoc="0" locked="0" layoutInCell="1" allowOverlap="1" wp14:anchorId="14F82A39" wp14:editId="2D7EEC13">
+          <wp:anchor distT="0" distB="0" distL="114300" distR="114300" simplePos="0" relativeHeight="251694080" behindDoc="0" locked="0" layoutInCell="1" allowOverlap="1" wp14:anchorId="14F82A39" wp14:editId="29DD5817">
             <wp:simplePos x="0" y="0"/>
             <wp:positionH relativeFrom="margin">
               <wp:posOffset>546379</wp:posOffset>
@@ -23526,7 +23621,7 @@
               <wp:posOffset>4732372</wp:posOffset>
             </wp:positionV>
             <wp:extent cx="1210310" cy="2771140"/>
-            <wp:effectExtent l="0" t="0" r="8890" b="0"/>
+            <wp:effectExtent l="19050" t="19050" r="27940" b="10160"/>
             <wp:wrapSquare wrapText="bothSides"/>
             <wp:docPr id="1687009307" name="Imagen 1"/>
             <wp:cNvGraphicFramePr>
@@ -23559,6 +23654,11 @@
                     <a:prstGeom prst="rect">
                       <a:avLst/>
                     </a:prstGeom>
+                    <a:ln>
+                      <a:solidFill>
+                        <a:schemeClr val="tx1"/>
+                      </a:solidFill>
+                    </a:ln>
                   </pic:spPr>
                 </pic:pic>
               </a:graphicData>
@@ -23641,7 +23741,7 @@
           <w:noProof/>
         </w:rPr>
         <w:drawing>
-          <wp:anchor distT="0" distB="0" distL="114300" distR="114300" simplePos="0" relativeHeight="251695104" behindDoc="0" locked="0" layoutInCell="1" allowOverlap="1" wp14:anchorId="2B971677" wp14:editId="12988887">
+          <wp:anchor distT="0" distB="0" distL="114300" distR="114300" simplePos="0" relativeHeight="251695104" behindDoc="0" locked="0" layoutInCell="1" allowOverlap="1" wp14:anchorId="2B971677" wp14:editId="536B8B74">
             <wp:simplePos x="0" y="0"/>
             <wp:positionH relativeFrom="margin">
               <wp:posOffset>3602355</wp:posOffset>
@@ -23650,7 +23750,7 @@
               <wp:posOffset>4750688</wp:posOffset>
             </wp:positionV>
             <wp:extent cx="1215390" cy="2762250"/>
-            <wp:effectExtent l="0" t="0" r="3810" b="0"/>
+            <wp:effectExtent l="19050" t="19050" r="22860" b="19050"/>
             <wp:wrapSquare wrapText="bothSides"/>
             <wp:docPr id="1168886223" name="Imagen 1"/>
             <wp:cNvGraphicFramePr>
@@ -23683,6 +23783,11 @@
                     <a:prstGeom prst="rect">
                       <a:avLst/>
                     </a:prstGeom>
+                    <a:ln>
+                      <a:solidFill>
+                        <a:schemeClr val="tx1"/>
+                      </a:solidFill>
+                    </a:ln>
                   </pic:spPr>
                 </pic:pic>
               </a:graphicData>
@@ -31813,9 +31918,9 @@
           <w:noProof/>
         </w:rPr>
         <w:drawing>
-          <wp:inline distT="0" distB="0" distL="0" distR="0" wp14:anchorId="630AE5CF" wp14:editId="1F56F786">
+          <wp:inline distT="0" distB="0" distL="0" distR="0" wp14:anchorId="630AE5CF" wp14:editId="233AA0E0">
             <wp:extent cx="3651250" cy="409618"/>
-            <wp:effectExtent l="0" t="0" r="6350" b="9525"/>
+            <wp:effectExtent l="19050" t="19050" r="25400" b="28575"/>
             <wp:docPr id="172105129" name="Imagen 1"/>
             <wp:cNvGraphicFramePr>
               <a:graphicFrameLocks xmlns:a="http://schemas.openxmlformats.org/drawingml/2006/main" noChangeAspect="1"/>
@@ -31841,6 +31946,11 @@
                     <a:prstGeom prst="rect">
                       <a:avLst/>
                     </a:prstGeom>
+                    <a:ln>
+                      <a:solidFill>
+                        <a:schemeClr val="tx1"/>
+                      </a:solidFill>
+                    </a:ln>
                   </pic:spPr>
                 </pic:pic>
               </a:graphicData>
@@ -33125,7 +33235,7 @@
         </w:rPr>
         <w:lastRenderedPageBreak/>
         <w:drawing>
-          <wp:anchor distT="0" distB="0" distL="114300" distR="114300" simplePos="0" relativeHeight="251671552" behindDoc="0" locked="0" layoutInCell="1" allowOverlap="1" wp14:anchorId="0ECDDFF2" wp14:editId="1F8A9584">
+          <wp:anchor distT="0" distB="0" distL="114300" distR="114300" simplePos="0" relativeHeight="251671552" behindDoc="0" locked="0" layoutInCell="1" allowOverlap="1" wp14:anchorId="0ECDDFF2" wp14:editId="62EA5ECA">
             <wp:simplePos x="0" y="0"/>
             <wp:positionH relativeFrom="margin">
               <wp:posOffset>-175895</wp:posOffset>
@@ -33134,7 +33244,7 @@
               <wp:posOffset>67945</wp:posOffset>
             </wp:positionV>
             <wp:extent cx="2514600" cy="5003800"/>
-            <wp:effectExtent l="0" t="0" r="0" b="6350"/>
+            <wp:effectExtent l="19050" t="19050" r="19050" b="25400"/>
             <wp:wrapSquare wrapText="bothSides"/>
             <wp:docPr id="477519739" name="Imagen 1"/>
             <wp:cNvGraphicFramePr>
@@ -33167,6 +33277,11 @@
                     <a:prstGeom prst="rect">
                       <a:avLst/>
                     </a:prstGeom>
+                    <a:ln>
+                      <a:solidFill>
+                        <a:schemeClr val="tx1"/>
+                      </a:solidFill>
+                    </a:ln>
                   </pic:spPr>
                 </pic:pic>
               </a:graphicData>

</xml_diff>

<commit_message>
<fix> credits and video fixed
</commit_message>
<xml_diff>
--- a/Manual de desarrollo en Atlax Renpy.docx
+++ b/Manual de desarrollo en Atlax Renpy.docx
@@ -7850,7 +7850,7 @@
           <w:noProof/>
         </w:rPr>
         <w:drawing>
-          <wp:anchor distT="0" distB="0" distL="114300" distR="114300" simplePos="0" relativeHeight="251676672" behindDoc="0" locked="0" layoutInCell="1" allowOverlap="1" wp14:anchorId="338485B2" wp14:editId="6835B9CF">
+          <wp:anchor distT="0" distB="0" distL="114300" distR="114300" simplePos="0" relativeHeight="251676672" behindDoc="0" locked="0" layoutInCell="1" allowOverlap="1" wp14:anchorId="338485B2" wp14:editId="57D51982">
             <wp:simplePos x="0" y="0"/>
             <wp:positionH relativeFrom="margin">
               <wp:align>center</wp:align>
@@ -11190,7 +11190,7 @@
           <w:noProof/>
         </w:rPr>
         <w:drawing>
-          <wp:anchor distT="0" distB="0" distL="114300" distR="114300" simplePos="0" relativeHeight="251693056" behindDoc="0" locked="0" layoutInCell="1" allowOverlap="1" wp14:anchorId="46113A86" wp14:editId="1D1921E3">
+          <wp:anchor distT="0" distB="0" distL="114300" distR="114300" simplePos="0" relativeHeight="251693056" behindDoc="0" locked="0" layoutInCell="1" allowOverlap="1" wp14:anchorId="46113A86" wp14:editId="32E35F8B">
             <wp:simplePos x="0" y="0"/>
             <wp:positionH relativeFrom="margin">
               <wp:posOffset>-260930</wp:posOffset>
@@ -15442,7 +15442,7 @@
           <w:noProof/>
         </w:rPr>
         <w:drawing>
-          <wp:anchor distT="0" distB="0" distL="114300" distR="114300" simplePos="0" relativeHeight="251668480" behindDoc="0" locked="0" layoutInCell="1" allowOverlap="1" wp14:anchorId="68EEACF9" wp14:editId="591F33F5">
+          <wp:anchor distT="0" distB="0" distL="114300" distR="114300" simplePos="0" relativeHeight="251668480" behindDoc="0" locked="0" layoutInCell="1" allowOverlap="1" wp14:anchorId="68EEACF9" wp14:editId="2BB0A62A">
             <wp:simplePos x="0" y="0"/>
             <wp:positionH relativeFrom="margin">
               <wp:align>center</wp:align>
@@ -24890,11 +24890,14 @@
       <w:r>
         <w:t>.</w:t>
       </w:r>
-    </w:p>
-    <w:p>
+      <w:r>
+        <w:t xml:space="preserve"> Sintaxis.</w:t>
+      </w:r>
       <w:r>
         <w:tab/>
-        <w:t>Estas transiciones irán separadas por un ; y sus parámetros por :</w:t>
+      </w:r>
+      <w:r>
+        <w:t xml:space="preserve"> </w:t>
       </w:r>
     </w:p>
     <w:p>
@@ -24902,19 +24905,28 @@
         <w:tab/>
       </w:r>
       <w:r>
-        <w:rPr>
-          <w:highlight w:val="yellow"/>
-        </w:rPr>
-        <w:t>#linear ; video : nombre_del_video</w:t>
-      </w:r>
-      <w:r>
-        <w:t xml:space="preserve"> (Muestra un video antes de pasar a la siguiente </w:t>
-      </w:r>
-      <w:r>
-        <w:t>escena</w:t>
-      </w:r>
-      <w:r>
-        <w:t>)</w:t>
+        <w:t>#</w:t>
+      </w:r>
+      <w:r>
+        <w:t xml:space="preserve">finalización </w:t>
+      </w:r>
+      <w:r>
+        <w:t>; video : nombre</w:t>
+      </w:r>
+      <w:r>
+        <w:t xml:space="preserve"> </w:t>
+      </w:r>
+      <w:r>
+        <w:t>del</w:t>
+      </w:r>
+      <w:r>
+        <w:t xml:space="preserve"> </w:t>
+      </w:r>
+      <w:r>
+        <w:t>video</w:t>
+      </w:r>
+      <w:r>
+        <w:t xml:space="preserve"> : siguiente fondo</w:t>
       </w:r>
     </w:p>
     <w:p>
@@ -24935,7 +24947,144 @@
         <w:t xml:space="preserve"> El motor hará un Dissolve a una pantalla en negro antes de mostrar el video.</w:t>
       </w:r>
     </w:p>
-    <w:p/>
+    <w:p>
+      <w:r>
+        <w:tab/>
+        <w:t>Cuando se reproduzca un video el motor hará lo siguiente:</w:t>
+      </w:r>
+    </w:p>
+    <w:p>
+      <w:pPr>
+        <w:pStyle w:val="Prrafodelista"/>
+        <w:numPr>
+          <w:ilvl w:val="0"/>
+          <w:numId w:val="31"/>
+        </w:numPr>
+      </w:pPr>
+      <w:r>
+        <w:t>Hará un fundido a negro tapando toda la pantalla.</w:t>
+      </w:r>
+    </w:p>
+    <w:p>
+      <w:pPr>
+        <w:pStyle w:val="Prrafodelista"/>
+        <w:numPr>
+          <w:ilvl w:val="0"/>
+          <w:numId w:val="31"/>
+        </w:numPr>
+      </w:pPr>
+      <w:r>
+        <w:t>Si se especificó un siguiente fondo, ese fondo será colocado.</w:t>
+      </w:r>
+    </w:p>
+    <w:p>
+      <w:pPr>
+        <w:pStyle w:val="Prrafodelista"/>
+        <w:numPr>
+          <w:ilvl w:val="0"/>
+          <w:numId w:val="31"/>
+        </w:numPr>
+      </w:pPr>
+      <w:r>
+        <w:t>El video se reproduce</w:t>
+      </w:r>
+    </w:p>
+    <w:p>
+      <w:pPr>
+        <w:pStyle w:val="Prrafodelista"/>
+        <w:numPr>
+          <w:ilvl w:val="0"/>
+          <w:numId w:val="31"/>
+        </w:numPr>
+      </w:pPr>
+      <w:r>
+        <w:t>Se retoma el fundido a negro y se muestra el fondo.</w:t>
+      </w:r>
+    </w:p>
+    <w:p>
+      <w:pPr>
+        <w:ind w:firstLine="708"/>
+      </w:pPr>
+      <w:r>
+        <w:t>Si no se especifica ningún siguiente fondo, al terminar de reproducirse el video, mostrará el fondo que ya se estaba mostrando antes.</w:t>
+      </w:r>
+    </w:p>
+    <w:p>
+      <w:pPr>
+        <w:ind w:firstLine="708"/>
+        <w:rPr>
+          <w:highlight w:val="yellow"/>
+        </w:rPr>
+      </w:pPr>
+      <w:r>
+        <w:rPr>
+          <w:highlight w:val="yellow"/>
+        </w:rPr>
+        <w:t>#linear ; video : watching the library</w:t>
+      </w:r>
+      <w:r>
+        <w:t xml:space="preserve"> (Muestra el video watching the library sin cambiar el fondo)</w:t>
+      </w:r>
+    </w:p>
+    <w:p>
+      <w:pPr>
+        <w:ind w:firstLine="708"/>
+      </w:pPr>
+      <w:r>
+        <w:rPr>
+          <w:highlight w:val="yellow"/>
+        </w:rPr>
+        <w:t>#linear ;</w:t>
+      </w:r>
+      <w:r>
+        <w:rPr>
+          <w:highlight w:val="yellow"/>
+        </w:rPr>
+        <w:t xml:space="preserve"> video</w:t>
+      </w:r>
+      <w:r>
+        <w:rPr>
+          <w:highlight w:val="yellow"/>
+        </w:rPr>
+        <w:t xml:space="preserve"> : running to </w:t>
+      </w:r>
+      <w:r>
+        <w:rPr>
+          <w:highlight w:val="yellow"/>
+        </w:rPr>
+        <w:t xml:space="preserve">home </w:t>
+      </w:r>
+      <w:r>
+        <w:rPr>
+          <w:highlight w:val="yellow"/>
+        </w:rPr>
+        <w:t xml:space="preserve">: </w:t>
+      </w:r>
+      <w:r>
+        <w:rPr>
+          <w:highlight w:val="yellow"/>
+        </w:rPr>
+        <w:t>home door</w:t>
+      </w:r>
+      <w:r>
+        <w:t xml:space="preserve"> </w:t>
+      </w:r>
+      <w:r>
+        <w:t xml:space="preserve">(Muestra el video </w:t>
+      </w:r>
+      <w:r>
+        <w:t xml:space="preserve">running to home </w:t>
+      </w:r>
+      <w:r>
+        <w:t xml:space="preserve">y al finalizar hará un fundido al fondo </w:t>
+      </w:r>
+      <w:r>
+        <w:t>home door</w:t>
+      </w:r>
+      <w:r>
+        <w:t>)</w:t>
+      </w:r>
+    </w:p>
     <w:p>
       <w:pPr>
         <w:pStyle w:val="Ttulo3"/>
@@ -24949,7 +25098,13 @@
     <w:p>
       <w:r>
         <w:tab/>
-        <w:t>Por razones de ahorro de recursos es conveniente que de vez en cuando limpiemos nuestra escena, esto lo hacemos añadiendo la opción “clear” al final de un fin de diálogo, este debe ir separado por un ;</w:t>
+        <w:t>Por razones de ahorro de recursos es conveniente que de vez en cuando limpiemos nuestra escena, esto lo hacemos añadiendo la opción “clear”</w:t>
+      </w:r>
+      <w:r>
+        <w:t xml:space="preserve"> como parámetro</w:t>
+      </w:r>
+      <w:r>
+        <w:t xml:space="preserve"> al final de un fin de diálogo, este debe ir separado por un ;</w:t>
       </w:r>
     </w:p>
     <w:p>
@@ -24982,9 +25137,6 @@
       </w:r>
     </w:p>
     <w:p>
-      <w:pPr>
-        <w:spacing w:after="0"/>
-      </w:pPr>
       <w:r>
         <w:tab/>
       </w:r>
@@ -24992,36 +25144,22 @@
         <w:rPr>
           <w:highlight w:val="yellow"/>
         </w:rPr>
-        <w:t>#condition scene ; fade : 1 : 2 : 1 ; clear</w:t>
-      </w:r>
-      <w:r>
-        <w:t xml:space="preserve"> (Hace un fa</w:t>
-      </w:r>
-      <w:r>
-        <w:t>d</w:t>
-      </w:r>
-      <w:r>
-        <w:t>e y luego limpia el juego)</w:t>
+        <w:t>#condition decisión ; ; clear</w:t>
+      </w:r>
+      <w:r>
+        <w:t xml:space="preserve"> (Limpiando sin hacer una transición)</w:t>
       </w:r>
     </w:p>
     <w:p>
       <w:r>
         <w:tab/>
-      </w:r>
-      <w:r>
-        <w:rPr>
-          <w:highlight w:val="yellow"/>
-        </w:rPr>
-        <w:t>#condition decisión ; ; clear</w:t>
-      </w:r>
-      <w:r>
-        <w:t xml:space="preserve"> (Limpiando sin hacer una transición)</w:t>
-      </w:r>
-    </w:p>
-    <w:p>
-      <w:r>
-        <w:tab/>
-        <w:t>Siempre que se vaya a pasar de una escena a otra de forma limpia, es decir, sin personajes en pantalla y sin cambio de fondo, es conveniente siempre agregar el parámetro clear para ahorrar recursos al dispositivo.</w:t>
+        <w:t>Siempre que se vaya a pasar de una escena a otra de forma limpia, es decir, sin personajes en pantall</w:t>
+      </w:r>
+      <w:r>
+        <w:t>a</w:t>
+      </w:r>
+      <w:r>
+        <w:t>, es conveniente siempre agregar el parámetro clear para ahorrar recursos al dispositivo.</w:t>
       </w:r>
     </w:p>
     <w:p>
@@ -25086,6 +25224,27 @@
       </w:r>
     </w:p>
     <w:p>
+      <w:r>
+        <w:lastRenderedPageBreak/>
+        <w:tab/>
+      </w:r>
+      <w:r>
+        <w:t>Cabe aclarar que los recursos visuales utilizados para crear estos ejemplos fueron generados con inteligencia artificial. Esto se hizo así ya que</w:t>
+      </w:r>
+      <w:r>
+        <w:t>,</w:t>
+      </w:r>
+      <w:r>
+        <w:t xml:space="preserve"> estos ejemplo tienen fines netamente educativos para mostrar cómo funciona el motor. Siempre procura crear los recursos visuales de tus proyectos sin inteligencia artificial</w:t>
+      </w:r>
+      <w:r>
+        <w:t xml:space="preserve"> (o al menos no en su totalidad)</w:t>
+      </w:r>
+      <w:r>
+        <w:t xml:space="preserve">. </w:t>
+      </w:r>
+    </w:p>
+    <w:p>
       <w:pPr>
         <w:pStyle w:val="Ttulo2"/>
       </w:pPr>
@@ -25131,7 +25290,6 @@
     </w:p>
     <w:p>
       <w:r>
-        <w:lastRenderedPageBreak/>
         <w:tab/>
       </w:r>
       <w:r>
@@ -25512,7 +25670,6 @@
         </w:rPr>
       </w:pPr>
       <w:r>
-        <w:lastRenderedPageBreak/>
         <w:tab/>
         <w:t xml:space="preserve">Asegúrate que utilizas la misma llave escrita en </w:t>
       </w:r>
@@ -25732,6 +25889,7 @@
         <w:spacing w:before="240"/>
       </w:pPr>
       <w:r>
+        <w:lastRenderedPageBreak/>
         <w:t>Se puede llega</w:t>
       </w:r>
       <w:r>
@@ -25889,8 +26047,22 @@
         <w:rPr>
           <w:noProof/>
         </w:rPr>
-        <w:lastRenderedPageBreak/>
         <w:t>La variable keysWalked guarda los keys de las decisiones, nombres de escenas, finalizaciones de diálogo y scripts personalizados.</w:t>
+      </w:r>
+    </w:p>
+    <w:p>
+      <w:pPr>
+        <w:pStyle w:val="Prrafodelista"/>
+        <w:numPr>
+          <w:ilvl w:val="0"/>
+          <w:numId w:val="20"/>
+        </w:numPr>
+      </w:pPr>
+      <w:r>
+        <w:rPr>
+          <w:noProof/>
+        </w:rPr>
+        <w:t>Si al pasar de una escena a otra deseamos que el fondo cambie con una transición específica, tendremos que colocar en el inicio de la nueva escena un cambio de fondo con la transición.</w:t>
       </w:r>
     </w:p>
     <w:p>
@@ -26056,13 +26228,13 @@
           <w:noProof/>
         </w:rPr>
         <w:drawing>
-          <wp:anchor distT="0" distB="0" distL="114300" distR="114300" simplePos="0" relativeHeight="251708416" behindDoc="0" locked="0" layoutInCell="1" allowOverlap="1" wp14:anchorId="5331149E" wp14:editId="7878FF6D">
+          <wp:anchor distT="0" distB="0" distL="114300" distR="114300" simplePos="0" relativeHeight="251708416" behindDoc="0" locked="0" layoutInCell="1" allowOverlap="1" wp14:anchorId="5331149E" wp14:editId="7A1389E3">
             <wp:simplePos x="0" y="0"/>
             <wp:positionH relativeFrom="margin">
-              <wp:posOffset>806098</wp:posOffset>
+              <wp:posOffset>589107</wp:posOffset>
             </wp:positionH>
             <wp:positionV relativeFrom="margin">
-              <wp:posOffset>4030524</wp:posOffset>
+              <wp:posOffset>4675182</wp:posOffset>
             </wp:positionV>
             <wp:extent cx="1379220" cy="2245995"/>
             <wp:effectExtent l="0" t="0" r="0" b="1905"/>
@@ -26297,15 +26469,14 @@
         <w:rPr>
           <w:noProof/>
         </w:rPr>
-        <w:lastRenderedPageBreak/>
         <w:drawing>
-          <wp:anchor distT="0" distB="0" distL="114300" distR="114300" simplePos="0" relativeHeight="251709440" behindDoc="0" locked="0" layoutInCell="1" allowOverlap="1" wp14:anchorId="6C2FC01C" wp14:editId="397ED955">
+          <wp:anchor distT="0" distB="0" distL="114300" distR="114300" simplePos="0" relativeHeight="251709440" behindDoc="0" locked="0" layoutInCell="1" allowOverlap="1" wp14:anchorId="6C2FC01C" wp14:editId="51BAE5A2">
             <wp:simplePos x="0" y="0"/>
             <wp:positionH relativeFrom="margin">
-              <wp:posOffset>712507</wp:posOffset>
+              <wp:posOffset>448193</wp:posOffset>
             </wp:positionH>
             <wp:positionV relativeFrom="margin">
-              <wp:posOffset>232270</wp:posOffset>
+              <wp:posOffset>1035178</wp:posOffset>
             </wp:positionV>
             <wp:extent cx="2118995" cy="2377440"/>
             <wp:effectExtent l="0" t="0" r="0" b="3810"/>
@@ -26410,14 +26581,15 @@
           <w:sz w:val="20"/>
           <w:szCs w:val="20"/>
         </w:rPr>
+        <w:lastRenderedPageBreak/>
         <w:drawing>
-          <wp:anchor distT="0" distB="0" distL="114300" distR="114300" simplePos="0" relativeHeight="251710464" behindDoc="0" locked="0" layoutInCell="1" allowOverlap="1" wp14:anchorId="5A9FFF2B" wp14:editId="686759A9">
+          <wp:anchor distT="0" distB="0" distL="114300" distR="114300" simplePos="0" relativeHeight="251710464" behindDoc="0" locked="0" layoutInCell="1" allowOverlap="1" wp14:anchorId="5A9FFF2B" wp14:editId="264AFE18">
             <wp:simplePos x="0" y="0"/>
             <wp:positionH relativeFrom="margin">
-              <wp:posOffset>614801</wp:posOffset>
+              <wp:posOffset>345117</wp:posOffset>
             </wp:positionH>
             <wp:positionV relativeFrom="margin">
-              <wp:posOffset>3923338</wp:posOffset>
+              <wp:posOffset>4758147</wp:posOffset>
             </wp:positionV>
             <wp:extent cx="3012440" cy="2322830"/>
             <wp:effectExtent l="0" t="0" r="0" b="1270"/>
@@ -26546,7 +26718,6 @@
           <w:szCs w:val="28"/>
           <w:highlight w:val="red"/>
         </w:rPr>
-        <w:lastRenderedPageBreak/>
         <w:t>Nota</w:t>
       </w:r>
       <w:r>
@@ -26603,6 +26774,7 @@
     </w:p>
     <w:p>
       <w:r>
+        <w:lastRenderedPageBreak/>
         <w:tab/>
         <w:t>Sin embargo, la cosa se puede complicar en gran medida pudiendo llegar a los millones de caminos posibles. Esto no es necesariamente un problema, al menos que nuestra novela tenga condiciones estrictas para alcanzar ciertos finales específicos.</w:t>
       </w:r>
@@ -26695,21 +26867,19 @@
     <w:p/>
     <w:p/>
     <w:p/>
-    <w:p/>
     <w:p>
       <w:r>
         <w:rPr>
           <w:noProof/>
         </w:rPr>
-        <w:lastRenderedPageBreak/>
         <w:drawing>
-          <wp:anchor distT="0" distB="0" distL="114300" distR="114300" simplePos="0" relativeHeight="251671552" behindDoc="0" locked="0" layoutInCell="1" allowOverlap="1" wp14:anchorId="0ECDDFF2" wp14:editId="62EA5ECA">
+          <wp:anchor distT="0" distB="0" distL="114300" distR="114300" simplePos="0" relativeHeight="251671552" behindDoc="0" locked="0" layoutInCell="1" allowOverlap="1" wp14:anchorId="0ECDDFF2" wp14:editId="0A3D8150">
             <wp:simplePos x="0" y="0"/>
             <wp:positionH relativeFrom="margin">
-              <wp:posOffset>-175895</wp:posOffset>
+              <wp:posOffset>-181181</wp:posOffset>
             </wp:positionH>
             <wp:positionV relativeFrom="margin">
-              <wp:posOffset>67945</wp:posOffset>
+              <wp:posOffset>326937</wp:posOffset>
             </wp:positionV>
             <wp:extent cx="2514600" cy="5003800"/>
             <wp:effectExtent l="19050" t="19050" r="19050" b="25400"/>
@@ -26763,7 +26933,10 @@
           </wp:anchor>
         </w:drawing>
       </w:r>
-      <w:r>
+    </w:p>
+    <w:p>
+      <w:r>
+        <w:lastRenderedPageBreak/>
         <w:tab/>
       </w:r>
       <w:r>
@@ -26995,7 +27168,6 @@
       </w:pPr>
       <w:bookmarkStart w:id="62" w:name="_Toc228985477"/>
       <w:r>
-        <w:lastRenderedPageBreak/>
         <w:t>Referencias</w:t>
       </w:r>
       <w:bookmarkEnd w:id="62"/>
@@ -27093,6 +27265,7 @@
           <w:i/>
           <w:iCs/>
         </w:rPr>
+        <w:lastRenderedPageBreak/>
         <w:t>Modificadores de texto en Renpy:</w:t>
       </w:r>
       <w:r>
@@ -27633,6 +27806,119 @@
     </w:lvl>
   </w:abstractNum>
   <w:abstractNum w:abstractNumId="4" w15:restartNumberingAfterBreak="0">
+    <w:nsid w:val="108E49A3"/>
+    <w:multiLevelType w:val="hybridMultilevel"/>
+    <w:tmpl w:val="67802D44"/>
+    <w:lvl w:ilvl="0" w:tplc="200A0001">
+      <w:start w:val="1"/>
+      <w:numFmt w:val="bullet"/>
+      <w:lvlText w:val=""/>
+      <w:lvlJc w:val="left"/>
+      <w:pPr>
+        <w:ind w:left="720" w:hanging="360"/>
+      </w:pPr>
+      <w:rPr>
+        <w:rFonts w:ascii="Symbol" w:hAnsi="Symbol" w:hint="default"/>
+      </w:rPr>
+    </w:lvl>
+    <w:lvl w:ilvl="1" w:tplc="200A0003" w:tentative="1">
+      <w:start w:val="1"/>
+      <w:numFmt w:val="bullet"/>
+      <w:lvlText w:val="o"/>
+      <w:lvlJc w:val="left"/>
+      <w:pPr>
+        <w:ind w:left="1440" w:hanging="360"/>
+      </w:pPr>
+      <w:rPr>
+        <w:rFonts w:ascii="Courier New" w:hAnsi="Courier New" w:cs="Courier New" w:hint="default"/>
+      </w:rPr>
+    </w:lvl>
+    <w:lvl w:ilvl="2" w:tplc="200A0005" w:tentative="1">
+      <w:start w:val="1"/>
+      <w:numFmt w:val="bullet"/>
+      <w:lvlText w:val=""/>
+      <w:lvlJc w:val="left"/>
+      <w:pPr>
+        <w:ind w:left="2160" w:hanging="360"/>
+      </w:pPr>
+      <w:rPr>
+        <w:rFonts w:ascii="Wingdings" w:hAnsi="Wingdings" w:hint="default"/>
+      </w:rPr>
+    </w:lvl>
+    <w:lvl w:ilvl="3" w:tplc="200A0001" w:tentative="1">
+      <w:start w:val="1"/>
+      <w:numFmt w:val="bullet"/>
+      <w:lvlText w:val=""/>
+      <w:lvlJc w:val="left"/>
+      <w:pPr>
+        <w:ind w:left="2880" w:hanging="360"/>
+      </w:pPr>
+      <w:rPr>
+        <w:rFonts w:ascii="Symbol" w:hAnsi="Symbol" w:hint="default"/>
+      </w:rPr>
+    </w:lvl>
+    <w:lvl w:ilvl="4" w:tplc="200A0003" w:tentative="1">
+      <w:start w:val="1"/>
+      <w:numFmt w:val="bullet"/>
+      <w:lvlText w:val="o"/>
+      <w:lvlJc w:val="left"/>
+      <w:pPr>
+        <w:ind w:left="3600" w:hanging="360"/>
+      </w:pPr>
+      <w:rPr>
+        <w:rFonts w:ascii="Courier New" w:hAnsi="Courier New" w:cs="Courier New" w:hint="default"/>
+      </w:rPr>
+    </w:lvl>
+    <w:lvl w:ilvl="5" w:tplc="200A0005" w:tentative="1">
+      <w:start w:val="1"/>
+      <w:numFmt w:val="bullet"/>
+      <w:lvlText w:val=""/>
+      <w:lvlJc w:val="left"/>
+      <w:pPr>
+        <w:ind w:left="4320" w:hanging="360"/>
+      </w:pPr>
+      <w:rPr>
+        <w:rFonts w:ascii="Wingdings" w:hAnsi="Wingdings" w:hint="default"/>
+      </w:rPr>
+    </w:lvl>
+    <w:lvl w:ilvl="6" w:tplc="200A0001" w:tentative="1">
+      <w:start w:val="1"/>
+      <w:numFmt w:val="bullet"/>
+      <w:lvlText w:val=""/>
+      <w:lvlJc w:val="left"/>
+      <w:pPr>
+        <w:ind w:left="5040" w:hanging="360"/>
+      </w:pPr>
+      <w:rPr>
+        <w:rFonts w:ascii="Symbol" w:hAnsi="Symbol" w:hint="default"/>
+      </w:rPr>
+    </w:lvl>
+    <w:lvl w:ilvl="7" w:tplc="200A0003" w:tentative="1">
+      <w:start w:val="1"/>
+      <w:numFmt w:val="bullet"/>
+      <w:lvlText w:val="o"/>
+      <w:lvlJc w:val="left"/>
+      <w:pPr>
+        <w:ind w:left="5760" w:hanging="360"/>
+      </w:pPr>
+      <w:rPr>
+        <w:rFonts w:ascii="Courier New" w:hAnsi="Courier New" w:cs="Courier New" w:hint="default"/>
+      </w:rPr>
+    </w:lvl>
+    <w:lvl w:ilvl="8" w:tplc="200A0005" w:tentative="1">
+      <w:start w:val="1"/>
+      <w:numFmt w:val="bullet"/>
+      <w:lvlText w:val=""/>
+      <w:lvlJc w:val="left"/>
+      <w:pPr>
+        <w:ind w:left="6480" w:hanging="360"/>
+      </w:pPr>
+      <w:rPr>
+        <w:rFonts w:ascii="Wingdings" w:hAnsi="Wingdings" w:hint="default"/>
+      </w:rPr>
+    </w:lvl>
+  </w:abstractNum>
+  <w:abstractNum w:abstractNumId="5" w15:restartNumberingAfterBreak="0">
     <w:nsid w:val="146F1EC7"/>
     <w:multiLevelType w:val="hybridMultilevel"/>
     <w:tmpl w:val="ECD427C0"/>
@@ -27745,7 +28031,7 @@
       </w:rPr>
     </w:lvl>
   </w:abstractNum>
-  <w:abstractNum w:abstractNumId="5" w15:restartNumberingAfterBreak="0">
+  <w:abstractNum w:abstractNumId="6" w15:restartNumberingAfterBreak="0">
     <w:nsid w:val="20093117"/>
     <w:multiLevelType w:val="hybridMultilevel"/>
     <w:tmpl w:val="FAC280E6"/>
@@ -27858,7 +28144,7 @@
       </w:rPr>
     </w:lvl>
   </w:abstractNum>
-  <w:abstractNum w:abstractNumId="6" w15:restartNumberingAfterBreak="0">
+  <w:abstractNum w:abstractNumId="7" w15:restartNumberingAfterBreak="0">
     <w:nsid w:val="21142F3C"/>
     <w:multiLevelType w:val="hybridMultilevel"/>
     <w:tmpl w:val="9B5EE3D4"/>
@@ -27971,7 +28257,7 @@
       </w:rPr>
     </w:lvl>
   </w:abstractNum>
-  <w:abstractNum w:abstractNumId="7" w15:restartNumberingAfterBreak="0">
+  <w:abstractNum w:abstractNumId="8" w15:restartNumberingAfterBreak="0">
     <w:nsid w:val="212B3076"/>
     <w:multiLevelType w:val="hybridMultilevel"/>
     <w:tmpl w:val="AD589D78"/>
@@ -28084,7 +28370,7 @@
       </w:rPr>
     </w:lvl>
   </w:abstractNum>
-  <w:abstractNum w:abstractNumId="8" w15:restartNumberingAfterBreak="0">
+  <w:abstractNum w:abstractNumId="9" w15:restartNumberingAfterBreak="0">
     <w:nsid w:val="22F95A1C"/>
     <w:multiLevelType w:val="hybridMultilevel"/>
     <w:tmpl w:val="79264C64"/>
@@ -28170,7 +28456,93 @@
       </w:pPr>
     </w:lvl>
   </w:abstractNum>
-  <w:abstractNum w:abstractNumId="9" w15:restartNumberingAfterBreak="0">
+  <w:abstractNum w:abstractNumId="10" w15:restartNumberingAfterBreak="0">
+    <w:nsid w:val="24C12C3D"/>
+    <w:multiLevelType w:val="hybridMultilevel"/>
+    <w:tmpl w:val="DD6AAC0E"/>
+    <w:lvl w:ilvl="0" w:tplc="200A000F">
+      <w:start w:val="1"/>
+      <w:numFmt w:val="decimal"/>
+      <w:lvlText w:val="%1."/>
+      <w:lvlJc w:val="left"/>
+      <w:pPr>
+        <w:ind w:left="1068" w:hanging="360"/>
+      </w:pPr>
+    </w:lvl>
+    <w:lvl w:ilvl="1" w:tplc="200A0019" w:tentative="1">
+      <w:start w:val="1"/>
+      <w:numFmt w:val="lowerLetter"/>
+      <w:lvlText w:val="%2."/>
+      <w:lvlJc w:val="left"/>
+      <w:pPr>
+        <w:ind w:left="1788" w:hanging="360"/>
+      </w:pPr>
+    </w:lvl>
+    <w:lvl w:ilvl="2" w:tplc="200A001B" w:tentative="1">
+      <w:start w:val="1"/>
+      <w:numFmt w:val="lowerRoman"/>
+      <w:lvlText w:val="%3."/>
+      <w:lvlJc w:val="right"/>
+      <w:pPr>
+        <w:ind w:left="2508" w:hanging="180"/>
+      </w:pPr>
+    </w:lvl>
+    <w:lvl w:ilvl="3" w:tplc="200A000F" w:tentative="1">
+      <w:start w:val="1"/>
+      <w:numFmt w:val="decimal"/>
+      <w:lvlText w:val="%4."/>
+      <w:lvlJc w:val="left"/>
+      <w:pPr>
+        <w:ind w:left="3228" w:hanging="360"/>
+      </w:pPr>
+    </w:lvl>
+    <w:lvl w:ilvl="4" w:tplc="200A0019" w:tentative="1">
+      <w:start w:val="1"/>
+      <w:numFmt w:val="lowerLetter"/>
+      <w:lvlText w:val="%5."/>
+      <w:lvlJc w:val="left"/>
+      <w:pPr>
+        <w:ind w:left="3948" w:hanging="360"/>
+      </w:pPr>
+    </w:lvl>
+    <w:lvl w:ilvl="5" w:tplc="200A001B" w:tentative="1">
+      <w:start w:val="1"/>
+      <w:numFmt w:val="lowerRoman"/>
+      <w:lvlText w:val="%6."/>
+      <w:lvlJc w:val="right"/>
+      <w:pPr>
+        <w:ind w:left="4668" w:hanging="180"/>
+      </w:pPr>
+    </w:lvl>
+    <w:lvl w:ilvl="6" w:tplc="200A000F" w:tentative="1">
+      <w:start w:val="1"/>
+      <w:numFmt w:val="decimal"/>
+      <w:lvlText w:val="%7."/>
+      <w:lvlJc w:val="left"/>
+      <w:pPr>
+        <w:ind w:left="5388" w:hanging="360"/>
+      </w:pPr>
+    </w:lvl>
+    <w:lvl w:ilvl="7" w:tplc="200A0019" w:tentative="1">
+      <w:start w:val="1"/>
+      <w:numFmt w:val="lowerLetter"/>
+      <w:lvlText w:val="%8."/>
+      <w:lvlJc w:val="left"/>
+      <w:pPr>
+        <w:ind w:left="6108" w:hanging="360"/>
+      </w:pPr>
+    </w:lvl>
+    <w:lvl w:ilvl="8" w:tplc="200A001B" w:tentative="1">
+      <w:start w:val="1"/>
+      <w:numFmt w:val="lowerRoman"/>
+      <w:lvlText w:val="%9."/>
+      <w:lvlJc w:val="right"/>
+      <w:pPr>
+        <w:ind w:left="6828" w:hanging="180"/>
+      </w:pPr>
+    </w:lvl>
+  </w:abstractNum>
+  <w:abstractNum w:abstractNumId="11" w15:restartNumberingAfterBreak="0">
     <w:nsid w:val="2C933685"/>
     <w:multiLevelType w:val="hybridMultilevel"/>
     <w:tmpl w:val="A7AC24A0"/>
@@ -28256,7 +28628,7 @@
       </w:pPr>
     </w:lvl>
   </w:abstractNum>
-  <w:abstractNum w:abstractNumId="10" w15:restartNumberingAfterBreak="0">
+  <w:abstractNum w:abstractNumId="12" w15:restartNumberingAfterBreak="0">
     <w:nsid w:val="2CB30798"/>
     <w:multiLevelType w:val="hybridMultilevel"/>
     <w:tmpl w:val="1A3E35CE"/>
@@ -28345,7 +28717,7 @@
       </w:pPr>
     </w:lvl>
   </w:abstractNum>
-  <w:abstractNum w:abstractNumId="11" w15:restartNumberingAfterBreak="0">
+  <w:abstractNum w:abstractNumId="13" w15:restartNumberingAfterBreak="0">
     <w:nsid w:val="34E74BA5"/>
     <w:multiLevelType w:val="hybridMultilevel"/>
     <w:tmpl w:val="6B0E7984"/>
@@ -28434,7 +28806,7 @@
       </w:pPr>
     </w:lvl>
   </w:abstractNum>
-  <w:abstractNum w:abstractNumId="12" w15:restartNumberingAfterBreak="0">
+  <w:abstractNum w:abstractNumId="14" w15:restartNumberingAfterBreak="0">
     <w:nsid w:val="35BB7E8F"/>
     <w:multiLevelType w:val="hybridMultilevel"/>
     <w:tmpl w:val="2DF213C2"/>
@@ -28547,7 +28919,7 @@
       </w:rPr>
     </w:lvl>
   </w:abstractNum>
-  <w:abstractNum w:abstractNumId="13" w15:restartNumberingAfterBreak="0">
+  <w:abstractNum w:abstractNumId="15" w15:restartNumberingAfterBreak="0">
     <w:nsid w:val="391A4D18"/>
     <w:multiLevelType w:val="hybridMultilevel"/>
     <w:tmpl w:val="BFCC90D6"/>
@@ -28633,7 +29005,7 @@
       </w:pPr>
     </w:lvl>
   </w:abstractNum>
-  <w:abstractNum w:abstractNumId="14" w15:restartNumberingAfterBreak="0">
+  <w:abstractNum w:abstractNumId="16" w15:restartNumberingAfterBreak="0">
     <w:nsid w:val="3A74320C"/>
     <w:multiLevelType w:val="hybridMultilevel"/>
     <w:tmpl w:val="6E88E228"/>
@@ -28746,7 +29118,7 @@
       </w:rPr>
     </w:lvl>
   </w:abstractNum>
-  <w:abstractNum w:abstractNumId="15" w15:restartNumberingAfterBreak="0">
+  <w:abstractNum w:abstractNumId="17" w15:restartNumberingAfterBreak="0">
     <w:nsid w:val="3D616461"/>
     <w:multiLevelType w:val="hybridMultilevel"/>
     <w:tmpl w:val="5E869988"/>
@@ -28859,7 +29231,7 @@
       </w:rPr>
     </w:lvl>
   </w:abstractNum>
-  <w:abstractNum w:abstractNumId="16" w15:restartNumberingAfterBreak="0">
+  <w:abstractNum w:abstractNumId="18" w15:restartNumberingAfterBreak="0">
     <w:nsid w:val="3DC26F13"/>
     <w:multiLevelType w:val="hybridMultilevel"/>
     <w:tmpl w:val="98323762"/>
@@ -28972,7 +29344,7 @@
       </w:rPr>
     </w:lvl>
   </w:abstractNum>
-  <w:abstractNum w:abstractNumId="17" w15:restartNumberingAfterBreak="0">
+  <w:abstractNum w:abstractNumId="19" w15:restartNumberingAfterBreak="0">
     <w:nsid w:val="3E672CCD"/>
     <w:multiLevelType w:val="hybridMultilevel"/>
     <w:tmpl w:val="0BAE5ED6"/>
@@ -29061,7 +29433,7 @@
       </w:pPr>
     </w:lvl>
   </w:abstractNum>
-  <w:abstractNum w:abstractNumId="18" w15:restartNumberingAfterBreak="0">
+  <w:abstractNum w:abstractNumId="20" w15:restartNumberingAfterBreak="0">
     <w:nsid w:val="3FBD7F10"/>
     <w:multiLevelType w:val="hybridMultilevel"/>
     <w:tmpl w:val="63AE9C56"/>
@@ -29150,7 +29522,7 @@
       </w:pPr>
     </w:lvl>
   </w:abstractNum>
-  <w:abstractNum w:abstractNumId="19" w15:restartNumberingAfterBreak="0">
+  <w:abstractNum w:abstractNumId="21" w15:restartNumberingAfterBreak="0">
     <w:nsid w:val="47C62F33"/>
     <w:multiLevelType w:val="hybridMultilevel"/>
     <w:tmpl w:val="F8989EB4"/>
@@ -29263,7 +29635,7 @@
       </w:rPr>
     </w:lvl>
   </w:abstractNum>
-  <w:abstractNum w:abstractNumId="20" w15:restartNumberingAfterBreak="0">
+  <w:abstractNum w:abstractNumId="22" w15:restartNumberingAfterBreak="0">
     <w:nsid w:val="4D794F7B"/>
     <w:multiLevelType w:val="hybridMultilevel"/>
     <w:tmpl w:val="ADB0E002"/>
@@ -29376,7 +29748,7 @@
       </w:rPr>
     </w:lvl>
   </w:abstractNum>
-  <w:abstractNum w:abstractNumId="21" w15:restartNumberingAfterBreak="0">
+  <w:abstractNum w:abstractNumId="23" w15:restartNumberingAfterBreak="0">
     <w:nsid w:val="5C381E8C"/>
     <w:multiLevelType w:val="hybridMultilevel"/>
     <w:tmpl w:val="5148D242"/>
@@ -29462,7 +29834,7 @@
       </w:pPr>
     </w:lvl>
   </w:abstractNum>
-  <w:abstractNum w:abstractNumId="22" w15:restartNumberingAfterBreak="0">
+  <w:abstractNum w:abstractNumId="24" w15:restartNumberingAfterBreak="0">
     <w:nsid w:val="615B20F0"/>
     <w:multiLevelType w:val="hybridMultilevel"/>
     <w:tmpl w:val="7AC4399A"/>
@@ -29548,7 +29920,7 @@
       </w:pPr>
     </w:lvl>
   </w:abstractNum>
-  <w:abstractNum w:abstractNumId="23" w15:restartNumberingAfterBreak="0">
+  <w:abstractNum w:abstractNumId="25" w15:restartNumberingAfterBreak="0">
     <w:nsid w:val="63556DA1"/>
     <w:multiLevelType w:val="hybridMultilevel"/>
     <w:tmpl w:val="FE8C0458"/>
@@ -29661,7 +30033,7 @@
       </w:rPr>
     </w:lvl>
   </w:abstractNum>
-  <w:abstractNum w:abstractNumId="24" w15:restartNumberingAfterBreak="0">
+  <w:abstractNum w:abstractNumId="26" w15:restartNumberingAfterBreak="0">
     <w:nsid w:val="67597F94"/>
     <w:multiLevelType w:val="hybridMultilevel"/>
     <w:tmpl w:val="A6049668"/>
@@ -29750,7 +30122,7 @@
       </w:pPr>
     </w:lvl>
   </w:abstractNum>
-  <w:abstractNum w:abstractNumId="25" w15:restartNumberingAfterBreak="0">
+  <w:abstractNum w:abstractNumId="27" w15:restartNumberingAfterBreak="0">
     <w:nsid w:val="6AD52AD2"/>
     <w:multiLevelType w:val="hybridMultilevel"/>
     <w:tmpl w:val="9FCE4DB8"/>
@@ -29839,7 +30211,7 @@
       </w:pPr>
     </w:lvl>
   </w:abstractNum>
-  <w:abstractNum w:abstractNumId="26" w15:restartNumberingAfterBreak="0">
+  <w:abstractNum w:abstractNumId="28" w15:restartNumberingAfterBreak="0">
     <w:nsid w:val="753D730E"/>
     <w:multiLevelType w:val="hybridMultilevel"/>
     <w:tmpl w:val="75E0B6C2"/>
@@ -29952,7 +30324,7 @@
       </w:rPr>
     </w:lvl>
   </w:abstractNum>
-  <w:abstractNum w:abstractNumId="27" w15:restartNumberingAfterBreak="0">
+  <w:abstractNum w:abstractNumId="29" w15:restartNumberingAfterBreak="0">
     <w:nsid w:val="77037EA0"/>
     <w:multiLevelType w:val="hybridMultilevel"/>
     <w:tmpl w:val="1D7C8B04"/>
@@ -30065,7 +30437,7 @@
       </w:rPr>
     </w:lvl>
   </w:abstractNum>
-  <w:abstractNum w:abstractNumId="28" w15:restartNumberingAfterBreak="0">
+  <w:abstractNum w:abstractNumId="30" w15:restartNumberingAfterBreak="0">
     <w:nsid w:val="7B12378A"/>
     <w:multiLevelType w:val="hybridMultilevel"/>
     <w:tmpl w:val="E6EC6DD6"/>
@@ -30152,91 +30524,97 @@
     </w:lvl>
   </w:abstractNum>
   <w:num w:numId="1" w16cid:durableId="1293169672">
-    <w:abstractNumId w:val="20"/>
+    <w:abstractNumId w:val="22"/>
   </w:num>
   <w:num w:numId="2" w16cid:durableId="132523105">
-    <w:abstractNumId w:val="23"/>
+    <w:abstractNumId w:val="25"/>
   </w:num>
   <w:num w:numId="3" w16cid:durableId="550045339">
-    <w:abstractNumId w:val="5"/>
+    <w:abstractNumId w:val="6"/>
   </w:num>
   <w:num w:numId="4" w16cid:durableId="913316204">
-    <w:abstractNumId w:val="17"/>
+    <w:abstractNumId w:val="19"/>
   </w:num>
   <w:num w:numId="5" w16cid:durableId="1328904247">
-    <w:abstractNumId w:val="14"/>
+    <w:abstractNumId w:val="16"/>
   </w:num>
   <w:num w:numId="6" w16cid:durableId="675959527">
-    <w:abstractNumId w:val="13"/>
+    <w:abstractNumId w:val="15"/>
   </w:num>
   <w:num w:numId="7" w16cid:durableId="1954557278">
-    <w:abstractNumId w:val="6"/>
+    <w:abstractNumId w:val="7"/>
   </w:num>
   <w:num w:numId="8" w16cid:durableId="1356231617">
     <w:abstractNumId w:val="3"/>
   </w:num>
   <w:num w:numId="9" w16cid:durableId="1882328899">
-    <w:abstractNumId w:val="12"/>
+    <w:abstractNumId w:val="14"/>
   </w:num>
   <w:num w:numId="10" w16cid:durableId="870528595">
-    <w:abstractNumId w:val="15"/>
+    <w:abstractNumId w:val="17"/>
   </w:num>
   <w:num w:numId="11" w16cid:durableId="1776826764">
-    <w:abstractNumId w:val="27"/>
+    <w:abstractNumId w:val="29"/>
   </w:num>
   <w:num w:numId="12" w16cid:durableId="1998149375">
     <w:abstractNumId w:val="0"/>
   </w:num>
   <w:num w:numId="13" w16cid:durableId="2030794282">
-    <w:abstractNumId w:val="28"/>
+    <w:abstractNumId w:val="30"/>
   </w:num>
   <w:num w:numId="14" w16cid:durableId="389350923">
+    <w:abstractNumId w:val="13"/>
+  </w:num>
+  <w:num w:numId="15" w16cid:durableId="1450397852">
     <w:abstractNumId w:val="11"/>
   </w:num>
-  <w:num w:numId="15" w16cid:durableId="1450397852">
+  <w:num w:numId="16" w16cid:durableId="1198618860">
+    <w:abstractNumId w:val="21"/>
+  </w:num>
+  <w:num w:numId="17" w16cid:durableId="534732538">
+    <w:abstractNumId w:val="27"/>
+  </w:num>
+  <w:num w:numId="18" w16cid:durableId="1870793516">
+    <w:abstractNumId w:val="18"/>
+  </w:num>
+  <w:num w:numId="19" w16cid:durableId="1198272480">
+    <w:abstractNumId w:val="24"/>
+  </w:num>
+  <w:num w:numId="20" w16cid:durableId="1597127380">
     <w:abstractNumId w:val="9"/>
   </w:num>
-  <w:num w:numId="16" w16cid:durableId="1198618860">
-    <w:abstractNumId w:val="19"/>
-  </w:num>
-  <w:num w:numId="17" w16cid:durableId="534732538">
-    <w:abstractNumId w:val="25"/>
-  </w:num>
-  <w:num w:numId="18" w16cid:durableId="1870793516">
-    <w:abstractNumId w:val="16"/>
-  </w:num>
-  <w:num w:numId="19" w16cid:durableId="1198272480">
-    <w:abstractNumId w:val="22"/>
-  </w:num>
-  <w:num w:numId="20" w16cid:durableId="1597127380">
-    <w:abstractNumId w:val="8"/>
-  </w:num>
   <w:num w:numId="21" w16cid:durableId="1672026176">
-    <w:abstractNumId w:val="26"/>
+    <w:abstractNumId w:val="28"/>
   </w:num>
   <w:num w:numId="22" w16cid:durableId="44453642">
     <w:abstractNumId w:val="1"/>
   </w:num>
   <w:num w:numId="23" w16cid:durableId="158888792">
-    <w:abstractNumId w:val="24"/>
+    <w:abstractNumId w:val="26"/>
   </w:num>
   <w:num w:numId="24" w16cid:durableId="1741439293">
-    <w:abstractNumId w:val="4"/>
+    <w:abstractNumId w:val="5"/>
   </w:num>
   <w:num w:numId="25" w16cid:durableId="1514027647">
-    <w:abstractNumId w:val="21"/>
+    <w:abstractNumId w:val="23"/>
   </w:num>
   <w:num w:numId="26" w16cid:durableId="799080835">
-    <w:abstractNumId w:val="7"/>
+    <w:abstractNumId w:val="8"/>
   </w:num>
   <w:num w:numId="27" w16cid:durableId="1869248346">
     <w:abstractNumId w:val="2"/>
   </w:num>
   <w:num w:numId="28" w16cid:durableId="1551306896">
-    <w:abstractNumId w:val="10"/>
+    <w:abstractNumId w:val="12"/>
   </w:num>
   <w:num w:numId="29" w16cid:durableId="716703061">
-    <w:abstractNumId w:val="18"/>
+    <w:abstractNumId w:val="20"/>
+  </w:num>
+  <w:num w:numId="30" w16cid:durableId="914823319">
+    <w:abstractNumId w:val="4"/>
+  </w:num>
+  <w:num w:numId="31" w16cid:durableId="540243546">
+    <w:abstractNumId w:val="10"/>
   </w:num>
 </w:numbering>
 </file>

</xml_diff>